<commit_message>
Add controlled automatic recovery test and installation instructions
</commit_message>
<xml_diff>
--- a/安装与使用指南.docx
+++ b/安装与使用指南.docx
@@ -17,7 +17,7 @@
     </w:p>
     <w:p>
       <w:r>
-        <w:t>这是一份可独立交给 Agent 的指南：附录包含本分享版的完整源码和校验值。本项目的 GitHub 地址为 https://github.com/ZhangJP-wh/web-video-to-word 。可点击 Code → Download ZIP 下载源码。拿到配套源码 ZIP 时可以直接解压；只有本文时，Agent 可以按第 11 节提取附录源码。普通读者只需读第 1～8 节，代码附录不必逐行阅读。</w:t>
+        <w:t>这是一份可独立交给 Agent 的指南：附录包含本分享版的完整源码和校验值。工具没有公开下载网站或 GitHub 仓库；本文不会虚构一个下载地址。拿到配套源码 ZIP 时可以直接解压；只有本文时，Agent 可以按第 11 节提取附录源码。普通读者只需读第 1～8 节，代码附录不必逐行阅读。</w:t>
       </w:r>
     </w:p>
     <w:p>
@@ -1004,6 +1004,11 @@
       </w:pPr>
       <w:r>
         <w:t>7.1 登录自动启动与异常恢复</w:t>
+      </w:r>
+    </w:p>
+    <w:p>
+      <w:r>
+        <w:t>双击“自动恢复测试.command”可以实测异常恢复：脚本停止本工具的网页服务，等待最多 45 秒，检查新服务进程和原识别进程。结果保存到 work/recovery-test.json。测试只检查网页服务恢复，不模拟电脑重启，也不检查文稿准确率。</w:t>
       </w:r>
     </w:p>
     <w:p>
@@ -1720,7 +1725,7 @@
     </w:p>
     <w:p>
       <w:r>
-        <w:t>有源码 ZIP 就解压至目标目录；只有本文则运行第 11 节提取程序。先验证 文件校验.json；源码应不包含 分享者个人目录 的专用路径、个人历史任务 ID、个人 job.json、Cookie、.venv 或 work/model-cache。附录源码仅用于建立朋友电脑上的副本，不修改分享者正在运行的工具。</w:t>
+        <w:t>有源码 ZIP 就解压至目标目录；只有本文则运行第 11 节提取程序。先验证 文件校验.json；源码应不包含 ~ 的专用路径、个人历史任务 ID、个人 job.json、Cookie、.venv 或 work/model-cache。附录源码仅用于建立朋友电脑上的副本，不修改分享者正在运行的工具。</w:t>
       </w:r>
     </w:p>
     <w:p>
@@ -9998,6 +10003,14 @@
         <w:pStyle w:val="SourceCode"/>
       </w:pPr>
       <w:r>
+        <w:t xml:space="preserve">  "check_recovery.py": "7fb929eabc113b13551764fe57caa4f72e7f37f6cded04a75c590fe54e1a3d2d",</w:t>
+      </w:r>
+    </w:p>
+    <w:p>
+      <w:pPr>
+        <w:pStyle w:val="SourceCode"/>
+      </w:pPr>
+      <w:r>
         <w:t xml:space="preserve">  "index.html": "778754984ab08de8e9a3e258265d23793114a2f5fe4f188c10b1b627731d57fa",</w:t>
       </w:r>
     </w:p>
@@ -10086,6 +10099,14 @@
         <w:pStyle w:val="SourceCode"/>
       </w:pPr>
       <w:r>
+        <w:t xml:space="preserve">  "自动恢复测试.command": "e5f7e855d99cd648d6ae2e1382da651e8afb7597f184e08d1661d6daef5cc7f6",</w:t>
+      </w:r>
+    </w:p>
+    <w:p>
+      <w:pPr>
+        <w:pStyle w:val="SourceCode"/>
+      </w:pPr>
+      <w:r>
         <w:t xml:space="preserve">  "首次安装.command": "3386934c6c62f0983f9d9ee8541bf0d73a4fa671be319201efa649bf71c28d32"</w:t>
       </w:r>
     </w:p>
@@ -11357,6 +11378,570 @@
       </w:pPr>
       <w:r>
         <w:t>.venv/bin/python launch_service.py install --port 8767</w:t>
+      </w:r>
+    </w:p>
+    <w:p>
+      <w:pPr>
+        <w:pStyle w:val="SourceCode"/>
+      </w:pPr>
+      <w:r>
+        <w:t>result=$?</w:t>
+      </w:r>
+    </w:p>
+    <w:p>
+      <w:pPr>
+        <w:pStyle w:val="SourceCode"/>
+      </w:pPr>
+      <w:r>
+        <w:t>read 'reply?按回车关闭窗口。'</w:t>
+      </w:r>
+    </w:p>
+    <w:p>
+      <w:pPr>
+        <w:pStyle w:val="SourceCode"/>
+      </w:pPr>
+      <w:r>
+        <w:t>exit $result</w:t>
+      </w:r>
+    </w:p>
+    <w:p>
+      <w:pPr>
+        <w:pStyle w:val="SourceCode"/>
+      </w:pPr>
+      <w:r/>
+    </w:p>
+    <w:p>
+      <w:pPr>
+        <w:pStyle w:val="Heading2"/>
+      </w:pPr>
+      <w:r>
+        <w:t>FILE: check_recovery.py</w:t>
+      </w:r>
+    </w:p>
+    <w:p>
+      <w:pPr>
+        <w:pStyle w:val="SourceCode"/>
+      </w:pPr>
+      <w:r>
+        <w:t>"""Controlled launchd recovery check. Run from the normal Mac user environment."""</w:t>
+      </w:r>
+    </w:p>
+    <w:p>
+      <w:pPr>
+        <w:pStyle w:val="SourceCode"/>
+      </w:pPr>
+      <w:r>
+        <w:t>import argparse</w:t>
+      </w:r>
+    </w:p>
+    <w:p>
+      <w:pPr>
+        <w:pStyle w:val="SourceCode"/>
+      </w:pPr>
+      <w:r>
+        <w:t>import json</w:t>
+      </w:r>
+    </w:p>
+    <w:p>
+      <w:pPr>
+        <w:pStyle w:val="SourceCode"/>
+      </w:pPr>
+      <w:r>
+        <w:t>import os</w:t>
+      </w:r>
+    </w:p>
+    <w:p>
+      <w:pPr>
+        <w:pStyle w:val="SourceCode"/>
+      </w:pPr>
+      <w:r>
+        <w:t>import plistlib</w:t>
+      </w:r>
+    </w:p>
+    <w:p>
+      <w:pPr>
+        <w:pStyle w:val="SourceCode"/>
+      </w:pPr>
+      <w:r>
+        <w:t>import subprocess</w:t>
+      </w:r>
+    </w:p>
+    <w:p>
+      <w:pPr>
+        <w:pStyle w:val="SourceCode"/>
+      </w:pPr>
+      <w:r>
+        <w:t>import time</w:t>
+      </w:r>
+    </w:p>
+    <w:p>
+      <w:pPr>
+        <w:pStyle w:val="SourceCode"/>
+      </w:pPr>
+      <w:r>
+        <w:t>import urllib.request</w:t>
+      </w:r>
+    </w:p>
+    <w:p>
+      <w:pPr>
+        <w:pStyle w:val="SourceCode"/>
+      </w:pPr>
+      <w:r>
+        <w:t>from pathlib import Path</w:t>
+      </w:r>
+    </w:p>
+    <w:p>
+      <w:pPr>
+        <w:pStyle w:val="SourceCode"/>
+      </w:pPr>
+      <w:r>
+        <w:t>from launch_service import LABEL</w:t>
+      </w:r>
+    </w:p>
+    <w:p>
+      <w:pPr>
+        <w:pStyle w:val="SourceCode"/>
+      </w:pPr>
+      <w:r>
+        <w:t>ROOT=Path(__file__).resolve().parent</w:t>
+      </w:r>
+    </w:p>
+    <w:p>
+      <w:pPr>
+        <w:pStyle w:val="SourceCode"/>
+      </w:pPr>
+      <w:r/>
+    </w:p>
+    <w:p>
+      <w:pPr>
+        <w:pStyle w:val="SourceCode"/>
+      </w:pPr>
+      <w:r>
+        <w:t>def health(port):</w:t>
+      </w:r>
+    </w:p>
+    <w:p>
+      <w:pPr>
+        <w:pStyle w:val="SourceCode"/>
+      </w:pPr>
+      <w:r>
+        <w:t xml:space="preserve">    with urllib.request.urlopen(f'http://127.0.0.1:{port}/health',timeout=2) as response:</w:t>
+      </w:r>
+    </w:p>
+    <w:p>
+      <w:pPr>
+        <w:pStyle w:val="SourceCode"/>
+      </w:pPr>
+      <w:r>
+        <w:t xml:space="preserve">        data=json.load(response)</w:t>
+      </w:r>
+    </w:p>
+    <w:p>
+      <w:pPr>
+        <w:pStyle w:val="SourceCode"/>
+      </w:pPr>
+      <w:r>
+        <w:t xml:space="preserve">    if data.get('project')!=str(ROOT):raise ValueError('页面不属于当前项目，停止测试。')</w:t>
+      </w:r>
+    </w:p>
+    <w:p>
+      <w:pPr>
+        <w:pStyle w:val="SourceCode"/>
+      </w:pPr>
+      <w:r>
+        <w:t xml:space="preserve">    return data</w:t>
+      </w:r>
+    </w:p>
+    <w:p>
+      <w:pPr>
+        <w:pStyle w:val="SourceCode"/>
+      </w:pPr>
+      <w:r/>
+    </w:p>
+    <w:p>
+      <w:pPr>
+        <w:pStyle w:val="SourceCode"/>
+      </w:pPr>
+      <w:r>
+        <w:t>def reader_pids():</w:t>
+      </w:r>
+    </w:p>
+    <w:p>
+      <w:pPr>
+        <w:pStyle w:val="SourceCode"/>
+      </w:pPr>
+      <w:r>
+        <w:t xml:space="preserve">    pids=set()</w:t>
+      </w:r>
+    </w:p>
+    <w:p>
+      <w:pPr>
+        <w:pStyle w:val="SourceCode"/>
+      </w:pPr>
+      <w:r>
+        <w:t xml:space="preserve">    for lock in (ROOT/'work/jobs').glob('*/.prepare.lock'):</w:t>
+      </w:r>
+    </w:p>
+    <w:p>
+      <w:pPr>
+        <w:pStyle w:val="SourceCode"/>
+      </w:pPr>
+      <w:r>
+        <w:t xml:space="preserve">        result=subprocess.run(['/usr/sbin/lsof','-t',str(lock)],capture_output=True,text=True)</w:t>
+      </w:r>
+    </w:p>
+    <w:p>
+      <w:pPr>
+        <w:pStyle w:val="SourceCode"/>
+      </w:pPr>
+      <w:r>
+        <w:t xml:space="preserve">        pids.update(int(value) for value in result.stdout.split())</w:t>
+      </w:r>
+    </w:p>
+    <w:p>
+      <w:pPr>
+        <w:pStyle w:val="SourceCode"/>
+      </w:pPr>
+      <w:r>
+        <w:t xml:space="preserve">    return pids</w:t>
+      </w:r>
+    </w:p>
+    <w:p>
+      <w:pPr>
+        <w:pStyle w:val="SourceCode"/>
+      </w:pPr>
+      <w:r/>
+    </w:p>
+    <w:p>
+      <w:pPr>
+        <w:pStyle w:val="SourceCode"/>
+      </w:pPr>
+      <w:r>
+        <w:t>def run(port):</w:t>
+      </w:r>
+    </w:p>
+    <w:p>
+      <w:pPr>
+        <w:pStyle w:val="SourceCode"/>
+      </w:pPr>
+      <w:r>
+        <w:t xml:space="preserve">    report={'passed':False,'tested_at':time.time(),'port':port}</w:t>
+      </w:r>
+    </w:p>
+    <w:p>
+      <w:pPr>
+        <w:pStyle w:val="SourceCode"/>
+      </w:pPr>
+      <w:r>
+        <w:t xml:space="preserve">    try:</w:t>
+      </w:r>
+    </w:p>
+    <w:p>
+      <w:pPr>
+        <w:pStyle w:val="SourceCode"/>
+      </w:pPr>
+      <w:r>
+        <w:t xml:space="preserve">        path=Path.home()/'Library/LaunchAgents'/(LABEL+'.plist')</w:t>
+      </w:r>
+    </w:p>
+    <w:p>
+      <w:pPr>
+        <w:pStyle w:val="SourceCode"/>
+      </w:pPr>
+      <w:r>
+        <w:t xml:space="preserve">        config=plistlib.loads(path.read_bytes())</w:t>
+      </w:r>
+    </w:p>
+    <w:p>
+      <w:pPr>
+        <w:pStyle w:val="SourceCode"/>
+      </w:pPr>
+      <w:r>
+        <w:t xml:space="preserve">        if config.get('WorkingDirectory')!=str(ROOT) or not config.get('KeepAlive') or not config.get('AbandonProcessGroup'):</w:t>
+      </w:r>
+    </w:p>
+    <w:p>
+      <w:pPr>
+        <w:pStyle w:val="SourceCode"/>
+      </w:pPr>
+      <w:r>
+        <w:t xml:space="preserve">            raise ValueError('启动项不匹配或缺少自动恢复设置，未停止服务。')</w:t>
+      </w:r>
+    </w:p>
+    <w:p>
+      <w:pPr>
+        <w:pStyle w:val="SourceCode"/>
+      </w:pPr>
+      <w:r>
+        <w:t xml:space="preserve">        before=health(port);report['before_pid']=before['pid']</w:t>
+      </w:r>
+    </w:p>
+    <w:p>
+      <w:pPr>
+        <w:pStyle w:val="SourceCode"/>
+      </w:pPr>
+      <w:r>
+        <w:t xml:space="preserve">        readers=reader_pids()-{before['pid']}</w:t>
+      </w:r>
+    </w:p>
+    <w:p>
+      <w:pPr>
+        <w:pStyle w:val="SourceCode"/>
+      </w:pPr>
+      <w:r>
+        <w:t xml:space="preserve">        started=time.monotonic()</w:t>
+      </w:r>
+    </w:p>
+    <w:p>
+      <w:pPr>
+        <w:pStyle w:val="SourceCode"/>
+      </w:pPr>
+      <w:r>
+        <w:t xml:space="preserve">        result=subprocess.run(['/bin/launchctl','kill','SIGTERM',f'gui/{os.getuid()}/{LABEL}'],capture_output=True,text=True)</w:t>
+      </w:r>
+    </w:p>
+    <w:p>
+      <w:pPr>
+        <w:pStyle w:val="SourceCode"/>
+      </w:pPr>
+      <w:r>
+        <w:t xml:space="preserve">        if result.returncode:raise RuntimeError(result.stderr.strip())</w:t>
+      </w:r>
+    </w:p>
+    <w:p>
+      <w:pPr>
+        <w:pStyle w:val="SourceCode"/>
+      </w:pPr>
+      <w:r>
+        <w:t xml:space="preserve">        while time.monotonic()-started&lt;45:</w:t>
+      </w:r>
+    </w:p>
+    <w:p>
+      <w:pPr>
+        <w:pStyle w:val="SourceCode"/>
+      </w:pPr>
+      <w:r>
+        <w:t xml:space="preserve">            try:</w:t>
+      </w:r>
+    </w:p>
+    <w:p>
+      <w:pPr>
+        <w:pStyle w:val="SourceCode"/>
+      </w:pPr>
+      <w:r>
+        <w:t xml:space="preserve">                after=health(port)</w:t>
+      </w:r>
+    </w:p>
+    <w:p>
+      <w:pPr>
+        <w:pStyle w:val="SourceCode"/>
+      </w:pPr>
+      <w:r>
+        <w:t xml:space="preserve">                if after['pid']!=before['pid']:</w:t>
+      </w:r>
+    </w:p>
+    <w:p>
+      <w:pPr>
+        <w:pStyle w:val="SourceCode"/>
+      </w:pPr>
+      <w:r>
+        <w:t xml:space="preserve">                    report.update(after_pid=after['pid'],recovery_seconds=round(time.monotonic()-started,2))</w:t>
+      </w:r>
+    </w:p>
+    <w:p>
+      <w:pPr>
+        <w:pStyle w:val="SourceCode"/>
+      </w:pPr>
+      <w:r>
+        <w:t xml:space="preserve">                    with urllib.request.urlopen(f'http://127.0.0.1:{port}/jobs') as response:</w:t>
+      </w:r>
+    </w:p>
+    <w:p>
+      <w:pPr>
+        <w:pStyle w:val="SourceCode"/>
+      </w:pPr>
+      <w:r>
+        <w:t xml:space="preserve">                        report['task_count']=len(json.load(response))</w:t>
+      </w:r>
+    </w:p>
+    <w:p>
+      <w:pPr>
+        <w:pStyle w:val="SourceCode"/>
+      </w:pPr>
+      <w:r>
+        <w:t xml:space="preserve">                    for pid in readers:</w:t>
+      </w:r>
+    </w:p>
+    <w:p>
+      <w:pPr>
+        <w:pStyle w:val="SourceCode"/>
+      </w:pPr>
+      <w:r>
+        <w:t xml:space="preserve">                        try:os.kill(pid,0)</w:t>
+      </w:r>
+    </w:p>
+    <w:p>
+      <w:pPr>
+        <w:pStyle w:val="SourceCode"/>
+      </w:pPr>
+      <w:r>
+        <w:t xml:space="preserve">                        except ProcessLookupError:raise RuntimeError('原识别进程已退出，需要检查是否正常完成。')</w:t>
+      </w:r>
+    </w:p>
+    <w:p>
+      <w:pPr>
+        <w:pStyle w:val="SourceCode"/>
+      </w:pPr>
+      <w:r>
+        <w:t xml:space="preserve">                    report.update(passed=True,preserved_reader_pids=sorted(readers));break</w:t>
+      </w:r>
+    </w:p>
+    <w:p>
+      <w:pPr>
+        <w:pStyle w:val="SourceCode"/>
+      </w:pPr>
+      <w:r>
+        <w:t xml:space="preserve">            except OSError:pass</w:t>
+      </w:r>
+    </w:p>
+    <w:p>
+      <w:pPr>
+        <w:pStyle w:val="SourceCode"/>
+      </w:pPr>
+      <w:r>
+        <w:t xml:space="preserve">            time.sleep(.5)</w:t>
+      </w:r>
+    </w:p>
+    <w:p>
+      <w:pPr>
+        <w:pStyle w:val="SourceCode"/>
+      </w:pPr>
+      <w:r>
+        <w:t xml:space="preserve">        if not report['passed']:raise RuntimeError('45 秒内未观察到网页服务恢复。')</w:t>
+      </w:r>
+    </w:p>
+    <w:p>
+      <w:pPr>
+        <w:pStyle w:val="SourceCode"/>
+      </w:pPr>
+      <w:r>
+        <w:t xml:space="preserve">    except (OSError,ValueError,RuntimeError) as error:report['error']=str(error)</w:t>
+      </w:r>
+    </w:p>
+    <w:p>
+      <w:pPr>
+        <w:pStyle w:val="SourceCode"/>
+      </w:pPr>
+      <w:r>
+        <w:t xml:space="preserve">    finally:</w:t>
+      </w:r>
+    </w:p>
+    <w:p>
+      <w:pPr>
+        <w:pStyle w:val="SourceCode"/>
+      </w:pPr>
+      <w:r>
+        <w:t xml:space="preserve">        (ROOT/'work').mkdir(exist_ok=True)</w:t>
+      </w:r>
+    </w:p>
+    <w:p>
+      <w:pPr>
+        <w:pStyle w:val="SourceCode"/>
+      </w:pPr>
+      <w:r>
+        <w:t xml:space="preserve">        (ROOT/'work/recovery-test.json').write_text(json.dumps(report,ensure_ascii=False,indent=2)+'\n')</w:t>
+      </w:r>
+    </w:p>
+    <w:p>
+      <w:pPr>
+        <w:pStyle w:val="SourceCode"/>
+      </w:pPr>
+      <w:r>
+        <w:t xml:space="preserve">    print(json.dumps(report,ensure_ascii=False,indent=2))</w:t>
+      </w:r>
+    </w:p>
+    <w:p>
+      <w:pPr>
+        <w:pStyle w:val="SourceCode"/>
+      </w:pPr>
+      <w:r>
+        <w:t xml:space="preserve">    if not report['passed']:raise SystemExit('测试未通过或未能执行，请保留以上报错。')</w:t>
+      </w:r>
+    </w:p>
+    <w:p>
+      <w:pPr>
+        <w:pStyle w:val="SourceCode"/>
+      </w:pPr>
+      <w:r>
+        <w:t xml:space="preserve">    print('自动恢复实测通过，原识别进程保留。')</w:t>
+      </w:r>
+    </w:p>
+    <w:p>
+      <w:pPr>
+        <w:pStyle w:val="SourceCode"/>
+      </w:pPr>
+      <w:r/>
+    </w:p>
+    <w:p>
+      <w:pPr>
+        <w:pStyle w:val="SourceCode"/>
+      </w:pPr>
+      <w:r>
+        <w:t>if __name__=='__main__':</w:t>
+      </w:r>
+    </w:p>
+    <w:p>
+      <w:pPr>
+        <w:pStyle w:val="SourceCode"/>
+      </w:pPr>
+      <w:r>
+        <w:t xml:space="preserve">    parser=argparse.ArgumentParser();parser.add_argument('--port',type=int,default=8767)</w:t>
+      </w:r>
+    </w:p>
+    <w:p>
+      <w:pPr>
+        <w:pStyle w:val="SourceCode"/>
+      </w:pPr>
+      <w:r>
+        <w:t xml:space="preserve">    run(parser.parse_args().port)</w:t>
+      </w:r>
+    </w:p>
+    <w:p>
+      <w:pPr>
+        <w:pStyle w:val="SourceCode"/>
+      </w:pPr>
+      <w:r/>
+    </w:p>
+    <w:p>
+      <w:pPr>
+        <w:pStyle w:val="Heading2"/>
+      </w:pPr>
+      <w:r>
+        <w:t>FILE: 自动恢复测试.command</w:t>
+      </w:r>
+    </w:p>
+    <w:p>
+      <w:pPr>
+        <w:pStyle w:val="SourceCode"/>
+      </w:pPr>
+      <w:r>
+        <w:t>#!/bin/zsh</w:t>
+      </w:r>
+    </w:p>
+    <w:p>
+      <w:pPr>
+        <w:pStyle w:val="SourceCode"/>
+      </w:pPr>
+      <w:r>
+        <w:t>cd "${0:A:h}" || exit 1</w:t>
+      </w:r>
+    </w:p>
+    <w:p>
+      <w:pPr>
+        <w:pStyle w:val="SourceCode"/>
+      </w:pPr>
+      <w:r>
+        <w:t>.venv/bin/python check_recovery.py --port 8767</w:t>
       </w:r>
     </w:p>
     <w:p>

</xml_diff>

<commit_message>
Add experimental Qianwen web transcription option with isolated login and verified Word import
</commit_message>
<xml_diff>
--- a/安装与使用指南.docx
+++ b/安装与使用指南.docx
@@ -996,6 +996,29 @@
     <w:p>
       <w:r>
         <w:t>卸载：先停用自动启动，并确认识别子进程已完成后，把 VideoTranscript 文件夹移入废纸篓。输出 Word 文件夹是独立的，想保留就不要删除。Python 和 Node 可能被其他软件使用，不要因为卸载本工具就自动卸载它们。</w:t>
+      </w:r>
+    </w:p>
+    <w:p>
+      <w:pPr>
+        <w:pStyle w:val="Heading2"/>
+      </w:pPr>
+      <w:r>
+        <w:t>千问网页识别（实验性可选功能）</w:t>
+      </w:r>
+    </w:p>
+    <w:p>
+      <w:r>
+        <w:t>页面的识别方式可以选择“千问网页”。首次双击项目中的“配置千问登录.command”，安装官方 Playwright/Chromium 后，在工具专用浏览器中登录千问，回到终端按回车。登录资料保存在本机 work/qianwen-browser-profile，不上传 GitHub。后续任务使用无窗口浏览器，音频会上传千问服务器。</w:t>
+      </w:r>
+    </w:p>
+    <w:p>
+      <w:r>
+        <w:t>设置固定为中英文自由说、不翻译、多人讨论；只导出原文 Word，必须包含发言人和时间戳。导出后生成本项目格式的 Word，并执行原有文档检查和废纸篓清理。千问网页单文件上限为6小时，音频500MB；工具使用64kbps MP3上传。网站额度、验证码、登录失效、页面变化可能中断，此时保留原媒体并显示失败，不绕过验证码、不自动购买额度。</w:t>
+      </w:r>
+    </w:p>
+    <w:p>
+      <w:r>
+        <w:t>当前验证：已通过 Codex 隐藏浏览器完成20秒音频上传、转写和带发言人/时间戳的原文Word导出；真实导出解析与14项程序测试通过。专用无窗口浏览器的完整流程尚未实测，不能视为已验证的全自动功能。首次专用浏览器登录后，应先测试短视频再处理长视频。本地模型仍是默认选项，已有任务不自动切换。</w:t>
       </w:r>
     </w:p>
     <w:p>
@@ -3169,7 +3192,15 @@
         <w:pStyle w:val="SourceCode"/>
       </w:pPr>
       <w:r>
-        <w:t xml:space="preserve">                                        'prepare', url], stdout=log, stderr=log)</w:t>
+        <w:t xml:space="preserve">                                        'prepare', url, '--engine',</w:t>
+      </w:r>
+    </w:p>
+    <w:p>
+      <w:pPr>
+        <w:pStyle w:val="SourceCode"/>
+      </w:pPr>
+      <w:r>
+        <w:t xml:space="preserve">                                        json.loads((folder/'job.json').read_text()).get('engine', 'local')], stdout=log, stderr=log)</w:t>
       </w:r>
     </w:p>
     <w:p>
@@ -3237,7 +3268,23 @@
         <w:pStyle w:val="SourceCode"/>
       </w:pPr>
       <w:r>
-        <w:t>def enqueue(url):</w:t>
+        <w:t>def enqueue(url, engine="local"):</w:t>
+      </w:r>
+    </w:p>
+    <w:p>
+      <w:pPr>
+        <w:pStyle w:val="SourceCode"/>
+      </w:pPr>
+      <w:r>
+        <w:t xml:space="preserve">    if engine not in ("local", "qianwen"):</w:t>
+      </w:r>
+    </w:p>
+    <w:p>
+      <w:pPr>
+        <w:pStyle w:val="SourceCode"/>
+      </w:pPr>
+      <w:r>
+        <w:t xml:space="preserve">        raise ValueError("不支持的语音识别方式")</w:t>
       </w:r>
     </w:p>
     <w:p>
@@ -3389,7 +3436,7 @@
         <w:pStyle w:val="SourceCode"/>
       </w:pPr>
       <w:r>
-        <w:t xml:space="preserve">            meta.update(url=url, state='queued')</w:t>
+        <w:t xml:space="preserve">            meta.update(url=url, state='queued', engine=engine)</w:t>
       </w:r>
     </w:p>
     <w:p>
@@ -3621,7 +3668,7 @@
         <w:pStyle w:val="SourceCode"/>
       </w:pPr>
       <w:r>
-        <w:t xml:space="preserve">            return self.reply(200, {'ok': True, 'project': str(ROOT), 'pid': os.getpid()})</w:t>
+        <w:t xml:space="preserve">            return self.reply(200, {'ok': True, 'project': str(ROOT), 'pid': os.getpid(), 'engines': ['local', 'qianwen']})</w:t>
       </w:r>
     </w:p>
     <w:p>
@@ -3859,7 +3906,7 @@
         <w:pStyle w:val="SourceCode"/>
       </w:pPr>
       <w:r>
-        <w:t xml:space="preserve">                return self.reply(200, {'id': enqueue(data['url'].strip())})</w:t>
+        <w:t xml:space="preserve">                return self.reply(200, {'id': enqueue(data['url'].strip(), data.get('engine', 'local'))})</w:t>
       </w:r>
     </w:p>
     <w:p>
@@ -4069,7 +4116,7 @@
         <w:pStyle w:val="SourceCode"/>
       </w:pPr>
       <w:r>
-        <w:t>&lt;form id="form"&gt;&lt;input id="url" aria-label="音视频网页链接" type="url" required placeholder="粘贴 YouTube、哔哩哔哩等音视频网页链接"&gt;&lt;button&gt;开始生成文稿&lt;/button&gt;&lt;/form&gt;</w:t>
+        <w:t>&lt;form id="form"&gt;&lt;input id="url" aria-label="音视频网页链接" type="url" required placeholder="粘贴 YouTube、哔哩哔哩等音视频网页链接"&gt;&lt;select id="engine" aria-label="识别方式"&gt;&lt;option value="local"&gt;本地模型&lt;/option&gt;&lt;option value="qianwen"&gt;千问网页（需首次配置登录）&lt;/option&gt;&lt;/select&gt;&lt;button&gt;开始生成文稿&lt;/button&gt;&lt;/form&gt;</w:t>
       </w:r>
     </w:p>
     <w:p>
@@ -4093,7 +4140,7 @@
         <w:pStyle w:val="SourceCode"/>
       </w:pPr>
       <w:r>
-        <w:t>&lt;p&gt;&lt;small&gt;Word 保存到“下载/网页视频转语音识别文字稿”。无需提交给其他 AI；完成后直接查看或打开所在位置。Word 完整性检查通过后自动将原音视频移入废纸篓并清理临时音轨。&lt;/small&gt;&lt;/p&gt;</w:t>
+        <w:t>&lt;p&gt;&lt;small&gt;Word 保存到“下载/网页视频转语音识别文字稿”。选择千问时，音频将上传千问服务器；首次双击“配置千问登录.command”登录。完成后直接查看或打开所在位置。Word 完整性检查通过后自动将原音视频移入废纸篓并清理临时音轨。&lt;/small&gt;&lt;/p&gt;</w:t>
       </w:r>
     </w:p>
     <w:p>
@@ -4125,7 +4172,7 @@
         <w:pStyle w:val="SourceCode"/>
       </w:pPr>
       <w:r>
-        <w:t>const stages={queued:'排队中',downloading:'正在下载',downloaded:'下载完成',diarizing:'本地模型正在区分发言人',transcribing:'本地模型正在识别语音',completed:'Word 已生成，可以查看',failed:'处理失败，进度已保留'};</w:t>
+        <w:t>const stages={queued:'排队中',downloading:'正在下载',downloaded:'下载完成',diarizing:'本地模型正在区分发言人',transcribing:'本地模型正在识别语音',cloud_transcribing:'千问正在后台识别语音',cloud_exporting:'正在导出千问原文 Word',completed:'Word 已生成，可以查看',failed:'处理失败，进度已保留'};</w:t>
       </w:r>
     </w:p>
     <w:p>
@@ -4149,7 +4196,7 @@
         <w:pStyle w:val="SourceCode"/>
       </w:pPr>
       <w:r>
-        <w:t>document.querySelector('#form').onsubmit=async e=&gt;{e.preventDefault();try{await post('/jobs',{url:document.querySelector('#url').value});msg.textContent='已加入后台队列。你可以继续做其他事情，稍后回来查看文稿。';await refresh()}catch(e){msg.textContent=e.message}};</w:t>
+        <w:t>document.querySelector('#form').onsubmit=async e=&gt;{e.preventDefault();try{if(document.querySelector('#engine').value==='qianwen'){let health=await(await fetch('/health')).json();if(!health.engines?.includes('qianwen'))throw Error('网页服务需要加载新版。请完成千问登录配置后再试。')}await post('/jobs',{url:document.querySelector('#url').value,engine:document.querySelector('#engine').value});msg.textContent='已加入后台队列。你可以继续做其他事情，稍后回来查看文稿。';await refresh()}catch(e){msg.textContent=e.message}};</w:t>
       </w:r>
     </w:p>
     <w:p>
@@ -4599,14 +4646,6 @@
         <w:pStyle w:val="SourceCode"/>
       </w:pPr>
       <w:r>
-        <w:t>import shutil</w:t>
-      </w:r>
-    </w:p>
-    <w:p>
-      <w:pPr>
-        <w:pStyle w:val="SourceCode"/>
-      </w:pPr>
-      <w:r>
         <w:t>from pathlib import Path</w:t>
       </w:r>
     </w:p>
@@ -6249,23 +6288,31 @@
         <w:pStyle w:val="SourceCode"/>
       </w:pPr>
       <w:r>
-        <w:t xml:space="preserve">            node = shutil.which('node')</w:t>
-      </w:r>
-    </w:p>
-    <w:p>
-      <w:pPr>
-        <w:pStyle w:val="SourceCode"/>
-      </w:pPr>
-      <w:r>
-        <w:t xml:space="preserve">            if node:</w:t>
-      </w:r>
-    </w:p>
-    <w:p>
-      <w:pPr>
-        <w:pStyle w:val="SourceCode"/>
-      </w:pPr>
-      <w:r>
-        <w:t xml:space="preserve">                options['js_runtimes'] = {'node': {'path': node}}</w:t>
+        <w:t xml:space="preserve">            import shutil</w:t>
+      </w:r>
+    </w:p>
+    <w:p>
+      <w:pPr>
+        <w:pStyle w:val="SourceCode"/>
+      </w:pPr>
+      <w:r>
+        <w:t xml:space="preserve">            node = Path(shutil.which('node') or '/nonexistent')</w:t>
+      </w:r>
+    </w:p>
+    <w:p>
+      <w:pPr>
+        <w:pStyle w:val="SourceCode"/>
+      </w:pPr>
+      <w:r>
+        <w:t xml:space="preserve">            if node.exists():</w:t>
+      </w:r>
+    </w:p>
+    <w:p>
+      <w:pPr>
+        <w:pStyle w:val="SourceCode"/>
+      </w:pPr>
+      <w:r>
+        <w:t xml:space="preserve">                options['js_runtimes'] = {'node': {'path': str(node)}}</w:t>
       </w:r>
     </w:p>
     <w:p>
@@ -6609,15 +6656,55 @@
         <w:pStyle w:val="SourceCode"/>
       </w:pPr>
       <w:r>
-        <w:t xml:space="preserve">            if raw.get('model') != args.model:</w:t>
-      </w:r>
-    </w:p>
-    <w:p>
-      <w:pPr>
-        <w:pStyle w:val="SourceCode"/>
-      </w:pPr>
-      <w:r>
-        <w:t xml:space="preserve">                raw = transcribe_qwen(wav, job, meta, args.model)</w:t>
+        <w:t xml:space="preserve">            wanted_model = 'qianwen-web' if getattr(args, 'engine', 'local') == 'qianwen' else args.model</w:t>
+      </w:r>
+    </w:p>
+    <w:p>
+      <w:pPr>
+        <w:pStyle w:val="SourceCode"/>
+      </w:pPr>
+      <w:r>
+        <w:t xml:space="preserve">            if raw.get('model') != wanted_model:</w:t>
+      </w:r>
+    </w:p>
+    <w:p>
+      <w:pPr>
+        <w:pStyle w:val="SourceCode"/>
+      </w:pPr>
+      <w:r>
+        <w:t xml:space="preserve">                if wanted_model == 'qianwen-web':</w:t>
+      </w:r>
+    </w:p>
+    <w:p>
+      <w:pPr>
+        <w:pStyle w:val="SourceCode"/>
+      </w:pPr>
+      <w:r>
+        <w:t xml:space="preserve">                    from qianwen_browser import export_audio</w:t>
+      </w:r>
+    </w:p>
+    <w:p>
+      <w:pPr>
+        <w:pStyle w:val="SourceCode"/>
+      </w:pPr>
+      <w:r>
+        <w:t xml:space="preserve">                    raw = export_audio(wav, job, meta, save_json)</w:t>
+      </w:r>
+    </w:p>
+    <w:p>
+      <w:pPr>
+        <w:pStyle w:val="SourceCode"/>
+      </w:pPr>
+      <w:r>
+        <w:t xml:space="preserve">                else:</w:t>
+      </w:r>
+    </w:p>
+    <w:p>
+      <w:pPr>
+        <w:pStyle w:val="SourceCode"/>
+      </w:pPr>
+      <w:r>
+        <w:t xml:space="preserve">                    raw = transcribe_qwen(wav, job, meta, args.model)</w:t>
       </w:r>
     </w:p>
     <w:p>
@@ -7889,6 +7976,14 @@
         <w:pStyle w:val="SourceCode"/>
       </w:pPr>
       <w:r>
+        <w:t xml:space="preserve">    prep.add_argument('--engine', choices=['local', 'qianwen'], default='local')</w:t>
+      </w:r>
+    </w:p>
+    <w:p>
+      <w:pPr>
+        <w:pStyle w:val="SourceCode"/>
+      </w:pPr>
+      <w:r>
         <w:t xml:space="preserve">    prep.add_argument('--cookies-browser', choices=['chrome', 'safari', 'firefox', 'edge'])</w:t>
       </w:r>
     </w:p>
@@ -9995,7 +10090,7 @@
         <w:pStyle w:val="SourceCode"/>
       </w:pPr>
       <w:r>
-        <w:t xml:space="preserve">  "app.py": "1460585eb00541738a8c8b32a1b60f908e77091b4bfa19734b7c42e665ef340a",</w:t>
+        <w:t xml:space="preserve">  "app.py": "ed518a900637030efbd2512ab549d760c25ff6ec9a94f1449ccb43582e2618e6",</w:t>
       </w:r>
     </w:p>
     <w:p>
@@ -10011,7 +10106,7 @@
         <w:pStyle w:val="SourceCode"/>
       </w:pPr>
       <w:r>
-        <w:t xml:space="preserve">  "index.html": "778754984ab08de8e9a3e258265d23793114a2f5fe4f188c10b1b627731d57fa",</w:t>
+        <w:t xml:space="preserve">  "index.html": "f4aacf140caeac36a16fa1692a473af9a1c98a547650f323b7b6b1eae8bc601a",</w:t>
       </w:r>
     </w:p>
     <w:p>
@@ -10043,7 +10138,15 @@
         <w:pStyle w:val="SourceCode"/>
       </w:pPr>
       <w:r>
-        <w:t xml:space="preserve">  "reader.py": "6847c329c06126638b7de798df74b2c7f5c0a15de0e59185f50d902efeada13f",</w:t>
+        <w:t xml:space="preserve">  "qianwen_browser.py": "daa1fea0b087bd1c48a2e4465ba2c1a5905489781f3de3ee6ca792782250d12e",</w:t>
+      </w:r>
+    </w:p>
+    <w:p>
+      <w:pPr>
+        <w:pStyle w:val="SourceCode"/>
+      </w:pPr>
+      <w:r>
+        <w:t xml:space="preserve">  "reader.py": "249c75d6bddae4a34db213168606a669dac8308707a7bf7dc20df992fad73ed8",</w:t>
       </w:r>
     </w:p>
     <w:p>
@@ -10067,6 +10170,14 @@
         <w:pStyle w:val="SourceCode"/>
       </w:pPr>
       <w:r>
+        <w:t xml:space="preserve">  "test_qianwen.py": "d95d8b70b0948906667d2de5389c00fbef90476554551beee1308e988d5dacc9",</w:t>
+      </w:r>
+    </w:p>
+    <w:p>
+      <w:pPr>
+        <w:pStyle w:val="SourceCode"/>
+      </w:pPr>
+      <w:r>
         <w:t xml:space="preserve">  "test_reader.py": "ea7af8f55bfe4c47023ee9f712b6b078cfc9dd0beedec2325134556970fdc059",</w:t>
       </w:r>
     </w:p>
@@ -10107,6 +10218,14 @@
         <w:pStyle w:val="SourceCode"/>
       </w:pPr>
       <w:r>
+        <w:t xml:space="preserve">  "配置千问登录.command": "3bc9b14516ab4c169b0cd7a9c595778965167f7f7ce533eab5ad7b3abd835fac",</w:t>
+      </w:r>
+    </w:p>
+    <w:p>
+      <w:pPr>
+        <w:pStyle w:val="SourceCode"/>
+      </w:pPr>
+      <w:r>
         <w:t xml:space="preserve">  "首次安装.command": "3386934c6c62f0983f9d9ee8541bf0d73a4fa671be319201efa649bf71c28d32"</w:t>
       </w:r>
     </w:p>
@@ -11966,6 +12085,1278 @@
       </w:pPr>
       <w:r>
         <w:t>exit $result</w:t>
+      </w:r>
+    </w:p>
+    <w:p>
+      <w:pPr>
+        <w:pStyle w:val="SourceCode"/>
+      </w:pPr>
+      <w:r/>
+    </w:p>
+    <w:p>
+      <w:pPr>
+        <w:pStyle w:val="Heading2"/>
+      </w:pPr>
+      <w:r>
+        <w:t>FILE: qianwen_browser.py</w:t>
+      </w:r>
+    </w:p>
+    <w:p>
+      <w:pPr>
+        <w:pStyle w:val="SourceCode"/>
+      </w:pPr>
+      <w:r>
+        <w:t>"""Qianwen web adapter. Uses an isolated local browser profile, never private APIs."""</w:t>
+      </w:r>
+    </w:p>
+    <w:p>
+      <w:pPr>
+        <w:pStyle w:val="SourceCode"/>
+      </w:pPr>
+      <w:r>
+        <w:t>import os</w:t>
+      </w:r>
+    </w:p>
+    <w:p>
+      <w:pPr>
+        <w:pStyle w:val="SourceCode"/>
+      </w:pPr>
+      <w:r>
+        <w:t>import argparse</w:t>
+      </w:r>
+    </w:p>
+    <w:p>
+      <w:pPr>
+        <w:pStyle w:val="SourceCode"/>
+      </w:pPr>
+      <w:r>
+        <w:t>import re</w:t>
+      </w:r>
+    </w:p>
+    <w:p>
+      <w:pPr>
+        <w:pStyle w:val="SourceCode"/>
+      </w:pPr>
+      <w:r>
+        <w:t>import subprocess</w:t>
+      </w:r>
+    </w:p>
+    <w:p>
+      <w:pPr>
+        <w:pStyle w:val="SourceCode"/>
+      </w:pPr>
+      <w:r>
+        <w:t>import time</w:t>
+      </w:r>
+    </w:p>
+    <w:p>
+      <w:pPr>
+        <w:pStyle w:val="SourceCode"/>
+      </w:pPr>
+      <w:r>
+        <w:t>from pathlib import Path</w:t>
+      </w:r>
+    </w:p>
+    <w:p>
+      <w:pPr>
+        <w:pStyle w:val="SourceCode"/>
+      </w:pPr>
+      <w:r/>
+    </w:p>
+    <w:p>
+      <w:pPr>
+        <w:pStyle w:val="SourceCode"/>
+      </w:pPr>
+      <w:r>
+        <w:t>ROOT = Path(__file__).resolve().parent</w:t>
+      </w:r>
+    </w:p>
+    <w:p>
+      <w:pPr>
+        <w:pStyle w:val="SourceCode"/>
+      </w:pPr>
+      <w:r>
+        <w:t>os.environ.setdefault('PLAYWRIGHT_BROWSERS_PATH', str(ROOT/'work/browser-bin'))</w:t>
+      </w:r>
+    </w:p>
+    <w:p>
+      <w:pPr>
+        <w:pStyle w:val="SourceCode"/>
+      </w:pPr>
+      <w:r>
+        <w:t>PROFILE = ROOT / 'work/qianwen-browser-profile'</w:t>
+      </w:r>
+    </w:p>
+    <w:p>
+      <w:pPr>
+        <w:pStyle w:val="SourceCode"/>
+      </w:pPr>
+      <w:r>
+        <w:t>URL = 'https://www.qianwen.com/discover/audioread'</w:t>
+      </w:r>
+    </w:p>
+    <w:p>
+      <w:pPr>
+        <w:pStyle w:val="SourceCode"/>
+      </w:pPr>
+      <w:r>
+        <w:t>MODEL = 'qianwen-web'</w:t>
+      </w:r>
+    </w:p>
+    <w:p>
+      <w:pPr>
+        <w:pStyle w:val="SourceCode"/>
+      </w:pPr>
+      <w:r/>
+    </w:p>
+    <w:p>
+      <w:pPr>
+        <w:pStyle w:val="SourceCode"/>
+      </w:pPr>
+      <w:r/>
+    </w:p>
+    <w:p>
+      <w:pPr>
+        <w:pStyle w:val="SourceCode"/>
+      </w:pPr>
+      <w:r>
+        <w:t>def read_export(path, duration):</w:t>
+      </w:r>
+    </w:p>
+    <w:p>
+      <w:pPr>
+        <w:pStyle w:val="SourceCode"/>
+      </w:pPr>
+      <w:r>
+        <w:t xml:space="preserve">    from docx import Document</w:t>
+      </w:r>
+    </w:p>
+    <w:p>
+      <w:pPr>
+        <w:pStyle w:val="SourceCode"/>
+      </w:pPr>
+      <w:r>
+        <w:t xml:space="preserve">    doc = Document(path)</w:t>
+      </w:r>
+    </w:p>
+    <w:p>
+      <w:pPr>
+        <w:pStyle w:val="SourceCode"/>
+      </w:pPr>
+      <w:r>
+        <w:t xml:space="preserve">    segments = []</w:t>
+      </w:r>
+    </w:p>
+    <w:p>
+      <w:pPr>
+        <w:pStyle w:val="SourceCode"/>
+      </w:pPr>
+      <w:r>
+        <w:t xml:space="preserve">    current = None</w:t>
+      </w:r>
+    </w:p>
+    <w:p>
+      <w:pPr>
+        <w:pStyle w:val="SourceCode"/>
+      </w:pPr>
+      <w:r>
+        <w:t xml:space="preserve">    for paragraph in doc.paragraphs:</w:t>
+      </w:r>
+    </w:p>
+    <w:p>
+      <w:pPr>
+        <w:pStyle w:val="SourceCode"/>
+      </w:pPr>
+      <w:r>
+        <w:t xml:space="preserve">        text = paragraph.text.strip()</w:t>
+      </w:r>
+    </w:p>
+    <w:p>
+      <w:pPr>
+        <w:pStyle w:val="SourceCode"/>
+      </w:pPr>
+      <w:r>
+        <w:t xml:space="preserve">        match = re.fullmatch(r'(发言人.*?)\s+((?:\d+:)?\d{2}:\d{2})', text)</w:t>
+      </w:r>
+    </w:p>
+    <w:p>
+      <w:pPr>
+        <w:pStyle w:val="SourceCode"/>
+      </w:pPr>
+      <w:r>
+        <w:t xml:space="preserve">        if match:</w:t>
+      </w:r>
+    </w:p>
+    <w:p>
+      <w:pPr>
+        <w:pStyle w:val="SourceCode"/>
+      </w:pPr>
+      <w:r>
+        <w:t xml:space="preserve">            parts = list(map(int, match[2].split(':')))</w:t>
+      </w:r>
+    </w:p>
+    <w:p>
+      <w:pPr>
+        <w:pStyle w:val="SourceCode"/>
+      </w:pPr>
+      <w:r>
+        <w:t xml:space="preserve">            seconds = sum(n * 60 ** i for i, n in enumerate(reversed(parts)))</w:t>
+      </w:r>
+    </w:p>
+    <w:p>
+      <w:pPr>
+        <w:pStyle w:val="SourceCode"/>
+      </w:pPr>
+      <w:r>
+        <w:t xml:space="preserve">            if seconds &gt; duration + 5 or (segments and seconds &lt; segments[-1]['start']):</w:t>
+      </w:r>
+    </w:p>
+    <w:p>
+      <w:pPr>
+        <w:pStyle w:val="SourceCode"/>
+      </w:pPr>
+      <w:r>
+        <w:t xml:space="preserve">                raise ValueError('千问时间戳与音频时长不符，保留原媒体')</w:t>
+      </w:r>
+    </w:p>
+    <w:p>
+      <w:pPr>
+        <w:pStyle w:val="SourceCode"/>
+      </w:pPr>
+      <w:r>
+        <w:t xml:space="preserve">            if current is not None:</w:t>
+      </w:r>
+    </w:p>
+    <w:p>
+      <w:pPr>
+        <w:pStyle w:val="SourceCode"/>
+      </w:pPr>
+      <w:r>
+        <w:t xml:space="preserve">                current['end'] = seconds</w:t>
+      </w:r>
+    </w:p>
+    <w:p>
+      <w:pPr>
+        <w:pStyle w:val="SourceCode"/>
+      </w:pPr>
+      <w:r>
+        <w:t xml:space="preserve">            current = {'start': seconds, 'end': duration, 'speaker': match[1], 'text': ''}</w:t>
+      </w:r>
+    </w:p>
+    <w:p>
+      <w:pPr>
+        <w:pStyle w:val="SourceCode"/>
+      </w:pPr>
+      <w:r>
+        <w:t xml:space="preserve">            segments.append(current)</w:t>
+      </w:r>
+    </w:p>
+    <w:p>
+      <w:pPr>
+        <w:pStyle w:val="SourceCode"/>
+      </w:pPr>
+      <w:r>
+        <w:t xml:space="preserve">        elif current is not None and text:</w:t>
+      </w:r>
+    </w:p>
+    <w:p>
+      <w:pPr>
+        <w:pStyle w:val="SourceCode"/>
+      </w:pPr>
+      <w:r>
+        <w:t xml:space="preserve">            current['text'] += ('\n' if current['text'] else '') + text</w:t>
+      </w:r>
+    </w:p>
+    <w:p>
+      <w:pPr>
+        <w:pStyle w:val="SourceCode"/>
+      </w:pPr>
+      <w:r>
+        <w:t xml:space="preserve">    if doc.tables:</w:t>
+      </w:r>
+    </w:p>
+    <w:p>
+      <w:pPr>
+        <w:pStyle w:val="SourceCode"/>
+      </w:pPr>
+      <w:r>
+        <w:t xml:space="preserve">        raise ValueError('千问导出出现未支持的表格结构，保留媒体，需更新导入器')</w:t>
+      </w:r>
+    </w:p>
+    <w:p>
+      <w:pPr>
+        <w:pStyle w:val="SourceCode"/>
+      </w:pPr>
+      <w:r>
+        <w:t xml:space="preserve">    if not segments or any(not s['text'] for s in segments):</w:t>
+      </w:r>
+    </w:p>
+    <w:p>
+      <w:pPr>
+        <w:pStyle w:val="SourceCode"/>
+      </w:pPr>
+      <w:r>
+        <w:t xml:space="preserve">        raise ValueError('千问导出缺少完整原文、发言人或时间戳，保留媒体')</w:t>
+      </w:r>
+    </w:p>
+    <w:p>
+      <w:pPr>
+        <w:pStyle w:val="SourceCode"/>
+      </w:pPr>
+      <w:r>
+        <w:t xml:space="preserve">    return {'model': MODEL, 'language': '中英文自由说', 'segments': segments,</w:t>
+      </w:r>
+    </w:p>
+    <w:p>
+      <w:pPr>
+        <w:pStyle w:val="SourceCode"/>
+      </w:pPr>
+      <w:r>
+        <w:t xml:space="preserve">            'speaker_method': '发言人由千问网页识别；结束时间取下一段起点，末段取音频总长。'}</w:t>
+      </w:r>
+    </w:p>
+    <w:p>
+      <w:pPr>
+        <w:pStyle w:val="SourceCode"/>
+      </w:pPr>
+      <w:r/>
+    </w:p>
+    <w:p>
+      <w:pPr>
+        <w:pStyle w:val="SourceCode"/>
+      </w:pPr>
+      <w:r/>
+    </w:p>
+    <w:p>
+      <w:pPr>
+        <w:pStyle w:val="SourceCode"/>
+      </w:pPr>
+      <w:r>
+        <w:t>def browser_context(playwright, headed=False):</w:t>
+      </w:r>
+    </w:p>
+    <w:p>
+      <w:pPr>
+        <w:pStyle w:val="SourceCode"/>
+      </w:pPr>
+      <w:r>
+        <w:t xml:space="preserve">    PROFILE.mkdir(parents=True, exist_ok=True)</w:t>
+      </w:r>
+    </w:p>
+    <w:p>
+      <w:pPr>
+        <w:pStyle w:val="SourceCode"/>
+      </w:pPr>
+      <w:r>
+        <w:t xml:space="preserve">    return playwright.chromium.launch_persistent_context(str(PROFILE), headless=not headed,</w:t>
+      </w:r>
+    </w:p>
+    <w:p>
+      <w:pPr>
+        <w:pStyle w:val="SourceCode"/>
+      </w:pPr>
+      <w:r>
+        <w:t xml:space="preserve">                                                         accept_downloads=True)</w:t>
+      </w:r>
+    </w:p>
+    <w:p>
+      <w:pPr>
+        <w:pStyle w:val="SourceCode"/>
+      </w:pPr>
+      <w:r/>
+    </w:p>
+    <w:p>
+      <w:pPr>
+        <w:pStyle w:val="SourceCode"/>
+      </w:pPr>
+      <w:r/>
+    </w:p>
+    <w:p>
+      <w:pPr>
+        <w:pStyle w:val="SourceCode"/>
+      </w:pPr>
+      <w:r>
+        <w:t>def export_audio(audio, job, meta, save):</w:t>
+      </w:r>
+    </w:p>
+    <w:p>
+      <w:pPr>
+        <w:pStyle w:val="SourceCode"/>
+      </w:pPr>
+      <w:r>
+        <w:t xml:space="preserve">    from playwright.sync_api import sync_playwright</w:t>
+      </w:r>
+    </w:p>
+    <w:p>
+      <w:pPr>
+        <w:pStyle w:val="SourceCode"/>
+      </w:pPr>
+      <w:r>
+        <w:t xml:space="preserve">    from reader import ffmpeg, filename</w:t>
+      </w:r>
+    </w:p>
+    <w:p>
+      <w:pPr>
+        <w:pStyle w:val="SourceCode"/>
+      </w:pPr>
+      <w:r>
+        <w:t xml:space="preserve">    upload = job/'media'/(filename(meta['title'])+'-'+job.name+'.mp3')</w:t>
+      </w:r>
+    </w:p>
+    <w:p>
+      <w:pPr>
+        <w:pStyle w:val="SourceCode"/>
+      </w:pPr>
+      <w:r>
+        <w:t xml:space="preserve">    if not upload.exists():</w:t>
+      </w:r>
+    </w:p>
+    <w:p>
+      <w:pPr>
+        <w:pStyle w:val="SourceCode"/>
+      </w:pPr>
+      <w:r>
+        <w:t xml:space="preserve">        subprocess.run([ffmpeg(), '-nostdin', '-v', 'error', '-y', '-i', str(audio),</w:t>
+      </w:r>
+    </w:p>
+    <w:p>
+      <w:pPr>
+        <w:pStyle w:val="SourceCode"/>
+      </w:pPr>
+      <w:r>
+        <w:t xml:space="preserve">                        '-c:a', 'libmp3lame', '-b:a', '64k', str(upload)], check=True)</w:t>
+      </w:r>
+    </w:p>
+    <w:p>
+      <w:pPr>
+        <w:pStyle w:val="SourceCode"/>
+      </w:pPr>
+      <w:r>
+        <w:t xml:space="preserve">    if meta['audio_duration'] &gt; 6*3600 or upload.stat().st_size &gt; 500*1024*1024:</w:t>
+      </w:r>
+    </w:p>
+    <w:p>
+      <w:pPr>
+        <w:pStyle w:val="SourceCode"/>
+      </w:pPr>
+      <w:r>
+        <w:t xml:space="preserve">        raise ValueError('超过千问网页单文件6小时或音频500MB限制，保留媒体')</w:t>
+      </w:r>
+    </w:p>
+    <w:p>
+      <w:pPr>
+        <w:pStyle w:val="SourceCode"/>
+      </w:pPr>
+      <w:r>
+        <w:t xml:space="preserve">    with sync_playwright() as p:</w:t>
+      </w:r>
+    </w:p>
+    <w:p>
+      <w:pPr>
+        <w:pStyle w:val="SourceCode"/>
+      </w:pPr>
+      <w:r>
+        <w:t xml:space="preserve">        with browser_context(p) as context:</w:t>
+      </w:r>
+    </w:p>
+    <w:p>
+      <w:pPr>
+        <w:pStyle w:val="SourceCode"/>
+      </w:pPr>
+      <w:r>
+        <w:t xml:space="preserve">            page = context.pages[0] if context.pages else context.new_page()</w:t>
+      </w:r>
+    </w:p>
+    <w:p>
+      <w:pPr>
+        <w:pStyle w:val="SourceCode"/>
+      </w:pPr>
+      <w:r>
+        <w:t xml:space="preserve">            page.goto(meta.get('qianwen_url') or URL)</w:t>
+      </w:r>
+    </w:p>
+    <w:p>
+      <w:pPr>
+        <w:pStyle w:val="SourceCode"/>
+      </w:pPr>
+      <w:r>
+        <w:t xml:space="preserve">            if not meta.get('qianwen_url'):</w:t>
+      </w:r>
+    </w:p>
+    <w:p>
+      <w:pPr>
+        <w:pStyle w:val="SourceCode"/>
+      </w:pPr>
+      <w:r>
+        <w:t xml:space="preserve">                try:</w:t>
+      </w:r>
+    </w:p>
+    <w:p>
+      <w:pPr>
+        <w:pStyle w:val="SourceCode"/>
+      </w:pPr>
+      <w:r>
+        <w:t xml:space="preserve">                    page.get_by_text('中英文自由说', exact=True).wait_for(timeout=30000)</w:t>
+      </w:r>
+    </w:p>
+    <w:p>
+      <w:pPr>
+        <w:pStyle w:val="SourceCode"/>
+      </w:pPr>
+      <w:r>
+        <w:t xml:space="preserve">                except Exception as error:</w:t>
+      </w:r>
+    </w:p>
+    <w:p>
+      <w:pPr>
+        <w:pStyle w:val="SourceCode"/>
+      </w:pPr>
+      <w:r>
+        <w:t xml:space="preserve">                    raise RuntimeError('千问需要登录或页面无法访问。请运行“配置千问登录.command”。') from error</w:t>
+      </w:r>
+    </w:p>
+    <w:p>
+      <w:pPr>
+        <w:pStyle w:val="SourceCode"/>
+      </w:pPr>
+      <w:r>
+        <w:t xml:space="preserve">                page.get_by_text('中英文自由说', exact=True).click()</w:t>
+      </w:r>
+    </w:p>
+    <w:p>
+      <w:pPr>
+        <w:pStyle w:val="SourceCode"/>
+      </w:pPr>
+      <w:r>
+        <w:t xml:space="preserve">                page.get_by_text('多人讨论', exact=True).click()</w:t>
+      </w:r>
+    </w:p>
+    <w:p>
+      <w:pPr>
+        <w:pStyle w:val="SourceCode"/>
+      </w:pPr>
+      <w:r>
+        <w:t xml:space="preserve">                if not page.get_by_text('不翻译', exact=True).is_visible():</w:t>
+      </w:r>
+    </w:p>
+    <w:p>
+      <w:pPr>
+        <w:pStyle w:val="SourceCode"/>
+      </w:pPr>
+      <w:r>
+        <w:t xml:space="preserve">                    raise RuntimeError('未确认不翻译设置，停止上传')</w:t>
+      </w:r>
+    </w:p>
+    <w:p>
+      <w:pPr>
+        <w:pStyle w:val="SourceCode"/>
+      </w:pPr>
+      <w:r>
+        <w:t xml:space="preserve">                if not meta.get('qianwen_submitted'):</w:t>
+      </w:r>
+    </w:p>
+    <w:p>
+      <w:pPr>
+        <w:pStyle w:val="SourceCode"/>
+      </w:pPr>
+      <w:r>
+        <w:t xml:space="preserve">                    with page.expect_file_chooser() as chooser:</w:t>
+      </w:r>
+    </w:p>
+    <w:p>
+      <w:pPr>
+        <w:pStyle w:val="SourceCode"/>
+      </w:pPr>
+      <w:r>
+        <w:t xml:space="preserve">                        page.get_by_role('button', name=re.compile('点击或将')).click()</w:t>
+      </w:r>
+    </w:p>
+    <w:p>
+      <w:pPr>
+        <w:pStyle w:val="SourceCode"/>
+      </w:pPr>
+      <w:r>
+        <w:t xml:space="preserve">                    chooser.value.set_files(str(upload))</w:t>
+      </w:r>
+    </w:p>
+    <w:p>
+      <w:pPr>
+        <w:pStyle w:val="SourceCode"/>
+      </w:pPr>
+      <w:r>
+        <w:t xml:space="preserve">                    page.get_by_role('button', name='确 认', exact=True).click()</w:t>
+      </w:r>
+    </w:p>
+    <w:p>
+      <w:pPr>
+        <w:pStyle w:val="SourceCode"/>
+      </w:pPr>
+      <w:r>
+        <w:t xml:space="preserve">                    meta['qianwen_submitted'] = True; save(job/'job.json', meta)</w:t>
+      </w:r>
+    </w:p>
+    <w:p>
+      <w:pPr>
+        <w:pStyle w:val="SourceCode"/>
+      </w:pPr>
+      <w:r>
+        <w:t xml:space="preserve">                meta['state'] = 'cloud_transcribing'; save(job/'job.json', meta)</w:t>
+      </w:r>
+    </w:p>
+    <w:p>
+      <w:pPr>
+        <w:pStyle w:val="SourceCode"/>
+      </w:pPr>
+      <w:r>
+        <w:t xml:space="preserve">                title = upload.stem</w:t>
+      </w:r>
+    </w:p>
+    <w:p>
+      <w:pPr>
+        <w:pStyle w:val="SourceCode"/>
+      </w:pPr>
+      <w:r>
+        <w:t xml:space="preserve">                deadline = time.monotonic() + 6 * 3600</w:t>
+      </w:r>
+    </w:p>
+    <w:p>
+      <w:pPr>
+        <w:pStyle w:val="SourceCode"/>
+      </w:pPr>
+      <w:r>
+        <w:t xml:space="preserve">                while time.monotonic() &lt; deadline:</w:t>
+      </w:r>
+    </w:p>
+    <w:p>
+      <w:pPr>
+        <w:pStyle w:val="SourceCode"/>
+      </w:pPr>
+      <w:r>
+        <w:t xml:space="preserve">                    page.get_by_text(title, exact=True).first.click(timeout=10000)</w:t>
+      </w:r>
+    </w:p>
+    <w:p>
+      <w:pPr>
+        <w:pStyle w:val="SourceCode"/>
+      </w:pPr>
+      <w:r>
+        <w:t xml:space="preserve">                    if page.get_by_role('button', name='导出', exact=True).count():</w:t>
+      </w:r>
+    </w:p>
+    <w:p>
+      <w:pPr>
+        <w:pStyle w:val="SourceCode"/>
+      </w:pPr>
+      <w:r>
+        <w:t xml:space="preserve">                        meta['qianwen_url'] = page.url; save(job/'job.json', meta); break</w:t>
+      </w:r>
+    </w:p>
+    <w:p>
+      <w:pPr>
+        <w:pStyle w:val="SourceCode"/>
+      </w:pPr>
+      <w:r>
+        <w:t xml:space="preserve">                    time.sleep(5)</w:t>
+      </w:r>
+    </w:p>
+    <w:p>
+      <w:pPr>
+        <w:pStyle w:val="SourceCode"/>
+      </w:pPr>
+      <w:r>
+        <w:t xml:space="preserve">                else:</w:t>
+      </w:r>
+    </w:p>
+    <w:p>
+      <w:pPr>
+        <w:pStyle w:val="SourceCode"/>
+      </w:pPr>
+      <w:r>
+        <w:t xml:space="preserve">                    raise RuntimeError('千问处理超过等待上限，保留媒体以便检查')</w:t>
+      </w:r>
+    </w:p>
+    <w:p>
+      <w:pPr>
+        <w:pStyle w:val="SourceCode"/>
+      </w:pPr>
+      <w:r>
+        <w:t xml:space="preserve">            page.get_by_role('button', name='导出', exact=True).click()</w:t>
+      </w:r>
+    </w:p>
+    <w:p>
+      <w:pPr>
+        <w:pStyle w:val="SourceCode"/>
+      </w:pPr>
+      <w:r>
+        <w:t xml:space="preserve">            panel = page.get_by_role('tooltip')</w:t>
+      </w:r>
+    </w:p>
+    <w:p>
+      <w:pPr>
+        <w:pStyle w:val="SourceCode"/>
+      </w:pPr>
+      <w:r>
+        <w:t xml:space="preserve">            checks = panel.get_by_role('checkbox')</w:t>
+      </w:r>
+    </w:p>
+    <w:p>
+      <w:pPr>
+        <w:pStyle w:val="SourceCode"/>
+      </w:pPr>
+      <w:r>
+        <w:t xml:space="preserve">            if checks.count() != 5:</w:t>
+      </w:r>
+    </w:p>
+    <w:p>
+      <w:pPr>
+        <w:pStyle w:val="SourceCode"/>
+      </w:pPr>
+      <w:r>
+        <w:t xml:space="preserve">                raise RuntimeError('千问导出界面已变化，停止导出并保留媒体')</w:t>
+      </w:r>
+    </w:p>
+    <w:p>
+      <w:pPr>
+        <w:pStyle w:val="SourceCode"/>
+      </w:pPr>
+      <w:r>
+        <w:t xml:space="preserve">            checks.nth(0).check()</w:t>
+      </w:r>
+    </w:p>
+    <w:p>
+      <w:pPr>
+        <w:pStyle w:val="SourceCode"/>
+      </w:pPr>
+      <w:r>
+        <w:t xml:space="preserve">            for i in range(1, 5): checks.nth(i).uncheck()</w:t>
+      </w:r>
+    </w:p>
+    <w:p>
+      <w:pPr>
+        <w:pStyle w:val="SourceCode"/>
+      </w:pPr>
+      <w:r>
+        <w:t xml:space="preserve">            if not panel.get_by_text('.docx', exact=True).first.is_visible():</w:t>
+      </w:r>
+    </w:p>
+    <w:p>
+      <w:pPr>
+        <w:pStyle w:val="SourceCode"/>
+      </w:pPr>
+      <w:r>
+        <w:t xml:space="preserve">                raise RuntimeError('导出格式不是 Word')</w:t>
+      </w:r>
+    </w:p>
+    <w:p>
+      <w:pPr>
+        <w:pStyle w:val="SourceCode"/>
+      </w:pPr>
+      <w:r>
+        <w:t xml:space="preserve">            for text in ('发言人', '时间戳'):</w:t>
+      </w:r>
+    </w:p>
+    <w:p>
+      <w:pPr>
+        <w:pStyle w:val="SourceCode"/>
+      </w:pPr>
+      <w:r>
+        <w:t xml:space="preserve">                if not panel.get_by_text(text, exact=True).is_visible():</w:t>
+      </w:r>
+    </w:p>
+    <w:p>
+      <w:pPr>
+        <w:pStyle w:val="SourceCode"/>
+      </w:pPr>
+      <w:r>
+        <w:t xml:space="preserve">                    raise RuntimeError('千问导出未包含'+text+'，请在千问导出设置中勾选')</w:t>
+      </w:r>
+    </w:p>
+    <w:p>
+      <w:pPr>
+        <w:pStyle w:val="SourceCode"/>
+      </w:pPr>
+      <w:r>
+        <w:t xml:space="preserve">            meta['state'] = 'cloud_exporting'; save(job/'job.json', meta)</w:t>
+      </w:r>
+    </w:p>
+    <w:p>
+      <w:pPr>
+        <w:pStyle w:val="SourceCode"/>
+      </w:pPr>
+      <w:r>
+        <w:t xml:space="preserve">            destination = job/'qianwen-original.docx'</w:t>
+      </w:r>
+    </w:p>
+    <w:p>
+      <w:pPr>
+        <w:pStyle w:val="SourceCode"/>
+      </w:pPr>
+      <w:r>
+        <w:t xml:space="preserve">            with page.expect_download(timeout=120000) as download:</w:t>
+      </w:r>
+    </w:p>
+    <w:p>
+      <w:pPr>
+        <w:pStyle w:val="SourceCode"/>
+      </w:pPr>
+      <w:r>
+        <w:t xml:space="preserve">                panel.get_by_role('button', name='导出', exact=True).click()</w:t>
+      </w:r>
+    </w:p>
+    <w:p>
+      <w:pPr>
+        <w:pStyle w:val="SourceCode"/>
+      </w:pPr>
+      <w:r>
+        <w:t xml:space="preserve">            download.value.save_as(str(destination))</w:t>
+      </w:r>
+    </w:p>
+    <w:p>
+      <w:pPr>
+        <w:pStyle w:val="SourceCode"/>
+      </w:pPr>
+      <w:r>
+        <w:t xml:space="preserve">    raw = read_export(destination, meta['audio_duration'])</w:t>
+      </w:r>
+    </w:p>
+    <w:p>
+      <w:pPr>
+        <w:pStyle w:val="SourceCode"/>
+      </w:pPr>
+      <w:r>
+        <w:t xml:space="preserve">    upload.unlink(missing_ok=True)</w:t>
+      </w:r>
+    </w:p>
+    <w:p>
+      <w:pPr>
+        <w:pStyle w:val="SourceCode"/>
+      </w:pPr>
+      <w:r>
+        <w:t xml:space="preserve">    return raw</w:t>
+      </w:r>
+    </w:p>
+    <w:p>
+      <w:pPr>
+        <w:pStyle w:val="SourceCode"/>
+      </w:pPr>
+      <w:r/>
+    </w:p>
+    <w:p>
+      <w:pPr>
+        <w:pStyle w:val="SourceCode"/>
+      </w:pPr>
+      <w:r/>
+    </w:p>
+    <w:p>
+      <w:pPr>
+        <w:pStyle w:val="SourceCode"/>
+      </w:pPr>
+      <w:r>
+        <w:t>def login():</w:t>
+      </w:r>
+    </w:p>
+    <w:p>
+      <w:pPr>
+        <w:pStyle w:val="SourceCode"/>
+      </w:pPr>
+      <w:r>
+        <w:t xml:space="preserve">    from playwright.sync_api import sync_playwright</w:t>
+      </w:r>
+    </w:p>
+    <w:p>
+      <w:pPr>
+        <w:pStyle w:val="SourceCode"/>
+      </w:pPr>
+      <w:r>
+        <w:t xml:space="preserve">    with sync_playwright() as p:</w:t>
+      </w:r>
+    </w:p>
+    <w:p>
+      <w:pPr>
+        <w:pStyle w:val="SourceCode"/>
+      </w:pPr>
+      <w:r>
+        <w:t xml:space="preserve">        with browser_context(p, headed=True) as context:</w:t>
+      </w:r>
+    </w:p>
+    <w:p>
+      <w:pPr>
+        <w:pStyle w:val="SourceCode"/>
+      </w:pPr>
+      <w:r>
+        <w:t xml:space="preserve">            page = context.pages[0] if context.pages else context.new_page()</w:t>
+      </w:r>
+    </w:p>
+    <w:p>
+      <w:pPr>
+        <w:pStyle w:val="SourceCode"/>
+      </w:pPr>
+      <w:r>
+        <w:t xml:space="preserve">            page.goto(URL)</w:t>
+      </w:r>
+    </w:p>
+    <w:p>
+      <w:pPr>
+        <w:pStyle w:val="SourceCode"/>
+      </w:pPr>
+      <w:r>
+        <w:t xml:space="preserve">            input('请在专用浏览器中登录千问，确认音视频速读页面可用后，在此按回车保存登录。')</w:t>
+      </w:r>
+    </w:p>
+    <w:p>
+      <w:pPr>
+        <w:pStyle w:val="SourceCode"/>
+      </w:pPr>
+      <w:r>
+        <w:t xml:space="preserve">    print('登录环境已保存在本机。后台任务不会打开此浏览器窗口。')</w:t>
+      </w:r>
+    </w:p>
+    <w:p>
+      <w:pPr>
+        <w:pStyle w:val="SourceCode"/>
+      </w:pPr>
+      <w:r/>
+    </w:p>
+    <w:p>
+      <w:pPr>
+        <w:pStyle w:val="SourceCode"/>
+      </w:pPr>
+      <w:r/>
+    </w:p>
+    <w:p>
+      <w:pPr>
+        <w:pStyle w:val="SourceCode"/>
+      </w:pPr>
+      <w:r>
+        <w:t>if __name__ == '__main__':</w:t>
+      </w:r>
+    </w:p>
+    <w:p>
+      <w:pPr>
+        <w:pStyle w:val="SourceCode"/>
+      </w:pPr>
+      <w:r>
+        <w:t xml:space="preserve">    parser = argparse.ArgumentParser(); parser.add_argument('command', choices=['login'])</w:t>
+      </w:r>
+    </w:p>
+    <w:p>
+      <w:pPr>
+        <w:pStyle w:val="SourceCode"/>
+      </w:pPr>
+      <w:r>
+        <w:t xml:space="preserve">    parser.parse_args(); login()</w:t>
+      </w:r>
+    </w:p>
+    <w:p>
+      <w:pPr>
+        <w:pStyle w:val="SourceCode"/>
+      </w:pPr>
+      <w:r/>
+    </w:p>
+    <w:p>
+      <w:pPr>
+        <w:pStyle w:val="Heading2"/>
+      </w:pPr>
+      <w:r>
+        <w:t>FILE: test_qianwen.py</w:t>
+      </w:r>
+    </w:p>
+    <w:p>
+      <w:pPr>
+        <w:pStyle w:val="SourceCode"/>
+      </w:pPr>
+      <w:r>
+        <w:t>import tempfile</w:t>
+      </w:r>
+    </w:p>
+    <w:p>
+      <w:pPr>
+        <w:pStyle w:val="SourceCode"/>
+      </w:pPr>
+      <w:r>
+        <w:t>import unittest</w:t>
+      </w:r>
+    </w:p>
+    <w:p>
+      <w:pPr>
+        <w:pStyle w:val="SourceCode"/>
+      </w:pPr>
+      <w:r>
+        <w:t>from pathlib import Path</w:t>
+      </w:r>
+    </w:p>
+    <w:p>
+      <w:pPr>
+        <w:pStyle w:val="SourceCode"/>
+      </w:pPr>
+      <w:r>
+        <w:t>from docx import Document</w:t>
+      </w:r>
+    </w:p>
+    <w:p>
+      <w:pPr>
+        <w:pStyle w:val="SourceCode"/>
+      </w:pPr>
+      <w:r>
+        <w:t>from qianwen_browser import read_export</w:t>
+      </w:r>
+    </w:p>
+    <w:p>
+      <w:pPr>
+        <w:pStyle w:val="SourceCode"/>
+      </w:pPr>
+      <w:r/>
+    </w:p>
+    <w:p>
+      <w:pPr>
+        <w:pStyle w:val="SourceCode"/>
+      </w:pPr>
+      <w:r>
+        <w:t>class QianwenExportTests(unittest.TestCase):</w:t>
+      </w:r>
+    </w:p>
+    <w:p>
+      <w:pPr>
+        <w:pStyle w:val="SourceCode"/>
+      </w:pPr>
+      <w:r>
+        <w:t xml:space="preserve">    def export(self, lines):</w:t>
+      </w:r>
+    </w:p>
+    <w:p>
+      <w:pPr>
+        <w:pStyle w:val="SourceCode"/>
+      </w:pPr>
+      <w:r>
+        <w:t xml:space="preserve">        temp=tempfile.TemporaryDirectory();self.addCleanup(temp.cleanup)</w:t>
+      </w:r>
+    </w:p>
+    <w:p>
+      <w:pPr>
+        <w:pStyle w:val="SourceCode"/>
+      </w:pPr>
+      <w:r>
+        <w:t xml:space="preserve">        path=Path(temp.name)/'export.docx';doc=Document()</w:t>
+      </w:r>
+    </w:p>
+    <w:p>
+      <w:pPr>
+        <w:pStyle w:val="SourceCode"/>
+      </w:pPr>
+      <w:r>
+        <w:t xml:space="preserve">        for line in lines:doc.add_paragraph(line)</w:t>
+      </w:r>
+    </w:p>
+    <w:p>
+      <w:pPr>
+        <w:pStyle w:val="SourceCode"/>
+      </w:pPr>
+      <w:r>
+        <w:t xml:space="preserve">        doc.save(path);return path</w:t>
+      </w:r>
+    </w:p>
+    <w:p>
+      <w:pPr>
+        <w:pStyle w:val="SourceCode"/>
+      </w:pPr>
+      <w:r>
+        <w:t xml:space="preserve">    def test_preserves_all_paragraphs_and_speakers(self):</w:t>
+      </w:r>
+    </w:p>
+    <w:p>
+      <w:pPr>
+        <w:pStyle w:val="SourceCode"/>
+      </w:pPr>
+      <w:r>
+        <w:t xml:space="preserve">        p=self.export(['标题','2026年10月07日','发言人1   00:00','第一段。','继续讲话。','发言人2   00:12','第二段。'])</w:t>
+      </w:r>
+    </w:p>
+    <w:p>
+      <w:pPr>
+        <w:pStyle w:val="SourceCode"/>
+      </w:pPr>
+      <w:r>
+        <w:t xml:space="preserve">        result=read_export(p,20)</w:t>
+      </w:r>
+    </w:p>
+    <w:p>
+      <w:pPr>
+        <w:pStyle w:val="SourceCode"/>
+      </w:pPr>
+      <w:r>
+        <w:t xml:space="preserve">        self.assertEqual(result['segments'],[{'start':0,'end':12,'speaker':'发言人1','text':'第一段。\n继续讲话。'},{'start':12,'end':20,'speaker':'发言人2','text':'第二段。'}])</w:t>
+      </w:r>
+    </w:p>
+    <w:p>
+      <w:pPr>
+        <w:pStyle w:val="SourceCode"/>
+      </w:pPr>
+      <w:r>
+        <w:t xml:space="preserve">    def test_rejects_missing_timestamps(self):</w:t>
+      </w:r>
+    </w:p>
+    <w:p>
+      <w:pPr>
+        <w:pStyle w:val="SourceCode"/>
+      </w:pPr>
+      <w:r>
+        <w:t xml:space="preserve">        with self.assertRaises(ValueError):read_export(self.export(['只有正文']),20)</w:t>
+      </w:r>
+    </w:p>
+    <w:p>
+      <w:pPr>
+        <w:pStyle w:val="SourceCode"/>
+      </w:pPr>
+      <w:r>
+        <w:t xml:space="preserve">    def test_rejects_wrong_duration(self):</w:t>
+      </w:r>
+    </w:p>
+    <w:p>
+      <w:pPr>
+        <w:pStyle w:val="SourceCode"/>
+      </w:pPr>
+      <w:r>
+        <w:t xml:space="preserve">        with self.assertRaises(ValueError):read_export(self.export(['发言人1   01:00','正文']),20)</w:t>
+      </w:r>
+    </w:p>
+    <w:p>
+      <w:pPr>
+        <w:pStyle w:val="SourceCode"/>
+      </w:pPr>
+      <w:r>
+        <w:t xml:space="preserve">    def test_rejects_empty_segment(self):</w:t>
+      </w:r>
+    </w:p>
+    <w:p>
+      <w:pPr>
+        <w:pStyle w:val="SourceCode"/>
+      </w:pPr>
+      <w:r>
+        <w:t xml:space="preserve">        with self.assertRaises(ValueError):read_export(self.export(['发言人1   00:00']),20)</w:t>
+      </w:r>
+    </w:p>
+    <w:p>
+      <w:pPr>
+        <w:pStyle w:val="SourceCode"/>
+      </w:pPr>
+      <w:r/>
+    </w:p>
+    <w:p>
+      <w:pPr>
+        <w:pStyle w:val="SourceCode"/>
+      </w:pPr>
+      <w:r>
+        <w:t>if __name__=='__main__':unittest.main()</w:t>
+      </w:r>
+    </w:p>
+    <w:p>
+      <w:pPr>
+        <w:pStyle w:val="SourceCode"/>
+      </w:pPr>
+      <w:r/>
+    </w:p>
+    <w:p>
+      <w:pPr>
+        <w:pStyle w:val="Heading2"/>
+      </w:pPr>
+      <w:r>
+        <w:t>FILE: 配置千问登录.command</w:t>
+      </w:r>
+    </w:p>
+    <w:p>
+      <w:pPr>
+        <w:pStyle w:val="SourceCode"/>
+      </w:pPr>
+      <w:r>
+        <w:t>#!/bin/zsh</w:t>
+      </w:r>
+    </w:p>
+    <w:p>
+      <w:pPr>
+        <w:pStyle w:val="SourceCode"/>
+      </w:pPr>
+      <w:r>
+        <w:t>cd -- "${0:A:h}" || exit 1</w:t>
+      </w:r>
+    </w:p>
+    <w:p>
+      <w:pPr>
+        <w:pStyle w:val="SourceCode"/>
+      </w:pPr>
+      <w:r>
+        <w:t>export SSL_CERT_FILE=/etc/ssl/cert.pem</w:t>
+      </w:r>
+    </w:p>
+    <w:p>
+      <w:pPr>
+        <w:pStyle w:val="SourceCode"/>
+      </w:pPr>
+      <w:r>
+        <w:t>export PIP_CERT=/etc/ssl/cert.pem</w:t>
+      </w:r>
+    </w:p>
+    <w:p>
+      <w:pPr>
+        <w:pStyle w:val="SourceCode"/>
+      </w:pPr>
+      <w:r>
+        <w:t>export NODE_EXTRA_CA_CERTS=/etc/ssl/cert.pem</w:t>
+      </w:r>
+    </w:p>
+    <w:p>
+      <w:pPr>
+        <w:pStyle w:val="SourceCode"/>
+      </w:pPr>
+      <w:r>
+        <w:t>export PLAYWRIGHT_BROWSERS_PATH="$PWD/work/browser-bin"</w:t>
+      </w:r>
+    </w:p>
+    <w:p>
+      <w:pPr>
+        <w:pStyle w:val="SourceCode"/>
+      </w:pPr>
+      <w:r>
+        <w:t>.venv/bin/python -m pip install playwright || exit 1</w:t>
+      </w:r>
+    </w:p>
+    <w:p>
+      <w:pPr>
+        <w:pStyle w:val="SourceCode"/>
+      </w:pPr>
+      <w:r>
+        <w:t>.venv/bin/python -m playwright install chromium || exit 1</w:t>
+      </w:r>
+    </w:p>
+    <w:p>
+      <w:pPr>
+        <w:pStyle w:val="SourceCode"/>
+      </w:pPr>
+      <w:r>
+        <w:t>.venv/bin/python qianwen_browser.py login || exit 1</w:t>
+      </w:r>
+    </w:p>
+    <w:p>
+      <w:pPr>
+        <w:pStyle w:val="SourceCode"/>
+      </w:pPr>
+      <w:r>
+        <w:t>/bin/launchctl kill SIGTERM "gui/$(id -u)/com.zhangjp.web-video-to-word" 2&gt;/dev/null || true</w:t>
+      </w:r>
+    </w:p>
+    <w:p>
+      <w:pPr>
+        <w:pStyle w:val="SourceCode"/>
+      </w:pPr>
+      <w:r>
+        <w:t>echo "登录配置完成。如已启用自动启动，服务将自动加载新版。"</w:t>
+      </w:r>
+    </w:p>
+    <w:p>
+      <w:pPr>
+        <w:pStyle w:val="SourceCode"/>
+      </w:pPr>
+      <w:r>
+        <w:t>read '?按回车关闭窗口。'</w:t>
       </w:r>
     </w:p>
     <w:p>

</xml_diff>

<commit_message>
Add independent background transcription smoke test and re-login instructions
</commit_message>
<xml_diff>
--- a/安装与使用指南.docx
+++ b/安装与使用指南.docx
@@ -1004,6 +1004,11 @@
       </w:pPr>
       <w:r>
         <w:t>千问网页识别（实验性可选功能）</w:t>
+      </w:r>
+    </w:p>
+    <w:p>
+      <w:r>
+        <w:t>首次登录完成后，可双击“测试千问后台流程.command”。它从已有任务的音轨截取20秒，在无窗口浏览器中转写、导出并生成测试Word，结果保存到 work/qianwen-smoke-test.json。没有现成音轨时需要先下载一个测试视频。此操作不终止正在识别的任务，不删除完整原媒体。当前版本登录失效不会自动弹出窗口；失败后在页面查看错误，再双击“配置千问登录.command”重新登录并重试原链接。</w:t>
       </w:r>
     </w:p>
     <w:p>
@@ -10162,6 +10167,14 @@
         <w:pStyle w:val="SourceCode"/>
       </w:pPr>
       <w:r>
+        <w:t xml:space="preserve">  "smoke_qianwen.py": "df0219bddc0456a3634a1e76c40a359060787ced5355e6a5d6d9f4495a37c81c",</w:t>
+      </w:r>
+    </w:p>
+    <w:p>
+      <w:pPr>
+        <w:pStyle w:val="SourceCode"/>
+      </w:pPr>
+      <w:r>
         <w:t xml:space="preserve">  "test_app.py": "911650ca1bd12c3e87ce499ed1d6bfea8882d8d04ac9e357bb98c067853befc9",</w:t>
       </w:r>
     </w:p>
@@ -10210,6 +10223,14 @@
         <w:pStyle w:val="SourceCode"/>
       </w:pPr>
       <w:r>
+        <w:t xml:space="preserve">  "测试千问后台流程.command": "52d888b7df03ab9b1b22d779628e6526f0e13f68ec09ba3bd1344faa7f61a6c3",</w:t>
+      </w:r>
+    </w:p>
+    <w:p>
+      <w:pPr>
+        <w:pStyle w:val="SourceCode"/>
+      </w:pPr>
+      <w:r>
         <w:t xml:space="preserve">  "自动恢复测试.command": "e5f7e855d99cd648d6ae2e1382da651e8afb7597f184e08d1661d6daef5cc7f6",</w:t>
       </w:r>
     </w:p>
@@ -13357,6 +13378,562 @@
       </w:pPr>
       <w:r>
         <w:t>read '?按回车关闭窗口。'</w:t>
+      </w:r>
+    </w:p>
+    <w:p>
+      <w:pPr>
+        <w:pStyle w:val="SourceCode"/>
+      </w:pPr>
+      <w:r/>
+    </w:p>
+    <w:p>
+      <w:pPr>
+        <w:pStyle w:val="Heading2"/>
+      </w:pPr>
+      <w:r>
+        <w:t>FILE: smoke_qianwen.py</w:t>
+      </w:r>
+    </w:p>
+    <w:p>
+      <w:pPr>
+        <w:pStyle w:val="SourceCode"/>
+      </w:pPr>
+      <w:r>
+        <w:t>"""Run the independent cloud workflow from the normal Mac environment."""</w:t>
+      </w:r>
+    </w:p>
+    <w:p>
+      <w:pPr>
+        <w:pStyle w:val="SourceCode"/>
+      </w:pPr>
+      <w:r>
+        <w:t>import hashlib</w:t>
+      </w:r>
+    </w:p>
+    <w:p>
+      <w:pPr>
+        <w:pStyle w:val="SourceCode"/>
+      </w:pPr>
+      <w:r>
+        <w:t>import json</w:t>
+      </w:r>
+    </w:p>
+    <w:p>
+      <w:pPr>
+        <w:pStyle w:val="SourceCode"/>
+      </w:pPr>
+      <w:r>
+        <w:t>import subprocess</w:t>
+      </w:r>
+    </w:p>
+    <w:p>
+      <w:pPr>
+        <w:pStyle w:val="SourceCode"/>
+      </w:pPr>
+      <w:r>
+        <w:t>import time</w:t>
+      </w:r>
+    </w:p>
+    <w:p>
+      <w:pPr>
+        <w:pStyle w:val="SourceCode"/>
+      </w:pPr>
+      <w:r>
+        <w:t>from pathlib import Path</w:t>
+      </w:r>
+    </w:p>
+    <w:p>
+      <w:pPr>
+        <w:pStyle w:val="SourceCode"/>
+      </w:pPr>
+      <w:r>
+        <w:t>import reader</w:t>
+      </w:r>
+    </w:p>
+    <w:p>
+      <w:pPr>
+        <w:pStyle w:val="SourceCode"/>
+      </w:pPr>
+      <w:r>
+        <w:t>from qianwen_browser import export_audio</w:t>
+      </w:r>
+    </w:p>
+    <w:p>
+      <w:pPr>
+        <w:pStyle w:val="SourceCode"/>
+      </w:pPr>
+      <w:r/>
+    </w:p>
+    <w:p>
+      <w:pPr>
+        <w:pStyle w:val="SourceCode"/>
+      </w:pPr>
+      <w:r/>
+    </w:p>
+    <w:p>
+      <w:pPr>
+        <w:pStyle w:val="SourceCode"/>
+      </w:pPr>
+      <w:r>
+        <w:t>def main():</w:t>
+      </w:r>
+    </w:p>
+    <w:p>
+      <w:pPr>
+        <w:pStyle w:val="SourceCode"/>
+      </w:pPr>
+      <w:r>
+        <w:t xml:space="preserve">    result={'passed':False,'started_at':time.time()}</w:t>
+      </w:r>
+    </w:p>
+    <w:p>
+      <w:pPr>
+        <w:pStyle w:val="SourceCode"/>
+      </w:pPr>
+      <w:r>
+        <w:t xml:space="preserve">    ident=hashlib.sha256(b'qianwen-smoke-test-20-seconds').hexdigest()[:12]</w:t>
+      </w:r>
+    </w:p>
+    <w:p>
+      <w:pPr>
+        <w:pStyle w:val="SourceCode"/>
+      </w:pPr>
+      <w:r>
+        <w:t xml:space="preserve">    job=reader.WORK/'jobs'/ident</w:t>
+      </w:r>
+    </w:p>
+    <w:p>
+      <w:pPr>
+        <w:pStyle w:val="SourceCode"/>
+      </w:pPr>
+      <w:r>
+        <w:t xml:space="preserve">    (job/'media').mkdir(parents=True,exist_ok=True)</w:t>
+      </w:r>
+    </w:p>
+    <w:p>
+      <w:pPr>
+        <w:pStyle w:val="SourceCode"/>
+      </w:pPr>
+      <w:r>
+        <w:t xml:space="preserve">    meta={'url':'',</w:t>
+      </w:r>
+    </w:p>
+    <w:p>
+      <w:pPr>
+        <w:pStyle w:val="SourceCode"/>
+      </w:pPr>
+      <w:r>
+        <w:t xml:space="preserve">          'title':'千问独立后台测试（仅20秒片段）','name':'千问独立后台测试（仅20秒片段）',</w:t>
+      </w:r>
+    </w:p>
+    <w:p>
+      <w:pPr>
+        <w:pStyle w:val="SourceCode"/>
+      </w:pPr>
+      <w:r>
+        <w:t xml:space="preserve">          'audio_duration':20,'engine':'qianwen','state':'cloud_transcribing',</w:t>
+      </w:r>
+    </w:p>
+    <w:p>
+      <w:pPr>
+        <w:pStyle w:val="SourceCode"/>
+      </w:pPr>
+      <w:r>
+        <w:t xml:space="preserve">          'created_at':time.time()}</w:t>
+      </w:r>
+    </w:p>
+    <w:p>
+      <w:pPr>
+        <w:pStyle w:val="SourceCode"/>
+      </w:pPr>
+      <w:r>
+        <w:t xml:space="preserve">    existing=job/'job.json'</w:t>
+      </w:r>
+    </w:p>
+    <w:p>
+      <w:pPr>
+        <w:pStyle w:val="SourceCode"/>
+      </w:pPr>
+      <w:r>
+        <w:t xml:space="preserve">    if existing.exists():</w:t>
+      </w:r>
+    </w:p>
+    <w:p>
+      <w:pPr>
+        <w:pStyle w:val="SourceCode"/>
+      </w:pPr>
+      <w:r>
+        <w:t xml:space="preserve">        previous=json.loads(existing.read_text())</w:t>
+      </w:r>
+    </w:p>
+    <w:p>
+      <w:pPr>
+        <w:pStyle w:val="SourceCode"/>
+      </w:pPr>
+      <w:r>
+        <w:t xml:space="preserve">        for key in ('qianwen_submitted','qianwen_url'): </w:t>
+      </w:r>
+    </w:p>
+    <w:p>
+      <w:pPr>
+        <w:pStyle w:val="SourceCode"/>
+      </w:pPr>
+      <w:r>
+        <w:t xml:space="preserve">            if key in previous:meta[key]=previous[key]</w:t>
+      </w:r>
+    </w:p>
+    <w:p>
+      <w:pPr>
+        <w:pStyle w:val="SourceCode"/>
+      </w:pPr>
+      <w:r>
+        <w:t xml:space="preserve">    try:</w:t>
+      </w:r>
+    </w:p>
+    <w:p>
+      <w:pPr>
+        <w:pStyle w:val="SourceCode"/>
+      </w:pPr>
+      <w:r>
+        <w:t xml:space="preserve">        candidates=[]</w:t>
+      </w:r>
+    </w:p>
+    <w:p>
+      <w:pPr>
+        <w:pStyle w:val="SourceCode"/>
+      </w:pPr>
+      <w:r>
+        <w:t xml:space="preserve">        for other in (reader.WORK/'jobs').glob('*/job.json'):</w:t>
+      </w:r>
+    </w:p>
+    <w:p>
+      <w:pPr>
+        <w:pStyle w:val="SourceCode"/>
+      </w:pPr>
+      <w:r>
+        <w:t xml:space="preserve">            data=json.loads(other.read_text())</w:t>
+      </w:r>
+    </w:p>
+    <w:p>
+      <w:pPr>
+        <w:pStyle w:val="SourceCode"/>
+      </w:pPr>
+      <w:r>
+        <w:t xml:space="preserve">            audio=Path(data.get('audio','/nonexistent'))</w:t>
+      </w:r>
+    </w:p>
+    <w:p>
+      <w:pPr>
+        <w:pStyle w:val="SourceCode"/>
+      </w:pPr>
+      <w:r>
+        <w:t xml:space="preserve">            if other.parent!=job and audio.is_file():candidates.append((other.stat().st_mtime,audio,data))</w:t>
+      </w:r>
+    </w:p>
+    <w:p>
+      <w:pPr>
+        <w:pStyle w:val="SourceCode"/>
+      </w:pPr>
+      <w:r>
+        <w:t xml:space="preserve">        if not candidates:</w:t>
+      </w:r>
+    </w:p>
+    <w:p>
+      <w:pPr>
+        <w:pStyle w:val="SourceCode"/>
+      </w:pPr>
+      <w:r>
+        <w:t xml:space="preserve">            raise ValueError('测试用的已下载音轨不存在，请让 Codex 选择其他测试音轨。')</w:t>
+      </w:r>
+    </w:p>
+    <w:p>
+      <w:pPr>
+        <w:pStyle w:val="SourceCode"/>
+      </w:pPr>
+      <w:r>
+        <w:t xml:space="preserve">        _,source,source_meta=max(candidates,key=lambda item:item[0])</w:t>
+      </w:r>
+    </w:p>
+    <w:p>
+      <w:pPr>
+        <w:pStyle w:val="SourceCode"/>
+      </w:pPr>
+      <w:r>
+        <w:t xml:space="preserve">        meta['url']=source_meta['url']</w:t>
+      </w:r>
+    </w:p>
+    <w:p>
+      <w:pPr>
+        <w:pStyle w:val="SourceCode"/>
+      </w:pPr>
+      <w:r>
+        <w:t xml:space="preserve">        clip=job/'media'/'test-20-seconds.wav'</w:t>
+      </w:r>
+    </w:p>
+    <w:p>
+      <w:pPr>
+        <w:pStyle w:val="SourceCode"/>
+      </w:pPr>
+      <w:r>
+        <w:t xml:space="preserve">        subprocess.run([reader.ffmpeg(),'-nostdin','-v','error','-y','-i',str(source),</w:t>
+      </w:r>
+    </w:p>
+    <w:p>
+      <w:pPr>
+        <w:pStyle w:val="SourceCode"/>
+      </w:pPr>
+      <w:r>
+        <w:t xml:space="preserve">                        '-t','20',str(clip)],check=True)</w:t>
+      </w:r>
+    </w:p>
+    <w:p>
+      <w:pPr>
+        <w:pStyle w:val="SourceCode"/>
+      </w:pPr>
+      <w:r>
+        <w:t xml:space="preserve">        meta.update(audio=str(clip),media=str(clip))</w:t>
+      </w:r>
+    </w:p>
+    <w:p>
+      <w:pPr>
+        <w:pStyle w:val="SourceCode"/>
+      </w:pPr>
+      <w:r>
+        <w:t xml:space="preserve">        reader.save_json(existing,meta)</w:t>
+      </w:r>
+    </w:p>
+    <w:p>
+      <w:pPr>
+        <w:pStyle w:val="SourceCode"/>
+      </w:pPr>
+      <w:r>
+        <w:t xml:space="preserve">        print('正在无窗口浏览器中上传20秒测试片段、等待千问转写并导出Word……',flush=True)</w:t>
+      </w:r>
+    </w:p>
+    <w:p>
+      <w:pPr>
+        <w:pStyle w:val="SourceCode"/>
+      </w:pPr>
+      <w:r>
+        <w:t xml:space="preserve">        raw=export_audio(clip,job,meta,reader.save_json)</w:t>
+      </w:r>
+    </w:p>
+    <w:p>
+      <w:pPr>
+        <w:pStyle w:val="SourceCode"/>
+      </w:pPr>
+      <w:r>
+        <w:t xml:space="preserve">        reader.save_json(job/'raw-transcript.json',raw)</w:t>
+      </w:r>
+    </w:p>
+    <w:p>
+      <w:pPr>
+        <w:pStyle w:val="SourceCode"/>
+      </w:pPr>
+      <w:r>
+        <w:t xml:space="preserve">        reader.save_json(existing,meta)</w:t>
+      </w:r>
+    </w:p>
+    <w:p>
+      <w:pPr>
+        <w:pStyle w:val="SourceCode"/>
+      </w:pPr>
+      <w:r>
+        <w:t xml:space="preserve">        document=reader.build_document(job,raw)</w:t>
+      </w:r>
+    </w:p>
+    <w:p>
+      <w:pPr>
+        <w:pStyle w:val="SourceCode"/>
+      </w:pPr>
+      <w:r>
+        <w:t xml:space="preserve">        result.update(passed=True,document=str(document),elapsed_seconds=round(time.time()-result['started_at'],2),segments=len(raw['segments']))</w:t>
+      </w:r>
+    </w:p>
+    <w:p>
+      <w:pPr>
+        <w:pStyle w:val="SourceCode"/>
+      </w:pPr>
+      <w:r>
+        <w:t xml:space="preserve">        print('独立后台完整流程测试通过。Word：'+str(document),flush=True)</w:t>
+      </w:r>
+    </w:p>
+    <w:p>
+      <w:pPr>
+        <w:pStyle w:val="SourceCode"/>
+      </w:pPr>
+      <w:r>
+        <w:t xml:space="preserve">    except Exception as error:</w:t>
+      </w:r>
+    </w:p>
+    <w:p>
+      <w:pPr>
+        <w:pStyle w:val="SourceCode"/>
+      </w:pPr>
+      <w:r>
+        <w:t xml:space="preserve">        result['error']=str(error)</w:t>
+      </w:r>
+    </w:p>
+    <w:p>
+      <w:pPr>
+        <w:pStyle w:val="SourceCode"/>
+      </w:pPr>
+      <w:r>
+        <w:t xml:space="preserve">        # Retain current cloud task identity for a safe retry.</w:t>
+      </w:r>
+    </w:p>
+    <w:p>
+      <w:pPr>
+        <w:pStyle w:val="SourceCode"/>
+      </w:pPr>
+      <w:r>
+        <w:t xml:space="preserve">        current=json.loads(existing.read_text()) if existing.exists() else meta</w:t>
+      </w:r>
+    </w:p>
+    <w:p>
+      <w:pPr>
+        <w:pStyle w:val="SourceCode"/>
+      </w:pPr>
+      <w:r>
+        <w:t xml:space="preserve">        current.update(state='failed',error=str(error))</w:t>
+      </w:r>
+    </w:p>
+    <w:p>
+      <w:pPr>
+        <w:pStyle w:val="SourceCode"/>
+      </w:pPr>
+      <w:r>
+        <w:t xml:space="preserve">        reader.save_json(existing,current)</w:t>
+      </w:r>
+    </w:p>
+    <w:p>
+      <w:pPr>
+        <w:pStyle w:val="SourceCode"/>
+      </w:pPr>
+      <w:r>
+        <w:t xml:space="preserve">        print('测试未通过：'+str(error),flush=True)</w:t>
+      </w:r>
+    </w:p>
+    <w:p>
+      <w:pPr>
+        <w:pStyle w:val="SourceCode"/>
+      </w:pPr>
+      <w:r>
+        <w:t xml:space="preserve">    finally:</w:t>
+      </w:r>
+    </w:p>
+    <w:p>
+      <w:pPr>
+        <w:pStyle w:val="SourceCode"/>
+      </w:pPr>
+      <w:r>
+        <w:t xml:space="preserve">        reader.save_json(reader.WORK/'qianwen-smoke-test.json',result)</w:t>
+      </w:r>
+    </w:p>
+    <w:p>
+      <w:pPr>
+        <w:pStyle w:val="SourceCode"/>
+      </w:pPr>
+      <w:r>
+        <w:t xml:space="preserve">    return 0 if result['passed'] else 1</w:t>
+      </w:r>
+    </w:p>
+    <w:p>
+      <w:pPr>
+        <w:pStyle w:val="SourceCode"/>
+      </w:pPr>
+      <w:r/>
+    </w:p>
+    <w:p>
+      <w:pPr>
+        <w:pStyle w:val="SourceCode"/>
+      </w:pPr>
+      <w:r/>
+    </w:p>
+    <w:p>
+      <w:pPr>
+        <w:pStyle w:val="SourceCode"/>
+      </w:pPr>
+      <w:r>
+        <w:t>if __name__=='__main__':raise SystemExit(main())</w:t>
+      </w:r>
+    </w:p>
+    <w:p>
+      <w:pPr>
+        <w:pStyle w:val="SourceCode"/>
+      </w:pPr>
+      <w:r/>
+    </w:p>
+    <w:p>
+      <w:pPr>
+        <w:pStyle w:val="Heading2"/>
+      </w:pPr>
+      <w:r>
+        <w:t>FILE: 测试千问后台流程.command</w:t>
+      </w:r>
+    </w:p>
+    <w:p>
+      <w:pPr>
+        <w:pStyle w:val="SourceCode"/>
+      </w:pPr>
+      <w:r>
+        <w:t>#!/bin/zsh</w:t>
+      </w:r>
+    </w:p>
+    <w:p>
+      <w:pPr>
+        <w:pStyle w:val="SourceCode"/>
+      </w:pPr>
+      <w:r>
+        <w:t>cd -- "${0:A:h}" || exit 1</w:t>
+      </w:r>
+    </w:p>
+    <w:p>
+      <w:pPr>
+        <w:pStyle w:val="SourceCode"/>
+      </w:pPr>
+      <w:r>
+        <w:t>export SSL_CERT_FILE=/etc/ssl/cert.pem</w:t>
+      </w:r>
+    </w:p>
+    <w:p>
+      <w:pPr>
+        <w:pStyle w:val="SourceCode"/>
+      </w:pPr>
+      <w:r>
+        <w:t>export NODE_EXTRA_CA_CERTS=/etc/ssl/cert.pem</w:t>
+      </w:r>
+    </w:p>
+    <w:p>
+      <w:pPr>
+        <w:pStyle w:val="SourceCode"/>
+      </w:pPr>
+      <w:r>
+        <w:t>.venv/bin/python smoke_qianwen.py</w:t>
+      </w:r>
+    </w:p>
+    <w:p>
+      <w:pPr>
+        <w:pStyle w:val="SourceCode"/>
+      </w:pPr>
+      <w:r>
+        <w:t>result=$?</w:t>
+      </w:r>
+    </w:p>
+    <w:p>
+      <w:pPr>
+        <w:pStyle w:val="SourceCode"/>
+      </w:pPr>
+      <w:r>
+        <w:t>read '?测试结束，按回车关闭窗口。'</w:t>
+      </w:r>
+    </w:p>
+    <w:p>
+      <w:pPr>
+        <w:pStyle w:val="SourceCode"/>
+      </w:pPr>
+      <w:r>
+        <w:t>exit "$result"</w:t>
       </w:r>
     </w:p>
     <w:p>

</xml_diff>

<commit_message>
Fix offscreen Qianwen task selection in background browser
</commit_message>
<xml_diff>
--- a/安装与使用指南.docx
+++ b/安装与使用指南.docx
@@ -10143,7 +10143,7 @@
         <w:pStyle w:val="SourceCode"/>
       </w:pPr>
       <w:r>
-        <w:t xml:space="preserve">  "qianwen_browser.py": "daa1fea0b087bd1c48a2e4465ba2c1a5905489781f3de3ee6ca792782250d12e",</w:t>
+        <w:t xml:space="preserve">  "qianwen_browser.py": "b28c68ccbd6ca8893e921394d515b6ee2bb693410408e96d8213089df98efccd",</w:t>
       </w:r>
     </w:p>
     <w:p>
@@ -12477,7 +12477,15 @@
         <w:pStyle w:val="SourceCode"/>
       </w:pPr>
       <w:r>
-        <w:t xml:space="preserve">                                                         accept_downloads=True)</w:t>
+        <w:t xml:space="preserve">                                                         accept_downloads=True,</w:t>
+      </w:r>
+    </w:p>
+    <w:p>
+      <w:pPr>
+        <w:pStyle w:val="SourceCode"/>
+      </w:pPr>
+      <w:r>
+        <w:t xml:space="preserve">                                                         viewport={'width': 1920, 'height': 1600})</w:t>
       </w:r>
     </w:p>
     <w:p>
@@ -12753,7 +12761,7 @@
         <w:pStyle w:val="SourceCode"/>
       </w:pPr>
       <w:r>
-        <w:t xml:space="preserve">                    page.get_by_text(title, exact=True).first.click(timeout=10000)</w:t>
+        <w:t xml:space="preserve">                    page.locator('.rowTitle .titleContent').filter(has_text=title).first.click(timeout=10000)</w:t>
       </w:r>
     </w:p>
     <w:p>

</xml_diff>

<commit_message>
Wait for Qianwen document navigation, verify fresh headless workflow and default new tasks to cloud
</commit_message>
<xml_diff>
--- a/安装与使用指南.docx
+++ b/安装与使用指南.docx
@@ -1008,7 +1008,7 @@
     </w:p>
     <w:p>
       <w:r>
-        <w:t>首次登录完成后，可双击“测试千问后台流程.command”。它从已有任务的音轨截取20秒，在无窗口浏览器中转写、导出并生成测试Word，结果保存到 work/qianwen-smoke-test.json。没有现成音轨时需要先下载一个测试视频。此操作不终止正在识别的任务，不删除完整原媒体。当前版本登录失效不会自动弹出窗口；失败后在页面查看错误，再双击“配置千问登录.command”重新登录并重试原链接。</w:t>
+        <w:t>首次登录完成后，可双击“测试千问后台流程.command”。测试窗口可保留在后台十分钟，以便在需要时触发重试；完成后可关闭。它从已有任务的音轨截取20秒，在无窗口浏览器中转写、导出并生成测试Word，结果保存到 work/qianwen-smoke-test.json。没有现成音轨时需要先下载一个测试视频。此操作不终止正在识别的任务，不删除完整原媒体。当前版本登录失效不会自动弹出窗口；失败后在页面查看错误，再双击“配置千问登录.command”重新登录并重试原链接。</w:t>
       </w:r>
     </w:p>
     <w:p>
@@ -1023,7 +1023,7 @@
     </w:p>
     <w:p>
       <w:r>
-        <w:t>当前验证：已通过 Codex 隐藏浏览器完成20秒音频上传、转写和带发言人/时间戳的原文Word导出；真实导出解析与14项程序测试通过。专用无窗口浏览器的完整流程尚未实测，不能视为已验证的全自动功能。首次专用浏览器登录后，应先测试短视频再处理长视频。本地模型仍是默认选项，已有任务不自动切换。</w:t>
+        <w:t>当前验证：已在本机专用无窗口浏览器中完成全新20秒音频的上传、转写、原文Word导出、最终文档检查和测试媒体移入废纸篓，全流程约46秒；14项程序测试通过。此结果不代表长视频速度或识别准确率，也没有在另一台全新Mac安装实测。新任务页面默认选择千问，可切换本地模型；已有任务不自动切换。</w:t>
       </w:r>
     </w:p>
     <w:p>
@@ -4113,15 +4113,15 @@
         <w:pStyle w:val="SourceCode"/>
       </w:pPr>
       <w:r>
-        <w:t>&lt;p&gt;粘贴网页链接，后台下载并用 Qwen3-ASR-1.7B 识别语音，自动区分发言人，生成带时间戳、以视频标题命名的 Word。&lt;/p&gt;</w:t>
-      </w:r>
-    </w:p>
-    <w:p>
-      <w:pPr>
-        <w:pStyle w:val="SourceCode"/>
-      </w:pPr>
-      <w:r>
-        <w:t>&lt;form id="form"&gt;&lt;input id="url" aria-label="音视频网页链接" type="url" required placeholder="粘贴 YouTube、哔哩哔哩等音视频网页链接"&gt;&lt;select id="engine" aria-label="识别方式"&gt;&lt;option value="local"&gt;本地模型&lt;/option&gt;&lt;option value="qianwen"&gt;千问网页（需首次配置登录）&lt;/option&gt;&lt;/select&gt;&lt;button&gt;开始生成文稿&lt;/button&gt;&lt;/form&gt;</w:t>
+        <w:t>&lt;p&gt;粘贴网页链接，后台下载并默认交给千问识别语音、区分发言人，生成带时间戳、以视频标题命名的 Word。&lt;/p&gt;</w:t>
+      </w:r>
+    </w:p>
+    <w:p>
+      <w:pPr>
+        <w:pStyle w:val="SourceCode"/>
+      </w:pPr>
+      <w:r>
+        <w:t>&lt;form id="form"&gt;&lt;input id="url" aria-label="音视频网页链接" type="url" required placeholder="粘贴 YouTube、哔哩哔哩等音视频网页链接"&gt;&lt;select id="engine" aria-label="识别方式"&gt;&lt;option value="qianwen"&gt;千问网页&lt;/option&gt;&lt;option value="local"&gt;本地模型（速度较慢）&lt;/option&gt;&lt;/select&gt;&lt;button&gt;开始生成文稿&lt;/button&gt;&lt;/form&gt;</w:t>
       </w:r>
     </w:p>
     <w:p>
@@ -7329,7 +7329,23 @@
         <w:pStyle w:val="SourceCode"/>
       </w:pPr>
       <w:r>
-        <w:t xml:space="preserve">                 '网页校对结果.json', 'submitted-result.json', 'result.json', 'speaker-turns.json'):</w:t>
+        <w:t xml:space="preserve">                 '网页校对结果.json', 'submitted-result.json', 'result.json', 'speaker-turns.json',</w:t>
+      </w:r>
+    </w:p>
+    <w:p>
+      <w:pPr>
+        <w:pStyle w:val="SourceCode"/>
+      </w:pPr>
+      <w:r>
+        <w:t xml:space="preserve">                 'qianwen-original.docx', 'browser-diagnostic.png', 'browser-diagnostic.txt',</w:t>
+      </w:r>
+    </w:p>
+    <w:p>
+      <w:pPr>
+        <w:pStyle w:val="SourceCode"/>
+      </w:pPr>
+      <w:r>
+        <w:t xml:space="preserve">                 'browser-elements.json', 'browser-rows.json', 'browser-structure.json'):</w:t>
       </w:r>
     </w:p>
     <w:p>
@@ -10111,7 +10127,7 @@
         <w:pStyle w:val="SourceCode"/>
       </w:pPr>
       <w:r>
-        <w:t xml:space="preserve">  "index.html": "f4aacf140caeac36a16fa1692a473af9a1c98a547650f323b7b6b1eae8bc601a",</w:t>
+        <w:t xml:space="preserve">  "index.html": "339b72f6949c295d5638366727e4a724976cc0aaa74b28325ab17c1cf5fa9941",</w:t>
       </w:r>
     </w:p>
     <w:p>
@@ -10143,15 +10159,15 @@
         <w:pStyle w:val="SourceCode"/>
       </w:pPr>
       <w:r>
-        <w:t xml:space="preserve">  "qianwen_browser.py": "b28c68ccbd6ca8893e921394d515b6ee2bb693410408e96d8213089df98efccd",</w:t>
-      </w:r>
-    </w:p>
-    <w:p>
-      <w:pPr>
-        <w:pStyle w:val="SourceCode"/>
-      </w:pPr>
-      <w:r>
-        <w:t xml:space="preserve">  "reader.py": "249c75d6bddae4a34db213168606a669dac8308707a7bf7dc20df992fad73ed8",</w:t>
+        <w:t xml:space="preserve">  "qianwen_browser.py": "59085a2bf8f03d430bbf00999b6e88a82336316005c0bec7a2360036ef9ad227",</w:t>
+      </w:r>
+    </w:p>
+    <w:p>
+      <w:pPr>
+        <w:pStyle w:val="SourceCode"/>
+      </w:pPr>
+      <w:r>
+        <w:t xml:space="preserve">  "reader.py": "39334c25f04793cdebb4a3af7c0e6aa347da1ff6a62a581266b92d3e624aef4a",</w:t>
       </w:r>
     </w:p>
     <w:p>
@@ -10167,7 +10183,15 @@
         <w:pStyle w:val="SourceCode"/>
       </w:pPr>
       <w:r>
-        <w:t xml:space="preserve">  "smoke_qianwen.py": "df0219bddc0456a3634a1e76c40a359060787ced5355e6a5d6d9f4495a37c81c",</w:t>
+        <w:t xml:space="preserve">  "smoke_qianwen.py": "5a41ae58b74a8f2edaaadeb36c60235646989c5bdb2aa49e17d72dfd8778f71e",</w:t>
+      </w:r>
+    </w:p>
+    <w:p>
+      <w:pPr>
+        <w:pStyle w:val="SourceCode"/>
+      </w:pPr>
+      <w:r>
+        <w:t xml:space="preserve">  "smoke_qianwen_runner.py": "10c6047ad2b7ae20cac3945b41f8afdc047975fd2da3ef0dc576f3753a512409",</w:t>
       </w:r>
     </w:p>
     <w:p>
@@ -10223,7 +10247,7 @@
         <w:pStyle w:val="SourceCode"/>
       </w:pPr>
       <w:r>
-        <w:t xml:space="preserve">  "测试千问后台流程.command": "52d888b7df03ab9b1b22d779628e6526f0e13f68ec09ba3bd1344faa7f61a6c3",</w:t>
+        <w:t xml:space="preserve">  "测试千问后台流程.command": "365ea7c455b38238341c79e3f2db6531de8053c34a909c4a210a19248a680c8c",</w:t>
       </w:r>
     </w:p>
     <w:p>
@@ -12609,6 +12633,22 @@
         <w:pStyle w:val="SourceCode"/>
       </w:pPr>
       <w:r>
+        <w:t xml:space="preserve">            page.screenshot(path=str(job/'browser-diagnostic.png'), full_page=True)</w:t>
+      </w:r>
+    </w:p>
+    <w:p>
+      <w:pPr>
+        <w:pStyle w:val="SourceCode"/>
+      </w:pPr>
+      <w:r>
+        <w:t xml:space="preserve">            (job/'browser-diagnostic.txt').write_text(page.locator('body').inner_text())</w:t>
+      </w:r>
+    </w:p>
+    <w:p>
+      <w:pPr>
+        <w:pStyle w:val="SourceCode"/>
+      </w:pPr>
+      <w:r>
         <w:t xml:space="preserve">            if not meta.get('qianwen_url'):</w:t>
       </w:r>
     </w:p>
@@ -12761,31 +12801,79 @@
         <w:pStyle w:val="SourceCode"/>
       </w:pPr>
       <w:r>
-        <w:t xml:space="preserve">                    page.locator('.rowTitle .titleContent').filter(has_text=title).first.click(timeout=10000)</w:t>
-      </w:r>
-    </w:p>
-    <w:p>
-      <w:pPr>
-        <w:pStyle w:val="SourceCode"/>
-      </w:pPr>
-      <w:r>
-        <w:t xml:space="preserve">                    if page.get_by_role('button', name='导出', exact=True).count():</w:t>
-      </w:r>
-    </w:p>
-    <w:p>
-      <w:pPr>
-        <w:pStyle w:val="SourceCode"/>
-      </w:pPr>
-      <w:r>
-        <w:t xml:space="preserve">                        meta['qianwen_url'] = page.url; save(job/'job.json', meta); break</w:t>
-      </w:r>
-    </w:p>
-    <w:p>
-      <w:pPr>
-        <w:pStyle w:val="SourceCode"/>
-      </w:pPr>
-      <w:r>
-        <w:t xml:space="preserve">                    time.sleep(5)</w:t>
+        <w:t xml:space="preserve">                    from playwright.sync_api import TimeoutError as BrowserTimeout</w:t>
+      </w:r>
+    </w:p>
+    <w:p>
+      <w:pPr>
+        <w:pStyle w:val="SourceCode"/>
+      </w:pPr>
+      <w:r>
+        <w:t xml:space="preserve">                    if '/efficiency/doc/transcripts/' not in page.url:</w:t>
+      </w:r>
+    </w:p>
+    <w:p>
+      <w:pPr>
+        <w:pStyle w:val="SourceCode"/>
+      </w:pPr>
+      <w:r>
+        <w:t xml:space="preserve">                        page.get_by_text(title, exact=True).filter(visible=True).first.click(timeout=10000)</w:t>
+      </w:r>
+    </w:p>
+    <w:p>
+      <w:pPr>
+        <w:pStyle w:val="SourceCode"/>
+      </w:pPr>
+      <w:r>
+        <w:t xml:space="preserve">                    try:</w:t>
+      </w:r>
+    </w:p>
+    <w:p>
+      <w:pPr>
+        <w:pStyle w:val="SourceCode"/>
+      </w:pPr>
+      <w:r>
+        <w:t xml:space="preserve">                        page.get_by_role('button', name='导出', exact=True).wait_for(timeout=10000)</w:t>
+      </w:r>
+    </w:p>
+    <w:p>
+      <w:pPr>
+        <w:pStyle w:val="SourceCode"/>
+      </w:pPr>
+      <w:r>
+        <w:t xml:space="preserve">                    except BrowserTimeout:</w:t>
+      </w:r>
+    </w:p>
+    <w:p>
+      <w:pPr>
+        <w:pStyle w:val="SourceCode"/>
+      </w:pPr>
+      <w:r>
+        <w:t xml:space="preserve">                        time.sleep(5)</w:t>
+      </w:r>
+    </w:p>
+    <w:p>
+      <w:pPr>
+        <w:pStyle w:val="SourceCode"/>
+      </w:pPr>
+      <w:r>
+        <w:t xml:space="preserve">                        continue</w:t>
+      </w:r>
+    </w:p>
+    <w:p>
+      <w:pPr>
+        <w:pStyle w:val="SourceCode"/>
+      </w:pPr>
+      <w:r>
+        <w:t xml:space="preserve">                    meta['qianwen_url'] = page.url; save(job/'job.json', meta)</w:t>
+      </w:r>
+    </w:p>
+    <w:p>
+      <w:pPr>
+        <w:pStyle w:val="SourceCode"/>
+      </w:pPr>
+      <w:r>
+        <w:t xml:space="preserve">                    break</w:t>
       </w:r>
     </w:p>
     <w:p>
@@ -12809,6 +12897,30 @@
         <w:pStyle w:val="SourceCode"/>
       </w:pPr>
       <w:r>
+        <w:t xml:space="preserve">            page.get_by_role('button', name='导出', exact=True).wait_for(timeout=60000)</w:t>
+      </w:r>
+    </w:p>
+    <w:p>
+      <w:pPr>
+        <w:pStyle w:val="SourceCode"/>
+      </w:pPr>
+      <w:r>
+        <w:t xml:space="preserve">            page.screenshot(path=str(job/'browser-diagnostic.png'), full_page=True)</w:t>
+      </w:r>
+    </w:p>
+    <w:p>
+      <w:pPr>
+        <w:pStyle w:val="SourceCode"/>
+      </w:pPr>
+      <w:r>
+        <w:t xml:space="preserve">            (job/'browser-diagnostic.txt').write_text(page.locator('body').inner_text())</w:t>
+      </w:r>
+    </w:p>
+    <w:p>
+      <w:pPr>
+        <w:pStyle w:val="SourceCode"/>
+      </w:pPr>
+      <w:r>
         <w:t xml:space="preserve">            page.get_by_role('button', name='导出', exact=True).click()</w:t>
       </w:r>
     </w:p>
@@ -13499,7 +13611,7 @@
         <w:pStyle w:val="SourceCode"/>
       </w:pPr>
       <w:r>
-        <w:t xml:space="preserve">    ident=hashlib.sha256(b'qianwen-smoke-test-20-seconds').hexdigest()[:12]</w:t>
+        <w:t xml:space="preserve">    ident=hashlib.sha256(b'qianwen-smoke-test-20-seconds-v2').hexdigest()[:12]</w:t>
       </w:r>
     </w:p>
     <w:p>
@@ -13531,7 +13643,7 @@
         <w:pStyle w:val="SourceCode"/>
       </w:pPr>
       <w:r>
-        <w:t xml:space="preserve">          'title':'千问独立后台测试（仅20秒片段）','name':'千问独立后台测试（仅20秒片段）',</w:t>
+        <w:t xml:space="preserve">          'title':'千问独立后台完整测试（仅20秒片段）','name':'千问独立后台完整测试（仅20秒片段）',</w:t>
       </w:r>
     </w:p>
     <w:p>
@@ -13917,7 +14029,7 @@
         <w:pStyle w:val="SourceCode"/>
       </w:pPr>
       <w:r>
-        <w:t>.venv/bin/python smoke_qianwen.py</w:t>
+        <w:t>.venv/bin/python smoke_qianwen_runner.py</w:t>
       </w:r>
     </w:p>
     <w:p>
@@ -13942,6 +14054,156 @@
       </w:pPr>
       <w:r>
         <w:t>exit "$result"</w:t>
+      </w:r>
+    </w:p>
+    <w:p>
+      <w:pPr>
+        <w:pStyle w:val="SourceCode"/>
+      </w:pPr>
+      <w:r/>
+    </w:p>
+    <w:p>
+      <w:pPr>
+        <w:pStyle w:val="Heading2"/>
+      </w:pPr>
+      <w:r>
+        <w:t>FILE: smoke_qianwen_runner.py</w:t>
+      </w:r>
+    </w:p>
+    <w:p>
+      <w:pPr>
+        <w:pStyle w:val="SourceCode"/>
+      </w:pPr>
+      <w:r>
+        <w:t>"""A bounded local test runner; retry only on an explicit file request."""</w:t>
+      </w:r>
+    </w:p>
+    <w:p>
+      <w:pPr>
+        <w:pStyle w:val="SourceCode"/>
+      </w:pPr>
+      <w:r>
+        <w:t>import subprocess</w:t>
+      </w:r>
+    </w:p>
+    <w:p>
+      <w:pPr>
+        <w:pStyle w:val="SourceCode"/>
+      </w:pPr>
+      <w:r>
+        <w:t>import sys</w:t>
+      </w:r>
+    </w:p>
+    <w:p>
+      <w:pPr>
+        <w:pStyle w:val="SourceCode"/>
+      </w:pPr>
+      <w:r>
+        <w:t>import time</w:t>
+      </w:r>
+    </w:p>
+    <w:p>
+      <w:pPr>
+        <w:pStyle w:val="SourceCode"/>
+      </w:pPr>
+      <w:r>
+        <w:t>from pathlib import Path</w:t>
+      </w:r>
+    </w:p>
+    <w:p>
+      <w:pPr>
+        <w:pStyle w:val="SourceCode"/>
+      </w:pPr>
+      <w:r>
+        <w:t>ROOT=Path(__file__).resolve().parent</w:t>
+      </w:r>
+    </w:p>
+    <w:p>
+      <w:pPr>
+        <w:pStyle w:val="SourceCode"/>
+      </w:pPr>
+      <w:r>
+        <w:t>request=ROOT/'work/qianwen-test-request.txt'</w:t>
+      </w:r>
+    </w:p>
+    <w:p>
+      <w:pPr>
+        <w:pStyle w:val="SourceCode"/>
+      </w:pPr>
+      <w:r>
+        <w:t>last=None</w:t>
+      </w:r>
+    </w:p>
+    <w:p>
+      <w:pPr>
+        <w:pStyle w:val="SourceCode"/>
+      </w:pPr>
+      <w:r>
+        <w:t>end=time.monotonic()+600</w:t>
+      </w:r>
+    </w:p>
+    <w:p>
+      <w:pPr>
+        <w:pStyle w:val="SourceCode"/>
+      </w:pPr>
+      <w:r>
+        <w:t>first=True</w:t>
+      </w:r>
+    </w:p>
+    <w:p>
+      <w:pPr>
+        <w:pStyle w:val="SourceCode"/>
+      </w:pPr>
+      <w:r>
+        <w:t>while time.monotonic()&lt;end:</w:t>
+      </w:r>
+    </w:p>
+    <w:p>
+      <w:pPr>
+        <w:pStyle w:val="SourceCode"/>
+      </w:pPr>
+      <w:r>
+        <w:t xml:space="preserve">    current=request.read_text() if request.exists() else ''</w:t>
+      </w:r>
+    </w:p>
+    <w:p>
+      <w:pPr>
+        <w:pStyle w:val="SourceCode"/>
+      </w:pPr>
+      <w:r>
+        <w:t xml:space="preserve">    if first or current!=last:</w:t>
+      </w:r>
+    </w:p>
+    <w:p>
+      <w:pPr>
+        <w:pStyle w:val="SourceCode"/>
+      </w:pPr>
+      <w:r>
+        <w:t xml:space="preserve">        first=False;last=current</w:t>
+      </w:r>
+    </w:p>
+    <w:p>
+      <w:pPr>
+        <w:pStyle w:val="SourceCode"/>
+      </w:pPr>
+      <w:r>
+        <w:t xml:space="preserve">        subprocess.run([sys.executable,str(ROOT/'smoke_qianwen.py')])</w:t>
+      </w:r>
+    </w:p>
+    <w:p>
+      <w:pPr>
+        <w:pStyle w:val="SourceCode"/>
+      </w:pPr>
+      <w:r>
+        <w:t xml:space="preserve">        print('测试结果已保存。保留此窗口即可，接下来十分钟内可后台重试；按Ctrl+C结束。',flush=True)</w:t>
+      </w:r>
+    </w:p>
+    <w:p>
+      <w:pPr>
+        <w:pStyle w:val="SourceCode"/>
+      </w:pPr>
+      <w:r>
+        <w:t xml:space="preserve">    time.sleep(1)</w:t>
       </w:r>
     </w:p>
     <w:p>

</xml_diff>

<commit_message>
Add Qianwen login status and local task deletion controls
</commit_message>
<xml_diff>
--- a/安装与使用指南.docx
+++ b/安装与使用指南.docx
@@ -1003,12 +1003,35 @@
         <w:pStyle w:val="Heading2"/>
       </w:pPr>
       <w:r>
+        <w:t>页面登录与删除任务</w:t>
+      </w:r>
+    </w:p>
+    <w:p>
+      <w:r>
+        <w:t>点击页面上的“千问登录”会打开本机专用浏览器。完成登录后关闭该窗口即可，无需到终端按回车。后台转写不会主动弹出登录窗口。网页检测到登录或验证提示时，任务显示“需要重新登录千问”，登录状态栏也会提示；登录后点击该任务的“重试任务”。状态栏显示最近成功转写时间，不能保证闲置期间登录一直有效，也不能提前知道准确失效时刻。登录窗口正在打开或浏览器正处理任务时，不重复打开另一份专用浏览器。</w:t>
+      </w:r>
+    </w:p>
+    <w:p>
+      <w:r>
+        <w:t>每条任务都有“删除任务”按钮。确认后，先停止本机该任务的识别及子进程，再将任务目录、媒体、导出的Word和已记录的未完成Word移入废纸篓，任务从列表消失。删除不会清空废纸篓，不删除共享模型、其他任务或千问云端记录；云端副本由本人在千问网页管理。停止未成功或文件路径无法确认时，显示错误而不宣称删除完成。</w:t>
+      </w:r>
+    </w:p>
+    <w:p>
+      <w:r>
+        <w:t>更新已有自动启动副本后，双击“加载本次更新.command”让服务重新加载，再刷新页面。它仅重启当前项目的网页服务，已有识别进程保留。不属于当前项目的启动项不会被操作。未启用自动启动的副本需正常停止旧手动网页服务后重新运行启动文件。</w:t>
+      </w:r>
+    </w:p>
+    <w:p>
+      <w:pPr>
+        <w:pStyle w:val="Heading2"/>
+      </w:pPr>
+      <w:r>
         <w:t>千问网页识别（实验性可选功能）</w:t>
       </w:r>
     </w:p>
     <w:p>
       <w:r>
-        <w:t>首次登录完成后，可双击“测试千问后台流程.command”。测试窗口可保留在后台十分钟，以便在需要时触发重试；完成后可关闭。它从已有任务的音轨截取20秒，在无窗口浏览器中转写、导出并生成测试Word，结果保存到 work/qianwen-smoke-test.json。没有现成音轨时需要先下载一个测试视频。此操作不终止正在识别的任务，不删除完整原媒体。当前版本登录失效不会自动弹出窗口；失败后在页面查看错误，再双击“配置千问登录.command”重新登录并重试原链接。</w:t>
+        <w:t>首次登录完成后，可双击“测试千问后台流程.command”。测试窗口可保留在后台十分钟，以便在需要时触发重试；完成后可关闭。它从已有任务的音轨截取20秒，在无窗口浏览器中转写、导出并生成测试Word，结果保存到 work/qianwen-smoke-test.json。没有现成音轨时需要先下载一个测试视频。此操作不终止正在识别的任务，不删除完整原媒体。登录失效不会自动弹出窗口；可在页面点击“千问登录”，关闭登录窗口后点击任务上的“重试任务”。</w:t>
       </w:r>
     </w:p>
     <w:p>
@@ -2296,6 +2319,38 @@
       <w:pPr>
         <w:pStyle w:val="SourceCode"/>
       </w:pPr>
+      <w:r>
+        <w:t>generations = {}</w:t>
+      </w:r>
+    </w:p>
+    <w:p>
+      <w:pPr>
+        <w:pStyle w:val="SourceCode"/>
+      </w:pPr>
+      <w:r>
+        <w:t>cancelled = set()</w:t>
+      </w:r>
+    </w:p>
+    <w:p>
+      <w:pPr>
+        <w:pStyle w:val="SourceCode"/>
+      </w:pPr>
+      <w:r>
+        <w:t>login_process = None</w:t>
+      </w:r>
+    </w:p>
+    <w:p>
+      <w:pPr>
+        <w:pStyle w:val="SourceCode"/>
+      </w:pPr>
+      <w:r>
+        <w:t>active_readers = {}</w:t>
+      </w:r>
+    </w:p>
+    <w:p>
+      <w:pPr>
+        <w:pStyle w:val="SourceCode"/>
+      </w:pPr>
       <w:r/>
     </w:p>
     <w:p>
@@ -2839,7 +2894,7 @@
         <w:pStyle w:val="SourceCode"/>
       </w:pPr>
       <w:r>
-        <w:t xml:space="preserve">        if item.get('state') not in ('completed', 'failed'):</w:t>
+        <w:t xml:space="preserve">        if item.get('state') not in ('completed', 'failed', 'login_required'):</w:t>
       </w:r>
     </w:p>
     <w:p>
@@ -2855,7 +2910,23 @@
         <w:pStyle w:val="SourceCode"/>
       </w:pPr>
       <w:r>
-        <w:t xml:space="preserve">            tasks.put((item['id'], item['url']))</w:t>
+        <w:t xml:space="preserve">            generation=__import__('uuid').uuid4().hex</w:t>
+      </w:r>
+    </w:p>
+    <w:p>
+      <w:pPr>
+        <w:pStyle w:val="SourceCode"/>
+      </w:pPr>
+      <w:r>
+        <w:t xml:space="preserve">            generations[item['id']]=generation</w:t>
+      </w:r>
+    </w:p>
+    <w:p>
+      <w:pPr>
+        <w:pStyle w:val="SourceCode"/>
+      </w:pPr>
+      <w:r>
+        <w:t xml:space="preserve">            tasks.put((item['id'], item['url'], generation))</w:t>
       </w:r>
     </w:p>
     <w:p>
@@ -3085,7 +3156,7 @@
         <w:pStyle w:val="SourceCode"/>
       </w:pPr>
       <w:r>
-        <w:t xml:space="preserve">        ident, url = tasks.get()</w:t>
+        <w:t xml:space="preserve">        ident, url, generation = tasks.get()</w:t>
       </w:r>
     </w:p>
     <w:p>
@@ -3117,6 +3188,14 @@
         <w:pStyle w:val="SourceCode"/>
       </w:pPr>
       <w:r>
+        <w:t xml:space="preserve">            if (ident,generation) in cancelled or not folder.exists():continue</w:t>
+      </w:r>
+    </w:p>
+    <w:p>
+      <w:pPr>
+        <w:pStyle w:val="SourceCode"/>
+      </w:pPr>
+      <w:r>
         <w:t xml:space="preserve">            with (folder / '.prepare.lock').open('a') as lock:</w:t>
       </w:r>
     </w:p>
@@ -3133,6 +3212,14 @@
         <w:pStyle w:val="SourceCode"/>
       </w:pPr>
       <w:r>
+        <w:t xml:space="preserve">                    if (ident,generation) in cancelled or not folder.exists() or (folder/'.deleting').exists():break</w:t>
+      </w:r>
+    </w:p>
+    <w:p>
+      <w:pPr>
+        <w:pStyle w:val="SourceCode"/>
+      </w:pPr>
+      <w:r>
         <w:t xml:space="preserve">                    try:</w:t>
       </w:r>
     </w:p>
@@ -3165,63 +3252,95 @@
         <w:pStyle w:val="SourceCode"/>
       </w:pPr>
       <w:r>
-        <w:t xml:space="preserve">                    except BlockingIOError:</w:t>
-      </w:r>
-    </w:p>
-    <w:p>
-      <w:pPr>
-        <w:pStyle w:val="SourceCode"/>
-      </w:pPr>
-      <w:r>
-        <w:t xml:space="preserve">                        time.sleep(2)</w:t>
-      </w:r>
-    </w:p>
-    <w:p>
-      <w:pPr>
-        <w:pStyle w:val="SourceCode"/>
-      </w:pPr>
-      <w:r>
-        <w:t xml:space="preserve">            with (folder / 'run.log').open('ab') as log:</w:t>
-      </w:r>
-    </w:p>
-    <w:p>
-      <w:pPr>
-        <w:pStyle w:val="SourceCode"/>
-      </w:pPr>
-      <w:r>
-        <w:t xml:space="preserve">                result = subprocess.run([str(ROOT / '.venv/bin/python'), str(ROOT / 'reader.py'),</w:t>
-      </w:r>
-    </w:p>
-    <w:p>
-      <w:pPr>
-        <w:pStyle w:val="SourceCode"/>
-      </w:pPr>
-      <w:r>
-        <w:t xml:space="preserve">                                        'prepare', url, '--engine',</w:t>
-      </w:r>
-    </w:p>
-    <w:p>
-      <w:pPr>
-        <w:pStyle w:val="SourceCode"/>
-      </w:pPr>
-      <w:r>
-        <w:t xml:space="preserve">                                        json.loads((folder/'job.json').read_text()).get('engine', 'local')], stdout=log, stderr=log)</w:t>
-      </w:r>
-    </w:p>
-    <w:p>
-      <w:pPr>
-        <w:pStyle w:val="SourceCode"/>
-      </w:pPr>
-      <w:r>
-        <w:t xml:space="preserve">            if result.returncode == 0:</w:t>
-      </w:r>
-    </w:p>
-    <w:p>
-      <w:pPr>
-        <w:pStyle w:val="SourceCode"/>
-      </w:pPr>
-      <w:r>
-        <w:t xml:space="preserve">                (folder / 'run.log').unlink(missing_ok=True)</w:t>
+        <w:t xml:space="preserve">                    except BlockingIOError:time.sleep(.2)</w:t>
+      </w:r>
+    </w:p>
+    <w:p>
+      <w:pPr>
+        <w:pStyle w:val="SourceCode"/>
+      </w:pPr>
+      <w:r>
+        <w:t xml:space="preserve">            with mutex:</w:t>
+      </w:r>
+    </w:p>
+    <w:p>
+      <w:pPr>
+        <w:pStyle w:val="SourceCode"/>
+      </w:pPr>
+      <w:r>
+        <w:t xml:space="preserve">                if (ident,generation) in cancelled or not folder.exists() or (folder/'.deleting').exists():continue</w:t>
+      </w:r>
+    </w:p>
+    <w:p>
+      <w:pPr>
+        <w:pStyle w:val="SourceCode"/>
+      </w:pPr>
+      <w:r>
+        <w:t xml:space="preserve">                log=(folder/'run.log').open('ab')</w:t>
+      </w:r>
+    </w:p>
+    <w:p>
+      <w:pPr>
+        <w:pStyle w:val="SourceCode"/>
+      </w:pPr>
+      <w:r>
+        <w:t xml:space="preserve">                process=subprocess.Popen([str(ROOT/'.venv/bin/python'),str(ROOT/'reader.py'),</w:t>
+      </w:r>
+    </w:p>
+    <w:p>
+      <w:pPr>
+        <w:pStyle w:val="SourceCode"/>
+      </w:pPr>
+      <w:r>
+        <w:t xml:space="preserve">                     'prepare',url,'--engine',json.loads((folder/'job.json').read_text()).get('engine','local')],</w:t>
+      </w:r>
+    </w:p>
+    <w:p>
+      <w:pPr>
+        <w:pStyle w:val="SourceCode"/>
+      </w:pPr>
+      <w:r>
+        <w:t xml:space="preserve">                     stdout=log,stderr=log,start_new_session=True)</w:t>
+      </w:r>
+    </w:p>
+    <w:p>
+      <w:pPr>
+        <w:pStyle w:val="SourceCode"/>
+      </w:pPr>
+      <w:r>
+        <w:t xml:space="preserve">                active_readers[ident]=(process,generation)</w:t>
+      </w:r>
+    </w:p>
+    <w:p>
+      <w:pPr>
+        <w:pStyle w:val="SourceCode"/>
+      </w:pPr>
+      <w:r>
+        <w:t xml:space="preserve">            result=process.wait();log.close()</w:t>
+      </w:r>
+    </w:p>
+    <w:p>
+      <w:pPr>
+        <w:pStyle w:val="SourceCode"/>
+      </w:pPr>
+      <w:r>
+        <w:t xml:space="preserve">            if result==0:(folder/'run.log').unlink(missing_ok=True)</w:t>
+      </w:r>
+    </w:p>
+    <w:p>
+      <w:pPr>
+        <w:pStyle w:val="SourceCode"/>
+      </w:pPr>
+      <w:r>
+        <w:t xml:space="preserve">        except OSError:</w:t>
+      </w:r>
+    </w:p>
+    <w:p>
+      <w:pPr>
+        <w:pStyle w:val="SourceCode"/>
+      </w:pPr>
+      <w:r>
+        <w:t xml:space="preserve">            pass</w:t>
       </w:r>
     </w:p>
     <w:p>
@@ -3245,7 +3364,31 @@
         <w:pStyle w:val="SourceCode"/>
       </w:pPr>
       <w:r>
-        <w:t xml:space="preserve">                pending.discard(ident)</w:t>
+        <w:t xml:space="preserve">                if generations.get(ident)==generation:</w:t>
+      </w:r>
+    </w:p>
+    <w:p>
+      <w:pPr>
+        <w:pStyle w:val="SourceCode"/>
+      </w:pPr>
+      <w:r>
+        <w:t xml:space="preserve">                    pending.discard(ident);generations.pop(ident,None)</w:t>
+      </w:r>
+    </w:p>
+    <w:p>
+      <w:pPr>
+        <w:pStyle w:val="SourceCode"/>
+      </w:pPr>
+      <w:r>
+        <w:t xml:space="preserve">                cancelled.discard((ident,generation))</w:t>
+      </w:r>
+    </w:p>
+    <w:p>
+      <w:pPr>
+        <w:pStyle w:val="SourceCode"/>
+      </w:pPr>
+      <w:r>
+        <w:t xml:space="preserve">                if active_readers.get(ident,(None,None))[1]==generation:active_readers.pop(ident,None)</w:t>
       </w:r>
     </w:p>
     <w:p>
@@ -3273,6 +3416,298 @@
         <w:pStyle w:val="SourceCode"/>
       </w:pPr>
       <w:r>
+        <w:t>def delete_task(ident):</w:t>
+      </w:r>
+    </w:p>
+    <w:p>
+      <w:pPr>
+        <w:pStyle w:val="SourceCode"/>
+      </w:pPr>
+      <w:r>
+        <w:t xml:space="preserve">    from task_controls import trash_task, stop_reader</w:t>
+      </w:r>
+    </w:p>
+    <w:p>
+      <w:pPr>
+        <w:pStyle w:val="SourceCode"/>
+      </w:pPr>
+      <w:r>
+        <w:t xml:space="preserve">    with mutex:</w:t>
+      </w:r>
+    </w:p>
+    <w:p>
+      <w:pPr>
+        <w:pStyle w:val="SourceCode"/>
+      </w:pPr>
+      <w:r>
+        <w:t xml:space="preserve">        generation=generations.get(ident)</w:t>
+      </w:r>
+    </w:p>
+    <w:p>
+      <w:pPr>
+        <w:pStyle w:val="SourceCode"/>
+      </w:pPr>
+      <w:r>
+        <w:t xml:space="preserve">        if generation:cancelled.add((ident,generation))</w:t>
+      </w:r>
+    </w:p>
+    <w:p>
+      <w:pPr>
+        <w:pStyle w:val="SourceCode"/>
+      </w:pPr>
+      <w:r>
+        <w:t xml:space="preserve">        process=active_readers.get(ident,(None,None))[0]</w:t>
+      </w:r>
+    </w:p>
+    <w:p>
+      <w:pPr>
+        <w:pStyle w:val="SourceCode"/>
+      </w:pPr>
+      <w:r>
+        <w:t xml:space="preserve">        if process and process.poll() is None:stop_reader(process.pid)</w:t>
+      </w:r>
+    </w:p>
+    <w:p>
+      <w:pPr>
+        <w:pStyle w:val="SourceCode"/>
+      </w:pPr>
+      <w:r>
+        <w:t xml:space="preserve">        result=trash_task(ROOT,WORK,[OUTPUT,LEGACY_OUTPUT,ROOT/'outputs',OUTPUT.parent/'网页视频转语音文稿'],ident)</w:t>
+      </w:r>
+    </w:p>
+    <w:p>
+      <w:pPr>
+        <w:pStyle w:val="SourceCode"/>
+      </w:pPr>
+      <w:r>
+        <w:t xml:space="preserve">        pending.discard(ident);generations.pop(ident,None)</w:t>
+      </w:r>
+    </w:p>
+    <w:p>
+      <w:pPr>
+        <w:pStyle w:val="SourceCode"/>
+      </w:pPr>
+      <w:r>
+        <w:t xml:space="preserve">        return result</w:t>
+      </w:r>
+    </w:p>
+    <w:p>
+      <w:pPr>
+        <w:pStyle w:val="SourceCode"/>
+      </w:pPr>
+      <w:r/>
+    </w:p>
+    <w:p>
+      <w:pPr>
+        <w:pStyle w:val="SourceCode"/>
+      </w:pPr>
+      <w:r/>
+    </w:p>
+    <w:p>
+      <w:pPr>
+        <w:pStyle w:val="SourceCode"/>
+      </w:pPr>
+      <w:r>
+        <w:t>def login_status():</w:t>
+      </w:r>
+    </w:p>
+    <w:p>
+      <w:pPr>
+        <w:pStyle w:val="SourceCode"/>
+      </w:pPr>
+      <w:r>
+        <w:t xml:space="preserve">    path=WORK/'qianwen-auth.json'</w:t>
+      </w:r>
+    </w:p>
+    <w:p>
+      <w:pPr>
+        <w:pStyle w:val="SourceCode"/>
+      </w:pPr>
+      <w:r>
+        <w:t xml:space="preserve">    state=json.loads(path.read_text()) if path.exists() else {'status':'unknown'}</w:t>
+      </w:r>
+    </w:p>
+    <w:p>
+      <w:pPr>
+        <w:pStyle w:val="SourceCode"/>
+      </w:pPr>
+      <w:r>
+        <w:t xml:space="preserve">    if not state.get('last_success'):</w:t>
+      </w:r>
+    </w:p>
+    <w:p>
+      <w:pPr>
+        <w:pStyle w:val="SourceCode"/>
+      </w:pPr>
+      <w:r>
+        <w:t xml:space="preserve">        successes=[item.get('added_at',0) for item in list_jobs() if item.get('state')=='completed' and item.get('model')=='qianwen-web']</w:t>
+      </w:r>
+    </w:p>
+    <w:p>
+      <w:pPr>
+        <w:pStyle w:val="SourceCode"/>
+      </w:pPr>
+      <w:r>
+        <w:t xml:space="preserve">        if successes:state['last_success']=max(successes)</w:t>
+      </w:r>
+    </w:p>
+    <w:p>
+      <w:pPr>
+        <w:pStyle w:val="SourceCode"/>
+      </w:pPr>
+      <w:r>
+        <w:t xml:space="preserve">    state['window_open']=bool(login_process and login_process.poll() is None)</w:t>
+      </w:r>
+    </w:p>
+    <w:p>
+      <w:pPr>
+        <w:pStyle w:val="SourceCode"/>
+      </w:pPr>
+      <w:r>
+        <w:t xml:space="preserve">    if login_process and login_process.poll() not in (None,0):state['error']='登录窗口未能正常打开，请运行配置千问登录.command检查浏览器环境。'</w:t>
+      </w:r>
+    </w:p>
+    <w:p>
+      <w:pPr>
+        <w:pStyle w:val="SourceCode"/>
+      </w:pPr>
+      <w:r>
+        <w:t xml:space="preserve">    return state</w:t>
+      </w:r>
+    </w:p>
+    <w:p>
+      <w:pPr>
+        <w:pStyle w:val="SourceCode"/>
+      </w:pPr>
+      <w:r/>
+    </w:p>
+    <w:p>
+      <w:pPr>
+        <w:pStyle w:val="SourceCode"/>
+      </w:pPr>
+      <w:r/>
+    </w:p>
+    <w:p>
+      <w:pPr>
+        <w:pStyle w:val="SourceCode"/>
+      </w:pPr>
+      <w:r>
+        <w:t>def open_login():</w:t>
+      </w:r>
+    </w:p>
+    <w:p>
+      <w:pPr>
+        <w:pStyle w:val="SourceCode"/>
+      </w:pPr>
+      <w:r>
+        <w:t xml:space="preserve">    global login_process</w:t>
+      </w:r>
+    </w:p>
+    <w:p>
+      <w:pPr>
+        <w:pStyle w:val="SourceCode"/>
+      </w:pPr>
+      <w:r>
+        <w:t xml:space="preserve">    with mutex:</w:t>
+      </w:r>
+    </w:p>
+    <w:p>
+      <w:pPr>
+        <w:pStyle w:val="SourceCode"/>
+      </w:pPr>
+      <w:r>
+        <w:t xml:space="preserve">        if login_process and login_process.poll() is None:return {'ok':True,'message':'登录窗口已经打开。'}</w:t>
+      </w:r>
+    </w:p>
+    <w:p>
+      <w:pPr>
+        <w:pStyle w:val="SourceCode"/>
+      </w:pPr>
+      <w:r>
+        <w:t xml:space="preserve">        lock=WORK/'qianwen-browser.lock'</w:t>
+      </w:r>
+    </w:p>
+    <w:p>
+      <w:pPr>
+        <w:pStyle w:val="SourceCode"/>
+      </w:pPr>
+      <w:r>
+        <w:t xml:space="preserve">        import fcntl</w:t>
+      </w:r>
+    </w:p>
+    <w:p>
+      <w:pPr>
+        <w:pStyle w:val="SourceCode"/>
+      </w:pPr>
+      <w:r>
+        <w:t xml:space="preserve">        with lock.open('a') as handle:</w:t>
+      </w:r>
+    </w:p>
+    <w:p>
+      <w:pPr>
+        <w:pStyle w:val="SourceCode"/>
+      </w:pPr>
+      <w:r>
+        <w:t xml:space="preserve">            try:fcntl.flock(handle,fcntl.LOCK_EX|fcntl.LOCK_NB)</w:t>
+      </w:r>
+    </w:p>
+    <w:p>
+      <w:pPr>
+        <w:pStyle w:val="SourceCode"/>
+      </w:pPr>
+      <w:r>
+        <w:t xml:space="preserve">            except BlockingIOError:raise ValueError('千问浏览器正在处理任务，请稍后再登录。')</w:t>
+      </w:r>
+    </w:p>
+    <w:p>
+      <w:pPr>
+        <w:pStyle w:val="SourceCode"/>
+      </w:pPr>
+      <w:r>
+        <w:t xml:space="preserve">        with (WORK/'qianwen-login.log').open('ab') as log:</w:t>
+      </w:r>
+    </w:p>
+    <w:p>
+      <w:pPr>
+        <w:pStyle w:val="SourceCode"/>
+      </w:pPr>
+      <w:r>
+        <w:t xml:space="preserve">            login_process=subprocess.Popen([str(ROOT/'.venv/bin/python'),str(ROOT/'qianwen_browser.py'),'login-ui'],</w:t>
+      </w:r>
+    </w:p>
+    <w:p>
+      <w:pPr>
+        <w:pStyle w:val="SourceCode"/>
+      </w:pPr>
+      <w:r>
+        <w:t xml:space="preserve">                                           stdin=subprocess.DEVNULL,stdout=log,stderr=log,start_new_session=True)</w:t>
+      </w:r>
+    </w:p>
+    <w:p>
+      <w:pPr>
+        <w:pStyle w:val="SourceCode"/>
+      </w:pPr>
+      <w:r>
+        <w:t xml:space="preserve">    return {'ok':True,'message':'正在打开千问登录窗口；登录完成后关闭该窗口即可。'}</w:t>
+      </w:r>
+    </w:p>
+    <w:p>
+      <w:pPr>
+        <w:pStyle w:val="SourceCode"/>
+      </w:pPr>
+      <w:r/>
+    </w:p>
+    <w:p>
+      <w:pPr>
+        <w:pStyle w:val="SourceCode"/>
+      </w:pPr>
+      <w:r/>
+    </w:p>
+    <w:p>
+      <w:pPr>
+        <w:pStyle w:val="SourceCode"/>
+      </w:pPr>
+      <w:r>
         <w:t>def enqueue(url, engine="local"):</w:t>
       </w:r>
     </w:p>
@@ -3433,6 +3868,14 @@
         <w:pStyle w:val="SourceCode"/>
       </w:pPr>
       <w:r>
+        <w:t xml:space="preserve">            (folder/'.deleting').unlink(missing_ok=True)</w:t>
+      </w:r>
+    </w:p>
+    <w:p>
+      <w:pPr>
+        <w:pStyle w:val="SourceCode"/>
+      </w:pPr>
+      <w:r>
         <w:t xml:space="preserve">            meta.setdefault('created_at', task_created_at(folder))</w:t>
       </w:r>
     </w:p>
@@ -3473,7 +3916,23 @@
         <w:pStyle w:val="SourceCode"/>
       </w:pPr>
       <w:r>
-        <w:t xml:space="preserve">        tasks.put((ident, url))</w:t>
+        <w:t xml:space="preserve">        generation=__import__('uuid').uuid4().hex</w:t>
+      </w:r>
+    </w:p>
+    <w:p>
+      <w:pPr>
+        <w:pStyle w:val="SourceCode"/>
+      </w:pPr>
+      <w:r>
+        <w:t xml:space="preserve">        generations[ident]=generation</w:t>
+      </w:r>
+    </w:p>
+    <w:p>
+      <w:pPr>
+        <w:pStyle w:val="SourceCode"/>
+      </w:pPr>
+      <w:r>
+        <w:t xml:space="preserve">        tasks.put((ident, url, generation))</w:t>
       </w:r>
     </w:p>
     <w:p>
@@ -3673,7 +4132,23 @@
         <w:pStyle w:val="SourceCode"/>
       </w:pPr>
       <w:r>
-        <w:t xml:space="preserve">            return self.reply(200, {'ok': True, 'project': str(ROOT), 'pid': os.getpid(), 'engines': ['local', 'qianwen']})</w:t>
+        <w:t xml:space="preserve">            return self.reply(200, {'ok': True, 'project': str(ROOT), 'pid': os.getpid(), 'engines': ['local', 'qianwen'], 'task_controls': True})</w:t>
+      </w:r>
+    </w:p>
+    <w:p>
+      <w:pPr>
+        <w:pStyle w:val="SourceCode"/>
+      </w:pPr>
+      <w:r>
+        <w:t xml:space="preserve">        if self.path == '/qianwen/status':</w:t>
+      </w:r>
+    </w:p>
+    <w:p>
+      <w:pPr>
+        <w:pStyle w:val="SourceCode"/>
+      </w:pPr>
+      <w:r>
+        <w:t xml:space="preserve">            return self.reply(200, login_status())</w:t>
       </w:r>
     </w:p>
     <w:p>
@@ -3919,6 +4394,38 @@
         <w:pStyle w:val="SourceCode"/>
       </w:pPr>
       <w:r>
+        <w:t xml:space="preserve">            if self.path == '/qianwen/login':</w:t>
+      </w:r>
+    </w:p>
+    <w:p>
+      <w:pPr>
+        <w:pStyle w:val="SourceCode"/>
+      </w:pPr>
+      <w:r>
+        <w:t xml:space="preserve">                return self.reply(200, open_login())</w:t>
+      </w:r>
+    </w:p>
+    <w:p>
+      <w:pPr>
+        <w:pStyle w:val="SourceCode"/>
+      </w:pPr>
+      <w:r>
+        <w:t xml:space="preserve">            deletion=re.fullmatch(r'/delete/([0-9a-f]{12})',self.path)</w:t>
+      </w:r>
+    </w:p>
+    <w:p>
+      <w:pPr>
+        <w:pStyle w:val="SourceCode"/>
+      </w:pPr>
+      <w:r>
+        <w:t xml:space="preserve">            if deletion:return self.reply(200, delete_task(deletion.group(1)))</w:t>
+      </w:r>
+    </w:p>
+    <w:p>
+      <w:pPr>
+        <w:pStyle w:val="SourceCode"/>
+      </w:pPr>
+      <w:r>
         <w:t xml:space="preserve">            match = re.fullmatch(r'/reveal/([0-9a-f]{12})', self.path)</w:t>
       </w:r>
     </w:p>
@@ -4129,7 +4636,7 @@
         <w:pStyle w:val="SourceCode"/>
       </w:pPr>
       <w:r>
-        <w:t>&lt;p id="message" role="status"&gt;&lt;/p&gt;</w:t>
+        <w:t>&lt;p class="actions"&gt;&lt;button type="button" id="qianwen-login"&gt;千问登录&lt;/button&gt;&lt;span id="login-status" role="status"&gt;正在读取千问登录状态…&lt;/span&gt;&lt;/p&gt;&lt;p id="message" role="status"&gt;&lt;/p&gt;</w:t>
       </w:r>
     </w:p>
     <w:p>
@@ -4177,7 +4684,7 @@
         <w:pStyle w:val="SourceCode"/>
       </w:pPr>
       <w:r>
-        <w:t>const stages={queued:'排队中',downloading:'正在下载',downloaded:'下载完成',diarizing:'本地模型正在区分发言人',transcribing:'本地模型正在识别语音',cloud_transcribing:'千问正在后台识别语音',cloud_exporting:'正在导出千问原文 Word',completed:'Word 已生成，可以查看',failed:'处理失败，进度已保留'};</w:t>
+        <w:t>const stages={queued:'排队中',downloading:'正在下载',downloaded:'下载完成',diarizing:'本地模型正在区分发言人',transcribing:'本地模型正在识别语音',cloud_transcribing:'千问正在后台识别语音',cloud_exporting:'正在导出千问原文 Word',completed:'Word 已生成，可以查看',login_required:'需要重新登录千问',failed:'处理失败，进度已保留'};</w:t>
       </w:r>
     </w:p>
     <w:p>
@@ -4193,6 +4700,30 @@
         <w:pStyle w:val="SourceCode"/>
       </w:pPr>
       <w:r>
+        <w:t>async function requireControls(){let h=await(await fetch('/health')).json();if(!h.task_controls)throw Error('请双击“加载本次更新.command”，让网页服务加载登录和删除功能。')}</w:t>
+      </w:r>
+    </w:p>
+    <w:p>
+      <w:pPr>
+        <w:pStyle w:val="SourceCode"/>
+      </w:pPr>
+      <w:r>
+        <w:t>document.querySelector('#qianwen-login').onclick=async()=&gt;{try{await requireControls();let r=await post('/qianwen/login',{});msg.textContent=r.message}catch(e){msg.textContent=e.message}};</w:t>
+      </w:r>
+    </w:p>
+    <w:p>
+      <w:pPr>
+        <w:pStyle w:val="SourceCode"/>
+      </w:pPr>
+      <w:r>
+        <w:t>async function refreshLogin(){try{let h=await(await fetch('/health')).json();if(!h.task_controls){document.querySelector('#login-status').textContent='新功能需要加载本次更新';return}let s=await(await fetch('/qianwen/status')).json();let text=s.window_open?'请在千问窗口中完成登录，完成后关闭窗口':s.status==='required'?'千问需要重新登录，请点击左侧按钮':s.last_success?'最近成功转写：'+new Date(s.last_success*1000).toLocaleString()+'；任务中会继续验证登录':'登录状态待验证；首次使用请点击千问登录';document.querySelector('#login-status').textContent=s.error||text}catch(e){document.querySelector('#login-status').textContent='暂时无法读取登录状态'}}</w:t>
+      </w:r>
+    </w:p>
+    <w:p>
+      <w:pPr>
+        <w:pStyle w:val="SourceCode"/>
+      </w:pPr>
+      <w:r>
         <w:t>async function post(url,data){let r=await fetch(url,{method:'POST',headers:{'Content-Type':'application/json'},body:JSON.stringify(data)});let j=await r.json();if(!r.ok)throw Error(j.error);return j}</w:t>
       </w:r>
     </w:p>
@@ -4225,7 +4756,7 @@
         <w:pStyle w:val="SourceCode"/>
       </w:pPr>
       <w:r>
-        <w:t>async function refresh(){try{let jobs=await(await fetch('/jobs')).json();jobs.sort((a,b)=&gt;(b.created_at??historicalTaskTimes[b.id]??b.added_at??Infinity)-(a.created_at??historicalTaskTimes[a.id]??a.added_at??Infinity));let host=document.querySelector('#jobs');host.replaceChildren();for(let j of jobs){let card=document.createElement('article');let h=document.createElement('h2');h.textContent=taskHeading(j);card.append(h);let p=document.createElement('p');p.textContent=(j.document&amp;&amp;!j.has_document)?'Word 文件已不在原保存位置，重新提交链接可生成':(stages[j.state]||'准备生成文稿');if(j.state==='transcribing'&amp;&amp;j.transcribed_seconds)p.textContent+=' · '+Math.floor(j.transcribed_seconds/60)+' / '+Math.ceil(j.audio_duration/60)+' 分钟';card.append(p);card.append(link('原网页',j.url));if(j.error){let err=document.createElement('p');err.textContent=j.error;card.append(err)}if(j.cleanup_error){let note=document.createElement('p');note.textContent='Word 已生成，但部分临时文件未清理：'+j.cleanup_error;card.append(note)}if(j.has_document){let actions=document.createElement('p');actions.className='actions';actions.append(link('查看 Word 文稿','/preview/'+j.id,'action'));let reveal=document.createElement('button');reveal.type='button';reveal.className='secondary';reveal.textContent='打开文档所在位置';let revealStatus=document.createElement('small');revealStatus.setAttribute('role','status');reveal.onclick=async()=&gt;{reveal.disabled=true;revealStatus.textContent='正在打开文件夹…';try{await post('/reveal/'+j.id,{});revealStatus.textContent='已打开 Finder 文件夹。';msg.textContent='已打开文档所在的 Finder 文件夹。'}catch(e){revealStatus.textContent='打开失败：'+e.message;msg.textContent='打开失败：'+e.message}finally{reveal.disabled=false}};actions.append(reveal);actions.append(revealStatus);let download=link('下载 Word','/document/'+j.id,'action secondary');download.download=j.name+'.docx';actions.append(download);card.append(actions);let note=document.createElement('small');note.textContent=j.temporary_files_removed?(j.media_trashed?'原音视频已移入废纸篓，临时音轨已清理。':'原音视频与临时音轨已清理。'):'Word 内容未经人工校对。';card.append(note)}host.append(card)}}catch(e){msg.textContent='后台连接中断，请重新启动工具。'}}</w:t>
+        <w:t>async function refresh(){try{let jobs=await(await fetch('/jobs')).json();jobs.sort((a,b)=&gt;(b.created_at??historicalTaskTimes[b.id]??b.added_at??Infinity)-(a.created_at??historicalTaskTimes[a.id]??a.added_at??Infinity));let host=document.querySelector('#jobs');host.replaceChildren();for(let j of jobs){let card=document.createElement('article');let h=document.createElement('h2');h.textContent=taskHeading(j);card.append(h);let p=document.createElement('p');p.textContent=(j.document&amp;&amp;!j.has_document)?'Word 文件已不在原保存位置，重新提交链接可生成':(stages[j.state]||'准备生成文稿');if(j.state==='transcribing'&amp;&amp;j.transcribed_seconds)p.textContent+=' · '+Math.floor(j.transcribed_seconds/60)+' / '+Math.ceil(j.audio_duration/60)+' 分钟';card.append(p);card.append(link('原网页',j.url));if(j.error){let err=document.createElement('p');err.textContent=j.error;card.append(err)}if(j.cleanup_error){let note=document.createElement('p');note.textContent='Word 已生成，但部分临时文件未清理：'+j.cleanup_error;card.append(note)}if(j.has_document){let actions=document.createElement('p');actions.className='actions';actions.append(link('查看 Word 文稿','/preview/'+j.id,'action'));let reveal=document.createElement('button');reveal.type='button';reveal.className='secondary';reveal.textContent='打开文档所在位置';let revealStatus=document.createElement('small');revealStatus.setAttribute('role','status');reveal.onclick=async()=&gt;{reveal.disabled=true;revealStatus.textContent='正在打开文件夹…';try{await post('/reveal/'+j.id,{});revealStatus.textContent='已打开 Finder 文件夹。';msg.textContent='已打开文档所在的 Finder 文件夹。'}catch(e){revealStatus.textContent='打开失败：'+e.message;msg.textContent='打开失败：'+e.message}finally{reveal.disabled=false}};actions.append(reveal);actions.append(revealStatus);let download=link('下载 Word','/document/'+j.id,'action secondary');download.download=j.name+'.docx';actions.append(download);card.append(actions);let note=document.createElement('small');note.textContent=j.temporary_files_removed?(j.media_trashed?'原音视频已移入废纸篓，临时音轨已清理。':'原音视频与临时音轨已清理。'):'Word 内容未经人工校对。';card.append(note)}let controls=document.createElement('p');controls.className='actions';if(j.state==='failed'||j.state==='login_required'){let retry=document.createElement('button');retry.textContent='重试任务';retry.onclick=async()=&gt;{try{await post('/jobs',{url:j.url,engine:j.engine||'qianwen'});await refresh()}catch(e){msg.textContent=e.message}};controls.append(retry)}let remove=document.createElement('button');remove.type='button';remove.className='secondary';remove.style.color='#a52222';remove.textContent='删除任务';remove.onclick=async()=&gt;{if(!confirm('删除“'+(j.title||j.id)+'”？将停止该任务，把本机任务文件和相关文稿移入废纸篓。千问云端记录需在千问网页中管理。'))return;remove.disabled=true;try{await requireControls();let r=await post('/delete/'+j.id,{});msg.textContent=r.message;await refresh()}catch(e){msg.textContent='删除失败：'+e.message;remove.disabled=false}};controls.append(remove);card.append(controls);host.append(card)}await refreshLogin()}catch(e){msg.textContent='后台连接中断，请重新启动工具。'}}</w:t>
       </w:r>
     </w:p>
     <w:p>
@@ -6749,7 +7280,15 @@
         <w:pStyle w:val="SourceCode"/>
       </w:pPr>
       <w:r>
-        <w:t xml:space="preserve">            meta.update(state='failed', error=str(error))</w:t>
+        <w:t xml:space="preserve">            from qianwen_browser import LoginRequired</w:t>
+      </w:r>
+    </w:p>
+    <w:p>
+      <w:pPr>
+        <w:pStyle w:val="SourceCode"/>
+      </w:pPr>
+      <w:r>
+        <w:t xml:space="preserve">            meta.update(state='login_required' if isinstance(error,LoginRequired) else 'failed', error=str(error))</w:t>
       </w:r>
     </w:p>
     <w:p>
@@ -7777,6 +8316,14 @@
         <w:pStyle w:val="SourceCode"/>
       </w:pPr>
       <w:r>
+        <w:t xml:space="preserve">    save_json(job/'export-target.json', {'path': str(path), 'url': meta['url']})</w:t>
+      </w:r>
+    </w:p>
+    <w:p>
+      <w:pPr>
+        <w:pStyle w:val="SourceCode"/>
+      </w:pPr>
+      <w:r>
         <w:t xml:space="preserve">    partial = path.with_suffix('.partial.docx')</w:t>
       </w:r>
     </w:p>
@@ -10111,7 +10658,7 @@
         <w:pStyle w:val="SourceCode"/>
       </w:pPr>
       <w:r>
-        <w:t xml:space="preserve">  "app.py": "ed518a900637030efbd2512ab549d760c25ff6ec9a94f1449ccb43582e2618e6",</w:t>
+        <w:t xml:space="preserve">  "app.py": "1674b87b11f86e1779e31b76ae93f7de94c3d2cf32be2d1c256507eef4111610",</w:t>
       </w:r>
     </w:p>
     <w:p>
@@ -10127,7 +10674,7 @@
         <w:pStyle w:val="SourceCode"/>
       </w:pPr>
       <w:r>
-        <w:t xml:space="preserve">  "index.html": "339b72f6949c295d5638366727e4a724976cc0aaa74b28325ab17c1cf5fa9941",</w:t>
+        <w:t xml:space="preserve">  "index.html": "53221c84e51b743d97e60611daf455f2727d5e408d914f6ac1a4613cf5241e30",</w:t>
       </w:r>
     </w:p>
     <w:p>
@@ -10159,15 +10706,15 @@
         <w:pStyle w:val="SourceCode"/>
       </w:pPr>
       <w:r>
-        <w:t xml:space="preserve">  "qianwen_browser.py": "59085a2bf8f03d430bbf00999b6e88a82336316005c0bec7a2360036ef9ad227",</w:t>
-      </w:r>
-    </w:p>
-    <w:p>
-      <w:pPr>
-        <w:pStyle w:val="SourceCode"/>
-      </w:pPr>
-      <w:r>
-        <w:t xml:space="preserve">  "reader.py": "39334c25f04793cdebb4a3af7c0e6aa347da1ff6a62a581266b92d3e624aef4a",</w:t>
+        <w:t xml:space="preserve">  "qianwen_browser.py": "cf35a52300ba890be471dad2b81181ef2bed6203a86236d26cdbaffec62d6302",</w:t>
+      </w:r>
+    </w:p>
+    <w:p>
+      <w:pPr>
+        <w:pStyle w:val="SourceCode"/>
+      </w:pPr>
+      <w:r>
+        <w:t xml:space="preserve">  "reader.py": "ae83580c8e6d45ae0c6a3b49a9edd6aade1c42f7f9c3d61fb1ba209b9ca9d8b8",</w:t>
       </w:r>
     </w:p>
     <w:p>
@@ -10199,6 +10746,14 @@
         <w:pStyle w:val="SourceCode"/>
       </w:pPr>
       <w:r>
+        <w:t xml:space="preserve">  "task_controls.py": "a420be2ff8a6b4fc833d126f235e8a249c521e2a8c30435b36ebdf7426579084",</w:t>
+      </w:r>
+    </w:p>
+    <w:p>
+      <w:pPr>
+        <w:pStyle w:val="SourceCode"/>
+      </w:pPr>
+      <w:r>
         <w:t xml:space="preserve">  "test_app.py": "911650ca1bd12c3e87ce499ed1d6bfea8882d8d04ac9e357bb98c067853befc9",</w:t>
       </w:r>
     </w:p>
@@ -10223,6 +10778,14 @@
         <w:pStyle w:val="SourceCode"/>
       </w:pPr>
       <w:r>
+        <w:t xml:space="preserve">  "test_task_controls.py": "7a07b1d54e383405a9914e69503319854a8cd543d7348c618e09a5744cc0ce30",</w:t>
+      </w:r>
+    </w:p>
+    <w:p>
+      <w:pPr>
+        <w:pStyle w:val="SourceCode"/>
+      </w:pPr>
+      <w:r>
         <w:t xml:space="preserve">  "停用自动启动.command": "0c2353cd41fd56b737864d09d6fe83f8b7d62cc1c51757e86fe0bc6bbd76b682",</w:t>
       </w:r>
     </w:p>
@@ -10231,6 +10794,14 @@
         <w:pStyle w:val="SourceCode"/>
       </w:pPr>
       <w:r>
+        <w:t xml:space="preserve">  "加载本次更新.command": "ceabb97ebf2b3d7df5568844de02733bc9e09f9c877621985bdaf801a182b978",</w:t>
+      </w:r>
+    </w:p>
+    <w:p>
+      <w:pPr>
+        <w:pStyle w:val="SourceCode"/>
+      </w:pPr>
+      <w:r>
         <w:t xml:space="preserve">  "启动工具.command": "f67940511e7be84f96ef4eadc60dee14b08668d185f06f94cd03a02ebd3d59ca",</w:t>
       </w:r>
     </w:p>
@@ -12167,6 +12738,14 @@
         <w:pStyle w:val="SourceCode"/>
       </w:pPr>
       <w:r>
+        <w:t>from contextlib import contextmanager</w:t>
+      </w:r>
+    </w:p>
+    <w:p>
+      <w:pPr>
+        <w:pStyle w:val="SourceCode"/>
+      </w:pPr>
+      <w:r>
         <w:t>import argparse</w:t>
       </w:r>
     </w:p>
@@ -12477,6 +13056,202 @@
         <w:pStyle w:val="SourceCode"/>
       </w:pPr>
       <w:r>
+        <w:t>class LoginRequired(RuntimeError):</w:t>
+      </w:r>
+    </w:p>
+    <w:p>
+      <w:pPr>
+        <w:pStyle w:val="SourceCode"/>
+      </w:pPr>
+      <w:r>
+        <w:t xml:space="preserve">    pass</w:t>
+      </w:r>
+    </w:p>
+    <w:p>
+      <w:pPr>
+        <w:pStyle w:val="SourceCode"/>
+      </w:pPr>
+      <w:r/>
+    </w:p>
+    <w:p>
+      <w:pPr>
+        <w:pStyle w:val="SourceCode"/>
+      </w:pPr>
+      <w:r/>
+    </w:p>
+    <w:p>
+      <w:pPr>
+        <w:pStyle w:val="SourceCode"/>
+      </w:pPr>
+      <w:r>
+        <w:t>def auth_state(status):</w:t>
+      </w:r>
+    </w:p>
+    <w:p>
+      <w:pPr>
+        <w:pStyle w:val="SourceCode"/>
+      </w:pPr>
+      <w:r>
+        <w:t xml:space="preserve">    from reader import save_json</w:t>
+      </w:r>
+    </w:p>
+    <w:p>
+      <w:pPr>
+        <w:pStyle w:val="SourceCode"/>
+      </w:pPr>
+      <w:r>
+        <w:t xml:space="preserve">    path=ROOT/'work/qianwen-auth.json'</w:t>
+      </w:r>
+    </w:p>
+    <w:p>
+      <w:pPr>
+        <w:pStyle w:val="SourceCode"/>
+      </w:pPr>
+      <w:r>
+        <w:t xml:space="preserve">    previous=__import__('json').loads(path.read_text()) if path.exists() else {}</w:t>
+      </w:r>
+    </w:p>
+    <w:p>
+      <w:pPr>
+        <w:pStyle w:val="SourceCode"/>
+      </w:pPr>
+      <w:r>
+        <w:t xml:space="preserve">    previous.update(status=status,checked_at=time.time())</w:t>
+      </w:r>
+    </w:p>
+    <w:p>
+      <w:pPr>
+        <w:pStyle w:val="SourceCode"/>
+      </w:pPr>
+      <w:r>
+        <w:t xml:space="preserve">    if status=='valid':previous['last_success']=time.time()</w:t>
+      </w:r>
+    </w:p>
+    <w:p>
+      <w:pPr>
+        <w:pStyle w:val="SourceCode"/>
+      </w:pPr>
+      <w:r>
+        <w:t xml:space="preserve">    save_json(path,previous)</w:t>
+      </w:r>
+    </w:p>
+    <w:p>
+      <w:pPr>
+        <w:pStyle w:val="SourceCode"/>
+      </w:pPr>
+      <w:r/>
+    </w:p>
+    <w:p>
+      <w:pPr>
+        <w:pStyle w:val="SourceCode"/>
+      </w:pPr>
+      <w:r/>
+    </w:p>
+    <w:p>
+      <w:pPr>
+        <w:pStyle w:val="SourceCode"/>
+      </w:pPr>
+      <w:r>
+        <w:t>def require_login_if_visible(page):</w:t>
+      </w:r>
+    </w:p>
+    <w:p>
+      <w:pPr>
+        <w:pStyle w:val="SourceCode"/>
+      </w:pPr>
+      <w:r>
+        <w:t xml:space="preserve">    prompts=page.get_by_role('dialog').filter(has_text=re.compile('登录|验证码|手机号'))</w:t>
+      </w:r>
+    </w:p>
+    <w:p>
+      <w:pPr>
+        <w:pStyle w:val="SourceCode"/>
+      </w:pPr>
+      <w:r>
+        <w:t xml:space="preserve">    for prompt in prompts.all():</w:t>
+      </w:r>
+    </w:p>
+    <w:p>
+      <w:pPr>
+        <w:pStyle w:val="SourceCode"/>
+      </w:pPr>
+      <w:r>
+        <w:t xml:space="preserve">        if prompt.is_visible():</w:t>
+      </w:r>
+    </w:p>
+    <w:p>
+      <w:pPr>
+        <w:pStyle w:val="SourceCode"/>
+      </w:pPr>
+      <w:r>
+        <w:t xml:space="preserve">            auth_state('required')</w:t>
+      </w:r>
+    </w:p>
+    <w:p>
+      <w:pPr>
+        <w:pStyle w:val="SourceCode"/>
+      </w:pPr>
+      <w:r>
+        <w:t xml:space="preserve">            raise LoginRequired('千问需要重新登录或完成验证。请点击页面上的“千问登录”，完成后重试任务。')</w:t>
+      </w:r>
+    </w:p>
+    <w:p>
+      <w:pPr>
+        <w:pStyle w:val="SourceCode"/>
+      </w:pPr>
+      <w:r>
+        <w:t xml:space="preserve">    buttons=page.get_by_role('button',name=re.compile('^(登录|登录/注册|立即登录)$'))</w:t>
+      </w:r>
+    </w:p>
+    <w:p>
+      <w:pPr>
+        <w:pStyle w:val="SourceCode"/>
+      </w:pPr>
+      <w:r>
+        <w:t xml:space="preserve">    if any(button.is_visible() for button in buttons.all()):</w:t>
+      </w:r>
+    </w:p>
+    <w:p>
+      <w:pPr>
+        <w:pStyle w:val="SourceCode"/>
+      </w:pPr>
+      <w:r>
+        <w:t xml:space="preserve">        auth_state('required')</w:t>
+      </w:r>
+    </w:p>
+    <w:p>
+      <w:pPr>
+        <w:pStyle w:val="SourceCode"/>
+      </w:pPr>
+      <w:r>
+        <w:t xml:space="preserve">        raise LoginRequired('千问登录已失效，请点击“千问登录”重新登录后重试。')</w:t>
+      </w:r>
+    </w:p>
+    <w:p>
+      <w:pPr>
+        <w:pStyle w:val="SourceCode"/>
+      </w:pPr>
+      <w:r/>
+    </w:p>
+    <w:p>
+      <w:pPr>
+        <w:pStyle w:val="SourceCode"/>
+      </w:pPr>
+      <w:r/>
+    </w:p>
+    <w:p>
+      <w:pPr>
+        <w:pStyle w:val="SourceCode"/>
+      </w:pPr>
+      <w:r>
+        <w:t>@contextmanager</w:t>
+      </w:r>
+    </w:p>
+    <w:p>
+      <w:pPr>
+        <w:pStyle w:val="SourceCode"/>
+      </w:pPr>
+      <w:r>
         <w:t>def browser_context(playwright, headed=False):</w:t>
       </w:r>
     </w:p>
@@ -12485,6 +13260,14 @@
         <w:pStyle w:val="SourceCode"/>
       </w:pPr>
       <w:r>
+        <w:t xml:space="preserve">    import fcntl</w:t>
+      </w:r>
+    </w:p>
+    <w:p>
+      <w:pPr>
+        <w:pStyle w:val="SourceCode"/>
+      </w:pPr>
+      <w:r>
         <w:t xml:space="preserve">    PROFILE.mkdir(parents=True, exist_ok=True)</w:t>
       </w:r>
     </w:p>
@@ -12493,23 +13276,71 @@
         <w:pStyle w:val="SourceCode"/>
       </w:pPr>
       <w:r>
-        <w:t xml:space="preserve">    return playwright.chromium.launch_persistent_context(str(PROFILE), headless=not headed,</w:t>
-      </w:r>
-    </w:p>
-    <w:p>
-      <w:pPr>
-        <w:pStyle w:val="SourceCode"/>
-      </w:pPr>
-      <w:r>
-        <w:t xml:space="preserve">                                                         accept_downloads=True,</w:t>
-      </w:r>
-    </w:p>
-    <w:p>
-      <w:pPr>
-        <w:pStyle w:val="SourceCode"/>
-      </w:pPr>
-      <w:r>
-        <w:t xml:space="preserve">                                                         viewport={'width': 1920, 'height': 1600})</w:t>
+        <w:t xml:space="preserve">    with (ROOT/'work/qianwen-browser.lock').open('a') as lock:</w:t>
+      </w:r>
+    </w:p>
+    <w:p>
+      <w:pPr>
+        <w:pStyle w:val="SourceCode"/>
+      </w:pPr>
+      <w:r>
+        <w:t xml:space="preserve">        try:fcntl.flock(lock,fcntl.LOCK_EX|fcntl.LOCK_NB)</w:t>
+      </w:r>
+    </w:p>
+    <w:p>
+      <w:pPr>
+        <w:pStyle w:val="SourceCode"/>
+      </w:pPr>
+      <w:r>
+        <w:t xml:space="preserve">        except BlockingIOError:raise RuntimeError('千问浏览器正在使用中，请关闭登录窗口或等待任务完成后再试。')</w:t>
+      </w:r>
+    </w:p>
+    <w:p>
+      <w:pPr>
+        <w:pStyle w:val="SourceCode"/>
+      </w:pPr>
+      <w:r>
+        <w:t xml:space="preserve">        context=playwright.chromium.launch_persistent_context(str(PROFILE), headless=not headed,</w:t>
+      </w:r>
+    </w:p>
+    <w:p>
+      <w:pPr>
+        <w:pStyle w:val="SourceCode"/>
+      </w:pPr>
+      <w:r>
+        <w:t xml:space="preserve">                     accept_downloads=True,viewport={'width':1920,'height':1600})</w:t>
+      </w:r>
+    </w:p>
+    <w:p>
+      <w:pPr>
+        <w:pStyle w:val="SourceCode"/>
+      </w:pPr>
+      <w:r>
+        <w:t xml:space="preserve">        try:yield context</w:t>
+      </w:r>
+    </w:p>
+    <w:p>
+      <w:pPr>
+        <w:pStyle w:val="SourceCode"/>
+      </w:pPr>
+      <w:r>
+        <w:t xml:space="preserve">        finally:</w:t>
+      </w:r>
+    </w:p>
+    <w:p>
+      <w:pPr>
+        <w:pStyle w:val="SourceCode"/>
+      </w:pPr>
+      <w:r>
+        <w:t xml:space="preserve">            try:context.close()</w:t>
+      </w:r>
+    </w:p>
+    <w:p>
+      <w:pPr>
+        <w:pStyle w:val="SourceCode"/>
+      </w:pPr>
+      <w:r>
+        <w:t xml:space="preserve">            except Exception:pass</w:t>
       </w:r>
     </w:p>
     <w:p>
@@ -12649,6 +13480,14 @@
         <w:pStyle w:val="SourceCode"/>
       </w:pPr>
       <w:r>
+        <w:t xml:space="preserve">            require_login_if_visible(page)</w:t>
+      </w:r>
+    </w:p>
+    <w:p>
+      <w:pPr>
+        <w:pStyle w:val="SourceCode"/>
+      </w:pPr>
+      <w:r>
         <w:t xml:space="preserve">            if not meta.get('qianwen_url'):</w:t>
       </w:r>
     </w:p>
@@ -12761,6 +13600,14 @@
         <w:pStyle w:val="SourceCode"/>
       </w:pPr>
       <w:r>
+        <w:t xml:space="preserve">                    require_login_if_visible(page)</w:t>
+      </w:r>
+    </w:p>
+    <w:p>
+      <w:pPr>
+        <w:pStyle w:val="SourceCode"/>
+      </w:pPr>
+      <w:r>
         <w:t xml:space="preserve">                    meta['qianwen_submitted'] = True; save(job/'job.json', meta)</w:t>
       </w:r>
     </w:p>
@@ -12801,6 +13648,14 @@
         <w:pStyle w:val="SourceCode"/>
       </w:pPr>
       <w:r>
+        <w:t xml:space="preserve">                    require_login_if_visible(page)</w:t>
+      </w:r>
+    </w:p>
+    <w:p>
+      <w:pPr>
+        <w:pStyle w:val="SourceCode"/>
+      </w:pPr>
+      <w:r>
         <w:t xml:space="preserve">                    from playwright.sync_api import TimeoutError as BrowserTimeout</w:t>
       </w:r>
     </w:p>
@@ -13065,6 +13920,14 @@
         <w:pStyle w:val="SourceCode"/>
       </w:pPr>
       <w:r>
+        <w:t xml:space="preserve">    auth_state('valid')</w:t>
+      </w:r>
+    </w:p>
+    <w:p>
+      <w:pPr>
+        <w:pStyle w:val="SourceCode"/>
+      </w:pPr>
+      <w:r>
         <w:t xml:space="preserve">    upload.unlink(missing_ok=True)</w:t>
       </w:r>
     </w:p>
@@ -13093,7 +13956,7 @@
         <w:pStyle w:val="SourceCode"/>
       </w:pPr>
       <w:r>
-        <w:t>def login():</w:t>
+        <w:t>def login(ui=False):</w:t>
       </w:r>
     </w:p>
     <w:p>
@@ -13141,7 +14004,55 @@
         <w:pStyle w:val="SourceCode"/>
       </w:pPr>
       <w:r>
-        <w:t xml:space="preserve">            input('请在专用浏览器中登录千问，确认音视频速读页面可用后，在此按回车保存登录。')</w:t>
+        <w:t xml:space="preserve">            if ui:</w:t>
+      </w:r>
+    </w:p>
+    <w:p>
+      <w:pPr>
+        <w:pStyle w:val="SourceCode"/>
+      </w:pPr>
+      <w:r>
+        <w:t xml:space="preserve">                while not page.is_closed():</w:t>
+      </w:r>
+    </w:p>
+    <w:p>
+      <w:pPr>
+        <w:pStyle w:val="SourceCode"/>
+      </w:pPr>
+      <w:r>
+        <w:t xml:space="preserve">                    try:page.wait_for_timeout(500)</w:t>
+      </w:r>
+    </w:p>
+    <w:p>
+      <w:pPr>
+        <w:pStyle w:val="SourceCode"/>
+      </w:pPr>
+      <w:r>
+        <w:t xml:space="preserve">                    except Exception:break</w:t>
+      </w:r>
+    </w:p>
+    <w:p>
+      <w:pPr>
+        <w:pStyle w:val="SourceCode"/>
+      </w:pPr>
+      <w:r>
+        <w:t xml:space="preserve">                auth_state('unknown')</w:t>
+      </w:r>
+    </w:p>
+    <w:p>
+      <w:pPr>
+        <w:pStyle w:val="SourceCode"/>
+      </w:pPr>
+      <w:r>
+        <w:t xml:space="preserve">            else:</w:t>
+      </w:r>
+    </w:p>
+    <w:p>
+      <w:pPr>
+        <w:pStyle w:val="SourceCode"/>
+      </w:pPr>
+      <w:r>
+        <w:t xml:space="preserve">                input('请在专用浏览器中登录千问，确认音视频速读页面可用后，在此按回车保存登录。')</w:t>
       </w:r>
     </w:p>
     <w:p>
@@ -13177,15 +14088,15 @@
         <w:pStyle w:val="SourceCode"/>
       </w:pPr>
       <w:r>
-        <w:t xml:space="preserve">    parser = argparse.ArgumentParser(); parser.add_argument('command', choices=['login'])</w:t>
-      </w:r>
-    </w:p>
-    <w:p>
-      <w:pPr>
-        <w:pStyle w:val="SourceCode"/>
-      </w:pPr>
-      <w:r>
-        <w:t xml:space="preserve">    parser.parse_args(); login()</w:t>
+        <w:t xml:space="preserve">    parser = argparse.ArgumentParser(); parser.add_argument('command', choices=['login','login-ui'])</w:t>
+      </w:r>
+    </w:p>
+    <w:p>
+      <w:pPr>
+        <w:pStyle w:val="SourceCode"/>
+      </w:pPr>
+      <w:r>
+        <w:t xml:space="preserve">    args=parser.parse_args(); login(ui=args.command=='login-ui')</w:t>
       </w:r>
     </w:p>
     <w:p>
@@ -14204,6 +15115,1402 @@
       </w:pPr>
       <w:r>
         <w:t xml:space="preserve">    time.sleep(1)</w:t>
+      </w:r>
+    </w:p>
+    <w:p>
+      <w:pPr>
+        <w:pStyle w:val="SourceCode"/>
+      </w:pPr>
+      <w:r/>
+    </w:p>
+    <w:p>
+      <w:pPr>
+        <w:pStyle w:val="Heading2"/>
+      </w:pPr>
+      <w:r>
+        <w:t>FILE: task_controls.py</w:t>
+      </w:r>
+    </w:p>
+    <w:p>
+      <w:pPr>
+        <w:pStyle w:val="SourceCode"/>
+      </w:pPr>
+      <w:r>
+        <w:t>"""Stop one verified reader and move its local artifacts to the Trash."""</w:t>
+      </w:r>
+    </w:p>
+    <w:p>
+      <w:pPr>
+        <w:pStyle w:val="SourceCode"/>
+      </w:pPr>
+      <w:r>
+        <w:t>import json</w:t>
+      </w:r>
+    </w:p>
+    <w:p>
+      <w:pPr>
+        <w:pStyle w:val="SourceCode"/>
+      </w:pPr>
+      <w:r>
+        <w:t>import os</w:t>
+      </w:r>
+    </w:p>
+    <w:p>
+      <w:pPr>
+        <w:pStyle w:val="SourceCode"/>
+      </w:pPr>
+      <w:r>
+        <w:t>import re</w:t>
+      </w:r>
+    </w:p>
+    <w:p>
+      <w:pPr>
+        <w:pStyle w:val="SourceCode"/>
+      </w:pPr>
+      <w:r>
+        <w:t>import shlex</w:t>
+      </w:r>
+    </w:p>
+    <w:p>
+      <w:pPr>
+        <w:pStyle w:val="SourceCode"/>
+      </w:pPr>
+      <w:r>
+        <w:t>import signal</w:t>
+      </w:r>
+    </w:p>
+    <w:p>
+      <w:pPr>
+        <w:pStyle w:val="SourceCode"/>
+      </w:pPr>
+      <w:r>
+        <w:t>import subprocess</w:t>
+      </w:r>
+    </w:p>
+    <w:p>
+      <w:pPr>
+        <w:pStyle w:val="SourceCode"/>
+      </w:pPr>
+      <w:r>
+        <w:t>import time</w:t>
+      </w:r>
+    </w:p>
+    <w:p>
+      <w:pPr>
+        <w:pStyle w:val="SourceCode"/>
+      </w:pPr>
+      <w:r>
+        <w:t>from pathlib import Path</w:t>
+      </w:r>
+    </w:p>
+    <w:p>
+      <w:pPr>
+        <w:pStyle w:val="SourceCode"/>
+      </w:pPr>
+      <w:r/>
+    </w:p>
+    <w:p>
+      <w:pPr>
+        <w:pStyle w:val="SourceCode"/>
+      </w:pPr>
+      <w:r/>
+    </w:p>
+    <w:p>
+      <w:pPr>
+        <w:pStyle w:val="SourceCode"/>
+      </w:pPr>
+      <w:r>
+        <w:t>def reader_pids(root, folder):</w:t>
+      </w:r>
+    </w:p>
+    <w:p>
+      <w:pPr>
+        <w:pStyle w:val="SourceCode"/>
+      </w:pPr>
+      <w:r>
+        <w:t xml:space="preserve">    result=subprocess.run(['/usr/sbin/lsof','-t',str(folder/'.prepare.lock')],capture_output=True,text=True)</w:t>
+      </w:r>
+    </w:p>
+    <w:p>
+      <w:pPr>
+        <w:pStyle w:val="SourceCode"/>
+      </w:pPr>
+      <w:r>
+        <w:t xml:space="preserve">    verified=[]</w:t>
+      </w:r>
+    </w:p>
+    <w:p>
+      <w:pPr>
+        <w:pStyle w:val="SourceCode"/>
+      </w:pPr>
+      <w:r>
+        <w:t xml:space="preserve">    for value in result.stdout.split():</w:t>
+      </w:r>
+    </w:p>
+    <w:p>
+      <w:pPr>
+        <w:pStyle w:val="SourceCode"/>
+      </w:pPr>
+      <w:r>
+        <w:t xml:space="preserve">        pid=int(value)</w:t>
+      </w:r>
+    </w:p>
+    <w:p>
+      <w:pPr>
+        <w:pStyle w:val="SourceCode"/>
+      </w:pPr>
+      <w:r>
+        <w:t xml:space="preserve">        command=subprocess.run(['/bin/ps','-p',str(pid),'-o','command='],capture_output=True,text=True)</w:t>
+      </w:r>
+    </w:p>
+    <w:p>
+      <w:pPr>
+        <w:pStyle w:val="SourceCode"/>
+      </w:pPr>
+      <w:r>
+        <w:t xml:space="preserve">        args=shlex.split(command.stdout.strip())</w:t>
+      </w:r>
+    </w:p>
+    <w:p>
+      <w:pPr>
+        <w:pStyle w:val="SourceCode"/>
+      </w:pPr>
+      <w:r>
+        <w:t xml:space="preserve">        if len(args)&gt;=3 and args[1]==str(root/'reader.py') and args[2]=='prepare':verified.append(pid)</w:t>
+      </w:r>
+    </w:p>
+    <w:p>
+      <w:pPr>
+        <w:pStyle w:val="SourceCode"/>
+      </w:pPr>
+      <w:r>
+        <w:t xml:space="preserve">    return verified</w:t>
+      </w:r>
+    </w:p>
+    <w:p>
+      <w:pPr>
+        <w:pStyle w:val="SourceCode"/>
+      </w:pPr>
+      <w:r/>
+    </w:p>
+    <w:p>
+      <w:pPr>
+        <w:pStyle w:val="SourceCode"/>
+      </w:pPr>
+      <w:r/>
+    </w:p>
+    <w:p>
+      <w:pPr>
+        <w:pStyle w:val="SourceCode"/>
+      </w:pPr>
+      <w:r>
+        <w:t>def stop_reader(pid):</w:t>
+      </w:r>
+    </w:p>
+    <w:p>
+      <w:pPr>
+        <w:pStyle w:val="SourceCode"/>
+      </w:pPr>
+      <w:r>
+        <w:t xml:space="preserve">    children=subprocess.run(['/usr/bin/pgrep','-P',str(pid)],capture_output=True,text=True)</w:t>
+      </w:r>
+    </w:p>
+    <w:p>
+      <w:pPr>
+        <w:pStyle w:val="SourceCode"/>
+      </w:pPr>
+      <w:r>
+        <w:t xml:space="preserve">    for child in children.stdout.split():stop_reader(int(child))</w:t>
+      </w:r>
+    </w:p>
+    <w:p>
+      <w:pPr>
+        <w:pStyle w:val="SourceCode"/>
+      </w:pPr>
+      <w:r>
+        <w:t xml:space="preserve">    try:os.kill(pid,signal.SIGTERM)</w:t>
+      </w:r>
+    </w:p>
+    <w:p>
+      <w:pPr>
+        <w:pStyle w:val="SourceCode"/>
+      </w:pPr>
+      <w:r>
+        <w:t xml:space="preserve">    except ProcessLookupError:pass</w:t>
+      </w:r>
+    </w:p>
+    <w:p>
+      <w:pPr>
+        <w:pStyle w:val="SourceCode"/>
+      </w:pPr>
+      <w:r/>
+    </w:p>
+    <w:p>
+      <w:pPr>
+        <w:pStyle w:val="SourceCode"/>
+      </w:pPr>
+      <w:r/>
+    </w:p>
+    <w:p>
+      <w:pPr>
+        <w:pStyle w:val="SourceCode"/>
+      </w:pPr>
+      <w:r>
+        <w:t>def trash_task(root, work, output_roots, ident):</w:t>
+      </w:r>
+    </w:p>
+    <w:p>
+      <w:pPr>
+        <w:pStyle w:val="SourceCode"/>
+      </w:pPr>
+      <w:r>
+        <w:t xml:space="preserve">    from send2trash import send2trash</w:t>
+      </w:r>
+    </w:p>
+    <w:p>
+      <w:pPr>
+        <w:pStyle w:val="SourceCode"/>
+      </w:pPr>
+      <w:r>
+        <w:t xml:space="preserve">    from docx import Document</w:t>
+      </w:r>
+    </w:p>
+    <w:p>
+      <w:pPr>
+        <w:pStyle w:val="SourceCode"/>
+      </w:pPr>
+      <w:r>
+        <w:t xml:space="preserve">    import fcntl</w:t>
+      </w:r>
+    </w:p>
+    <w:p>
+      <w:pPr>
+        <w:pStyle w:val="SourceCode"/>
+      </w:pPr>
+      <w:r>
+        <w:t xml:space="preserve">    if not re.fullmatch('[0-9a-f]{12}',ident):raise ValueError('任务编号不合法')</w:t>
+      </w:r>
+    </w:p>
+    <w:p>
+      <w:pPr>
+        <w:pStyle w:val="SourceCode"/>
+      </w:pPr>
+      <w:r>
+        <w:t xml:space="preserve">    folder=work/'jobs'/ident</w:t>
+      </w:r>
+    </w:p>
+    <w:p>
+      <w:pPr>
+        <w:pStyle w:val="SourceCode"/>
+      </w:pPr>
+      <w:r>
+        <w:t xml:space="preserve">    if folder.is_symlink() or not folder.exists():raise ValueError('任务不存在')</w:t>
+      </w:r>
+    </w:p>
+    <w:p>
+      <w:pPr>
+        <w:pStyle w:val="SourceCode"/>
+      </w:pPr>
+      <w:r>
+        <w:t xml:space="preserve">    meta=json.loads((folder/'job.json').read_text())</w:t>
+      </w:r>
+    </w:p>
+    <w:p>
+      <w:pPr>
+        <w:pStyle w:val="SourceCode"/>
+      </w:pPr>
+      <w:r>
+        <w:t xml:space="preserve">    (folder/'.deleting').touch()</w:t>
+      </w:r>
+    </w:p>
+    <w:p>
+      <w:pPr>
+        <w:pStyle w:val="SourceCode"/>
+      </w:pPr>
+      <w:r>
+        <w:t xml:space="preserve">    for pid in reader_pids(root,folder):stop_reader(pid)</w:t>
+      </w:r>
+    </w:p>
+    <w:p>
+      <w:pPr>
+        <w:pStyle w:val="SourceCode"/>
+      </w:pPr>
+      <w:r>
+        <w:t xml:space="preserve">    # Do not remove files until the reader has actually relinquished ownership.</w:t>
+      </w:r>
+    </w:p>
+    <w:p>
+      <w:pPr>
+        <w:pStyle w:val="SourceCode"/>
+      </w:pPr>
+      <w:r>
+        <w:t xml:space="preserve">    with (folder/'.prepare.lock').open('a') as lock:</w:t>
+      </w:r>
+    </w:p>
+    <w:p>
+      <w:pPr>
+        <w:pStyle w:val="SourceCode"/>
+      </w:pPr>
+      <w:r>
+        <w:t xml:space="preserve">        deadline=time.monotonic()+15</w:t>
+      </w:r>
+    </w:p>
+    <w:p>
+      <w:pPr>
+        <w:pStyle w:val="SourceCode"/>
+      </w:pPr>
+      <w:r>
+        <w:t xml:space="preserve">        while True:</w:t>
+      </w:r>
+    </w:p>
+    <w:p>
+      <w:pPr>
+        <w:pStyle w:val="SourceCode"/>
+      </w:pPr>
+      <w:r>
+        <w:t xml:space="preserve">            try:fcntl.flock(lock,fcntl.LOCK_EX|fcntl.LOCK_NB);break</w:t>
+      </w:r>
+    </w:p>
+    <w:p>
+      <w:pPr>
+        <w:pStyle w:val="SourceCode"/>
+      </w:pPr>
+      <w:r>
+        <w:t xml:space="preserve">            except BlockingIOError:</w:t>
+      </w:r>
+    </w:p>
+    <w:p>
+      <w:pPr>
+        <w:pStyle w:val="SourceCode"/>
+      </w:pPr>
+      <w:r>
+        <w:t xml:space="preserve">                if time.monotonic()&gt;deadline:</w:t>
+      </w:r>
+    </w:p>
+    <w:p>
+      <w:pPr>
+        <w:pStyle w:val="SourceCode"/>
+      </w:pPr>
+      <w:r>
+        <w:t xml:space="preserve">                    (folder/'.deleting').unlink(missing_ok=True)</w:t>
+      </w:r>
+    </w:p>
+    <w:p>
+      <w:pPr>
+        <w:pStyle w:val="SourceCode"/>
+      </w:pPr>
+      <w:r>
+        <w:t xml:space="preserve">                    raise ValueError('任务尚未停止，未删除文件。请稍后重试。')</w:t>
+      </w:r>
+    </w:p>
+    <w:p>
+      <w:pPr>
+        <w:pStyle w:val="SourceCode"/>
+      </w:pPr>
+      <w:r>
+        <w:t xml:space="preserve">                time.sleep(.2)</w:t>
+      </w:r>
+    </w:p>
+    <w:p>
+      <w:pPr>
+        <w:pStyle w:val="SourceCode"/>
+      </w:pPr>
+      <w:r>
+        <w:t xml:space="preserve">        meta=json.loads((folder/'job.json').read_text())</w:t>
+      </w:r>
+    </w:p>
+    <w:p>
+      <w:pPr>
+        <w:pStyle w:val="SourceCode"/>
+      </w:pPr>
+      <w:r>
+        <w:t xml:space="preserve">        candidates=set()</w:t>
+      </w:r>
+    </w:p>
+    <w:p>
+      <w:pPr>
+        <w:pStyle w:val="SourceCode"/>
+      </w:pPr>
+      <w:r>
+        <w:t xml:space="preserve">        owned=set()</w:t>
+      </w:r>
+    </w:p>
+    <w:p>
+      <w:pPr>
+        <w:pStyle w:val="SourceCode"/>
+      </w:pPr>
+      <w:r>
+        <w:t xml:space="preserve">        reservation=folder/'export-target.json'</w:t>
+      </w:r>
+    </w:p>
+    <w:p>
+      <w:pPr>
+        <w:pStyle w:val="SourceCode"/>
+      </w:pPr>
+      <w:r>
+        <w:t xml:space="preserve">        if reservation.exists():</w:t>
+      </w:r>
+    </w:p>
+    <w:p>
+      <w:pPr>
+        <w:pStyle w:val="SourceCode"/>
+      </w:pPr>
+      <w:r>
+        <w:t xml:space="preserve">            record=json.loads(reservation.read_text())</w:t>
+      </w:r>
+    </w:p>
+    <w:p>
+      <w:pPr>
+        <w:pStyle w:val="SourceCode"/>
+      </w:pPr>
+      <w:r>
+        <w:t xml:space="preserve">            if record.get('url')==meta.get('url'):</w:t>
+      </w:r>
+    </w:p>
+    <w:p>
+      <w:pPr>
+        <w:pStyle w:val="SourceCode"/>
+      </w:pPr>
+      <w:r>
+        <w:t xml:space="preserve">                target=Path(record['path'])</w:t>
+      </w:r>
+    </w:p>
+    <w:p>
+      <w:pPr>
+        <w:pStyle w:val="SourceCode"/>
+      </w:pPr>
+      <w:r>
+        <w:t xml:space="preserve">                owned.update([target,target.with_suffix('.partial.docx')])</w:t>
+      </w:r>
+    </w:p>
+    <w:p>
+      <w:pPr>
+        <w:pStyle w:val="SourceCode"/>
+      </w:pPr>
+      <w:r>
+        <w:t xml:space="preserve">                candidates.update(owned)</w:t>
+      </w:r>
+    </w:p>
+    <w:p>
+      <w:pPr>
+        <w:pStyle w:val="SourceCode"/>
+      </w:pPr>
+      <w:r>
+        <w:t xml:space="preserve">        if meta.get('document'):</w:t>
+      </w:r>
+    </w:p>
+    <w:p>
+      <w:pPr>
+        <w:pStyle w:val="SourceCode"/>
+      </w:pPr>
+      <w:r>
+        <w:t xml:space="preserve">            candidates.add(Path(meta['document']));owned.add(Path(meta['document']))</w:t>
+      </w:r>
+    </w:p>
+    <w:p>
+      <w:pPr>
+        <w:pStyle w:val="SourceCode"/>
+      </w:pPr>
+      <w:r>
+        <w:t xml:space="preserve">        name=meta.get('name')</w:t>
+      </w:r>
+    </w:p>
+    <w:p>
+      <w:pPr>
+        <w:pStyle w:val="SourceCode"/>
+      </w:pPr>
+      <w:r>
+        <w:t xml:space="preserve">        if name:</w:t>
+      </w:r>
+    </w:p>
+    <w:p>
+      <w:pPr>
+        <w:pStyle w:val="SourceCode"/>
+      </w:pPr>
+      <w:r>
+        <w:t xml:space="preserve">            for base in output_roots:</w:t>
+      </w:r>
+    </w:p>
+    <w:p>
+      <w:pPr>
+        <w:pStyle w:val="SourceCode"/>
+      </w:pPr>
+      <w:r>
+        <w:t xml:space="preserve">                for suffix in ('.docx','.partial.docx'):</w:t>
+      </w:r>
+    </w:p>
+    <w:p>
+      <w:pPr>
+        <w:pStyle w:val="SourceCode"/>
+      </w:pPr>
+      <w:r>
+        <w:t xml:space="preserve">                    candidates.add(base/(name+suffix))</w:t>
+      </w:r>
+    </w:p>
+    <w:p>
+      <w:pPr>
+        <w:pStyle w:val="SourceCode"/>
+      </w:pPr>
+      <w:r>
+        <w:t xml:space="preserve">                    candidates.add(base/(name+' ('+ident+')'+suffix))</w:t>
+      </w:r>
+    </w:p>
+    <w:p>
+      <w:pPr>
+        <w:pStyle w:val="SourceCode"/>
+      </w:pPr>
+      <w:r>
+        <w:t xml:space="preserve">        for path in candidates:</w:t>
+      </w:r>
+    </w:p>
+    <w:p>
+      <w:pPr>
+        <w:pStyle w:val="SourceCode"/>
+      </w:pPr>
+      <w:r>
+        <w:t xml:space="preserve">            if path.exists() and (path.is_symlink() or not any(base.resolve() in path.resolve().parents for base in output_roots)):</w:t>
+      </w:r>
+    </w:p>
+    <w:p>
+      <w:pPr>
+        <w:pStyle w:val="SourceCode"/>
+      </w:pPr>
+      <w:r>
+        <w:t xml:space="preserve">                raise ValueError('文稿路径不属于工具输出目录，未删除任务')</w:t>
+      </w:r>
+    </w:p>
+    <w:p>
+      <w:pPr>
+        <w:pStyle w:val="SourceCode"/>
+      </w:pPr>
+      <w:r>
+        <w:t xml:space="preserve">        for path in candidates:</w:t>
+      </w:r>
+    </w:p>
+    <w:p>
+      <w:pPr>
+        <w:pStyle w:val="SourceCode"/>
+      </w:pPr>
+      <w:r>
+        <w:t xml:space="preserve">            if not path.exists():continue</w:t>
+      </w:r>
+    </w:p>
+    <w:p>
+      <w:pPr>
+        <w:pStyle w:val="SourceCode"/>
+      </w:pPr>
+      <w:r>
+        <w:t xml:space="preserve">            if path.is_symlink() or not any(base.resolve() in path.resolve().parents for base in output_roots):</w:t>
+      </w:r>
+    </w:p>
+    <w:p>
+      <w:pPr>
+        <w:pStyle w:val="SourceCode"/>
+      </w:pPr>
+      <w:r>
+        <w:t xml:space="preserve">                raise ValueError('文稿路径不属于工具输出目录，未删除任务')</w:t>
+      </w:r>
+    </w:p>
+    <w:p>
+      <w:pPr>
+        <w:pStyle w:val="SourceCode"/>
+      </w:pPr>
+      <w:r>
+        <w:t xml:space="preserve">            try:</w:t>
+      </w:r>
+    </w:p>
+    <w:p>
+      <w:pPr>
+        <w:pStyle w:val="SourceCode"/>
+      </w:pPr>
+      <w:r>
+        <w:t xml:space="preserve">                paragraphs=Document(path).paragraphs</w:t>
+      </w:r>
+    </w:p>
+    <w:p>
+      <w:pPr>
+        <w:pStyle w:val="SourceCode"/>
+      </w:pPr>
+      <w:r>
+        <w:t xml:space="preserve">                belongs=path in owned or bool(paragraphs and paragraphs[0].text==meta.get('url'))</w:t>
+      </w:r>
+    </w:p>
+    <w:p>
+      <w:pPr>
+        <w:pStyle w:val="SourceCode"/>
+      </w:pPr>
+      <w:r>
+        <w:t xml:space="preserve">            except Exception:</w:t>
+      </w:r>
+    </w:p>
+    <w:p>
+      <w:pPr>
+        <w:pStyle w:val="SourceCode"/>
+      </w:pPr>
+      <w:r>
+        <w:t xml:space="preserve">                # An incomplete file is owned only if it was explicitly recorded.</w:t>
+      </w:r>
+    </w:p>
+    <w:p>
+      <w:pPr>
+        <w:pStyle w:val="SourceCode"/>
+      </w:pPr>
+      <w:r>
+        <w:t xml:space="preserve">                belongs=str(path)==meta.get('document') or path in owned</w:t>
+      </w:r>
+    </w:p>
+    <w:p>
+      <w:pPr>
+        <w:pStyle w:val="SourceCode"/>
+      </w:pPr>
+      <w:r>
+        <w:t xml:space="preserve">                if not belongs and path.suffix=='.docx' and '.partial' in path.name:</w:t>
+      </w:r>
+    </w:p>
+    <w:p>
+      <w:pPr>
+        <w:pStyle w:val="SourceCode"/>
+      </w:pPr>
+      <w:r>
+        <w:t xml:space="preserve">                    raise ValueError('无法确认未完成文稿的归属，已保留文件，请检查')</w:t>
+      </w:r>
+    </w:p>
+    <w:p>
+      <w:pPr>
+        <w:pStyle w:val="SourceCode"/>
+      </w:pPr>
+      <w:r>
+        <w:t xml:space="preserve">            if belongs:send2trash(str(path.resolve()))</w:t>
+      </w:r>
+    </w:p>
+    <w:p>
+      <w:pPr>
+        <w:pStyle w:val="SourceCode"/>
+      </w:pPr>
+      <w:r>
+        <w:t xml:space="preserve">        for base in output_roots[1:]:</w:t>
+      </w:r>
+    </w:p>
+    <w:p>
+      <w:pPr>
+        <w:pStyle w:val="SourceCode"/>
+      </w:pPr>
+      <w:r>
+        <w:t xml:space="preserve">            legacy=base/ident</w:t>
+      </w:r>
+    </w:p>
+    <w:p>
+      <w:pPr>
+        <w:pStyle w:val="SourceCode"/>
+      </w:pPr>
+      <w:r>
+        <w:t xml:space="preserve">            if legacy.is_dir() and not legacy.is_symlink():send2trash(str(legacy.resolve()))</w:t>
+      </w:r>
+    </w:p>
+    <w:p>
+      <w:pPr>
+        <w:pStyle w:val="SourceCode"/>
+      </w:pPr>
+      <w:r>
+        <w:t xml:space="preserve">        send2trash(str(folder.resolve()))</w:t>
+      </w:r>
+    </w:p>
+    <w:p>
+      <w:pPr>
+        <w:pStyle w:val="SourceCode"/>
+      </w:pPr>
+      <w:r>
+        <w:t xml:space="preserve">    return {'ok':True,'message':'本机任务与相关文件已移入废纸篓。千问云端记录需在千问网页中管理。'}</w:t>
+      </w:r>
+    </w:p>
+    <w:p>
+      <w:pPr>
+        <w:pStyle w:val="SourceCode"/>
+      </w:pPr>
+      <w:r/>
+    </w:p>
+    <w:p>
+      <w:pPr>
+        <w:pStyle w:val="Heading2"/>
+      </w:pPr>
+      <w:r>
+        <w:t>FILE: test_task_controls.py</w:t>
+      </w:r>
+    </w:p>
+    <w:p>
+      <w:pPr>
+        <w:pStyle w:val="SourceCode"/>
+      </w:pPr>
+      <w:r>
+        <w:t>import json</w:t>
+      </w:r>
+    </w:p>
+    <w:p>
+      <w:pPr>
+        <w:pStyle w:val="SourceCode"/>
+      </w:pPr>
+      <w:r>
+        <w:t>import shutil</w:t>
+      </w:r>
+    </w:p>
+    <w:p>
+      <w:pPr>
+        <w:pStyle w:val="SourceCode"/>
+      </w:pPr>
+      <w:r>
+        <w:t>import tempfile</w:t>
+      </w:r>
+    </w:p>
+    <w:p>
+      <w:pPr>
+        <w:pStyle w:val="SourceCode"/>
+      </w:pPr>
+      <w:r>
+        <w:t>import unittest</w:t>
+      </w:r>
+    </w:p>
+    <w:p>
+      <w:pPr>
+        <w:pStyle w:val="SourceCode"/>
+      </w:pPr>
+      <w:r>
+        <w:t>from pathlib import Path</w:t>
+      </w:r>
+    </w:p>
+    <w:p>
+      <w:pPr>
+        <w:pStyle w:val="SourceCode"/>
+      </w:pPr>
+      <w:r>
+        <w:t>from unittest.mock import patch</w:t>
+      </w:r>
+    </w:p>
+    <w:p>
+      <w:pPr>
+        <w:pStyle w:val="SourceCode"/>
+      </w:pPr>
+      <w:r>
+        <w:t>from docx import Document</w:t>
+      </w:r>
+    </w:p>
+    <w:p>
+      <w:pPr>
+        <w:pStyle w:val="SourceCode"/>
+      </w:pPr>
+      <w:r>
+        <w:t>import task_controls</w:t>
+      </w:r>
+    </w:p>
+    <w:p>
+      <w:pPr>
+        <w:pStyle w:val="SourceCode"/>
+      </w:pPr>
+      <w:r>
+        <w:t>import qianwen_browser</w:t>
+      </w:r>
+    </w:p>
+    <w:p>
+      <w:pPr>
+        <w:pStyle w:val="SourceCode"/>
+      </w:pPr>
+      <w:r/>
+    </w:p>
+    <w:p>
+      <w:pPr>
+        <w:pStyle w:val="SourceCode"/>
+      </w:pPr>
+      <w:r/>
+    </w:p>
+    <w:p>
+      <w:pPr>
+        <w:pStyle w:val="SourceCode"/>
+      </w:pPr>
+      <w:r>
+        <w:t>class TaskControlTests(unittest.TestCase):</w:t>
+      </w:r>
+    </w:p>
+    <w:p>
+      <w:pPr>
+        <w:pStyle w:val="SourceCode"/>
+      </w:pPr>
+      <w:r>
+        <w:t xml:space="preserve">    def setup_files(self, root):</w:t>
+      </w:r>
+    </w:p>
+    <w:p>
+      <w:pPr>
+        <w:pStyle w:val="SourceCode"/>
+      </w:pPr>
+      <w:r>
+        <w:t xml:space="preserve">        folder=root/'work/jobs/123456abcdef';folder.mkdir(parents=True)</w:t>
+      </w:r>
+    </w:p>
+    <w:p>
+      <w:pPr>
+        <w:pStyle w:val="SourceCode"/>
+      </w:pPr>
+      <w:r>
+        <w:t xml:space="preserve">        output=root/'output';output.mkdir()</w:t>
+      </w:r>
+    </w:p>
+    <w:p>
+      <w:pPr>
+        <w:pStyle w:val="SourceCode"/>
+      </w:pPr>
+      <w:r>
+        <w:t xml:space="preserve">        path=output/'测试.docx';doc=Document();doc.add_paragraph('https://example.com/test');doc.add_paragraph('正文');doc.save(path)</w:t>
+      </w:r>
+    </w:p>
+    <w:p>
+      <w:pPr>
+        <w:pStyle w:val="SourceCode"/>
+      </w:pPr>
+      <w:r>
+        <w:t xml:space="preserve">        meta={'name':'测试','url':'https://example.com/test','document':str(path)}</w:t>
+      </w:r>
+    </w:p>
+    <w:p>
+      <w:pPr>
+        <w:pStyle w:val="SourceCode"/>
+      </w:pPr>
+      <w:r>
+        <w:t xml:space="preserve">        (folder/'job.json').write_text(json.dumps(meta))</w:t>
+      </w:r>
+    </w:p>
+    <w:p>
+      <w:pPr>
+        <w:pStyle w:val="SourceCode"/>
+      </w:pPr>
+      <w:r>
+        <w:t xml:space="preserve">        (folder/'media').mkdir();(folder/'media/video.mp4').write_bytes(b'test')</w:t>
+      </w:r>
+    </w:p>
+    <w:p>
+      <w:pPr>
+        <w:pStyle w:val="SourceCode"/>
+      </w:pPr>
+      <w:r>
+        <w:t xml:space="preserve">        return folder,output,path</w:t>
+      </w:r>
+    </w:p>
+    <w:p>
+      <w:pPr>
+        <w:pStyle w:val="SourceCode"/>
+      </w:pPr>
+      <w:r/>
+    </w:p>
+    <w:p>
+      <w:pPr>
+        <w:pStyle w:val="SourceCode"/>
+      </w:pPr>
+      <w:r>
+        <w:t xml:space="preserve">    def run_delete(self, root, output):</w:t>
+      </w:r>
+    </w:p>
+    <w:p>
+      <w:pPr>
+        <w:pStyle w:val="SourceCode"/>
+      </w:pPr>
+      <w:r>
+        <w:t xml:space="preserve">        trash=root/'trash';trash.mkdir()</w:t>
+      </w:r>
+    </w:p>
+    <w:p>
+      <w:pPr>
+        <w:pStyle w:val="SourceCode"/>
+      </w:pPr>
+      <w:r>
+        <w:t xml:space="preserve">        def move(path):shutil.move(path,trash/Path(path).name)</w:t>
+      </w:r>
+    </w:p>
+    <w:p>
+      <w:pPr>
+        <w:pStyle w:val="SourceCode"/>
+      </w:pPr>
+      <w:r>
+        <w:t xml:space="preserve">        with patch('send2trash.send2trash',side_effect=move),patch('task_controls.reader_pids',return_value=[]):</w:t>
+      </w:r>
+    </w:p>
+    <w:p>
+      <w:pPr>
+        <w:pStyle w:val="SourceCode"/>
+      </w:pPr>
+      <w:r>
+        <w:t xml:space="preserve">            task_controls.trash_task(root,root/'work',[output],'123456abcdef')</w:t>
+      </w:r>
+    </w:p>
+    <w:p>
+      <w:pPr>
+        <w:pStyle w:val="SourceCode"/>
+      </w:pPr>
+      <w:r>
+        <w:t xml:space="preserve">        return trash</w:t>
+      </w:r>
+    </w:p>
+    <w:p>
+      <w:pPr>
+        <w:pStyle w:val="SourceCode"/>
+      </w:pPr>
+      <w:r/>
+    </w:p>
+    <w:p>
+      <w:pPr>
+        <w:pStyle w:val="SourceCode"/>
+      </w:pPr>
+      <w:r>
+        <w:t xml:space="preserve">    def test_removes_task_media_document_and_reserved_partial(self):</w:t>
+      </w:r>
+    </w:p>
+    <w:p>
+      <w:pPr>
+        <w:pStyle w:val="SourceCode"/>
+      </w:pPr>
+      <w:r>
+        <w:t xml:space="preserve">        with tempfile.TemporaryDirectory() as tmp:</w:t>
+      </w:r>
+    </w:p>
+    <w:p>
+      <w:pPr>
+        <w:pStyle w:val="SourceCode"/>
+      </w:pPr>
+      <w:r>
+        <w:t xml:space="preserve">            root=Path(tmp);folder,output,path=self.setup_files(root)</w:t>
+      </w:r>
+    </w:p>
+    <w:p>
+      <w:pPr>
+        <w:pStyle w:val="SourceCode"/>
+      </w:pPr>
+      <w:r>
+        <w:t xml:space="preserve">            partial=path.with_suffix('.partial.docx');partial.write_bytes(b'incomplete zip')</w:t>
+      </w:r>
+    </w:p>
+    <w:p>
+      <w:pPr>
+        <w:pStyle w:val="SourceCode"/>
+      </w:pPr>
+      <w:r>
+        <w:t xml:space="preserve">            (folder/'export-target.json').write_text(json.dumps({'url':'https://example.com/test','path':str(path)}))</w:t>
+      </w:r>
+    </w:p>
+    <w:p>
+      <w:pPr>
+        <w:pStyle w:val="SourceCode"/>
+      </w:pPr>
+      <w:r>
+        <w:t xml:space="preserve">            trash=self.run_delete(root,output)</w:t>
+      </w:r>
+    </w:p>
+    <w:p>
+      <w:pPr>
+        <w:pStyle w:val="SourceCode"/>
+      </w:pPr>
+      <w:r>
+        <w:t xml:space="preserve">            self.assertFalse(folder.exists());self.assertFalse(path.exists());self.assertFalse(partial.exists())</w:t>
+      </w:r>
+    </w:p>
+    <w:p>
+      <w:pPr>
+        <w:pStyle w:val="SourceCode"/>
+      </w:pPr>
+      <w:r>
+        <w:t xml:space="preserve">            self.assertTrue((trash/'123456abcdef/media/video.mp4').exists())</w:t>
+      </w:r>
+    </w:p>
+    <w:p>
+      <w:pPr>
+        <w:pStyle w:val="SourceCode"/>
+      </w:pPr>
+      <w:r>
+        <w:t xml:space="preserve">            self.assertTrue((trash/'测试.docx').exists());self.assertTrue((trash/'测试.partial.docx').exists())</w:t>
+      </w:r>
+    </w:p>
+    <w:p>
+      <w:pPr>
+        <w:pStyle w:val="SourceCode"/>
+      </w:pPr>
+      <w:r/>
+    </w:p>
+    <w:p>
+      <w:pPr>
+        <w:pStyle w:val="SourceCode"/>
+      </w:pPr>
+      <w:r>
+        <w:t xml:space="preserve">    def test_preserves_unrelated_document_with_same_title(self):</w:t>
+      </w:r>
+    </w:p>
+    <w:p>
+      <w:pPr>
+        <w:pStyle w:val="SourceCode"/>
+      </w:pPr>
+      <w:r>
+        <w:t xml:space="preserve">        with tempfile.TemporaryDirectory() as tmp:</w:t>
+      </w:r>
+    </w:p>
+    <w:p>
+      <w:pPr>
+        <w:pStyle w:val="SourceCode"/>
+      </w:pPr>
+      <w:r>
+        <w:t xml:space="preserve">            root=Path(tmp);folder,output,path=self.setup_files(root)</w:t>
+      </w:r>
+    </w:p>
+    <w:p>
+      <w:pPr>
+        <w:pStyle w:val="SourceCode"/>
+      </w:pPr>
+      <w:r>
+        <w:t xml:space="preserve">            meta=json.loads((folder/'job.json').read_text());meta.pop('document');(folder/'job.json').write_text(json.dumps(meta))</w:t>
+      </w:r>
+    </w:p>
+    <w:p>
+      <w:pPr>
+        <w:pStyle w:val="SourceCode"/>
+      </w:pPr>
+      <w:r>
+        <w:t xml:space="preserve">            doc=Document();doc.add_paragraph('https://other.example/video');doc.save(path)</w:t>
+      </w:r>
+    </w:p>
+    <w:p>
+      <w:pPr>
+        <w:pStyle w:val="SourceCode"/>
+      </w:pPr>
+      <w:r>
+        <w:t xml:space="preserve">            self.run_delete(root,output);self.assertTrue(path.exists())</w:t>
+      </w:r>
+    </w:p>
+    <w:p>
+      <w:pPr>
+        <w:pStyle w:val="SourceCode"/>
+      </w:pPr>
+      <w:r/>
+    </w:p>
+    <w:p>
+      <w:pPr>
+        <w:pStyle w:val="SourceCode"/>
+      </w:pPr>
+      <w:r>
+        <w:t xml:space="preserve">    def test_rejects_document_outside_outputs(self):</w:t>
+      </w:r>
+    </w:p>
+    <w:p>
+      <w:pPr>
+        <w:pStyle w:val="SourceCode"/>
+      </w:pPr>
+      <w:r>
+        <w:t xml:space="preserve">        with tempfile.TemporaryDirectory() as tmp:</w:t>
+      </w:r>
+    </w:p>
+    <w:p>
+      <w:pPr>
+        <w:pStyle w:val="SourceCode"/>
+      </w:pPr>
+      <w:r>
+        <w:t xml:space="preserve">            root=Path(tmp);folder,output,path=self.setup_files(root)</w:t>
+      </w:r>
+    </w:p>
+    <w:p>
+      <w:pPr>
+        <w:pStyle w:val="SourceCode"/>
+      </w:pPr>
+      <w:r>
+        <w:t xml:space="preserve">            outside=root/'private.docx';shutil.copy2(path,outside)</w:t>
+      </w:r>
+    </w:p>
+    <w:p>
+      <w:pPr>
+        <w:pStyle w:val="SourceCode"/>
+      </w:pPr>
+      <w:r>
+        <w:t xml:space="preserve">            meta=json.loads((folder/'job.json').read_text());meta['document']=str(outside);(folder/'job.json').write_text(json.dumps(meta))</w:t>
+      </w:r>
+    </w:p>
+    <w:p>
+      <w:pPr>
+        <w:pStyle w:val="SourceCode"/>
+      </w:pPr>
+      <w:r>
+        <w:t xml:space="preserve">            with patch('task_controls.reader_pids',return_value=[]),patch('send2trash.send2trash'),self.assertRaises(ValueError):</w:t>
+      </w:r>
+    </w:p>
+    <w:p>
+      <w:pPr>
+        <w:pStyle w:val="SourceCode"/>
+      </w:pPr>
+      <w:r>
+        <w:t xml:space="preserve">                task_controls.trash_task(root,root/'work',[output],'123456abcdef')</w:t>
+      </w:r>
+    </w:p>
+    <w:p>
+      <w:pPr>
+        <w:pStyle w:val="SourceCode"/>
+      </w:pPr>
+      <w:r>
+        <w:t xml:space="preserve">            self.assertTrue(outside.exists());self.assertTrue(folder.exists())</w:t>
+      </w:r>
+    </w:p>
+    <w:p>
+      <w:pPr>
+        <w:pStyle w:val="SourceCode"/>
+      </w:pPr>
+      <w:r/>
+    </w:p>
+    <w:p>
+      <w:pPr>
+        <w:pStyle w:val="SourceCode"/>
+      </w:pPr>
+      <w:r>
+        <w:t xml:space="preserve">    def test_invalid_identifier_cannot_escape_job_folder(self):</w:t>
+      </w:r>
+    </w:p>
+    <w:p>
+      <w:pPr>
+        <w:pStyle w:val="SourceCode"/>
+      </w:pPr>
+      <w:r>
+        <w:t xml:space="preserve">        with self.assertRaises(ValueError):task_controls.trash_task(Path('/tmp'),Path('/tmp'),[], '../escape')</w:t>
+      </w:r>
+    </w:p>
+    <w:p>
+      <w:pPr>
+        <w:pStyle w:val="SourceCode"/>
+      </w:pPr>
+      <w:r/>
+    </w:p>
+    <w:p>
+      <w:pPr>
+        <w:pStyle w:val="SourceCode"/>
+      </w:pPr>
+      <w:r>
+        <w:t xml:space="preserve">    def test_login_prompt_becomes_explicit_login_required(self):</w:t>
+      </w:r>
+    </w:p>
+    <w:p>
+      <w:pPr>
+        <w:pStyle w:val="SourceCode"/>
+      </w:pPr>
+      <w:r>
+        <w:t xml:space="preserve">        from unittest.mock import MagicMock</w:t>
+      </w:r>
+    </w:p>
+    <w:p>
+      <w:pPr>
+        <w:pStyle w:val="SourceCode"/>
+      </w:pPr>
+      <w:r>
+        <w:t xml:space="preserve">        page=MagicMock();prompt=MagicMock();prompt.is_visible.return_value=True</w:t>
+      </w:r>
+    </w:p>
+    <w:p>
+      <w:pPr>
+        <w:pStyle w:val="SourceCode"/>
+      </w:pPr>
+      <w:r>
+        <w:t xml:space="preserve">        page.get_by_role.return_value.filter.return_value.all.return_value=[prompt]</w:t>
+      </w:r>
+    </w:p>
+    <w:p>
+      <w:pPr>
+        <w:pStyle w:val="SourceCode"/>
+      </w:pPr>
+      <w:r>
+        <w:t xml:space="preserve">        with patch('qianwen_browser.auth_state') as state,self.assertRaises(qianwen_browser.LoginRequired):</w:t>
+      </w:r>
+    </w:p>
+    <w:p>
+      <w:pPr>
+        <w:pStyle w:val="SourceCode"/>
+      </w:pPr>
+      <w:r>
+        <w:t xml:space="preserve">            qianwen_browser.require_login_if_visible(page)</w:t>
+      </w:r>
+    </w:p>
+    <w:p>
+      <w:pPr>
+        <w:pStyle w:val="SourceCode"/>
+      </w:pPr>
+      <w:r>
+        <w:t xml:space="preserve">        state.assert_called_once_with('required')</w:t>
+      </w:r>
+    </w:p>
+    <w:p>
+      <w:pPr>
+        <w:pStyle w:val="SourceCode"/>
+      </w:pPr>
+      <w:r/>
+    </w:p>
+    <w:p>
+      <w:pPr>
+        <w:pStyle w:val="SourceCode"/>
+      </w:pPr>
+      <w:r>
+        <w:t>if __name__=='__main__':unittest.main()</w:t>
+      </w:r>
+    </w:p>
+    <w:p>
+      <w:pPr>
+        <w:pStyle w:val="SourceCode"/>
+      </w:pPr>
+      <w:r/>
+    </w:p>
+    <w:p>
+      <w:pPr>
+        <w:pStyle w:val="Heading2"/>
+      </w:pPr>
+      <w:r>
+        <w:t>FILE: 加载本次更新.command</w:t>
+      </w:r>
+    </w:p>
+    <w:p>
+      <w:pPr>
+        <w:pStyle w:val="SourceCode"/>
+      </w:pPr>
+      <w:r>
+        <w:t>#!/bin/zsh</w:t>
+      </w:r>
+    </w:p>
+    <w:p>
+      <w:pPr>
+        <w:pStyle w:val="SourceCode"/>
+      </w:pPr>
+      <w:r>
+        <w:t>cd -- "${0:A:h}" || exit 1</w:t>
+      </w:r>
+    </w:p>
+    <w:p>
+      <w:pPr>
+        <w:pStyle w:val="SourceCode"/>
+      </w:pPr>
+      <w:r>
+        <w:t>.venv/bin/python - &lt;&lt;'PY'</w:t>
+      </w:r>
+    </w:p>
+    <w:p>
+      <w:pPr>
+        <w:pStyle w:val="SourceCode"/>
+      </w:pPr>
+      <w:r>
+        <w:t>import os, plistlib, subprocess</w:t>
+      </w:r>
+    </w:p>
+    <w:p>
+      <w:pPr>
+        <w:pStyle w:val="SourceCode"/>
+      </w:pPr>
+      <w:r>
+        <w:t>from pathlib import Path</w:t>
+      </w:r>
+    </w:p>
+    <w:p>
+      <w:pPr>
+        <w:pStyle w:val="SourceCode"/>
+      </w:pPr>
+      <w:r>
+        <w:t>from launch_service import LABEL</w:t>
+      </w:r>
+    </w:p>
+    <w:p>
+      <w:pPr>
+        <w:pStyle w:val="SourceCode"/>
+      </w:pPr>
+      <w:r>
+        <w:t>root=Path.cwd()</w:t>
+      </w:r>
+    </w:p>
+    <w:p>
+      <w:pPr>
+        <w:pStyle w:val="SourceCode"/>
+      </w:pPr>
+      <w:r>
+        <w:t>path=Path.home()/'Library/LaunchAgents'/(LABEL+'.plist')</w:t>
+      </w:r>
+    </w:p>
+    <w:p>
+      <w:pPr>
+        <w:pStyle w:val="SourceCode"/>
+      </w:pPr>
+      <w:r>
+        <w:t>if not path.exists():</w:t>
+      </w:r>
+    </w:p>
+    <w:p>
+      <w:pPr>
+        <w:pStyle w:val="SourceCode"/>
+      </w:pPr>
+      <w:r>
+        <w:t xml:space="preserve">    raise SystemExit('尚未启用自动启动。请先关闭手动网页服务，再运行启动工具.command。')</w:t>
+      </w:r>
+    </w:p>
+    <w:p>
+      <w:pPr>
+        <w:pStyle w:val="SourceCode"/>
+      </w:pPr>
+      <w:r>
+        <w:t>config=plistlib.loads(path.read_bytes())</w:t>
+      </w:r>
+    </w:p>
+    <w:p>
+      <w:pPr>
+        <w:pStyle w:val="SourceCode"/>
+      </w:pPr>
+      <w:r>
+        <w:t>if config.get('WorkingDirectory')!=str(root):</w:t>
+      </w:r>
+    </w:p>
+    <w:p>
+      <w:pPr>
+        <w:pStyle w:val="SourceCode"/>
+      </w:pPr>
+      <w:r>
+        <w:t xml:space="preserve">    raise SystemExit('自动启动项属于另一个项目副本，未停止服务。')</w:t>
+      </w:r>
+    </w:p>
+    <w:p>
+      <w:pPr>
+        <w:pStyle w:val="SourceCode"/>
+      </w:pPr>
+      <w:r>
+        <w:t>subprocess.run(['/bin/launchctl','kill','SIGTERM',f'gui/{os.getuid()}/{LABEL}'],check=True)</w:t>
+      </w:r>
+    </w:p>
+    <w:p>
+      <w:pPr>
+        <w:pStyle w:val="SourceCode"/>
+      </w:pPr>
+      <w:r>
+        <w:t>print('网页服务正在自动恢复。请稍后刷新工具页面。正在识别的任务会保留。')</w:t>
+      </w:r>
+    </w:p>
+    <w:p>
+      <w:pPr>
+        <w:pStyle w:val="SourceCode"/>
+      </w:pPr>
+      <w:r>
+        <w:t>PY</w:t>
+      </w:r>
+    </w:p>
+    <w:p>
+      <w:pPr>
+        <w:pStyle w:val="SourceCode"/>
+      </w:pPr>
+      <w:r>
+        <w:t>result=$?</w:t>
+      </w:r>
+    </w:p>
+    <w:p>
+      <w:pPr>
+        <w:pStyle w:val="SourceCode"/>
+      </w:pPr>
+      <w:r>
+        <w:t>read '?按回车关闭窗口。'</w:t>
+      </w:r>
+    </w:p>
+    <w:p>
+      <w:pPr>
+        <w:pStyle w:val="SourceCode"/>
+      </w:pPr>
+      <w:r>
+        <w:t>exit "$result"</w:t>
       </w:r>
     </w:p>
     <w:p>

</xml_diff>

<commit_message>
Change generate transcript button to orange
</commit_message>
<xml_diff>
--- a/安装与使用指南.docx
+++ b/安装与使用指南.docx
@@ -46,7 +46,7 @@
     </w:p>
     <w:p>
       <w:r>
-        <w:t>3. 粘贴 YouTube、哔哩哔哩等视频页面链接，点击蓝色“开始生成文稿”。</w:t>
+        <w:t>3. 粘贴 YouTube、哔哩哔哩等视频页面链接，点击橙色“开始生成文稿”。</w:t>
       </w:r>
     </w:p>
     <w:p>
@@ -3705,7 +3705,7 @@
         <w:pStyle w:val="SourceCode"/>
       </w:pPr>
       <w:r>
-        <w:t>#form button,#qianwen-login{background:#004B93;border-color:#004B93}#form button:hover,#qianwen-login:hover{background:#003B75}&lt;/style&gt;</w:t>
+        <w:t>#qianwen-login{background:#004B93;border-color:#004B93}#qianwen-login:hover{background:#003B75}#form button{background:#D65A00;border-color:#D65A00}#form button:hover{background:#B94D00}&lt;/style&gt;</w:t>
       </w:r>
     </w:p>
     <w:p>
@@ -13413,7 +13413,7 @@
         <w:pStyle w:val="SourceCode"/>
       </w:pPr>
       <w:r>
-        <w:t xml:space="preserve">  "index.html": "c642671e5e3d8aa535772c310368698fe77e58433118d4261cd4453769684966",</w:t>
+        <w:t xml:space="preserve">  "index.html": "05131b2ec6b632fdfcb5da59d1fbd08a08591958b20a491857c6ba61f1ece0f2",</w:t>
       </w:r>
     </w:p>
     <w:p>

</xml_diff>

<commit_message>
Preserve certifi during model cleanup and restore verified HTTPS downloads
</commit_message>
<xml_diff>
--- a/安装与使用指南.docx
+++ b/安装与使用指南.docx
@@ -167,6 +167,19 @@
         <w:pStyle w:val="Heading1"/>
       </w:pPr>
       <w:r>
+        <w:t>HTTPS 证书</w:t>
+      </w:r>
+    </w:p>
+    <w:p>
+      <w:r>
+        <w:t>下载依赖 certifi 的可信证书。已将 certifi 列为必需组件并保留，清理旧模型时不会移除；不关闭 HTTPS 证书校验。若下载出现 CERTIFICATE_VERIFY_FAILED，请在项目中执行 `.venv/bin/python -m pip install -r requirements.txt` 恢复依赖后重试。</w:t>
+      </w:r>
+    </w:p>
+    <w:p>
+      <w:pPr>
+        <w:pStyle w:val="Heading1"/>
+      </w:pPr>
+      <w:r>
         <w:t>限制与隐私</w:t>
       </w:r>
     </w:p>
@@ -3531,7 +3544,7 @@
         <w:pStyle w:val="SourceCode"/>
       </w:pPr>
       <w:r>
-        <w:t xml:space="preserve">    keep=set(); pending=['yt-dlp','python-docx','imageio-ffmpeg','send2trash','ds-store','playwright','pip','setuptools','packaging']</w:t>
+        <w:t xml:space="preserve">    keep=set(); pending=['yt-dlp','python-docx','imageio-ffmpeg','send2trash','ds-store','playwright','pip','setuptools','packaging','certifi']</w:t>
       </w:r>
     </w:p>
     <w:p>
@@ -7047,6 +7060,22 @@
         <w:pStyle w:val="SourceCode"/>
       </w:pPr>
       <w:r>
+        <w:t xml:space="preserve">    import certifi</w:t>
+      </w:r>
+    </w:p>
+    <w:p>
+      <w:pPr>
+        <w:pStyle w:val="SourceCode"/>
+      </w:pPr>
+      <w:r>
+        <w:t xml:space="preserve">    os.environ['SSL_CERT_FILE'] = certifi.where()</w:t>
+      </w:r>
+    </w:p>
+    <w:p>
+      <w:pPr>
+        <w:pStyle w:val="SourceCode"/>
+      </w:pPr>
+      <w:r>
         <w:t xml:space="preserve">    from yt_dlp import YoutubeDL</w:t>
       </w:r>
     </w:p>
@@ -9176,6 +9205,14 @@
       <w:pPr>
         <w:pStyle w:val="SourceCode"/>
       </w:pPr>
+      <w:r>
+        <w:t>certifi</w:t>
+      </w:r>
+    </w:p>
+    <w:p>
+      <w:pPr>
+        <w:pStyle w:val="SourceCode"/>
+      </w:pPr>
       <w:r/>
     </w:p>
     <w:p>
@@ -13437,7 +13474,7 @@
         <w:pStyle w:val="SourceCode"/>
       </w:pPr>
       <w:r>
-        <w:t xml:space="preserve">  "requirements.txt": "1bef18e7e19cf30dd5dd0310e70ef0bbcc448d7632f896785981380e3f6f397b",</w:t>
+        <w:t xml:space="preserve">  "requirements.txt": "8f1f858b32310780d785ef1d196205c8c85a0c44efbb9fe4124bf7e98c9a96d3",</w:t>
       </w:r>
     </w:p>
     <w:p>
@@ -13477,7 +13514,7 @@
         <w:pStyle w:val="SourceCode"/>
       </w:pPr>
       <w:r>
-        <w:t xml:space="preserve">  "reader.py": "f4b48a28caad4c8343886516109ac54c86ce5b9f3388b6c583ac9731755f2f98",</w:t>
+        <w:t xml:space="preserve">  "reader.py": "9ebeb8e8987dbfa5bb8acda6fb4aecfa01fc722f46742d43564be1133006bd68",</w:t>
       </w:r>
     </w:p>
     <w:p>
@@ -13501,7 +13538,7 @@
         <w:pStyle w:val="SourceCode"/>
       </w:pPr>
       <w:r>
-        <w:t xml:space="preserve">  "cloud_migration.py": "fb3a5efbd4b19206eb90ccf3bd4119de1b070fee14aa327e39c8ef6d1be71a8b",</w:t>
+        <w:t xml:space="preserve">  "cloud_migration.py": "cc5c02b953f404a280f0230e836ff9a5fe04f3e7002361ef9b8b8cdc244c07a0",</w:t>
       </w:r>
     </w:p>
     <w:p>

</xml_diff>

<commit_message>
Fix exact login button matching in Qianwen browser
</commit_message>
<xml_diff>
--- a/安装与使用指南.docx
+++ b/安装与使用指南.docx
@@ -267,7 +267,7 @@
     </w:p>
     <w:p>
       <w:r>
-        <w:t>本次 18 项测试通过，其中云端识别返回结果在单元测试中模拟；旧本地推理断点测试已移除。此前本机20秒音频的千问后台完整流程约46秒，不能推断长视频速度或识别准确率。未在另一台全新 Mac 完成安装实测。</w:t>
+        <w:t>本次 19 项测试通过，其中云端识别返回结果在单元测试中模拟；旧本地推理断点测试已移除。此前本机20秒音频的千问后台完整流程约46秒，不能推断长视频速度或识别准确率。未在另一台全新 Mac 完成安装实测。</w:t>
       </w:r>
     </w:p>
     <w:p>
@@ -5644,15 +5644,23 @@
         <w:pStyle w:val="SourceCode"/>
       </w:pPr>
       <w:r>
-        <w:t xml:space="preserve">    buttons=page.get_by_role('button',name=re.compile('^(登录|登录/注册|立即登录)$'))</w:t>
-      </w:r>
-    </w:p>
-    <w:p>
-      <w:pPr>
-        <w:pStyle w:val="SourceCode"/>
-      </w:pPr>
-      <w:r>
-        <w:t xml:space="preserve">    if any(button.is_visible() for button in buttons.all()):</w:t>
+        <w:t xml:space="preserve">    buttons=[button for name in ('登录','登录/注册','立即登录')</w:t>
+      </w:r>
+    </w:p>
+    <w:p>
+      <w:pPr>
+        <w:pStyle w:val="SourceCode"/>
+      </w:pPr>
+      <w:r>
+        <w:t xml:space="preserve">             for button in page.get_by_role('button',name=name,exact=True).all()]</w:t>
+      </w:r>
+    </w:p>
+    <w:p>
+      <w:pPr>
+        <w:pStyle w:val="SourceCode"/>
+      </w:pPr>
+      <w:r>
+        <w:t xml:space="preserve">    if any(button.is_visible() for button in buttons):</w:t>
       </w:r>
     </w:p>
     <w:p>
@@ -12846,6 +12854,76 @@
         <w:pStyle w:val="SourceCode"/>
       </w:pPr>
       <w:r>
+        <w:t xml:space="preserve">    def test_login_buttons_use_exact_names(self):</w:t>
+      </w:r>
+    </w:p>
+    <w:p>
+      <w:pPr>
+        <w:pStyle w:val="SourceCode"/>
+      </w:pPr>
+      <w:r>
+        <w:t xml:space="preserve">        from unittest.mock import MagicMock</w:t>
+      </w:r>
+    </w:p>
+    <w:p>
+      <w:pPr>
+        <w:pStyle w:val="SourceCode"/>
+      </w:pPr>
+      <w:r>
+        <w:t xml:space="preserve">        page=MagicMock()</w:t>
+      </w:r>
+    </w:p>
+    <w:p>
+      <w:pPr>
+        <w:pStyle w:val="SourceCode"/>
+      </w:pPr>
+      <w:r>
+        <w:t xml:space="preserve">        page.get_by_role.return_value.filter.return_value.all.return_value=[]</w:t>
+      </w:r>
+    </w:p>
+    <w:p>
+      <w:pPr>
+        <w:pStyle w:val="SourceCode"/>
+      </w:pPr>
+      <w:r>
+        <w:t xml:space="preserve">        page.get_by_role.return_value.all.return_value=[]</w:t>
+      </w:r>
+    </w:p>
+    <w:p>
+      <w:pPr>
+        <w:pStyle w:val="SourceCode"/>
+      </w:pPr>
+      <w:r>
+        <w:t xml:space="preserve">        qianwen_browser.require_login_if_visible(page)</w:t>
+      </w:r>
+    </w:p>
+    <w:p>
+      <w:pPr>
+        <w:pStyle w:val="SourceCode"/>
+      </w:pPr>
+      <w:r>
+        <w:t xml:space="preserve">        for name in ('登录','登录/注册','立即登录'):</w:t>
+      </w:r>
+    </w:p>
+    <w:p>
+      <w:pPr>
+        <w:pStyle w:val="SourceCode"/>
+      </w:pPr>
+      <w:r>
+        <w:t xml:space="preserve">            page.get_by_role.assert_any_call('button',name=name,exact=True)</w:t>
+      </w:r>
+    </w:p>
+    <w:p>
+      <w:pPr>
+        <w:pStyle w:val="SourceCode"/>
+      </w:pPr>
+      <w:r/>
+    </w:p>
+    <w:p>
+      <w:pPr>
+        <w:pStyle w:val="SourceCode"/>
+      </w:pPr>
+      <w:r>
         <w:t>if __name__=='__main__':unittest.main()</w:t>
       </w:r>
     </w:p>
@@ -13426,7 +13504,7 @@
         <w:pStyle w:val="SourceCode"/>
       </w:pPr>
       <w:r>
-        <w:t xml:space="preserve">  "qianwen_browser.py": "cf35a52300ba890be471dad2b81181ef2bed6203a86236d26cdbaffec62d6302",</w:t>
+        <w:t xml:space="preserve">  "qianwen_browser.py": "f30408557e01d5ea5345f9d50e04cb5f9a1604a7178fa2bc1e444d752468d977",</w:t>
       </w:r>
     </w:p>
     <w:p>
@@ -13506,7 +13584,7 @@
         <w:pStyle w:val="SourceCode"/>
       </w:pPr>
       <w:r>
-        <w:t xml:space="preserve">  "test_task_controls.py": "7a07b1d54e383405a9914e69503319854a8cd543d7348c618e09a5744cc0ce30",</w:t>
+        <w:t xml:space="preserve">  "test_task_controls.py": "2a0d1da5b7de5a52a5d3c0257dd989341bccf00ba3cda5fd57fe98db25842644",</w:t>
       </w:r>
     </w:p>
     <w:p>

</xml_diff>

<commit_message>
Wait for Qianwen export panel options before checking layout
</commit_message>
<xml_diff>
--- a/安装与使用指南.docx
+++ b/安装与使用指南.docx
@@ -6236,7 +6236,15 @@
         <w:pStyle w:val="SourceCode"/>
       </w:pPr>
       <w:r>
-        <w:t xml:space="preserve">            panel = page.get_by_role('tooltip')</w:t>
+        <w:t xml:space="preserve">            panel = page.get_by_role('tooltip').filter(visible=True).first</w:t>
+      </w:r>
+    </w:p>
+    <w:p>
+      <w:pPr>
+        <w:pStyle w:val="SourceCode"/>
+      </w:pPr>
+      <w:r>
+        <w:t xml:space="preserve">            panel.wait_for(state='visible',timeout=15000)</w:t>
       </w:r>
     </w:p>
     <w:p>
@@ -6252,15 +6260,55 @@
         <w:pStyle w:val="SourceCode"/>
       </w:pPr>
       <w:r>
-        <w:t xml:space="preserve">            if checks.count() != 5:</w:t>
-      </w:r>
-    </w:p>
-    <w:p>
-      <w:pPr>
-        <w:pStyle w:val="SourceCode"/>
-      </w:pPr>
-      <w:r>
-        <w:t xml:space="preserve">                raise RuntimeError('千问导出界面已变化，停止导出并保留媒体')</w:t>
+        <w:t xml:space="preserve">            from playwright.sync_api import expect</w:t>
+      </w:r>
+    </w:p>
+    <w:p>
+      <w:pPr>
+        <w:pStyle w:val="SourceCode"/>
+      </w:pPr>
+      <w:r>
+        <w:t xml:space="preserve">            try:</w:t>
+      </w:r>
+    </w:p>
+    <w:p>
+      <w:pPr>
+        <w:pStyle w:val="SourceCode"/>
+      </w:pPr>
+      <w:r>
+        <w:t xml:space="preserve">                expect(checks).to_have_count(5,timeout=15000)</w:t>
+      </w:r>
+    </w:p>
+    <w:p>
+      <w:pPr>
+        <w:pStyle w:val="SourceCode"/>
+      </w:pPr>
+      <w:r>
+        <w:t xml:space="preserve">            except Exception as error:</w:t>
+      </w:r>
+    </w:p>
+    <w:p>
+      <w:pPr>
+        <w:pStyle w:val="SourceCode"/>
+      </w:pPr>
+      <w:r>
+        <w:t xml:space="preserve">                page.screenshot(path=str(job/'browser-diagnostic.png'),full_page=True)</w:t>
+      </w:r>
+    </w:p>
+    <w:p>
+      <w:pPr>
+        <w:pStyle w:val="SourceCode"/>
+      </w:pPr>
+      <w:r>
+        <w:t xml:space="preserve">                (job/'browser-diagnostic.txt').write_text(page.locator('body').inner_text())</w:t>
+      </w:r>
+    </w:p>
+    <w:p>
+      <w:pPr>
+        <w:pStyle w:val="SourceCode"/>
+      </w:pPr>
+      <w:r>
+        <w:t xml:space="preserve">                raise RuntimeError('千问导出选项未正确加载（实际 '+str(checks.count())+' 项），保留媒体以便重试') from error</w:t>
       </w:r>
     </w:p>
     <w:p>
@@ -13504,7 +13552,7 @@
         <w:pStyle w:val="SourceCode"/>
       </w:pPr>
       <w:r>
-        <w:t xml:space="preserve">  "qianwen_browser.py": "f30408557e01d5ea5345f9d50e04cb5f9a1604a7178fa2bc1e444d752468d977",</w:t>
+        <w:t xml:space="preserve">  "qianwen_browser.py": "6c1b9e88c87c6395a150cb3f6629026e7b7776bf53cd828aee0db44037854c5f",</w:t>
       </w:r>
     </w:p>
     <w:p>

</xml_diff>

<commit_message>
Replace obsolete local recognition status with cloud preparation status
</commit_message>
<xml_diff>
--- a/安装与使用指南.docx
+++ b/安装与使用指南.docx
@@ -3811,7 +3811,7 @@
         <w:pStyle w:val="SourceCode"/>
       </w:pPr>
       <w:r>
-        <w:t>const stages={queued:'排队中',downloading:'正在下载',downloaded:'下载完成',diarizing:'本地模型正在区分发言人',transcribing:'本地模型正在识别语音',cloud_transcribing:'千问正在后台识别语音',cloud_exporting:'正在导出千问原文 Word',completed:'Word 已生成，可以查看',login_required:'需要重新登录千问',failed:'处理失败，进度已保留'};</w:t>
+        <w:t>const stages={queued:'排队中',downloading:'正在下载',downloaded:'下载完成',diarizing:'正在准备千问识别',transcribing:'正在准备千问识别',cloud_preparing:'正在准备音频并连接千问',cloud_transcribing:'千问正在后台识别语音',cloud_exporting:'正在导出千问原文 Word',completed:'Word 已生成，可以查看',login_required:'需要重新登录千问',failed:'处理失败，进度已保留'};</w:t>
       </w:r>
     </w:p>
     <w:p>
@@ -3883,7 +3883,7 @@
         <w:pStyle w:val="SourceCode"/>
       </w:pPr>
       <w:r>
-        <w:t>async function refresh(){try{let jobs=await(await fetch('/jobs')).json();jobs.sort((a,b)=&gt;(b.created_at??historicalTaskTimes[b.id]??b.added_at??Infinity)-(a.created_at??historicalTaskTimes[a.id]??a.added_at??Infinity));let host=document.querySelector('#jobs');host.replaceChildren();for(let j of jobs){let card=document.createElement('article');let h=document.createElement('h2');h.textContent=taskHeading(j);card.append(h);let p=document.createElement('p');p.textContent=(j.document&amp;&amp;!j.has_document)?'Word 文件已不在原保存位置，重新提交链接可生成':(stages[j.state]||'准备生成文稿');if(j.state==='transcribing'&amp;&amp;j.transcribed_seconds)p.textContent+=' · '+Math.floor(j.transcribed_seconds/60)+' / '+Math.ceil(j.audio_duration/60)+' 分钟';card.append(p);card.append(link('原网页',j.url));if(j.error){let err=document.createElement('p');err.textContent=j.error;card.append(err)}if(j.cleanup_error){let note=document.createElement('p');note.textContent='Word 已生成，但部分临时文件未清理：'+j.cleanup_error;card.append(note)}if(j.has_document){let actions=document.createElement('p');actions.className='actions';actions.append(link('查看 Word 文稿','/preview/'+j.id,'action'));let reveal=document.createElement('button');reveal.type='button';reveal.className='secondary';reveal.textContent='打开文档所在位置';let revealStatus=document.createElement('small');revealStatus.setAttribute('role','status');reveal.onclick=async()=&gt;{reveal.disabled=true;revealStatus.textContent='正在打开文件夹…';try{await post('/reveal/'+j.id,{});revealStatus.textContent='已打开 Finder 文件夹。';msg.textContent='已打开文档所在的 Finder 文件夹。'}catch(e){revealStatus.textContent='打开失败：'+e.message;msg.textContent='打开失败：'+e.message}finally{reveal.disabled=false}};actions.append(reveal);actions.append(revealStatus);let download=link('下载 Word','/document/'+j.id,'action secondary');download.download=j.name+'.docx';actions.append(download);card.append(actions);let note=document.createElement('small');note.textContent=j.temporary_files_removed?(j.media_trashed?'原音视频已移入废纸篓，临时音轨已清理。':'原音视频与临时音轨已清理。'):'Word 内容未经人工校对。';card.append(note)}let controls=document.createElement('p');controls.className='actions';if(j.state==='failed'||j.state==='login_required'){let retry=document.createElement('button');retry.textContent='重试任务';retry.onclick=async()=&gt;{try{await post('/jobs',{url:j.url,engine:'qianwen'});await refresh()}catch(e){msg.textContent=e.message}};controls.append(retry)}let remove=document.createElement('button');remove.type='button';remove.className='secondary';remove.style.color='#a52222';remove.textContent='删除任务';remove.onclick=async()=&gt;{if(!confirm('删除“'+(j.title||j.id)+'”？将停止该任务，把本机任务文件和相关文稿移入废纸篓。千问云端记录需在千问网页中管理。'))return;remove.disabled=true;try{await requireControls();let r=await post('/delete/'+j.id,{});msg.textContent=r.message;await refresh()}catch(e){msg.textContent='删除失败：'+e.message;remove.disabled=false}};controls.append(remove);card.append(controls);host.append(card)}await refreshLogin()}catch(e){msg.textContent='后台连接中断，请重新启动工具。'}}</w:t>
+        <w:t>async function refresh(){try{let jobs=await(await fetch('/jobs')).json();jobs.sort((a,b)=&gt;(b.created_at??historicalTaskTimes[b.id]??b.added_at??Infinity)-(a.created_at??historicalTaskTimes[a.id]??a.added_at??Infinity));let host=document.querySelector('#jobs');host.replaceChildren();for(let j of jobs){let card=document.createElement('article');let h=document.createElement('h2');h.textContent=taskHeading(j);card.append(h);let p=document.createElement('p');p.textContent=(j.document&amp;&amp;!j.has_document)?'Word 文件已不在原保存位置，重新提交链接可生成':(stages[j.state]||'准备生成文稿');card.append(p);card.append(link('原网页',j.url));if(j.error){let err=document.createElement('p');err.textContent=j.error;card.append(err)}if(j.cleanup_error){let note=document.createElement('p');note.textContent='Word 已生成，但部分临时文件未清理：'+j.cleanup_error;card.append(note)}if(j.has_document){let actions=document.createElement('p');actions.className='actions';actions.append(link('查看 Word 文稿','/preview/'+j.id,'action'));let reveal=document.createElement('button');reveal.type='button';reveal.className='secondary';reveal.textContent='打开文档所在位置';let revealStatus=document.createElement('small');revealStatus.setAttribute('role','status');reveal.onclick=async()=&gt;{reveal.disabled=true;revealStatus.textContent='正在打开文件夹…';try{await post('/reveal/'+j.id,{});revealStatus.textContent='已打开 Finder 文件夹。';msg.textContent='已打开文档所在的 Finder 文件夹。'}catch(e){revealStatus.textContent='打开失败：'+e.message;msg.textContent='打开失败：'+e.message}finally{reveal.disabled=false}};actions.append(reveal);actions.append(revealStatus);let download=link('下载 Word','/document/'+j.id,'action secondary');download.download=j.name+'.docx';actions.append(download);card.append(actions);let note=document.createElement('small');note.textContent=j.temporary_files_removed?(j.media_trashed?'原音视频已移入废纸篓，临时音轨已清理。':'原音视频与临时音轨已清理。'):'Word 内容未经人工校对。';card.append(note)}let controls=document.createElement('p');controls.className='actions';if(j.state==='failed'||j.state==='login_required'){let retry=document.createElement('button');retry.textContent='重试任务';retry.onclick=async()=&gt;{try{await post('/jobs',{url:j.url,engine:'qianwen'});await refresh()}catch(e){msg.textContent=e.message}};controls.append(retry)}let remove=document.createElement('button');remove.type='button';remove.className='secondary';remove.style.color='#a52222';remove.textContent='删除任务';remove.onclick=async()=&gt;{if(!confirm('删除“'+(j.title||j.id)+'”？将停止该任务，把本机任务文件和相关文稿移入废纸篓。千问云端记录需在千问网页中管理。'))return;remove.disabled=true;try{await requireControls();let r=await post('/delete/'+j.id,{});msg.textContent=r.message;await refresh()}catch(e){msg.textContent='删除失败：'+e.message;remove.disabled=false}};controls.append(remove);card.append(controls);host.append(card)}await refreshLogin()}catch(e){msg.textContent='后台连接中断，请重新启动工具。'}}</w:t>
       </w:r>
     </w:p>
     <w:p>
@@ -7905,7 +7905,7 @@
         <w:pStyle w:val="SourceCode"/>
       </w:pPr>
       <w:r>
-        <w:t xml:space="preserve">            meta['state'] = 'transcribing'</w:t>
+        <w:t xml:space="preserve">            meta['state'] = 'cloud_preparing'</w:t>
       </w:r>
     </w:p>
     <w:p>
@@ -14139,7 +14139,7 @@
         <w:pStyle w:val="SourceCode"/>
       </w:pPr>
       <w:r>
-        <w:t xml:space="preserve">  "index.html": "05131b2ec6b632fdfcb5da59d1fbd08a08591958b20a491857c6ba61f1ece0f2",</w:t>
+        <w:t xml:space="preserve">  "index.html": "b5ec31b060876e6d4eef303943a81d9321b354c322afc5097a16afda4cbbbca9",</w:t>
       </w:r>
     </w:p>
     <w:p>
@@ -14203,7 +14203,7 @@
         <w:pStyle w:val="SourceCode"/>
       </w:pPr>
       <w:r>
-        <w:t xml:space="preserve">  "reader.py": "8f34a3a569cbaaddbe60e685d5ffba6fbcb115adb25516fdf20a097e9132c0cb",</w:t>
+        <w:t xml:space="preserve">  "reader.py": "616bada6fec387b086514c859cd2f90fa578029507ebfca8b25408c58fafc2a5",</w:t>
       </w:r>
     </w:p>
     <w:p>

</xml_diff>

<commit_message>
Replace duplicate Word download action with delete task
</commit_message>
<xml_diff>
--- a/安装与使用指南.docx
+++ b/安装与使用指南.docx
@@ -84,7 +84,7 @@
     </w:p>
     <w:p>
       <w:r>
-        <w:t>每条任务的“删除任务”会停止该任务，将相关本机文件、已完成和未完成 Word、任务记录移入废纸篓；千问云端记录自行管理。模型和登录信息不会上传 GitHub。</w:t>
+        <w:t>已完成任务的“删除任务”与“查看 Word 文稿”“打开文档所在位置”同排，不再提供重复下载按钮。每条任务的“删除任务”会停止该任务，将相关本机文件、已完成和未完成 Word、任务记录移入废纸篓；千问云端记录自行管理。模型和登录信息不会上传 GitHub。</w:t>
       </w:r>
     </w:p>
     <w:p>
@@ -3883,7 +3883,7 @@
         <w:pStyle w:val="SourceCode"/>
       </w:pPr>
       <w:r>
-        <w:t>async function refresh(){try{let jobs=await(await fetch('/jobs')).json();jobs.sort((a,b)=&gt;(b.created_at??historicalTaskTimes[b.id]??b.added_at??Infinity)-(a.created_at??historicalTaskTimes[a.id]??a.added_at??Infinity));let host=document.querySelector('#jobs');host.replaceChildren();for(let j of jobs){let card=document.createElement('article');let h=document.createElement('h2');h.textContent=taskHeading(j);card.append(h);let p=document.createElement('p');p.textContent=(j.document&amp;&amp;!j.has_document)?'Word 文件已不在原保存位置，重新提交链接可生成':(stages[j.state]||'准备生成文稿');card.append(p);card.append(link('原网页',j.url));if(j.error){let err=document.createElement('p');err.textContent=j.error;card.append(err)}if(j.cleanup_error){let note=document.createElement('p');note.textContent='Word 已生成，但部分临时文件未清理：'+j.cleanup_error;card.append(note)}if(j.has_document){let actions=document.createElement('p');actions.className='actions';actions.append(link('查看 Word 文稿','/preview/'+j.id,'action'));let reveal=document.createElement('button');reveal.type='button';reveal.className='secondary';reveal.textContent='打开文档所在位置';let revealStatus=document.createElement('small');revealStatus.setAttribute('role','status');reveal.onclick=async()=&gt;{reveal.disabled=true;revealStatus.textContent='正在打开文件夹…';try{await post('/reveal/'+j.id,{});revealStatus.textContent='已打开 Finder 文件夹。';msg.textContent='已打开文档所在的 Finder 文件夹。'}catch(e){revealStatus.textContent='打开失败：'+e.message;msg.textContent='打开失败：'+e.message}finally{reveal.disabled=false}};actions.append(reveal);actions.append(revealStatus);let download=link('下载 Word','/document/'+j.id,'action secondary');download.download=j.name+'.docx';actions.append(download);card.append(actions);let note=document.createElement('small');note.textContent=j.temporary_files_removed?(j.media_trashed?'原音视频已移入废纸篓，临时音轨已清理。':'原音视频与临时音轨已清理。'):'Word 内容未经人工校对。';card.append(note)}let controls=document.createElement('p');controls.className='actions';if(j.state==='failed'||j.state==='login_required'){let retry=document.createElement('button');retry.textContent='重试任务';retry.onclick=async()=&gt;{try{await post('/jobs',{url:j.url,engine:'qianwen'});await refresh()}catch(e){msg.textContent=e.message}};controls.append(retry)}let remove=document.createElement('button');remove.type='button';remove.className='secondary';remove.style.color='#a52222';remove.textContent='删除任务';remove.onclick=async()=&gt;{if(!confirm('删除“'+(j.title||j.id)+'”？将停止该任务，把本机任务文件和相关文稿移入废纸篓。千问云端记录需在千问网页中管理。'))return;remove.disabled=true;try{await requireControls();let r=await post('/delete/'+j.id,{});msg.textContent=r.message;await refresh()}catch(e){msg.textContent='删除失败：'+e.message;remove.disabled=false}};controls.append(remove);card.append(controls);host.append(card)}await refreshLogin()}catch(e){msg.textContent='后台连接中断，请重新启动工具。'}}</w:t>
+        <w:t>async function refresh(){try{let jobs=await(await fetch('/jobs')).json();jobs.sort((a,b)=&gt;(b.created_at??historicalTaskTimes[b.id]??b.added_at??Infinity)-(a.created_at??historicalTaskTimes[a.id]??a.added_at??Infinity));let host=document.querySelector('#jobs');host.replaceChildren();for(let j of jobs){let card=document.createElement('article');let h=document.createElement('h2');h.textContent=taskHeading(j);card.append(h);let p=document.createElement('p');p.textContent=(j.document&amp;&amp;!j.has_document)?'Word 文件已不在原保存位置，重新提交链接可生成':(stages[j.state]||'准备生成文稿');card.append(p);card.append(link('原网页',j.url));if(j.error){let err=document.createElement('p');err.textContent=j.error;card.append(err)}if(j.cleanup_error){let note=document.createElement('p');note.textContent='Word 已生成，但部分临时文件未清理：'+j.cleanup_error;card.append(note)}if(j.has_document){let actions=document.createElement('p');actions.className='actions';actions.append(link('查看 Word 文稿','/preview/'+j.id,'action'));let reveal=document.createElement('button');reveal.type='button';reveal.className='secondary';reveal.textContent='打开文档所在位置';let revealStatus=document.createElement('small');revealStatus.setAttribute('role','status');reveal.onclick=async()=&gt;{reveal.disabled=true;revealStatus.textContent='正在打开文件夹…';try{await post('/reveal/'+j.id,{});revealStatus.textContent='已打开 Finder 文件夹。';msg.textContent='已打开文档所在的 Finder 文件夹。'}catch(e){revealStatus.textContent='打开失败：'+e.message;msg.textContent='打开失败：'+e.message}finally{reveal.disabled=false}};actions.append(reveal);actions.append(revealStatus);card.append(actions);let note=document.createElement('small');note.textContent=j.temporary_files_removed?(j.media_trashed?'原音视频已移入废纸篓，临时音轨已清理。':'原音视频与临时音轨已清理。'):'Word 内容未经人工校对。';card.append(note)}let controls=document.createElement('p');controls.className='actions';if(j.state==='failed'||j.state==='login_required'){let retry=document.createElement('button');retry.textContent='重试任务';retry.onclick=async()=&gt;{try{await post('/jobs',{url:j.url,engine:'qianwen'});await refresh()}catch(e){msg.textContent=e.message}};controls.append(retry)}let remove=document.createElement('button');remove.type='button';remove.className='secondary';remove.style.color='#a52222';remove.textContent='删除任务';remove.onclick=async()=&gt;{if(!confirm('删除“'+(j.title||j.id)+'”？将停止该任务，把本机任务文件和相关文稿移入废纸篓。千问云端记录需在千问网页中管理。'))return;remove.disabled=true;try{await requireControls();let r=await post('/delete/'+j.id,{});msg.textContent=r.message;await refresh()}catch(e){msg.textContent='删除失败：'+e.message;remove.disabled=false}};if(j.has_document){card.querySelector('.actions').append(remove)}else{controls.append(remove)}if(controls.children.length)card.append(controls);host.append(card)}await refreshLogin()}catch(e){msg.textContent='后台连接中断，请重新启动工具。'}}</w:t>
       </w:r>
     </w:p>
     <w:p>
@@ -14139,7 +14139,7 @@
         <w:pStyle w:val="SourceCode"/>
       </w:pPr>
       <w:r>
-        <w:t xml:space="preserve">  "index.html": "b5ec31b060876e6d4eef303943a81d9321b354c322afc5097a16afda4cbbbca9",</w:t>
+        <w:t xml:space="preserve">  "index.html": "447628199c3397c6dde8702bcd331fa9de639e660daf6ae4a1a8a91abfb4aabd",</w:t>
       </w:r>
     </w:p>
     <w:p>

</xml_diff>

<commit_message>
Clear URL input after successful task submission
</commit_message>
<xml_diff>
--- a/安装与使用指南.docx
+++ b/安装与使用指南.docx
@@ -46,7 +46,7 @@
     </w:p>
     <w:p>
       <w:r>
-        <w:t>3. 粘贴 YouTube、哔哩哔哩等视频页面链接，点击橙色“开始生成文稿”。</w:t>
+        <w:t>3. 粘贴 YouTube、哔哩哔哩等视频页面链接，点击橙色“开始生成文稿”。任务添加成功后链接框自动清空，可继续粘贴下一条；提交失败时保留链接。</w:t>
       </w:r>
     </w:p>
     <w:p>
@@ -3859,7 +3859,7 @@
         <w:pStyle w:val="SourceCode"/>
       </w:pPr>
       <w:r>
-        <w:t>document.querySelector('#form').onsubmit=async e=&gt;{e.preventDefault();try{if('qianwen'==='qianwen'){let health=await(await fetch('/health')).json();if(!health.engines?.includes('qianwen'))throw Error('网页服务需要加载新版。请完成千问登录配置后再试。')}await post('/jobs',{url:document.querySelector('#url').value,engine:'qianwen'});msg.textContent='已加入后台队列。你可以继续做其他事情，稍后回来查看文稿。';await refresh()}catch(e){msg.textContent=e.message}};</w:t>
+        <w:t>document.querySelector('#form').onsubmit=async e=&gt;{e.preventDefault();try{if('qianwen'==='qianwen'){let health=await(await fetch('/health')).json();if(!health.engines?.includes('qianwen'))throw Error('网页服务需要加载新版。请完成千问登录配置后再试。')}await post('/jobs',{url:document.querySelector('#url').value,engine:'qianwen'});document.querySelector('#url').value='';msg.textContent='已加入后台队列。你可以继续做其他事情，稍后回来查看文稿。';await refresh()}catch(e){msg.textContent=e.message}};</w:t>
       </w:r>
     </w:p>
     <w:p>
@@ -14139,7 +14139,7 @@
         <w:pStyle w:val="SourceCode"/>
       </w:pPr>
       <w:r>
-        <w:t xml:space="preserve">  "index.html": "447628199c3397c6dde8702bcd331fa9de639e660daf6ae4a1a8a91abfb4aabd",</w:t>
+        <w:t xml:space="preserve">  "index.html": "c2cd0c55ef39c598df3cf3ce9734dd5738e84378c25999fa5254d35c4e3d4d8f",</w:t>
       </w:r>
     </w:p>
     <w:p>

</xml_diff>

<commit_message>
Disable URL input autocomplete history
</commit_message>
<xml_diff>
--- a/安装与使用指南.docx
+++ b/安装与使用指南.docx
@@ -46,7 +46,7 @@
     </w:p>
     <w:p>
       <w:r>
-        <w:t>3. 粘贴 YouTube、哔哩哔哩等视频页面链接，点击橙色“开始生成文稿”。任务添加成功后链接框自动清空，可继续粘贴下一条；提交失败时保留链接。</w:t>
+        <w:t>3. 粘贴 YouTube、哔哩哔哩等视频页面链接，点击橙色“开始生成文稿”。任务添加成功后链接框自动清空，可继续粘贴下一条；提交失败时保留链接。链接输入框关闭浏览器历史自动填充。</w:t>
       </w:r>
     </w:p>
     <w:p>
@@ -3755,7 +3755,7 @@
         <w:pStyle w:val="SourceCode"/>
       </w:pPr>
       <w:r>
-        <w:t>&lt;form id="form"&gt;&lt;input id="url" aria-label="音视频网页链接" type="url" required placeholder="粘贴 YouTube、哔哩哔哩等音视频网页链接"&gt;&lt;button&gt;开始生成文稿&lt;/button&gt;&lt;/form&gt;</w:t>
+        <w:t>&lt;form id="form" autocomplete="off"&gt;&lt;input id="url" autocomplete="off" aria-label="音视频网页链接" type="url" required placeholder="粘贴 YouTube、哔哩哔哩等音视频网页链接"&gt;&lt;button&gt;开始生成文稿&lt;/button&gt;&lt;/form&gt;</w:t>
       </w:r>
     </w:p>
     <w:p>
@@ -14139,7 +14139,7 @@
         <w:pStyle w:val="SourceCode"/>
       </w:pPr>
       <w:r>
-        <w:t xml:space="preserve">  "index.html": "c2cd0c55ef39c598df3cf3ce9734dd5738e84378c25999fa5254d35c4e3d4d8f",</w:t>
+        <w:t xml:space="preserve">  "index.html": "bc0041386bbc0a09ca620c3f6eec8711e1eaf5646b89291d6d7eded8932b417b",</w:t>
       </w:r>
     </w:p>
     <w:p>

</xml_diff>

<commit_message>
Report missing audio tracks clearly and test real media extraction
</commit_message>
<xml_diff>
--- a/安装与使用指南.docx
+++ b/安装与使用指南.docx
@@ -193,6 +193,19 @@
         <w:pStyle w:val="Heading1"/>
       </w:pPr>
       <w:r>
+        <w:t>无声视频</w:t>
+      </w:r>
+    </w:p>
+    <w:p>
+      <w:r>
+        <w:t>下载文件如果没有音轨，不能做语音识别。工具明确提示并保留媒体；如果网页播放有声音，请提供有声音的版本。工具不会把画面上的文字当作语音识别结果。</w:t>
+      </w:r>
+    </w:p>
+    <w:p>
+      <w:pPr>
+        <w:pStyle w:val="Heading1"/>
+      </w:pPr>
+      <w:r>
         <w:t>限制与隐私</w:t>
       </w:r>
     </w:p>
@@ -280,7 +293,7 @@
     </w:p>
     <w:p>
       <w:r>
-        <w:t>本次 24 项测试通过，其中云端识别返回结果在单元测试中模拟；旧本地推理断点测试已移除。此前本机20秒音频的千问后台完整流程约46秒，不能推断长视频速度或识别准确率。未在另一台全新 Mac 完成安装实测。</w:t>
+        <w:t>本次 26 项测试通过，其中云端识别返回结果在单元测试中模拟；旧本地推理断点测试已移除。此前本机20秒音频的千问后台完整流程约46秒，不能推断长视频速度或识别准确率。未在另一台全新 Mac 完成安装实测。</w:t>
       </w:r>
     </w:p>
     <w:p>
@@ -7281,6 +7294,90 @@
         <w:pStyle w:val="SourceCode"/>
       </w:pPr>
       <w:r>
+        <w:t>def extract_audio(executable,media,destination):</w:t>
+      </w:r>
+    </w:p>
+    <w:p>
+      <w:pPr>
+        <w:pStyle w:val="SourceCode"/>
+      </w:pPr>
+      <w:r>
+        <w:t xml:space="preserve">    result=subprocess.run([executable,'-nostdin','-v','error','-y','-i',str(media),</w:t>
+      </w:r>
+    </w:p>
+    <w:p>
+      <w:pPr>
+        <w:pStyle w:val="SourceCode"/>
+      </w:pPr>
+      <w:r>
+        <w:t xml:space="preserve">                           '-vn','-ac','1','-ar','16000','-c:a','pcm_s16le',str(destination)],</w:t>
+      </w:r>
+    </w:p>
+    <w:p>
+      <w:pPr>
+        <w:pStyle w:val="SourceCode"/>
+      </w:pPr>
+      <w:r>
+        <w:t xml:space="preserve">                          capture_output=True,text=True)</w:t>
+      </w:r>
+    </w:p>
+    <w:p>
+      <w:pPr>
+        <w:pStyle w:val="SourceCode"/>
+      </w:pPr>
+      <w:r>
+        <w:t xml:space="preserve">    if result.returncode:</w:t>
+      </w:r>
+    </w:p>
+    <w:p>
+      <w:pPr>
+        <w:pStyle w:val="SourceCode"/>
+      </w:pPr>
+      <w:r>
+        <w:t xml:space="preserve">        destination.unlink(missing_ok=True)</w:t>
+      </w:r>
+    </w:p>
+    <w:p>
+      <w:pPr>
+        <w:pStyle w:val="SourceCode"/>
+      </w:pPr>
+      <w:r>
+        <w:t xml:space="preserve">        if 'does not contain any stream' in result.stderr:</w:t>
+      </w:r>
+    </w:p>
+    <w:p>
+      <w:pPr>
+        <w:pStyle w:val="SourceCode"/>
+      </w:pPr>
+      <w:r>
+        <w:t xml:space="preserve">            raise ValueError('下载的视频没有音轨，无法生成语音文字稿。原视频已保留；如果原网页播放时有声音，请提供其他有声音的视频版本。')</w:t>
+      </w:r>
+    </w:p>
+    <w:p>
+      <w:pPr>
+        <w:pStyle w:val="SourceCode"/>
+      </w:pPr>
+      <w:r>
+        <w:t xml:space="preserve">        raise ValueError('音频提取失败，原视频已保留。转换器提示：'+result.stderr.strip()[-600:])</w:t>
+      </w:r>
+    </w:p>
+    <w:p>
+      <w:pPr>
+        <w:pStyle w:val="SourceCode"/>
+      </w:pPr>
+      <w:r/>
+    </w:p>
+    <w:p>
+      <w:pPr>
+        <w:pStyle w:val="SourceCode"/>
+      </w:pPr>
+      <w:r/>
+    </w:p>
+    <w:p>
+      <w:pPr>
+        <w:pStyle w:val="SourceCode"/>
+      </w:pPr>
+      <w:r>
         <w:t>def prepare(args):</w:t>
       </w:r>
     </w:p>
@@ -7817,23 +7914,7 @@
         <w:pStyle w:val="SourceCode"/>
       </w:pPr>
       <w:r>
-        <w:t xml:space="preserve">                subprocess.run([ff, '-nostdin', '-v', 'error', '-y', '-i', meta['media'],</w:t>
-      </w:r>
-    </w:p>
-    <w:p>
-      <w:pPr>
-        <w:pStyle w:val="SourceCode"/>
-      </w:pPr>
-      <w:r>
-        <w:t xml:space="preserve">                                '-vn', '-ac', '1', '-ar', '16000', '-c:a', 'pcm_s16le',</w:t>
-      </w:r>
-    </w:p>
-    <w:p>
-      <w:pPr>
-        <w:pStyle w:val="SourceCode"/>
-      </w:pPr>
-      <w:r>
-        <w:t xml:space="preserve">                                str(partial)], check=True)</w:t>
+        <w:t xml:space="preserve">                extract_audio(ff,Path(meta['media']),partial)</w:t>
       </w:r>
     </w:p>
     <w:p>
@@ -12952,6 +13033,186 @@
     </w:p>
     <w:p>
       <w:pPr>
+        <w:pStyle w:val="SourceCode"/>
+      </w:pPr>
+      <w:r>
+        <w:t>class AudioExtractionTests(unittest.TestCase):</w:t>
+      </w:r>
+    </w:p>
+    <w:p>
+      <w:pPr>
+        <w:pStyle w:val="SourceCode"/>
+      </w:pPr>
+      <w:r>
+        <w:t xml:space="preserve">    def test_real_silent_video_gives_readable_error_and_preserves_source(self):</w:t>
+      </w:r>
+    </w:p>
+    <w:p>
+      <w:pPr>
+        <w:pStyle w:val="SourceCode"/>
+      </w:pPr>
+      <w:r>
+        <w:t xml:space="preserve">        import subprocess,imageio_ffmpeg</w:t>
+      </w:r>
+    </w:p>
+    <w:p>
+      <w:pPr>
+        <w:pStyle w:val="SourceCode"/>
+      </w:pPr>
+      <w:r>
+        <w:t xml:space="preserve">        with tempfile.TemporaryDirectory() as tmp:</w:t>
+      </w:r>
+    </w:p>
+    <w:p>
+      <w:pPr>
+        <w:pStyle w:val="SourceCode"/>
+      </w:pPr>
+      <w:r>
+        <w:t xml:space="preserve">            folder=Path(tmp);source=folder/'silent.mp4';target=folder/'temporary.wav'</w:t>
+      </w:r>
+    </w:p>
+    <w:p>
+      <w:pPr>
+        <w:pStyle w:val="SourceCode"/>
+      </w:pPr>
+      <w:r>
+        <w:t xml:space="preserve">            executable=imageio_ffmpeg.get_ffmpeg_exe()</w:t>
+      </w:r>
+    </w:p>
+    <w:p>
+      <w:pPr>
+        <w:pStyle w:val="SourceCode"/>
+      </w:pPr>
+      <w:r>
+        <w:t xml:space="preserve">            subprocess.run([executable,'-v','error','-f','lavfi','-i','color=size=16x16:rate=1','-t','1','-an',str(source)],check=True)</w:t>
+      </w:r>
+    </w:p>
+    <w:p>
+      <w:pPr>
+        <w:pStyle w:val="SourceCode"/>
+      </w:pPr>
+      <w:r>
+        <w:t xml:space="preserve">            with self.assertRaisesRegex(ValueError,'没有音轨'):</w:t>
+      </w:r>
+    </w:p>
+    <w:p>
+      <w:pPr>
+        <w:pStyle w:val="SourceCode"/>
+      </w:pPr>
+      <w:r>
+        <w:t xml:space="preserve">                reader.extract_audio(executable,source,target)</w:t>
+      </w:r>
+    </w:p>
+    <w:p>
+      <w:pPr>
+        <w:pStyle w:val="SourceCode"/>
+      </w:pPr>
+      <w:r>
+        <w:t xml:space="preserve">            self.assertTrue(source.exists());self.assertFalse(target.exists())</w:t>
+      </w:r>
+    </w:p>
+    <w:p>
+      <w:pPr>
+        <w:pStyle w:val="SourceCode"/>
+      </w:pPr>
+      <w:r/>
+    </w:p>
+    <w:p>
+      <w:pPr>
+        <w:pStyle w:val="SourceCode"/>
+      </w:pPr>
+      <w:r>
+        <w:t xml:space="preserve">    def test_real_audio_extracts_readable_wave(self):</w:t>
+      </w:r>
+    </w:p>
+    <w:p>
+      <w:pPr>
+        <w:pStyle w:val="SourceCode"/>
+      </w:pPr>
+      <w:r>
+        <w:t xml:space="preserve">        import subprocess,imageio_ffmpeg</w:t>
+      </w:r>
+    </w:p>
+    <w:p>
+      <w:pPr>
+        <w:pStyle w:val="SourceCode"/>
+      </w:pPr>
+      <w:r>
+        <w:t xml:space="preserve">        with tempfile.TemporaryDirectory() as tmp:</w:t>
+      </w:r>
+    </w:p>
+    <w:p>
+      <w:pPr>
+        <w:pStyle w:val="SourceCode"/>
+      </w:pPr>
+      <w:r>
+        <w:t xml:space="preserve">            folder=Path(tmp);source=folder/'sound.wav';target=folder/'temporary.wav'</w:t>
+      </w:r>
+    </w:p>
+    <w:p>
+      <w:pPr>
+        <w:pStyle w:val="SourceCode"/>
+      </w:pPr>
+      <w:r>
+        <w:t xml:space="preserve">            executable=imageio_ffmpeg.get_ffmpeg_exe()</w:t>
+      </w:r>
+    </w:p>
+    <w:p>
+      <w:pPr>
+        <w:pStyle w:val="SourceCode"/>
+      </w:pPr>
+      <w:r>
+        <w:t xml:space="preserve">            subprocess.run([executable,'-v','error','-f','lavfi','-i','sine=frequency=440:duration=1',str(source)],check=True)</w:t>
+      </w:r>
+    </w:p>
+    <w:p>
+      <w:pPr>
+        <w:pStyle w:val="SourceCode"/>
+      </w:pPr>
+      <w:r>
+        <w:t xml:space="preserve">            reader.extract_audio(executable,source,target)</w:t>
+      </w:r>
+    </w:p>
+    <w:p>
+      <w:pPr>
+        <w:pStyle w:val="SourceCode"/>
+      </w:pPr>
+      <w:r>
+        <w:t xml:space="preserve">            with wave.open(str(target)) as audio:</w:t>
+      </w:r>
+    </w:p>
+    <w:p>
+      <w:pPr>
+        <w:pStyle w:val="SourceCode"/>
+      </w:pPr>
+      <w:r>
+        <w:t xml:space="preserve">                self.assertEqual(audio.getframerate(),16000)</w:t>
+      </w:r>
+    </w:p>
+    <w:p>
+      <w:pPr>
+        <w:pStyle w:val="SourceCode"/>
+      </w:pPr>
+      <w:r>
+        <w:t xml:space="preserve">                self.assertEqual(audio.getnchannels(),1)</w:t>
+      </w:r>
+    </w:p>
+    <w:p>
+      <w:pPr>
+        <w:pStyle w:val="SourceCode"/>
+      </w:pPr>
+      <w:r>
+        <w:t xml:space="preserve">                self.assertGreater(audio.getnframes(),0)</w:t>
+      </w:r>
+    </w:p>
+    <w:p>
+      <w:pPr>
+        <w:pStyle w:val="SourceCode"/>
+      </w:pPr>
+      <w:r/>
+    </w:p>
+    <w:p>
+      <w:pPr>
         <w:pStyle w:val="Heading2"/>
       </w:pPr>
       <w:r>
@@ -14107,7 +14368,7 @@
         <w:pStyle w:val="SourceCode"/>
       </w:pPr>
       <w:r>
-        <w:t xml:space="preserve">  "test_reader.py": "71fc155ea2c8eef538b119ee78a2a63118c02308aadde680f6f483829d036626",</w:t>
+        <w:t xml:space="preserve">  "test_reader.py": "cff139029d75e464f25a84e9f8e0283df6827691c1e125186fd1c82721ec4200",</w:t>
       </w:r>
     </w:p>
     <w:p>
@@ -14203,7 +14464,7 @@
         <w:pStyle w:val="SourceCode"/>
       </w:pPr>
       <w:r>
-        <w:t xml:space="preserve">  "reader.py": "616bada6fec387b086514c859cd2f90fa578029507ebfca8b25408c58fafc2a5",</w:t>
+        <w:t xml:space="preserve">  "reader.py": "480fb1b02df11b9d4b6f1cb8da486b6bf92ba6e3ac6095951cff5a7155c814bc",</w:t>
       </w:r>
     </w:p>
     <w:p>

</xml_diff>

<commit_message>
Normalize Douyin selected-video links and explain cookie restrictions
</commit_message>
<xml_diff>
--- a/安装与使用指南.docx
+++ b/安装与使用指南.docx
@@ -193,6 +193,19 @@
         <w:pStyle w:val="Heading1"/>
       </w:pPr>
       <w:r>
+        <w:t>抖音链接</w:t>
+      </w:r>
+    </w:p>
+    <w:p>
+      <w:r>
+        <w:t>精选页中包含数字 modal_id 的链接会转换成 /video/视频编号 供下载器使用，Word 保留用户原链接。抖音仍可能要求有效浏览器 Cookie 并拒绝自动下载；转换链接不保证成功。当前页面没有抖音登录配置，不读取日常浏览器 Cookie，不绕过访问限制。</w:t>
+      </w:r>
+    </w:p>
+    <w:p>
+      <w:pPr>
+        <w:pStyle w:val="Heading1"/>
+      </w:pPr>
+      <w:r>
         <w:t>无声视频</w:t>
       </w:r>
     </w:p>
@@ -293,7 +306,7 @@
     </w:p>
     <w:p>
       <w:r>
-        <w:t>本次 26 项测试通过，其中云端识别返回结果在单元测试中模拟；旧本地推理断点测试已移除。此前本机20秒音频的千问后台完整流程约46秒，不能推断长视频速度或识别准确率。未在另一台全新 Mac 完成安装实测。</w:t>
+        <w:t>本次 29 项测试通过，其中云端识别返回结果在单元测试中模拟；旧本地推理断点测试已移除。此前本机20秒音频的千问后台完整流程约46秒，不能推断长视频速度或识别准确率。未在另一台全新 Mac 完成安装实测。</w:t>
       </w:r>
     </w:p>
     <w:p>
@@ -450,7 +463,7 @@
         <w:pStyle w:val="SourceCode"/>
       </w:pPr>
       <w:r>
-        <w:t>from reader import ROOT, WORK, OUTPUT, LEGACY_OUTPUT, NOTICE, save_json</w:t>
+        <w:t>from reader import ROOT, WORK, OUTPUT, LEGACY_OUTPUT, NOTICE, save_json, download_url</w:t>
       </w:r>
     </w:p>
     <w:p>
@@ -918,7 +931,7 @@
         <w:pStyle w:val="SourceCode"/>
       </w:pPr>
       <w:r>
-        <w:t xml:space="preserve">             '--socket-timeout', '8', '--retries', '0', '--print', 'title', url],</w:t>
+        <w:t xml:space="preserve">             '--socket-timeout', '8', '--retries', '0', '--print', 'title', download_url(url)],</w:t>
       </w:r>
     </w:p>
     <w:p>
@@ -7294,6 +7307,82 @@
         <w:pStyle w:val="SourceCode"/>
       </w:pPr>
       <w:r>
+        <w:t>def download_url(url):</w:t>
+      </w:r>
+    </w:p>
+    <w:p>
+      <w:pPr>
+        <w:pStyle w:val="SourceCode"/>
+      </w:pPr>
+      <w:r>
+        <w:t xml:space="preserve">    """Normalize Douyin modal pages without changing the source link in the document."""</w:t>
+      </w:r>
+    </w:p>
+    <w:p>
+      <w:pPr>
+        <w:pStyle w:val="SourceCode"/>
+      </w:pPr>
+      <w:r>
+        <w:t xml:space="preserve">    from urllib.parse import urlparse,parse_qs</w:t>
+      </w:r>
+    </w:p>
+    <w:p>
+      <w:pPr>
+        <w:pStyle w:val="SourceCode"/>
+      </w:pPr>
+      <w:r>
+        <w:t xml:space="preserve">    parts=urlparse(url)</w:t>
+      </w:r>
+    </w:p>
+    <w:p>
+      <w:pPr>
+        <w:pStyle w:val="SourceCode"/>
+      </w:pPr>
+      <w:r>
+        <w:t xml:space="preserve">    if parts.hostname in ('douyin.com','www.douyin.com'):</w:t>
+      </w:r>
+    </w:p>
+    <w:p>
+      <w:pPr>
+        <w:pStyle w:val="SourceCode"/>
+      </w:pPr>
+      <w:r>
+        <w:t xml:space="preserve">        ident=parse_qs(parts.query).get('modal_id',[''])[0]</w:t>
+      </w:r>
+    </w:p>
+    <w:p>
+      <w:pPr>
+        <w:pStyle w:val="SourceCode"/>
+      </w:pPr>
+      <w:r>
+        <w:t xml:space="preserve">        if re.fullmatch(r'[0-9]+',ident):return 'https://www.douyin.com/video/'+ident</w:t>
+      </w:r>
+    </w:p>
+    <w:p>
+      <w:pPr>
+        <w:pStyle w:val="SourceCode"/>
+      </w:pPr>
+      <w:r>
+        <w:t xml:space="preserve">    return url</w:t>
+      </w:r>
+    </w:p>
+    <w:p>
+      <w:pPr>
+        <w:pStyle w:val="SourceCode"/>
+      </w:pPr>
+      <w:r/>
+    </w:p>
+    <w:p>
+      <w:pPr>
+        <w:pStyle w:val="SourceCode"/>
+      </w:pPr>
+      <w:r/>
+    </w:p>
+    <w:p>
+      <w:pPr>
+        <w:pStyle w:val="SourceCode"/>
+      </w:pPr>
+      <w:r>
         <w:t>def extract_audio(executable,media,destination):</w:t>
       </w:r>
     </w:p>
@@ -7762,7 +7851,7 @@
         <w:pStyle w:val="SourceCode"/>
       </w:pPr>
       <w:r>
-        <w:t xml:space="preserve">                    info = downloader.extract_info(args.url, download=True)</w:t>
+        <w:t xml:space="preserve">                    info = downloader.extract_info(download_url(args.url), download=True)</w:t>
       </w:r>
     </w:p>
     <w:p>
@@ -8098,7 +8187,31 @@
         <w:pStyle w:val="SourceCode"/>
       </w:pPr>
       <w:r>
-        <w:t xml:space="preserve">            meta.update(state='login_required' if isinstance(error,LoginRequired) else 'failed', error=str(error))</w:t>
+        <w:t xml:space="preserve">            message=str(error)</w:t>
+      </w:r>
+    </w:p>
+    <w:p>
+      <w:pPr>
+        <w:pStyle w:val="SourceCode"/>
+      </w:pPr>
+      <w:r>
+        <w:t xml:space="preserve">            if 'Fresh cookies' in message and 'Douyin' in message:</w:t>
+      </w:r>
+    </w:p>
+    <w:p>
+      <w:pPr>
+        <w:pStyle w:val="SourceCode"/>
+      </w:pPr>
+      <w:r>
+        <w:t xml:space="preserve">                message='抖音限制了自动下载，需要有效的抖音浏览器 Cookie。精选页链接已转换成单视频地址，但尚未下载成功；千问转写尚未开始。'</w:t>
+      </w:r>
+    </w:p>
+    <w:p>
+      <w:pPr>
+        <w:pStyle w:val="SourceCode"/>
+      </w:pPr>
+      <w:r>
+        <w:t xml:space="preserve">            meta.update(state='login_required' if isinstance(error,LoginRequired) else 'failed', error=message)</w:t>
       </w:r>
     </w:p>
     <w:p>
@@ -13213,6 +13326,92 @@
     </w:p>
     <w:p>
       <w:pPr>
+        <w:pStyle w:val="SourceCode"/>
+      </w:pPr>
+      <w:r>
+        <w:t>class DownloadLinkTests(unittest.TestCase):</w:t>
+      </w:r>
+    </w:p>
+    <w:p>
+      <w:pPr>
+        <w:pStyle w:val="SourceCode"/>
+      </w:pPr>
+      <w:r>
+        <w:t xml:space="preserve">    def test_douyin_selected_video_is_normalized(self):</w:t>
+      </w:r>
+    </w:p>
+    <w:p>
+      <w:pPr>
+        <w:pStyle w:val="SourceCode"/>
+      </w:pPr>
+      <w:r>
+        <w:t xml:space="preserve">        source='https://www.douyin.com/jingxuan?modal_id=7689068026368380196'</w:t>
+      </w:r>
+    </w:p>
+    <w:p>
+      <w:pPr>
+        <w:pStyle w:val="SourceCode"/>
+      </w:pPr>
+      <w:r>
+        <w:t xml:space="preserve">        self.assertEqual(reader.download_url(source),'https://www.douyin.com/video/7689068026368380196')</w:t>
+      </w:r>
+    </w:p>
+    <w:p>
+      <w:pPr>
+        <w:pStyle w:val="SourceCode"/>
+      </w:pPr>
+      <w:r>
+        <w:t xml:space="preserve">    def test_other_site_modal_parameter_is_untouched(self):</w:t>
+      </w:r>
+    </w:p>
+    <w:p>
+      <w:pPr>
+        <w:pStyle w:val="SourceCode"/>
+      </w:pPr>
+      <w:r>
+        <w:t xml:space="preserve">        source='https://example.com/jingxuan?modal_id=123'</w:t>
+      </w:r>
+    </w:p>
+    <w:p>
+      <w:pPr>
+        <w:pStyle w:val="SourceCode"/>
+      </w:pPr>
+      <w:r>
+        <w:t xml:space="preserve">        self.assertEqual(reader.download_url(source),source)</w:t>
+      </w:r>
+    </w:p>
+    <w:p>
+      <w:pPr>
+        <w:pStyle w:val="SourceCode"/>
+      </w:pPr>
+      <w:r>
+        <w:t xml:space="preserve">    def test_invalid_douyin_id_is_untouched(self):</w:t>
+      </w:r>
+    </w:p>
+    <w:p>
+      <w:pPr>
+        <w:pStyle w:val="SourceCode"/>
+      </w:pPr>
+      <w:r>
+        <w:t xml:space="preserve">        source='https://www.douyin.com/jingxuan?modal_id=invalid'</w:t>
+      </w:r>
+    </w:p>
+    <w:p>
+      <w:pPr>
+        <w:pStyle w:val="SourceCode"/>
+      </w:pPr>
+      <w:r>
+        <w:t xml:space="preserve">        self.assertEqual(reader.download_url(source),source)</w:t>
+      </w:r>
+    </w:p>
+    <w:p>
+      <w:pPr>
+        <w:pStyle w:val="SourceCode"/>
+      </w:pPr>
+      <w:r/>
+    </w:p>
+    <w:p>
+      <w:pPr>
         <w:pStyle w:val="Heading2"/>
       </w:pPr>
       <w:r>
@@ -14368,7 +14567,7 @@
         <w:pStyle w:val="SourceCode"/>
       </w:pPr>
       <w:r>
-        <w:t xml:space="preserve">  "test_reader.py": "cff139029d75e464f25a84e9f8e0283df6827691c1e125186fd1c82721ec4200",</w:t>
+        <w:t xml:space="preserve">  "test_reader.py": "44db5108039e4ddc37b71a1aa75a52a7d9259a8787aaa0d14fb8d3f52b517bdb",</w:t>
       </w:r>
     </w:p>
     <w:p>
@@ -14464,7 +14663,7 @@
         <w:pStyle w:val="SourceCode"/>
       </w:pPr>
       <w:r>
-        <w:t xml:space="preserve">  "reader.py": "480fb1b02df11b9d4b6f1cb8da486b6bf92ba6e3ac6095951cff5a7155c814bc",</w:t>
+        <w:t xml:space="preserve">  "reader.py": "471e54c25778c6f00eed89124298e7808502366a8561e115710bd297a26357a0",</w:t>
       </w:r>
     </w:p>
     <w:p>
@@ -14504,7 +14703,7 @@
         <w:pStyle w:val="SourceCode"/>
       </w:pPr>
       <w:r>
-        <w:t xml:space="preserve">  "app.py": "b7adb2011fe1eafbfdefdd0137cad3bb5944c331740526e5549d7ce0289b8ee4",</w:t>
+        <w:t xml:space="preserve">  "app.py": "8a8779e13abfa8da12c953c2cf44de52729bd6963b31dbc6ce4c1b87b3fb618e",</w:t>
       </w:r>
     </w:p>
     <w:p>

</xml_diff>

<commit_message>
Report actual pipeline phases and avoid assuming cloud recognition progress
</commit_message>
<xml_diff>
--- a/安装与使用指南.docx
+++ b/安装与使用指南.docx
@@ -172,6 +172,19 @@
         <w:pStyle w:val="Heading1"/>
       </w:pPr>
       <w:r>
+        <w:t>运行状态</w:t>
+      </w:r>
+    </w:p>
+    <w:p>
+      <w:r>
+        <w:t>状态对应实际步骤：下载、提取音频、准备上传音频、连接千问、上传、等待千问结果、导出原文、生成并检查 Word、清理媒体、完成。没有千问内部进度数据时，只显示等待结果，不断言云端正在识别。Word 生成后清理结束或记录清理错误，才显示完成。</w:t>
+      </w:r>
+    </w:p>
+    <w:p>
+      <w:pPr>
+        <w:pStyle w:val="Heading1"/>
+      </w:pPr>
+      <w:r>
         <w:t>故障恢复加固</w:t>
       </w:r>
     </w:p>
@@ -3922,7 +3935,7 @@
         <w:pStyle w:val="SourceCode"/>
       </w:pPr>
       <w:r>
-        <w:t>const stages={queued:'排队中',downloading:'正在下载',downloaded:'下载完成',diarizing:'正在准备千问识别',transcribing:'正在准备千问识别',cloud_preparing:'正在准备音频并连接千问',cloud_transcribing:'千问正在后台识别语音',cloud_exporting:'正在导出千问原文 Word',completed:'Word 已生成，可以查看',login_required:'需要重新登录千问',failed:'处理失败，进度已保留'};</w:t>
+        <w:t>const stages={queued:'排队中',downloading:'正在下载',downloaded:'下载完成',diarizing:'正在准备千问识别',transcribing:'正在准备千问识别',cloud_preparing:'正在准备上传音频',cloud_transcribing:'等待千问处理结果或加载文稿页面',extracting_audio:'正在提取音频',cloud_connecting:'正在连接千问并检查登录',cloud_uploading:'正在向千问上传音频',retry_waiting:'页面加载超时，稍后自动重试',generating_document:'正在生成并检查 Word 文稿',cleaning:'Word 已生成，正在清理原音视频和临时文件',cloud_exporting:'正在导出千问原文 Word',completed:'Word 已生成，可以查看',login_required:'需要重新登录千问',failed:'处理失败，进度已保留'};</w:t>
       </w:r>
     </w:p>
     <w:p>
@@ -3994,7 +4007,7 @@
         <w:pStyle w:val="SourceCode"/>
       </w:pPr>
       <w:r>
-        <w:t>async function refresh(){try{let jobs=await(await fetch('/jobs')).json();jobs.sort((a,b)=&gt;(b.created_at??historicalTaskTimes[b.id]??b.added_at??Infinity)-(a.created_at??historicalTaskTimes[a.id]??a.added_at??Infinity));let host=document.querySelector('#jobs');host.replaceChildren();for(let j of jobs){let card=document.createElement('article');let h=document.createElement('h2');h.textContent=taskHeading(j);card.append(h);let p=document.createElement('p');p.textContent=(j.document&amp;&amp;!j.has_document)?'Word 文件已不在原保存位置，重新提交链接可生成':(stages[j.state]||'准备生成文稿');card.append(p);card.append(link('原网页',j.url));if(j.error){let err=document.createElement('p');err.textContent=j.error;card.append(err)}if(j.cleanup_error){let note=document.createElement('p');note.textContent='Word 已生成，但部分临时文件未清理：'+j.cleanup_error;card.append(note)}if(j.has_document){let actions=document.createElement('p');actions.className='actions';actions.append(link('查看 Word 文稿','/preview/'+j.id,'action'));let reveal=document.createElement('button');reveal.type='button';reveal.className='secondary';reveal.textContent='打开文档所在位置';let revealStatus=document.createElement('small');revealStatus.setAttribute('role','status');reveal.onclick=async()=&gt;{reveal.disabled=true;revealStatus.textContent='正在打开文件夹…';try{await post('/reveal/'+j.id,{});revealStatus.textContent='已打开 Finder 文件夹。';msg.textContent='已打开文档所在的 Finder 文件夹。'}catch(e){revealStatus.textContent='打开失败：'+e.message;msg.textContent='打开失败：'+e.message}finally{reveal.disabled=false}};actions.append(reveal);actions.append(revealStatus);card.append(actions);let note=document.createElement('small');note.textContent=j.temporary_files_removed?(j.media_trashed?'原音视频已移入废纸篓，临时音轨已清理。':'原音视频与临时音轨已清理。'):'Word 内容未经人工校对。';card.append(note)}let controls=document.createElement('p');controls.className='actions';if(j.state==='failed'||j.state==='login_required'){let retry=document.createElement('button');retry.textContent='重试任务';retry.onclick=async()=&gt;{try{await post('/jobs',{url:j.url,engine:'qianwen'});await refresh()}catch(e){msg.textContent=e.message}};controls.append(retry)}let remove=document.createElement('button');remove.type='button';remove.className='secondary';remove.style.color='#a52222';remove.textContent='删除任务';remove.onclick=async()=&gt;{if(!confirm('删除“'+(j.title||j.id)+'”？将停止该任务，把本机任务文件和相关文稿移入废纸篓。千问云端记录需在千问网页中管理。'))return;remove.disabled=true;try{await requireControls();let r=await post('/delete/'+j.id,{});msg.textContent=r.message;await refresh()}catch(e){msg.textContent='删除失败：'+e.message;remove.disabled=false}};if(j.has_document){card.querySelector('.actions').append(remove)}else{controls.append(remove)}if(controls.children.length)card.append(controls);host.append(card)}await refreshLogin()}catch(e){msg.textContent='后台连接中断，请重新启动工具。'}}</w:t>
+        <w:t>async function refresh(){try{let jobs=await(await fetch('/jobs')).json();jobs.sort((a,b)=&gt;(b.created_at??historicalTaskTimes[b.id]??b.added_at??Infinity)-(a.created_at??historicalTaskTimes[a.id]??a.added_at??Infinity));let host=document.querySelector('#jobs');host.replaceChildren();for(let j of jobs){let card=document.createElement('article');let h=document.createElement('h2');h.textContent=taskHeading(j);card.append(h);let p=document.createElement('p');p.textContent=(j.document&amp;&amp;!j.has_document)?'Word 文件已不在原保存位置，重新提交链接可生成':(stages[j.state]||'状态暂未识别：'+String(j.state));card.append(p);card.append(link('原网页',j.url));if(j.error){let err=document.createElement('p');err.textContent=j.error;card.append(err)}if(j.cleanup_error){let note=document.createElement('p');note.textContent='Word 已生成，但部分临时文件未清理：'+j.cleanup_error;card.append(note)}if(j.has_document){let actions=document.createElement('p');actions.className='actions';actions.append(link('查看 Word 文稿','/preview/'+j.id,'action'));let reveal=document.createElement('button');reveal.type='button';reveal.className='secondary';reveal.textContent='打开文档所在位置';let revealStatus=document.createElement('small');revealStatus.setAttribute('role','status');reveal.onclick=async()=&gt;{reveal.disabled=true;revealStatus.textContent='正在打开文件夹…';try{await post('/reveal/'+j.id,{});revealStatus.textContent='已打开 Finder 文件夹。';msg.textContent='已打开文档所在的 Finder 文件夹。'}catch(e){revealStatus.textContent='打开失败：'+e.message;msg.textContent='打开失败：'+e.message}finally{reveal.disabled=false}};actions.append(reveal);actions.append(revealStatus);card.append(actions);let note=document.createElement('small');note.textContent=j.temporary_files_removed?(j.media_trashed?'原音视频已移入废纸篓，临时音轨已清理。':'原音视频与临时音轨已清理。'):'Word 内容未经人工校对。';card.append(note)}let controls=document.createElement('p');controls.className='actions';if(j.state==='failed'||j.state==='login_required'){let retry=document.createElement('button');retry.textContent='重试任务';retry.onclick=async()=&gt;{try{await post('/jobs',{url:j.url,engine:'qianwen'});await refresh()}catch(e){msg.textContent=e.message}};controls.append(retry)}let remove=document.createElement('button');remove.type='button';remove.className='secondary';remove.style.color='#a52222';remove.textContent='删除任务';remove.onclick=async()=&gt;{if(!confirm('删除“'+(j.title||j.id)+'”？将停止该任务，把本机任务文件和相关文稿移入废纸篓。千问云端记录需在千问网页中管理。'))return;remove.disabled=true;try{await requireControls();let r=await post('/delete/'+j.id,{});msg.textContent=r.message;await refresh()}catch(e){msg.textContent='删除失败：'+e.message;remove.disabled=false}};if(j.has_document){card.querySelector('.actions').append(remove)}else{controls.append(remove)}if(controls.children.length)card.append(controls);host.append(card)}await refreshLogin()}catch(e){msg.textContent='后台连接中断，请重新启动工具。'}}</w:t>
       </w:r>
     </w:p>
     <w:p>
@@ -6000,7 +6013,7 @@
         <w:pStyle w:val="SourceCode"/>
       </w:pPr>
       <w:r>
-        <w:t xml:space="preserve">            meta.update(state='cloud_transcribing',retry_attempt=attempt+1)</w:t>
+        <w:t xml:space="preserve">            meta.update(state='retry_waiting',retry_attempt=attempt+1)</w:t>
       </w:r>
     </w:p>
     <w:p>
@@ -6176,6 +6189,14 @@
         <w:pStyle w:val="SourceCode"/>
       </w:pPr>
       <w:r>
+        <w:t xml:space="preserve">    meta['state']='cloud_preparing';save(job/'job.json',meta)</w:t>
+      </w:r>
+    </w:p>
+    <w:p>
+      <w:pPr>
+        <w:pStyle w:val="SourceCode"/>
+      </w:pPr>
+      <w:r>
         <w:t xml:space="preserve">    upload = job/'media'/(filename(meta['title'])+'-'+job.name+'.mp3')</w:t>
       </w:r>
     </w:p>
@@ -6248,6 +6269,14 @@
         <w:pStyle w:val="SourceCode"/>
       </w:pPr>
       <w:r>
+        <w:t xml:space="preserve">            meta['state']='cloud_connecting';save(job/'job.json',meta)</w:t>
+      </w:r>
+    </w:p>
+    <w:p>
+      <w:pPr>
+        <w:pStyle w:val="SourceCode"/>
+      </w:pPr>
+      <w:r>
         <w:t xml:space="preserve">            page.goto(meta.get('qianwen_url') or URL)</w:t>
       </w:r>
     </w:p>
@@ -6360,6 +6389,14 @@
         <w:pStyle w:val="SourceCode"/>
       </w:pPr>
       <w:r>
+        <w:t xml:space="preserve">                    meta['state']='cloud_uploading';save(job/'job.json',meta)</w:t>
+      </w:r>
+    </w:p>
+    <w:p>
+      <w:pPr>
+        <w:pStyle w:val="SourceCode"/>
+      </w:pPr>
+      <w:r>
         <w:t xml:space="preserve">                    with page.expect_file_chooser() as chooser:</w:t>
       </w:r>
     </w:p>
@@ -6560,6 +6597,14 @@
         <w:pStyle w:val="SourceCode"/>
       </w:pPr>
       <w:r>
+        <w:t xml:space="preserve">            meta['state']='cloud_exporting';save(job/'job.json',meta)</w:t>
+      </w:r>
+    </w:p>
+    <w:p>
+      <w:pPr>
+        <w:pStyle w:val="SourceCode"/>
+      </w:pPr>
+      <w:r>
         <w:t xml:space="preserve">            page.get_by_role('button', name='导出', exact=True).wait_for(timeout=60000)</w:t>
       </w:r>
     </w:p>
@@ -8080,6 +8125,14 @@
         <w:pStyle w:val="SourceCode"/>
       </w:pPr>
       <w:r>
+        <w:t xml:space="preserve">                meta['state']='extracting_audio';save_json(job/'job.json',meta)</w:t>
+      </w:r>
+    </w:p>
+    <w:p>
+      <w:pPr>
+        <w:pStyle w:val="SourceCode"/>
+      </w:pPr>
+      <w:r>
         <w:t xml:space="preserve">                partial = wav.with_name('transcription-audio.partial.wav')</w:t>
       </w:r>
     </w:p>
@@ -8240,6 +8293,14 @@
         <w:pStyle w:val="SourceCode"/>
       </w:pPr>
       <w:r>
+        <w:t xml:space="preserve">            meta['state']='generating_document';save_json(job/'job.json',meta)</w:t>
+      </w:r>
+    </w:p>
+    <w:p>
+      <w:pPr>
+        <w:pStyle w:val="SourceCode"/>
+      </w:pPr>
+      <w:r>
         <w:t xml:space="preserve">            build_document(job, raw)</w:t>
       </w:r>
     </w:p>
@@ -9404,7 +9465,7 @@
         <w:pStyle w:val="SourceCode"/>
       </w:pPr>
       <w:r>
-        <w:t xml:space="preserve">    meta.update(state='completed', document=str(path), blocks=len(blocks),</w:t>
+        <w:t xml:space="preserve">    meta.update(state='cleaning', document=str(path), blocks=len(blocks),</w:t>
       </w:r>
     </w:p>
     <w:p>
@@ -9492,6 +9553,22 @@
         <w:pStyle w:val="SourceCode"/>
       </w:pPr>
       <w:r>
+        <w:t xml:space="preserve">    meta['state']='completed'</w:t>
+      </w:r>
+    </w:p>
+    <w:p>
+      <w:pPr>
+        <w:pStyle w:val="SourceCode"/>
+      </w:pPr>
+      <w:r>
+        <w:t xml:space="preserve">    save_json(job/'job.json',meta)</w:t>
+      </w:r>
+    </w:p>
+    <w:p>
+      <w:pPr>
+        <w:pStyle w:val="SourceCode"/>
+      </w:pPr>
+      <w:r>
         <w:t xml:space="preserve">    return path</w:t>
       </w:r>
     </w:p>
@@ -14810,7 +14887,7 @@
         <w:pStyle w:val="SourceCode"/>
       </w:pPr>
       <w:r>
-        <w:t xml:space="preserve">  "qianwen_browser.py": "f19cd54031b7d7c3f4dfe4fa13b7b03a11dbe49b859d79f52a3c9570c26f3cc3",</w:t>
+        <w:t xml:space="preserve">  "qianwen_browser.py": "3f2f4655e7ddd3dfdc4a19b85d4b0b25959803baee841cd43523e55fc5c367b4",</w:t>
       </w:r>
     </w:p>
     <w:p>
@@ -14834,7 +14911,7 @@
         <w:pStyle w:val="SourceCode"/>
       </w:pPr>
       <w:r>
-        <w:t xml:space="preserve">  "index.html": "bc0041386bbc0a09ca620c3f6eec8711e1eaf5646b89291d6d7eded8932b417b",</w:t>
+        <w:t xml:space="preserve">  "index.html": "e9834483039d7f85b4495a593575a80b263dc9a2998d29a9b33165fe28cd98e5",</w:t>
       </w:r>
     </w:p>
     <w:p>
@@ -14898,7 +14975,7 @@
         <w:pStyle w:val="SourceCode"/>
       </w:pPr>
       <w:r>
-        <w:t xml:space="preserve">  "reader.py": "471e54c25778c6f00eed89124298e7808502366a8561e115710bd297a26357a0",</w:t>
+        <w:t xml:space="preserve">  "reader.py": "8e245f7ee3a2bc35c89c8f91f7bc08c554e2901e56d179ff84b893cc54864f63",</w:t>
       </w:r>
     </w:p>
     <w:p>

</xml_diff>

<commit_message>
Mention Xiaoyuzhou in URL input placeholder
</commit_message>
<xml_diff>
--- a/安装与使用指南.docx
+++ b/安装与使用指南.docx
@@ -3879,7 +3879,7 @@
         <w:pStyle w:val="SourceCode"/>
       </w:pPr>
       <w:r>
-        <w:t>&lt;form id="form" autocomplete="off"&gt;&lt;input id="url" autocomplete="off" aria-label="音视频网页链接" type="url" required placeholder="粘贴 YouTube、哔哩哔哩等音视频网页链接"&gt;&lt;button&gt;开始生成文稿&lt;/button&gt;&lt;/form&gt;</w:t>
+        <w:t>&lt;form id="form" autocomplete="off"&gt;&lt;input id="url" autocomplete="off" aria-label="音视频网页链接" type="url" required placeholder="粘贴YouTube、B站、小宇宙等音视频网页链接"&gt;&lt;button&gt;开始生成文稿&lt;/button&gt;&lt;/form&gt;</w:t>
       </w:r>
     </w:p>
     <w:p>
@@ -14911,7 +14911,7 @@
         <w:pStyle w:val="SourceCode"/>
       </w:pPr>
       <w:r>
-        <w:t xml:space="preserve">  "index.html": "e9834483039d7f85b4495a593575a80b263dc9a2998d29a9b33165fe28cd98e5",</w:t>
+        <w:t xml:space="preserve">  "index.html": "7a96b77ad812eb08159432d66d118916e31dea5f775996a5d68a41991f9fe9cc",</w:t>
       </w:r>
     </w:p>
     <w:p>

</xml_diff>

<commit_message>
Require visible Qianwen record before marking upload confirmed
</commit_message>
<xml_diff>
--- a/安装与使用指南.docx
+++ b/安装与使用指南.docx
@@ -172,6 +172,19 @@
         <w:pStyle w:val="Heading1"/>
       </w:pPr>
       <w:r>
+        <w:t>上传成功确认</w:t>
+      </w:r>
+    </w:p>
+    <w:p>
+      <w:r>
+        <w:t>只有千问页面显示本次文件名对应的记录后，才标记上传确认成功。点击确认不再被当作成功依据。等待记录最多2分钟，期间保存页面诊断。没有确认时停止并保留音频，不自动重复上传；需检查页面后再恢复。记录存在也不等于转写完成。</w:t>
+      </w:r>
+    </w:p>
+    <w:p>
+      <w:pPr>
+        <w:pStyle w:val="Heading1"/>
+      </w:pPr>
+      <w:r>
         <w:t>运行状态</w:t>
       </w:r>
     </w:p>
@@ -324,7 +337,7 @@
     </w:p>
     <w:p>
       <w:r>
-        <w:t>本次 30 项测试通过，其中云端识别返回结果在单元测试中模拟；旧本地推理断点测试已移除。此前本机20秒音频的千问后台完整流程约46秒，不能推断长视频速度或识别准确率。未在另一台全新 Mac 完成安装实测。</w:t>
+        <w:t>本次 32 项测试通过，其中云端识别返回结果在单元测试中模拟；旧本地推理断点测试已移除。此前本机20秒音频的千问后台完整流程约46秒，不能推断长视频速度或识别准确率。未在另一台全新 Mac 完成安装实测。</w:t>
       </w:r>
     </w:p>
     <w:p>
@@ -3935,7 +3948,7 @@
         <w:pStyle w:val="SourceCode"/>
       </w:pPr>
       <w:r>
-        <w:t>const stages={queued:'排队中',downloading:'正在下载',downloaded:'下载完成',diarizing:'正在准备千问识别',transcribing:'正在准备千问识别',cloud_preparing:'正在准备上传音频',cloud_transcribing:'等待千问处理结果或加载文稿页面',extracting_audio:'正在提取音频',cloud_connecting:'正在连接千问并检查登录',cloud_uploading:'正在向千问上传音频',retry_waiting:'页面加载超时，稍后自动重试',generating_document:'正在生成并检查 Word 文稿',cleaning:'Word 已生成，正在清理原音视频和临时文件',cloud_exporting:'正在导出千问原文 Word',completed:'Word 已生成，可以查看',login_required:'需要重新登录千问',failed:'处理失败，进度已保留'};</w:t>
+        <w:t>const stages={queued:'排队中',downloading:'正在下载',downloaded:'下载完成',diarizing:'正在准备千问识别',transcribing:'正在准备千问识别',cloud_preparing:'正在准备上传音频',cloud_transcribing:'等待千问处理结果或加载文稿页面',extracting_audio:'正在提取音频',cloud_connecting:'正在连接千问并检查登录',cloud_uploading:'正在向千问上传音频',cloud_confirming_upload:'等待千问页面确认上传记录（尚未确认成功）',retry_waiting:'页面加载超时，稍后自动重试',generating_document:'正在生成并检查 Word 文稿',cleaning:'Word 已生成，正在清理原音视频和临时文件',cloud_exporting:'正在导出千问原文 Word',completed:'Word 已生成，可以查看',login_required:'需要重新登录千问',failed:'处理失败，进度已保留'};</w:t>
       </w:r>
     </w:p>
     <w:p>
@@ -6165,6 +6178,146 @@
         <w:pStyle w:val="SourceCode"/>
       </w:pPr>
       <w:r>
+        <w:t>def confirm_submission(page,title,job,meta,save,timeout=120000):</w:t>
+      </w:r>
+    </w:p>
+    <w:p>
+      <w:pPr>
+        <w:pStyle w:val="SourceCode"/>
+      </w:pPr>
+      <w:r>
+        <w:t xml:space="preserve">    from playwright.sync_api import TimeoutError as BrowserTimeout</w:t>
+      </w:r>
+    </w:p>
+    <w:p>
+      <w:pPr>
+        <w:pStyle w:val="SourceCode"/>
+      </w:pPr>
+      <w:r>
+        <w:t xml:space="preserve">    meta['state']='cloud_confirming_upload';save(job/'job.json',meta)</w:t>
+      </w:r>
+    </w:p>
+    <w:p>
+      <w:pPr>
+        <w:pStyle w:val="SourceCode"/>
+      </w:pPr>
+      <w:r>
+        <w:t xml:space="preserve">    deadline=time.monotonic()+timeout/1000</w:t>
+      </w:r>
+    </w:p>
+    <w:p>
+      <w:pPr>
+        <w:pStyle w:val="SourceCode"/>
+      </w:pPr>
+      <w:r>
+        <w:t xml:space="preserve">    while time.monotonic()&lt;deadline:</w:t>
+      </w:r>
+    </w:p>
+    <w:p>
+      <w:pPr>
+        <w:pStyle w:val="SourceCode"/>
+      </w:pPr>
+      <w:r>
+        <w:t xml:space="preserve">        require_login_if_visible(page)</w:t>
+      </w:r>
+    </w:p>
+    <w:p>
+      <w:pPr>
+        <w:pStyle w:val="SourceCode"/>
+      </w:pPr>
+      <w:r>
+        <w:t xml:space="preserve">        try:</w:t>
+      </w:r>
+    </w:p>
+    <w:p>
+      <w:pPr>
+        <w:pStyle w:val="SourceCode"/>
+      </w:pPr>
+      <w:r>
+        <w:t xml:space="preserve">            page.get_by_text(title,exact=True).filter(visible=True).first.wait_for(timeout=10000)</w:t>
+      </w:r>
+    </w:p>
+    <w:p>
+      <w:pPr>
+        <w:pStyle w:val="SourceCode"/>
+      </w:pPr>
+      <w:r>
+        <w:t xml:space="preserve">            meta.update(qianwen_submitted=True,qianwen_upload_confirmed=True,state='cloud_transcribing')</w:t>
+      </w:r>
+    </w:p>
+    <w:p>
+      <w:pPr>
+        <w:pStyle w:val="SourceCode"/>
+      </w:pPr>
+      <w:r>
+        <w:t xml:space="preserve">            save(job/'job.json',meta)</w:t>
+      </w:r>
+    </w:p>
+    <w:p>
+      <w:pPr>
+        <w:pStyle w:val="SourceCode"/>
+      </w:pPr>
+      <w:r>
+        <w:t xml:space="preserve">            return</w:t>
+      </w:r>
+    </w:p>
+    <w:p>
+      <w:pPr>
+        <w:pStyle w:val="SourceCode"/>
+      </w:pPr>
+      <w:r>
+        <w:t xml:space="preserve">        except BrowserTimeout:</w:t>
+      </w:r>
+    </w:p>
+    <w:p>
+      <w:pPr>
+        <w:pStyle w:val="SourceCode"/>
+      </w:pPr>
+      <w:r>
+        <w:t xml:space="preserve">            page.screenshot(path=str(job/'browser-diagnostic.png'),full_page=True)</w:t>
+      </w:r>
+    </w:p>
+    <w:p>
+      <w:pPr>
+        <w:pStyle w:val="SourceCode"/>
+      </w:pPr>
+      <w:r>
+        <w:t xml:space="preserve">            (job/'browser-diagnostic.txt').write_text(page.locator('body').inner_text())</w:t>
+      </w:r>
+    </w:p>
+    <w:p>
+      <w:pPr>
+        <w:pStyle w:val="SourceCode"/>
+      </w:pPr>
+      <w:r>
+        <w:t xml:space="preserve">            meta['last_browser_check']=time.time();save(job/'job.json',meta)</w:t>
+      </w:r>
+    </w:p>
+    <w:p>
+      <w:pPr>
+        <w:pStyle w:val="SourceCode"/>
+      </w:pPr>
+      <w:r>
+        <w:t xml:space="preserve">    raise RuntimeError('千问页面未出现本次上传记录，尚未确认上传成功。已保留音频，请诊断后重试；不会重复自动上传。')</w:t>
+      </w:r>
+    </w:p>
+    <w:p>
+      <w:pPr>
+        <w:pStyle w:val="SourceCode"/>
+      </w:pPr>
+      <w:r/>
+    </w:p>
+    <w:p>
+      <w:pPr>
+        <w:pStyle w:val="SourceCode"/>
+      </w:pPr>
+      <w:r/>
+    </w:p>
+    <w:p>
+      <w:pPr>
+        <w:pStyle w:val="SourceCode"/>
+      </w:pPr>
+      <w:r>
         <w:t>def export_audio(audio, job, meta, save):</w:t>
       </w:r>
     </w:p>
@@ -6381,7 +6534,7 @@
         <w:pStyle w:val="SourceCode"/>
       </w:pPr>
       <w:r>
-        <w:t xml:space="preserve">                if not meta.get('qianwen_submitted'):</w:t>
+        <w:t xml:space="preserve">                if not meta.get('qianwen_submitted') and not meta.get('qianwen_submission_attempted'):</w:t>
       </w:r>
     </w:p>
     <w:p>
@@ -6421,6 +6574,30 @@
         <w:pStyle w:val="SourceCode"/>
       </w:pPr>
       <w:r>
+        <w:t xml:space="preserve">                    from playwright.sync_api import expect</w:t>
+      </w:r>
+    </w:p>
+    <w:p>
+      <w:pPr>
+        <w:pStyle w:val="SourceCode"/>
+      </w:pPr>
+      <w:r>
+        <w:t xml:space="preserve">                    expect(page.get_by_role('button',name='确 认',exact=True)).to_be_enabled(timeout=120000)</w:t>
+      </w:r>
+    </w:p>
+    <w:p>
+      <w:pPr>
+        <w:pStyle w:val="SourceCode"/>
+      </w:pPr>
+      <w:r>
+        <w:t xml:space="preserve">                    meta['qianwen_submission_attempted']=True;save(job/'job.json',meta)</w:t>
+      </w:r>
+    </w:p>
+    <w:p>
+      <w:pPr>
+        <w:pStyle w:val="SourceCode"/>
+      </w:pPr>
+      <w:r>
         <w:t xml:space="preserve">                    page.get_by_role('button', name='确 认', exact=True).click()</w:t>
       </w:r>
     </w:p>
@@ -6437,22 +6614,6 @@
         <w:pStyle w:val="SourceCode"/>
       </w:pPr>
       <w:r>
-        <w:t xml:space="preserve">                    meta['qianwen_submitted'] = True; save(job/'job.json', meta)</w:t>
-      </w:r>
-    </w:p>
-    <w:p>
-      <w:pPr>
-        <w:pStyle w:val="SourceCode"/>
-      </w:pPr>
-      <w:r>
-        <w:t xml:space="preserve">                meta['state'] = 'cloud_transcribing'; save(job/'job.json', meta)</w:t>
-      </w:r>
-    </w:p>
-    <w:p>
-      <w:pPr>
-        <w:pStyle w:val="SourceCode"/>
-      </w:pPr>
-      <w:r>
         <w:t xml:space="preserve">                title = upload.stem</w:t>
       </w:r>
     </w:p>
@@ -6461,6 +6622,14 @@
         <w:pStyle w:val="SourceCode"/>
       </w:pPr>
       <w:r>
+        <w:t xml:space="preserve">                confirm_submission(page,title,job,meta,save)</w:t>
+      </w:r>
+    </w:p>
+    <w:p>
+      <w:pPr>
+        <w:pStyle w:val="SourceCode"/>
+      </w:pPr>
+      <w:r>
         <w:t xml:space="preserve">                deadline = time.monotonic() + 6 * 3600</w:t>
       </w:r>
     </w:p>
@@ -6549,6 +6718,30 @@
         <w:pStyle w:val="SourceCode"/>
       </w:pPr>
       <w:r>
+        <w:t xml:space="preserve">                        page.screenshot(path=str(job/'browser-diagnostic.png'),full_page=True)</w:t>
+      </w:r>
+    </w:p>
+    <w:p>
+      <w:pPr>
+        <w:pStyle w:val="SourceCode"/>
+      </w:pPr>
+      <w:r>
+        <w:t xml:space="preserve">                        (job/'browser-diagnostic.txt').write_text(page.locator('body').inner_text())</w:t>
+      </w:r>
+    </w:p>
+    <w:p>
+      <w:pPr>
+        <w:pStyle w:val="SourceCode"/>
+      </w:pPr>
+      <w:r>
+        <w:t xml:space="preserve">                        meta['last_browser_check']=time.time();save(job/'job.json',meta)</w:t>
+      </w:r>
+    </w:p>
+    <w:p>
+      <w:pPr>
+        <w:pStyle w:val="SourceCode"/>
+      </w:pPr>
+      <w:r>
         <w:t xml:space="preserve">                        time.sleep(5)</w:t>
       </w:r>
     </w:p>
@@ -12607,6 +12800,248 @@
         <w:pStyle w:val="SourceCode"/>
       </w:pPr>
       <w:r>
+        <w:t>class UploadConfirmationTests(unittest.TestCase):</w:t>
+      </w:r>
+    </w:p>
+    <w:p>
+      <w:pPr>
+        <w:pStyle w:val="SourceCode"/>
+      </w:pPr>
+      <w:r>
+        <w:t xml:space="preserve">    def page(self):</w:t>
+      </w:r>
+    </w:p>
+    <w:p>
+      <w:pPr>
+        <w:pStyle w:val="SourceCode"/>
+      </w:pPr>
+      <w:r>
+        <w:t xml:space="preserve">        from unittest.mock import MagicMock</w:t>
+      </w:r>
+    </w:p>
+    <w:p>
+      <w:pPr>
+        <w:pStyle w:val="SourceCode"/>
+      </w:pPr>
+      <w:r>
+        <w:t xml:space="preserve">        page=MagicMock()</w:t>
+      </w:r>
+    </w:p>
+    <w:p>
+      <w:pPr>
+        <w:pStyle w:val="SourceCode"/>
+      </w:pPr>
+      <w:r>
+        <w:t xml:space="preserve">        page.get_by_role.return_value.filter.return_value.all.return_value=[]</w:t>
+      </w:r>
+    </w:p>
+    <w:p>
+      <w:pPr>
+        <w:pStyle w:val="SourceCode"/>
+      </w:pPr>
+      <w:r>
+        <w:t xml:space="preserve">        page.get_by_role.return_value.all.return_value=[]</w:t>
+      </w:r>
+    </w:p>
+    <w:p>
+      <w:pPr>
+        <w:pStyle w:val="SourceCode"/>
+      </w:pPr>
+      <w:r>
+        <w:t xml:space="preserve">        page.locator.return_value.inner_text.return_value='最近记录'</w:t>
+      </w:r>
+    </w:p>
+    <w:p>
+      <w:pPr>
+        <w:pStyle w:val="SourceCode"/>
+      </w:pPr>
+      <w:r>
+        <w:t xml:space="preserve">        return page</w:t>
+      </w:r>
+    </w:p>
+    <w:p>
+      <w:pPr>
+        <w:pStyle w:val="SourceCode"/>
+      </w:pPr>
+      <w:r/>
+    </w:p>
+    <w:p>
+      <w:pPr>
+        <w:pStyle w:val="SourceCode"/>
+      </w:pPr>
+      <w:r>
+        <w:t xml:space="preserve">    def test_submission_requires_visible_record(self):</w:t>
+      </w:r>
+    </w:p>
+    <w:p>
+      <w:pPr>
+        <w:pStyle w:val="SourceCode"/>
+      </w:pPr>
+      <w:r>
+        <w:t xml:space="preserve">        import qianwen_browser as browser</w:t>
+      </w:r>
+    </w:p>
+    <w:p>
+      <w:pPr>
+        <w:pStyle w:val="SourceCode"/>
+      </w:pPr>
+      <w:r>
+        <w:t xml:space="preserve">        page=self.page();meta={'qianwen_submission_attempted':True}</w:t>
+      </w:r>
+    </w:p>
+    <w:p>
+      <w:pPr>
+        <w:pStyle w:val="SourceCode"/>
+      </w:pPr>
+      <w:r>
+        <w:t xml:space="preserve">        with tempfile.TemporaryDirectory() as tmp:</w:t>
+      </w:r>
+    </w:p>
+    <w:p>
+      <w:pPr>
+        <w:pStyle w:val="SourceCode"/>
+      </w:pPr>
+      <w:r>
+        <w:t xml:space="preserve">            browser.confirm_submission(page,'test-task',Path(tmp),meta,lambda *args:None)</w:t>
+      </w:r>
+    </w:p>
+    <w:p>
+      <w:pPr>
+        <w:pStyle w:val="SourceCode"/>
+      </w:pPr>
+      <w:r>
+        <w:t xml:space="preserve">        page.get_by_text.return_value.filter.return_value.first.wait_for.assert_called_once_with(timeout=10000)</w:t>
+      </w:r>
+    </w:p>
+    <w:p>
+      <w:pPr>
+        <w:pStyle w:val="SourceCode"/>
+      </w:pPr>
+      <w:r>
+        <w:t xml:space="preserve">        self.assertTrue(meta['qianwen_upload_confirmed'])</w:t>
+      </w:r>
+    </w:p>
+    <w:p>
+      <w:pPr>
+        <w:pStyle w:val="SourceCode"/>
+      </w:pPr>
+      <w:r>
+        <w:t xml:space="preserve">        self.assertEqual(meta['state'],'cloud_transcribing')</w:t>
+      </w:r>
+    </w:p>
+    <w:p>
+      <w:pPr>
+        <w:pStyle w:val="SourceCode"/>
+      </w:pPr>
+      <w:r/>
+    </w:p>
+    <w:p>
+      <w:pPr>
+        <w:pStyle w:val="SourceCode"/>
+      </w:pPr>
+      <w:r>
+        <w:t xml:space="preserve">    def test_absent_record_does_not_claim_submission_success(self):</w:t>
+      </w:r>
+    </w:p>
+    <w:p>
+      <w:pPr>
+        <w:pStyle w:val="SourceCode"/>
+      </w:pPr>
+      <w:r>
+        <w:t xml:space="preserve">        from unittest.mock import patch</w:t>
+      </w:r>
+    </w:p>
+    <w:p>
+      <w:pPr>
+        <w:pStyle w:val="SourceCode"/>
+      </w:pPr>
+      <w:r>
+        <w:t xml:space="preserve">        from playwright.sync_api import TimeoutError</w:t>
+      </w:r>
+    </w:p>
+    <w:p>
+      <w:pPr>
+        <w:pStyle w:val="SourceCode"/>
+      </w:pPr>
+      <w:r>
+        <w:t xml:space="preserve">        import qianwen_browser as browser</w:t>
+      </w:r>
+    </w:p>
+    <w:p>
+      <w:pPr>
+        <w:pStyle w:val="SourceCode"/>
+      </w:pPr>
+      <w:r>
+        <w:t xml:space="preserve">        page=self.page();page.get_by_text.return_value.filter.return_value.first.wait_for.side_effect=TimeoutError('absent')</w:t>
+      </w:r>
+    </w:p>
+    <w:p>
+      <w:pPr>
+        <w:pStyle w:val="SourceCode"/>
+      </w:pPr>
+      <w:r>
+        <w:t xml:space="preserve">        meta={'qianwen_submission_attempted':True}</w:t>
+      </w:r>
+    </w:p>
+    <w:p>
+      <w:pPr>
+        <w:pStyle w:val="SourceCode"/>
+      </w:pPr>
+      <w:r>
+        <w:t xml:space="preserve">        with tempfile.TemporaryDirectory() as tmp,patch.object(browser.time,'monotonic',side_effect=[0,0,130]):</w:t>
+      </w:r>
+    </w:p>
+    <w:p>
+      <w:pPr>
+        <w:pStyle w:val="SourceCode"/>
+      </w:pPr>
+      <w:r>
+        <w:t xml:space="preserve">            with self.assertRaisesRegex(RuntimeError,'未出现本次上传记录'):</w:t>
+      </w:r>
+    </w:p>
+    <w:p>
+      <w:pPr>
+        <w:pStyle w:val="SourceCode"/>
+      </w:pPr>
+      <w:r>
+        <w:t xml:space="preserve">                browser.confirm_submission(page,'test-task',Path(tmp),meta,lambda *args:None)</w:t>
+      </w:r>
+    </w:p>
+    <w:p>
+      <w:pPr>
+        <w:pStyle w:val="SourceCode"/>
+      </w:pPr>
+      <w:r>
+        <w:t xml:space="preserve">        self.assertFalse(meta.get('qianwen_upload_confirmed',False))</w:t>
+      </w:r>
+    </w:p>
+    <w:p>
+      <w:pPr>
+        <w:pStyle w:val="SourceCode"/>
+      </w:pPr>
+      <w:r>
+        <w:t xml:space="preserve">        self.assertEqual(meta['state'],'cloud_confirming_upload')</w:t>
+      </w:r>
+    </w:p>
+    <w:p>
+      <w:pPr>
+        <w:pStyle w:val="SourceCode"/>
+      </w:pPr>
+      <w:r>
+        <w:t xml:space="preserve">        page.screenshot.assert_called_once()</w:t>
+      </w:r>
+    </w:p>
+    <w:p>
+      <w:pPr>
+        <w:pStyle w:val="SourceCode"/>
+      </w:pPr>
+      <w:r/>
+    </w:p>
+    <w:p>
+      <w:pPr>
+        <w:pStyle w:val="SourceCode"/>
+      </w:pPr>
+      <w:r>
         <w:t>if __name__=='__main__':unittest.main()</w:t>
       </w:r>
     </w:p>
@@ -14887,7 +15322,7 @@
         <w:pStyle w:val="SourceCode"/>
       </w:pPr>
       <w:r>
-        <w:t xml:space="preserve">  "qianwen_browser.py": "3f2f4655e7ddd3dfdc4a19b85d4b0b25959803baee841cd43523e55fc5c367b4",</w:t>
+        <w:t xml:space="preserve">  "qianwen_browser.py": "08f4b1bebdc4864c6c7a10a4ade69133aeb6cff622bdb8548777ab5902113990",</w:t>
       </w:r>
     </w:p>
     <w:p>
@@ -14911,7 +15346,7 @@
         <w:pStyle w:val="SourceCode"/>
       </w:pPr>
       <w:r>
-        <w:t xml:space="preserve">  "index.html": "7a96b77ad812eb08159432d66d118916e31dea5f775996a5d68a41991f9fe9cc",</w:t>
+        <w:t xml:space="preserve">  "index.html": "c08bc216839f6f4e340af83ff3aa4e3969d033658155e192d3e1b5b05c3aa354",</w:t>
       </w:r>
     </w:p>
     <w:p>
@@ -15047,7 +15482,7 @@
         <w:pStyle w:val="SourceCode"/>
       </w:pPr>
       <w:r>
-        <w:t xml:space="preserve">  "test_qianwen.py": "8c7b820b2a463d3eb009a2a0affa96927a3acca9889ab84c420657a630031ac1",</w:t>
+        <w:t xml:space="preserve">  "test_qianwen.py": "dcf2db859a38b71f34ff920e1ec735b87c6a93e3b04f645f0b17b3a429733790",</w:t>
       </w:r>
     </w:p>
     <w:p>

</xml_diff>

<commit_message>
Detect Qianwen storage quota rejection and preserve audio for retry
</commit_message>
<xml_diff>
--- a/安装与使用指南.docx
+++ b/安装与使用指南.docx
@@ -203,7 +203,7 @@
     </w:p>
     <w:p>
       <w:r>
-        <w:t>页面加载超时会自动重试，最多3次；复用已经提交的千问任务和保存的文稿链接，不重复上传。登录失效立即提示用户，不自动反复尝试登录。导出菜单等待可见及选项完整后才操作。加载异常保留媒体和页面诊断，文稿验证失败不清理源文件。自动恢复不能保证第三方改版、网络中断或服务限额永不影响任务。</w:t>
+        <w:t>页面加载超时会自动重试，最多3次；复用已经提交的千问任务和保存的文稿链接，不重复上传。登录失效立即提示用户，不自动反复尝试登录。导出菜单等待可见及选项完整后才操作。加载异常保留媒体和页面诊断，文稿验证失败不清理源文件。千问提示云端存储已满时立即停止并保留本机音频；请用户自行清理千问记录后重试，工具不会删除云端记录。自动恢复不能保证第三方改版、网络中断或服务限额永不影响任务。</w:t>
       </w:r>
     </w:p>
     <w:p>
@@ -337,7 +337,7 @@
     </w:p>
     <w:p>
       <w:r>
-        <w:t>本次 32 项测试通过，其中云端识别返回结果在单元测试中模拟；旧本地推理断点测试已移除。此前本机20秒音频的千问后台完整流程约46秒，不能推断长视频速度或识别准确率。未在另一台全新 Mac 完成安装实测。</w:t>
+        <w:t>本次 33 项测试通过，其中云端识别返回结果在单元测试中模拟；旧本地推理断点测试已移除。此前本机20秒音频的千问后台完整流程约46秒，不能推断长视频速度或识别准确率。未在另一台全新 Mac 完成安装实测。</w:t>
       </w:r>
     </w:p>
     <w:p>
@@ -6322,6 +6322,38 @@
         <w:pStyle w:val="SourceCode"/>
       </w:pPr>
       <w:r>
+        <w:t xml:space="preserve">            if '存储已满' in body and '删除不用的记录' in body:</w:t>
+      </w:r>
+    </w:p>
+    <w:p>
+      <w:pPr>
+        <w:pStyle w:val="SourceCode"/>
+      </w:pPr>
+      <w:r>
+        <w:t xml:space="preserve">                meta.update(qianwen_submission_attempted=False,qianwen_submitted=False,qianwen_upload_confirmed=False)</w:t>
+      </w:r>
+    </w:p>
+    <w:p>
+      <w:pPr>
+        <w:pStyle w:val="SourceCode"/>
+      </w:pPr>
+      <w:r>
+        <w:t xml:space="preserve">                save(job/'job.json',meta)</w:t>
+      </w:r>
+    </w:p>
+    <w:p>
+      <w:pPr>
+        <w:pStyle w:val="SourceCode"/>
+      </w:pPr>
+      <w:r>
+        <w:t xml:space="preserve">                raise RuntimeError('千问账号云端存储已满，请在千问中自行删除不需要的记录后重试。本机音频已保留；工具不会删除云端记录。')</w:t>
+      </w:r>
+    </w:p>
+    <w:p>
+      <w:pPr>
+        <w:pStyle w:val="SourceCode"/>
+      </w:pPr>
+      <w:r>
         <w:t xml:space="preserve">            meta['last_browser_check']=time.time();save(job/'job.json',meta)</w:t>
       </w:r>
     </w:p>
@@ -13106,6 +13138,116 @@
         <w:pStyle w:val="SourceCode"/>
       </w:pPr>
       <w:r>
+        <w:t xml:space="preserve">    def test_cloud_storage_full_stops_without_claiming_upload(self):</w:t>
+      </w:r>
+    </w:p>
+    <w:p>
+      <w:pPr>
+        <w:pStyle w:val="SourceCode"/>
+      </w:pPr>
+      <w:r>
+        <w:t xml:space="preserve">        from playwright.sync_api import TimeoutError</w:t>
+      </w:r>
+    </w:p>
+    <w:p>
+      <w:pPr>
+        <w:pStyle w:val="SourceCode"/>
+      </w:pPr>
+      <w:r>
+        <w:t xml:space="preserve">        import qianwen_browser as browser</w:t>
+      </w:r>
+    </w:p>
+    <w:p>
+      <w:pPr>
+        <w:pStyle w:val="SourceCode"/>
+      </w:pPr>
+      <w:r>
+        <w:t xml:space="preserve">        page=self.page()</w:t>
+      </w:r>
+    </w:p>
+    <w:p>
+      <w:pPr>
+        <w:pStyle w:val="SourceCode"/>
+      </w:pPr>
+      <w:r>
+        <w:t xml:space="preserve">        page.get_by_text.return_value.filter.return_value.first.wait_for.side_effect=TimeoutError('absent')</w:t>
+      </w:r>
+    </w:p>
+    <w:p>
+      <w:pPr>
+        <w:pStyle w:val="SourceCode"/>
+      </w:pPr>
+      <w:r>
+        <w:t xml:space="preserve">        page.locator.return_value.inner_text.return_value='任务添加成功，请在「我的记录」查看进展\n存储已满\n请删除不用的记录后重试'</w:t>
+      </w:r>
+    </w:p>
+    <w:p>
+      <w:pPr>
+        <w:pStyle w:val="SourceCode"/>
+      </w:pPr>
+      <w:r>
+        <w:t xml:space="preserve">        meta={'qianwen_submission_attempted':True}</w:t>
+      </w:r>
+    </w:p>
+    <w:p>
+      <w:pPr>
+        <w:pStyle w:val="SourceCode"/>
+      </w:pPr>
+      <w:r>
+        <w:t xml:space="preserve">        with tempfile.TemporaryDirectory() as tmp:</w:t>
+      </w:r>
+    </w:p>
+    <w:p>
+      <w:pPr>
+        <w:pStyle w:val="SourceCode"/>
+      </w:pPr>
+      <w:r>
+        <w:t xml:space="preserve">            with self.assertRaisesRegex(RuntimeError,'云端存储已满'):</w:t>
+      </w:r>
+    </w:p>
+    <w:p>
+      <w:pPr>
+        <w:pStyle w:val="SourceCode"/>
+      </w:pPr>
+      <w:r>
+        <w:t xml:space="preserve">                browser.confirm_submission(page,'test-task',Path(tmp),meta,lambda *args:None)</w:t>
+      </w:r>
+    </w:p>
+    <w:p>
+      <w:pPr>
+        <w:pStyle w:val="SourceCode"/>
+      </w:pPr>
+      <w:r>
+        <w:t xml:space="preserve">        self.assertFalse(meta['qianwen_upload_confirmed'])</w:t>
+      </w:r>
+    </w:p>
+    <w:p>
+      <w:pPr>
+        <w:pStyle w:val="SourceCode"/>
+      </w:pPr>
+      <w:r>
+        <w:t xml:space="preserve">        self.assertFalse(meta['qianwen_submission_attempted'])</w:t>
+      </w:r>
+    </w:p>
+    <w:p>
+      <w:pPr>
+        <w:pStyle w:val="SourceCode"/>
+      </w:pPr>
+      <w:r>
+        <w:t xml:space="preserve">        page.get_by_text.return_value.filter.return_value.first.wait_for.assert_called_once()</w:t>
+      </w:r>
+    </w:p>
+    <w:p>
+      <w:pPr>
+        <w:pStyle w:val="SourceCode"/>
+      </w:pPr>
+      <w:r/>
+    </w:p>
+    <w:p>
+      <w:pPr>
+        <w:pStyle w:val="SourceCode"/>
+      </w:pPr>
+      <w:r>
         <w:t>if __name__=='__main__':unittest.main()</w:t>
       </w:r>
     </w:p>
@@ -15386,7 +15528,7 @@
         <w:pStyle w:val="SourceCode"/>
       </w:pPr>
       <w:r>
-        <w:t xml:space="preserve">  "qianwen_browser.py": "a74a740d10aab38cb06d437790da78ea05967a12c43ac6f2d06177cc95e8fbf5",</w:t>
+        <w:t xml:space="preserve">  "qianwen_browser.py": "3bb869a22ef027895843a88483dbff0b53d683dc62dc41f1fd5432537e7c731f",</w:t>
       </w:r>
     </w:p>
     <w:p>
@@ -15546,7 +15688,7 @@
         <w:pStyle w:val="SourceCode"/>
       </w:pPr>
       <w:r>
-        <w:t xml:space="preserve">  "test_qianwen.py": "0b24553adaa36ffe63477fbc4eaeeafbaa10d2f50b69cc5c2279b3a2bf469fbe",</w:t>
+        <w:t xml:space="preserve">  "test_qianwen.py": "7b8c1ecf5a9060993d18d3f62c8d7cd171697cb3d8574a2a469b3f11f1a06740",</w:t>
       </w:r>
     </w:p>
     <w:p>

</xml_diff>

<commit_message>
Show explicit cloud error alerts and move Qianwen login beside title
</commit_message>
<xml_diff>
--- a/安装与使用指南.docx
+++ b/安装与使用指南.docx
@@ -79,7 +79,7 @@
     </w:p>
     <w:p>
       <w:r>
-        <w:t>页面上有蓝色“千问登录”按钮。识别任务检测到登录失效后显示需要重新登录；点击按钮登录、关闭登录窗口，再点击重试。空闲时不保证实时发现过期，也不会主动抢占屏幕。</w:t>
+        <w:t>页面上有标题旁蓝色“登录千问”按钮。识别任务检测到登录失效后显示需要重新登录；点击按钮登录、关闭登录窗口，再点击重试。空闲时不保证实时发现过期，也不会主动抢占屏幕。</w:t>
       </w:r>
     </w:p>
     <w:p>
@@ -203,7 +203,7 @@
     </w:p>
     <w:p>
       <w:r>
-        <w:t>页面加载超时会自动重试，最多3次；复用已经提交的千问任务和保存的文稿链接，不重复上传。登录失效立即提示用户，不自动反复尝试登录。导出菜单等待可见及选项完整后才操作。加载异常保留媒体和页面诊断，文稿验证失败不清理源文件。千问提示云端存储已满时立即停止并保留本机音频；请用户自行清理千问记录后重试，工具不会删除云端记录。自动恢复不能保证第三方改版、网络中断或服务限额永不影响任务。</w:t>
+        <w:t>页面加载超时会自动重试，最多3次；复用已经提交的千问任务和保存的文稿链接，不重复上传。登录失效立即提示用户，不自动反复尝试登录。导出菜单等待可见及选项完整后才操作。加载异常保留媒体和页面诊断，文稿验证失败不清理源文件。工具会显示千问页面明确可见的错误提示（如上传失败、额度不足、服务异常），保留文件供重试；未明确报错时不推断原因。千问提示云端存储已满时立即停止并保留本机音频；请用户自行清理千问记录后重试，工具不会删除云端记录。自动恢复不能保证第三方改版、网络中断或服务限额永不影响任务。</w:t>
       </w:r>
     </w:p>
     <w:p>
@@ -337,7 +337,7 @@
     </w:p>
     <w:p>
       <w:r>
-        <w:t>本次 33 项测试通过，其中云端识别返回结果在单元测试中模拟；旧本地推理断点测试已移除。此前本机20秒音频的千问后台完整流程约46秒，不能推断长视频速度或识别准确率。未在另一台全新 Mac 完成安装实测。</w:t>
+        <w:t>本次 35 项测试通过，其中云端识别返回结果在单元测试中模拟；旧本地推理断点测试已移除。此前本机20秒音频的千问后台完整流程约46秒，不能推断长视频速度或识别准确率。未在另一台全新 Mac 完成安装实测。</w:t>
       </w:r>
     </w:p>
     <w:p>
@@ -3860,7 +3860,7 @@
         <w:pStyle w:val="SourceCode"/>
       </w:pPr>
       <w:r>
-        <w:t>body{font:16px/1.7 -apple-system,BlinkMacSystemFont,sans-serif;color:#24322d;background:#f4f6f3;max-width:920px;margin:48px auto;padding:0 24px}h1{font-size:32px}input,button,.action{font:inherit;padding:10px 14px;border:1px solid #c6d1ca;border-radius:8px}input[type=url]{flex:1;min-width:180px}button,.action{background:#245441;color:white;cursor:pointer;text-decoration:none;display:inline-block}form,.actions{display:flex;gap:12px;flex-wrap:wrap}article{background:white;padding:24px;border:1px solid #e0e7e1;border-radius:12px;margin:20px 0}small{color:#62736b}a{color:#245441}#message{color:#8b4520}.notice{background:#fff3cd;color:#9c0006;padding:14px 18px;border-left:4px solid #b07800;font-weight:bold}.secondary{background:white;color:#245441}</w:t>
+        <w:t>body{font:16px/1.7 -apple-system,BlinkMacSystemFont,sans-serif;color:#24322d;background:#f4f6f3;max-width:920px;margin:48px auto;padding:0 24px}h1{font-size:32px}h1 button{font-size:16px;font-weight:normal;vertical-align:middle;white-space:nowrap}input,button,.action{font:inherit;padding:10px 14px;border:1px solid #c6d1ca;border-radius:8px}input[type=url]{flex:1;min-width:180px}button,.action{background:#245441;color:white;cursor:pointer;text-decoration:none;display:inline-block}form,.actions{display:flex;gap:12px;flex-wrap:wrap}article{background:white;padding:24px;border:1px solid #e0e7e1;border-radius:12px;margin:20px 0}small{color:#62736b}a{color:#245441}#message{color:#8b4520}.notice{background:#fff3cd;color:#9c0006;padding:14px 18px;border-left:4px solid #b07800;font-weight:bold}.secondary{background:white;color:#245441}</w:t>
       </w:r>
     </w:p>
     <w:p>
@@ -3876,7 +3876,7 @@
         <w:pStyle w:val="SourceCode"/>
       </w:pPr>
       <w:r>
-        <w:t>&lt;h1&gt;网页视频转语音识别文字稿（由千问提供支持）&lt;/h1&gt;</w:t>
+        <w:t>&lt;h1&gt;网页视频转语音识别文字稿（由千问提供支持） &lt;button type="button" id="qianwen-login"&gt;登录千问&lt;/button&gt;&lt;/h1&gt;</w:t>
       </w:r>
     </w:p>
     <w:p>
@@ -3900,7 +3900,7 @@
         <w:pStyle w:val="SourceCode"/>
       </w:pPr>
       <w:r>
-        <w:t>&lt;p class="actions"&gt;&lt;button type="button" id="qianwen-login"&gt;千问登录&lt;/button&gt;&lt;span id="login-status" role="status"&gt;正在读取千问登录状态…&lt;/span&gt;&lt;/p&gt;&lt;p id="message" role="status"&gt;&lt;/p&gt;</w:t>
+        <w:t>&lt;p class="actions"&gt;&lt;span id="login-status" role="status"&gt;正在读取登录千问状态…&lt;/span&gt;&lt;/p&gt;&lt;p id="message" role="status"&gt;&lt;/p&gt;</w:t>
       </w:r>
     </w:p>
     <w:p>
@@ -3916,7 +3916,7 @@
         <w:pStyle w:val="SourceCode"/>
       </w:pPr>
       <w:r>
-        <w:t>&lt;p&gt;&lt;small&gt;Word 保存到“下载/网页视频转语音识别文字稿（由千问提供支持）”。音频将上传千问服务器；需要登录时点击上方“千问登录”。完成后直接查看或打开所在位置。Word 完整性检查通过后自动将原音视频移入废纸篓并清理临时音轨。&lt;/small&gt;&lt;/p&gt;</w:t>
+        <w:t>&lt;p&gt;&lt;small&gt;Word 保存到“下载/网页视频转语音识别文字稿（由千问提供支持）”。音频将上传千问服务器；需要登录时点击上方“登录千问”。完成后直接查看或打开所在位置。Word 完整性检查通过后自动将原音视频移入废纸篓并清理临时音轨。&lt;/small&gt;&lt;/p&gt;</w:t>
       </w:r>
     </w:p>
     <w:p>
@@ -3940,6 +3940,14 @@
         <w:pStyle w:val="SourceCode"/>
       </w:pPr>
       <w:r>
+        <w:t>if(location.port==='8767')location.replace('http://127.0.0.1:8768/');</w:t>
+      </w:r>
+    </w:p>
+    <w:p>
+      <w:pPr>
+        <w:pStyle w:val="SourceCode"/>
+      </w:pPr>
+      <w:r>
         <w:t>const historicalTaskTimes={};</w:t>
       </w:r>
     </w:p>
@@ -3980,7 +3988,7 @@
         <w:pStyle w:val="SourceCode"/>
       </w:pPr>
       <w:r>
-        <w:t>async function refreshLogin(){try{let h=await(await fetch('/health')).json();if(!h.task_controls){document.querySelector('#login-status').textContent='新功能需要加载本次更新';return}let s=await(await fetch('/qianwen/status')).json();let text=s.window_open?'请在千问窗口中完成登录，完成后关闭窗口':s.status==='required'?'千问需要重新登录，请点击左侧按钮':s.last_success?'最近成功转写：'+new Date(s.last_success*1000).toLocaleString()+'；任务中会继续验证登录':'登录状态待验证；首次使用请点击千问登录';document.querySelector('#login-status').textContent=s.error||text}catch(e){document.querySelector('#login-status').textContent='暂时无法读取登录状态'}}</w:t>
+        <w:t>async function refreshLogin(){try{let h=await(await fetch('/health')).json();if(!h.task_controls){document.querySelector('#login-status').textContent='新功能需要加载本次更新';return}let s=await(await fetch('/qianwen/status')).json();let text=s.window_open?'请在千问窗口中完成登录，完成后关闭窗口':s.status==='required'?'千问需要重新登录，请点击标题旁的“登录千问”按钮':s.last_success?'最近成功转写：'+new Date(s.last_success*1000).toLocaleString()+'；任务中会继续验证登录':'登录状态待验证；首次使用请点击登录千问';document.querySelector('#login-status').textContent=s.error||text}catch(e){document.querySelector('#login-status').textContent='暂时无法读取登录状态'}}</w:t>
       </w:r>
     </w:p>
     <w:p>
@@ -3996,7 +4004,7 @@
         <w:pStyle w:val="SourceCode"/>
       </w:pPr>
       <w:r>
-        <w:t>document.querySelector('#form').onsubmit=async e=&gt;{e.preventDefault();try{if('qianwen'==='qianwen'){let health=await(await fetch('/health')).json();if(!health.engines?.includes('qianwen'))throw Error('网页服务需要加载新版。请完成千问登录配置后再试。')}await post('/jobs',{url:document.querySelector('#url').value,engine:'qianwen'});document.querySelector('#url').value='';msg.textContent='已加入后台队列。你可以继续做其他事情，稍后回来查看文稿。';await refresh()}catch(e){msg.textContent=e.message}};</w:t>
+        <w:t>document.querySelector('#form').onsubmit=async e=&gt;{e.preventDefault();try{if('qianwen'==='qianwen'){let health=await(await fetch('/health')).json();if(!health.engines?.includes('qianwen'))throw Error('网页服务需要加载新版。请完成登录千问配置后再试。')}await post('/jobs',{url:document.querySelector('#url').value,engine:'qianwen'});document.querySelector('#url').value='';msg.textContent='已加入后台队列。你可以继续做其他事情，稍后回来查看文稿。';await refresh()}catch(e){msg.textContent=e.message}};</w:t>
       </w:r>
     </w:p>
     <w:p>
@@ -5786,7 +5794,7 @@
         <w:pStyle w:val="SourceCode"/>
       </w:pPr>
       <w:r>
-        <w:t xml:space="preserve">            raise LoginRequired('千问需要重新登录或完成验证。请点击页面上的“千问登录”，完成后重试任务。')</w:t>
+        <w:t xml:space="preserve">            raise LoginRequired('千问需要重新登录或完成验证。请点击页面上的“登录千问”，完成后重试任务。')</w:t>
       </w:r>
     </w:p>
     <w:p>
@@ -5826,7 +5834,7 @@
         <w:pStyle w:val="SourceCode"/>
       </w:pPr>
       <w:r>
-        <w:t xml:space="preserve">        raise LoginRequired('千问登录已失效，请点击“千问登录”重新登录后重试。')</w:t>
+        <w:t xml:space="preserve">        raise LoginRequired('千问登录已失效，请点击“登录千问”重新登录后重试。')</w:t>
       </w:r>
     </w:p>
     <w:p>
@@ -5846,6 +5854,98 @@
         <w:pStyle w:val="SourceCode"/>
       </w:pPr>
       <w:r>
+        <w:t>def require_cloud_available(page):</w:t>
+      </w:r>
+    </w:p>
+    <w:p>
+      <w:pPr>
+        <w:pStyle w:val="SourceCode"/>
+      </w:pPr>
+      <w:r>
+        <w:t xml:space="preserve">    """Surface explicit visible errors, without interpreting transcript text as errors."""</w:t>
+      </w:r>
+    </w:p>
+    <w:p>
+      <w:pPr>
+        <w:pStyle w:val="SourceCode"/>
+      </w:pPr>
+      <w:r>
+        <w:t xml:space="preserve">    messages=[]</w:t>
+      </w:r>
+    </w:p>
+    <w:p>
+      <w:pPr>
+        <w:pStyle w:val="SourceCode"/>
+      </w:pPr>
+      <w:r>
+        <w:t xml:space="preserve">    for alert in page.get_by_role('alert').all():</w:t>
+      </w:r>
+    </w:p>
+    <w:p>
+      <w:pPr>
+        <w:pStyle w:val="SourceCode"/>
+      </w:pPr>
+      <w:r>
+        <w:t xml:space="preserve">        if alert.is_visible():</w:t>
+      </w:r>
+    </w:p>
+    <w:p>
+      <w:pPr>
+        <w:pStyle w:val="SourceCode"/>
+      </w:pPr>
+      <w:r>
+        <w:t xml:space="preserve">            text=alert.inner_text().strip()</w:t>
+      </w:r>
+    </w:p>
+    <w:p>
+      <w:pPr>
+        <w:pStyle w:val="SourceCode"/>
+      </w:pPr>
+      <w:r>
+        <w:t xml:space="preserve">            if re.search('失败|出错|错误|异常|已满|超限|不足|重试|限制|不可用',text):</w:t>
+      </w:r>
+    </w:p>
+    <w:p>
+      <w:pPr>
+        <w:pStyle w:val="SourceCode"/>
+      </w:pPr>
+      <w:r>
+        <w:t xml:space="preserve">                messages.append(text)</w:t>
+      </w:r>
+    </w:p>
+    <w:p>
+      <w:pPr>
+        <w:pStyle w:val="SourceCode"/>
+      </w:pPr>
+      <w:r>
+        <w:t xml:space="preserve">    if messages:</w:t>
+      </w:r>
+    </w:p>
+    <w:p>
+      <w:pPr>
+        <w:pStyle w:val="SourceCode"/>
+      </w:pPr>
+      <w:r>
+        <w:t xml:space="preserve">        raise RuntimeError('千问页面提示：'+'；'.join(messages)+'。本机文件已保留，请处理后重试。')</w:t>
+      </w:r>
+    </w:p>
+    <w:p>
+      <w:pPr>
+        <w:pStyle w:val="SourceCode"/>
+      </w:pPr>
+      <w:r/>
+    </w:p>
+    <w:p>
+      <w:pPr>
+        <w:pStyle w:val="SourceCode"/>
+      </w:pPr>
+      <w:r/>
+    </w:p>
+    <w:p>
+      <w:pPr>
+        <w:pStyle w:val="SourceCode"/>
+      </w:pPr>
+      <w:r>
         <w:t>@contextmanager</w:t>
       </w:r>
     </w:p>
@@ -6354,6 +6454,14 @@
         <w:pStyle w:val="SourceCode"/>
       </w:pPr>
       <w:r>
+        <w:t xml:space="preserve">            require_cloud_available(page)</w:t>
+      </w:r>
+    </w:p>
+    <w:p>
+      <w:pPr>
+        <w:pStyle w:val="SourceCode"/>
+      </w:pPr>
+      <w:r>
         <w:t xml:space="preserve">            meta['last_browser_check']=time.time();save(job/'job.json',meta)</w:t>
       </w:r>
     </w:p>
@@ -6750,6 +6858,14 @@
         <w:pStyle w:val="SourceCode"/>
       </w:pPr>
       <w:r>
+        <w:t xml:space="preserve">                    require_cloud_available(page)</w:t>
+      </w:r>
+    </w:p>
+    <w:p>
+      <w:pPr>
+        <w:pStyle w:val="SourceCode"/>
+      </w:pPr>
+      <w:r>
         <w:t xml:space="preserve">                    from playwright.sync_api import TimeoutError as BrowserTimeout</w:t>
       </w:r>
     </w:p>
@@ -6918,6 +7034,14 @@
         <w:pStyle w:val="SourceCode"/>
       </w:pPr>
       <w:r>
+        <w:t xml:space="preserve">            require_cloud_available(page)</w:t>
+      </w:r>
+    </w:p>
+    <w:p>
+      <w:pPr>
+        <w:pStyle w:val="SourceCode"/>
+      </w:pPr>
+      <w:r>
         <w:t xml:space="preserve">            page.get_by_role('button', name='导出', exact=True).click()</w:t>
       </w:r>
     </w:p>
@@ -13248,6 +13372,154 @@
         <w:pStyle w:val="SourceCode"/>
       </w:pPr>
       <w:r>
+        <w:t>class CloudErrorTests(unittest.TestCase):</w:t>
+      </w:r>
+    </w:p>
+    <w:p>
+      <w:pPr>
+        <w:pStyle w:val="SourceCode"/>
+      </w:pPr>
+      <w:r>
+        <w:t xml:space="preserve">    def test_visible_cloud_error_is_preserved(self):</w:t>
+      </w:r>
+    </w:p>
+    <w:p>
+      <w:pPr>
+        <w:pStyle w:val="SourceCode"/>
+      </w:pPr>
+      <w:r>
+        <w:t xml:space="preserve">        from unittest.mock import MagicMock</w:t>
+      </w:r>
+    </w:p>
+    <w:p>
+      <w:pPr>
+        <w:pStyle w:val="SourceCode"/>
+      </w:pPr>
+      <w:r>
+        <w:t xml:space="preserve">        from qianwen_browser import require_cloud_available</w:t>
+      </w:r>
+    </w:p>
+    <w:p>
+      <w:pPr>
+        <w:pStyle w:val="SourceCode"/>
+      </w:pPr>
+      <w:r>
+        <w:t xml:space="preserve">        page=MagicMock();alert=MagicMock()</w:t>
+      </w:r>
+    </w:p>
+    <w:p>
+      <w:pPr>
+        <w:pStyle w:val="SourceCode"/>
+      </w:pPr>
+      <w:r>
+        <w:t xml:space="preserve">        alert.is_visible.return_value=True;alert.inner_text.return_value='上传失败，请稍后重试'</w:t>
+      </w:r>
+    </w:p>
+    <w:p>
+      <w:pPr>
+        <w:pStyle w:val="SourceCode"/>
+      </w:pPr>
+      <w:r>
+        <w:t xml:space="preserve">        page.get_by_role.return_value.all.return_value=[alert]</w:t>
+      </w:r>
+    </w:p>
+    <w:p>
+      <w:pPr>
+        <w:pStyle w:val="SourceCode"/>
+      </w:pPr>
+      <w:r>
+        <w:t xml:space="preserve">        with self.assertRaisesRegex(RuntimeError,'上传失败，请稍后重试'):</w:t>
+      </w:r>
+    </w:p>
+    <w:p>
+      <w:pPr>
+        <w:pStyle w:val="SourceCode"/>
+      </w:pPr>
+      <w:r>
+        <w:t xml:space="preserve">            require_cloud_available(page)</w:t>
+      </w:r>
+    </w:p>
+    <w:p>
+      <w:pPr>
+        <w:pStyle w:val="SourceCode"/>
+      </w:pPr>
+      <w:r/>
+    </w:p>
+    <w:p>
+      <w:pPr>
+        <w:pStyle w:val="SourceCode"/>
+      </w:pPr>
+      <w:r>
+        <w:t xml:space="preserve">    def test_success_or_hidden_alert_does_not_fail_task(self):</w:t>
+      </w:r>
+    </w:p>
+    <w:p>
+      <w:pPr>
+        <w:pStyle w:val="SourceCode"/>
+      </w:pPr>
+      <w:r>
+        <w:t xml:space="preserve">        from unittest.mock import MagicMock</w:t>
+      </w:r>
+    </w:p>
+    <w:p>
+      <w:pPr>
+        <w:pStyle w:val="SourceCode"/>
+      </w:pPr>
+      <w:r>
+        <w:t xml:space="preserve">        from qianwen_browser import require_cloud_available</w:t>
+      </w:r>
+    </w:p>
+    <w:p>
+      <w:pPr>
+        <w:pStyle w:val="SourceCode"/>
+      </w:pPr>
+      <w:r>
+        <w:t xml:space="preserve">        page=MagicMock();success=MagicMock();hidden=MagicMock()</w:t>
+      </w:r>
+    </w:p>
+    <w:p>
+      <w:pPr>
+        <w:pStyle w:val="SourceCode"/>
+      </w:pPr>
+      <w:r>
+        <w:t xml:space="preserve">        success.is_visible.return_value=True;success.inner_text.return_value='任务添加成功'</w:t>
+      </w:r>
+    </w:p>
+    <w:p>
+      <w:pPr>
+        <w:pStyle w:val="SourceCode"/>
+      </w:pPr>
+      <w:r>
+        <w:t xml:space="preserve">        hidden.is_visible.return_value=False;hidden.inner_text.return_value='上传失败'</w:t>
+      </w:r>
+    </w:p>
+    <w:p>
+      <w:pPr>
+        <w:pStyle w:val="SourceCode"/>
+      </w:pPr>
+      <w:r>
+        <w:t xml:space="preserve">        page.get_by_role.return_value.all.return_value=[success,hidden]</w:t>
+      </w:r>
+    </w:p>
+    <w:p>
+      <w:pPr>
+        <w:pStyle w:val="SourceCode"/>
+      </w:pPr>
+      <w:r>
+        <w:t xml:space="preserve">        require_cloud_available(page)</w:t>
+      </w:r>
+    </w:p>
+    <w:p>
+      <w:pPr>
+        <w:pStyle w:val="SourceCode"/>
+      </w:pPr>
+      <w:r/>
+    </w:p>
+    <w:p>
+      <w:pPr>
+        <w:pStyle w:val="SourceCode"/>
+      </w:pPr>
+      <w:r>
         <w:t>if __name__=='__main__':unittest.main()</w:t>
       </w:r>
     </w:p>
@@ -15528,7 +15800,7 @@
         <w:pStyle w:val="SourceCode"/>
       </w:pPr>
       <w:r>
-        <w:t xml:space="preserve">  "qianwen_browser.py": "3bb869a22ef027895843a88483dbff0b53d683dc62dc41f1fd5432537e7c731f",</w:t>
+        <w:t xml:space="preserve">  "qianwen_browser.py": "1c0d273d18ebe5451362705781360aeea8e6cc68368746de1edc392334483172",</w:t>
       </w:r>
     </w:p>
     <w:p>
@@ -15552,7 +15824,7 @@
         <w:pStyle w:val="SourceCode"/>
       </w:pPr>
       <w:r>
-        <w:t xml:space="preserve">  "index.html": "c08bc216839f6f4e340af83ff3aa4e3969d033658155e192d3e1b5b05c3aa354",</w:t>
+        <w:t xml:space="preserve">  "index.html": "813cbd9f9b8dbccbd1e8c63d3b7170a34082ad7bbdb94d01ad815d8f023b8cba",</w:t>
       </w:r>
     </w:p>
     <w:p>
@@ -15688,7 +15960,7 @@
         <w:pStyle w:val="SourceCode"/>
       </w:pPr>
       <w:r>
-        <w:t xml:space="preserve">  "test_qianwen.py": "7b8c1ecf5a9060993d18d3f62c8d7cd171697cb3d8574a2a469b3f11f1a06740",</w:t>
+        <w:t xml:space="preserve">  "test_qianwen.py": "0c88e4472bcfdabc026b5e01398f7d55061d3530500884db4cb5078a771a4b38",</w:t>
       </w:r>
     </w:p>
     <w:p>

</xml_diff>

<commit_message>
Reduce Qianwen login button size
</commit_message>
<xml_diff>
--- a/安装与使用指南.docx
+++ b/安装与使用指南.docx
@@ -3860,7 +3860,7 @@
         <w:pStyle w:val="SourceCode"/>
       </w:pPr>
       <w:r>
-        <w:t>body{font:16px/1.7 -apple-system,BlinkMacSystemFont,sans-serif;color:#24322d;background:#f4f6f3;max-width:920px;margin:48px auto;padding:0 24px}h1{font-size:32px}h1 button{font-size:16px;font-weight:normal;vertical-align:middle;white-space:nowrap}input,button,.action{font:inherit;padding:10px 14px;border:1px solid #c6d1ca;border-radius:8px}input[type=url]{flex:1;min-width:180px}button,.action{background:#245441;color:white;cursor:pointer;text-decoration:none;display:inline-block}form,.actions{display:flex;gap:12px;flex-wrap:wrap}article{background:white;padding:24px;border:1px solid #e0e7e1;border-radius:12px;margin:20px 0}small{color:#62736b}a{color:#245441}#message{color:#8b4520}.notice{background:#fff3cd;color:#9c0006;padding:14px 18px;border-left:4px solid #b07800;font-weight:bold}.secondary{background:white;color:#245441}</w:t>
+        <w:t>body{font:16px/1.7 -apple-system,BlinkMacSystemFont,sans-serif;color:#24322d;background:#f4f6f3;max-width:920px;margin:48px auto;padding:0 24px}h1{font-size:32px}h1 button{font-size:14px;padding:6px 10px;font-weight:normal;vertical-align:middle;white-space:nowrap}input,button,.action{font:inherit;padding:10px 14px;border:1px solid #c6d1ca;border-radius:8px}input[type=url]{flex:1;min-width:180px}button,.action{background:#245441;color:white;cursor:pointer;text-decoration:none;display:inline-block}form,.actions{display:flex;gap:12px;flex-wrap:wrap}article{background:white;padding:24px;border:1px solid #e0e7e1;border-radius:12px;margin:20px 0}small{color:#62736b}a{color:#245441}#message{color:#8b4520}.notice{background:#fff3cd;color:#9c0006;padding:14px 18px;border-left:4px solid #b07800;font-weight:bold}.secondary{background:white;color:#245441}</w:t>
       </w:r>
     </w:p>
     <w:p>
@@ -15824,7 +15824,7 @@
         <w:pStyle w:val="SourceCode"/>
       </w:pPr>
       <w:r>
-        <w:t xml:space="preserve">  "index.html": "813cbd9f9b8dbccbd1e8c63d3b7170a34082ad7bbdb94d01ad815d8f023b8cba",</w:t>
+        <w:t xml:space="preserve">  "index.html": "84f8937d61dd91b51b6aca64f6f7adbd090eb6d1110d01e2ad1fa77053fed5f0",</w:t>
       </w:r>
     </w:p>
     <w:p>

</xml_diff>

<commit_message>
Add local audio/video file selection and drag-drop using shared transcription button
</commit_message>
<xml_diff>
--- a/安装与使用指南.docx
+++ b/安装与使用指南.docx
@@ -46,7 +46,7 @@
     </w:p>
     <w:p>
       <w:r>
-        <w:t>3. 粘贴 YouTube、哔哩哔哩等视频页面链接，点击橙色“开始生成文稿”。任务添加成功后链接框自动清空，可继续粘贴下一条；提交失败时保留链接。链接输入框关闭浏览器历史自动填充。</w:t>
+        <w:t>3. 可点击或拖拽本地音视频文件到上传入口（每次一个，最大6GB），或粘贴 YouTube、哔哩哔哩等视频页面链接，点击橙色“开始生成文稿”。任务添加成功后链接框自动清空，可继续粘贴下一条；提交失败时保留链接。链接输入框关闭浏览器历史自动填充。</w:t>
       </w:r>
     </w:p>
     <w:p>
@@ -56,7 +56,7 @@
     </w:p>
     <w:p>
       <w:r>
-        <w:t>每份 Word 第一行保留原视频网页链接，按视频标题命名，包含全部识别原文、时间戳和发言人信息。显著提示：</w:t>
+        <w:t>本地文件与链接共用橙色“开始生成文稿”按钮，选择文件会清空链接，输入链接会取消文件选择。上传仅复制文件，完成后清理工具副本，不删除用户原文件。千问登录、原文、发言人和时间戳设置沿用现有流程。每份 Word 第一行保留原视频网页链接（本地上传则注明来源文件名），按视频标题或本地文件名命名，包含全部识别原文、时间戳和发言人信息。显著提示：</w:t>
       </w:r>
     </w:p>
     <w:p>
@@ -337,7 +337,7 @@
     </w:p>
     <w:p>
       <w:r>
-        <w:t>本次 35 项测试通过，其中云端识别返回结果在单元测试中模拟；旧本地推理断点测试已移除。此前本机20秒音频的千问后台完整流程约46秒，不能推断长视频速度或识别准确率。未在另一台全新 Mac 完成安装实测。</w:t>
+        <w:t>本次 39 项测试通过，其中云端识别返回结果在单元测试中模拟；旧本地推理断点测试已移除。此前本机20秒音频的千问后台完整流程约46秒，不能推断长视频速度或识别准确率。未在另一台全新 Mac 完成安装实测。</w:t>
       </w:r>
     </w:p>
     <w:p>
@@ -480,7 +480,7 @@
         <w:pStyle w:val="SourceCode"/>
       </w:pPr>
       <w:r>
-        <w:t>from urllib.parse import urlparse</w:t>
+        <w:t>from urllib.parse import urlparse, unquote</w:t>
       </w:r>
     </w:p>
     <w:p>
@@ -2024,7 +2024,23 @@
         <w:pStyle w:val="SourceCode"/>
       </w:pPr>
       <w:r>
-        <w:t xml:space="preserve">    if urlparse(url).scheme not in ('http', 'https') or not urlparse(url).hostname:</w:t>
+        <w:t xml:space="preserve">    ident = hashlib.sha256(url.encode()).hexdigest()[:12]</w:t>
+      </w:r>
+    </w:p>
+    <w:p>
+      <w:pPr>
+        <w:pStyle w:val="SourceCode"/>
+      </w:pPr>
+      <w:r>
+        <w:t xml:space="preserve">    local = url.startswith('local://') and (WORK/'jobs'/ident/'job.json').is_file()</w:t>
+      </w:r>
+    </w:p>
+    <w:p>
+      <w:pPr>
+        <w:pStyle w:val="SourceCode"/>
+      </w:pPr>
+      <w:r>
+        <w:t xml:space="preserve">    if not local and (urlparse(url).scheme not in ('http', 'https') or not urlparse(url).hostname):</w:t>
       </w:r>
     </w:p>
     <w:p>
@@ -2232,7 +2248,7 @@
         <w:pStyle w:val="SourceCode"/>
       </w:pPr>
       <w:r>
-        <w:t xml:space="preserve">        if not meta.get('title'):</w:t>
+        <w:t xml:space="preserve">        if not meta.get('title') and not local:</w:t>
       </w:r>
     </w:p>
     <w:p>
@@ -2268,6 +2284,256 @@
         <w:pStyle w:val="SourceCode"/>
       </w:pPr>
       <w:r>
+        <w:t>MEDIA_EXTENSIONS={'.mp4','.mov','.mkv','.webm','.avi','.wmv','.m4v','.flv','.mp3','.wav','.m4a','.aac','.ogg','.flac','.aiff','.wma','.amr','.mpeg','.mpg','.opus'}</w:t>
+      </w:r>
+    </w:p>
+    <w:p>
+      <w:pPr>
+        <w:pStyle w:val="SourceCode"/>
+      </w:pPr>
+      <w:r/>
+    </w:p>
+    <w:p>
+      <w:pPr>
+        <w:pStyle w:val="SourceCode"/>
+      </w:pPr>
+      <w:r>
+        <w:t>def receive_upload(stream, length, original_name):</w:t>
+      </w:r>
+    </w:p>
+    <w:p>
+      <w:pPr>
+        <w:pStyle w:val="SourceCode"/>
+      </w:pPr>
+      <w:r>
+        <w:t xml:space="preserve">    """Stream a browser-selected file into an isolated task; never move the user's original."""</w:t>
+      </w:r>
+    </w:p>
+    <w:p>
+      <w:pPr>
+        <w:pStyle w:val="SourceCode"/>
+      </w:pPr>
+      <w:r>
+        <w:t xml:space="preserve">    import uuid, shutil</w:t>
+      </w:r>
+    </w:p>
+    <w:p>
+      <w:pPr>
+        <w:pStyle w:val="SourceCode"/>
+      </w:pPr>
+      <w:r>
+        <w:t xml:space="preserve">    from reader import filename</w:t>
+      </w:r>
+    </w:p>
+    <w:p>
+      <w:pPr>
+        <w:pStyle w:val="SourceCode"/>
+      </w:pPr>
+      <w:r>
+        <w:t xml:space="preserve">    name=Path(original_name.replace('\\','/')).name</w:t>
+      </w:r>
+    </w:p>
+    <w:p>
+      <w:pPr>
+        <w:pStyle w:val="SourceCode"/>
+      </w:pPr>
+      <w:r>
+        <w:t xml:space="preserve">    if Path(name).suffix.lower() not in MEDIA_EXTENSIONS:</w:t>
+      </w:r>
+    </w:p>
+    <w:p>
+      <w:pPr>
+        <w:pStyle w:val="SourceCode"/>
+      </w:pPr>
+      <w:r>
+        <w:t xml:space="preserve">        raise ValueError('请选择支持的音频或视频文件')</w:t>
+      </w:r>
+    </w:p>
+    <w:p>
+      <w:pPr>
+        <w:pStyle w:val="SourceCode"/>
+      </w:pPr>
+      <w:r>
+        <w:t xml:space="preserve">    if not 0 &lt; length &lt;= 6_000_000_000:</w:t>
+      </w:r>
+    </w:p>
+    <w:p>
+      <w:pPr>
+        <w:pStyle w:val="SourceCode"/>
+      </w:pPr>
+      <w:r>
+        <w:t xml:space="preserve">        raise ValueError('文件为空或超过 6GB')</w:t>
+      </w:r>
+    </w:p>
+    <w:p>
+      <w:pPr>
+        <w:pStyle w:val="SourceCode"/>
+      </w:pPr>
+      <w:r>
+        <w:t xml:space="preserve">    url='local://'+uuid.uuid4().hex</w:t>
+      </w:r>
+    </w:p>
+    <w:p>
+      <w:pPr>
+        <w:pStyle w:val="SourceCode"/>
+      </w:pPr>
+      <w:r>
+        <w:t xml:space="preserve">    ident=hashlib.sha256(url.encode()).hexdigest()[:12]</w:t>
+      </w:r>
+    </w:p>
+    <w:p>
+      <w:pPr>
+        <w:pStyle w:val="SourceCode"/>
+      </w:pPr>
+      <w:r>
+        <w:t xml:space="preserve">    folder=WORK/'jobs'/ident</w:t>
+      </w:r>
+    </w:p>
+    <w:p>
+      <w:pPr>
+        <w:pStyle w:val="SourceCode"/>
+      </w:pPr>
+      <w:r>
+        <w:t xml:space="preserve">    media=folder/'media';media.mkdir(parents=True)</w:t>
+      </w:r>
+    </w:p>
+    <w:p>
+      <w:pPr>
+        <w:pStyle w:val="SourceCode"/>
+      </w:pPr>
+      <w:r>
+        <w:t xml:space="preserve">    target=media/(filename(Path(name).stem)+Path(name).suffix.lower())</w:t>
+      </w:r>
+    </w:p>
+    <w:p>
+      <w:pPr>
+        <w:pStyle w:val="SourceCode"/>
+      </w:pPr>
+      <w:r>
+        <w:t xml:space="preserve">    try:</w:t>
+      </w:r>
+    </w:p>
+    <w:p>
+      <w:pPr>
+        <w:pStyle w:val="SourceCode"/>
+      </w:pPr>
+      <w:r>
+        <w:t xml:space="preserve">        remaining=length</w:t>
+      </w:r>
+    </w:p>
+    <w:p>
+      <w:pPr>
+        <w:pStyle w:val="SourceCode"/>
+      </w:pPr>
+      <w:r>
+        <w:t xml:space="preserve">        with target.open('wb') as output:</w:t>
+      </w:r>
+    </w:p>
+    <w:p>
+      <w:pPr>
+        <w:pStyle w:val="SourceCode"/>
+      </w:pPr>
+      <w:r>
+        <w:t xml:space="preserve">            while remaining:</w:t>
+      </w:r>
+    </w:p>
+    <w:p>
+      <w:pPr>
+        <w:pStyle w:val="SourceCode"/>
+      </w:pPr>
+      <w:r>
+        <w:t xml:space="preserve">                chunk=stream.read(min(1024*1024,remaining))</w:t>
+      </w:r>
+    </w:p>
+    <w:p>
+      <w:pPr>
+        <w:pStyle w:val="SourceCode"/>
+      </w:pPr>
+      <w:r>
+        <w:t xml:space="preserve">                if not chunk:raise ValueError('文件上传中断，请重新选择并提交')</w:t>
+      </w:r>
+    </w:p>
+    <w:p>
+      <w:pPr>
+        <w:pStyle w:val="SourceCode"/>
+      </w:pPr>
+      <w:r>
+        <w:t xml:space="preserve">                output.write(chunk);remaining-=len(chunk)</w:t>
+      </w:r>
+    </w:p>
+    <w:p>
+      <w:pPr>
+        <w:pStyle w:val="SourceCode"/>
+      </w:pPr>
+      <w:r>
+        <w:t xml:space="preserve">        save_json(folder/'job.json',{'url':url,'source_kind':'local','source_label':'本地上传文件：'+name,</w:t>
+      </w:r>
+    </w:p>
+    <w:p>
+      <w:pPr>
+        <w:pStyle w:val="SourceCode"/>
+      </w:pPr>
+      <w:r>
+        <w:t xml:space="preserve">            'title':Path(name).stem,'name':filename(Path(name).stem),'media':str(target),</w:t>
+      </w:r>
+    </w:p>
+    <w:p>
+      <w:pPr>
+        <w:pStyle w:val="SourceCode"/>
+      </w:pPr>
+      <w:r>
+        <w:t xml:space="preserve">            'state':'queued','engine':'qianwen','created_at':time.time()})</w:t>
+      </w:r>
+    </w:p>
+    <w:p>
+      <w:pPr>
+        <w:pStyle w:val="SourceCode"/>
+      </w:pPr>
+      <w:r>
+        <w:t xml:space="preserve">        return enqueue(url)</w:t>
+      </w:r>
+    </w:p>
+    <w:p>
+      <w:pPr>
+        <w:pStyle w:val="SourceCode"/>
+      </w:pPr>
+      <w:r>
+        <w:t xml:space="preserve">    except Exception:</w:t>
+      </w:r>
+    </w:p>
+    <w:p>
+      <w:pPr>
+        <w:pStyle w:val="SourceCode"/>
+      </w:pPr>
+      <w:r>
+        <w:t xml:space="preserve">        shutil.rmtree(folder,ignore_errors=True)</w:t>
+      </w:r>
+    </w:p>
+    <w:p>
+      <w:pPr>
+        <w:pStyle w:val="SourceCode"/>
+      </w:pPr>
+      <w:r>
+        <w:t xml:space="preserve">        raise</w:t>
+      </w:r>
+    </w:p>
+    <w:p>
+      <w:pPr>
+        <w:pStyle w:val="SourceCode"/>
+      </w:pPr>
+      <w:r/>
+    </w:p>
+    <w:p>
+      <w:pPr>
+        <w:pStyle w:val="SourceCode"/>
+      </w:pPr>
+      <w:r/>
+    </w:p>
+    <w:p>
+      <w:pPr>
+        <w:pStyle w:val="SourceCode"/>
+      </w:pPr>
+      <w:r>
         <w:t>class Handler(BaseHTTPRequestHandler):</w:t>
       </w:r>
     </w:p>
@@ -2424,7 +2690,7 @@
         <w:pStyle w:val="SourceCode"/>
       </w:pPr>
       <w:r>
-        <w:t xml:space="preserve">            return self.reply(200, {'ok': True, 'project': str(ROOT), 'pid': os.getpid(), 'engines': ['qianwen'], 'task_controls': True})</w:t>
+        <w:t xml:space="preserve">            return self.reply(200, {'ok': True, 'project': str(ROOT), 'pid': os.getpid(), 'engines': ['qianwen'], 'task_controls': True, 'local_upload': True})</w:t>
       </w:r>
     </w:p>
     <w:p>
@@ -2646,6 +2912,30 @@
         <w:pStyle w:val="SourceCode"/>
       </w:pPr>
       <w:r>
+        <w:t xml:space="preserve">            if self.path == '/upload':</w:t>
+      </w:r>
+    </w:p>
+    <w:p>
+      <w:pPr>
+        <w:pStyle w:val="SourceCode"/>
+      </w:pPr>
+      <w:r>
+        <w:t xml:space="preserve">                self.connection.settimeout(120)</w:t>
+      </w:r>
+    </w:p>
+    <w:p>
+      <w:pPr>
+        <w:pStyle w:val="SourceCode"/>
+      </w:pPr>
+      <w:r>
+        <w:t xml:space="preserve">                return self.reply(200, {'id': receive_upload(self.rfile,length,unquote(self.headers.get('X-File-Name','')))})</w:t>
+      </w:r>
+    </w:p>
+    <w:p>
+      <w:pPr>
+        <w:pStyle w:val="SourceCode"/>
+      </w:pPr>
+      <w:r>
         <w:t xml:space="preserve">            if not 0 &lt; length &lt;= 5_000_000:</w:t>
       </w:r>
     </w:p>
@@ -3868,7 +4158,7 @@
         <w:pStyle w:val="SourceCode"/>
       </w:pPr>
       <w:r>
-        <w:t>#qianwen-login{background:#004B93;border-color:#004B93}#qianwen-login:hover{background:#003B75}#form button{background:#D65A00;border-color:#D65A00}#form button:hover{background:#B94D00}&lt;/style&gt;</w:t>
+        <w:t>#upload-zone{border:1px dashed #c6d1ca;border-radius:8px;padding:12px 14px;cursor:pointer;flex-basis:100%;box-sizing:border-box}#file-name{display:block;font-size:14px;color:#62736b}#form input[type=url]{order:0}#form button{order:1}#upload-zone{order:2}#qianwen-login{background:#004B93;border-color:#004B93}#qianwen-login:hover{background:#003B75}#form button{background:#D65A00;border-color:#D65A00}#form button:hover{background:#B94D00}&lt;/style&gt;</w:t>
       </w:r>
     </w:p>
     <w:p>
@@ -3892,7 +4182,7 @@
         <w:pStyle w:val="SourceCode"/>
       </w:pPr>
       <w:r>
-        <w:t>&lt;form id="form" autocomplete="off"&gt;&lt;input id="url" autocomplete="off" aria-label="音视频网页链接" type="url" required placeholder="粘贴YouTube、B站、小宇宙等音视频网页链接"&gt;&lt;button&gt;开始生成文稿&lt;/button&gt;&lt;/form&gt;</w:t>
+        <w:t>&lt;form id="form" autocomplete="off"&gt;&lt;input id="url" autocomplete="off" aria-label="音视频网页链接" type="url" placeholder="粘贴YouTube、B站、小宇宙等音视频网页链接"&gt;&lt;label id="upload-zone" tabindex="0"&gt;点击或将音视频文件拖拽到此处上传&lt;input id="media-file" type="file" accept="audio/*,video/*,.mkv,.flac,.opus" hidden&gt;&lt;span id="file-name"&gt;&lt;/span&gt;&lt;/label&gt;&lt;button&gt;开始生成文稿&lt;/button&gt;&lt;/form&gt;</w:t>
       </w:r>
     </w:p>
     <w:p>
@@ -3939,9 +4229,7 @@
       <w:pPr>
         <w:pStyle w:val="SourceCode"/>
       </w:pPr>
-      <w:r>
-        <w:t>if(location.port==='8767')location.replace('http://127.0.0.1:8768/');</w:t>
-      </w:r>
+      <w:r/>
     </w:p>
     <w:p>
       <w:pPr>
@@ -4004,7 +4292,63 @@
         <w:pStyle w:val="SourceCode"/>
       </w:pPr>
       <w:r>
-        <w:t>document.querySelector('#form').onsubmit=async e=&gt;{e.preventDefault();try{if('qianwen'==='qianwen'){let health=await(await fetch('/health')).json();if(!health.engines?.includes('qianwen'))throw Error('网页服务需要加载新版。请完成登录千问配置后再试。')}await post('/jobs',{url:document.querySelector('#url').value,engine:'qianwen'});document.querySelector('#url').value='';msg.textContent='已加入后台队列。你可以继续做其他事情，稍后回来查看文稿。';await refresh()}catch(e){msg.textContent=e.message}};</w:t>
+        <w:t>let selectedFile=null;</w:t>
+      </w:r>
+    </w:p>
+    <w:p>
+      <w:pPr>
+        <w:pStyle w:val="SourceCode"/>
+      </w:pPr>
+      <w:r>
+        <w:t>const zone=document.querySelector('#upload-zone'),picker=document.querySelector('#media-file'),urlInput=document.querySelector('#url');</w:t>
+      </w:r>
+    </w:p>
+    <w:p>
+      <w:pPr>
+        <w:pStyle w:val="SourceCode"/>
+      </w:pPr>
+      <w:r>
+        <w:t>function selectFile(file){if(!file)return;selectedFile=file;urlInput.value='';document.querySelector('#file-name').textContent=file.name}</w:t>
+      </w:r>
+    </w:p>
+    <w:p>
+      <w:pPr>
+        <w:pStyle w:val="SourceCode"/>
+      </w:pPr>
+      <w:r>
+        <w:t>picker.onchange=()=&gt;selectFile(picker.files[0]);</w:t>
+      </w:r>
+    </w:p>
+    <w:p>
+      <w:pPr>
+        <w:pStyle w:val="SourceCode"/>
+      </w:pPr>
+      <w:r>
+        <w:t>zone.onkeydown=e=&gt;{if(e.key==='Enter'||e.key===' '){e.preventDefault();picker.click()}};</w:t>
+      </w:r>
+    </w:p>
+    <w:p>
+      <w:pPr>
+        <w:pStyle w:val="SourceCode"/>
+      </w:pPr>
+      <w:r>
+        <w:t>zone.ondragover=e=&gt;{e.preventDefault()};zone.ondrop=e=&gt;{e.preventDefault();if(e.dataTransfer.files.length!==1){msg.textContent='每次请选择一个音视频文件';return}selectFile(e.dataTransfer.files[0])};</w:t>
+      </w:r>
+    </w:p>
+    <w:p>
+      <w:pPr>
+        <w:pStyle w:val="SourceCode"/>
+      </w:pPr>
+      <w:r>
+        <w:t>urlInput.oninput=()=&gt;{if(urlInput.value){selectedFile=null;picker.value='';document.querySelector('#file-name').textContent=''}};</w:t>
+      </w:r>
+    </w:p>
+    <w:p>
+      <w:pPr>
+        <w:pStyle w:val="SourceCode"/>
+      </w:pPr>
+      <w:r>
+        <w:t>document.querySelector('#form').onsubmit=async e=&gt;{e.preventDefault();try{if('qianwen'==='qianwen'){let health=await(await fetch('/health')).json();if(!health.engines?.includes('qianwen'))throw Error('网页服务需要加载新版。请完成登录千问配置后再试。')}if(selectedFile){let h=await(await fetch('/health')).json();if(!h.local_upload)throw Error('请双击“加载本次更新.command”启用本地文件入口。');let button=document.querySelector('#form button');button.disabled=true;msg.textContent='正在将文件交给本机后台，请稍候…';try{let r=await fetch('/upload',{method:'POST',headers:{'Content-Type':'application/octet-stream','X-File-Name':encodeURIComponent(selectedFile.name)},body:selectedFile});let j=await r.json();if(!r.ok)throw Error(j.error)}finally{button.disabled=false}}else{if(!urlInput.value.trim())throw Error('请粘贴链接或选择音视频文件');await post('/jobs',{url:urlInput.value,engine:'qianwen'})}selectedFile=null;picker.value='';document.querySelector('#file-name').textContent='';document.querySelector('#url').value='';msg.textContent='已加入后台队列。你可以继续做其他事情，稍后回来查看文稿。';await refresh()}catch(e){msg.textContent=e.message}};</w:t>
       </w:r>
     </w:p>
     <w:p>
@@ -4028,7 +4372,7 @@
         <w:pStyle w:val="SourceCode"/>
       </w:pPr>
       <w:r>
-        <w:t>async function refresh(){try{let jobs=await(await fetch('/jobs')).json();jobs.sort((a,b)=&gt;(b.created_at??historicalTaskTimes[b.id]??b.added_at??Infinity)-(a.created_at??historicalTaskTimes[a.id]??a.added_at??Infinity));let host=document.querySelector('#jobs');host.replaceChildren();for(let j of jobs){let card=document.createElement('article');let h=document.createElement('h2');h.textContent=taskHeading(j);card.append(h);let p=document.createElement('p');p.textContent=(j.document&amp;&amp;!j.has_document)?'Word 文件已不在原保存位置，重新提交链接可生成':(stages[j.state]||'状态暂未识别：'+String(j.state));card.append(p);card.append(link('原网页',j.url));if(j.error){let err=document.createElement('p');err.textContent=j.error;card.append(err)}if(j.cleanup_error){let note=document.createElement('p');note.textContent='Word 已生成，但部分临时文件未清理：'+j.cleanup_error;card.append(note)}if(j.has_document){let actions=document.createElement('p');actions.className='actions';actions.append(link('查看 Word 文稿','/preview/'+j.id,'action'));let reveal=document.createElement('button');reveal.type='button';reveal.className='secondary';reveal.textContent='打开文档所在位置';let revealStatus=document.createElement('small');revealStatus.setAttribute('role','status');reveal.onclick=async()=&gt;{reveal.disabled=true;revealStatus.textContent='正在打开文件夹…';try{await post('/reveal/'+j.id,{});revealStatus.textContent='已打开 Finder 文件夹。';msg.textContent='已打开文档所在的 Finder 文件夹。'}catch(e){revealStatus.textContent='打开失败：'+e.message;msg.textContent='打开失败：'+e.message}finally{reveal.disabled=false}};actions.append(reveal);actions.append(revealStatus);card.append(actions);let note=document.createElement('small');note.textContent=j.temporary_files_removed?(j.media_trashed?'原音视频已移入废纸篓，临时音轨已清理。':'原音视频与临时音轨已清理。'):'Word 内容未经人工校对。';card.append(note)}let controls=document.createElement('p');controls.className='actions';if(j.state==='failed'||j.state==='login_required'){let retry=document.createElement('button');retry.textContent='重试任务';retry.onclick=async()=&gt;{try{await post('/jobs',{url:j.url,engine:'qianwen'});await refresh()}catch(e){msg.textContent=e.message}};controls.append(retry)}let remove=document.createElement('button');remove.type='button';remove.className='secondary';remove.style.color='#a52222';remove.textContent='删除任务';remove.onclick=async()=&gt;{if(!confirm('删除“'+(j.title||j.id)+'”？将停止该任务，把本机任务文件和相关文稿移入废纸篓。千问云端记录需在千问网页中管理。'))return;remove.disabled=true;try{await requireControls();let r=await post('/delete/'+j.id,{});msg.textContent=r.message;await refresh()}catch(e){msg.textContent='删除失败：'+e.message;remove.disabled=false}};if(j.has_document){card.querySelector('.actions').append(remove)}else{controls.append(remove)}if(controls.children.length)card.append(controls);host.append(card)}await refreshLogin()}catch(e){msg.textContent='后台连接中断，请重新启动工具。'}}</w:t>
+        <w:t>async function refresh(){try{let jobs=await(await fetch('/jobs')).json();jobs.sort((a,b)=&gt;(b.created_at??historicalTaskTimes[b.id]??b.added_at??Infinity)-(a.created_at??historicalTaskTimes[a.id]??a.added_at??Infinity));let host=document.querySelector('#jobs');host.replaceChildren();for(let j of jobs){let card=document.createElement('article');let h=document.createElement('h2');h.textContent=taskHeading(j);card.append(h);let p=document.createElement('p');p.textContent=(j.document&amp;&amp;!j.has_document)?'Word 文件已不在原保存位置，重新提交链接可生成':(stages[j.state]||'状态暂未识别：'+String(j.state));card.append(p);if(j.source_kind==='local'){let source=document.createElement('p');source.textContent=j.source_label;card.append(source)}else card.append(link('原网页',j.url));if(j.error){let err=document.createElement('p');err.textContent=j.error;card.append(err)}if(j.cleanup_error){let note=document.createElement('p');note.textContent='Word 已生成，但部分临时文件未清理：'+j.cleanup_error;card.append(note)}if(j.has_document){let actions=document.createElement('p');actions.className='actions';actions.append(link('查看 Word 文稿','/preview/'+j.id,'action'));let reveal=document.createElement('button');reveal.type='button';reveal.className='secondary';reveal.textContent='打开文档所在位置';let revealStatus=document.createElement('small');revealStatus.setAttribute('role','status');reveal.onclick=async()=&gt;{reveal.disabled=true;revealStatus.textContent='正在打开文件夹…';try{await post('/reveal/'+j.id,{});revealStatus.textContent='已打开 Finder 文件夹。';msg.textContent='已打开文档所在的 Finder 文件夹。'}catch(e){revealStatus.textContent='打开失败：'+e.message;msg.textContent='打开失败：'+e.message}finally{reveal.disabled=false}};actions.append(reveal);actions.append(revealStatus);card.append(actions);let note=document.createElement('small');note.textContent=j.temporary_files_removed?(j.media_trashed?'原音视频已移入废纸篓，临时音轨已清理。':'原音视频与临时音轨已清理。'):'Word 内容未经人工校对。';card.append(note)}let controls=document.createElement('p');controls.className='actions';if(j.state==='failed'||j.state==='login_required'){let retry=document.createElement('button');retry.textContent='重试任务';retry.onclick=async()=&gt;{try{await post('/jobs',{url:j.url,engine:'qianwen'});await refresh()}catch(e){msg.textContent=e.message}};controls.append(retry)}let remove=document.createElement('button');remove.type='button';remove.className='secondary';remove.style.color='#a52222';remove.textContent='删除任务';remove.onclick=async()=&gt;{if(!confirm('删除“'+(j.title||j.id)+'”？将停止该任务，把本机任务文件和相关文稿移入废纸篓。千问云端记录需在千问网页中管理。'))return;remove.disabled=true;try{await requireControls();let r=await post('/delete/'+j.id,{});msg.textContent=r.message;await refresh()}catch(e){msg.textContent='删除失败：'+e.message;remove.disabled=false}};if(j.has_document){card.querySelector('.actions').append(remove)}else{controls.append(remove)}if(controls.children.length)card.append(controls);host.append(card)}await refreshLogin()}catch(e){msg.textContent='后台连接中断，请重新启动工具。'}}</w:t>
       </w:r>
     </w:p>
     <w:p>
@@ -8050,7 +8394,7 @@
         <w:pStyle w:val="SourceCode"/>
       </w:pPr>
       <w:r>
-        <w:t xml:space="preserve">    if urlparse(args.url).scheme not in ('http', 'https'):</w:t>
+        <w:t xml:space="preserve">    if urlparse(args.url).scheme not in ('http', 'https', 'local'):</w:t>
       </w:r>
     </w:p>
     <w:p>
@@ -8330,7 +8674,7 @@
         <w:pStyle w:val="SourceCode"/>
       </w:pPr>
       <w:r>
-        <w:t xml:space="preserve">            node = Path(__import__('shutil').which('node') or 'node')</w:t>
+        <w:t xml:space="preserve">            node = Path(__import__('shutil').which('node') or '/nonexistent')</w:t>
       </w:r>
     </w:p>
     <w:p>
@@ -8370,6 +8714,22 @@
         <w:pStyle w:val="SourceCode"/>
       </w:pPr>
       <w:r>
+        <w:t xml:space="preserve">            if meta.get('source_kind') == 'local' and (not meta.get('media') or not Path(meta['media']).is_file()):</w:t>
+      </w:r>
+    </w:p>
+    <w:p>
+      <w:pPr>
+        <w:pStyle w:val="SourceCode"/>
+      </w:pPr>
+      <w:r>
+        <w:t xml:space="preserve">                raise ValueError('本地上传文件已不存在，请重新上传')</w:t>
+      </w:r>
+    </w:p>
+    <w:p>
+      <w:pPr>
+        <w:pStyle w:val="SourceCode"/>
+      </w:pPr>
+      <w:r>
         <w:t xml:space="preserve">            if not meta.get('media') or not Path(meta['media']).exists():</w:t>
       </w:r>
     </w:p>
@@ -9018,15 +9378,15 @@
         <w:pStyle w:val="SourceCode"/>
       </w:pPr>
       <w:r>
-        <w:t xml:space="preserve">    if not texts or texts[0] != meta['url']:</w:t>
-      </w:r>
-    </w:p>
-    <w:p>
-      <w:pPr>
-        <w:pStyle w:val="SourceCode"/>
-      </w:pPr>
-      <w:r>
-        <w:t xml:space="preserve">        raise ValueError('Word 缺少原网页链接')</w:t>
+        <w:t xml:space="preserve">    if not texts or texts[0] != (meta.get('source_label') if meta.get('source_kind') == 'local' else meta['url']):</w:t>
+      </w:r>
+    </w:p>
+    <w:p>
+      <w:pPr>
+        <w:pStyle w:val="SourceCode"/>
+      </w:pPr>
+      <w:r>
+        <w:t xml:space="preserve">        raise ValueError('Word 缺少来源信息')</w:t>
       </w:r>
     </w:p>
     <w:p>
@@ -9098,7 +9458,7 @@
         <w:pStyle w:val="SourceCode"/>
       </w:pPr>
       <w:r>
-        <w:t xml:space="preserve">    return {'zip_valid': True, 'first_line_url': True, 'notice_present': True,</w:t>
+        <w:t xml:space="preserve">    return {'zip_valid': True, 'first_line_url': meta.get('source_kind') != 'local', 'first_line_source': True, 'notice_present': True,</w:t>
       </w:r>
     </w:p>
     <w:p>
@@ -9710,7 +10070,31 @@
         <w:pStyle w:val="SourceCode"/>
       </w:pPr>
       <w:r>
-        <w:t xml:space="preserve">    hyperlink(doc.add_paragraph(), meta['url'])</w:t>
+        <w:t xml:space="preserve">    if meta.get('source_kind') == 'local':</w:t>
+      </w:r>
+    </w:p>
+    <w:p>
+      <w:pPr>
+        <w:pStyle w:val="SourceCode"/>
+      </w:pPr>
+      <w:r>
+        <w:t xml:space="preserve">        doc.add_paragraph(meta['source_label'])</w:t>
+      </w:r>
+    </w:p>
+    <w:p>
+      <w:pPr>
+        <w:pStyle w:val="SourceCode"/>
+      </w:pPr>
+      <w:r>
+        <w:t xml:space="preserve">    else:</w:t>
+      </w:r>
+    </w:p>
+    <w:p>
+      <w:pPr>
+        <w:pStyle w:val="SourceCode"/>
+      </w:pPr>
+      <w:r>
+        <w:t xml:space="preserve">        hyperlink(doc.add_paragraph(), meta['url'])</w:t>
       </w:r>
     </w:p>
     <w:p>
@@ -12420,6 +12804,272 @@
         <w:pStyle w:val="SourceCode"/>
       </w:pPr>
       <w:r>
+        <w:t>class LocalUploadTests(unittest.TestCase):</w:t>
+      </w:r>
+    </w:p>
+    <w:p>
+      <w:pPr>
+        <w:pStyle w:val="SourceCode"/>
+      </w:pPr>
+      <w:r>
+        <w:t xml:space="preserve">    def test_rejects_incomplete_upload_without_queuing_or_residue(self):</w:t>
+      </w:r>
+    </w:p>
+    <w:p>
+      <w:pPr>
+        <w:pStyle w:val="SourceCode"/>
+      </w:pPr>
+      <w:r>
+        <w:t xml:space="preserve">        import io</w:t>
+      </w:r>
+    </w:p>
+    <w:p>
+      <w:pPr>
+        <w:pStyle w:val="SourceCode"/>
+      </w:pPr>
+      <w:r>
+        <w:t xml:space="preserve">        with tempfile.TemporaryDirectory() as tmp,patch.object(app,'WORK',Path(tmp)),patch.object(app,'enqueue') as enqueue:</w:t>
+      </w:r>
+    </w:p>
+    <w:p>
+      <w:pPr>
+        <w:pStyle w:val="SourceCode"/>
+      </w:pPr>
+      <w:r>
+        <w:t xml:space="preserve">            with self.assertRaisesRegex(ValueError,'上传中断'):</w:t>
+      </w:r>
+    </w:p>
+    <w:p>
+      <w:pPr>
+        <w:pStyle w:val="SourceCode"/>
+      </w:pPr>
+      <w:r>
+        <w:t xml:space="preserve">                app.receive_upload(io.BytesIO(b'abc'),10,'test.mp3')</w:t>
+      </w:r>
+    </w:p>
+    <w:p>
+      <w:pPr>
+        <w:pStyle w:val="SourceCode"/>
+      </w:pPr>
+      <w:r>
+        <w:t xml:space="preserve">            enqueue.assert_not_called()</w:t>
+      </w:r>
+    </w:p>
+    <w:p>
+      <w:pPr>
+        <w:pStyle w:val="SourceCode"/>
+      </w:pPr>
+      <w:r>
+        <w:t xml:space="preserve">            self.assertFalse(list((Path(tmp)/'jobs').glob('*/job.json')))</w:t>
+      </w:r>
+    </w:p>
+    <w:p>
+      <w:pPr>
+        <w:pStyle w:val="SourceCode"/>
+      </w:pPr>
+      <w:r/>
+    </w:p>
+    <w:p>
+      <w:pPr>
+        <w:pStyle w:val="SourceCode"/>
+      </w:pPr>
+      <w:r>
+        <w:t xml:space="preserve">    def test_http_upload_streams_file_and_preserves_chinese_name(self):</w:t>
+      </w:r>
+    </w:p>
+    <w:p>
+      <w:pPr>
+        <w:pStyle w:val="SourceCode"/>
+      </w:pPr>
+      <w:r>
+        <w:t xml:space="preserve">        import http.client, threading</w:t>
+      </w:r>
+    </w:p>
+    <w:p>
+      <w:pPr>
+        <w:pStyle w:val="SourceCode"/>
+      </w:pPr>
+      <w:r>
+        <w:t xml:space="preserve">        from urllib.parse import quote</w:t>
+      </w:r>
+    </w:p>
+    <w:p>
+      <w:pPr>
+        <w:pStyle w:val="SourceCode"/>
+      </w:pPr>
+      <w:r>
+        <w:t xml:space="preserve">        from http.server import ThreadingHTTPServer</w:t>
+      </w:r>
+    </w:p>
+    <w:p>
+      <w:pPr>
+        <w:pStyle w:val="SourceCode"/>
+      </w:pPr>
+      <w:r>
+        <w:t xml:space="preserve">        server=ThreadingHTTPServer(('127.0.0.1',0),app.Handler)</w:t>
+      </w:r>
+    </w:p>
+    <w:p>
+      <w:pPr>
+        <w:pStyle w:val="SourceCode"/>
+      </w:pPr>
+      <w:r>
+        <w:t xml:space="preserve">        port=server.server_port</w:t>
+      </w:r>
+    </w:p>
+    <w:p>
+      <w:pPr>
+        <w:pStyle w:val="SourceCode"/>
+      </w:pPr>
+      <w:r>
+        <w:t xml:space="preserve">        with tempfile.TemporaryDirectory() as tmp,patch.object(app,'WORK',Path(tmp)),patch.object(app,'PORT',port),patch.object(app,'enqueue',return_value='123456abcdef') as enqueue:</w:t>
+      </w:r>
+    </w:p>
+    <w:p>
+      <w:pPr>
+        <w:pStyle w:val="SourceCode"/>
+      </w:pPr>
+      <w:r>
+        <w:t xml:space="preserve">            thread=threading.Thread(target=server.serve_forever,daemon=True);thread.start()</w:t>
+      </w:r>
+    </w:p>
+    <w:p>
+      <w:pPr>
+        <w:pStyle w:val="SourceCode"/>
+      </w:pPr>
+      <w:r>
+        <w:t xml:space="preserve">            try:</w:t>
+      </w:r>
+    </w:p>
+    <w:p>
+      <w:pPr>
+        <w:pStyle w:val="SourceCode"/>
+      </w:pPr>
+      <w:r>
+        <w:t xml:space="preserve">                conn=http.client.HTTPConnection('127.0.0.1',port)</w:t>
+      </w:r>
+    </w:p>
+    <w:p>
+      <w:pPr>
+        <w:pStyle w:val="SourceCode"/>
+      </w:pPr>
+      <w:r>
+        <w:t xml:space="preserve">                conn.request('POST','/upload',body=b'example-audio',headers={'Origin':f'http://127.0.0.1:{port}','X-File-Name':quote('采访.mp3'),'Content-Type':'application/octet-stream'})</w:t>
+      </w:r>
+    </w:p>
+    <w:p>
+      <w:pPr>
+        <w:pStyle w:val="SourceCode"/>
+      </w:pPr>
+      <w:r>
+        <w:t xml:space="preserve">                response=conn.getresponse();result=json.loads(response.read());conn.close()</w:t>
+      </w:r>
+    </w:p>
+    <w:p>
+      <w:pPr>
+        <w:pStyle w:val="SourceCode"/>
+      </w:pPr>
+      <w:r>
+        <w:t xml:space="preserve">                self.assertEqual(response.status,200);self.assertEqual(result['id'],'123456abcdef')</w:t>
+      </w:r>
+    </w:p>
+    <w:p>
+      <w:pPr>
+        <w:pStyle w:val="SourceCode"/>
+      </w:pPr>
+      <w:r>
+        <w:t xml:space="preserve">                enqueue.assert_called_once()</w:t>
+      </w:r>
+    </w:p>
+    <w:p>
+      <w:pPr>
+        <w:pStyle w:val="SourceCode"/>
+      </w:pPr>
+      <w:r>
+        <w:t xml:space="preserve">                meta=json.loads(next((Path(tmp)/'jobs').glob('*/job.json')).read_text())</w:t>
+      </w:r>
+    </w:p>
+    <w:p>
+      <w:pPr>
+        <w:pStyle w:val="SourceCode"/>
+      </w:pPr>
+      <w:r>
+        <w:t xml:space="preserve">                self.assertEqual(meta['source_label'],'本地上传文件：采访.mp3')</w:t>
+      </w:r>
+    </w:p>
+    <w:p>
+      <w:pPr>
+        <w:pStyle w:val="SourceCode"/>
+      </w:pPr>
+      <w:r>
+        <w:t xml:space="preserve">                self.assertEqual(Path(meta['media']).read_bytes(),b'example-audio')</w:t>
+      </w:r>
+    </w:p>
+    <w:p>
+      <w:pPr>
+        <w:pStyle w:val="SourceCode"/>
+      </w:pPr>
+      <w:r>
+        <w:t xml:space="preserve">            finally:server.shutdown();server.server_close();thread.join()</w:t>
+      </w:r>
+    </w:p>
+    <w:p>
+      <w:pPr>
+        <w:pStyle w:val="SourceCode"/>
+      </w:pPr>
+      <w:r/>
+    </w:p>
+    <w:p>
+      <w:pPr>
+        <w:pStyle w:val="SourceCode"/>
+      </w:pPr>
+      <w:r>
+        <w:t xml:space="preserve">    def test_unsupported_file_rejected_before_writing(self):</w:t>
+      </w:r>
+    </w:p>
+    <w:p>
+      <w:pPr>
+        <w:pStyle w:val="SourceCode"/>
+      </w:pPr>
+      <w:r>
+        <w:t xml:space="preserve">        import io</w:t>
+      </w:r>
+    </w:p>
+    <w:p>
+      <w:pPr>
+        <w:pStyle w:val="SourceCode"/>
+      </w:pPr>
+      <w:r>
+        <w:t xml:space="preserve">        with tempfile.TemporaryDirectory() as tmp,patch.object(app,'WORK',Path(tmp)):</w:t>
+      </w:r>
+    </w:p>
+    <w:p>
+      <w:pPr>
+        <w:pStyle w:val="SourceCode"/>
+      </w:pPr>
+      <w:r>
+        <w:t xml:space="preserve">            with self.assertRaises(ValueError):app.receive_upload(io.BytesIO(b'abc'),3,'a.command')</w:t>
+      </w:r>
+    </w:p>
+    <w:p>
+      <w:pPr>
+        <w:pStyle w:val="SourceCode"/>
+      </w:pPr>
+      <w:r>
+        <w:t xml:space="preserve">            self.assertFalse((Path(tmp)/'jobs').exists())</w:t>
+      </w:r>
+    </w:p>
+    <w:p>
+      <w:pPr>
+        <w:pStyle w:val="SourceCode"/>
+      </w:pPr>
+      <w:r/>
+    </w:p>
+    <w:p>
+      <w:pPr>
+        <w:pStyle w:val="SourceCode"/>
+      </w:pPr>
+      <w:r>
         <w:t>if __name__ == '__main__':</w:t>
       </w:r>
     </w:p>
@@ -14104,6 +14754,148 @@
         <w:pStyle w:val="SourceCode"/>
       </w:pPr>
       <w:r>
+        <w:t xml:space="preserve">    def test_local_upload_pipeline_preserves_user_original(self):</w:t>
+      </w:r>
+    </w:p>
+    <w:p>
+      <w:pPr>
+        <w:pStyle w:val="SourceCode"/>
+      </w:pPr>
+      <w:r>
+        <w:t xml:space="preserve">        import io, app, shutil</w:t>
+      </w:r>
+    </w:p>
+    <w:p>
+      <w:pPr>
+        <w:pStyle w:val="SourceCode"/>
+      </w:pPr>
+      <w:r>
+        <w:t xml:space="preserve">        original=Path(self.temp.name)/'我的录音.wav'</w:t>
+      </w:r>
+    </w:p>
+    <w:p>
+      <w:pPr>
+        <w:pStyle w:val="SourceCode"/>
+      </w:pPr>
+      <w:r>
+        <w:t xml:space="preserve">        with wave.open(str(original),'wb') as a:</w:t>
+      </w:r>
+    </w:p>
+    <w:p>
+      <w:pPr>
+        <w:pStyle w:val="SourceCode"/>
+      </w:pPr>
+      <w:r>
+        <w:t xml:space="preserve">            a.setnchannels(1);a.setsampwidth(2);a.setframerate(16000);a.writeframes(b'\0'*32000)</w:t>
+      </w:r>
+    </w:p>
+    <w:p>
+      <w:pPr>
+        <w:pStyle w:val="SourceCode"/>
+      </w:pPr>
+      <w:r>
+        <w:t xml:space="preserve">        with patch.object(app,'WORK',self.work),patch.object(app,'enqueue',side_effect=lambda url: __import__('hashlib').sha256(url.encode()).hexdigest()[:12]):</w:t>
+      </w:r>
+    </w:p>
+    <w:p>
+      <w:pPr>
+        <w:pStyle w:val="SourceCode"/>
+      </w:pPr>
+      <w:r>
+        <w:t xml:space="preserve">            ident=app.receive_upload(io.BytesIO(original.read_bytes()),original.stat().st_size,original.name)</w:t>
+      </w:r>
+    </w:p>
+    <w:p>
+      <w:pPr>
+        <w:pStyle w:val="SourceCode"/>
+      </w:pPr>
+      <w:r>
+        <w:t xml:space="preserve">        job=self.work/'jobs'/ident;meta=json.loads((job/'job.json').read_text())</w:t>
+      </w:r>
+    </w:p>
+    <w:p>
+      <w:pPr>
+        <w:pStyle w:val="SourceCode"/>
+      </w:pPr>
+      <w:r>
+        <w:t xml:space="preserve">        raw={'model':'qianwen-web','segments':[{'start':0,'end':1,'speaker':'发言人 1','text':'本地文件全部原文'}]}</w:t>
+      </w:r>
+    </w:p>
+    <w:p>
+      <w:pPr>
+        <w:pStyle w:val="SourceCode"/>
+      </w:pPr>
+      <w:r>
+        <w:t xml:space="preserve">        with patch('qianwen_browser.export_audio',return_value=raw),patch.object(reader,'ffmpeg',return_value='/unused'),patch.object(reader,'extract_audio',side_effect=lambda ff,src,dst:shutil.copy2(src,dst)):</w:t>
+      </w:r>
+    </w:p>
+    <w:p>
+      <w:pPr>
+        <w:pStyle w:val="SourceCode"/>
+      </w:pPr>
+      <w:r>
+        <w:t xml:space="preserve">            reader.prepare(argparse.Namespace(url=meta['url'],cookies_browser=None,engine='qianwen'))</w:t>
+      </w:r>
+    </w:p>
+    <w:p>
+      <w:pPr>
+        <w:pStyle w:val="SourceCode"/>
+      </w:pPr>
+      <w:r>
+        <w:t xml:space="preserve">        saved=json.loads((job/'job.json').read_text());texts=[p.text for p in Document(saved['document']).paragraphs]</w:t>
+      </w:r>
+    </w:p>
+    <w:p>
+      <w:pPr>
+        <w:pStyle w:val="SourceCode"/>
+      </w:pPr>
+      <w:r>
+        <w:t xml:space="preserve">        self.assertEqual(saved['state'],'completed')</w:t>
+      </w:r>
+    </w:p>
+    <w:p>
+      <w:pPr>
+        <w:pStyle w:val="SourceCode"/>
+      </w:pPr>
+      <w:r>
+        <w:t xml:space="preserve">        self.assertEqual(texts[0],'本地上传文件：我的录音.wav')</w:t>
+      </w:r>
+    </w:p>
+    <w:p>
+      <w:pPr>
+        <w:pStyle w:val="SourceCode"/>
+      </w:pPr>
+      <w:r>
+        <w:t xml:space="preserve">        self.assertEqual(Path(saved['document']).name,'我的录音.docx')</w:t>
+      </w:r>
+    </w:p>
+    <w:p>
+      <w:pPr>
+        <w:pStyle w:val="SourceCode"/>
+      </w:pPr>
+      <w:r>
+        <w:t xml:space="preserve">        self.assertIn('[00:00:00–00:00:01] 发言人 1',texts)</w:t>
+      </w:r>
+    </w:p>
+    <w:p>
+      <w:pPr>
+        <w:pStyle w:val="SourceCode"/>
+      </w:pPr>
+      <w:r>
+        <w:t xml:space="preserve">        self.assertTrue(original.exists());self.assertFalse(Path(meta['media']).exists())</w:t>
+      </w:r>
+    </w:p>
+    <w:p>
+      <w:pPr>
+        <w:pStyle w:val="SourceCode"/>
+      </w:pPr>
+      <w:r/>
+    </w:p>
+    <w:p>
+      <w:pPr>
+        <w:pStyle w:val="SourceCode"/>
+      </w:pPr>
+      <w:r>
         <w:t xml:space="preserve">    def test_speaker_changes_keep_separate_timestamps(self):</w:t>
       </w:r>
     </w:p>
@@ -15792,7 +16584,7 @@
         <w:pStyle w:val="SourceCode"/>
       </w:pPr>
       <w:r>
-        <w:t xml:space="preserve">  "test_reader.py": "44db5108039e4ddc37b71a1aa75a52a7d9259a8787aaa0d14fb8d3f52b517bdb",</w:t>
+        <w:t xml:space="preserve">  "test_reader.py": "dcbf181640b381f6d7ab81497b5fc8779ea88ae203dfb4181eb00861aaf044f5",</w:t>
       </w:r>
     </w:p>
     <w:p>
@@ -15824,7 +16616,7 @@
         <w:pStyle w:val="SourceCode"/>
       </w:pPr>
       <w:r>
-        <w:t xml:space="preserve">  "index.html": "84f8937d61dd91b51b6aca64f6f7adbd090eb6d1110d01e2ad1fa77053fed5f0",</w:t>
+        <w:t xml:space="preserve">  "index.html": "a511f38fa6ce431b7214123de14a04c70bab5d9e7b4e5da3a367d9ebb73f11fa",</w:t>
       </w:r>
     </w:p>
     <w:p>
@@ -15888,7 +16680,7 @@
         <w:pStyle w:val="SourceCode"/>
       </w:pPr>
       <w:r>
-        <w:t xml:space="preserve">  "reader.py": "d4d41b22f5e93ebb1a1f95c4173fa2d0588177d88585310667cb1caafdf3639c",</w:t>
+        <w:t xml:space="preserve">  "reader.py": "1b32092e273dcf8847b30c1ab80fc5597d12ff5ca5c69e35172c9cdbe7be406f",</w:t>
       </w:r>
     </w:p>
     <w:p>
@@ -15928,7 +16720,7 @@
         <w:pStyle w:val="SourceCode"/>
       </w:pPr>
       <w:r>
-        <w:t xml:space="preserve">  "app.py": "5d159f770f7f14dbc0b4356f88da7ff5238d79f631ade25cb1c15985efc4736c",</w:t>
+        <w:t xml:space="preserve">  "app.py": "3a68dc7b10a21d064f8bf6ded132b60778435fb54bcbf68e33da328b5cda6a2d",</w:t>
       </w:r>
     </w:p>
     <w:p>
@@ -15984,7 +16776,7 @@
         <w:pStyle w:val="SourceCode"/>
       </w:pPr>
       <w:r>
-        <w:t xml:space="preserve">  "test_app.py": "602564153f61b95bf960f153ed5357076f1f07e1b2caac408d811e2b6b114e92"</w:t>
+        <w:t xml:space="preserve">  "test_app.py": "fb6d9ea0dd25ad4046c3e2ff83e7b86b997c247c0f9685a591675280f0f5c8ab"</w:t>
       </w:r>
     </w:p>
     <w:p>

</xml_diff>

<commit_message>
Match upload area to URL input with white background and centered gray text
</commit_message>
<xml_diff>
--- a/安装与使用指南.docx
+++ b/安装与使用指南.docx
@@ -4158,7 +4158,7 @@
         <w:pStyle w:val="SourceCode"/>
       </w:pPr>
       <w:r>
-        <w:t>#upload-zone{border:1px dashed #c6d1ca;border-radius:8px;padding:12px 14px;cursor:pointer;flex-basis:100%;box-sizing:border-box}#file-name{display:block;font-size:14px;color:#62736b}#form input[type=url]{order:0}#form button{order:1}#upload-zone{order:2}#qianwen-login{background:#004B93;border-color:#004B93}#qianwen-login:hover{background:#003B75}#form button{background:#D65A00;border-color:#D65A00}#form button:hover{background:#B94D00}&lt;/style&gt;</w:t>
+        <w:t>#url::placeholder{color:#757575;opacity:1}#upload-zone{background:#fff;color:#757575;font:inherit;text-align:center;border:1px dashed #c6d1ca;border-radius:8px;padding:12px 14px;cursor:pointer;flex-basis:100%;box-sizing:border-box}#file-name{display:block;font-size:14px;color:#62736b}#form input[type=url]{order:0}#form button{order:1}#upload-zone{order:2}#qianwen-login{background:#004B93;border-color:#004B93}#qianwen-login:hover{background:#003B75}#form button{background:#D65A00;border-color:#D65A00}#form button:hover{background:#B94D00}&lt;/style&gt;</w:t>
       </w:r>
     </w:p>
     <w:p>
@@ -16616,7 +16616,7 @@
         <w:pStyle w:val="SourceCode"/>
       </w:pPr>
       <w:r>
-        <w:t xml:space="preserve">  "index.html": "a511f38fa6ce431b7214123de14a04c70bab5d9e7b4e5da3a367d9ebb73f11fa",</w:t>
+        <w:t xml:space="preserve">  "index.html": "0dd0d9b7110eba451c78c92a326d7addee61ed16df2be861d416bb22cd5e8c3b",</w:t>
       </w:r>
     </w:p>
     <w:p>

</xml_diff>

<commit_message>
Synchronize task deletion with exact Qianwen record and retain local files on cloud failure
</commit_message>
<xml_diff>
--- a/安装与使用指南.docx
+++ b/安装与使用指南.docx
@@ -84,7 +84,7 @@
     </w:p>
     <w:p>
       <w:r>
-        <w:t>已完成任务的“删除任务”与“查看 Word 文稿”“打开文档所在位置”同排，不再提供重复下载按钮。每条任务的“删除任务”会停止该任务，将相关本机文件、已完成和未完成 Word、任务记录移入废纸篓；千问云端记录自行管理。模型和登录信息不会上传 GitHub。</w:t>
+        <w:t>已完成任务的“删除任务并同步到千问”与“查看 Word 文稿”“打开文档所在位置”同排，不再提供重复下载按钮。每条任务的“删除任务并同步到千问”会停止该任务，将相关本机文件、已完成和未完成 Word、任务记录移入废纸篓；点击“删除任务并同步到千问”会删除对应千问记录，云端删除后无法恢复。云端删除失败则保留本机任务和文稿，提示原因后可重试；未上传的任务只清理本机。仅删除含本工具任务编号且唯一匹配的记录，旧记录未找到时保留文件供检查。模型和登录信息不会上传 GitHub。</w:t>
       </w:r>
     </w:p>
     <w:p>
@@ -203,7 +203,7 @@
     </w:p>
     <w:p>
       <w:r>
-        <w:t>页面加载超时会自动重试，最多3次；复用已经提交的千问任务和保存的文稿链接，不重复上传。登录失效立即提示用户，不自动反复尝试登录。导出菜单等待可见及选项完整后才操作。加载异常保留媒体和页面诊断，文稿验证失败不清理源文件。工具会显示千问页面明确可见的错误提示（如上传失败、额度不足、服务异常），保留文件供重试；未明确报错时不推断原因。千问提示云端存储已满时立即停止并保留本机音频；请用户自行清理千问记录后重试，工具不会删除云端记录。自动恢复不能保证第三方改版、网络中断或服务限额永不影响任务。</w:t>
+        <w:t>页面加载超时会自动重试，最多3次；复用已经提交的千问任务和保存的文稿链接，不重复上传。登录失效立即提示用户，不自动反复尝试登录。导出菜单等待可见及选项完整后才操作。加载异常保留媒体和页面诊断，文稿验证失败不清理源文件。工具会显示千问页面明确可见的错误提示（如上传失败、额度不足、服务异常），保留文件供重试；未明确报错时不推断原因。千问提示云端存储已满时立即停止并保留本机音频；请用户自行清理千问记录后重试，同步删除按钮可清理对应云端记录。自动恢复不能保证第三方改版、网络中断或服务限额永不影响任务。</w:t>
       </w:r>
     </w:p>
     <w:p>
@@ -337,7 +337,7 @@
     </w:p>
     <w:p>
       <w:r>
-        <w:t>本次 39 项测试通过，其中云端识别返回结果在单元测试中模拟；旧本地推理断点测试已移除。此前本机20秒音频的千问后台完整流程约46秒，不能推断长视频速度或识别准确率。未在另一台全新 Mac 完成安装实测。</w:t>
+        <w:t>本次 42 项测试通过，其中云端识别返回结果在单元测试中模拟；旧本地推理断点测试已移除。此前本机20秒音频的千问后台完整流程约46秒，不能推断长视频速度或识别准确率。未在另一台全新 Mac 完成安装实测。</w:t>
       </w:r>
     </w:p>
     <w:p>
@@ -1764,6 +1764,190 @@
         <w:pStyle w:val="SourceCode"/>
       </w:pPr>
       <w:r>
+        <w:t xml:space="preserve">        folder=WORK/'jobs'/ident</w:t>
+      </w:r>
+    </w:p>
+    <w:p>
+      <w:pPr>
+        <w:pStyle w:val="SourceCode"/>
+      </w:pPr>
+      <w:r>
+        <w:t xml:space="preserve">        (folder/'.deleting').touch()</w:t>
+      </w:r>
+    </w:p>
+    <w:p>
+      <w:pPr>
+        <w:pStyle w:val="SourceCode"/>
+      </w:pPr>
+      <w:r>
+        <w:t xml:space="preserve">        try:</w:t>
+      </w:r>
+    </w:p>
+    <w:p>
+      <w:pPr>
+        <w:pStyle w:val="SourceCode"/>
+      </w:pPr>
+      <w:r>
+        <w:t xml:space="preserve">            # Also stop readers recovered after a web-service restart.</w:t>
+      </w:r>
+    </w:p>
+    <w:p>
+      <w:pPr>
+        <w:pStyle w:val="SourceCode"/>
+      </w:pPr>
+      <w:r>
+        <w:t xml:space="preserve">            from task_controls import reader_pids</w:t>
+      </w:r>
+    </w:p>
+    <w:p>
+      <w:pPr>
+        <w:pStyle w:val="SourceCode"/>
+      </w:pPr>
+      <w:r>
+        <w:t xml:space="preserve">            for pid in reader_pids(ROOT,folder):stop_reader(pid)</w:t>
+      </w:r>
+    </w:p>
+    <w:p>
+      <w:pPr>
+        <w:pStyle w:val="SourceCode"/>
+      </w:pPr>
+      <w:r>
+        <w:t xml:space="preserve">            import fcntl</w:t>
+      </w:r>
+    </w:p>
+    <w:p>
+      <w:pPr>
+        <w:pStyle w:val="SourceCode"/>
+      </w:pPr>
+      <w:r>
+        <w:t xml:space="preserve">            with (folder/'.prepare.lock').open('a') as lock:</w:t>
+      </w:r>
+    </w:p>
+    <w:p>
+      <w:pPr>
+        <w:pStyle w:val="SourceCode"/>
+      </w:pPr>
+      <w:r>
+        <w:t xml:space="preserve">                deadline=time.monotonic()+15</w:t>
+      </w:r>
+    </w:p>
+    <w:p>
+      <w:pPr>
+        <w:pStyle w:val="SourceCode"/>
+      </w:pPr>
+      <w:r>
+        <w:t xml:space="preserve">                while True:</w:t>
+      </w:r>
+    </w:p>
+    <w:p>
+      <w:pPr>
+        <w:pStyle w:val="SourceCode"/>
+      </w:pPr>
+      <w:r>
+        <w:t xml:space="preserve">                    try:fcntl.flock(lock,fcntl.LOCK_EX|fcntl.LOCK_NB);break</w:t>
+      </w:r>
+    </w:p>
+    <w:p>
+      <w:pPr>
+        <w:pStyle w:val="SourceCode"/>
+      </w:pPr>
+      <w:r>
+        <w:t xml:space="preserve">                    except BlockingIOError:</w:t>
+      </w:r>
+    </w:p>
+    <w:p>
+      <w:pPr>
+        <w:pStyle w:val="SourceCode"/>
+      </w:pPr>
+      <w:r>
+        <w:t xml:space="preserve">                        if time.monotonic()&gt;deadline:raise ValueError('任务尚未停止，请稍后重试删除')</w:t>
+      </w:r>
+    </w:p>
+    <w:p>
+      <w:pPr>
+        <w:pStyle w:val="SourceCode"/>
+      </w:pPr>
+      <w:r>
+        <w:t xml:space="preserve">                        time.sleep(.2)</w:t>
+      </w:r>
+    </w:p>
+    <w:p>
+      <w:pPr>
+        <w:pStyle w:val="SourceCode"/>
+      </w:pPr>
+      <w:r>
+        <w:t xml:space="preserve">                result=subprocess.run([str(ROOT/'.venv/bin/python'),str(ROOT/'qianwen_browser.py'),'delete','--job',ident],capture_output=True,text=True,timeout=120)</w:t>
+      </w:r>
+    </w:p>
+    <w:p>
+      <w:pPr>
+        <w:pStyle w:val="SourceCode"/>
+      </w:pPr>
+      <w:r>
+        <w:t xml:space="preserve">                if result.returncode:raise ValueError('千问同步删除失败，本机任务和文稿已保留：'+(result.stderr.strip().splitlines()[-1] if result.stderr.strip() else '后台浏览器未能完成删除'))</w:t>
+      </w:r>
+    </w:p>
+    <w:p>
+      <w:pPr>
+        <w:pStyle w:val="SourceCode"/>
+      </w:pPr>
+      <w:r>
+        <w:t xml:space="preserve">        except Exception as error:</w:t>
+      </w:r>
+    </w:p>
+    <w:p>
+      <w:pPr>
+        <w:pStyle w:val="SourceCode"/>
+      </w:pPr>
+      <w:r>
+        <w:t xml:space="preserve">            (folder/'.deleting').unlink(missing_ok=True)</w:t>
+      </w:r>
+    </w:p>
+    <w:p>
+      <w:pPr>
+        <w:pStyle w:val="SourceCode"/>
+      </w:pPr>
+      <w:r>
+        <w:t xml:space="preserve">            meta=json.loads((folder/'job.json').read_text())</w:t>
+      </w:r>
+    </w:p>
+    <w:p>
+      <w:pPr>
+        <w:pStyle w:val="SourceCode"/>
+      </w:pPr>
+      <w:r>
+        <w:t xml:space="preserve">            if meta.get('state') not in ('completed','failed','login_required'):</w:t>
+      </w:r>
+    </w:p>
+    <w:p>
+      <w:pPr>
+        <w:pStyle w:val="SourceCode"/>
+      </w:pPr>
+      <w:r>
+        <w:t xml:space="preserve">                meta.update(state='failed',error='任务已停止，千问同步删除未完成：'+str(error))</w:t>
+      </w:r>
+    </w:p>
+    <w:p>
+      <w:pPr>
+        <w:pStyle w:val="SourceCode"/>
+      </w:pPr>
+      <w:r>
+        <w:t xml:space="preserve">                save_json(folder/'job.json',meta)</w:t>
+      </w:r>
+    </w:p>
+    <w:p>
+      <w:pPr>
+        <w:pStyle w:val="SourceCode"/>
+      </w:pPr>
+      <w:r>
+        <w:t xml:space="preserve">            raise</w:t>
+      </w:r>
+    </w:p>
+    <w:p>
+      <w:pPr>
+        <w:pStyle w:val="SourceCode"/>
+      </w:pPr>
+      <w:r>
         <w:t xml:space="preserve">        result=trash_task(ROOT,WORK,[OUTPUT,LEGACY_OUTPUT,ROOT/'outputs',OUTPUT.parent/'网页视频转语音文稿'],ident)</w:t>
       </w:r>
     </w:p>
@@ -1780,6 +1964,14 @@
         <w:pStyle w:val="SourceCode"/>
       </w:pPr>
       <w:r>
+        <w:t xml:space="preserve">        result['message']='任务与本机相关文件已移入废纸篓，对应千问记录已删除（未上传的任务无需云端删除）。'</w:t>
+      </w:r>
+    </w:p>
+    <w:p>
+      <w:pPr>
+        <w:pStyle w:val="SourceCode"/>
+      </w:pPr>
+      <w:r>
         <w:t xml:space="preserve">        return result</w:t>
       </w:r>
     </w:p>
@@ -2690,7 +2882,7 @@
         <w:pStyle w:val="SourceCode"/>
       </w:pPr>
       <w:r>
-        <w:t xml:space="preserve">            return self.reply(200, {'ok': True, 'project': str(ROOT), 'pid': os.getpid(), 'engines': ['qianwen'], 'task_controls': True, 'local_upload': True})</w:t>
+        <w:t xml:space="preserve">            return self.reply(200, {'ok': True, 'project': str(ROOT), 'pid': os.getpid(), 'engines': ['qianwen'], 'task_controls': True, 'local_upload': True, 'cloud_delete': True})</w:t>
       </w:r>
     </w:p>
     <w:p>
@@ -4158,7 +4350,7 @@
         <w:pStyle w:val="SourceCode"/>
       </w:pPr>
       <w:r>
-        <w:t>#url::placeholder{color:#757575;opacity:1}#upload-zone{background:#fff;color:#757575;font:inherit;text-align:center;border:1px dashed #c6d1ca;border-radius:8px;padding:12px 14px;cursor:pointer;flex-basis:100%;box-sizing:border-box}#file-name{display:block;font-size:14px;color:#62736b}#form input[type=url]{order:0}#form button{order:1}#upload-zone{order:2}#qianwen-login{background:#004B93;border-color:#004B93}#qianwen-login:hover{background:#003B75}#form button{background:#D65A00;border-color:#D65A00}#form button:hover{background:#B94D00}&lt;/style&gt;</w:t>
+        <w:t>#url::placeholder{color:#757575;opacity:1}#upload-zone{background:#fff;color:#757575;font:inherit;text-align:center;border:1px dashed #c6d1ca;border-radius:8px;padding:12px 14px;cursor:pointer;flex-basis:100%;box-sizing:border-box}#file-name{display:block;font-size:14px;color:#000}#form input[type=url]{order:0}#form button{order:1}#upload-zone{order:2}#qianwen-login{background:#004B93;border-color:#004B93}#qianwen-login:hover{background:#003B75}#form button{background:#D65A00;border-color:#D65A00}#form button:hover{background:#B94D00}&lt;/style&gt;</w:t>
       </w:r>
     </w:p>
     <w:p>
@@ -4372,7 +4564,7 @@
         <w:pStyle w:val="SourceCode"/>
       </w:pPr>
       <w:r>
-        <w:t>async function refresh(){try{let jobs=await(await fetch('/jobs')).json();jobs.sort((a,b)=&gt;(b.created_at??historicalTaskTimes[b.id]??b.added_at??Infinity)-(a.created_at??historicalTaskTimes[a.id]??a.added_at??Infinity));let host=document.querySelector('#jobs');host.replaceChildren();for(let j of jobs){let card=document.createElement('article');let h=document.createElement('h2');h.textContent=taskHeading(j);card.append(h);let p=document.createElement('p');p.textContent=(j.document&amp;&amp;!j.has_document)?'Word 文件已不在原保存位置，重新提交链接可生成':(stages[j.state]||'状态暂未识别：'+String(j.state));card.append(p);if(j.source_kind==='local'){let source=document.createElement('p');source.textContent=j.source_label;card.append(source)}else card.append(link('原网页',j.url));if(j.error){let err=document.createElement('p');err.textContent=j.error;card.append(err)}if(j.cleanup_error){let note=document.createElement('p');note.textContent='Word 已生成，但部分临时文件未清理：'+j.cleanup_error;card.append(note)}if(j.has_document){let actions=document.createElement('p');actions.className='actions';actions.append(link('查看 Word 文稿','/preview/'+j.id,'action'));let reveal=document.createElement('button');reveal.type='button';reveal.className='secondary';reveal.textContent='打开文档所在位置';let revealStatus=document.createElement('small');revealStatus.setAttribute('role','status');reveal.onclick=async()=&gt;{reveal.disabled=true;revealStatus.textContent='正在打开文件夹…';try{await post('/reveal/'+j.id,{});revealStatus.textContent='已打开 Finder 文件夹。';msg.textContent='已打开文档所在的 Finder 文件夹。'}catch(e){revealStatus.textContent='打开失败：'+e.message;msg.textContent='打开失败：'+e.message}finally{reveal.disabled=false}};actions.append(reveal);actions.append(revealStatus);card.append(actions);let note=document.createElement('small');note.textContent=j.temporary_files_removed?(j.media_trashed?'原音视频已移入废纸篓，临时音轨已清理。':'原音视频与临时音轨已清理。'):'Word 内容未经人工校对。';card.append(note)}let controls=document.createElement('p');controls.className='actions';if(j.state==='failed'||j.state==='login_required'){let retry=document.createElement('button');retry.textContent='重试任务';retry.onclick=async()=&gt;{try{await post('/jobs',{url:j.url,engine:'qianwen'});await refresh()}catch(e){msg.textContent=e.message}};controls.append(retry)}let remove=document.createElement('button');remove.type='button';remove.className='secondary';remove.style.color='#a52222';remove.textContent='删除任务';remove.onclick=async()=&gt;{if(!confirm('删除“'+(j.title||j.id)+'”？将停止该任务，把本机任务文件和相关文稿移入废纸篓。千问云端记录需在千问网页中管理。'))return;remove.disabled=true;try{await requireControls();let r=await post('/delete/'+j.id,{});msg.textContent=r.message;await refresh()}catch(e){msg.textContent='删除失败：'+e.message;remove.disabled=false}};if(j.has_document){card.querySelector('.actions').append(remove)}else{controls.append(remove)}if(controls.children.length)card.append(controls);host.append(card)}await refreshLogin()}catch(e){msg.textContent='后台连接中断，请重新启动工具。'}}</w:t>
+        <w:t>async function refresh(){try{let jobs=await(await fetch('/jobs')).json();jobs.sort((a,b)=&gt;(b.created_at??historicalTaskTimes[b.id]??b.added_at??Infinity)-(a.created_at??historicalTaskTimes[a.id]??a.added_at??Infinity));let host=document.querySelector('#jobs');host.replaceChildren();for(let j of jobs){let card=document.createElement('article');let h=document.createElement('h2');h.textContent=taskHeading(j);card.append(h);let p=document.createElement('p');p.textContent=(j.document&amp;&amp;!j.has_document)?'Word 文件已不在原保存位置，重新提交链接可生成':(stages[j.state]||'状态暂未识别：'+String(j.state));card.append(p);if(j.source_kind==='local'){let source=document.createElement('p');source.textContent=j.source_label;card.append(source)}else card.append(link('原网页',j.url));if(j.error){let err=document.createElement('p');err.textContent=j.error;card.append(err)}if(j.cleanup_error){let note=document.createElement('p');note.textContent='Word 已生成，但部分临时文件未清理：'+j.cleanup_error;card.append(note)}if(j.has_document){let actions=document.createElement('p');actions.className='actions';actions.append(link('查看 Word 文稿','/preview/'+j.id,'action'));let reveal=document.createElement('button');reveal.type='button';reveal.className='secondary';reveal.textContent='打开文档所在位置';let revealStatus=document.createElement('small');revealStatus.setAttribute('role','status');reveal.onclick=async()=&gt;{reveal.disabled=true;revealStatus.textContent='正在打开文件夹…';try{await post('/reveal/'+j.id,{});revealStatus.textContent='已打开 Finder 文件夹。';msg.textContent='已打开文档所在的 Finder 文件夹。'}catch(e){revealStatus.textContent='打开失败：'+e.message;msg.textContent='打开失败：'+e.message}finally{reveal.disabled=false}};actions.append(reveal);actions.append(revealStatus);card.append(actions);let note=document.createElement('small');note.textContent=j.temporary_files_removed?(j.media_trashed?'原音视频已移入废纸篓，临时音轨已清理。':'原音视频与临时音轨已清理。'):'Word 内容未经人工校对。';card.append(note)}let controls=document.createElement('p');controls.className='actions';if(j.state==='failed'||j.state==='login_required'){let retry=document.createElement('button');retry.textContent='重试任务';retry.onclick=async()=&gt;{try{await post('/jobs',{url:j.url,engine:'qianwen'});await refresh()}catch(e){msg.textContent=e.message}};controls.append(retry)}let remove=document.createElement('button');remove.type='button';remove.className='secondary';remove.style.color='#a52222';remove.textContent='删除任务并同步到千问';remove.onclick=async()=&gt;{if(!confirm('删除“'+(j.title||j.id)+'”？将停止该任务，把本机任务文件和相关文稿移入废纸篓。同时删除对应的千问云端记录，云端删除后无法恢复。'))return;remove.disabled=true;remove.textContent='正在同步删除…';try{let health=await(await fetch('/health')).json();if(!health.cloud_delete)throw Error('请先双击加载本次更新.command启用千问同步删除');await requireControls();let r=await post('/delete/'+j.id,{});msg.textContent=r.message;await refresh()}catch(e){msg.textContent='删除失败：'+e.message;remove.disabled=false;remove.textContent='删除任务并同步到千问'}};if(j.has_document){card.querySelector('.actions').append(remove)}else{controls.append(remove)}if(controls.children.length)card.append(controls);host.append(card)}await refreshLogin()}catch(e){msg.textContent='后台连接中断，请重新启动工具。'}}</w:t>
       </w:r>
     </w:p>
     <w:p>
@@ -6790,7 +6982,7 @@
         <w:pStyle w:val="SourceCode"/>
       </w:pPr>
       <w:r>
-        <w:t xml:space="preserve">                raise RuntimeError('千问账号云端存储已满，请在千问中自行删除不需要的记录后重试。本机音频已保留；工具不会删除云端记录。')</w:t>
+        <w:t xml:space="preserve">                raise RuntimeError('千问账号云端存储已满，请在千问中自行删除不需要的记录后重试。本机音频已保留；本次未删除云端记录。')</w:t>
       </w:r>
     </w:p>
     <w:p>
@@ -7122,6 +7314,14 @@
         <w:pStyle w:val="SourceCode"/>
       </w:pPr>
       <w:r>
+        <w:t xml:space="preserve">                    meta['qianwen_upload_title']=upload.stem</w:t>
+      </w:r>
+    </w:p>
+    <w:p>
+      <w:pPr>
+        <w:pStyle w:val="SourceCode"/>
+      </w:pPr>
+      <w:r>
         <w:t xml:space="preserve">                    meta['qianwen_submission_attempted']=True;save(job/'job.json',meta)</w:t>
       </w:r>
     </w:p>
@@ -7542,6 +7742,310 @@
         <w:pStyle w:val="SourceCode"/>
       </w:pPr>
       <w:r>
+        <w:t>def delete_cloud_record(page, job, meta, save):</w:t>
+      </w:r>
+    </w:p>
+    <w:p>
+      <w:pPr>
+        <w:pStyle w:val="SourceCode"/>
+      </w:pPr>
+      <w:r>
+        <w:t xml:space="preserve">    """Delete only the exact tool-uploaded title containing this task's identifier."""</w:t>
+      </w:r>
+    </w:p>
+    <w:p>
+      <w:pPr>
+        <w:pStyle w:val="SourceCode"/>
+      </w:pPr>
+      <w:r>
+        <w:t xml:space="preserve">    from playwright.sync_api import expect</w:t>
+      </w:r>
+    </w:p>
+    <w:p>
+      <w:pPr>
+        <w:pStyle w:val="SourceCode"/>
+      </w:pPr>
+      <w:r>
+        <w:t xml:space="preserve">    from reader import filename</w:t>
+      </w:r>
+    </w:p>
+    <w:p>
+      <w:pPr>
+        <w:pStyle w:val="SourceCode"/>
+      </w:pPr>
+      <w:r>
+        <w:t xml:space="preserve">    if meta.get('qianwen_cloud_deleted'):return</w:t>
+      </w:r>
+    </w:p>
+    <w:p>
+      <w:pPr>
+        <w:pStyle w:val="SourceCode"/>
+      </w:pPr>
+      <w:r>
+        <w:t xml:space="preserve">    if not any(meta.get(key) for key in ('qianwen_submitted','qianwen_submission_attempted','qianwen_url','qianwen_upload_confirmed')):</w:t>
+      </w:r>
+    </w:p>
+    <w:p>
+      <w:pPr>
+        <w:pStyle w:val="SourceCode"/>
+      </w:pPr>
+      <w:r>
+        <w:t xml:space="preserve">        meta['qianwen_cloud_deleted']=True;save(job/'job.json',meta);return</w:t>
+      </w:r>
+    </w:p>
+    <w:p>
+      <w:pPr>
+        <w:pStyle w:val="SourceCode"/>
+      </w:pPr>
+      <w:r>
+        <w:t xml:space="preserve">    title=meta.get('qianwen_upload_title') or filename(meta['title'])+'-'+job.name</w:t>
+      </w:r>
+    </w:p>
+    <w:p>
+      <w:pPr>
+        <w:pStyle w:val="SourceCode"/>
+      </w:pPr>
+      <w:r>
+        <w:t xml:space="preserve">    if not title.endswith('-'+job.name):raise RuntimeError('无法确认千问记录归属，未执行删除')</w:t>
+      </w:r>
+    </w:p>
+    <w:p>
+      <w:pPr>
+        <w:pStyle w:val="SourceCode"/>
+      </w:pPr>
+      <w:r>
+        <w:t xml:space="preserve">    require_login_if_visible(page)</w:t>
+      </w:r>
+    </w:p>
+    <w:p>
+      <w:pPr>
+        <w:pStyle w:val="SourceCode"/>
+      </w:pPr>
+      <w:r>
+        <w:t xml:space="preserve">    page.get_by_text('最近记录',exact=True).wait_for(timeout=30000)</w:t>
+      </w:r>
+    </w:p>
+    <w:p>
+      <w:pPr>
+        <w:pStyle w:val="SourceCode"/>
+      </w:pPr>
+      <w:r>
+        <w:t xml:space="preserve">    rows=page.locator('[data-e2e-test-id="folders_item_div"]').filter(has=page.get_by_text(title,exact=True))</w:t>
+      </w:r>
+    </w:p>
+    <w:p>
+      <w:pPr>
+        <w:pStyle w:val="SourceCode"/>
+      </w:pPr>
+      <w:r>
+        <w:t xml:space="preserve">    try:expect(rows).to_have_count(1,timeout=15000)</w:t>
+      </w:r>
+    </w:p>
+    <w:p>
+      <w:pPr>
+        <w:pStyle w:val="SourceCode"/>
+      </w:pPr>
+      <w:r>
+        <w:t xml:space="preserve">    except AssertionError as error:raise RuntimeError('未能唯一定位对应千问记录，未删除本机文件。记录可能已被手动删除或不在最近记录中，请检查千问页面。') from error</w:t>
+      </w:r>
+    </w:p>
+    <w:p>
+      <w:pPr>
+        <w:pStyle w:val="SourceCode"/>
+      </w:pPr>
+      <w:r>
+        <w:t xml:space="preserve">    rows.locator('[data-name="action"] .ant-dropdown-trigger').click()</w:t>
+      </w:r>
+    </w:p>
+    <w:p>
+      <w:pPr>
+        <w:pStyle w:val="SourceCode"/>
+      </w:pPr>
+      <w:r>
+        <w:t xml:space="preserve">    page.get_by_role('menuitem',name='删除',exact=True).click()</w:t>
+      </w:r>
+    </w:p>
+    <w:p>
+      <w:pPr>
+        <w:pStyle w:val="SourceCode"/>
+      </w:pPr>
+      <w:r>
+        <w:t xml:space="preserve">    dialog=page.get_by_role('dialog').filter(has_text='确定删除本记录吗？')</w:t>
+      </w:r>
+    </w:p>
+    <w:p>
+      <w:pPr>
+        <w:pStyle w:val="SourceCode"/>
+      </w:pPr>
+      <w:r>
+        <w:t xml:space="preserve">    dialog.wait_for(state='visible',timeout=10000)</w:t>
+      </w:r>
+    </w:p>
+    <w:p>
+      <w:pPr>
+        <w:pStyle w:val="SourceCode"/>
+      </w:pPr>
+      <w:r>
+        <w:t xml:space="preserve">    dialog.get_by_role('button',name='确定删除',exact=True).click()</w:t>
+      </w:r>
+    </w:p>
+    <w:p>
+      <w:pPr>
+        <w:pStyle w:val="SourceCode"/>
+      </w:pPr>
+      <w:r>
+        <w:t xml:space="preserve">    expect(rows).to_have_count(0,timeout=30000)</w:t>
+      </w:r>
+    </w:p>
+    <w:p>
+      <w:pPr>
+        <w:pStyle w:val="SourceCode"/>
+      </w:pPr>
+      <w:r>
+        <w:t xml:space="preserve">    require_cloud_available(page)</w:t>
+      </w:r>
+    </w:p>
+    <w:p>
+      <w:pPr>
+        <w:pStyle w:val="SourceCode"/>
+      </w:pPr>
+      <w:r>
+        <w:t xml:space="preserve">    meta['qianwen_cloud_deleted']=True;save(job/'job.json',meta)</w:t>
+      </w:r>
+    </w:p>
+    <w:p>
+      <w:pPr>
+        <w:pStyle w:val="SourceCode"/>
+      </w:pPr>
+      <w:r/>
+    </w:p>
+    <w:p>
+      <w:pPr>
+        <w:pStyle w:val="SourceCode"/>
+      </w:pPr>
+      <w:r/>
+    </w:p>
+    <w:p>
+      <w:pPr>
+        <w:pStyle w:val="SourceCode"/>
+      </w:pPr>
+      <w:r>
+        <w:t>def delete_cloud(job):</w:t>
+      </w:r>
+    </w:p>
+    <w:p>
+      <w:pPr>
+        <w:pStyle w:val="SourceCode"/>
+      </w:pPr>
+      <w:r>
+        <w:t xml:space="preserve">    import json</w:t>
+      </w:r>
+    </w:p>
+    <w:p>
+      <w:pPr>
+        <w:pStyle w:val="SourceCode"/>
+      </w:pPr>
+      <w:r>
+        <w:t xml:space="preserve">    from reader import save_json</w:t>
+      </w:r>
+    </w:p>
+    <w:p>
+      <w:pPr>
+        <w:pStyle w:val="SourceCode"/>
+      </w:pPr>
+      <w:r>
+        <w:t xml:space="preserve">    from playwright.sync_api import sync_playwright</w:t>
+      </w:r>
+    </w:p>
+    <w:p>
+      <w:pPr>
+        <w:pStyle w:val="SourceCode"/>
+      </w:pPr>
+      <w:r>
+        <w:t xml:space="preserve">    meta=json.loads((job/'job.json').read_text())</w:t>
+      </w:r>
+    </w:p>
+    <w:p>
+      <w:pPr>
+        <w:pStyle w:val="SourceCode"/>
+      </w:pPr>
+      <w:r>
+        <w:t xml:space="preserve">    if meta.get('qianwen_cloud_deleted'):return</w:t>
+      </w:r>
+    </w:p>
+    <w:p>
+      <w:pPr>
+        <w:pStyle w:val="SourceCode"/>
+      </w:pPr>
+      <w:r>
+        <w:t xml:space="preserve">    if not any(meta.get(key) for key in ('qianwen_submitted','qianwen_submission_attempted','qianwen_url','qianwen_upload_confirmed')):</w:t>
+      </w:r>
+    </w:p>
+    <w:p>
+      <w:pPr>
+        <w:pStyle w:val="SourceCode"/>
+      </w:pPr>
+      <w:r>
+        <w:t xml:space="preserve">        meta['qianwen_cloud_deleted']=True;save_json(job/'job.json',meta);return</w:t>
+      </w:r>
+    </w:p>
+    <w:p>
+      <w:pPr>
+        <w:pStyle w:val="SourceCode"/>
+      </w:pPr>
+      <w:r>
+        <w:t xml:space="preserve">    with sync_playwright() as p:</w:t>
+      </w:r>
+    </w:p>
+    <w:p>
+      <w:pPr>
+        <w:pStyle w:val="SourceCode"/>
+      </w:pPr>
+      <w:r>
+        <w:t xml:space="preserve">        with browser_context(p) as context:</w:t>
+      </w:r>
+    </w:p>
+    <w:p>
+      <w:pPr>
+        <w:pStyle w:val="SourceCode"/>
+      </w:pPr>
+      <w:r>
+        <w:t xml:space="preserve">            page=context.pages[0] if context.pages else context.new_page()</w:t>
+      </w:r>
+    </w:p>
+    <w:p>
+      <w:pPr>
+        <w:pStyle w:val="SourceCode"/>
+      </w:pPr>
+      <w:r>
+        <w:t xml:space="preserve">            page.goto(URL,wait_until='domcontentloaded')</w:t>
+      </w:r>
+    </w:p>
+    <w:p>
+      <w:pPr>
+        <w:pStyle w:val="SourceCode"/>
+      </w:pPr>
+      <w:r>
+        <w:t xml:space="preserve">            delete_cloud_record(page,job,meta,save_json)</w:t>
+      </w:r>
+    </w:p>
+    <w:p>
+      <w:pPr>
+        <w:pStyle w:val="SourceCode"/>
+      </w:pPr>
+      <w:r/>
+    </w:p>
+    <w:p>
+      <w:pPr>
+        <w:pStyle w:val="SourceCode"/>
+      </w:pPr>
+      <w:r/>
+    </w:p>
+    <w:p>
+      <w:pPr>
+        <w:pStyle w:val="SourceCode"/>
+      </w:pPr>
+      <w:r>
         <w:t>def login(ui=False):</w:t>
       </w:r>
     </w:p>
@@ -7674,15 +8178,55 @@
         <w:pStyle w:val="SourceCode"/>
       </w:pPr>
       <w:r>
-        <w:t xml:space="preserve">    parser = argparse.ArgumentParser(); parser.add_argument('command', choices=['login','login-ui'])</w:t>
-      </w:r>
-    </w:p>
-    <w:p>
-      <w:pPr>
-        <w:pStyle w:val="SourceCode"/>
-      </w:pPr>
-      <w:r>
-        <w:t xml:space="preserve">    args=parser.parse_args(); login(ui=args.command=='login-ui')</w:t>
+        <w:t xml:space="preserve">    parser = argparse.ArgumentParser(); parser.add_argument('command', choices=['login','login-ui','delete'])</w:t>
+      </w:r>
+    </w:p>
+    <w:p>
+      <w:pPr>
+        <w:pStyle w:val="SourceCode"/>
+      </w:pPr>
+      <w:r>
+        <w:t xml:space="preserve">    parser.add_argument('--job')</w:t>
+      </w:r>
+    </w:p>
+    <w:p>
+      <w:pPr>
+        <w:pStyle w:val="SourceCode"/>
+      </w:pPr>
+      <w:r>
+        <w:t xml:space="preserve">    args=parser.parse_args()</w:t>
+      </w:r>
+    </w:p>
+    <w:p>
+      <w:pPr>
+        <w:pStyle w:val="SourceCode"/>
+      </w:pPr>
+      <w:r>
+        <w:t xml:space="preserve">    if args.command=='delete':</w:t>
+      </w:r>
+    </w:p>
+    <w:p>
+      <w:pPr>
+        <w:pStyle w:val="SourceCode"/>
+      </w:pPr>
+      <w:r>
+        <w:t xml:space="preserve">        if not args.job or not re.fullmatch('[0-9a-f]{12}',args.job):parser.error('任务编号不合法')</w:t>
+      </w:r>
+    </w:p>
+    <w:p>
+      <w:pPr>
+        <w:pStyle w:val="SourceCode"/>
+      </w:pPr>
+      <w:r>
+        <w:t xml:space="preserve">        delete_cloud(ROOT/'work/jobs'/args.job)</w:t>
+      </w:r>
+    </w:p>
+    <w:p>
+      <w:pPr>
+        <w:pStyle w:val="SourceCode"/>
+      </w:pPr>
+      <w:r>
+        <w:t xml:space="preserve">    else:login(ui=args.command=='login-ui')</w:t>
       </w:r>
     </w:p>
     <w:p>
@@ -13070,6 +13614,108 @@
         <w:pStyle w:val="SourceCode"/>
       </w:pPr>
       <w:r>
+        <w:t>class SynchronizedDeleteTests(unittest.TestCase):</w:t>
+      </w:r>
+    </w:p>
+    <w:p>
+      <w:pPr>
+        <w:pStyle w:val="SourceCode"/>
+      </w:pPr>
+      <w:r>
+        <w:t xml:space="preserve">    def test_cloud_failure_preserves_local_document_and_task(self):</w:t>
+      </w:r>
+    </w:p>
+    <w:p>
+      <w:pPr>
+        <w:pStyle w:val="SourceCode"/>
+      </w:pPr>
+      <w:r>
+        <w:t xml:space="preserve">        from types import SimpleNamespace</w:t>
+      </w:r>
+    </w:p>
+    <w:p>
+      <w:pPr>
+        <w:pStyle w:val="SourceCode"/>
+      </w:pPr>
+      <w:r>
+        <w:t xml:space="preserve">        with tempfile.TemporaryDirectory() as tmp:</w:t>
+      </w:r>
+    </w:p>
+    <w:p>
+      <w:pPr>
+        <w:pStyle w:val="SourceCode"/>
+      </w:pPr>
+      <w:r>
+        <w:t xml:space="preserve">            work=Path(tmp);folder=work/'jobs/123456abcdef';folder.mkdir(parents=True)</w:t>
+      </w:r>
+    </w:p>
+    <w:p>
+      <w:pPr>
+        <w:pStyle w:val="SourceCode"/>
+      </w:pPr>
+      <w:r>
+        <w:t xml:space="preserve">            doc=work/'keep.docx';doc.write_bytes(b'keep')</w:t>
+      </w:r>
+    </w:p>
+    <w:p>
+      <w:pPr>
+        <w:pStyle w:val="SourceCode"/>
+      </w:pPr>
+      <w:r>
+        <w:t xml:space="preserve">            (folder/'job.json').write_text(json.dumps({'state':'completed','document':str(doc)}))</w:t>
+      </w:r>
+    </w:p>
+    <w:p>
+      <w:pPr>
+        <w:pStyle w:val="SourceCode"/>
+      </w:pPr>
+      <w:r>
+        <w:t xml:space="preserve">            with patch.object(app,'WORK',work),patch('task_controls.reader_pids',return_value=[]),patch('task_controls.trash_task') as trash,patch('app.subprocess.run',return_value=SimpleNamespace(returncode=1,stderr='登录失效')):</w:t>
+      </w:r>
+    </w:p>
+    <w:p>
+      <w:pPr>
+        <w:pStyle w:val="SourceCode"/>
+      </w:pPr>
+      <w:r>
+        <w:t xml:space="preserve">                with self.assertRaisesRegex(ValueError,'登录失效'):app.delete_task('123456abcdef')</w:t>
+      </w:r>
+    </w:p>
+    <w:p>
+      <w:pPr>
+        <w:pStyle w:val="SourceCode"/>
+      </w:pPr>
+      <w:r>
+        <w:t xml:space="preserve">                trash.assert_not_called()</w:t>
+      </w:r>
+    </w:p>
+    <w:p>
+      <w:pPr>
+        <w:pStyle w:val="SourceCode"/>
+      </w:pPr>
+      <w:r>
+        <w:t xml:space="preserve">            self.assertTrue(doc.exists());self.assertTrue((folder/'job.json').exists())</w:t>
+      </w:r>
+    </w:p>
+    <w:p>
+      <w:pPr>
+        <w:pStyle w:val="SourceCode"/>
+      </w:pPr>
+      <w:r>
+        <w:t xml:space="preserve">            self.assertFalse((folder/'.deleting').exists())</w:t>
+      </w:r>
+    </w:p>
+    <w:p>
+      <w:pPr>
+        <w:pStyle w:val="SourceCode"/>
+      </w:pPr>
+      <w:r/>
+    </w:p>
+    <w:p>
+      <w:pPr>
+        <w:pStyle w:val="SourceCode"/>
+      </w:pPr>
+      <w:r>
         <w:t>if __name__ == '__main__':</w:t>
       </w:r>
     </w:p>
@@ -14170,6 +14816,162 @@
         <w:pStyle w:val="SourceCode"/>
       </w:pPr>
       <w:r>
+        <w:t>class CloudDeleteSafetyTests(unittest.TestCase):</w:t>
+      </w:r>
+    </w:p>
+    <w:p>
+      <w:pPr>
+        <w:pStyle w:val="SourceCode"/>
+      </w:pPr>
+      <w:r>
+        <w:t xml:space="preserve">    def test_rejects_record_title_without_task_identifier(self):</w:t>
+      </w:r>
+    </w:p>
+    <w:p>
+      <w:pPr>
+        <w:pStyle w:val="SourceCode"/>
+      </w:pPr>
+      <w:r>
+        <w:t xml:space="preserve">        from unittest.mock import MagicMock</w:t>
+      </w:r>
+    </w:p>
+    <w:p>
+      <w:pPr>
+        <w:pStyle w:val="SourceCode"/>
+      </w:pPr>
+      <w:r>
+        <w:t xml:space="preserve">        import qianwen_browser as browser</w:t>
+      </w:r>
+    </w:p>
+    <w:p>
+      <w:pPr>
+        <w:pStyle w:val="SourceCode"/>
+      </w:pPr>
+      <w:r>
+        <w:t xml:space="preserve">        page=MagicMock()</w:t>
+      </w:r>
+    </w:p>
+    <w:p>
+      <w:pPr>
+        <w:pStyle w:val="SourceCode"/>
+      </w:pPr>
+      <w:r>
+        <w:t xml:space="preserve">        with self.assertRaisesRegex(RuntimeError,'归属'):</w:t>
+      </w:r>
+    </w:p>
+    <w:p>
+      <w:pPr>
+        <w:pStyle w:val="SourceCode"/>
+      </w:pPr>
+      <w:r>
+        <w:t xml:space="preserve">            browser.delete_cloud_record(page,Path('/tmp/123456abcdef'),{'qianwen_submitted':True,'qianwen_upload_title':'同名视频'},lambda *args:None)</w:t>
+      </w:r>
+    </w:p>
+    <w:p>
+      <w:pPr>
+        <w:pStyle w:val="SourceCode"/>
+      </w:pPr>
+      <w:r>
+        <w:t xml:space="preserve">        page.get_by_role.assert_not_called()</w:t>
+      </w:r>
+    </w:p>
+    <w:p>
+      <w:pPr>
+        <w:pStyle w:val="SourceCode"/>
+      </w:pPr>
+      <w:r/>
+    </w:p>
+    <w:p>
+      <w:pPr>
+        <w:pStyle w:val="SourceCode"/>
+      </w:pPr>
+      <w:r>
+        <w:t xml:space="preserve">    def test_ambiguous_record_never_clicks_delete(self):</w:t>
+      </w:r>
+    </w:p>
+    <w:p>
+      <w:pPr>
+        <w:pStyle w:val="SourceCode"/>
+      </w:pPr>
+      <w:r>
+        <w:t xml:space="preserve">        from unittest.mock import MagicMock,patch</w:t>
+      </w:r>
+    </w:p>
+    <w:p>
+      <w:pPr>
+        <w:pStyle w:val="SourceCode"/>
+      </w:pPr>
+      <w:r>
+        <w:t xml:space="preserve">        import qianwen_browser as browser</w:t>
+      </w:r>
+    </w:p>
+    <w:p>
+      <w:pPr>
+        <w:pStyle w:val="SourceCode"/>
+      </w:pPr>
+      <w:r>
+        <w:t xml:space="preserve">        page=UploadConfirmationTests().page();meta={'title':'测试','qianwen_submitted':True}</w:t>
+      </w:r>
+    </w:p>
+    <w:p>
+      <w:pPr>
+        <w:pStyle w:val="SourceCode"/>
+      </w:pPr>
+      <w:r>
+        <w:t xml:space="preserve">        with patch('playwright.sync_api.expect') as expect:</w:t>
+      </w:r>
+    </w:p>
+    <w:p>
+      <w:pPr>
+        <w:pStyle w:val="SourceCode"/>
+      </w:pPr>
+      <w:r>
+        <w:t xml:space="preserve">            expect.return_value.to_have_count.side_effect=AssertionError('two records')</w:t>
+      </w:r>
+    </w:p>
+    <w:p>
+      <w:pPr>
+        <w:pStyle w:val="SourceCode"/>
+      </w:pPr>
+      <w:r>
+        <w:t xml:space="preserve">            with self.assertRaisesRegex(RuntimeError,'唯一定位'):</w:t>
+      </w:r>
+    </w:p>
+    <w:p>
+      <w:pPr>
+        <w:pStyle w:val="SourceCode"/>
+      </w:pPr>
+      <w:r>
+        <w:t xml:space="preserve">                browser.delete_cloud_record(page,Path('/tmp/123456abcdef'),meta,lambda *args:None)</w:t>
+      </w:r>
+    </w:p>
+    <w:p>
+      <w:pPr>
+        <w:pStyle w:val="SourceCode"/>
+      </w:pPr>
+      <w:r>
+        <w:t xml:space="preserve">        page.locator.return_value.filter.return_value.locator.assert_not_called()</w:t>
+      </w:r>
+    </w:p>
+    <w:p>
+      <w:pPr>
+        <w:pStyle w:val="SourceCode"/>
+      </w:pPr>
+      <w:r>
+        <w:t xml:space="preserve">        self.assertFalse(meta.get('qianwen_cloud_deleted',False))</w:t>
+      </w:r>
+    </w:p>
+    <w:p>
+      <w:pPr>
+        <w:pStyle w:val="SourceCode"/>
+      </w:pPr>
+      <w:r/>
+    </w:p>
+    <w:p>
+      <w:pPr>
+        <w:pStyle w:val="SourceCode"/>
+      </w:pPr>
+      <w:r>
         <w:t>if __name__=='__main__':unittest.main()</w:t>
       </w:r>
     </w:p>
@@ -16592,7 +17394,7 @@
         <w:pStyle w:val="SourceCode"/>
       </w:pPr>
       <w:r>
-        <w:t xml:space="preserve">  "qianwen_browser.py": "1c0d273d18ebe5451362705781360aeea8e6cc68368746de1edc392334483172",</w:t>
+        <w:t xml:space="preserve">  "qianwen_browser.py": "bdd2035a54f5b0a2f55ad7141b827237e2a094a446b089d122249e5d547dba2b",</w:t>
       </w:r>
     </w:p>
     <w:p>
@@ -16616,7 +17418,7 @@
         <w:pStyle w:val="SourceCode"/>
       </w:pPr>
       <w:r>
-        <w:t xml:space="preserve">  "index.html": "0dd0d9b7110eba451c78c92a326d7addee61ed16df2be861d416bb22cd5e8c3b",</w:t>
+        <w:t xml:space="preserve">  "index.html": "dc1a4a7d512d27f968bb1f05d7c7148806de42bba34c3260501186ecebd95514",</w:t>
       </w:r>
     </w:p>
     <w:p>
@@ -16720,7 +17522,7 @@
         <w:pStyle w:val="SourceCode"/>
       </w:pPr>
       <w:r>
-        <w:t xml:space="preserve">  "app.py": "3a68dc7b10a21d064f8bf6ded132b60778435fb54bcbf68e33da328b5cda6a2d",</w:t>
+        <w:t xml:space="preserve">  "app.py": "8d3a65acfbc113e04f0ba3a08fbb01d1ee9cd1fea25916161d7b0c6d536e7245",</w:t>
       </w:r>
     </w:p>
     <w:p>
@@ -16752,7 +17554,7 @@
         <w:pStyle w:val="SourceCode"/>
       </w:pPr>
       <w:r>
-        <w:t xml:space="preserve">  "test_qianwen.py": "0c88e4472bcfdabc026b5e01398f7d55061d3530500884db4cb5078a771a4b38",</w:t>
+        <w:t xml:space="preserve">  "test_qianwen.py": "7638fbb3e2cf702a7291cb253e3842798e60752e9f57949bdc5533f489878bcc",</w:t>
       </w:r>
     </w:p>
     <w:p>
@@ -16776,7 +17578,7 @@
         <w:pStyle w:val="SourceCode"/>
       </w:pPr>
       <w:r>
-        <w:t xml:space="preserve">  "test_app.py": "fb6d9ea0dd25ad4046c3e2ff83e7b86b997c247c0f9685a591675280f0f5c8ab"</w:t>
+        <w:t xml:space="preserve">  "test_app.py": "487b27e80bfc988fc3351b0f7f056bd07eb174a82db479be9c2465de7dec4bc7"</w:t>
       </w:r>
     </w:p>
     <w:p>

</xml_diff>

<commit_message>
Remove deleted task cards immediately and ignore stale task-list responses
</commit_message>
<xml_diff>
--- a/安装与使用指南.docx
+++ b/安装与使用指南.docx
@@ -84,7 +84,7 @@
     </w:p>
     <w:p>
       <w:r>
-        <w:t>已完成任务的“删除任务并同步到千问”与“查看 Word 文稿”“打开文档所在位置”同排，不再提供重复下载按钮。每条任务的“删除任务并同步到千问”会停止该任务，将相关本机文件、已完成和未完成 Word、任务记录移入废纸篓；点击“删除任务并同步到千问”会删除对应千问记录，云端删除后无法恢复。云端删除失败则保留本机任务和文稿，提示原因后可重试；未上传的任务只清理本机。仅删除含本工具任务编号且唯一匹配的记录，旧记录未找到时保留文件供检查。模型和登录信息不会上传 GitHub。</w:t>
+        <w:t>已完成任务的“删除任务并同步到千问”与“查看 Word 文稿”“打开文档所在位置”同排，不再提供重复下载按钮。每条任务的“删除任务并同步到千问”会停止该任务，将相关本机文件、已完成和未完成 Word、任务记录移入废纸篓；点击“删除任务并同步到千问”会删除对应千问记录，云端删除后无法恢复。成功删除后任务卡片立即从工具列表消失，旧的刷新结果不会把卡片重新显示。云端删除失败则保留本机任务和文稿，提示原因后可重试；未上传的任务只清理本机。仅删除含本工具任务编号且唯一匹配的记录，旧记录未找到时保留文件供检查。模型和登录信息不会上传 GitHub。</w:t>
       </w:r>
     </w:p>
     <w:p>
@@ -337,7 +337,7 @@
     </w:p>
     <w:p>
       <w:r>
-        <w:t>本次 42 项测试通过，其中云端识别返回结果在单元测试中模拟；旧本地推理断点测试已移除。此前本机20秒音频的千问后台完整流程约46秒，不能推断长视频速度或识别准确率。未在另一台全新 Mac 完成安装实测。</w:t>
+        <w:t>本次 43 项测试通过，其中云端识别返回结果在单元测试中模拟；旧本地推理断点测试已移除。此前本机20秒音频的千问后台完整流程约46秒，不能推断长视频速度或识别准确率。未在另一台全新 Mac 完成安装实测。</w:t>
       </w:r>
     </w:p>
     <w:p>
@@ -4452,6 +4452,14 @@
         <w:pStyle w:val="SourceCode"/>
       </w:pPr>
       <w:r>
+        <w:t>const deletedTaskIds=new Set();let refreshSequence=0;</w:t>
+      </w:r>
+    </w:p>
+    <w:p>
+      <w:pPr>
+        <w:pStyle w:val="SourceCode"/>
+      </w:pPr>
+      <w:r>
         <w:t>async function requireControls(){let h=await(await fetch('/health')).json();if(!h.task_controls)throw Error('请双击“加载本次更新.command”，让网页服务加载登录和删除功能。')}</w:t>
       </w:r>
     </w:p>
@@ -4540,7 +4548,7 @@
         <w:pStyle w:val="SourceCode"/>
       </w:pPr>
       <w:r>
-        <w:t>document.querySelector('#form').onsubmit=async e=&gt;{e.preventDefault();try{if('qianwen'==='qianwen'){let health=await(await fetch('/health')).json();if(!health.engines?.includes('qianwen'))throw Error('网页服务需要加载新版。请完成登录千问配置后再试。')}if(selectedFile){let h=await(await fetch('/health')).json();if(!h.local_upload)throw Error('请双击“加载本次更新.command”启用本地文件入口。');let button=document.querySelector('#form button');button.disabled=true;msg.textContent='正在将文件交给本机后台，请稍候…';try{let r=await fetch('/upload',{method:'POST',headers:{'Content-Type':'application/octet-stream','X-File-Name':encodeURIComponent(selectedFile.name)},body:selectedFile});let j=await r.json();if(!r.ok)throw Error(j.error)}finally{button.disabled=false}}else{if(!urlInput.value.trim())throw Error('请粘贴链接或选择音视频文件');await post('/jobs',{url:urlInput.value,engine:'qianwen'})}selectedFile=null;picker.value='';document.querySelector('#file-name').textContent='';document.querySelector('#url').value='';msg.textContent='已加入后台队列。你可以继续做其他事情，稍后回来查看文稿。';await refresh()}catch(e){msg.textContent=e.message}};</w:t>
+        <w:t>document.querySelector('#form').onsubmit=async e=&gt;{e.preventDefault();try{if('qianwen'==='qianwen'){let health=await(await fetch('/health')).json();if(!health.engines?.includes('qianwen'))throw Error('网页服务需要加载新版。请完成登录千问配置后再试。')}if(selectedFile){let h=await(await fetch('/health')).json();if(!h.local_upload)throw Error('请双击“加载本次更新.command”启用本地文件入口。');let button=document.querySelector('#form button');button.disabled=true;msg.textContent='正在将文件交给本机后台，请稍候…';try{let r=await fetch('/upload',{method:'POST',headers:{'Content-Type':'application/octet-stream','X-File-Name':encodeURIComponent(selectedFile.name)},body:selectedFile});let j=await r.json();if(!r.ok)throw Error(j.error)}finally{button.disabled=false}}else{if(!urlInput.value.trim())throw Error('请粘贴链接或选择音视频文件');await post('/jobs',{url:urlInput.value,engine:'qianwen'})}deletedTaskIds.clear();selectedFile=null;picker.value='';document.querySelector('#file-name').textContent='';document.querySelector('#url').value='';msg.textContent='已加入后台队列。你可以继续做其他事情，稍后回来查看文稿。';await refresh()}catch(e){msg.textContent=e.message}};</w:t>
       </w:r>
     </w:p>
     <w:p>
@@ -4564,7 +4572,7 @@
         <w:pStyle w:val="SourceCode"/>
       </w:pPr>
       <w:r>
-        <w:t>async function refresh(){try{let jobs=await(await fetch('/jobs')).json();jobs.sort((a,b)=&gt;(b.created_at??historicalTaskTimes[b.id]??b.added_at??Infinity)-(a.created_at??historicalTaskTimes[a.id]??a.added_at??Infinity));let host=document.querySelector('#jobs');host.replaceChildren();for(let j of jobs){let card=document.createElement('article');let h=document.createElement('h2');h.textContent=taskHeading(j);card.append(h);let p=document.createElement('p');p.textContent=(j.document&amp;&amp;!j.has_document)?'Word 文件已不在原保存位置，重新提交链接可生成':(stages[j.state]||'状态暂未识别：'+String(j.state));card.append(p);if(j.source_kind==='local'){let source=document.createElement('p');source.textContent=j.source_label;card.append(source)}else card.append(link('原网页',j.url));if(j.error){let err=document.createElement('p');err.textContent=j.error;card.append(err)}if(j.cleanup_error){let note=document.createElement('p');note.textContent='Word 已生成，但部分临时文件未清理：'+j.cleanup_error;card.append(note)}if(j.has_document){let actions=document.createElement('p');actions.className='actions';actions.append(link('查看 Word 文稿','/preview/'+j.id,'action'));let reveal=document.createElement('button');reveal.type='button';reveal.className='secondary';reveal.textContent='打开文档所在位置';let revealStatus=document.createElement('small');revealStatus.setAttribute('role','status');reveal.onclick=async()=&gt;{reveal.disabled=true;revealStatus.textContent='正在打开文件夹…';try{await post('/reveal/'+j.id,{});revealStatus.textContent='已打开 Finder 文件夹。';msg.textContent='已打开文档所在的 Finder 文件夹。'}catch(e){revealStatus.textContent='打开失败：'+e.message;msg.textContent='打开失败：'+e.message}finally{reveal.disabled=false}};actions.append(reveal);actions.append(revealStatus);card.append(actions);let note=document.createElement('small');note.textContent=j.temporary_files_removed?(j.media_trashed?'原音视频已移入废纸篓，临时音轨已清理。':'原音视频与临时音轨已清理。'):'Word 内容未经人工校对。';card.append(note)}let controls=document.createElement('p');controls.className='actions';if(j.state==='failed'||j.state==='login_required'){let retry=document.createElement('button');retry.textContent='重试任务';retry.onclick=async()=&gt;{try{await post('/jobs',{url:j.url,engine:'qianwen'});await refresh()}catch(e){msg.textContent=e.message}};controls.append(retry)}let remove=document.createElement('button');remove.type='button';remove.className='secondary';remove.style.color='#a52222';remove.textContent='删除任务并同步到千问';remove.onclick=async()=&gt;{if(!confirm('删除“'+(j.title||j.id)+'”？将停止该任务，把本机任务文件和相关文稿移入废纸篓。同时删除对应的千问云端记录，云端删除后无法恢复。'))return;remove.disabled=true;remove.textContent='正在同步删除…';try{let health=await(await fetch('/health')).json();if(!health.cloud_delete)throw Error('请先双击加载本次更新.command启用千问同步删除');await requireControls();let r=await post('/delete/'+j.id,{});msg.textContent=r.message;await refresh()}catch(e){msg.textContent='删除失败：'+e.message;remove.disabled=false;remove.textContent='删除任务并同步到千问'}};if(j.has_document){card.querySelector('.actions').append(remove)}else{controls.append(remove)}if(controls.children.length)card.append(controls);host.append(card)}await refreshLogin()}catch(e){msg.textContent='后台连接中断，请重新启动工具。'}}</w:t>
+        <w:t>async function refresh(){const sequence=++refreshSequence;try{let jobs=await(await fetch('/jobs')).json();if(sequence!==refreshSequence)return;jobs=jobs.filter(j=&gt;!deletedTaskIds.has(j.id));jobs.sort((a,b)=&gt;(b.created_at??historicalTaskTimes[b.id]??b.added_at??Infinity)-(a.created_at??historicalTaskTimes[a.id]??a.added_at??Infinity));let host=document.querySelector('#jobs');host.replaceChildren();for(let j of jobs){let card=document.createElement('article');let h=document.createElement('h2');h.textContent=taskHeading(j);card.append(h);let p=document.createElement('p');p.textContent=(j.document&amp;&amp;!j.has_document)?'Word 文件已不在原保存位置，重新提交链接可生成':(stages[j.state]||'状态暂未识别：'+String(j.state));card.append(p);if(j.source_kind==='local'){let source=document.createElement('p');source.textContent=j.source_label;card.append(source)}else card.append(link('原网页',j.url));if(j.error){let err=document.createElement('p');err.textContent=j.error;card.append(err)}if(j.cleanup_error){let note=document.createElement('p');note.textContent='Word 已生成，但部分临时文件未清理：'+j.cleanup_error;card.append(note)}if(j.has_document){let actions=document.createElement('p');actions.className='actions';actions.append(link('查看 Word 文稿','/preview/'+j.id,'action'));let reveal=document.createElement('button');reveal.type='button';reveal.className='secondary';reveal.textContent='打开文档所在位置';let revealStatus=document.createElement('small');revealStatus.setAttribute('role','status');reveal.onclick=async()=&gt;{reveal.disabled=true;revealStatus.textContent='正在打开文件夹…';try{await post('/reveal/'+j.id,{});revealStatus.textContent='已打开 Finder 文件夹。';msg.textContent='已打开文档所在的 Finder 文件夹。'}catch(e){revealStatus.textContent='打开失败：'+e.message;msg.textContent='打开失败：'+e.message}finally{reveal.disabled=false}};actions.append(reveal);actions.append(revealStatus);card.append(actions);let note=document.createElement('small');note.textContent=j.temporary_files_removed?(j.media_trashed?'原音视频已移入废纸篓，临时音轨已清理。':'原音视频与临时音轨已清理。'):'Word 内容未经人工校对。';card.append(note)}let controls=document.createElement('p');controls.className='actions';if(j.state==='failed'||j.state==='login_required'){let retry=document.createElement('button');retry.textContent='重试任务';retry.onclick=async()=&gt;{try{await post('/jobs',{url:j.url,engine:'qianwen'});await refresh()}catch(e){msg.textContent=e.message}};controls.append(retry)}let remove=document.createElement('button');remove.type='button';remove.className='secondary';remove.style.color='#a52222';remove.textContent='删除任务并同步到千问';remove.onclick=async()=&gt;{if(!confirm('删除“'+(j.title||j.id)+'”？将停止该任务，把本机任务文件和相关文稿移入废纸篓。同时删除对应的千问云端记录，云端删除后无法恢复。'))return;remove.disabled=true;remove.textContent='正在同步删除…';try{let health=await(await fetch('/health')).json();if(!health.cloud_delete)throw Error('请先双击加载本次更新.command启用千问同步删除');await requireControls();let r=await post('/delete/'+j.id,{});deletedTaskIds.add(j.id);++refreshSequence;card.remove();msg.textContent=r.message;await refresh()}catch(e){msg.textContent='删除失败：'+e.message;remove.disabled=false;remove.textContent='删除任务并同步到千问'}};if(j.has_document){card.querySelector('.actions').append(remove)}else{controls.append(remove)}if(controls.children.length)card.append(controls);host.append(card)}await refreshLogin()}catch(e){msg.textContent='后台连接中断，请重新启动工具。'}}</w:t>
       </w:r>
     </w:p>
     <w:p>
@@ -13622,6 +13630,116 @@
         <w:pStyle w:val="SourceCode"/>
       </w:pPr>
       <w:r>
+        <w:t xml:space="preserve">    def test_successful_delete_removes_task_from_list(self):</w:t>
+      </w:r>
+    </w:p>
+    <w:p>
+      <w:pPr>
+        <w:pStyle w:val="SourceCode"/>
+      </w:pPr>
+      <w:r>
+        <w:t xml:space="preserve">        import shutil</w:t>
+      </w:r>
+    </w:p>
+    <w:p>
+      <w:pPr>
+        <w:pStyle w:val="SourceCode"/>
+      </w:pPr>
+      <w:r>
+        <w:t xml:space="preserve">        from types import SimpleNamespace</w:t>
+      </w:r>
+    </w:p>
+    <w:p>
+      <w:pPr>
+        <w:pStyle w:val="SourceCode"/>
+      </w:pPr>
+      <w:r>
+        <w:t xml:space="preserve">        with tempfile.TemporaryDirectory() as tmp:</w:t>
+      </w:r>
+    </w:p>
+    <w:p>
+      <w:pPr>
+        <w:pStyle w:val="SourceCode"/>
+      </w:pPr>
+      <w:r>
+        <w:t xml:space="preserve">            work=Path(tmp);folder=work/'jobs/123456abcdef';folder.mkdir(parents=True)</w:t>
+      </w:r>
+    </w:p>
+    <w:p>
+      <w:pPr>
+        <w:pStyle w:val="SourceCode"/>
+      </w:pPr>
+      <w:r>
+        <w:t xml:space="preserve">            (folder/'job.json').write_text(json.dumps({'state':'completed','created_at':1}))</w:t>
+      </w:r>
+    </w:p>
+    <w:p>
+      <w:pPr>
+        <w:pStyle w:val="SourceCode"/>
+      </w:pPr>
+      <w:r>
+        <w:t xml:space="preserve">            def trash(root,work,outputs,ident):</w:t>
+      </w:r>
+    </w:p>
+    <w:p>
+      <w:pPr>
+        <w:pStyle w:val="SourceCode"/>
+      </w:pPr>
+      <w:r>
+        <w:t xml:space="preserve">                shutil.rmtree(work/'jobs'/ident)</w:t>
+      </w:r>
+    </w:p>
+    <w:p>
+      <w:pPr>
+        <w:pStyle w:val="SourceCode"/>
+      </w:pPr>
+      <w:r>
+        <w:t xml:space="preserve">                return {'ok':True}</w:t>
+      </w:r>
+    </w:p>
+    <w:p>
+      <w:pPr>
+        <w:pStyle w:val="SourceCode"/>
+      </w:pPr>
+      <w:r>
+        <w:t xml:space="preserve">            with patch.object(app,'WORK',work),patch('task_controls.reader_pids',return_value=[]),patch('task_controls.trash_task',side_effect=trash),patch('app.subprocess.run',return_value=SimpleNamespace(returncode=0)):</w:t>
+      </w:r>
+    </w:p>
+    <w:p>
+      <w:pPr>
+        <w:pStyle w:val="SourceCode"/>
+      </w:pPr>
+      <w:r>
+        <w:t xml:space="preserve">                self.assertEqual(len(app.list_jobs()),1)</w:t>
+      </w:r>
+    </w:p>
+    <w:p>
+      <w:pPr>
+        <w:pStyle w:val="SourceCode"/>
+      </w:pPr>
+      <w:r>
+        <w:t xml:space="preserve">                self.assertTrue(app.delete_task('123456abcdef')['ok'])</w:t>
+      </w:r>
+    </w:p>
+    <w:p>
+      <w:pPr>
+        <w:pStyle w:val="SourceCode"/>
+      </w:pPr>
+      <w:r>
+        <w:t xml:space="preserve">                self.assertEqual(app.list_jobs(),[])</w:t>
+      </w:r>
+    </w:p>
+    <w:p>
+      <w:pPr>
+        <w:pStyle w:val="SourceCode"/>
+      </w:pPr>
+      <w:r/>
+    </w:p>
+    <w:p>
+      <w:pPr>
+        <w:pStyle w:val="SourceCode"/>
+      </w:pPr>
+      <w:r>
         <w:t xml:space="preserve">    def test_cloud_failure_preserves_local_document_and_task(self):</w:t>
       </w:r>
     </w:p>
@@ -17418,7 +17536,7 @@
         <w:pStyle w:val="SourceCode"/>
       </w:pPr>
       <w:r>
-        <w:t xml:space="preserve">  "index.html": "dc1a4a7d512d27f968bb1f05d7c7148806de42bba34c3260501186ecebd95514",</w:t>
+        <w:t xml:space="preserve">  "index.html": "5acde03cff253aec5a2f83cdea4c003233958913e2cded85227187eb2f5e3a40",</w:t>
       </w:r>
     </w:p>
     <w:p>
@@ -17578,7 +17696,7 @@
         <w:pStyle w:val="SourceCode"/>
       </w:pPr>
       <w:r>
-        <w:t xml:space="preserve">  "test_app.py": "487b27e80bfc988fc3351b0f7f056bd07eb174a82db479be9c2465de7dec4bc7"</w:t>
+        <w:t xml:space="preserve">  "test_app.py": "d339344df009571d13c51836941d74ce19ba5b307e8d7f57c349d4e412a72818"</w:t>
       </w:r>
     </w:p>
     <w:p>

</xml_diff>

<commit_message>
Fix Qianwen recent-record counter matching and persist visible deletion results
</commit_message>
<xml_diff>
--- a/安装与使用指南.docx
+++ b/安装与使用指南.docx
@@ -84,7 +84,7 @@
     </w:p>
     <w:p>
       <w:r>
-        <w:t>已完成任务的“删除任务并同步到千问”与“查看 Word 文稿”“打开文档所在位置”同排，不再提供重复下载按钮。每条任务的“删除任务并同步到千问”会停止该任务，将相关本机文件、已完成和未完成 Word、任务记录移入废纸篓；点击“删除任务并同步到千问”会删除对应千问记录，云端删除后无法恢复。成功删除后任务卡片立即从工具列表消失，旧的刷新结果不会把卡片重新显示。云端删除失败则保留本机任务和文稿，提示原因后可重试；未上传的任务只清理本机。仅删除含本工具任务编号且唯一匹配的记录，旧记录未找到时保留文件供检查。模型和登录信息不会上传 GitHub。</w:t>
+        <w:t>已完成任务的“删除任务并同步到千问”与“查看 Word 文稿”“打开文档所在位置”同排，不再提供重复下载按钮。每条任务的“删除任务并同步到千问”会停止该任务，将相关本机文件、已完成和未完成 Word、任务记录移入废纸篓；点击“删除任务并同步到千问”会删除对应千问记录，云端删除后无法恢复。页面以绿色提示删除成功，红色提示删除失败；失败原因保留在任务卡片并随刷新显示。成功删除后任务卡片立即从工具列表消失，旧的刷新结果不会把卡片重新显示。云端删除失败则保留本机任务和文稿，提示原因后可重试；未上传的任务只清理本机。仅删除含本工具任务编号且唯一匹配的记录，旧记录未找到时保留文件供检查。模型和登录信息不会上传 GitHub。</w:t>
       </w:r>
     </w:p>
     <w:p>
@@ -337,7 +337,7 @@
     </w:p>
     <w:p>
       <w:r>
-        <w:t>本次 43 项测试通过，其中云端识别返回结果在单元测试中模拟；旧本地推理断点测试已移除。此前本机20秒音频的千问后台完整流程约46秒，不能推断长视频速度或识别准确率。未在另一台全新 Mac 完成安装实测。</w:t>
+        <w:t>本次 45 项测试通过，其中云端识别返回结果在单元测试中模拟；旧本地推理断点测试已移除。此前本机20秒音频的千问后台完整流程约46秒，不能推断长视频速度或识别准确率。未在另一台全新 Mac 完成安装实测。</w:t>
       </w:r>
     </w:p>
     <w:p>
@@ -1284,6 +1284,22 @@
         <w:pStyle w:val="SourceCode"/>
       </w:pPr>
       <w:r>
+        <w:t xml:space="preserve">            deletion=path.parent/'delete-result.json'</w:t>
+      </w:r>
+    </w:p>
+    <w:p>
+      <w:pPr>
+        <w:pStyle w:val="SourceCode"/>
+      </w:pPr>
+      <w:r>
+        <w:t xml:space="preserve">            if deletion.exists():item['deletion_result']=json.loads(deletion.read_text())</w:t>
+      </w:r>
+    </w:p>
+    <w:p>
+      <w:pPr>
+        <w:pStyle w:val="SourceCode"/>
+      </w:pPr>
+      <w:r>
         <w:t xml:space="preserve">            title_path = path.parent / 'page-title.json'</w:t>
       </w:r>
     </w:p>
@@ -3208,7 +3224,79 @@
         <w:pStyle w:val="SourceCode"/>
       </w:pPr>
       <w:r>
-        <w:t xml:space="preserve">            if deletion:return self.reply(200, delete_task(deletion.group(1)))</w:t>
+        <w:t xml:space="preserve">            if deletion:</w:t>
+      </w:r>
+    </w:p>
+    <w:p>
+      <w:pPr>
+        <w:pStyle w:val="SourceCode"/>
+      </w:pPr>
+      <w:r>
+        <w:t xml:space="preserve">                ident=deletion.group(1)</w:t>
+      </w:r>
+    </w:p>
+    <w:p>
+      <w:pPr>
+        <w:pStyle w:val="SourceCode"/>
+      </w:pPr>
+      <w:r>
+        <w:t xml:space="preserve">                try:</w:t>
+      </w:r>
+    </w:p>
+    <w:p>
+      <w:pPr>
+        <w:pStyle w:val="SourceCode"/>
+      </w:pPr>
+      <w:r>
+        <w:t xml:space="preserve">                    result=delete_task(ident)</w:t>
+      </w:r>
+    </w:p>
+    <w:p>
+      <w:pPr>
+        <w:pStyle w:val="SourceCode"/>
+      </w:pPr>
+      <w:r>
+        <w:t xml:space="preserve">                except (ValueError,OSError,subprocess.SubprocessError) as error:</w:t>
+      </w:r>
+    </w:p>
+    <w:p>
+      <w:pPr>
+        <w:pStyle w:val="SourceCode"/>
+      </w:pPr>
+      <w:r>
+        <w:t xml:space="preserve">                    folder=WORK/'jobs'/ident</w:t>
+      </w:r>
+    </w:p>
+    <w:p>
+      <w:pPr>
+        <w:pStyle w:val="SourceCode"/>
+      </w:pPr>
+      <w:r>
+        <w:t xml:space="preserve">                    if folder.exists():save_json(folder/'delete-result.json',{'status':'failed','message':'删除失败：'+str(error),'at':time.time()})</w:t>
+      </w:r>
+    </w:p>
+    <w:p>
+      <w:pPr>
+        <w:pStyle w:val="SourceCode"/>
+      </w:pPr>
+      <w:r>
+        <w:t xml:space="preserve">                    raise</w:t>
+      </w:r>
+    </w:p>
+    <w:p>
+      <w:pPr>
+        <w:pStyle w:val="SourceCode"/>
+      </w:pPr>
+      <w:r>
+        <w:t xml:space="preserve">                result['message']='删除成功：任务列表记录、本机文稿及任务文件已清理，对应千问记录已删除（未上传的任务无需云端删除）。'</w:t>
+      </w:r>
+    </w:p>
+    <w:p>
+      <w:pPr>
+        <w:pStyle w:val="SourceCode"/>
+      </w:pPr>
+      <w:r>
+        <w:t xml:space="preserve">                return self.reply(200,result)</w:t>
       </w:r>
     </w:p>
     <w:p>
@@ -4342,7 +4430,7 @@
         <w:pStyle w:val="SourceCode"/>
       </w:pPr>
       <w:r>
-        <w:t>body{font:16px/1.7 -apple-system,BlinkMacSystemFont,sans-serif;color:#24322d;background:#f4f6f3;max-width:920px;margin:48px auto;padding:0 24px}h1{font-size:32px}h1 button{font-size:14px;padding:6px 10px;font-weight:normal;vertical-align:middle;white-space:nowrap}input,button,.action{font:inherit;padding:10px 14px;border:1px solid #c6d1ca;border-radius:8px}input[type=url]{flex:1;min-width:180px}button,.action{background:#245441;color:white;cursor:pointer;text-decoration:none;display:inline-block}form,.actions{display:flex;gap:12px;flex-wrap:wrap}article{background:white;padding:24px;border:1px solid #e0e7e1;border-radius:12px;margin:20px 0}small{color:#62736b}a{color:#245441}#message{color:#8b4520}.notice{background:#fff3cd;color:#9c0006;padding:14px 18px;border-left:4px solid #b07800;font-weight:bold}.secondary{background:white;color:#245441}</w:t>
+        <w:t>body{font:16px/1.7 -apple-system,BlinkMacSystemFont,sans-serif;color:#24322d;background:#f4f6f3;max-width:920px;margin:48px auto;padding:0 24px}h1{font-size:32px}h1 button{font-size:14px;padding:6px 10px;font-weight:normal;vertical-align:middle;white-space:nowrap}input,button,.action{font:inherit;padding:10px 14px;border:1px solid #c6d1ca;border-radius:8px}input[type=url]{flex:1;min-width:180px}button,.action{background:#245441;color:white;cursor:pointer;text-decoration:none;display:inline-block}form,.actions{display:flex;gap:12px;flex-wrap:wrap}article{background:white;padding:24px;border:1px solid #e0e7e1;border-radius:12px;margin:20px 0}small{color:#62736b}a{color:#245441}#message{color:#8b4520}#message.success{color:#176538;background:#eaf7ee;padding:12px;border-radius:8px}#message.failure{color:#a52222;background:#fff0f0;padding:12px;border-radius:8px}.delete-result{font-weight:bold;white-space:pre-wrap}.notice{background:#fff3cd;color:#9c0006;padding:14px 18px;border-left:4px solid #b07800;font-weight:bold}.secondary{background:white;color:#245441}</w:t>
       </w:r>
     </w:p>
     <w:p>
@@ -4452,7 +4540,7 @@
         <w:pStyle w:val="SourceCode"/>
       </w:pPr>
       <w:r>
-        <w:t>const deletedTaskIds=new Set();let refreshSequence=0;</w:t>
+        <w:t>const deletedTaskIds=new Set();const deletionResults=new Map();let refreshSequence=0;</w:t>
       </w:r>
     </w:p>
     <w:p>
@@ -4572,7 +4660,7 @@
         <w:pStyle w:val="SourceCode"/>
       </w:pPr>
       <w:r>
-        <w:t>async function refresh(){const sequence=++refreshSequence;try{let jobs=await(await fetch('/jobs')).json();if(sequence!==refreshSequence)return;jobs=jobs.filter(j=&gt;!deletedTaskIds.has(j.id));jobs.sort((a,b)=&gt;(b.created_at??historicalTaskTimes[b.id]??b.added_at??Infinity)-(a.created_at??historicalTaskTimes[a.id]??a.added_at??Infinity));let host=document.querySelector('#jobs');host.replaceChildren();for(let j of jobs){let card=document.createElement('article');let h=document.createElement('h2');h.textContent=taskHeading(j);card.append(h);let p=document.createElement('p');p.textContent=(j.document&amp;&amp;!j.has_document)?'Word 文件已不在原保存位置，重新提交链接可生成':(stages[j.state]||'状态暂未识别：'+String(j.state));card.append(p);if(j.source_kind==='local'){let source=document.createElement('p');source.textContent=j.source_label;card.append(source)}else card.append(link('原网页',j.url));if(j.error){let err=document.createElement('p');err.textContent=j.error;card.append(err)}if(j.cleanup_error){let note=document.createElement('p');note.textContent='Word 已生成，但部分临时文件未清理：'+j.cleanup_error;card.append(note)}if(j.has_document){let actions=document.createElement('p');actions.className='actions';actions.append(link('查看 Word 文稿','/preview/'+j.id,'action'));let reveal=document.createElement('button');reveal.type='button';reveal.className='secondary';reveal.textContent='打开文档所在位置';let revealStatus=document.createElement('small');revealStatus.setAttribute('role','status');reveal.onclick=async()=&gt;{reveal.disabled=true;revealStatus.textContent='正在打开文件夹…';try{await post('/reveal/'+j.id,{});revealStatus.textContent='已打开 Finder 文件夹。';msg.textContent='已打开文档所在的 Finder 文件夹。'}catch(e){revealStatus.textContent='打开失败：'+e.message;msg.textContent='打开失败：'+e.message}finally{reveal.disabled=false}};actions.append(reveal);actions.append(revealStatus);card.append(actions);let note=document.createElement('small');note.textContent=j.temporary_files_removed?(j.media_trashed?'原音视频已移入废纸篓，临时音轨已清理。':'原音视频与临时音轨已清理。'):'Word 内容未经人工校对。';card.append(note)}let controls=document.createElement('p');controls.className='actions';if(j.state==='failed'||j.state==='login_required'){let retry=document.createElement('button');retry.textContent='重试任务';retry.onclick=async()=&gt;{try{await post('/jobs',{url:j.url,engine:'qianwen'});await refresh()}catch(e){msg.textContent=e.message}};controls.append(retry)}let remove=document.createElement('button');remove.type='button';remove.className='secondary';remove.style.color='#a52222';remove.textContent='删除任务并同步到千问';remove.onclick=async()=&gt;{if(!confirm('删除“'+(j.title||j.id)+'”？将停止该任务，把本机任务文件和相关文稿移入废纸篓。同时删除对应的千问云端记录，云端删除后无法恢复。'))return;remove.disabled=true;remove.textContent='正在同步删除…';try{let health=await(await fetch('/health')).json();if(!health.cloud_delete)throw Error('请先双击加载本次更新.command启用千问同步删除');await requireControls();let r=await post('/delete/'+j.id,{});deletedTaskIds.add(j.id);++refreshSequence;card.remove();msg.textContent=r.message;await refresh()}catch(e){msg.textContent='删除失败：'+e.message;remove.disabled=false;remove.textContent='删除任务并同步到千问'}};if(j.has_document){card.querySelector('.actions').append(remove)}else{controls.append(remove)}if(controls.children.length)card.append(controls);host.append(card)}await refreshLogin()}catch(e){msg.textContent='后台连接中断，请重新启动工具。'}}</w:t>
+        <w:t>async function refresh(){const sequence=++refreshSequence;try{let jobs=await(await fetch('/jobs')).json();if(sequence!==refreshSequence)return;jobs=jobs.filter(j=&gt;!deletedTaskIds.has(j.id));jobs.sort((a,b)=&gt;(b.created_at??historicalTaskTimes[b.id]??b.added_at??Infinity)-(a.created_at??historicalTaskTimes[a.id]??a.added_at??Infinity));let host=document.querySelector('#jobs');host.replaceChildren();for(let j of jobs){let card=document.createElement('article');let h=document.createElement('h2');h.textContent=taskHeading(j);card.append(h);let p=document.createElement('p');p.textContent=(j.document&amp;&amp;!j.has_document)?'Word 文件已不在原保存位置，重新提交链接可生成':(stages[j.state]||'状态暂未识别：'+String(j.state));card.append(p);if(j.source_kind==='local'){let source=document.createElement('p');source.textContent=j.source_label;card.append(source)}else card.append(link('原网页',j.url));let deletion=deletionResults.get(j.id)||j.deletion_result;if(deletion){let status=document.createElement('p');status.className='delete-result';status.setAttribute('role','alert');status.style.color=deletion.status==='failed'?'#a52222':'#8b4520';status.textContent=deletion.message;card.append(status)}if(j.error){let err=document.createElement('p');err.textContent=j.error;card.append(err)}if(j.cleanup_error){let note=document.createElement('p');note.textContent='Word 已生成，但部分临时文件未清理：'+j.cleanup_error;card.append(note)}if(j.has_document){let actions=document.createElement('p');actions.className='actions';actions.append(link('查看 Word 文稿','/preview/'+j.id,'action'));let reveal=document.createElement('button');reveal.type='button';reveal.className='secondary';reveal.textContent='打开文档所在位置';let revealStatus=document.createElement('small');revealStatus.setAttribute('role','status');reveal.onclick=async()=&gt;{reveal.disabled=true;revealStatus.textContent='正在打开文件夹…';try{await post('/reveal/'+j.id,{});revealStatus.textContent='已打开 Finder 文件夹。';msg.textContent='已打开文档所在的 Finder 文件夹。'}catch(e){revealStatus.textContent='打开失败：'+e.message;msg.textContent='打开失败：'+e.message}finally{reveal.disabled=false}};actions.append(reveal);actions.append(revealStatus);card.append(actions);let note=document.createElement('small');note.textContent=j.temporary_files_removed?(j.media_trashed?'原音视频已移入废纸篓，临时音轨已清理。':'原音视频与临时音轨已清理。'):'Word 内容未经人工校对。';card.append(note)}let controls=document.createElement('p');controls.className='actions';if(j.state==='failed'||j.state==='login_required'){let retry=document.createElement('button');retry.textContent='重试任务';retry.onclick=async()=&gt;{try{await post('/jobs',{url:j.url,engine:'qianwen'});await refresh()}catch(e){msg.textContent=e.message}};controls.append(retry)}let remove=document.createElement('button');remove.type='button';remove.className='secondary';remove.style.color='#a52222';remove.textContent='删除任务并同步到千问';if(deletion?.status==='pending'){remove.disabled=true;remove.textContent='正在同步删除…'}remove.onclick=async()=&gt;{if(!confirm('删除“'+(j.title||j.id)+'”？将停止该任务，把本机任务文件和相关文稿移入废纸篓。同时删除对应的千问云端记录，云端删除后无法恢复。'))return;deletionResults.set(j.id,{status:'pending',message:'正在删除并同步到千问，请稍候…'});msg.className='';msg.textContent='正在删除并同步到千问，请稍候…';remove.disabled=true;remove.textContent='正在同步删除…';try{let health=await(await fetch('/health')).json();if(!health.cloud_delete)throw Error('请先双击加载本次更新.command启用千问同步删除');await requireControls();let r=await post('/delete/'+j.id,{});deletedTaskIds.add(j.id);++refreshSequence;card.remove();deletionResults.delete(j.id);msg.className='success';msg.textContent=r.message.startsWith('删除成功')?r.message:'删除成功：'+r.message;await refresh()}catch(e){let message='删除失败：'+e.message;deletionResults.set(j.id,{status:'failed',message});msg.className='failure';msg.textContent=message;let status=card.querySelector('.delete-result');if(!status){status=document.createElement('p');status.className='delete-result';status.setAttribute('role','alert');card.append(status)}status.style.color='#a52222';status.textContent=message;remove.disabled=false;remove.textContent='删除任务并同步到千问'}};if(j.has_document){card.querySelector('.actions').append(remove)}else{controls.append(remove)}if(controls.children.length)card.append(controls);host.append(card)}await refreshLogin()}catch(e){msg.textContent='后台连接中断，请重新启动工具。'}}</w:t>
       </w:r>
     </w:p>
     <w:p>
@@ -7830,7 +7918,7 @@
         <w:pStyle w:val="SourceCode"/>
       </w:pPr>
       <w:r>
-        <w:t xml:space="preserve">    page.get_by_text('最近记录',exact=True).wait_for(timeout=30000)</w:t>
+        <w:t xml:space="preserve">    page.get_by_text('最近记录',exact=False).first.wait_for(timeout=30000)</w:t>
       </w:r>
     </w:p>
     <w:p>
@@ -13630,6 +13718,68 @@
         <w:pStyle w:val="SourceCode"/>
       </w:pPr>
       <w:r>
+        <w:t xml:space="preserve">    def test_failed_deletion_result_survives_task_list_refresh(self):</w:t>
+      </w:r>
+    </w:p>
+    <w:p>
+      <w:pPr>
+        <w:pStyle w:val="SourceCode"/>
+      </w:pPr>
+      <w:r>
+        <w:t xml:space="preserve">        with tempfile.TemporaryDirectory() as tmp:</w:t>
+      </w:r>
+    </w:p>
+    <w:p>
+      <w:pPr>
+        <w:pStyle w:val="SourceCode"/>
+      </w:pPr>
+      <w:r>
+        <w:t xml:space="preserve">            work=Path(tmp);folder=work/'jobs/123456abcdef';folder.mkdir(parents=True)</w:t>
+      </w:r>
+    </w:p>
+    <w:p>
+      <w:pPr>
+        <w:pStyle w:val="SourceCode"/>
+      </w:pPr>
+      <w:r>
+        <w:t xml:space="preserve">            (folder/'job.json').write_text(json.dumps({'state':'completed','created_at':1}))</w:t>
+      </w:r>
+    </w:p>
+    <w:p>
+      <w:pPr>
+        <w:pStyle w:val="SourceCode"/>
+      </w:pPr>
+      <w:r>
+        <w:t xml:space="preserve">            (folder/'delete-result.json').write_text(json.dumps({'status':'failed','message':'删除失败：登录失效'}))</w:t>
+      </w:r>
+    </w:p>
+    <w:p>
+      <w:pPr>
+        <w:pStyle w:val="SourceCode"/>
+      </w:pPr>
+      <w:r>
+        <w:t xml:space="preserve">            with patch.object(app,'WORK',work):</w:t>
+      </w:r>
+    </w:p>
+    <w:p>
+      <w:pPr>
+        <w:pStyle w:val="SourceCode"/>
+      </w:pPr>
+      <w:r>
+        <w:t xml:space="preserve">                self.assertEqual(app.list_jobs()[0]['deletion_result']['message'],'删除失败：登录失效')</w:t>
+      </w:r>
+    </w:p>
+    <w:p>
+      <w:pPr>
+        <w:pStyle w:val="SourceCode"/>
+      </w:pPr>
+      <w:r/>
+    </w:p>
+    <w:p>
+      <w:pPr>
+        <w:pStyle w:val="SourceCode"/>
+      </w:pPr>
+      <w:r>
         <w:t xml:space="preserve">    def test_successful_delete_removes_task_from_list(self):</w:t>
       </w:r>
     </w:p>
@@ -15004,6 +15154,116 @@
         <w:pStyle w:val="SourceCode"/>
       </w:pPr>
       <w:r>
+        <w:t xml:space="preserve">    def test_recent_records_counter_does_not_block_deletion(self):</w:t>
+      </w:r>
+    </w:p>
+    <w:p>
+      <w:pPr>
+        <w:pStyle w:val="SourceCode"/>
+      </w:pPr>
+      <w:r>
+        <w:t xml:space="preserve">        from unittest.mock import MagicMock,patch</w:t>
+      </w:r>
+    </w:p>
+    <w:p>
+      <w:pPr>
+        <w:pStyle w:val="SourceCode"/>
+      </w:pPr>
+      <w:r>
+        <w:t xml:space="preserve">        import qianwen_browser as browser</w:t>
+      </w:r>
+    </w:p>
+    <w:p>
+      <w:pPr>
+        <w:pStyle w:val="SourceCode"/>
+      </w:pPr>
+      <w:r>
+        <w:t xml:space="preserve">        page=UploadConfirmationTests().page();meta={'title':'测试','qianwen_submitted':True}</w:t>
+      </w:r>
+    </w:p>
+    <w:p>
+      <w:pPr>
+        <w:pStyle w:val="SourceCode"/>
+      </w:pPr>
+      <w:r>
+        <w:t xml:space="preserve">        # The actual header is “最近记录 + 4”; exact matching must not be used.</w:t>
+      </w:r>
+    </w:p>
+    <w:p>
+      <w:pPr>
+        <w:pStyle w:val="SourceCode"/>
+      </w:pPr>
+      <w:r>
+        <w:t xml:space="preserve">        def text_locator(text,exact=False):</w:t>
+      </w:r>
+    </w:p>
+    <w:p>
+      <w:pPr>
+        <w:pStyle w:val="SourceCode"/>
+      </w:pPr>
+      <w:r>
+        <w:t xml:space="preserve">            if text=='最近记录' and exact:raise AssertionError('header includes counter')</w:t>
+      </w:r>
+    </w:p>
+    <w:p>
+      <w:pPr>
+        <w:pStyle w:val="SourceCode"/>
+      </w:pPr>
+      <w:r>
+        <w:t xml:space="preserve">            return MagicMock()</w:t>
+      </w:r>
+    </w:p>
+    <w:p>
+      <w:pPr>
+        <w:pStyle w:val="SourceCode"/>
+      </w:pPr>
+      <w:r>
+        <w:t xml:space="preserve">        page.get_by_text.side_effect=text_locator</w:t>
+      </w:r>
+    </w:p>
+    <w:p>
+      <w:pPr>
+        <w:pStyle w:val="SourceCode"/>
+      </w:pPr>
+      <w:r>
+        <w:t xml:space="preserve">        with patch('playwright.sync_api.expect'):</w:t>
+      </w:r>
+    </w:p>
+    <w:p>
+      <w:pPr>
+        <w:pStyle w:val="SourceCode"/>
+      </w:pPr>
+      <w:r>
+        <w:t xml:space="preserve">            browser.delete_cloud_record(page,Path('/tmp/123456abcdef'),meta,lambda *args:None)</w:t>
+      </w:r>
+    </w:p>
+    <w:p>
+      <w:pPr>
+        <w:pStyle w:val="SourceCode"/>
+      </w:pPr>
+      <w:r>
+        <w:t xml:space="preserve">        self.assertTrue(meta['qianwen_cloud_deleted'])</w:t>
+      </w:r>
+    </w:p>
+    <w:p>
+      <w:pPr>
+        <w:pStyle w:val="SourceCode"/>
+      </w:pPr>
+      <w:r>
+        <w:t xml:space="preserve">        page.get_by_text.assert_any_call('最近记录',exact=False)</w:t>
+      </w:r>
+    </w:p>
+    <w:p>
+      <w:pPr>
+        <w:pStyle w:val="SourceCode"/>
+      </w:pPr>
+      <w:r/>
+    </w:p>
+    <w:p>
+      <w:pPr>
+        <w:pStyle w:val="SourceCode"/>
+      </w:pPr>
+      <w:r>
         <w:t xml:space="preserve">    def test_ambiguous_record_never_clicks_delete(self):</w:t>
       </w:r>
     </w:p>
@@ -17512,7 +17772,7 @@
         <w:pStyle w:val="SourceCode"/>
       </w:pPr>
       <w:r>
-        <w:t xml:space="preserve">  "qianwen_browser.py": "bdd2035a54f5b0a2f55ad7141b827237e2a094a446b089d122249e5d547dba2b",</w:t>
+        <w:t xml:space="preserve">  "qianwen_browser.py": "db8f342fd33c568d400c3a8d17e4ffc70a947cb9d786a075a585232f0bcc646c",</w:t>
       </w:r>
     </w:p>
     <w:p>
@@ -17536,7 +17796,7 @@
         <w:pStyle w:val="SourceCode"/>
       </w:pPr>
       <w:r>
-        <w:t xml:space="preserve">  "index.html": "5acde03cff253aec5a2f83cdea4c003233958913e2cded85227187eb2f5e3a40",</w:t>
+        <w:t xml:space="preserve">  "index.html": "699d5cd37cad548f6fdfcc465ba99e36079a2878a94f77962815e923977e4187",</w:t>
       </w:r>
     </w:p>
     <w:p>
@@ -17640,7 +17900,7 @@
         <w:pStyle w:val="SourceCode"/>
       </w:pPr>
       <w:r>
-        <w:t xml:space="preserve">  "app.py": "8d3a65acfbc113e04f0ba3a08fbb01d1ee9cd1fea25916161d7b0c6d536e7245",</w:t>
+        <w:t xml:space="preserve">  "app.py": "729aaa04f83a8c1a5656d57a2a179d8d8bd9a287088fa027ad93c9e0e1a5e98b",</w:t>
       </w:r>
     </w:p>
     <w:p>
@@ -17672,7 +17932,7 @@
         <w:pStyle w:val="SourceCode"/>
       </w:pPr>
       <w:r>
-        <w:t xml:space="preserve">  "test_qianwen.py": "7638fbb3e2cf702a7291cb253e3842798e60752e9f57949bdc5533f489878bcc",</w:t>
+        <w:t xml:space="preserve">  "test_qianwen.py": "8db8864671dcbd9e5ca59b79d4e5d2880387be8837cf5a771f3b6d8616a9bb6e",</w:t>
       </w:r>
     </w:p>
     <w:p>
@@ -17696,7 +17956,7 @@
         <w:pStyle w:val="SourceCode"/>
       </w:pPr>
       <w:r>
-        <w:t xml:space="preserve">  "test_app.py": "d339344df009571d13c51836941d74ce19ba5b307e8d7f57c349d4e412a72818"</w:t>
+        <w:t xml:space="preserve">  "test_app.py": "3f6f01881f8b4f680700c7bc54544be7b814ba5e0e12877fb001b9d470a90517"</w:t>
       </w:r>
     </w:p>
     <w:p>

</xml_diff>

<commit_message>
Report three deletion outcomes, allow missing cloud records, clear success notice after three seconds
</commit_message>
<xml_diff>
--- a/安装与使用指南.docx
+++ b/安装与使用指南.docx
@@ -84,7 +84,7 @@
     </w:p>
     <w:p>
       <w:r>
-        <w:t>已完成任务的“删除任务并同步到千问”与“查看 Word 文稿”“打开文档所在位置”同排，不再提供重复下载按钮。每条任务的“删除任务并同步到千问”会停止该任务，将相关本机文件、已完成和未完成 Word、任务记录移入废纸篓；点击“删除任务并同步到千问”会删除对应千问记录，云端删除后无法恢复。页面以绿色提示删除成功，红色提示删除失败；失败原因保留在任务卡片并随刷新显示。成功删除后任务卡片立即从工具列表消失，旧的刷新结果不会把卡片重新显示。云端删除失败则保留本机任务和文稿，提示原因后可重试；未上传的任务只清理本机。仅删除含本工具任务编号且唯一匹配的记录，旧记录未找到时保留文件供检查。模型和登录信息不会上传 GitHub。</w:t>
+        <w:t>已完成任务的“删除任务并同步到千问”与“查看 Word 文稿”“打开文档所在位置”同排，不再提供重复下载按钮。每条任务的“删除任务并同步到千问”会停止该任务，将相关本机文件、已完成和未完成 Word、任务记录移入废纸篓；点击“删除任务并同步到千问”会删除对应千问记录，云端删除后无法恢复。删除结果逐项列出工具任务记录、本机文稿及任务文件、对应千问记录。绿色成功提示在卡片消失后显示3秒自动清空；红色失败提示保留；失败原因保留在任务卡片并随刷新显示。成功删除后任务卡片立即从工具列表消失，旧的刷新结果不会把卡片重新显示。云端删除失败则保留本机任务和文稿，提示原因后可重试；未上传的任务只清理本机。仅删除含本工具任务编号且唯一匹配的记录，千问未找到对应记录时仍清理本机，整体按成功处理，并明确注明未找到、未执行云端删除；多个匹配记录或页面/登录异常仍视为失败。模型和登录信息不会上传 GitHub。</w:t>
       </w:r>
     </w:p>
     <w:p>
@@ -337,7 +337,7 @@
     </w:p>
     <w:p>
       <w:r>
-        <w:t>本次 45 项测试通过，其中云端识别返回结果在单元测试中模拟；旧本地推理断点测试已移除。此前本机20秒音频的千问后台完整流程约46秒，不能推断长视频速度或识别准确率。未在另一台全新 Mac 完成安装实测。</w:t>
+        <w:t>本次 48 项测试通过，其中云端识别返回结果在单元测试中模拟；旧本地推理断点测试已移除。此前本机20秒音频的千问后台完整流程约46秒，不能推断长视频速度或识别准确率。未在另一台全新 Mac 完成安装实测。</w:t>
       </w:r>
     </w:p>
     <w:p>
@@ -1724,6 +1724,106 @@
         <w:pStyle w:val="SourceCode"/>
       </w:pPr>
       <w:r>
+        <w:t>def deletion_report(success, cloud_status, error=''):</w:t>
+      </w:r>
+    </w:p>
+    <w:p>
+      <w:pPr>
+        <w:pStyle w:val="SourceCode"/>
+      </w:pPr>
+      <w:r>
+        <w:t xml:space="preserve">    cloud={'deleted':'删除成功','not_uploaded':'无需删除：此任务未上传到千问',</w:t>
+      </w:r>
+    </w:p>
+    <w:p>
+      <w:pPr>
+        <w:pStyle w:val="SourceCode"/>
+      </w:pPr>
+      <w:r>
+        <w:t xml:space="preserve">           'not_found':'未找到对应千问记录，未执行云端删除；本机清理按成功处理'}</w:t>
+      </w:r>
+    </w:p>
+    <w:p>
+      <w:pPr>
+        <w:pStyle w:val="SourceCode"/>
+      </w:pPr>
+      <w:r>
+        <w:t xml:space="preserve">    local='删除成功' if success else '未删除成功，任务已保留'</w:t>
+      </w:r>
+    </w:p>
+    <w:p>
+      <w:pPr>
+        <w:pStyle w:val="SourceCode"/>
+      </w:pPr>
+      <w:r>
+        <w:t xml:space="preserve">    files='删除成功（已移入废纸篓）' if success else ('未全部删除成功，请检查并重试' if cloud_status in cloud else '未执行删除，文件已保留')</w:t>
+      </w:r>
+    </w:p>
+    <w:p>
+      <w:pPr>
+        <w:pStyle w:val="SourceCode"/>
+      </w:pPr>
+      <w:r>
+        <w:t xml:space="preserve">    elements=[{'label':'工具任务列表记录','detail':local},</w:t>
+      </w:r>
+    </w:p>
+    <w:p>
+      <w:pPr>
+        <w:pStyle w:val="SourceCode"/>
+      </w:pPr>
+      <w:r>
+        <w:t xml:space="preserve">              {'label':'本机文稿及任务文件','detail':files},</w:t>
+      </w:r>
+    </w:p>
+    <w:p>
+      <w:pPr>
+        <w:pStyle w:val="SourceCode"/>
+      </w:pPr>
+      <w:r>
+        <w:t xml:space="preserve">              {'label':'对应的千问记录','detail':cloud.get(cloud_status,'删除失败：'+error)}]</w:t>
+      </w:r>
+    </w:p>
+    <w:p>
+      <w:pPr>
+        <w:pStyle w:val="SourceCode"/>
+      </w:pPr>
+      <w:r>
+        <w:t xml:space="preserve">    message=('删除成功' if success else '删除失败')+'\n'+'\n'.join(e['label']+'：'+e['detail'] for e in elements)</w:t>
+      </w:r>
+    </w:p>
+    <w:p>
+      <w:pPr>
+        <w:pStyle w:val="SourceCode"/>
+      </w:pPr>
+      <w:r>
+        <w:t xml:space="preserve">    if not success and cloud_status in cloud:message+='\n失败原因：'+error</w:t>
+      </w:r>
+    </w:p>
+    <w:p>
+      <w:pPr>
+        <w:pStyle w:val="SourceCode"/>
+      </w:pPr>
+      <w:r>
+        <w:t xml:space="preserve">    return {'status':'success' if success else 'failed','message':message,'elements':elements,'at':time.time()}</w:t>
+      </w:r>
+    </w:p>
+    <w:p>
+      <w:pPr>
+        <w:pStyle w:val="SourceCode"/>
+      </w:pPr>
+      <w:r/>
+    </w:p>
+    <w:p>
+      <w:pPr>
+        <w:pStyle w:val="SourceCode"/>
+      </w:pPr>
+      <w:r/>
+    </w:p>
+    <w:p>
+      <w:pPr>
+        <w:pStyle w:val="SourceCode"/>
+      </w:pPr>
+      <w:r>
         <w:t>def delete_task(ident):</w:t>
       </w:r>
     </w:p>
@@ -1964,6 +2064,22 @@
         <w:pStyle w:val="SourceCode"/>
       </w:pPr>
       <w:r>
+        <w:t xml:space="preserve">        cloud_meta=json.loads((folder/'job.json').read_text())</w:t>
+      </w:r>
+    </w:p>
+    <w:p>
+      <w:pPr>
+        <w:pStyle w:val="SourceCode"/>
+      </w:pPr>
+      <w:r>
+        <w:t xml:space="preserve">        cloud_status=cloud_meta.get('qianwen_delete_result','deleted' if cloud_meta.get('qianwen_cloud_deleted') else 'failed')</w:t>
+      </w:r>
+    </w:p>
+    <w:p>
+      <w:pPr>
+        <w:pStyle w:val="SourceCode"/>
+      </w:pPr>
+      <w:r>
         <w:t xml:space="preserve">        result=trash_task(ROOT,WORK,[OUTPUT,LEGACY_OUTPUT,ROOT/'outputs',OUTPUT.parent/'网页视频转语音文稿'],ident)</w:t>
       </w:r>
     </w:p>
@@ -1980,7 +2096,15 @@
         <w:pStyle w:val="SourceCode"/>
       </w:pPr>
       <w:r>
-        <w:t xml:space="preserve">        result['message']='任务与本机相关文件已移入废纸篓，对应千问记录已删除（未上传的任务无需云端删除）。'</w:t>
+        <w:t xml:space="preserve">        result['deletion_result']=deletion_report(True,cloud_status)</w:t>
+      </w:r>
+    </w:p>
+    <w:p>
+      <w:pPr>
+        <w:pStyle w:val="SourceCode"/>
+      </w:pPr>
+      <w:r>
+        <w:t xml:space="preserve">        result['message']=result['deletion_result']['message']</w:t>
       </w:r>
     </w:p>
     <w:p>
@@ -3272,23 +3396,39 @@
         <w:pStyle w:val="SourceCode"/>
       </w:pPr>
       <w:r>
-        <w:t xml:space="preserve">                    if folder.exists():save_json(folder/'delete-result.json',{'status':'failed','message':'删除失败：'+str(error),'at':time.time()})</w:t>
-      </w:r>
-    </w:p>
-    <w:p>
-      <w:pPr>
-        <w:pStyle w:val="SourceCode"/>
-      </w:pPr>
-      <w:r>
-        <w:t xml:space="preserve">                    raise</w:t>
-      </w:r>
-    </w:p>
-    <w:p>
-      <w:pPr>
-        <w:pStyle w:val="SourceCode"/>
-      </w:pPr>
-      <w:r>
-        <w:t xml:space="preserve">                result['message']='删除成功：任务列表记录、本机文稿及任务文件已清理，对应千问记录已删除（未上传的任务无需云端删除）。'</w:t>
+        <w:t xml:space="preserve">                    meta=json.loads((folder/'job.json').read_text()) if (folder/'job.json').exists() else {}</w:t>
+      </w:r>
+    </w:p>
+    <w:p>
+      <w:pPr>
+        <w:pStyle w:val="SourceCode"/>
+      </w:pPr>
+      <w:r>
+        <w:t xml:space="preserve">                    cloud_status=meta.get('qianwen_delete_result','deleted' if meta.get('qianwen_cloud_deleted') else 'failed')</w:t>
+      </w:r>
+    </w:p>
+    <w:p>
+      <w:pPr>
+        <w:pStyle w:val="SourceCode"/>
+      </w:pPr>
+      <w:r>
+        <w:t xml:space="preserve">                    report=deletion_report(False,cloud_status,str(error))</w:t>
+      </w:r>
+    </w:p>
+    <w:p>
+      <w:pPr>
+        <w:pStyle w:val="SourceCode"/>
+      </w:pPr>
+      <w:r>
+        <w:t xml:space="preserve">                    if folder.exists():save_json(folder/'delete-result.json',report)</w:t>
+      </w:r>
+    </w:p>
+    <w:p>
+      <w:pPr>
+        <w:pStyle w:val="SourceCode"/>
+      </w:pPr>
+      <w:r>
+        <w:t xml:space="preserve">                    return self.reply(400,{'error':str(error),'deletion_result':report})</w:t>
       </w:r>
     </w:p>
     <w:p>
@@ -4430,7 +4570,7 @@
         <w:pStyle w:val="SourceCode"/>
       </w:pPr>
       <w:r>
-        <w:t>body{font:16px/1.7 -apple-system,BlinkMacSystemFont,sans-serif;color:#24322d;background:#f4f6f3;max-width:920px;margin:48px auto;padding:0 24px}h1{font-size:32px}h1 button{font-size:14px;padding:6px 10px;font-weight:normal;vertical-align:middle;white-space:nowrap}input,button,.action{font:inherit;padding:10px 14px;border:1px solid #c6d1ca;border-radius:8px}input[type=url]{flex:1;min-width:180px}button,.action{background:#245441;color:white;cursor:pointer;text-decoration:none;display:inline-block}form,.actions{display:flex;gap:12px;flex-wrap:wrap}article{background:white;padding:24px;border:1px solid #e0e7e1;border-radius:12px;margin:20px 0}small{color:#62736b}a{color:#245441}#message{color:#8b4520}#message.success{color:#176538;background:#eaf7ee;padding:12px;border-radius:8px}#message.failure{color:#a52222;background:#fff0f0;padding:12px;border-radius:8px}.delete-result{font-weight:bold;white-space:pre-wrap}.notice{background:#fff3cd;color:#9c0006;padding:14px 18px;border-left:4px solid #b07800;font-weight:bold}.secondary{background:white;color:#245441}</w:t>
+        <w:t>body{font:16px/1.7 -apple-system,BlinkMacSystemFont,sans-serif;color:#24322d;background:#f4f6f3;max-width:920px;margin:48px auto;padding:0 24px}h1{font-size:32px}h1 button{font-size:14px;padding:6px 10px;font-weight:normal;vertical-align:middle;white-space:nowrap}input,button,.action{font:inherit;padding:10px 14px;border:1px solid #c6d1ca;border-radius:8px}input[type=url]{flex:1;min-width:180px}button,.action{background:#245441;color:white;cursor:pointer;text-decoration:none;display:inline-block}form,.actions{display:flex;gap:12px;flex-wrap:wrap}article{background:white;padding:24px;border:1px solid #e0e7e1;border-radius:12px;margin:20px 0}small{color:#62736b}a{color:#245441}#message{color:#8b4520;white-space:pre-line}#message.success{color:#176538;background:#eaf7ee;padding:12px;border-radius:8px}#message.failure{color:#a52222;background:#fff0f0;padding:12px;border-radius:8px}.delete-result{font-weight:bold;white-space:pre-wrap}.notice{background:#fff3cd;color:#9c0006;padding:14px 18px;border-left:4px solid #b07800;font-weight:bold}.secondary{background:white;color:#245441}</w:t>
       </w:r>
     </w:p>
     <w:p>
@@ -4540,6 +4680,22 @@
         <w:pStyle w:val="SourceCode"/>
       </w:pPr>
       <w:r>
+        <w:t>let deleteNoticeTimer;</w:t>
+      </w:r>
+    </w:p>
+    <w:p>
+      <w:pPr>
+        <w:pStyle w:val="SourceCode"/>
+      </w:pPr>
+      <w:r>
+        <w:t>function showDeletionResult(message,success){clearTimeout(deleteNoticeTimer);msg.className=success?'success':'failure';msg.textContent=message;if(success){deleteNoticeTimer=setTimeout(()=&gt;{if(msg.className==='success'&amp;&amp;msg.textContent===message){msg.textContent='';msg.className=''}},3000)}}</w:t>
+      </w:r>
+    </w:p>
+    <w:p>
+      <w:pPr>
+        <w:pStyle w:val="SourceCode"/>
+      </w:pPr>
+      <w:r>
         <w:t>const deletedTaskIds=new Set();const deletionResults=new Map();let refreshSequence=0;</w:t>
       </w:r>
     </w:p>
@@ -4572,7 +4728,7 @@
         <w:pStyle w:val="SourceCode"/>
       </w:pPr>
       <w:r>
-        <w:t>async function post(url,data){let r=await fetch(url,{method:'POST',headers:{'Content-Type':'application/json'},body:JSON.stringify(data)});let j=await r.json();if(!r.ok)throw Error(j.error);return j}</w:t>
+        <w:t>async function post(url,data){let r=await fetch(url,{method:'POST',headers:{'Content-Type':'application/json'},body:JSON.stringify(data)});let j=await r.json();if(!r.ok){let error=Error(j.error);error.deletionResult=j.deletion_result;throw error}return j}</w:t>
       </w:r>
     </w:p>
     <w:p>
@@ -4660,7 +4816,7 @@
         <w:pStyle w:val="SourceCode"/>
       </w:pPr>
       <w:r>
-        <w:t>async function refresh(){const sequence=++refreshSequence;try{let jobs=await(await fetch('/jobs')).json();if(sequence!==refreshSequence)return;jobs=jobs.filter(j=&gt;!deletedTaskIds.has(j.id));jobs.sort((a,b)=&gt;(b.created_at??historicalTaskTimes[b.id]??b.added_at??Infinity)-(a.created_at??historicalTaskTimes[a.id]??a.added_at??Infinity));let host=document.querySelector('#jobs');host.replaceChildren();for(let j of jobs){let card=document.createElement('article');let h=document.createElement('h2');h.textContent=taskHeading(j);card.append(h);let p=document.createElement('p');p.textContent=(j.document&amp;&amp;!j.has_document)?'Word 文件已不在原保存位置，重新提交链接可生成':(stages[j.state]||'状态暂未识别：'+String(j.state));card.append(p);if(j.source_kind==='local'){let source=document.createElement('p');source.textContent=j.source_label;card.append(source)}else card.append(link('原网页',j.url));let deletion=deletionResults.get(j.id)||j.deletion_result;if(deletion){let status=document.createElement('p');status.className='delete-result';status.setAttribute('role','alert');status.style.color=deletion.status==='failed'?'#a52222':'#8b4520';status.textContent=deletion.message;card.append(status)}if(j.error){let err=document.createElement('p');err.textContent=j.error;card.append(err)}if(j.cleanup_error){let note=document.createElement('p');note.textContent='Word 已生成，但部分临时文件未清理：'+j.cleanup_error;card.append(note)}if(j.has_document){let actions=document.createElement('p');actions.className='actions';actions.append(link('查看 Word 文稿','/preview/'+j.id,'action'));let reveal=document.createElement('button');reveal.type='button';reveal.className='secondary';reveal.textContent='打开文档所在位置';let revealStatus=document.createElement('small');revealStatus.setAttribute('role','status');reveal.onclick=async()=&gt;{reveal.disabled=true;revealStatus.textContent='正在打开文件夹…';try{await post('/reveal/'+j.id,{});revealStatus.textContent='已打开 Finder 文件夹。';msg.textContent='已打开文档所在的 Finder 文件夹。'}catch(e){revealStatus.textContent='打开失败：'+e.message;msg.textContent='打开失败：'+e.message}finally{reveal.disabled=false}};actions.append(reveal);actions.append(revealStatus);card.append(actions);let note=document.createElement('small');note.textContent=j.temporary_files_removed?(j.media_trashed?'原音视频已移入废纸篓，临时音轨已清理。':'原音视频与临时音轨已清理。'):'Word 内容未经人工校对。';card.append(note)}let controls=document.createElement('p');controls.className='actions';if(j.state==='failed'||j.state==='login_required'){let retry=document.createElement('button');retry.textContent='重试任务';retry.onclick=async()=&gt;{try{await post('/jobs',{url:j.url,engine:'qianwen'});await refresh()}catch(e){msg.textContent=e.message}};controls.append(retry)}let remove=document.createElement('button');remove.type='button';remove.className='secondary';remove.style.color='#a52222';remove.textContent='删除任务并同步到千问';if(deletion?.status==='pending'){remove.disabled=true;remove.textContent='正在同步删除…'}remove.onclick=async()=&gt;{if(!confirm('删除“'+(j.title||j.id)+'”？将停止该任务，把本机任务文件和相关文稿移入废纸篓。同时删除对应的千问云端记录，云端删除后无法恢复。'))return;deletionResults.set(j.id,{status:'pending',message:'正在删除并同步到千问，请稍候…'});msg.className='';msg.textContent='正在删除并同步到千问，请稍候…';remove.disabled=true;remove.textContent='正在同步删除…';try{let health=await(await fetch('/health')).json();if(!health.cloud_delete)throw Error('请先双击加载本次更新.command启用千问同步删除');await requireControls();let r=await post('/delete/'+j.id,{});deletedTaskIds.add(j.id);++refreshSequence;card.remove();deletionResults.delete(j.id);msg.className='success';msg.textContent=r.message.startsWith('删除成功')?r.message:'删除成功：'+r.message;await refresh()}catch(e){let message='删除失败：'+e.message;deletionResults.set(j.id,{status:'failed',message});msg.className='failure';msg.textContent=message;let status=card.querySelector('.delete-result');if(!status){status=document.createElement('p');status.className='delete-result';status.setAttribute('role','alert');card.append(status)}status.style.color='#a52222';status.textContent=message;remove.disabled=false;remove.textContent='删除任务并同步到千问'}};if(j.has_document){card.querySelector('.actions').append(remove)}else{controls.append(remove)}if(controls.children.length)card.append(controls);host.append(card)}await refreshLogin()}catch(e){msg.textContent='后台连接中断，请重新启动工具。'}}</w:t>
+        <w:t>async function refresh(){const sequence=++refreshSequence;try{let jobs=await(await fetch('/jobs')).json();if(sequence!==refreshSequence)return;jobs=jobs.filter(j=&gt;!deletedTaskIds.has(j.id));jobs.sort((a,b)=&gt;(b.created_at??historicalTaskTimes[b.id]??b.added_at??Infinity)-(a.created_at??historicalTaskTimes[a.id]??a.added_at??Infinity));let host=document.querySelector('#jobs');host.replaceChildren();for(let j of jobs){let card=document.createElement('article');card.dataset.taskId=j.id;let h=document.createElement('h2');h.textContent=taskHeading(j);card.append(h);let p=document.createElement('p');p.textContent=(j.document&amp;&amp;!j.has_document)?'Word 文件已不在原保存位置，重新提交链接可生成':(stages[j.state]||'状态暂未识别：'+String(j.state));card.append(p);if(j.source_kind==='local'){let source=document.createElement('p');source.textContent=j.source_label;card.append(source)}else card.append(link('原网页',j.url));let deletion=deletionResults.get(j.id)||j.deletion_result;if(deletion){let status=document.createElement('p');status.className='delete-result';status.setAttribute('role','alert');status.style.color=deletion.status==='failed'?'#a52222':'#8b4520';status.textContent=deletion.message;card.append(status)}if(j.error){let err=document.createElement('p');err.textContent=j.error;card.append(err)}if(j.cleanup_error){let note=document.createElement('p');note.textContent='Word 已生成，但部分临时文件未清理：'+j.cleanup_error;card.append(note)}if(j.has_document){let actions=document.createElement('p');actions.className='actions';actions.append(link('查看 Word 文稿','/preview/'+j.id,'action'));let reveal=document.createElement('button');reveal.type='button';reveal.className='secondary';reveal.textContent='打开文档所在位置';let revealStatus=document.createElement('small');revealStatus.setAttribute('role','status');reveal.onclick=async()=&gt;{reveal.disabled=true;revealStatus.textContent='正在打开文件夹…';try{await post('/reveal/'+j.id,{});revealStatus.textContent='已打开 Finder 文件夹。';msg.textContent='已打开文档所在的 Finder 文件夹。'}catch(e){revealStatus.textContent='打开失败：'+e.message;msg.textContent='打开失败：'+e.message}finally{reveal.disabled=false}};actions.append(reveal);actions.append(revealStatus);card.append(actions);let note=document.createElement('small');note.textContent=j.temporary_files_removed?(j.media_trashed?'原音视频已移入废纸篓，临时音轨已清理。':'原音视频与临时音轨已清理。'):'Word 内容未经人工校对。';card.append(note)}let controls=document.createElement('p');controls.className='actions';if(j.state==='failed'||j.state==='login_required'){let retry=document.createElement('button');retry.textContent='重试任务';retry.onclick=async()=&gt;{try{await post('/jobs',{url:j.url,engine:'qianwen'});await refresh()}catch(e){msg.textContent=e.message}};controls.append(retry)}let remove=document.createElement('button');remove.type='button';remove.className='secondary';remove.style.color='#a52222';remove.textContent='删除任务并同步到千问';if(deletion?.status==='pending'){remove.disabled=true;remove.textContent='正在同步删除…'}remove.onclick=async()=&gt;{if(!confirm('删除“'+(j.title||j.id)+'”？将停止该任务，把本机任务文件和相关文稿移入废纸篓。同时删除对应的千问云端记录，云端删除后无法恢复。'))return;deletionResults.set(j.id,{status:'pending',message:'正在删除并同步到千问，请稍候…'});msg.className='';msg.textContent='正在删除并同步到千问，请稍候…';remove.disabled=true;remove.textContent='正在同步删除…';try{let health=await(await fetch('/health')).json();if(!health.cloud_delete)throw Error('请先双击加载本次更新.command启用千问同步删除');await requireControls();let r=await post('/delete/'+j.id,{});deletedTaskIds.add(j.id);++refreshSequence;document.querySelectorAll('article[data-task-id="'+j.id+'"]').forEach(node=&gt;node.remove());deletionResults.delete(j.id);showDeletionResult(r.deletion_result?.message||r.message,true);await refresh()}catch(e){let message=e.deletionResult?.message||('删除失败\n工具任务列表记录：未删除成功\n本机文稿及任务文件：未确认删除成功\n对应的千问记录：未确认删除成功\n原因：'+e.message);deletionResults.set(j.id,{status:'failed',message});showDeletionResult(message,false);let status=card.querySelector('.delete-result');if(!status){status=document.createElement('p');status.className='delete-result';status.setAttribute('role','alert');card.append(status)}status.style.color='#a52222';status.textContent=message;remove.disabled=false;remove.textContent='删除任务并同步到千问'}};if(j.has_document){card.querySelector('.actions').append(remove)}else{controls.append(remove)}if(controls.children.length)card.append(controls);host.append(card)}await refreshLogin()}catch(e){msg.textContent='后台连接中断，请重新启动工具。'}}</w:t>
       </w:r>
     </w:p>
     <w:p>
@@ -7870,7 +8026,7 @@
         <w:pStyle w:val="SourceCode"/>
       </w:pPr>
       <w:r>
-        <w:t xml:space="preserve">    if meta.get('qianwen_cloud_deleted'):return</w:t>
+        <w:t xml:space="preserve">    if meta.get('qianwen_cloud_deleted') or meta.get('qianwen_delete_resolved'):return</w:t>
       </w:r>
     </w:p>
     <w:p>
@@ -7886,7 +8042,7 @@
         <w:pStyle w:val="SourceCode"/>
       </w:pPr>
       <w:r>
-        <w:t xml:space="preserve">        meta['qianwen_cloud_deleted']=True;save(job/'job.json',meta);return</w:t>
+        <w:t xml:space="preserve">        meta.update(qianwen_delete_resolved=True,qianwen_delete_result='not_uploaded');save(job/'job.json',meta);return</w:t>
       </w:r>
     </w:p>
     <w:p>
@@ -7942,7 +8098,63 @@
         <w:pStyle w:val="SourceCode"/>
       </w:pPr>
       <w:r>
-        <w:t xml:space="preserve">    except AssertionError as error:raise RuntimeError('未能唯一定位对应千问记录，未删除本机文件。记录可能已被手动删除或不在最近记录中，请检查千问页面。') from error</w:t>
+        <w:t xml:space="preserve">    except AssertionError as error:</w:t>
+      </w:r>
+    </w:p>
+    <w:p>
+      <w:pPr>
+        <w:pStyle w:val="SourceCode"/>
+      </w:pPr>
+      <w:r>
+        <w:t xml:space="preserve">        require_login_if_visible(page)</w:t>
+      </w:r>
+    </w:p>
+    <w:p>
+      <w:pPr>
+        <w:pStyle w:val="SourceCode"/>
+      </w:pPr>
+      <w:r>
+        <w:t xml:space="preserve">        require_cloud_available(page)</w:t>
+      </w:r>
+    </w:p>
+    <w:p>
+      <w:pPr>
+        <w:pStyle w:val="SourceCode"/>
+      </w:pPr>
+      <w:r>
+        <w:t xml:space="preserve">        if rows.count()==0:</w:t>
+      </w:r>
+    </w:p>
+    <w:p>
+      <w:pPr>
+        <w:pStyle w:val="SourceCode"/>
+      </w:pPr>
+      <w:r>
+        <w:t xml:space="preserve">            meta.update(qianwen_delete_resolved=True,qianwen_delete_result='not_found')</w:t>
+      </w:r>
+    </w:p>
+    <w:p>
+      <w:pPr>
+        <w:pStyle w:val="SourceCode"/>
+      </w:pPr>
+      <w:r>
+        <w:t xml:space="preserve">            save(job/'job.json',meta)</w:t>
+      </w:r>
+    </w:p>
+    <w:p>
+      <w:pPr>
+        <w:pStyle w:val="SourceCode"/>
+      </w:pPr>
+      <w:r>
+        <w:t xml:space="preserve">            return</w:t>
+      </w:r>
+    </w:p>
+    <w:p>
+      <w:pPr>
+        <w:pStyle w:val="SourceCode"/>
+      </w:pPr>
+      <w:r>
+        <w:t xml:space="preserve">        raise RuntimeError('存在多个匹配的千问记录，无法唯一定位，未执行云端删除') from error</w:t>
       </w:r>
     </w:p>
     <w:p>
@@ -8006,7 +8218,7 @@
         <w:pStyle w:val="SourceCode"/>
       </w:pPr>
       <w:r>
-        <w:t xml:space="preserve">    meta['qianwen_cloud_deleted']=True;save(job/'job.json',meta)</w:t>
+        <w:t xml:space="preserve">    meta.update(qianwen_cloud_deleted=True,qianwen_delete_resolved=True,qianwen_delete_result='deleted');save(job/'job.json',meta)</w:t>
       </w:r>
     </w:p>
     <w:p>
@@ -8066,7 +8278,7 @@
         <w:pStyle w:val="SourceCode"/>
       </w:pPr>
       <w:r>
-        <w:t xml:space="preserve">    if meta.get('qianwen_cloud_deleted'):return</w:t>
+        <w:t xml:space="preserve">    if meta.get('qianwen_cloud_deleted') or meta.get('qianwen_delete_resolved'):return</w:t>
       </w:r>
     </w:p>
     <w:p>
@@ -8082,7 +8294,7 @@
         <w:pStyle w:val="SourceCode"/>
       </w:pPr>
       <w:r>
-        <w:t xml:space="preserve">        meta['qianwen_cloud_deleted']=True;save_json(job/'job.json',meta);return</w:t>
+        <w:t xml:space="preserve">        meta.update(qianwen_delete_resolved=True,qianwen_delete_result='not_uploaded');save_json(job/'job.json',meta);return</w:t>
       </w:r>
     </w:p>
     <w:p>
@@ -13718,6 +13930,106 @@
         <w:pStyle w:val="SourceCode"/>
       </w:pPr>
       <w:r>
+        <w:t xml:space="preserve">    def test_missing_cloud_record_success_reports_all_three_elements(self):</w:t>
+      </w:r>
+    </w:p>
+    <w:p>
+      <w:pPr>
+        <w:pStyle w:val="SourceCode"/>
+      </w:pPr>
+      <w:r>
+        <w:t xml:space="preserve">        report=app.deletion_report(True,'not_found')</w:t>
+      </w:r>
+    </w:p>
+    <w:p>
+      <w:pPr>
+        <w:pStyle w:val="SourceCode"/>
+      </w:pPr>
+      <w:r>
+        <w:t xml:space="preserve">        self.assertEqual(report['status'],'success')</w:t>
+      </w:r>
+    </w:p>
+    <w:p>
+      <w:pPr>
+        <w:pStyle w:val="SourceCode"/>
+      </w:pPr>
+      <w:r>
+        <w:t xml:space="preserve">        self.assertEqual(len(report['elements']),3)</w:t>
+      </w:r>
+    </w:p>
+    <w:p>
+      <w:pPr>
+        <w:pStyle w:val="SourceCode"/>
+      </w:pPr>
+      <w:r>
+        <w:t xml:space="preserve">        self.assertIn('未找到对应千问记录',report['elements'][2]['detail'])</w:t>
+      </w:r>
+    </w:p>
+    <w:p>
+      <w:pPr>
+        <w:pStyle w:val="SourceCode"/>
+      </w:pPr>
+      <w:r>
+        <w:t xml:space="preserve">        self.assertIn('删除成功',report['elements'][0]['detail'])</w:t>
+      </w:r>
+    </w:p>
+    <w:p>
+      <w:pPr>
+        <w:pStyle w:val="SourceCode"/>
+      </w:pPr>
+      <w:r/>
+    </w:p>
+    <w:p>
+      <w:pPr>
+        <w:pStyle w:val="SourceCode"/>
+      </w:pPr>
+      <w:r>
+        <w:t xml:space="preserve">    def test_partial_failure_keeps_cloud_success_in_report(self):</w:t>
+      </w:r>
+    </w:p>
+    <w:p>
+      <w:pPr>
+        <w:pStyle w:val="SourceCode"/>
+      </w:pPr>
+      <w:r>
+        <w:t xml:space="preserve">        report=app.deletion_report(False,'deleted','文件被占用')</w:t>
+      </w:r>
+    </w:p>
+    <w:p>
+      <w:pPr>
+        <w:pStyle w:val="SourceCode"/>
+      </w:pPr>
+      <w:r>
+        <w:t xml:space="preserve">        self.assertEqual(report['elements'][2]['detail'],'删除成功')</w:t>
+      </w:r>
+    </w:p>
+    <w:p>
+      <w:pPr>
+        <w:pStyle w:val="SourceCode"/>
+      </w:pPr>
+      <w:r>
+        <w:t xml:space="preserve">        self.assertIn('未全部删除成功',report['elements'][1]['detail'])</w:t>
+      </w:r>
+    </w:p>
+    <w:p>
+      <w:pPr>
+        <w:pStyle w:val="SourceCode"/>
+      </w:pPr>
+      <w:r>
+        <w:t xml:space="preserve">        self.assertIn('文件被占用',report['message'])</w:t>
+      </w:r>
+    </w:p>
+    <w:p>
+      <w:pPr>
+        <w:pStyle w:val="SourceCode"/>
+      </w:pPr>
+      <w:r/>
+    </w:p>
+    <w:p>
+      <w:pPr>
+        <w:pStyle w:val="SourceCode"/>
+      </w:pPr>
+      <w:r>
         <w:t xml:space="preserve">    def test_failed_deletion_result_survives_task_list_refresh(self):</w:t>
       </w:r>
     </w:p>
@@ -15264,6 +15576,108 @@
         <w:pStyle w:val="SourceCode"/>
       </w:pPr>
       <w:r>
+        <w:t xml:space="preserve">    def test_missing_cloud_record_allows_local_cleanup_without_claiming_deleted(self):</w:t>
+      </w:r>
+    </w:p>
+    <w:p>
+      <w:pPr>
+        <w:pStyle w:val="SourceCode"/>
+      </w:pPr>
+      <w:r>
+        <w:t xml:space="preserve">        from unittest.mock import patch</w:t>
+      </w:r>
+    </w:p>
+    <w:p>
+      <w:pPr>
+        <w:pStyle w:val="SourceCode"/>
+      </w:pPr>
+      <w:r>
+        <w:t xml:space="preserve">        import qianwen_browser as browser</w:t>
+      </w:r>
+    </w:p>
+    <w:p>
+      <w:pPr>
+        <w:pStyle w:val="SourceCode"/>
+      </w:pPr>
+      <w:r>
+        <w:t xml:space="preserve">        page=UploadConfirmationTests().page();meta={'title':'测试','qianwen_submitted':True}</w:t>
+      </w:r>
+    </w:p>
+    <w:p>
+      <w:pPr>
+        <w:pStyle w:val="SourceCode"/>
+      </w:pPr>
+      <w:r>
+        <w:t xml:space="preserve">        page.locator.return_value.filter.return_value.count.return_value=0</w:t>
+      </w:r>
+    </w:p>
+    <w:p>
+      <w:pPr>
+        <w:pStyle w:val="SourceCode"/>
+      </w:pPr>
+      <w:r>
+        <w:t xml:space="preserve">        with patch('playwright.sync_api.expect') as expect:</w:t>
+      </w:r>
+    </w:p>
+    <w:p>
+      <w:pPr>
+        <w:pStyle w:val="SourceCode"/>
+      </w:pPr>
+      <w:r>
+        <w:t xml:space="preserve">            expect.return_value.to_have_count.side_effect=AssertionError('record absent')</w:t>
+      </w:r>
+    </w:p>
+    <w:p>
+      <w:pPr>
+        <w:pStyle w:val="SourceCode"/>
+      </w:pPr>
+      <w:r>
+        <w:t xml:space="preserve">            browser.delete_cloud_record(page,Path('/tmp/123456abcdef'),meta,lambda *args:None)</w:t>
+      </w:r>
+    </w:p>
+    <w:p>
+      <w:pPr>
+        <w:pStyle w:val="SourceCode"/>
+      </w:pPr>
+      <w:r>
+        <w:t xml:space="preserve">        self.assertEqual(meta['qianwen_delete_result'],'not_found')</w:t>
+      </w:r>
+    </w:p>
+    <w:p>
+      <w:pPr>
+        <w:pStyle w:val="SourceCode"/>
+      </w:pPr>
+      <w:r>
+        <w:t xml:space="preserve">        self.assertTrue(meta['qianwen_delete_resolved'])</w:t>
+      </w:r>
+    </w:p>
+    <w:p>
+      <w:pPr>
+        <w:pStyle w:val="SourceCode"/>
+      </w:pPr>
+      <w:r>
+        <w:t xml:space="preserve">        self.assertFalse(meta.get('qianwen_cloud_deleted',False))</w:t>
+      </w:r>
+    </w:p>
+    <w:p>
+      <w:pPr>
+        <w:pStyle w:val="SourceCode"/>
+      </w:pPr>
+      <w:r>
+        <w:t xml:space="preserve">        page.locator.return_value.filter.return_value.locator.assert_not_called()</w:t>
+      </w:r>
+    </w:p>
+    <w:p>
+      <w:pPr>
+        <w:pStyle w:val="SourceCode"/>
+      </w:pPr>
+      <w:r/>
+    </w:p>
+    <w:p>
+      <w:pPr>
+        <w:pStyle w:val="SourceCode"/>
+      </w:pPr>
+      <w:r>
         <w:t xml:space="preserve">    def test_ambiguous_record_never_clicks_delete(self):</w:t>
       </w:r>
     </w:p>
@@ -17772,7 +18186,7 @@
         <w:pStyle w:val="SourceCode"/>
       </w:pPr>
       <w:r>
-        <w:t xml:space="preserve">  "qianwen_browser.py": "db8f342fd33c568d400c3a8d17e4ffc70a947cb9d786a075a585232f0bcc646c",</w:t>
+        <w:t xml:space="preserve">  "qianwen_browser.py": "4042b5e64acb95f87c8be2de002b46d52bc172a5b833877e23d397e06fd296f7",</w:t>
       </w:r>
     </w:p>
     <w:p>
@@ -17796,7 +18210,7 @@
         <w:pStyle w:val="SourceCode"/>
       </w:pPr>
       <w:r>
-        <w:t xml:space="preserve">  "index.html": "699d5cd37cad548f6fdfcc465ba99e36079a2878a94f77962815e923977e4187",</w:t>
+        <w:t xml:space="preserve">  "index.html": "f5bf6afe5e6be87dbdc8816c8cbb99cd3dd4e8a6cefa8bc9955caed5bf5a4162",</w:t>
       </w:r>
     </w:p>
     <w:p>
@@ -17900,7 +18314,7 @@
         <w:pStyle w:val="SourceCode"/>
       </w:pPr>
       <w:r>
-        <w:t xml:space="preserve">  "app.py": "729aaa04f83a8c1a5656d57a2a179d8d8bd9a287088fa027ad93c9e0e1a5e98b",</w:t>
+        <w:t xml:space="preserve">  "app.py": "5153e75763d03906b9dd31bdbd90d90f4317174ecb54b943aaec8599d976cc83",</w:t>
       </w:r>
     </w:p>
     <w:p>
@@ -17932,7 +18346,7 @@
         <w:pStyle w:val="SourceCode"/>
       </w:pPr>
       <w:r>
-        <w:t xml:space="preserve">  "test_qianwen.py": "8db8864671dcbd9e5ca59b79d4e5d2880387be8837cf5a771f3b6d8616a9bb6e",</w:t>
+        <w:t xml:space="preserve">  "test_qianwen.py": "47ba77b258ba4fb918fdc390419931c05fa9da14a7483cdad91f83e812ffdcda",</w:t>
       </w:r>
     </w:p>
     <w:p>
@@ -17956,7 +18370,7 @@
         <w:pStyle w:val="SourceCode"/>
       </w:pPr>
       <w:r>
-        <w:t xml:space="preserve">  "test_app.py": "3f6f01881f8b4f680700c7bc54544be7b814ba5e0e12877fb001b9d470a90517"</w:t>
+        <w:t xml:space="preserve">  "test_app.py": "e936dde26bfb7f51c322c9b9b4b0b736da892dffb0a8f3070e2dc72d21988307"</w:t>
       </w:r>
     </w:p>
     <w:p>

</xml_diff>

<commit_message>
Color each deletion outcome independently green or red
</commit_message>
<xml_diff>
--- a/安装与使用指南.docx
+++ b/安装与使用指南.docx
@@ -84,7 +84,7 @@
     </w:p>
     <w:p>
       <w:r>
-        <w:t>已完成任务的“删除任务并同步到千问”与“查看 Word 文稿”“打开文档所在位置”同排，不再提供重复下载按钮。每条任务的“删除任务并同步到千问”会停止该任务，将相关本机文件、已完成和未完成 Word、任务记录移入废纸篓；点击“删除任务并同步到千问”会删除对应千问记录，云端删除后无法恢复。删除结果逐项列出工具任务记录、本机文稿及任务文件、对应千问记录。绿色成功提示在卡片消失后显示3秒自动清空；红色失败提示保留；失败原因保留在任务卡片并随刷新显示。成功删除后任务卡片立即从工具列表消失，旧的刷新结果不会把卡片重新显示。云端删除失败则保留本机任务和文稿，提示原因后可重试；未上传的任务只清理本机。仅删除含本工具任务编号且唯一匹配的记录，千问未找到对应记录时仍清理本机，整体按成功处理，并明确注明未找到、未执行云端删除；多个匹配记录或页面/登录异常仍视为失败。模型和登录信息不会上传 GitHub。</w:t>
+        <w:t>已完成任务的“删除任务并同步到千问”与“查看 Word 文稿”“打开文档所在位置”同排，不再提供重复下载按钮。每条任务的“删除任务并同步到千问”会停止该任务，将相关本机文件、已完成和未完成 Word、任务记录移入废纸篓；点击“删除任务并同步到千问”会删除对应千问记录，云端删除后无法恢复。删除结果逐项列出工具任务记录、本机文稿及任务文件、对应千问记录，每项成功显示绿色、失败显示红色；千问记录未找到而按成功处理时显示绿色并注明情况。绿色成功提示在卡片消失后显示3秒自动清空；红色失败提示保留；失败原因保留在任务卡片并随刷新显示。成功删除后任务卡片立即从工具列表消失，旧的刷新结果不会把卡片重新显示。云端删除失败则保留本机任务和文稿，提示原因后可重试；未上传的任务只清理本机。仅删除含本工具任务编号且唯一匹配的记录，千问未找到对应记录时仍清理本机，整体按成功处理，并明确注明未找到、未执行云端删除；多个匹配记录或页面/登录异常仍视为失败。模型和登录信息不会上传 GitHub。</w:t>
       </w:r>
     </w:p>
     <w:p>
@@ -1764,23 +1764,23 @@
         <w:pStyle w:val="SourceCode"/>
       </w:pPr>
       <w:r>
-        <w:t xml:space="preserve">    elements=[{'label':'工具任务列表记录','detail':local},</w:t>
-      </w:r>
-    </w:p>
-    <w:p>
-      <w:pPr>
-        <w:pStyle w:val="SourceCode"/>
-      </w:pPr>
-      <w:r>
-        <w:t xml:space="preserve">              {'label':'本机文稿及任务文件','detail':files},</w:t>
-      </w:r>
-    </w:p>
-    <w:p>
-      <w:pPr>
-        <w:pStyle w:val="SourceCode"/>
-      </w:pPr>
-      <w:r>
-        <w:t xml:space="preserve">              {'label':'对应的千问记录','detail':cloud.get(cloud_status,'删除失败：'+error)}]</w:t>
+        <w:t xml:space="preserve">    elements=[{'label':'工具任务列表记录','detail':local,'status':'success' if success else 'failed'},</w:t>
+      </w:r>
+    </w:p>
+    <w:p>
+      <w:pPr>
+        <w:pStyle w:val="SourceCode"/>
+      </w:pPr>
+      <w:r>
+        <w:t xml:space="preserve">              {'label':'本机文稿及任务文件','detail':files,'status':'success' if success else 'failed'},</w:t>
+      </w:r>
+    </w:p>
+    <w:p>
+      <w:pPr>
+        <w:pStyle w:val="SourceCode"/>
+      </w:pPr>
+      <w:r>
+        <w:t xml:space="preserve">              {'label':'对应的千问记录','detail':cloud.get(cloud_status,'删除失败：'+error),'status':'success' if cloud_status in cloud else 'failed'}]</w:t>
       </w:r>
     </w:p>
     <w:p>
@@ -4688,7 +4688,15 @@
         <w:pStyle w:val="SourceCode"/>
       </w:pPr>
       <w:r>
-        <w:t>function showDeletionResult(message,success){clearTimeout(deleteNoticeTimer);msg.className=success?'success':'failure';msg.textContent=message;if(success){deleteNoticeTimer=setTimeout(()=&gt;{if(msg.className==='success'&amp;&amp;msg.textContent===message){msg.textContent='';msg.className=''}},3000)}}</w:t>
+        <w:t>function renderDeletionResult(target,result){target.replaceChildren();let heading=document.createElement('div');heading.textContent=result.status==='success'?'删除成功':result.status==='pending'?'正在同步删除…':'删除失败';heading.style.color=result.status==='success'?'#176538':'#a52222';target.append(heading);if(result.elements){for(let element of result.elements){let row=document.createElement('div');row.textContent=element.label+'：'+element.detail;row.style.color=(element.status==='success'||(!element.status&amp;&amp;/^(删除成功|无需删除|未找到对应千问记录)/.test(element.detail)))?'#176538':'#a52222';target.append(row)}}else{let row=document.createElement('div');row.textContent=result.message;row.style.color=result.status==='success'?'#176538':'#a52222';target.append(row)}}</w:t>
+      </w:r>
+    </w:p>
+    <w:p>
+      <w:pPr>
+        <w:pStyle w:val="SourceCode"/>
+      </w:pPr>
+      <w:r>
+        <w:t>function showDeletionResult(result,success){clearTimeout(deleteNoticeTimer);msg.className=success?'success':'failure';renderDeletionResult(msg,result);let displayed=msg.textContent;if(success){deleteNoticeTimer=setTimeout(()=&gt;{if(msg.className==='success'&amp;&amp;msg.textContent===displayed){msg.replaceChildren();msg.className=''}},3000)}}</w:t>
       </w:r>
     </w:p>
     <w:p>
@@ -4816,7 +4824,7 @@
         <w:pStyle w:val="SourceCode"/>
       </w:pPr>
       <w:r>
-        <w:t>async function refresh(){const sequence=++refreshSequence;try{let jobs=await(await fetch('/jobs')).json();if(sequence!==refreshSequence)return;jobs=jobs.filter(j=&gt;!deletedTaskIds.has(j.id));jobs.sort((a,b)=&gt;(b.created_at??historicalTaskTimes[b.id]??b.added_at??Infinity)-(a.created_at??historicalTaskTimes[a.id]??a.added_at??Infinity));let host=document.querySelector('#jobs');host.replaceChildren();for(let j of jobs){let card=document.createElement('article');card.dataset.taskId=j.id;let h=document.createElement('h2');h.textContent=taskHeading(j);card.append(h);let p=document.createElement('p');p.textContent=(j.document&amp;&amp;!j.has_document)?'Word 文件已不在原保存位置，重新提交链接可生成':(stages[j.state]||'状态暂未识别：'+String(j.state));card.append(p);if(j.source_kind==='local'){let source=document.createElement('p');source.textContent=j.source_label;card.append(source)}else card.append(link('原网页',j.url));let deletion=deletionResults.get(j.id)||j.deletion_result;if(deletion){let status=document.createElement('p');status.className='delete-result';status.setAttribute('role','alert');status.style.color=deletion.status==='failed'?'#a52222':'#8b4520';status.textContent=deletion.message;card.append(status)}if(j.error){let err=document.createElement('p');err.textContent=j.error;card.append(err)}if(j.cleanup_error){let note=document.createElement('p');note.textContent='Word 已生成，但部分临时文件未清理：'+j.cleanup_error;card.append(note)}if(j.has_document){let actions=document.createElement('p');actions.className='actions';actions.append(link('查看 Word 文稿','/preview/'+j.id,'action'));let reveal=document.createElement('button');reveal.type='button';reveal.className='secondary';reveal.textContent='打开文档所在位置';let revealStatus=document.createElement('small');revealStatus.setAttribute('role','status');reveal.onclick=async()=&gt;{reveal.disabled=true;revealStatus.textContent='正在打开文件夹…';try{await post('/reveal/'+j.id,{});revealStatus.textContent='已打开 Finder 文件夹。';msg.textContent='已打开文档所在的 Finder 文件夹。'}catch(e){revealStatus.textContent='打开失败：'+e.message;msg.textContent='打开失败：'+e.message}finally{reveal.disabled=false}};actions.append(reveal);actions.append(revealStatus);card.append(actions);let note=document.createElement('small');note.textContent=j.temporary_files_removed?(j.media_trashed?'原音视频已移入废纸篓，临时音轨已清理。':'原音视频与临时音轨已清理。'):'Word 内容未经人工校对。';card.append(note)}let controls=document.createElement('p');controls.className='actions';if(j.state==='failed'||j.state==='login_required'){let retry=document.createElement('button');retry.textContent='重试任务';retry.onclick=async()=&gt;{try{await post('/jobs',{url:j.url,engine:'qianwen'});await refresh()}catch(e){msg.textContent=e.message}};controls.append(retry)}let remove=document.createElement('button');remove.type='button';remove.className='secondary';remove.style.color='#a52222';remove.textContent='删除任务并同步到千问';if(deletion?.status==='pending'){remove.disabled=true;remove.textContent='正在同步删除…'}remove.onclick=async()=&gt;{if(!confirm('删除“'+(j.title||j.id)+'”？将停止该任务，把本机任务文件和相关文稿移入废纸篓。同时删除对应的千问云端记录，云端删除后无法恢复。'))return;deletionResults.set(j.id,{status:'pending',message:'正在删除并同步到千问，请稍候…'});msg.className='';msg.textContent='正在删除并同步到千问，请稍候…';remove.disabled=true;remove.textContent='正在同步删除…';try{let health=await(await fetch('/health')).json();if(!health.cloud_delete)throw Error('请先双击加载本次更新.command启用千问同步删除');await requireControls();let r=await post('/delete/'+j.id,{});deletedTaskIds.add(j.id);++refreshSequence;document.querySelectorAll('article[data-task-id="'+j.id+'"]').forEach(node=&gt;node.remove());deletionResults.delete(j.id);showDeletionResult(r.deletion_result?.message||r.message,true);await refresh()}catch(e){let message=e.deletionResult?.message||('删除失败\n工具任务列表记录：未删除成功\n本机文稿及任务文件：未确认删除成功\n对应的千问记录：未确认删除成功\n原因：'+e.message);deletionResults.set(j.id,{status:'failed',message});showDeletionResult(message,false);let status=card.querySelector('.delete-result');if(!status){status=document.createElement('p');status.className='delete-result';status.setAttribute('role','alert');card.append(status)}status.style.color='#a52222';status.textContent=message;remove.disabled=false;remove.textContent='删除任务并同步到千问'}};if(j.has_document){card.querySelector('.actions').append(remove)}else{controls.append(remove)}if(controls.children.length)card.append(controls);host.append(card)}await refreshLogin()}catch(e){msg.textContent='后台连接中断，请重新启动工具。'}}</w:t>
+        <w:t>async function refresh(){const sequence=++refreshSequence;try{let jobs=await(await fetch('/jobs')).json();if(sequence!==refreshSequence)return;jobs=jobs.filter(j=&gt;!deletedTaskIds.has(j.id));jobs.sort((a,b)=&gt;(b.created_at??historicalTaskTimes[b.id]??b.added_at??Infinity)-(a.created_at??historicalTaskTimes[a.id]??a.added_at??Infinity));let host=document.querySelector('#jobs');host.replaceChildren();for(let j of jobs){let card=document.createElement('article');card.dataset.taskId=j.id;let h=document.createElement('h2');h.textContent=taskHeading(j);card.append(h);let p=document.createElement('p');p.textContent=(j.document&amp;&amp;!j.has_document)?'Word 文件已不在原保存位置，重新提交链接可生成':(stages[j.state]||'状态暂未识别：'+String(j.state));card.append(p);if(j.source_kind==='local'){let source=document.createElement('p');source.textContent=j.source_label;card.append(source)}else card.append(link('原网页',j.url));let deletion=deletionResults.get(j.id)||j.deletion_result;if(deletion){let status=document.createElement('p');status.className='delete-result';status.setAttribute('role','alert');status.style.color=deletion.status==='failed'?'#a52222':'#8b4520';renderDeletionResult(status,deletion);card.append(status)}if(j.error){let err=document.createElement('p');err.textContent=j.error;card.append(err)}if(j.cleanup_error){let note=document.createElement('p');note.textContent='Word 已生成，但部分临时文件未清理：'+j.cleanup_error;card.append(note)}if(j.has_document){let actions=document.createElement('p');actions.className='actions';actions.append(link('查看 Word 文稿','/preview/'+j.id,'action'));let reveal=document.createElement('button');reveal.type='button';reveal.className='secondary';reveal.textContent='打开文档所在位置';let revealStatus=document.createElement('small');revealStatus.setAttribute('role','status');reveal.onclick=async()=&gt;{reveal.disabled=true;revealStatus.textContent='正在打开文件夹…';try{await post('/reveal/'+j.id,{});revealStatus.textContent='已打开 Finder 文件夹。';msg.textContent='已打开文档所在的 Finder 文件夹。'}catch(e){revealStatus.textContent='打开失败：'+e.message;msg.textContent='打开失败：'+e.message}finally{reveal.disabled=false}};actions.append(reveal);actions.append(revealStatus);card.append(actions);let note=document.createElement('small');note.textContent=j.temporary_files_removed?(j.media_trashed?'原音视频已移入废纸篓，临时音轨已清理。':'原音视频与临时音轨已清理。'):'Word 内容未经人工校对。';card.append(note)}let controls=document.createElement('p');controls.className='actions';if(j.state==='failed'||j.state==='login_required'){let retry=document.createElement('button');retry.textContent='重试任务';retry.onclick=async()=&gt;{try{await post('/jobs',{url:j.url,engine:'qianwen'});await refresh()}catch(e){msg.textContent=e.message}};controls.append(retry)}let remove=document.createElement('button');remove.type='button';remove.className='secondary';remove.style.color='#a52222';remove.textContent='删除任务并同步到千问';if(deletion?.status==='pending'){remove.disabled=true;remove.textContent='正在同步删除…'}remove.onclick=async()=&gt;{if(!confirm('删除“'+(j.title||j.id)+'”？将停止该任务，把本机任务文件和相关文稿移入废纸篓。同时删除对应的千问云端记录，云端删除后无法恢复。'))return;deletionResults.set(j.id,{status:'pending',message:'正在删除并同步到千问，请稍候…'});msg.className='';msg.textContent='正在删除并同步到千问，请稍候…';remove.disabled=true;remove.textContent='正在同步删除…';try{let health=await(await fetch('/health')).json();if(!health.cloud_delete)throw Error('请先双击加载本次更新.command启用千问同步删除');await requireControls();let r=await post('/delete/'+j.id,{});deletedTaskIds.add(j.id);++refreshSequence;document.querySelectorAll('article[data-task-id="'+j.id+'"]').forEach(node=&gt;node.remove());deletionResults.delete(j.id);showDeletionResult(r.deletion_result||{status:'success',message:r.message},true);await refresh()}catch(e){let message=e.deletionResult?.message||('删除失败\n工具任务列表记录：未删除成功\n本机文稿及任务文件：未确认删除成功\n对应的千问记录：未确认删除成功\n原因：'+e.message);let report=e.deletionResult||{status:'failed',message};deletionResults.set(j.id,report);showDeletionResult(report,false);let status=card.querySelector('.delete-result');if(!status){status=document.createElement('p');status.className='delete-result';status.setAttribute('role','alert');card.append(status)}status.style.color='#a52222';renderDeletionResult(status,report);remove.disabled=false;remove.textContent='删除任务并同步到千问'}};if(j.has_document){card.querySelector('.actions').append(remove)}else{controls.append(remove)}if(controls.children.length)card.append(controls);host.append(card)}await refreshLogin()}catch(e){msg.textContent='后台连接中断，请重新启动工具。'}}</w:t>
       </w:r>
     </w:p>
     <w:p>
@@ -14008,6 +14016,14 @@
         <w:pStyle w:val="SourceCode"/>
       </w:pPr>
       <w:r>
+        <w:t xml:space="preserve">        self.assertEqual([e['status'] for e in report['elements']],['failed','failed','success'])</w:t>
+      </w:r>
+    </w:p>
+    <w:p>
+      <w:pPr>
+        <w:pStyle w:val="SourceCode"/>
+      </w:pPr>
+      <w:r>
         <w:t xml:space="preserve">        self.assertIn('未全部删除成功',report['elements'][1]['detail'])</w:t>
       </w:r>
     </w:p>
@@ -18210,7 +18226,7 @@
         <w:pStyle w:val="SourceCode"/>
       </w:pPr>
       <w:r>
-        <w:t xml:space="preserve">  "index.html": "f5bf6afe5e6be87dbdc8816c8cbb99cd3dd4e8a6cefa8bc9955caed5bf5a4162",</w:t>
+        <w:t xml:space="preserve">  "index.html": "8807e6f53fce9bcabe4e2b01782e55ca6bf20aeccdfb7e452f209729ab3a1e66",</w:t>
       </w:r>
     </w:p>
     <w:p>
@@ -18314,7 +18330,7 @@
         <w:pStyle w:val="SourceCode"/>
       </w:pPr>
       <w:r>
-        <w:t xml:space="preserve">  "app.py": "5153e75763d03906b9dd31bdbd90d90f4317174ecb54b943aaec8599d976cc83",</w:t>
+        <w:t xml:space="preserve">  "app.py": "42334fb8c21c2b74196f6377bd67516af9c5bb5b1a8541128d8592b3882f4391",</w:t>
       </w:r>
     </w:p>
     <w:p>
@@ -18370,7 +18386,7 @@
         <w:pStyle w:val="SourceCode"/>
       </w:pPr>
       <w:r>
-        <w:t xml:space="preserve">  "test_app.py": "e936dde26bfb7f51c322c9b9b4b0b736da892dffb0a8f3070e2dc72d21988307"</w:t>
+        <w:t xml:space="preserve">  "test_app.py": "e850e10b4e8414ef683b73076e73d10e39b5837125edfd82f97af9a8cbb781ab"</w:t>
       </w:r>
     </w:p>
     <w:p>

</xml_diff>

<commit_message>
Rename Qianwen button to login or open Qianwen
</commit_message>
<xml_diff>
--- a/安装与使用指南.docx
+++ b/安装与使用指南.docx
@@ -79,7 +79,7 @@
     </w:p>
     <w:p>
       <w:r>
-        <w:t>页面上有标题旁蓝色“登录千问”按钮。识别任务检测到登录失效后显示需要重新登录；点击按钮登录、关闭登录窗口，再点击重试。空闲时不保证实时发现过期，也不会主动抢占屏幕。</w:t>
+        <w:t>页面上有标题旁蓝色“登录或打开千问”按钮。识别任务检测到登录失效后显示需要重新登录；点击按钮登录、关闭登录窗口，再点击重试。空闲时不保证实时发现过期，也不会主动抢占屏幕。</w:t>
       </w:r>
     </w:p>
     <w:p>
@@ -4586,7 +4586,7 @@
         <w:pStyle w:val="SourceCode"/>
       </w:pPr>
       <w:r>
-        <w:t>&lt;h1&gt;网页视频转语音识别文字稿（由千问提供支持） &lt;button type="button" id="qianwen-login"&gt;登录千问&lt;/button&gt;&lt;/h1&gt;</w:t>
+        <w:t>&lt;h1&gt;网页视频转语音识别文字稿（由千问提供支持） &lt;button type="button" id="qianwen-login"&gt;登录或打开千问&lt;/button&gt;&lt;/h1&gt;</w:t>
       </w:r>
     </w:p>
     <w:p>
@@ -4626,7 +4626,7 @@
         <w:pStyle w:val="SourceCode"/>
       </w:pPr>
       <w:r>
-        <w:t>&lt;p&gt;&lt;small&gt;Word 保存到“下载/网页视频转语音识别文字稿（由千问提供支持）”。音频将上传千问服务器；需要登录时点击上方“登录千问”。完成后直接查看或打开所在位置。Word 完整性检查通过后自动将原音视频移入废纸篓并清理临时音轨。&lt;/small&gt;&lt;/p&gt;</w:t>
+        <w:t>&lt;p&gt;&lt;small&gt;Word 保存到“下载/网页视频转语音识别文字稿（由千问提供支持）”。音频将上传千问服务器；需要登录时点击上方“登录或打开千问”。完成后直接查看或打开所在位置。Word 完整性检查通过后自动将原音视频移入废纸篓并清理临时音轨。&lt;/small&gt;&lt;/p&gt;</w:t>
       </w:r>
     </w:p>
     <w:p>
@@ -4728,7 +4728,7 @@
         <w:pStyle w:val="SourceCode"/>
       </w:pPr>
       <w:r>
-        <w:t>async function refreshLogin(){try{let h=await(await fetch('/health')).json();if(!h.task_controls){document.querySelector('#login-status').textContent='新功能需要加载本次更新';return}let s=await(await fetch('/qianwen/status')).json();let text=s.window_open?'请在千问窗口中完成登录，完成后关闭窗口':s.status==='required'?'千问需要重新登录，请点击标题旁的“登录千问”按钮':s.last_success?'最近成功转写：'+new Date(s.last_success*1000).toLocaleString()+'；任务中会继续验证登录':'登录状态待验证；首次使用请点击登录千问';document.querySelector('#login-status').textContent=s.error||text}catch(e){document.querySelector('#login-status').textContent='暂时无法读取登录状态'}}</w:t>
+        <w:t>async function refreshLogin(){try{let h=await(await fetch('/health')).json();if(!h.task_controls){document.querySelector('#login-status').textContent='新功能需要加载本次更新';return}let s=await(await fetch('/qianwen/status')).json();let text=s.window_open?'请在千问窗口中完成登录，完成后关闭窗口':s.status==='required'?'千问需要重新登录，请点击标题旁的“登录或打开千问”按钮':s.last_success?'最近成功转写：'+new Date(s.last_success*1000).toLocaleString()+'；任务中会继续验证登录':'登录状态待验证；首次使用请点击“登录或打开千问”';document.querySelector('#login-status').textContent=s.error||text}catch(e){document.querySelector('#login-status').textContent='暂时无法读取登录状态'}}</w:t>
       </w:r>
     </w:p>
     <w:p>
@@ -18226,7 +18226,7 @@
         <w:pStyle w:val="SourceCode"/>
       </w:pPr>
       <w:r>
-        <w:t xml:space="preserve">  "index.html": "8807e6f53fce9bcabe4e2b01782e55ca6bf20aeccdfb7e452f209729ab3a1e66",</w:t>
+        <w:t xml:space="preserve">  "index.html": "a5ae1e8ce64032d6ee744fa81e4649a13041f0f281b911cf52db48cbb0c38add",</w:t>
       </w:r>
     </w:p>
     <w:p>

</xml_diff>

<commit_message>
Verify Windows venv child service and exercise PowerShell bootstrap
</commit_message>
<xml_diff>
--- a/安装与使用指南.docx
+++ b/安装与使用指南.docx
@@ -3563,7 +3563,7 @@
     </w:p>
     <w:p>
       <w:r>
-        <w:t xml:space="preserve">            &amp; $candidate -c 'import sys,platform; sys.exit(not (sys.version_info[:2]==(3,12) and platform.machine().lower() in (''amd64'',''x86_64'')))' 2&gt;$null</w:t>
+        <w:t xml:space="preserve">            &amp; $candidate -c 'import sys,platform; sys.exit(not (sys.version_info[:2]==(3,12) and sys.maxsize&gt;2**32 and platform.machine().lower() in (''amd64'',''x86_64'')))' 2&gt;$null</w:t>
       </w:r>
     </w:p>
     <w:p>
@@ -3902,6 +3902,16 @@
     </w:p>
     <w:p>
       <w:r>
+        <w:t xml:space="preserve">    if system == 'Windows' and sys.maxsize &lt;= 2**32:</w:t>
+      </w:r>
+    </w:p>
+    <w:p>
+      <w:r>
+        <w:t xml:space="preserve">        raise RuntimeError('Windows 需要64位 Python 3.12，请安装官方 x64 安装包。')</w:t>
+      </w:r>
+    </w:p>
+    <w:p>
+      <w:r>
         <w:t xml:space="preserve">    if system == 'Windows' and sys.getwindowsversion().build &lt; 17763:</w:t>
       </w:r>
     </w:p>
@@ -4115,6 +4125,88 @@
     <w:p/>
     <w:p>
       <w:r>
+        <w:t>def started_service_matches(pid, launcher_pid):</w:t>
+      </w:r>
+    </w:p>
+    <w:p>
+      <w:r>
+        <w:t xml:space="preserve">    if pid == launcher_pid:</w:t>
+      </w:r>
+    </w:p>
+    <w:p>
+      <w:r>
+        <w:t xml:space="preserve">        return True</w:t>
+      </w:r>
+    </w:p>
+    <w:p>
+      <w:r>
+        <w:t xml:space="preserve">    if platform.system() != 'Windows':</w:t>
+      </w:r>
+    </w:p>
+    <w:p>
+      <w:r>
+        <w:t xml:space="preserve">        return False</w:t>
+      </w:r>
+    </w:p>
+    <w:p>
+      <w:r>
+        <w:t xml:space="preserve">    # Windows venv python.exe redirects to a child interpreter. Verify ancestry,</w:t>
+      </w:r>
+    </w:p>
+    <w:p>
+      <w:r>
+        <w:t xml:space="preserve">    # script and working directory rather than accepting an arbitrary PID.</w:t>
+      </w:r>
+    </w:p>
+    <w:p>
+      <w:r>
+        <w:t xml:space="preserve">    import psutil</w:t>
+      </w:r>
+    </w:p>
+    <w:p>
+      <w:r>
+        <w:t xml:space="preserve">    try:</w:t>
+      </w:r>
+    </w:p>
+    <w:p>
+      <w:r>
+        <w:t xml:space="preserve">        process = psutil.Process(pid)</w:t>
+      </w:r>
+    </w:p>
+    <w:p>
+      <w:r>
+        <w:t xml:space="preserve">        args = process.cmdline()</w:t>
+      </w:r>
+    </w:p>
+    <w:p>
+      <w:r>
+        <w:t xml:space="preserve">        return (any(p.pid == launcher_pid for p in process.parents()) and</w:t>
+      </w:r>
+    </w:p>
+    <w:p>
+      <w:r>
+        <w:t xml:space="preserve">                len(args) &gt;= 2 and Path(args[1]).resolve() == ROOT / 'app.py' and</w:t>
+      </w:r>
+    </w:p>
+    <w:p>
+      <w:r>
+        <w:t xml:space="preserve">                Path(process.cwd()).resolve() == ROOT)</w:t>
+      </w:r>
+    </w:p>
+    <w:p>
+      <w:r>
+        <w:t xml:space="preserve">    except (psutil.NoSuchProcess, psutil.AccessDenied, OSError, ValueError):</w:t>
+      </w:r>
+    </w:p>
+    <w:p>
+      <w:r>
+        <w:t xml:space="preserve">        return False</w:t>
+      </w:r>
+    </w:p>
+    <w:p/>
+    <w:p/>
+    <w:p>
+      <w:r>
         <w:t>def start_service(python, port):</w:t>
       </w:r>
     </w:p>
@@ -4280,7 +4372,7 @@
     </w:p>
     <w:p>
       <w:r>
-        <w:t xml:space="preserve">            if data.get('pid') != child.pid:</w:t>
+        <w:t xml:space="preserve">            if not started_service_matches(data.get('pid'), child.pid):</w:t>
       </w:r>
     </w:p>
     <w:p>
@@ -13049,6 +13141,72 @@
     <w:p/>
     <w:p>
       <w:r>
+        <w:t xml:space="preserve">    def test_windows_service_redirector_identity(self):</w:t>
+      </w:r>
+    </w:p>
+    <w:p>
+      <w:r>
+        <w:t xml:space="preserve">        fake = MagicMock()</w:t>
+      </w:r>
+    </w:p>
+    <w:p>
+      <w:r>
+        <w:t xml:space="preserve">        process = fake.Process.return_value</w:t>
+      </w:r>
+    </w:p>
+    <w:p>
+      <w:r>
+        <w:t xml:space="preserve">        process.parents.return_value = [MagicMock(pid=123)]</w:t>
+      </w:r>
+    </w:p>
+    <w:p>
+      <w:r>
+        <w:t xml:space="preserve">        process.cmdline.return_value = ['python.exe', str(install.ROOT/'app.py')]</w:t>
+      </w:r>
+    </w:p>
+    <w:p>
+      <w:r>
+        <w:t xml:space="preserve">        process.cwd.return_value = str(install.ROOT)</w:t>
+      </w:r>
+    </w:p>
+    <w:p>
+      <w:r>
+        <w:t xml:space="preserve">        with patch.object(install.platform,'system',return_value='Windows'), patch.dict(sys.modules, {'psutil':fake}):</w:t>
+      </w:r>
+    </w:p>
+    <w:p>
+      <w:r>
+        <w:t xml:space="preserve">            self.assertTrue(install.started_service_matches(456,123))</w:t>
+      </w:r>
+    </w:p>
+    <w:p>
+      <w:r>
+        <w:t xml:space="preserve">            process.cmdline.return_value = ['python.exe', str(install.ROOT/'other.py')]</w:t>
+      </w:r>
+    </w:p>
+    <w:p>
+      <w:r>
+        <w:t xml:space="preserve">            self.assertFalse(install.started_service_matches(456,123))</w:t>
+      </w:r>
+    </w:p>
+    <w:p>
+      <w:r>
+        <w:t xml:space="preserve">            process.cmdline.return_value = ['python.exe', str(install.ROOT/'app.py')]</w:t>
+      </w:r>
+    </w:p>
+    <w:p>
+      <w:r>
+        <w:t xml:space="preserve">            process.parents.return_value = [MagicMock(pid=999)]</w:t>
+      </w:r>
+    </w:p>
+    <w:p>
+      <w:r>
+        <w:t xml:space="preserve">            self.assertFalse(install.started_service_matches(456,123))</w:t>
+      </w:r>
+    </w:p>
+    <w:p/>
+    <w:p>
+      <w:r>
         <w:t xml:space="preserve">    def test_windows_arm_rejected(self):</w:t>
       </w:r>
     </w:p>
@@ -14316,12 +14474,12 @@
     </w:p>
     <w:p>
       <w:r>
-        <w:t xml:space="preserve">  "install-windows.ps1": "f469304d41ccb402e1b74e9915cae6f851bb272c374b054d861155b56c3416ae",</w:t>
-      </w:r>
-    </w:p>
-    <w:p>
-      <w:r>
-        <w:t xml:space="preserve">  "install.py": "8bdbd65f6029cd942b72bdf3ec2bfe2f453f44adfbfe9c09d3942d7538d04b29",</w:t>
+        <w:t xml:space="preserve">  "install-windows.ps1": "41b154fee7d2df1352ad384de1b942b67bcc81a483e61542c7f7b1454119dcba",</w:t>
+      </w:r>
+    </w:p>
+    <w:p>
+      <w:r>
+        <w:t xml:space="preserve">  "install.py": "73f34616d8af9fc38e555722d63002224178ccf5e686ab1b36aa7bc05e8f8c37",</w:t>
       </w:r>
     </w:p>
     <w:p>
@@ -14396,7 +14554,7 @@
     </w:p>
     <w:p>
       <w:r>
-        <w:t xml:space="preserve">  "test_runtime_compat.py": "3f7b61ddad4064df2704313451db4e29a28bdadb140b14c0ee2020eae177cc2b",</w:t>
+        <w:t xml:space="preserve">  "test_runtime_compat.py": "1f0ae09861bb4f5ffa6bd7e6af237512c4e93229ef3298c80471a2fe287754d6",</w:t>
       </w:r>
     </w:p>
     <w:p>

</xml_diff>

<commit_message>
Run Windows startup verification inside the installed venv
</commit_message>
<xml_diff>
--- a/安装与使用指南.docx
+++ b/安装与使用指南.docx
@@ -4574,6 +4574,46 @@
     </w:p>
     <w:p>
       <w:r>
+        <w:t xml:space="preserve">        # Bootstrap runs under system Python; Windows process verification uses</w:t>
+      </w:r>
+    </w:p>
+    <w:p>
+      <w:r>
+        <w:t xml:space="preserve">        # psutil installed inside the project venv, never the global environment.</w:t>
+      </w:r>
+    </w:p>
+    <w:p>
+      <w:r>
+        <w:t xml:space="preserve">        if platform.system() == 'Windows' and Path(sys.prefix).resolve() != (ROOT/'.venv').resolve():</w:t>
+      </w:r>
+    </w:p>
+    <w:p>
+      <w:r>
+        <w:t xml:space="preserve">            command = [python, ROOT/'install.py', '--start-only', '--port', str(args.port)]</w:t>
+      </w:r>
+    </w:p>
+    <w:p>
+      <w:r>
+        <w:t xml:space="preserve">            if args.open:</w:t>
+      </w:r>
+    </w:p>
+    <w:p>
+      <w:r>
+        <w:t xml:space="preserve">                command.append('--open')</w:t>
+      </w:r>
+    </w:p>
+    <w:p>
+      <w:r>
+        <w:t xml:space="preserve">            run(command)</w:t>
+      </w:r>
+    </w:p>
+    <w:p>
+      <w:r>
+        <w:t xml:space="preserve">            return</w:t>
+      </w:r>
+    </w:p>
+    <w:p>
+      <w:r>
         <w:t xml:space="preserve">        start_service(python, args.port)</w:t>
       </w:r>
     </w:p>
@@ -14479,7 +14519,7 @@
     </w:p>
     <w:p>
       <w:r>
-        <w:t xml:space="preserve">  "install.py": "73f34616d8af9fc38e555722d63002224178ccf5e686ab1b36aa7bc05e8f8c37",</w:t>
+        <w:t xml:space="preserve">  "install.py": "76400d914fe51eada8a704ee5e18d1310d003daf564b163443aa6dc22c63e140",</w:t>
       </w:r>
     </w:p>
     <w:p>

</xml_diff>

<commit_message>
Document verified Windows setup and require supported Windows versions
</commit_message>
<xml_diff>
--- a/安装与使用指南.docx
+++ b/安装与使用指南.docx
@@ -43,12 +43,12 @@
     </w:p>
     <w:p>
       <w:r>
-        <w:t>| Windows 10 1809+ / Windows 11，64位 x64（常见 Intel/AMD PC） | install-windows.cmd / install-windows.ps1 | 新增兼容入口；验证结果见下方，尚未在全新实体 Windows 电脑实测 |</w:t>
-      </w:r>
-    </w:p>
-    <w:p>
-      <w:r>
-        <w:t>| Intel Mac、Windows ARM/32位、WSL/Linux | 暂无 | 暂不支持自动安装 |</w:t>
+        <w:t>| Windows 11，64位 x64（常见 Intel/AMD PC） | install-windows.cmd / install-windows.ps1 | GitHub Windows runner 完整安装/启动验收通过；尚未在全新实体 Windows 11 电脑实测 |</w:t>
+      </w:r>
+    </w:p>
+    <w:p>
+      <w:r>
+        <w:t>| Intel Mac、Windows 10、Windows ARM/32位、WSL/Linux | 暂无 | 暂不支持自动安装 |</w:t>
       </w:r>
     </w:p>
     <w:p/>
@@ -119,6 +119,12 @@
     </w:p>
     <w:p/>
     <w:p>
+      <w:r>
+        <w:t>Windows 版本支持范围依据 [Playwright 官方系统要求](https://playwright.dev/python/docs/intro#system-requirements)。Windows Server 2019+ 可用于自动化验收；普通用户优先使用 Windows 11 x64。</w:t>
+      </w:r>
+    </w:p>
+    <w:p/>
+    <w:p>
       <w:pPr>
         <w:pStyle w:val="Heading2"/>
       </w:pPr>
@@ -525,6 +531,12 @@
     <w:p/>
     <w:p>
       <w:r>
+        <w:t>Windows 的 PowerShell 完整入口、Chromium 下载/启动、全部测试、pip check、服务健康检查和重复启动已经通过 [GitHub 自动化验收](https://github.com/ZhangJP-wh/web-video-to-word/actions/runs/37683739032)。runner 预置了 Python/Node，因此 WinGet 缺环境安装、本人登录千问和实体新电脑安装不属于这次自动化验收。</w:t>
+      </w:r>
+    </w:p>
+    <w:p/>
+    <w:p>
+      <w:r>
         <w:t>安装入口运行 `test_reader test_app test_qianwen test_task_controls test_install test_runtime_compat` 全部测试及 pip check。安装器回归覆盖错误架构/Node版本、损坏环境保留与修复、符号链接保护、依赖失败中止、错误服务身份拒绝和正确服务复用。千问单元测试使用模拟结果，不调用用户账号。</w:t>
       </w:r>
     </w:p>
@@ -3673,7 +3685,27 @@
     </w:p>
     <w:p>
       <w:r>
-        <w:t xml:space="preserve">        throw '需要 Windows 10 1809/Windows 11 x64 和64位 PowerShell。Windows ARM、32位和 WSL 尚不支持。'</w:t>
+        <w:t xml:space="preserve">        throw '需要 Windows 11 x64（或 Windows Server 2019+） 和64位 PowerShell。Windows ARM、32位和 WSL 尚不支持。'</w:t>
+      </w:r>
+    </w:p>
+    <w:p>
+      <w:r>
+        <w:t xml:space="preserve">    }</w:t>
+      </w:r>
+    </w:p>
+    <w:p>
+      <w:r>
+        <w:t xml:space="preserve">    $osInfo = Get-CimInstance Win32_OperatingSystem</w:t>
+      </w:r>
+    </w:p>
+    <w:p>
+      <w:r>
+        <w:t xml:space="preserve">    if ($osInfo.ProductType -eq 1 -and [Environment]::OSVersion.Version.Build -lt 22000) {</w:t>
+      </w:r>
+    </w:p>
+    <w:p>
+      <w:r>
+        <w:t xml:space="preserve">        throw '需要 Windows 11 x64；当前 Playwright 不正式支持 Windows 10，不能承诺自动安装。'</w:t>
       </w:r>
     </w:p>
     <w:p>
@@ -3897,7 +3929,7 @@
     </w:p>
     <w:p>
       <w:r>
-        <w:t xml:space="preserve">        raise RuntimeError('支持原生 Apple Silicon Mac 或 Windows 10/11 x64；不支持 Rosetta、Intel Mac、Windows ARM/32位和 Linux。')</w:t>
+        <w:t xml:space="preserve">        raise RuntimeError('支持原生 Apple Silicon Mac 或 Windows 11 x64；不支持 Rosetta、Intel Mac、Windows ARM/32位和 Linux。')</w:t>
       </w:r>
     </w:p>
     <w:p>
@@ -3912,12 +3944,22 @@
     </w:p>
     <w:p>
       <w:r>
-        <w:t xml:space="preserve">    if system == 'Windows' and sys.getwindowsversion().build &lt; 17763:</w:t>
-      </w:r>
-    </w:p>
-    <w:p>
-      <w:r>
-        <w:t xml:space="preserve">        raise RuntimeError('需要 Windows 10 1809 或更新版本。')</w:t>
+        <w:t xml:space="preserve">    if system == 'Windows':</w:t>
+      </w:r>
+    </w:p>
+    <w:p>
+      <w:r>
+        <w:t xml:space="preserve">        version = sys.getwindowsversion()</w:t>
+      </w:r>
+    </w:p>
+    <w:p>
+      <w:r>
+        <w:t xml:space="preserve">        if version.build &lt; 17763 or (version.product_type == 1 and version.build &lt; 22000):</w:t>
+      </w:r>
+    </w:p>
+    <w:p>
+      <w:r>
+        <w:t xml:space="preserve">            raise RuntimeError('需要 Windows 11 x64 或 Windows Server 2019+；当前 Playwright 不正式支持 Windows 10。')</w:t>
       </w:r>
     </w:p>
     <w:p>
@@ -8818,7 +8860,7 @@
     </w:p>
     <w:p>
       <w:r>
-        <w:t>"""Small platform boundary for Windows x64 and native Apple Silicon Mac."""</w:t>
+        <w:t>"""Small platform boundary for Windows 11 x64 and native Apple Silicon Mac."""</w:t>
       </w:r>
     </w:p>
     <w:p>
@@ -13170,7 +13212,7 @@
     </w:p>
     <w:p>
       <w:r>
-        <w:t xml:space="preserve">        with patch.object(install.platform,'system',return_value='Windows'), patch.object(install.platform,'machine',return_value='AMD64'), patch.object(install.sys,'version_info',(3,12)), patch.object(install.sys,'getwindowsversion',create=True,return_value=MagicMock(build=19045)), patch.object(install.shutil,'which',return_value='node.exe'), patch.object(install.subprocess,'check_output',return_value=json.dumps({'version':'24.0.0','arch':'x64'})):</w:t>
+        <w:t xml:space="preserve">        with patch.object(install.platform,'system',return_value='Windows'), patch.object(install.platform,'machine',return_value='AMD64'), patch.object(install.sys,'version_info',(3,12)), patch.object(install.sys,'getwindowsversion',create=True,return_value=MagicMock(build=22631,product_type=1)), patch.object(install.shutil,'which',return_value='node.exe'), patch.object(install.subprocess,'check_output',return_value=json.dumps({'version':'24.0.0','arch':'x64'})):</w:t>
       </w:r>
     </w:p>
     <w:p>
@@ -13242,6 +13284,32 @@
     <w:p>
       <w:r>
         <w:t xml:space="preserve">            self.assertFalse(install.started_service_matches(456,123))</w:t>
+      </w:r>
+    </w:p>
+    <w:p/>
+    <w:p>
+      <w:r>
+        <w:t xml:space="preserve">    def test_windows_10_rejected_before_dependency_install(self):</w:t>
+      </w:r>
+    </w:p>
+    <w:p>
+      <w:r>
+        <w:t xml:space="preserve">        with patch.object(install.platform,'system',return_value='Windows'), patch.object(install.platform,'machine',return_value='AMD64'), patch.object(install.sys,'getwindowsversion',create=True,return_value=MagicMock(build=19045,product_type=1)), patch.object(install,'run') as run:</w:t>
+      </w:r>
+    </w:p>
+    <w:p>
+      <w:r>
+        <w:t xml:space="preserve">            with self.assertRaisesRegex(RuntimeError,'Windows 11'):</w:t>
+      </w:r>
+    </w:p>
+    <w:p>
+      <w:r>
+        <w:t xml:space="preserve">                install.check_environment()</w:t>
+      </w:r>
+    </w:p>
+    <w:p>
+      <w:r>
+        <w:t xml:space="preserve">            run.assert_not_called()</w:t>
       </w:r>
     </w:p>
     <w:p/>
@@ -14514,12 +14582,12 @@
     </w:p>
     <w:p>
       <w:r>
-        <w:t xml:space="preserve">  "install-windows.ps1": "41b154fee7d2df1352ad384de1b942b67bcc81a483e61542c7f7b1454119dcba",</w:t>
-      </w:r>
-    </w:p>
-    <w:p>
-      <w:r>
-        <w:t xml:space="preserve">  "install.py": "76400d914fe51eada8a704ee5e18d1310d003daf564b163443aa6dc22c63e140",</w:t>
+        <w:t xml:space="preserve">  "install-windows.ps1": "727a49a50e928b435c2863aff20dd8b20be4b0c5662d971c71ac8a4554dbaedd",</w:t>
+      </w:r>
+    </w:p>
+    <w:p>
+      <w:r>
+        <w:t xml:space="preserve">  "install.py": "8fb062e855fb41616c65923dc4ca43808d4c710fc8919d1cb62c039a1fb2144c",</w:t>
       </w:r>
     </w:p>
     <w:p>
@@ -14549,7 +14617,7 @@
     </w:p>
     <w:p>
       <w:r>
-        <w:t xml:space="preserve">  "runtime_compat.py": "8390ff8d5940b5665cce78b7f302ded196c79b1e8476fa62ef3d5de38fcb5fa5",</w:t>
+        <w:t xml:space="preserve">  "runtime_compat.py": "88356cfde1ee32b4a9100f48ee374ed7e5ac0ba558f6a8626dde430c10b1191f",</w:t>
       </w:r>
     </w:p>
     <w:p>
@@ -14594,7 +14662,7 @@
     </w:p>
     <w:p>
       <w:r>
-        <w:t xml:space="preserve">  "test_runtime_compat.py": "1f0ae09861bb4f5ffa6bd7e6af237512c4e93229ef3298c80471a2fe287754d6",</w:t>
+        <w:t xml:space="preserve">  "test_runtime_compat.py": "e7e4d7ddc223a5586ab803f7969a4a6eb69861f64d1257b48f02ade15a939188",</w:t>
       </w:r>
     </w:p>
     <w:p>

</xml_diff>

<commit_message>
Report actual login-window failure and bypass proxies for local browser control
</commit_message>
<xml_diff>
--- a/安装与使用指南.docx
+++ b/安装与使用指南.docx
@@ -613,6 +613,12 @@
     </w:p>
     <w:p/>
     <w:p>
+      <w:r>
+        <w:t>更新前已启动的旧任务会继续使用旧浏览器连接；等待其结束后再打开登录窗口。占用、验证失败和未登录会分别提示，不把浏览器占用误报为安装环境错误。本机浏览器控制连接不经过网络代理。</w:t>
+      </w:r>
+    </w:p>
+    <w:p/>
+    <w:p>
       <w:pPr>
         <w:pStyle w:val="Heading1"/>
       </w:pPr>
@@ -1950,7 +1956,22 @@
     </w:p>
     <w:p>
       <w:r>
-        <w:t xml:space="preserve">    if login_process and login_process.poll() not in (None,0):state['error']='登录窗口未能正常打开，请运行配置千问登录.command检查浏览器环境。'</w:t>
+        <w:t xml:space="preserve">    result_path=WORK/'qianwen-login-result.json'</w:t>
+      </w:r>
+    </w:p>
+    <w:p>
+      <w:r>
+        <w:t xml:space="preserve">    if login_process and login_process.poll() not in (None,0):</w:t>
+      </w:r>
+    </w:p>
+    <w:p>
+      <w:r>
+        <w:t xml:space="preserve">        result=json.loads(result_path.read_text(encoding='utf-8')) if result_path.exists() else {}</w:t>
+      </w:r>
+    </w:p>
+    <w:p>
+      <w:r>
+        <w:t xml:space="preserve">        state['error']=result.get('error','千问登录窗口未能打开，请重试；若仍失败请检查登录错误记录。')</w:t>
       </w:r>
     </w:p>
     <w:p>
@@ -1978,6 +1999,11 @@
     <w:p>
       <w:r>
         <w:t xml:space="preserve">        if login_process and login_process.poll() is None:return {'ok':True,'message':'登录窗口已经打开。'}</w:t>
+      </w:r>
+    </w:p>
+    <w:p>
+      <w:r>
+        <w:t xml:space="preserve">        (WORK/'qianwen-login-result.json').unlink(missing_ok=True)</w:t>
       </w:r>
     </w:p>
     <w:p>
@@ -2844,7 +2870,17 @@
     </w:p>
     <w:p>
       <w:r>
-        <w:t xml:space="preserve">        with urllib.request.urlopen(f'http://127.0.0.1:{PORT}/json/version',timeout=1) as r:</w:t>
+        <w:t xml:space="preserve">        # Loopback control traffic must never go through system/environment proxies.</w:t>
+      </w:r>
+    </w:p>
+    <w:p>
+      <w:r>
+        <w:t xml:space="preserve">        opener=urllib.request.build_opener(urllib.request.ProxyHandler({}))</w:t>
+      </w:r>
+    </w:p>
+    <w:p>
+      <w:r>
+        <w:t xml:space="preserve">        with opener.open(f'http://127.0.0.1:{PORT}/json/version',timeout=1) as r:</w:t>
       </w:r>
     </w:p>
     <w:p>
@@ -4124,7 +4160,7 @@
     </w:p>
     <w:p>
       <w:r>
-        <w:t>async function refreshLogin(){try{let h=await(await fetch('/health')).json();if(!h.task_controls){document.querySelector('#login-status').textContent='新功能需要加载本次更新';return}let s=await(await fetch('/qianwen/status')).json();let verified=s.status==='valid'&amp;&amp;Date.now()/1000-s.checked_at&lt;180;document.querySelector('#qianwen-login').textContent=verified?'已登录千问':s.status==='required'?'需登录千问':'正在验证登录';if(verified)loginPrompted=false;if(s.status==='required'&amp;&amp;!loginPrompted){loginPrompted=true;alert('千问未登录或登录已失效，请点击标题旁的登录按钮，完成登录后重试任务。');}let text=s.window_open?'请在千问窗口中完成登录，完成后关闭窗口':s.status==='required'?'千问需要重新登录，请点击标题旁的“登录或打开千问”按钮':s.last_success?'最近成功转写：'+new Date(s.last_success*1000).toLocaleString()+'；任务中会继续验证登录':'登录状态待验证，可能千问未登录；首次使用请点击“登录或打开千问”完成登录';document.querySelector('#login-status').textContent=s.error||text}catch(e){document.querySelector('#login-status').textContent='暂时无法读取登录状态'}}</w:t>
+        <w:t>async function refreshLogin(){try{let h=await(await fetch('/health')).json();if(!h.task_controls){document.querySelector('#login-status').textContent='新功能需要加载本次更新';return}let s=await(await fetch('/qianwen/status')).json();let verified=s.status==='valid'&amp;&amp;Date.now()/1000-s.checked_at&lt;180;document.querySelector('#qianwen-login').textContent=verified?'已登录千问':s.status==='required'?'需登录千问':s.check_error?'登录状态待确认':'正在验证登录';if(verified)loginPrompted=false;if(s.status==='required'&amp;&amp;!loginPrompted){loginPrompted=true;alert('千问未登录或登录已失效，请点击标题旁的登录按钮，完成登录后重试任务。');}let text=s.window_open?'请在千问窗口中完成登录，完成后关闭窗口':s.status==='required'?'千问需要重新登录，请点击标题旁的“登录或打开千问”按钮':s.last_success?'最近成功转写：'+new Date(s.last_success*1000).toLocaleString()+'；任务中会继续验证登录':'登录状态待验证，可能千问未登录；首次使用请点击“登录或打开千问”完成登录';document.querySelector('#login-status').textContent=s.error||(s.check_error?'暂时无法验证千问登录：'+s.check_error:text);if(s.error&amp;&amp;msg.textContent.startsWith('正在打开千问登录窗口')){msg.textContent='打开失败：'+s.error;msg.style.color='#a52222'}}catch(e){document.querySelector('#login-status').textContent='暂时无法读取登录状态'}}</w:t>
       </w:r>
     </w:p>
     <w:p>
@@ -6609,7 +6645,7 @@
     <w:p/>
     <w:p>
       <w:r>
-        <w:t>def auth_state(status):</w:t>
+        <w:t>def auth_state(status, error=None):</w:t>
       </w:r>
     </w:p>
     <w:p>
@@ -6630,6 +6666,16 @@
     <w:p>
       <w:r>
         <w:t xml:space="preserve">    previous.update(status=status,checked_at=time.time())</w:t>
+      </w:r>
+    </w:p>
+    <w:p>
+      <w:r>
+        <w:t xml:space="preserve">    previous.pop('check_error',None)</w:t>
+      </w:r>
+    </w:p>
+    <w:p>
+      <w:r>
+        <w:t xml:space="preserve">    if error:previous['check_error']=str(error)</w:t>
       </w:r>
     </w:p>
     <w:p>
@@ -8083,6 +8129,16 @@
     </w:p>
     <w:p>
       <w:r>
+        <w:t xml:space="preserve">        except Exception as error:</w:t>
+      </w:r>
+    </w:p>
+    <w:p>
+      <w:r>
+        <w:t xml:space="preserve">            auth_state('unknown',error)</w:t>
+      </w:r>
+    </w:p>
+    <w:p>
+      <w:r>
         <w:t xml:space="preserve">    elif args.command=='delete':</w:t>
       </w:r>
     </w:p>
@@ -8098,7 +8154,67 @@
     </w:p>
     <w:p>
       <w:r>
-        <w:t xml:space="preserve">    else:login(ui=args.command=='login-ui')</w:t>
+        <w:t xml:space="preserve">    else:</w:t>
+      </w:r>
+    </w:p>
+    <w:p>
+      <w:r>
+        <w:t xml:space="preserve">        from reader import save_json</w:t>
+      </w:r>
+    </w:p>
+    <w:p>
+      <w:r>
+        <w:t xml:space="preserve">        result=ROOT/'work/qianwen-login-result.json'</w:t>
+      </w:r>
+    </w:p>
+    <w:p>
+      <w:r>
+        <w:t xml:space="preserve">        save_json(result,{'status':'opening','at':time.time()})</w:t>
+      </w:r>
+    </w:p>
+    <w:p>
+      <w:r>
+        <w:t xml:space="preserve">        try:</w:t>
+      </w:r>
+    </w:p>
+    <w:p>
+      <w:r>
+        <w:t xml:space="preserve">            login(ui=args.command=='login-ui')</w:t>
+      </w:r>
+    </w:p>
+    <w:p>
+      <w:r>
+        <w:t xml:space="preserve">            save_json(result,{'status':'closed','at':time.time()})</w:t>
+      </w:r>
+    </w:p>
+    <w:p>
+      <w:r>
+        <w:t xml:space="preserve">        except Exception as error:</w:t>
+      </w:r>
+    </w:p>
+    <w:p>
+      <w:r>
+        <w:t xml:space="preserve">            message=str(error)</w:t>
+      </w:r>
+    </w:p>
+    <w:p>
+      <w:r>
+        <w:t xml:space="preserve">            if '浏览器正在使用中' in message:</w:t>
+      </w:r>
+    </w:p>
+    <w:p>
+      <w:r>
+        <w:t xml:space="preserve">                message='千问浏览器被更新前启动的任务或登录窗口占用，请等待该任务结束或关闭登录窗口后再试。'</w:t>
+      </w:r>
+    </w:p>
+    <w:p>
+      <w:r>
+        <w:t xml:space="preserve">            save_json(result,{'status':'failed','error':message,'at':time.time()})</w:t>
+      </w:r>
+    </w:p>
+    <w:p>
+      <w:r>
+        <w:t xml:space="preserve">            raise</w:t>
       </w:r>
     </w:p>
     <w:p>
@@ -12142,6 +12258,97 @@
         <w:t xml:space="preserve">   self.assertFalse(browser_busy('/unused'))</w:t>
       </w:r>
     </w:p>
+    <w:p/>
+    <w:p>
+      <w:r>
+        <w:t>class LoginDiagnosticsTests(unittest.TestCase):</w:t>
+      </w:r>
+    </w:p>
+    <w:p>
+      <w:r>
+        <w:t xml:space="preserve"> def test_endpoint_explicitly_bypasses_proxy(self):</w:t>
+      </w:r>
+    </w:p>
+    <w:p>
+      <w:r>
+        <w:t xml:space="preserve">  from browser_service import endpoint</w:t>
+      </w:r>
+    </w:p>
+    <w:p>
+      <w:r>
+        <w:t xml:space="preserve">  import json</w:t>
+      </w:r>
+    </w:p>
+    <w:p>
+      <w:r>
+        <w:t xml:space="preserve">  response=Mock();response.__enter__=Mock(return_value=response);response.__exit__=Mock(return_value=False)</w:t>
+      </w:r>
+    </w:p>
+    <w:p>
+      <w:r>
+        <w:t xml:space="preserve">  response.read.return_value=json.dumps({'webSocketDebuggerUrl':'ws://127.0.0.1/test'}).encode()</w:t>
+      </w:r>
+    </w:p>
+    <w:p>
+      <w:r>
+        <w:t xml:space="preserve">  with patch('urllib.request.ProxyHandler') as proxy,patch('urllib.request.build_opener') as opener:</w:t>
+      </w:r>
+    </w:p>
+    <w:p>
+      <w:r>
+        <w:t xml:space="preserve">   opener.return_value.open.return_value=response</w:t>
+      </w:r>
+    </w:p>
+    <w:p>
+      <w:r>
+        <w:t xml:space="preserve">   self.assertEqual(endpoint(),'ws://127.0.0.1/test');proxy.assert_called_once_with({})</w:t>
+      </w:r>
+    </w:p>
+    <w:p>
+      <w:r>
+        <w:t xml:space="preserve"> def test_login_failure_surfaces_actual_busy_reason(self):</w:t>
+      </w:r>
+    </w:p>
+    <w:p>
+      <w:r>
+        <w:t xml:space="preserve">  import app,tempfile,json,time</w:t>
+      </w:r>
+    </w:p>
+    <w:p>
+      <w:r>
+        <w:t xml:space="preserve">  from pathlib import Path</w:t>
+      </w:r>
+    </w:p>
+    <w:p>
+      <w:r>
+        <w:t xml:space="preserve">  with tempfile.TemporaryDirectory() as tmp:</w:t>
+      </w:r>
+    </w:p>
+    <w:p>
+      <w:r>
+        <w:t xml:space="preserve">   work=Path(tmp);(work/'qianwen-auth.json').write_text('{}')</w:t>
+      </w:r>
+    </w:p>
+    <w:p>
+      <w:r>
+        <w:t xml:space="preserve">   (work/'qianwen-login-result.json').write_text(json.dumps({'error':'旧任务占用浏览器'}))</w:t>
+      </w:r>
+    </w:p>
+    <w:p>
+      <w:r>
+        <w:t xml:space="preserve">   process=Mock();process.poll.return_value=1</w:t>
+      </w:r>
+    </w:p>
+    <w:p>
+      <w:r>
+        <w:t xml:space="preserve">   with patch.object(app,'WORK',work),patch.object(app,'login_process',process),patch.object(app,'auth_check_started',time.time()),patch.object(app,'list_jobs',return_value=[]):</w:t>
+      </w:r>
+    </w:p>
+    <w:p>
+      <w:r>
+        <w:t xml:space="preserve">    self.assertEqual(app.login_status()['error'],'旧任务占用浏览器')</w:t>
+      </w:r>
+    </w:p>
     <w:p>
       <w:r>
         <w:t>```</w:t>
@@ -15990,12 +16197,12 @@
     </w:p>
     <w:p>
       <w:r>
-        <w:t xml:space="preserve">  "app.py": "3960dbac40c9108b3dd8cc5bc027ef448b5d39a1a6bb0676c3083cca82352dcc",</w:t>
-      </w:r>
-    </w:p>
-    <w:p>
-      <w:r>
-        <w:t xml:space="preserve">  "browser_service.py": "084ef33bb8cceb116a3e1348fa784c1d8fe70cc40fb2d0797c5db80e7163fa8a",</w:t>
+        <w:t xml:space="preserve">  "app.py": "fb5a181bb84116aea8991ae65fb0797776c3c3416607db35172a6470ad5f982a",</w:t>
+      </w:r>
+    </w:p>
+    <w:p>
+      <w:r>
+        <w:t xml:space="preserve">  "browser_service.py": "71726c36176c2951b12897c626953f333d229d035f318622cf9202d93687f9f5",</w:t>
       </w:r>
     </w:p>
     <w:p>
@@ -16015,7 +16222,7 @@
     </w:p>
     <w:p>
       <w:r>
-        <w:t xml:space="preserve">  "index.html": "0adbe564abf3fbbbd5165f4eb3d3887b0ad032ba6d6b7c21e3317afa26a5ec3e",</w:t>
+        <w:t xml:space="preserve">  "index.html": "99dd5c2431e48292b17c95f7053b0f15b1556ec3a5bd1a71dacd7595fb25ba3e",</w:t>
       </w:r>
     </w:p>
     <w:p>
@@ -16045,7 +16252,7 @@
     </w:p>
     <w:p>
       <w:r>
-        <w:t xml:space="preserve">  "qianwen_browser.py": "8a6009e3db01f75702ceac7be0ef71e7cdb76ac01abc7233900da572065e79bc",</w:t>
+        <w:t xml:space="preserve">  "qianwen_browser.py": "355f4a0a38332846e3c9ab36cd3dcf54977260d7e6a8623f0a1340cb9449a1f5",</w:t>
       </w:r>
     </w:p>
     <w:p>
@@ -16090,7 +16297,7 @@
     </w:p>
     <w:p>
       <w:r>
-        <w:t xml:space="preserve">  "test_browser_service.py": "cc64d15089f3dc1bc1ed35cb74eb6052b9271f9c83550b752d651192572c7f7c",</w:t>
+        <w:t xml:space="preserve">  "test_browser_service.py": "fa30cf65671ef804c0fee82b0cecced1a3748bbc9f2209cde584ceb8aa49a2c3",</w:t>
       </w:r>
     </w:p>
     <w:p>

</xml_diff>

<commit_message>
Retry Bilibili public playback pages and verify episode before download
</commit_message>
<xml_diff>
--- a/安装与使用指南.docx
+++ b/安装与使用指南.docx
@@ -639,6 +639,12 @@
     </w:p>
     <w:p/>
     <w:p>
+      <w:r>
+        <w:t>补充下载重试：B站播放接口只有验证信息时，有限重读公开播放器网页，核对 cid 后提取已有媒体地址，避免误取其他分集。已验证两条失败样例的完整音频下载和解码；这不代表千问转写已完成。</w:t>
+      </w:r>
+    </w:p>
+    <w:p/>
+    <w:p>
       <w:pPr>
         <w:pStyle w:val="Heading1"/>
       </w:pPr>
@@ -2889,7 +2895,12 @@
     </w:p>
     <w:p>
       <w:r>
-        <w:t>"""Preserve public page formats when the optional API returns only a voucher."""</w:t>
+        <w:t>"""Retry public page playback data when optional Bilibili API has no streams."""</w:t>
+      </w:r>
+    </w:p>
+    <w:p>
+      <w:r>
+        <w:t>from urllib.parse import urlsplit,parse_qs,urlencode</w:t>
       </w:r>
     </w:p>
     <w:p>
@@ -2914,6 +2925,21 @@
     </w:p>
     <w:p>
       <w:r>
+        <w:t xml:space="preserve">    def _real_extract(self,url):</w:t>
+      </w:r>
+    </w:p>
+    <w:p>
+      <w:r>
+        <w:t xml:space="preserve">        self.source_url=url</w:t>
+      </w:r>
+    </w:p>
+    <w:p>
+      <w:r>
+        <w:t xml:space="preserve">        return super()._real_extract(url)</w:t>
+      </w:r>
+    </w:p>
+    <w:p>
+      <w:r>
         <w:t xml:space="preserve">    def _download_playinfo(self,*args,**kwargs):</w:t>
       </w:r>
     </w:p>
@@ -2929,12 +2955,67 @@
     </w:p>
     <w:p>
       <w:r>
-        <w:t xml:space="preserve">            self.report_warning('B站接口要求访问验证，尝试保留公开网页中已有的播放地址。')</w:t>
-      </w:r>
-    </w:p>
-    <w:p>
-      <w:r>
-        <w:t xml:space="preserve">            return None</w:t>
+        <w:t xml:space="preserve">            self.report_warning('B站播放接口没有返回媒体地址，重新读取公开网页中的播放器数据。')</w:t>
+      </w:r>
+    </w:p>
+    <w:p>
+      <w:r>
+        <w:t xml:space="preserve">            bvid,cid=args[:2]</w:t>
+      </w:r>
+    </w:p>
+    <w:p>
+      <w:r>
+        <w:t xml:space="preserve">            source=getattr(self,'source_url','https://www.bilibili.com/video/'+bvid+'/')</w:t>
+      </w:r>
+    </w:p>
+    <w:p>
+      <w:r>
+        <w:t xml:space="preserve">            part=parse_qs(urlsplit(source).query).get('p',['1'])[0]</w:t>
+      </w:r>
+    </w:p>
+    <w:p>
+      <w:r>
+        <w:t xml:space="preserve">            for extra in ({'p':part,'t':'0'},{'p':part}):</w:t>
+      </w:r>
+    </w:p>
+    <w:p>
+      <w:r>
+        <w:t xml:space="preserve">                page=self._download_webpage('https://www.bilibili.com/video/'+bvid+'/?'+urlencode(extra),bvid,fatal=False)</w:t>
+      </w:r>
+    </w:p>
+    <w:p>
+      <w:r>
+        <w:t xml:space="preserve">                if not page:continue</w:t>
+      </w:r>
+    </w:p>
+    <w:p>
+      <w:r>
+        <w:t xml:space="preserve">                state=self._search_json(r'window\.__INITIAL_STATE__\s*=',page,'page state',bvid,default={})</w:t>
+      </w:r>
+    </w:p>
+    <w:p>
+      <w:r>
+        <w:t xml:space="preserve">                selected=state.get('videoData',{}).get('cid')</w:t>
+      </w:r>
+    </w:p>
+    <w:p>
+      <w:r>
+        <w:t xml:space="preserve">                if str(selected)!=str(cid):continue # Never substitute a different episode.</w:t>
+      </w:r>
+    </w:p>
+    <w:p>
+      <w:r>
+        <w:t xml:space="preserve">                play=self._search_json(r'window\.__playinfo__\s*=',page,'page playback',bvid,default={}).get('data',{})</w:t>
+      </w:r>
+    </w:p>
+    <w:p>
+      <w:r>
+        <w:t xml:space="preserve">                if self.extract_formats(play):return play</w:t>
+      </w:r>
+    </w:p>
+    <w:p>
+      <w:r>
+        <w:t xml:space="preserve">            return None # Preserve initial-page data if these pages also lack streams.</w:t>
       </w:r>
     </w:p>
     <w:p>
@@ -12640,7 +12721,7 @@
     </w:p>
     <w:p>
       <w:r>
-        <w:t xml:space="preserve">  with patch('yt_dlp.extractor.bilibili.BiliBiliIE._download_playinfo',return_value={'v_voucher':'test'}),patch.object(ie,'extract_formats',return_value=[]),patch.object(ie,'report_warning'):</w:t>
+        <w:t xml:space="preserve">  with patch('yt_dlp.extractor.bilibili.BiliBiliIE._download_playinfo',return_value={'v_voucher':'test'}),patch.object(ie,'extract_formats',return_value=[]),patch.object(ie,'report_warning'),patch.object(ie,'_download_webpage',return_value=None):</w:t>
       </w:r>
     </w:p>
     <w:p>
@@ -12676,6 +12757,47 @@
     <w:p>
       <w:r>
         <w:t xml:space="preserve">  with patch('yt_dlp.extractor.bilibili.BiliBiliIE._download_playinfo',return_value=info):self.assertIs(ie._download_playinfo('video','cid'),info)</w:t>
+      </w:r>
+    </w:p>
+    <w:p/>
+    <w:p>
+      <w:r>
+        <w:t xml:space="preserve"> def test_matching_page_streams_used(self):</w:t>
+      </w:r>
+    </w:p>
+    <w:p>
+      <w:r>
+        <w:t xml:space="preserve">  ie=BiliBiliPageFallbackIE();api={'v_voucher':'test'};play={'dash':{'audio':[{'id':1}]}}</w:t>
+      </w:r>
+    </w:p>
+    <w:p>
+      <w:r>
+        <w:t xml:space="preserve">  with patch('yt_dlp.extractor.bilibili.BiliBiliIE._download_playinfo',return_value=api),patch.object(ie,'extract_formats',side_effect=lambda data: [] if data==api else [{'url':'media'}]),patch.object(ie,'report_warning'),patch.object(ie,'_download_webpage',return_value='page'),patch.object(ie,'_search_json',side_effect=[{'videoData':{'cid':123}},{'data':play}]):</w:t>
+      </w:r>
+    </w:p>
+    <w:p>
+      <w:r>
+        <w:t xml:space="preserve">   self.assertIs(ie._download_playinfo('BVtest',123,fatal=False),play)</w:t>
+      </w:r>
+    </w:p>
+    <w:p>
+      <w:r>
+        <w:t xml:space="preserve"> def test_other_episode_not_used(self):</w:t>
+      </w:r>
+    </w:p>
+    <w:p>
+      <w:r>
+        <w:t xml:space="preserve">  ie=BiliBiliPageFallbackIE()</w:t>
+      </w:r>
+    </w:p>
+    <w:p>
+      <w:r>
+        <w:t xml:space="preserve">  with patch('yt_dlp.extractor.bilibili.BiliBiliIE._download_playinfo',return_value={'v_voucher':'test'}),patch.object(ie,'extract_formats',return_value=[]),patch.object(ie,'report_warning'),patch.object(ie,'_download_webpage',return_value='page'),patch.object(ie,'_search_json',return_value={'videoData':{'cid':999}}):</w:t>
+      </w:r>
+    </w:p>
+    <w:p>
+      <w:r>
+        <w:t xml:space="preserve">   self.assertIsNone(ie._download_playinfo('BVtest',123,fatal=False))</w:t>
       </w:r>
     </w:p>
     <w:p>
@@ -17029,7 +17151,7 @@
     </w:p>
     <w:p>
       <w:r>
-        <w:t xml:space="preserve">  "bilibili_download.py": "610f783140c50a447a8fbfc68960cf37fbaead94fe9a8ffb2e205f40f1a37173",</w:t>
+        <w:t xml:space="preserve">  "bilibili_download.py": "286ed2197bb0763f3f060aea40075d0cb4a46c1252ef19a0343358e00dd40f5d",</w:t>
       </w:r>
     </w:p>
     <w:p>
@@ -17134,7 +17256,7 @@
     </w:p>
     <w:p>
       <w:r>
-        <w:t xml:space="preserve">  "test_bilibili_download.py": "4f7d34d63bc60af4113c1f9f4ca824cf758f332ac3929f49def966d0b02c3546",</w:t>
+        <w:t xml:space="preserve">  "test_bilibili_download.py": "7d880288610b8e78afb0927f074275b737b143b5b81750c4caf51d99ebe7dae1",</w:t>
       </w:r>
     </w:p>
     <w:p>

</xml_diff>

<commit_message>
Use supplied play-and-note logo for page heading and native Mac app
</commit_message>
<xml_diff>
--- a/安装与使用指南.docx
+++ b/安装与使用指南.docx
@@ -665,6 +665,12 @@
     </w:p>
     <w:p/>
     <w:p>
+      <w:r>
+        <w:t>工具Logo采用蓝色圆角底板、红色播放符号与黄色便签图案；网页标题左侧和Mac独立应用Dock共用该图案。更新Mac图标后退出并重新打开独立应用即可加载，后台任务继续运行。</w:t>
+      </w:r>
+    </w:p>
+    <w:p/>
+    <w:p>
       <w:pPr>
         <w:pStyle w:val="Heading1"/>
       </w:pPr>
@@ -4395,12 +4401,12 @@
     </w:p>
     <w:p>
       <w:r>
-        <w:t>#url::placeholder{color:#757575;opacity:1}#upload-zone{background:#fff;color:#757575;font:inherit;text-align:center;border:1px dashed #c6d1ca;border-radius:8px;padding:12px 14px;cursor:pointer;flex-basis:100%;box-sizing:border-box}#file-name{display:block;font-size:14px;color:#000}#form input[type=url]{order:0}#form button{order:1}#upload-zone{order:2}#qianwen-login{background:#004B93;border-color:#004B93}#qianwen-login:hover{background:#003B75}#form button{background:#D65A00;border-color:#D65A00}#form button:hover{background:#B94D00}.retry-task{background:#FFD54F;border-color:#FFD54F;color:#24322d}.retry-task:hover{background:#FFC928;border-color:#FFC928}#runtime-show{background:#169bb4;border-color:#169bb4}#runtime-show:hover{background:#127e93}#runtime-dialog{width:min(850px,90vw);max-height:85vh;border:1px solid #c6d1ca;border-radius:12px;overflow:auto}#runtime-dialog img{max-width:100%;border:1px solid #ddd}#runtime-dialog::backdrop{background:#0005}&lt;/style&gt;</w:t>
-      </w:r>
-    </w:p>
-    <w:p>
-      <w:r>
-        <w:t>&lt;h1&gt;网页视频转语音识别文字稿（由千问提供支持） &lt;button type="button" id="qianwen-login"&gt;正在验证登录&lt;/button&gt; &lt;button type="button" id="runtime-show"&gt;显示任务状态&lt;/button&gt;&lt;/h1&gt;</w:t>
+        <w:t>#url::placeholder{color:#757575;opacity:1}#upload-zone{background:#fff;color:#757575;font:inherit;text-align:center;border:1px dashed #c6d1ca;border-radius:8px;padding:12px 14px;cursor:pointer;flex-basis:100%;box-sizing:border-box}#file-name{display:block;font-size:14px;color:#000}#form input[type=url]{order:0}#form button{order:1}#upload-zone{order:2}#qianwen-login{background:#004B93;border-color:#004B93}#qianwen-login:hover{background:#003B75}#form button{background:#D65A00;border-color:#D65A00}#form button:hover{background:#B94D00}.retry-task{background:#FFD54F;border-color:#FFD54F;color:#24322d}.retry-task:hover{background:#FFC928;border-color:#FFC928}#runtime-show{background:#169bb4;border-color:#169bb4}#runtime-show:hover{background:#127e93}#runtime-dialog{width:min(850px,90vw);max-height:85vh;border:1px solid #c6d1ca;border-radius:12px;overflow:auto}#runtime-dialog img{max-width:100%;border:1px solid #ddd}#runtime-dialog::backdrop{background:#0005}.tool-logo{width:52px;height:52px;object-fit:contain;vertical-align:middle;margin-right:10px}h1{line-height:1.5}@media(max-width:600px){.tool-logo{width:44px;height:44px}}&lt;/style&gt;</w:t>
+      </w:r>
+    </w:p>
+    <w:p>
+      <w:r>
+        <w:t>&lt;h1&gt;&lt;img class="tool-logo" src="/icons/app-icon.svg" alt="工具Logo"&gt;网页视频转语音识别文字稿（由千问提供支持） &lt;button type="button" id="qianwen-login"&gt;正在验证登录&lt;/button&gt; &lt;button type="button" id="runtime-show"&gt;显示任务状态&lt;/button&gt;&lt;/h1&gt;</w:t>
       </w:r>
     </w:p>
     <w:p>
@@ -17837,7 +17843,7 @@
     </w:p>
     <w:p>
       <w:r>
-        <w:t xml:space="preserve">  "index.html": "0402fbcde032058dc76f4d71813fbf65cff13d8b1b48113333aae0be76b473aa",</w:t>
+        <w:t xml:space="preserve">  "index.html": "4149c178307ea3a78548836f004e7198e15fc0c2294908f1ec309b1f4efe0671",</w:t>
       </w:r>
     </w:p>
     <w:p>

</xml_diff>

<commit_message>
Replace app icons with supplied MacAppIcon package and move status actions below heading
</commit_message>
<xml_diff>
--- a/安装与使用指南.docx
+++ b/安装与使用指南.docx
@@ -671,6 +671,12 @@
     </w:p>
     <w:p/>
     <w:p>
+      <w:r>
+        <w:t>最新图标原始包：[MacAppIcon.zip](icons/MacAppIcon.zip)，包含 macOS ICNS 与各尺寸 PNG。网页标志高度为标题字号的 1.5 倍，与标题第一行底部对齐；登录状态和显示任务状态按钮位于第二行。</w:t>
+      </w:r>
+    </w:p>
+    <w:p/>
+    <w:p>
       <w:pPr>
         <w:pStyle w:val="Heading1"/>
       </w:pPr>
@@ -4401,12 +4407,17 @@
     </w:p>
     <w:p>
       <w:r>
-        <w:t>#url::placeholder{color:#757575;opacity:1}#upload-zone{background:#fff;color:#757575;font:inherit;text-align:center;border:1px dashed #c6d1ca;border-radius:8px;padding:12px 14px;cursor:pointer;flex-basis:100%;box-sizing:border-box}#file-name{display:block;font-size:14px;color:#000}#form input[type=url]{order:0}#form button{order:1}#upload-zone{order:2}#qianwen-login{background:#004B93;border-color:#004B93}#qianwen-login:hover{background:#003B75}#form button{background:#D65A00;border-color:#D65A00}#form button:hover{background:#B94D00}.retry-task{background:#FFD54F;border-color:#FFD54F;color:#24322d}.retry-task:hover{background:#FFC928;border-color:#FFC928}#runtime-show{background:#169bb4;border-color:#169bb4}#runtime-show:hover{background:#127e93}#runtime-dialog{width:min(850px,90vw);max-height:85vh;border:1px solid #c6d1ca;border-radius:12px;overflow:auto}#runtime-dialog img{max-width:100%;border:1px solid #ddd}#runtime-dialog::backdrop{background:#0005}.tool-logo{width:52px;height:52px;object-fit:contain;vertical-align:middle;margin-right:10px}h1{line-height:1.5}@media(max-width:600px){.tool-logo{width:44px;height:44px}}&lt;/style&gt;</w:t>
-      </w:r>
-    </w:p>
-    <w:p>
-      <w:r>
-        <w:t>&lt;h1&gt;&lt;img class="tool-logo" src="/icons/app-icon.svg" alt="工具Logo"&gt;网页视频转语音识别文字稿（由千问提供支持） &lt;button type="button" id="qianwen-login"&gt;正在验证登录&lt;/button&gt; &lt;button type="button" id="runtime-show"&gt;显示任务状态&lt;/button&gt;&lt;/h1&gt;</w:t>
+        <w:t>#url::placeholder{color:#757575;opacity:1}#upload-zone{background:#fff;color:#757575;font:inherit;text-align:center;border:1px dashed #c6d1ca;border-radius:8px;padding:12px 14px;cursor:pointer;flex-basis:100%;box-sizing:border-box}#file-name{display:block;font-size:14px;color:#000}#form input[type=url]{order:0}#form button{order:1}#upload-zone{order:2}#qianwen-login{background:#004B93;border-color:#004B93}#qianwen-login:hover{background:#003B75}#form button{background:#D65A00;border-color:#D65A00}#form button:hover{background:#B94D00}.retry-task{background:#FFD54F;border-color:#FFD54F;color:#24322d}.retry-task:hover{background:#FFC928;border-color:#FFC928}#runtime-show{background:#169bb4;border-color:#169bb4}#runtime-show:hover{background:#127e93}#runtime-dialog{width:min(850px,90vw);max-height:85vh;border:1px solid #c6d1ca;border-radius:12px;overflow:auto}#runtime-dialog img{max-width:100%;border:1px solid #ddd}#runtime-dialog::backdrop{background:#0005}.tool-logo{width:1.5em;height:1.5em;object-fit:contain;flex:none;margin-right:10px;vertical-align:baseline}h1{display:flex;align-items:flex-start;line-height:1;margin-bottom:16px}.tool-title{padding-top:.5em;line-height:1}.title-actions{display:flex;gap:10px;flex-wrap:wrap;margin-bottom:24px}.title-actions button{font-size:14px;padding:6px 10px;font-weight:normal}&lt;/style&gt;</w:t>
+      </w:r>
+    </w:p>
+    <w:p>
+      <w:r>
+        <w:t>&lt;h1&gt;&lt;img class="tool-logo" src="/icons/app-icon.svg" alt="工具Logo"&gt;&lt;span class="tool-title"&gt;网页视频转语音识别文字稿（由千问提供支持）&lt;/span&gt;&lt;/h1&gt;</w:t>
+      </w:r>
+    </w:p>
+    <w:p>
+      <w:r>
+        <w:t>&lt;div class="title-actions"&gt;&lt;button type="button" id="qianwen-login"&gt;正在验证登录&lt;/button&gt; &lt;button type="button" id="runtime-show"&gt;显示任务状态&lt;/button&gt;&lt;/div&gt;</w:t>
       </w:r>
     </w:p>
     <w:p>
@@ -17843,7 +17854,7 @@
     </w:p>
     <w:p>
       <w:r>
-        <w:t xml:space="preserve">  "index.html": "4149c178307ea3a78548836f004e7198e15fc0c2294908f1ec309b1f4efe0671",</w:t>
+        <w:t xml:space="preserve">  "index.html": "39b799591b3167d305e79c46dad2405673d68c04df75d1c475e61286dbcb4aae",</w:t>
       </w:r>
     </w:p>
     <w:p>

</xml_diff>

<commit_message>
Enlarge heading logo and align visible artwork edges
</commit_message>
<xml_diff>
--- a/安装与使用指南.docx
+++ b/安装与使用指南.docx
@@ -672,7 +672,7 @@
     <w:p/>
     <w:p>
       <w:r>
-        <w:t>最新图标原始包：[MacAppIcon.zip](icons/MacAppIcon.zip)，包含 macOS ICNS 与各尺寸 PNG。网页标志高度为标题字号的 1.5 倍，与标题第一行底部对齐；登录状态和显示任务状态按钮位于第二行。</w:t>
+        <w:t>最新图标原始包：[MacAppIcon.zip](icons/MacAppIcon.zip)，包含 macOS ICNS 与各尺寸 PNG。网页标志高度为标题字号的 2.5 倍（以蓝色图案的可见边缘为准，补偿透明留白与阴影），与标题第一行底部对齐；登录状态和显示任务状态按钮位于第二行。</w:t>
       </w:r>
     </w:p>
     <w:p/>
@@ -4407,7 +4407,7 @@
     </w:p>
     <w:p>
       <w:r>
-        <w:t>#url::placeholder{color:#757575;opacity:1}#upload-zone{background:#fff;color:#757575;font:inherit;text-align:center;border:1px dashed #c6d1ca;border-radius:8px;padding:12px 14px;cursor:pointer;flex-basis:100%;box-sizing:border-box}#file-name{display:block;font-size:14px;color:#000}#form input[type=url]{order:0}#form button{order:1}#upload-zone{order:2}#qianwen-login{background:#004B93;border-color:#004B93}#qianwen-login:hover{background:#003B75}#form button{background:#D65A00;border-color:#D65A00}#form button:hover{background:#B94D00}.retry-task{background:#FFD54F;border-color:#FFD54F;color:#24322d}.retry-task:hover{background:#FFC928;border-color:#FFC928}#runtime-show{background:#169bb4;border-color:#169bb4}#runtime-show:hover{background:#127e93}#runtime-dialog{width:min(850px,90vw);max-height:85vh;border:1px solid #c6d1ca;border-radius:12px;overflow:auto}#runtime-dialog img{max-width:100%;border:1px solid #ddd}#runtime-dialog::backdrop{background:#0005}.tool-logo{width:1.5em;height:1.5em;object-fit:contain;flex:none;margin-right:10px;vertical-align:baseline}h1{display:flex;align-items:flex-start;line-height:1;margin-bottom:16px}.tool-title{padding-top:.5em;line-height:1}.title-actions{display:flex;gap:10px;flex-wrap:wrap;margin-bottom:24px}.title-actions button{font-size:14px;padding:6px 10px;font-weight:normal}&lt;/style&gt;</w:t>
+        <w:t>#url::placeholder{color:#757575;opacity:1}#upload-zone{background:#fff;color:#757575;font:inherit;text-align:center;border:1px dashed #c6d1ca;border-radius:8px;padding:12px 14px;cursor:pointer;flex-basis:100%;box-sizing:border-box}#file-name{display:block;font-size:14px;color:#000}#form input[type=url]{order:0}#form button{order:1}#upload-zone{order:2}#qianwen-login{background:#004B93;border-color:#004B93}#qianwen-login:hover{background:#003B75}#form button{background:#D65A00;border-color:#D65A00}#form button:hover{background:#B94D00}.retry-task{background:#FFD54F;border-color:#FFD54F;color:#24322d}.retry-task:hover{background:#FFC928;border-color:#FFC928}#runtime-show{background:#169bb4;border-color:#169bb4}#runtime-show:hover{background:#127e93}#runtime-dialog{width:min(850px,90vw);max-height:85vh;border:1px solid #c6d1ca;border-radius:12px;overflow:auto}#runtime-dialog img{max-width:100%;border:1px solid #ddd}#runtime-dialog::backdrop{background:#0005}.tool-logo{width:2.5em;height:2.5em;object-fit:contain;flex:none;margin-right:10px;vertical-align:baseline;transform:translate(-.154em,-.08em) scale(1.123);transform-origin:top left}h1{display:flex;align-items:flex-start;line-height:1;margin-bottom:16px}.tool-title{padding-top:1.5em;line-height:1}.title-actions{display:flex;gap:10px;flex-wrap:wrap;margin-bottom:24px}.title-actions button{font-size:14px;padding:6px 10px;font-weight:normal}&lt;/style&gt;</w:t>
       </w:r>
     </w:p>
     <w:p>
@@ -17854,7 +17854,7 @@
     </w:p>
     <w:p>
       <w:r>
-        <w:t xml:space="preserve">  "index.html": "39b799591b3167d305e79c46dad2405673d68c04df75d1c475e61286dbcb4aae",</w:t>
+        <w:t xml:space="preserve">  "index.html": "6c084e35abfdfbfc35d5e926883ecb152ac19d147ddcd9a08b0cf6241f644326",</w:t>
       </w:r>
     </w:p>
     <w:p>

</xml_diff>

<commit_message>
Increase heading size and version persistent native icon resource
</commit_message>
<xml_diff>
--- a/安装与使用指南.docx
+++ b/安装与使用指南.docx
@@ -4407,7 +4407,7 @@
     </w:p>
     <w:p>
       <w:r>
-        <w:t>#url::placeholder{color:#757575;opacity:1}#upload-zone{background:#fff;color:#757575;font:inherit;text-align:center;border:1px dashed #c6d1ca;border-radius:8px;padding:12px 14px;cursor:pointer;flex-basis:100%;box-sizing:border-box}#file-name{display:block;font-size:14px;color:#000}#form input[type=url]{order:0}#form button{order:1}#upload-zone{order:2}#qianwen-login{background:#004B93;border-color:#004B93}#qianwen-login:hover{background:#003B75}#form button{background:#D65A00;border-color:#D65A00}#form button:hover{background:#B94D00}.retry-task{background:#FFD54F;border-color:#FFD54F;color:#24322d}.retry-task:hover{background:#FFC928;border-color:#FFC928}#runtime-show{background:#169bb4;border-color:#169bb4}#runtime-show:hover{background:#127e93}#runtime-dialog{width:min(850px,90vw);max-height:85vh;border:1px solid #c6d1ca;border-radius:12px;overflow:auto}#runtime-dialog img{max-width:100%;border:1px solid #ddd}#runtime-dialog::backdrop{background:#0005}.tool-logo{width:2.5em;height:2.5em;object-fit:contain;flex:none;margin-right:10px;vertical-align:baseline;transform:translate(-.154em,-.08em) scale(1.123);transform-origin:top left}h1{display:flex;align-items:flex-start;line-height:1;margin-bottom:16px}.tool-title{padding-top:1.5em;line-height:1}.title-actions{display:flex;gap:10px;flex-wrap:wrap;margin-bottom:24px}.title-actions button{font-size:14px;padding:6px 10px;font-weight:normal}&lt;/style&gt;</w:t>
+        <w:t>#url::placeholder{color:#757575;opacity:1}#upload-zone{background:#fff;color:#757575;font:inherit;text-align:center;border:1px dashed #c6d1ca;border-radius:8px;padding:12px 14px;cursor:pointer;flex-basis:100%;box-sizing:border-box}#file-name{display:block;font-size:14px;color:#000}#form input[type=url]{order:0}#form button{order:1}#upload-zone{order:2}#qianwen-login{background:#004B93;border-color:#004B93}#qianwen-login:hover{background:#003B75}#form button{background:#D65A00;border-color:#D65A00}#form button:hover{background:#B94D00}.retry-task{background:#FFD54F;border-color:#FFD54F;color:#24322d}.retry-task:hover{background:#FFC928;border-color:#FFC928}#runtime-show{background:#169bb4;border-color:#169bb4}#runtime-show:hover{background:#127e93}#runtime-dialog{width:min(850px,90vw);max-height:85vh;border:1px solid #c6d1ca;border-radius:12px;overflow:auto}#runtime-dialog img{max-width:100%;border:1px solid #ddd}#runtime-dialog::backdrop{background:#0005}.tool-logo{width:80px;height:80px;object-fit:contain;flex:none;margin-right:10px;vertical-align:baseline;transform:translate(-4.928px,1px) scale(1.123);transform-origin:top left}h1{display:flex;align-items:flex-start;line-height:1;margin-bottom:16px}.tool-title{font-size:60px;padding-top:20px;line-height:1}.title-actions{display:flex;gap:10px;flex-wrap:wrap;margin-bottom:24px}.title-actions button{font-size:14px;padding:6px 10px;font-weight:normal}&lt;/style&gt;</w:t>
       </w:r>
     </w:p>
     <w:p>
@@ -17854,7 +17854,7 @@
     </w:p>
     <w:p>
       <w:r>
-        <w:t xml:space="preserve">  "index.html": "6c084e35abfdfbfc35d5e926883ecb152ac19d147ddcd9a08b0cf6241f644326",</w:t>
+        <w:t xml:space="preserve">  "index.html": "9369f7485233bdb3ee990a6dcbe9be83f48347841eb78f4b344f8d877fb02a38",</w:t>
       </w:r>
     </w:p>
     <w:p>

</xml_diff>

<commit_message>
Split title into two lines and persist matching native Dock icon
</commit_message>
<xml_diff>
--- a/安装与使用指南.docx
+++ b/安装与使用指南.docx
@@ -4407,12 +4407,12 @@
     </w:p>
     <w:p>
       <w:r>
-        <w:t>#url::placeholder{color:#757575;opacity:1}#upload-zone{background:#fff;color:#757575;font:inherit;text-align:center;border:1px dashed #c6d1ca;border-radius:8px;padding:12px 14px;cursor:pointer;flex-basis:100%;box-sizing:border-box}#file-name{display:block;font-size:14px;color:#000}#form input[type=url]{order:0}#form button{order:1}#upload-zone{order:2}#qianwen-login{background:#004B93;border-color:#004B93}#qianwen-login:hover{background:#003B75}#form button{background:#D65A00;border-color:#D65A00}#form button:hover{background:#B94D00}.retry-task{background:#FFD54F;border-color:#FFD54F;color:#24322d}.retry-task:hover{background:#FFC928;border-color:#FFC928}#runtime-show{background:#169bb4;border-color:#169bb4}#runtime-show:hover{background:#127e93}#runtime-dialog{width:min(850px,90vw);max-height:85vh;border:1px solid #c6d1ca;border-radius:12px;overflow:auto}#runtime-dialog img{max-width:100%;border:1px solid #ddd}#runtime-dialog::backdrop{background:#0005}.tool-logo{width:80px;height:80px;object-fit:contain;flex:none;margin-right:10px;vertical-align:baseline;transform:translate(-4.928px,1px) scale(1.123);transform-origin:top left}h1{display:flex;align-items:flex-start;line-height:1;margin-bottom:16px}.tool-title{font-size:60px;padding-top:20px;line-height:1}.title-actions{display:flex;gap:10px;flex-wrap:wrap;margin-bottom:24px}.title-actions button{font-size:14px;padding:6px 10px;font-weight:normal}&lt;/style&gt;</w:t>
-      </w:r>
-    </w:p>
-    <w:p>
-      <w:r>
-        <w:t>&lt;h1&gt;&lt;img class="tool-logo" src="/icons/app-icon.svg" alt="工具Logo"&gt;&lt;span class="tool-title"&gt;网页视频转语音识别文字稿（由千问提供支持）&lt;/span&gt;&lt;/h1&gt;</w:t>
+        <w:t>#url::placeholder{color:#757575;opacity:1}#upload-zone{background:#fff;color:#757575;font:inherit;text-align:center;border:1px dashed #c6d1ca;border-radius:8px;padding:12px 14px;cursor:pointer;flex-basis:100%;box-sizing:border-box}#file-name{display:block;font-size:14px;color:#000}#form input[type=url]{order:0}#form button{order:1}#upload-zone{order:2}#qianwen-login{background:#004B93;border-color:#004B93}#qianwen-login:hover{background:#003B75}#form button{background:#D65A00;border-color:#D65A00}#form button:hover{background:#B94D00}.retry-task{background:#FFD54F;border-color:#FFD54F;color:#24322d}.retry-task:hover{background:#FFC928;border-color:#FFC928}#runtime-show{background:#169bb4;border-color:#169bb4}#runtime-show:hover{background:#127e93}#runtime-dialog{width:min(850px,90vw);max-height:85vh;border:1px solid #c6d1ca;border-radius:12px;overflow:auto}#runtime-dialog img{max-width:100%;border:1px solid #ddd}#runtime-dialog::backdrop{background:#0005}.tool-logo{width:136px;height:136px;object-fit:contain;flex:none;margin-right:16px;transform:translate(-7.44px,-4px);transform-origin:top left}h1{display:flex;align-items:flex-start;line-height:1;margin-bottom:16px}.tool-title{font-size:60px;line-height:1;font-weight:inherit;min-width:0}.tool-title-main,.tool-title-support{display:block}.tool-title-support{font-size:56px;margin-top:8px}@media(max-width:800px){.tool-title{font-size:clamp(20px,5.5vw,60px)}.tool-title-support{font-size:.9333em;margin-top:.1333em}.tool-logo{width:2.1667em;height:2.1667em}h1{font-size:clamp(20px,5.5vw,60px)}}.title-actions{display:flex;gap:10px;flex-wrap:wrap;margin-bottom:24px}.title-actions button{font-size:14px;padding:6px 10px;font-weight:normal}&lt;/style&gt;</w:t>
+      </w:r>
+    </w:p>
+    <w:p>
+      <w:r>
+        <w:t>&lt;h1&gt;&lt;img class="tool-logo" src="/icons/app-icon.svg" alt="工具Logo"&gt;&lt;span class="tool-title"&gt;&lt;span class="tool-title-main"&gt;网页视频转语音识别文字稿&lt;/span&gt;&lt;span class="tool-title-support"&gt;（由千问提供支持）&lt;/span&gt;&lt;/span&gt;&lt;/h1&gt;</w:t>
       </w:r>
     </w:p>
     <w:p>
@@ -17854,7 +17854,7 @@
     </w:p>
     <w:p>
       <w:r>
-        <w:t xml:space="preserve">  "index.html": "9369f7485233bdb3ee990a6dcbe9be83f48347841eb78f4b344f8d877fb02a38",</w:t>
+        <w:t xml:space="preserve">  "index.html": "cbcc5edc94d0cf04cd0bcc54394b5865f7c7bf81007a28e391a49148d158f61c",</w:t>
       </w:r>
     </w:p>
     <w:p>

</xml_diff>

<commit_message>
Refresh bookmark favicon and align smaller support title visually
</commit_message>
<xml_diff>
--- a/安装与使用指南.docx
+++ b/安装与使用指南.docx
@@ -4377,7 +4377,7 @@
     </w:p>
     <w:p>
       <w:r>
-        <w:t>&lt;link rel="icon" type="image/svg+xml" href="/icons/app-icon.svg"&gt;</w:t>
+        <w:t>&lt;link rel="icon" type="image/png" sizes="32x32" href="data:image/png;base64,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"&gt;</w:t>
       </w:r>
     </w:p>
     <w:p>
@@ -4407,7 +4407,7 @@
     </w:p>
     <w:p>
       <w:r>
-        <w:t>#url::placeholder{color:#757575;opacity:1}#upload-zone{background:#fff;color:#757575;font:inherit;text-align:center;border:1px dashed #c6d1ca;border-radius:8px;padding:12px 14px;cursor:pointer;flex-basis:100%;box-sizing:border-box}#file-name{display:block;font-size:14px;color:#000}#form input[type=url]{order:0}#form button{order:1}#upload-zone{order:2}#qianwen-login{background:#004B93;border-color:#004B93}#qianwen-login:hover{background:#003B75}#form button{background:#D65A00;border-color:#D65A00}#form button:hover{background:#B94D00}.retry-task{background:#FFD54F;border-color:#FFD54F;color:#24322d}.retry-task:hover{background:#FFC928;border-color:#FFC928}#runtime-show{background:#169bb4;border-color:#169bb4}#runtime-show:hover{background:#127e93}#runtime-dialog{width:min(850px,90vw);max-height:85vh;border:1px solid #c6d1ca;border-radius:12px;overflow:auto}#runtime-dialog img{max-width:100%;border:1px solid #ddd}#runtime-dialog::backdrop{background:#0005}.tool-logo{width:136px;height:136px;object-fit:contain;flex:none;margin-right:16px;transform:translate(-7.44px,-4px);transform-origin:top left}h1{display:flex;align-items:flex-start;line-height:1;margin-bottom:16px}.tool-title{font-size:60px;line-height:1;font-weight:inherit;min-width:0}.tool-title-main,.tool-title-support{display:block}.tool-title-support{font-size:56px;margin-top:8px}@media(max-width:800px){.tool-title{font-size:clamp(20px,5.5vw,60px)}.tool-title-support{font-size:.9333em;margin-top:.1333em}.tool-logo{width:2.1667em;height:2.1667em}h1{font-size:clamp(20px,5.5vw,60px)}}.title-actions{display:flex;gap:10px;flex-wrap:wrap;margin-bottom:24px}.title-actions button{font-size:14px;padding:6px 10px;font-weight:normal}&lt;/style&gt;</w:t>
+        <w:t>#url::placeholder{color:#757575;opacity:1}#upload-zone{background:#fff;color:#757575;font:inherit;text-align:center;border:1px dashed #c6d1ca;border-radius:8px;padding:12px 14px;cursor:pointer;flex-basis:100%;box-sizing:border-box}#file-name{display:block;font-size:14px;color:#000}#form input[type=url]{order:0}#form button{order:1}#upload-zone{order:2}#qianwen-login{background:#004B93;border-color:#004B93}#qianwen-login:hover{background:#003B75}#form button{background:#D65A00;border-color:#D65A00}#form button:hover{background:#B94D00}.retry-task{background:#FFD54F;border-color:#FFD54F;color:#24322d}.retry-task:hover{background:#FFC928;border-color:#FFC928}#runtime-show{background:#169bb4;border-color:#169bb4}#runtime-show:hover{background:#127e93}#runtime-dialog{width:min(850px,90vw);max-height:85vh;border:1px solid #c6d1ca;border-radius:12px;overflow:auto}#runtime-dialog img{max-width:100%;border:1px solid #ddd}#runtime-dialog::backdrop{background:#0005}.tool-logo{width:136px;height:136px;object-fit:contain;flex:none;margin-right:16px;transform:translate(-7.44px,-4px);transform-origin:top left}h1{display:flex;align-items:flex-start;line-height:1;margin-bottom:16px}.tool-title{font-size:60px;line-height:1;font-weight:inherit;min-width:0}.tool-title-main,.tool-title-support{display:block}.tool-title-support{font-size:52px;margin-top:8px;margin-left:-.58em}@media(max-width:800px){.tool-title{font-size:clamp(20px,5.5vw,60px)}.tool-title-support{font-size:.8667em;margin-top:.1333em}.tool-logo{width:2.1667em;height:2.1667em}h1{font-size:clamp(20px,5.5vw,60px)}}.title-actions{display:flex;gap:10px;flex-wrap:wrap;margin-bottom:24px}.title-actions button{font-size:14px;padding:6px 10px;font-weight:normal}&lt;/style&gt;</w:t>
       </w:r>
     </w:p>
     <w:p>
@@ -17854,7 +17854,7 @@
     </w:p>
     <w:p>
       <w:r>
-        <w:t xml:space="preserve">  "index.html": "cbcc5edc94d0cf04cd0bcc54394b5865f7c7bf81007a28e391a49148d158f61c",</w:t>
+        <w:t xml:space="preserve">  "index.html": "9d3e810574065f1a50bfb22b197c253cc83bdb81686a0327b8b5e4bcce569741",</w:t>
       </w:r>
     </w:p>
     <w:p>

</xml_diff>

<commit_message>
Reduce support title font size by three pixels
</commit_message>
<xml_diff>
--- a/安装与使用指南.docx
+++ b/安装与使用指南.docx
@@ -4407,7 +4407,7 @@
     </w:p>
     <w:p>
       <w:r>
-        <w:t>#url::placeholder{color:#757575;opacity:1}#upload-zone{background:#fff;color:#757575;font:inherit;text-align:center;border:1px dashed #c6d1ca;border-radius:8px;padding:12px 14px;cursor:pointer;flex-basis:100%;box-sizing:border-box}#file-name{display:block;font-size:14px;color:#000}#form input[type=url]{order:0}#form button{order:1}#upload-zone{order:2}#qianwen-login{background:#004B93;border-color:#004B93}#qianwen-login:hover{background:#003B75}#form button{background:#D65A00;border-color:#D65A00}#form button:hover{background:#B94D00}.retry-task{background:#FFD54F;border-color:#FFD54F;color:#24322d}.retry-task:hover{background:#FFC928;border-color:#FFC928}#runtime-show{background:#169bb4;border-color:#169bb4}#runtime-show:hover{background:#127e93}#runtime-dialog{width:min(850px,90vw);max-height:85vh;border:1px solid #c6d1ca;border-radius:12px;overflow:auto}#runtime-dialog img{max-width:100%;border:1px solid #ddd}#runtime-dialog::backdrop{background:#0005}.tool-logo{width:136px;height:136px;object-fit:contain;flex:none;margin-right:16px;transform:translate(-7.44px,-4px);transform-origin:top left}h1{display:flex;align-items:flex-start;line-height:1;margin-bottom:16px}.tool-title{font-size:60px;line-height:1;font-weight:inherit;min-width:0}.tool-title-main,.tool-title-support{display:block}.tool-title-support{font-size:52px;margin-top:8px;margin-left:-.58em}@media(max-width:800px){.tool-title{font-size:clamp(20px,5.5vw,60px)}.tool-title-support{font-size:.8667em;margin-top:.1333em}.tool-logo{width:2.1667em;height:2.1667em}h1{font-size:clamp(20px,5.5vw,60px)}}.title-actions{display:flex;gap:10px;flex-wrap:wrap;margin-bottom:24px}.title-actions button{font-size:14px;padding:6px 10px;font-weight:normal}&lt;/style&gt;</w:t>
+        <w:t>#url::placeholder{color:#757575;opacity:1}#upload-zone{background:#fff;color:#757575;font:inherit;text-align:center;border:1px dashed #c6d1ca;border-radius:8px;padding:12px 14px;cursor:pointer;flex-basis:100%;box-sizing:border-box}#file-name{display:block;font-size:14px;color:#000}#form input[type=url]{order:0}#form button{order:1}#upload-zone{order:2}#qianwen-login{background:#004B93;border-color:#004B93}#qianwen-login:hover{background:#003B75}#form button{background:#D65A00;border-color:#D65A00}#form button:hover{background:#B94D00}.retry-task{background:#FFD54F;border-color:#FFD54F;color:#24322d}.retry-task:hover{background:#FFC928;border-color:#FFC928}#runtime-show{background:#169bb4;border-color:#169bb4}#runtime-show:hover{background:#127e93}#runtime-dialog{width:min(850px,90vw);max-height:85vh;border:1px solid #c6d1ca;border-radius:12px;overflow:auto}#runtime-dialog img{max-width:100%;border:1px solid #ddd}#runtime-dialog::backdrop{background:#0005}.tool-logo{width:136px;height:136px;object-fit:contain;flex:none;margin-right:16px;transform:translate(-7.44px,-4px);transform-origin:top left}h1{display:flex;align-items:flex-start;line-height:1;margin-bottom:16px}.tool-title{font-size:60px;line-height:1;font-weight:inherit;min-width:0}.tool-title-main,.tool-title-support{display:block}.tool-title-support{font-size:49px;margin-top:8px;margin-left:-.58em}@media(max-width:800px){.tool-title{font-size:clamp(20px,5.5vw,60px)}.tool-title-support{font-size:.8167em;margin-top:.1333em}.tool-logo{width:2.1667em;height:2.1667em}h1{font-size:clamp(20px,5.5vw,60px)}}.title-actions{display:flex;gap:10px;flex-wrap:wrap;margin-bottom:24px}.title-actions button{font-size:14px;padding:6px 10px;font-weight:normal}&lt;/style&gt;</w:t>
       </w:r>
     </w:p>
     <w:p>
@@ -17854,7 +17854,7 @@
     </w:p>
     <w:p>
       <w:r>
-        <w:t xml:space="preserve">  "index.html": "9d3e810574065f1a50bfb22b197c253cc83bdb81686a0327b8b5e4bcce569741",</w:t>
+        <w:t xml:space="preserve">  "index.html": "e78f6adccf8d29491cae0ce707a062fddddb449f48b2f809920d8afef9eb9a97",</w:t>
       </w:r>
     </w:p>
     <w:p>

</xml_diff>

<commit_message>
Reduce both heading lines and match logo visual height
</commit_message>
<xml_diff>
--- a/安装与使用指南.docx
+++ b/安装与使用指南.docx
@@ -4407,7 +4407,7 @@
     </w:p>
     <w:p>
       <w:r>
-        <w:t>#url::placeholder{color:#757575;opacity:1}#upload-zone{background:#fff;color:#757575;font:inherit;text-align:center;border:1px dashed #c6d1ca;border-radius:8px;padding:12px 14px;cursor:pointer;flex-basis:100%;box-sizing:border-box}#file-name{display:block;font-size:14px;color:#000}#form input[type=url]{order:0}#form button{order:1}#upload-zone{order:2}#qianwen-login{background:#004B93;border-color:#004B93}#qianwen-login:hover{background:#003B75}#form button{background:#D65A00;border-color:#D65A00}#form button:hover{background:#B94D00}.retry-task{background:#FFD54F;border-color:#FFD54F;color:#24322d}.retry-task:hover{background:#FFC928;border-color:#FFC928}#runtime-show{background:#169bb4;border-color:#169bb4}#runtime-show:hover{background:#127e93}#runtime-dialog{width:min(850px,90vw);max-height:85vh;border:1px solid #c6d1ca;border-radius:12px;overflow:auto}#runtime-dialog img{max-width:100%;border:1px solid #ddd}#runtime-dialog::backdrop{background:#0005}.tool-logo{width:136px;height:136px;object-fit:contain;flex:none;margin-right:16px;transform:translate(-7.44px,-4px);transform-origin:top left}h1{display:flex;align-items:flex-start;line-height:1;margin-bottom:16px}.tool-title{font-size:60px;line-height:1;font-weight:inherit;min-width:0}.tool-title-main,.tool-title-support{display:block}.tool-title-support{font-size:49px;margin-top:8px;margin-left:-.58em}@media(max-width:800px){.tool-title{font-size:clamp(20px,5.5vw,60px)}.tool-title-support{font-size:.8167em;margin-top:.1333em}.tool-logo{width:2.1667em;height:2.1667em}h1{font-size:clamp(20px,5.5vw,60px)}}.title-actions{display:flex;gap:10px;flex-wrap:wrap;margin-bottom:24px}.title-actions button{font-size:14px;padding:6px 10px;font-weight:normal}&lt;/style&gt;</w:t>
+        <w:t>#url::placeholder{color:#757575;opacity:1}#upload-zone{background:#fff;color:#757575;font:inherit;text-align:center;border:1px dashed #c6d1ca;border-radius:8px;padding:12px 14px;cursor:pointer;flex-basis:100%;box-sizing:border-box}#file-name{display:block;font-size:14px;color:#000}#form input[type=url]{order:0}#form button{order:1}#upload-zone{order:2}#qianwen-login{background:#004B93;border-color:#004B93}#qianwen-login:hover{background:#003B75}#form button{background:#D65A00;border-color:#D65A00}#form button:hover{background:#B94D00}.retry-task{background:#FFD54F;border-color:#FFD54F;color:#24322d}.retry-task:hover{background:#FFC928;border-color:#FFC928}#runtime-show{background:#169bb4;border-color:#169bb4}#runtime-show:hover{background:#127e93}#runtime-dialog{width:min(850px,90vw);max-height:85vh;border:1px solid #c6d1ca;border-radius:12px;overflow:auto}#runtime-dialog img{max-width:100%;border:1px solid #ddd}#runtime-dialog::backdrop{background:#0005}.tool-logo{width:122px;height:122px;object-fit:contain;flex:none;margin-right:16px;transform:translate(-6.67px,-3px);transform-origin:top left}h1{display:flex;align-items:flex-start;line-height:1;margin-bottom:16px}.tool-title{font-size:58px;line-height:1;font-weight:inherit;min-width:0}.tool-title-main,.tool-title-support{display:block}.tool-title-support{font-size:47px;margin-top:8px;margin-left:-.58em}@media(max-width:800px){.tool-title{font-size:clamp(20px,5.5vw,58px)}.tool-title-support{font-size:.8103em;margin-top:.1333em}.tool-logo{width:2.1034em;height:2.1034em}h1{font-size:clamp(20px,5.5vw,58px)}}.title-actions{display:flex;gap:10px;flex-wrap:wrap;margin-bottom:24px}.title-actions button{font-size:14px;padding:6px 10px;font-weight:normal}&lt;/style&gt;</w:t>
       </w:r>
     </w:p>
     <w:p>
@@ -17854,7 +17854,7 @@
     </w:p>
     <w:p>
       <w:r>
-        <w:t xml:space="preserve">  "index.html": "e78f6adccf8d29491cae0ce707a062fddddb449f48b2f809920d8afef9eb9a97",</w:t>
+        <w:t xml:space="preserve">  "index.html": "63e3475fb59e253c263ae8727867d4dc7014299e410ee7cc77c92316f597857f",</w:t>
       </w:r>
     </w:p>
     <w:p>

</xml_diff>

<commit_message>
Match heading blue to logo and reduce support text size
</commit_message>
<xml_diff>
--- a/安装与使用指南.docx
+++ b/安装与使用指南.docx
@@ -4407,7 +4407,7 @@
     </w:p>
     <w:p>
       <w:r>
-        <w:t>#url::placeholder{color:#757575;opacity:1}#upload-zone{background:#fff;color:#757575;font:inherit;text-align:center;border:1px dashed #c6d1ca;border-radius:8px;padding:12px 14px;cursor:pointer;flex-basis:100%;box-sizing:border-box}#file-name{display:block;font-size:14px;color:#000}#form input[type=url]{order:0}#form button{order:1}#upload-zone{order:2}#qianwen-login{background:#004B93;border-color:#004B93}#qianwen-login:hover{background:#003B75}#form button{background:#D65A00;border-color:#D65A00}#form button:hover{background:#B94D00}.retry-task{background:#FFD54F;border-color:#FFD54F;color:#24322d}.retry-task:hover{background:#FFC928;border-color:#FFC928}#runtime-show{background:#169bb4;border-color:#169bb4}#runtime-show:hover{background:#127e93}#runtime-dialog{width:min(850px,90vw);max-height:85vh;border:1px solid #c6d1ca;border-radius:12px;overflow:auto}#runtime-dialog img{max-width:100%;border:1px solid #ddd}#runtime-dialog::backdrop{background:#0005}.tool-logo{width:122px;height:122px;object-fit:contain;flex:none;margin-right:16px;transform:translate(-6.67px,-3px);transform-origin:top left}h1{display:flex;align-items:flex-start;line-height:1;margin-bottom:16px}.tool-title{font-size:58px;line-height:1;font-weight:inherit;min-width:0}.tool-title-main,.tool-title-support{display:block}.tool-title-support{font-size:47px;margin-top:8px;margin-left:-.58em}@media(max-width:800px){.tool-title{font-size:clamp(20px,5.5vw,58px)}.tool-title-support{font-size:.8103em;margin-top:.1333em}.tool-logo{width:2.1034em;height:2.1034em}h1{font-size:clamp(20px,5.5vw,58px)}}.title-actions{display:flex;gap:10px;flex-wrap:wrap;margin-bottom:24px}.title-actions button{font-size:14px;padding:6px 10px;font-weight:normal}&lt;/style&gt;</w:t>
+        <w:t>#url::placeholder{color:#757575;opacity:1}#upload-zone{background:#fff;color:#757575;font:inherit;text-align:center;border:1px dashed #c6d1ca;border-radius:8px;padding:12px 14px;cursor:pointer;flex-basis:100%;box-sizing:border-box}#file-name{display:block;font-size:14px;color:#000}#form input[type=url]{order:0}#form button{order:1}#upload-zone{order:2}#qianwen-login{background:#004B93;border-color:#004B93}#qianwen-login:hover{background:#003B75}#form button{background:#D65A00;border-color:#D65A00}#form button:hover{background:#B94D00}.retry-task{background:#FFD54F;border-color:#FFD54F;color:#24322d}.retry-task:hover{background:#FFC928;border-color:#FFC928}#runtime-show{background:#169bb4;border-color:#169bb4}#runtime-show:hover{background:#127e93}#runtime-dialog{width:min(850px,90vw);max-height:85vh;border:1px solid #c6d1ca;border-radius:12px;overflow:auto}#runtime-dialog img{max-width:100%;border:1px solid #ddd}#runtime-dialog::backdrop{background:#0005}.tool-logo{width:122px;height:122px;object-fit:contain;flex:none;margin-right:16px;transform:translate(-6.67px,-3px);transform-origin:top left}h1{display:flex;align-items:flex-start;line-height:1;margin-bottom:16px}.tool-title{color:#287FB8;font-size:58px;line-height:1;font-weight:inherit;min-width:0}.tool-title-main,.tool-title-support{display:block}.tool-title-support{font-size:45px;margin-top:8px;margin-left:-.58em}@media(max-width:800px){.tool-title{font-size:clamp(20px,5.5vw,58px)}.tool-title-support{font-size:.7759em;margin-top:.1333em}.tool-logo{width:2.1034em;height:2.1034em}h1{font-size:clamp(20px,5.5vw,58px)}}.title-actions{display:flex;gap:10px;flex-wrap:wrap;margin-bottom:24px}.title-actions button{font-size:14px;padding:6px 10px;font-weight:normal}&lt;/style&gt;</w:t>
       </w:r>
     </w:p>
     <w:p>
@@ -17854,7 +17854,7 @@
     </w:p>
     <w:p>
       <w:r>
-        <w:t xml:space="preserve">  "index.html": "63e3475fb59e253c263ae8727867d4dc7014299e410ee7cc77c92316f597857f",</w:t>
+        <w:t xml:space="preserve">  "index.html": "a3785950e502254905a62c83749246a8ddd13c6153095725582226a99d239dcd",</w:t>
       </w:r>
     </w:p>
     <w:p>

</xml_diff>

<commit_message>
Update page heading and speech recognition support wording
</commit_message>
<xml_diff>
--- a/安装与使用指南.docx
+++ b/安装与使用指南.docx
@@ -4407,12 +4407,12 @@
     </w:p>
     <w:p>
       <w:r>
-        <w:t>#url::placeholder{color:#757575;opacity:1}#upload-zone{background:#fff;color:#757575;font:inherit;text-align:center;border:1px dashed #c6d1ca;border-radius:8px;padding:12px 14px;cursor:pointer;flex-basis:100%;box-sizing:border-box}#file-name{display:block;font-size:14px;color:#000}#form input[type=url]{order:0}#form button{order:1}#upload-zone{order:2}#qianwen-login{background:#004B93;border-color:#004B93}#qianwen-login:hover{background:#003B75}#form button{background:#D65A00;border-color:#D65A00}#form button:hover{background:#B94D00}.retry-task{background:#FFD54F;border-color:#FFD54F;color:#24322d}.retry-task:hover{background:#FFC928;border-color:#FFC928}#runtime-show{background:#169bb4;border-color:#169bb4}#runtime-show:hover{background:#127e93}#runtime-dialog{width:min(850px,90vw);max-height:85vh;border:1px solid #c6d1ca;border-radius:12px;overflow:auto}#runtime-dialog img{max-width:100%;border:1px solid #ddd}#runtime-dialog::backdrop{background:#0005}.tool-logo{width:122px;height:122px;object-fit:contain;flex:none;margin-right:16px;transform:translate(-6.67px,-3px);transform-origin:top left}h1{display:flex;align-items:flex-start;line-height:1;margin-bottom:16px}.tool-title{color:#287FB8;font-size:58px;line-height:1;font-weight:inherit;min-width:0}.tool-title-main,.tool-title-support{display:block}.tool-title-support{font-size:45px;margin-top:8px;margin-left:-.58em}@media(max-width:800px){.tool-title{font-size:clamp(20px,5.5vw,58px)}.tool-title-support{font-size:.7759em;margin-top:.1333em}.tool-logo{width:2.1034em;height:2.1034em}h1{font-size:clamp(20px,5.5vw,58px)}}.title-actions{display:flex;gap:10px;flex-wrap:wrap;margin-bottom:24px}.title-actions button{font-size:14px;padding:6px 10px;font-weight:normal}&lt;/style&gt;</w:t>
-      </w:r>
-    </w:p>
-    <w:p>
-      <w:r>
-        <w:t>&lt;h1&gt;&lt;img class="tool-logo" src="/icons/app-icon.svg" alt="工具Logo"&gt;&lt;span class="tool-title"&gt;&lt;span class="tool-title-main"&gt;网页视频转语音识别文字稿&lt;/span&gt;&lt;span class="tool-title-support"&gt;（由千问提供支持）&lt;/span&gt;&lt;/span&gt;&lt;/h1&gt;</w:t>
+        <w:t>#url::placeholder{color:#757575;opacity:1}#upload-zone{background:#fff;color:#757575;font:inherit;text-align:center;border:1px dashed #c6d1ca;border-radius:8px;padding:12px 14px;cursor:pointer;flex-basis:100%;box-sizing:border-box}#file-name{display:block;font-size:14px;color:#000}#form input[type=url]{order:0}#form button{order:1}#upload-zone{order:2}#qianwen-login{background:#004B93;border-color:#004B93}#qianwen-login:hover{background:#003B75}#form button{background:#D65A00;border-color:#D65A00}#form button:hover{background:#B94D00}.retry-task{background:#FFD54F;border-color:#FFD54F;color:#24322d}.retry-task:hover{background:#FFC928;border-color:#FFC928}#runtime-show{background:#169bb4;border-color:#169bb4}#runtime-show:hover{background:#127e93}#runtime-dialog{width:min(850px,90vw);max-height:85vh;border:1px solid #c6d1ca;border-radius:12px;overflow:auto}#runtime-dialog img{max-width:100%;border:1px solid #ddd}#runtime-dialog::backdrop{background:#0005}.tool-logo{width:122px;height:122px;object-fit:contain;flex:none;margin-right:16px;transform:translate(-6.67px,-3px);transform-origin:top left}h1{display:flex;align-items:flex-start;line-height:1;margin-bottom:16px}.tool-title{color:#287FB8;font-size:58px;line-height:1;font-weight:inherit;min-width:0}.tool-title-main,.tool-title-support{display:block}.tool-title-support{font-size:45px;margin-top:8px;margin-left:0}@media(max-width:800px){.tool-title{font-size:clamp(20px,5.5vw,58px)}.tool-title-support{font-size:.7759em;margin-top:.1333em}.tool-logo{width:2.1034em;height:2.1034em}h1{font-size:clamp(20px,5.5vw,58px)}}.title-actions{display:flex;gap:10px;flex-wrap:wrap;margin-bottom:24px}.title-actions button{font-size:14px;padding:6px 10px;font-weight:normal}&lt;/style&gt;</w:t>
+      </w:r>
+    </w:p>
+    <w:p>
+      <w:r>
+        <w:t>&lt;h1&gt;&lt;img class="tool-logo" src="/icons/app-icon.svg" alt="工具Logo"&gt;&lt;span class="tool-title"&gt;&lt;span class="tool-title-main"&gt;网页视频转文字稿&lt;/span&gt;&lt;span class="tool-title-support"&gt;由千问提供语音识别支持&lt;/span&gt;&lt;/span&gt;&lt;/h1&gt;</w:t>
       </w:r>
     </w:p>
     <w:p>
@@ -17854,7 +17854,7 @@
     </w:p>
     <w:p>
       <w:r>
-        <w:t xml:space="preserve">  "index.html": "a3785950e502254905a62c83749246a8ddd13c6153095725582226a99d239dcd",</w:t>
+        <w:t xml:space="preserve">  "index.html": "329348b2a2a855b82cda550dddac037442ad344ea0f6db5ada6a492e90b92f59",</w:t>
       </w:r>
     </w:p>
     <w:p>

</xml_diff>

<commit_message>
Restore support title parentheses and reduce font size
</commit_message>
<xml_diff>
--- a/安装与使用指南.docx
+++ b/安装与使用指南.docx
@@ -4407,12 +4407,12 @@
     </w:p>
     <w:p>
       <w:r>
-        <w:t>#url::placeholder{color:#757575;opacity:1}#upload-zone{background:#fff;color:#757575;font:inherit;text-align:center;border:1px dashed #c6d1ca;border-radius:8px;padding:12px 14px;cursor:pointer;flex-basis:100%;box-sizing:border-box}#file-name{display:block;font-size:14px;color:#000}#form input[type=url]{order:0}#form button{order:1}#upload-zone{order:2}#qianwen-login{background:#004B93;border-color:#004B93}#qianwen-login:hover{background:#003B75}#form button{background:#D65A00;border-color:#D65A00}#form button:hover{background:#B94D00}.retry-task{background:#FFD54F;border-color:#FFD54F;color:#24322d}.retry-task:hover{background:#FFC928;border-color:#FFC928}#runtime-show{background:#169bb4;border-color:#169bb4}#runtime-show:hover{background:#127e93}#runtime-dialog{width:min(850px,90vw);max-height:85vh;border:1px solid #c6d1ca;border-radius:12px;overflow:auto}#runtime-dialog img{max-width:100%;border:1px solid #ddd}#runtime-dialog::backdrop{background:#0005}.tool-logo{width:122px;height:122px;object-fit:contain;flex:none;margin-right:16px;transform:translate(-6.67px,-3px);transform-origin:top left}h1{display:flex;align-items:flex-start;line-height:1;margin-bottom:16px}.tool-title{color:#287FB8;font-size:58px;line-height:1;font-weight:inherit;min-width:0}.tool-title-main,.tool-title-support{display:block}.tool-title-support{font-size:45px;margin-top:8px;margin-left:0}@media(max-width:800px){.tool-title{font-size:clamp(20px,5.5vw,58px)}.tool-title-support{font-size:.7759em;margin-top:.1333em}.tool-logo{width:2.1034em;height:2.1034em}h1{font-size:clamp(20px,5.5vw,58px)}}.title-actions{display:flex;gap:10px;flex-wrap:wrap;margin-bottom:24px}.title-actions button{font-size:14px;padding:6px 10px;font-weight:normal}&lt;/style&gt;</w:t>
-      </w:r>
-    </w:p>
-    <w:p>
-      <w:r>
-        <w:t>&lt;h1&gt;&lt;img class="tool-logo" src="/icons/app-icon.svg" alt="工具Logo"&gt;&lt;span class="tool-title"&gt;&lt;span class="tool-title-main"&gt;网页视频转文字稿&lt;/span&gt;&lt;span class="tool-title-support"&gt;由千问提供语音识别支持&lt;/span&gt;&lt;/span&gt;&lt;/h1&gt;</w:t>
+        <w:t>#url::placeholder{color:#757575;opacity:1}#upload-zone{background:#fff;color:#757575;font:inherit;text-align:center;border:1px dashed #c6d1ca;border-radius:8px;padding:12px 14px;cursor:pointer;flex-basis:100%;box-sizing:border-box}#file-name{display:block;font-size:14px;color:#000}#form input[type=url]{order:0}#form button{order:1}#upload-zone{order:2}#qianwen-login{background:#004B93;border-color:#004B93}#qianwen-login:hover{background:#003B75}#form button{background:#D65A00;border-color:#D65A00}#form button:hover{background:#B94D00}.retry-task{background:#FFD54F;border-color:#FFD54F;color:#24322d}.retry-task:hover{background:#FFC928;border-color:#FFC928}#runtime-show{background:#169bb4;border-color:#169bb4}#runtime-show:hover{background:#127e93}#runtime-dialog{width:min(850px,90vw);max-height:85vh;border:1px solid #c6d1ca;border-radius:12px;overflow:auto}#runtime-dialog img{max-width:100%;border:1px solid #ddd}#runtime-dialog::backdrop{background:#0005}.tool-logo{width:122px;height:122px;object-fit:contain;flex:none;margin-right:16px;transform:translate(-6.67px,-3px);transform-origin:top left}h1{display:flex;align-items:flex-start;line-height:1;margin-bottom:16px}.tool-title{color:#287FB8;font-size:58px;line-height:1;font-weight:inherit;min-width:0}.tool-title-main,.tool-title-support{display:block}.tool-title-support{font-size:42px;margin-top:8px;margin-left:-.58em}@media(max-width:800px){.tool-title{font-size:clamp(20px,5.5vw,58px)}.tool-title-support{font-size:.7241em;margin-top:.1333em}.tool-logo{width:2.1034em;height:2.1034em}h1{font-size:clamp(20px,5.5vw,58px)}}.title-actions{display:flex;gap:10px;flex-wrap:wrap;margin-bottom:24px}.title-actions button{font-size:14px;padding:6px 10px;font-weight:normal}&lt;/style&gt;</w:t>
+      </w:r>
+    </w:p>
+    <w:p>
+      <w:r>
+        <w:t>&lt;h1&gt;&lt;img class="tool-logo" src="/icons/app-icon.svg" alt="工具Logo"&gt;&lt;span class="tool-title"&gt;&lt;span class="tool-title-main"&gt;网页视频转文字稿&lt;/span&gt;&lt;span class="tool-title-support"&gt;（由千问提供语音识别支持）&lt;/span&gt;&lt;/span&gt;&lt;/h1&gt;</w:t>
       </w:r>
     </w:p>
     <w:p>
@@ -17854,7 +17854,7 @@
     </w:p>
     <w:p>
       <w:r>
-        <w:t xml:space="preserve">  "index.html": "329348b2a2a855b82cda550dddac037442ad344ea0f6db5ada6a492e90b92f59",</w:t>
+        <w:t xml:space="preserve">  "index.html": "2dbaab9ed8ca4426ed7c446468188f4d795111c5faf1bace4f985f6bfa6f9167",</w:t>
       </w:r>
     </w:p>
     <w:p>

</xml_diff>

<commit_message>
Reduce parenthesized support heading to 39px
</commit_message>
<xml_diff>
--- a/安装与使用指南.docx
+++ b/安装与使用指南.docx
@@ -4407,7 +4407,7 @@
     </w:p>
     <w:p>
       <w:r>
-        <w:t>#url::placeholder{color:#757575;opacity:1}#upload-zone{background:#fff;color:#757575;font:inherit;text-align:center;border:1px dashed #c6d1ca;border-radius:8px;padding:12px 14px;cursor:pointer;flex-basis:100%;box-sizing:border-box}#file-name{display:block;font-size:14px;color:#000}#form input[type=url]{order:0}#form button{order:1}#upload-zone{order:2}#qianwen-login{background:#004B93;border-color:#004B93}#qianwen-login:hover{background:#003B75}#form button{background:#D65A00;border-color:#D65A00}#form button:hover{background:#B94D00}.retry-task{background:#FFD54F;border-color:#FFD54F;color:#24322d}.retry-task:hover{background:#FFC928;border-color:#FFC928}#runtime-show{background:#169bb4;border-color:#169bb4}#runtime-show:hover{background:#127e93}#runtime-dialog{width:min(850px,90vw);max-height:85vh;border:1px solid #c6d1ca;border-radius:12px;overflow:auto}#runtime-dialog img{max-width:100%;border:1px solid #ddd}#runtime-dialog::backdrop{background:#0005}.tool-logo{width:122px;height:122px;object-fit:contain;flex:none;margin-right:16px;transform:translate(-6.67px,-3px);transform-origin:top left}h1{display:flex;align-items:flex-start;line-height:1;margin-bottom:16px}.tool-title{color:#287FB8;font-size:58px;line-height:1;font-weight:inherit;min-width:0}.tool-title-main,.tool-title-support{display:block}.tool-title-support{font-size:42px;margin-top:8px;margin-left:-.58em}@media(max-width:800px){.tool-title{font-size:clamp(20px,5.5vw,58px)}.tool-title-support{font-size:.7241em;margin-top:.1333em}.tool-logo{width:2.1034em;height:2.1034em}h1{font-size:clamp(20px,5.5vw,58px)}}.title-actions{display:flex;gap:10px;flex-wrap:wrap;margin-bottom:24px}.title-actions button{font-size:14px;padding:6px 10px;font-weight:normal}&lt;/style&gt;</w:t>
+        <w:t>#url::placeholder{color:#757575;opacity:1}#upload-zone{background:#fff;color:#757575;font:inherit;text-align:center;border:1px dashed #c6d1ca;border-radius:8px;padding:12px 14px;cursor:pointer;flex-basis:100%;box-sizing:border-box}#file-name{display:block;font-size:14px;color:#000}#form input[type=url]{order:0}#form button{order:1}#upload-zone{order:2}#qianwen-login{background:#004B93;border-color:#004B93}#qianwen-login:hover{background:#003B75}#form button{background:#D65A00;border-color:#D65A00}#form button:hover{background:#B94D00}.retry-task{background:#FFD54F;border-color:#FFD54F;color:#24322d}.retry-task:hover{background:#FFC928;border-color:#FFC928}#runtime-show{background:#169bb4;border-color:#169bb4}#runtime-show:hover{background:#127e93}#runtime-dialog{width:min(850px,90vw);max-height:85vh;border:1px solid #c6d1ca;border-radius:12px;overflow:auto}#runtime-dialog img{max-width:100%;border:1px solid #ddd}#runtime-dialog::backdrop{background:#0005}.tool-logo{width:122px;height:122px;object-fit:contain;flex:none;margin-right:16px;transform:translate(-6.67px,-3px);transform-origin:top left}h1{display:flex;align-items:flex-start;line-height:1;margin-bottom:16px}.tool-title{color:#287FB8;font-size:58px;line-height:1;font-weight:inherit;min-width:0}.tool-title-main,.tool-title-support{display:block}.tool-title-support{font-size:39px;margin-top:8px;margin-left:-.58em}@media(max-width:800px){.tool-title{font-size:clamp(20px,5.5vw,58px)}.tool-title-support{font-size:.6724em;margin-top:.1333em}.tool-logo{width:2.1034em;height:2.1034em}h1{font-size:clamp(20px,5.5vw,58px)}}.title-actions{display:flex;gap:10px;flex-wrap:wrap;margin-bottom:24px}.title-actions button{font-size:14px;padding:6px 10px;font-weight:normal}&lt;/style&gt;</w:t>
       </w:r>
     </w:p>
     <w:p>
@@ -17854,7 +17854,7 @@
     </w:p>
     <w:p>
       <w:r>
-        <w:t xml:space="preserve">  "index.html": "2dbaab9ed8ca4426ed7c446468188f4d795111c5faf1bace4f985f6bfa6f9167",</w:t>
+        <w:t xml:space="preserve">  "index.html": "e03ef79f87244a42a836ac02fd78eace8fcea43807c27614ba7f1257f57e630c",</w:t>
       </w:r>
     </w:p>
     <w:p>

</xml_diff>

<commit_message>
Validate Word downloads and retry transient export failures without reupload
</commit_message>
<xml_diff>
--- a/安装与使用指南.docx
+++ b/安装与使用指南.docx
@@ -677,6 +677,12 @@
     </w:p>
     <w:p/>
     <w:p>
+      <w:r>
+        <w:t>千问 Word 导出下载会先校验 ZIP 完整性和正文，空文件不算下载成功。下载连接失败或文件不完整时自动重试（最多三次），复用已有云端文稿，不重新上传音频；失败保留本机媒体。</w:t>
+      </w:r>
+    </w:p>
+    <w:p/>
+    <w:p>
       <w:pPr>
         <w:pStyle w:val="Heading1"/>
       </w:pPr>
@@ -7184,421 +7190,493 @@
     <w:p/>
     <w:p>
       <w:r>
-        <w:t>def save_export_download(download,page,destination):</w:t>
-      </w:r>
-    </w:p>
-    <w:p>
-      <w:r>
-        <w:t xml:space="preserve">    """CDP clients can cancel browser downloads; recover through the same page session."""</w:t>
-      </w:r>
-    </w:p>
-    <w:p>
-      <w:r>
-        <w:t xml:space="preserve">    import base64</w:t>
-      </w:r>
-    </w:p>
-    <w:p>
-      <w:r>
-        <w:t xml:space="preserve">    try:</w:t>
-      </w:r>
-    </w:p>
-    <w:p>
-      <w:r>
-        <w:t xml:space="preserve">        download.save_as(str(destination))</w:t>
-      </w:r>
-    </w:p>
-    <w:p>
-      <w:r>
-        <w:t xml:space="preserve">        return</w:t>
-      </w:r>
-    </w:p>
-    <w:p>
-      <w:r>
-        <w:t xml:space="preserve">    except Exception as error:</w:t>
-      </w:r>
-    </w:p>
-    <w:p>
-      <w:r>
-        <w:t xml:space="preserve">        if 'canceled' not in str(error).lower():raise</w:t>
-      </w:r>
-    </w:p>
-    <w:p>
-      <w:r>
-        <w:t xml:space="preserve">    # Use the exact URL emitted by this export, including session-local blob URLs.</w:t>
-      </w:r>
-    </w:p>
-    <w:p>
-      <w:r>
-        <w:t xml:space="preserve">    encoded=page.evaluate("""async url =&gt; {</w:t>
-      </w:r>
-    </w:p>
-    <w:p>
-      <w:r>
-        <w:t xml:space="preserve">        const response=await fetch(url,{credentials:'include'});</w:t>
-      </w:r>
-    </w:p>
-    <w:p>
-      <w:r>
-        <w:t xml:space="preserve">        if(!response.ok)throw new Error('Word导出请求失败：HTTP '+response.status);</w:t>
-      </w:r>
-    </w:p>
-    <w:p>
-      <w:r>
-        <w:t xml:space="preserve">        const bytes=new Uint8Array(await response.arrayBuffer());</w:t>
-      </w:r>
-    </w:p>
-    <w:p>
-      <w:r>
-        <w:t xml:space="preserve">        if(bytes.length&gt;50*1024*1024)throw new Error('Word导出文件超过50MB');</w:t>
-      </w:r>
-    </w:p>
-    <w:p>
-      <w:r>
-        <w:t xml:space="preserve">        let binary='';for(let i=0;i&lt;bytes.length;i+=8192)binary+=String.fromCharCode(...bytes.subarray(i,i+8192));</w:t>
-      </w:r>
-    </w:p>
-    <w:p>
-      <w:r>
-        <w:t xml:space="preserve">        return btoa(binary);</w:t>
-      </w:r>
-    </w:p>
-    <w:p>
-      <w:r>
-        <w:t xml:space="preserve">    }""",download.url)</w:t>
-      </w:r>
-    </w:p>
-    <w:p>
-      <w:r>
-        <w:t xml:space="preserve">    data=base64.b64decode(encoded,validate=True)</w:t>
-      </w:r>
-    </w:p>
-    <w:p>
-      <w:r>
-        <w:t xml:space="preserve">    if not data.startswith(b'PK'):raise RuntimeError('千问导出未返回有效Word文件，原媒体已保留')</w:t>
-      </w:r>
-    </w:p>
-    <w:p>
-      <w:r>
-        <w:t xml:space="preserve">    from zipfile import ZipFile</w:t>
-      </w:r>
-    </w:p>
-    <w:p>
-      <w:r>
-        <w:t xml:space="preserve">    import io</w:t>
-      </w:r>
-    </w:p>
-    <w:p>
-      <w:r>
-        <w:t xml:space="preserve">    with ZipFile(io.BytesIO(data)) as archive:</w:t>
-      </w:r>
-    </w:p>
-    <w:p>
-      <w:r>
-        <w:t xml:space="preserve">        if 'word/document.xml' not in archive.namelist():raise RuntimeError('千问导出缺少Word正文，原媒体已保留')</w:t>
-      </w:r>
-    </w:p>
-    <w:p>
-      <w:r>
-        <w:t xml:space="preserve">    partial=destination.with_suffix('.partial.docx');partial.write_bytes(data);partial.replace(destination)</w:t>
-      </w:r>
-    </w:p>
-    <w:p/>
-    <w:p>
-      <w:r>
-        <w:t>class TaskContext:</w:t>
-      </w:r>
-    </w:p>
-    <w:p>
-      <w:r>
-        <w:t xml:space="preserve">    def __init__(self,context):</w:t>
-      </w:r>
-    </w:p>
-    <w:p>
-      <w:r>
-        <w:t xml:space="preserve">        self.page=context.new_page()</w:t>
-      </w:r>
-    </w:p>
-    <w:p>
-      <w:r>
-        <w:t xml:space="preserve">        self.pages=[self.page]</w:t>
-      </w:r>
-    </w:p>
-    <w:p>
-      <w:r>
-        <w:t xml:space="preserve">        session=context.new_cdp_session(self.page)</w:t>
-      </w:r>
-    </w:p>
-    <w:p>
-      <w:r>
-        <w:t xml:space="preserve">        target=session.send("Target.getTargetInfo")["targetInfo"]["targetId"]</w:t>
-      </w:r>
-    </w:p>
-    <w:p>
-      <w:r>
-        <w:t xml:space="preserve">        session.detach()</w:t>
-      </w:r>
-    </w:p>
-    <w:p>
-      <w:r>
-        <w:t xml:space="preserve">        self.owner=ROOT/"work/browser-page-owners"/target</w:t>
-      </w:r>
-    </w:p>
-    <w:p>
-      <w:r>
-        <w:t xml:space="preserve">        self.owner.parent.mkdir(exist_ok=True)</w:t>
-      </w:r>
-    </w:p>
-    <w:p>
-      <w:r>
-        <w:t xml:space="preserve">        self.owner.write_text(str(os.getpid()))</w:t>
-      </w:r>
-    </w:p>
-    <w:p/>
-    <w:p>
-      <w:r>
-        <w:t>@contextmanager</w:t>
-      </w:r>
-    </w:p>
-    <w:p>
-      <w:r>
-        <w:t>def browser_context(playwright, headed=False):</w:t>
-      </w:r>
-    </w:p>
-    <w:p>
-      <w:r>
-        <w:t xml:space="preserve">    from browser_service import endpoint</w:t>
-      </w:r>
-    </w:p>
-    <w:p>
-      <w:r>
-        <w:t xml:space="preserve">    from runtime_compat import venv_python,file_lock as fcntl</w:t>
-      </w:r>
-    </w:p>
-    <w:p>
-      <w:r>
-        <w:t xml:space="preserve">    PROFILE.mkdir(parents=True, exist_ok=True)</w:t>
-      </w:r>
-    </w:p>
-    <w:p>
-      <w:r>
-        <w:t xml:space="preserve">    if not headed:</w:t>
-      </w:r>
-    </w:p>
-    <w:p>
-      <w:r>
-        <w:t xml:space="preserve">        if not endpoint():</w:t>
-      </w:r>
-    </w:p>
-    <w:p>
-      <w:r>
-        <w:t xml:space="preserve">            with (ROOT/'work/browser-service.log').open('ab') as log:</w:t>
-      </w:r>
-    </w:p>
-    <w:p>
-      <w:r>
-        <w:t xml:space="preserve">                subprocess.Popen([str(venv_python(ROOT)),str(ROOT/'browser_service.py')],stdout=log,stderr=log,start_new_session=True)</w:t>
-      </w:r>
-    </w:p>
-    <w:p>
-      <w:r>
-        <w:t xml:space="preserve">            for _ in range(40):</w:t>
-      </w:r>
-    </w:p>
-    <w:p>
-      <w:r>
-        <w:t xml:space="preserve">                if endpoint():break</w:t>
-      </w:r>
-    </w:p>
-    <w:p>
-      <w:r>
-        <w:t xml:space="preserve">                time.sleep(.25)</w:t>
-      </w:r>
-    </w:p>
-    <w:p>
-      <w:r>
-        <w:t xml:space="preserve">        address=endpoint()</w:t>
-      </w:r>
-    </w:p>
-    <w:p>
-      <w:r>
-        <w:t xml:space="preserve">        if not address:raise RuntimeError('千问浏览器正在使用中，请关闭登录窗口或稍后重试。')</w:t>
-      </w:r>
-    </w:p>
-    <w:p>
-      <w:r>
-        <w:t xml:space="preserve">        browser=playwright.chromium.connect_over_cdp(address)</w:t>
-      </w:r>
-    </w:p>
-    <w:p>
-      <w:r>
-        <w:t xml:space="preserve">        task=TaskContext(browser.contexts[0])</w:t>
-      </w:r>
-    </w:p>
-    <w:p>
-      <w:r>
-        <w:t xml:space="preserve">        try:yield task</w:t>
-      </w:r>
-    </w:p>
-    <w:p>
-      <w:r>
-        <w:t xml:space="preserve">        finally:</w:t>
-      </w:r>
-    </w:p>
-    <w:p>
-      <w:r>
-        <w:t xml:space="preserve">            try:</w:t>
-      </w:r>
-    </w:p>
-    <w:p>
-      <w:r>
-        <w:t xml:space="preserve">                task.page.close()</w:t>
-      </w:r>
-    </w:p>
-    <w:p>
-      <w:r>
-        <w:t xml:space="preserve">                task.owner.unlink(missing_ok=True)</w:t>
-      </w:r>
-    </w:p>
-    <w:p>
-      <w:r>
-        <w:t xml:space="preserve">            finally:browser.close() # CDP disconnect; shared browser stays alive.</w:t>
-      </w:r>
-    </w:p>
-    <w:p>
-      <w:r>
-        <w:t xml:space="preserve">        return</w:t>
-      </w:r>
-    </w:p>
-    <w:p>
-      <w:r>
-        <w:t xml:space="preserve">    address=endpoint()</w:t>
-      </w:r>
-    </w:p>
-    <w:p>
-      <w:r>
-        <w:t xml:space="preserve">    if address:</w:t>
-      </w:r>
-    </w:p>
-    <w:p>
-      <w:r>
-        <w:t xml:space="preserve">        browser=playwright.chromium.connect_over_cdp(address)</w:t>
-      </w:r>
-    </w:p>
-    <w:p>
-      <w:r>
-        <w:t xml:space="preserve">        if len(browser.contexts[0].pages)&gt;1:</w:t>
-      </w:r>
-    </w:p>
-    <w:p>
-      <w:r>
-        <w:t xml:space="preserve">            browser.close()</w:t>
-      </w:r>
-    </w:p>
-    <w:p>
-      <w:r>
-        <w:t xml:space="preserve">            raise RuntimeError('后台任务仍在使用千问，请等待当前操作完成后登录。')</w:t>
-      </w:r>
-    </w:p>
-    <w:p>
-      <w:r>
-        <w:t xml:space="preserve">        browser.new_browser_cdp_session().send('Browser.close')</w:t>
-      </w:r>
-    </w:p>
-    <w:p>
-      <w:r>
-        <w:t xml:space="preserve">        browser.close()</w:t>
-      </w:r>
-    </w:p>
-    <w:p>
-      <w:r>
-        <w:t xml:space="preserve">        time.sleep(1)</w:t>
-      </w:r>
-    </w:p>
-    <w:p>
-      <w:r>
-        <w:t xml:space="preserve">    with (ROOT/'work/qianwen-browser.lock').open('a') as lock:</w:t>
-      </w:r>
-    </w:p>
-    <w:p>
-      <w:r>
-        <w:t xml:space="preserve">        try:fcntl.flock(lock,fcntl.LOCK_EX|fcntl.LOCK_NB)</w:t>
-      </w:r>
-    </w:p>
-    <w:p>
-      <w:r>
-        <w:t xml:space="preserve">        except BlockingIOError:raise RuntimeError('千问浏览器正在使用中，请关闭登录窗口或等待任务完成后再试。')</w:t>
-      </w:r>
-    </w:p>
-    <w:p>
-      <w:r>
-        <w:t xml:space="preserve">        context=playwright.chromium.launch_persistent_context(str(PROFILE),headless=False,accept_downloads=True,viewport={'width':1920,'height':1600})</w:t>
-      </w:r>
-    </w:p>
-    <w:p>
-      <w:r>
-        <w:t xml:space="preserve">        try:yield context</w:t>
-      </w:r>
-    </w:p>
-    <w:p>
-      <w:r>
-        <w:t xml:space="preserve">        finally:context.close()</w:t>
-      </w:r>
-    </w:p>
-    <w:p/>
-    <w:p>
-      <w:r>
-        <w:t>def check_auth():</w:t>
-      </w:r>
-    </w:p>
-    <w:p>
-      <w:r>
-        <w:t xml:space="preserve">    from playwright.sync_api import sync_playwright</w:t>
-      </w:r>
-    </w:p>
-    <w:p>
-      <w:r>
-        <w:t xml:space="preserve">    with sync_playwright() as p:</w:t>
-      </w:r>
-    </w:p>
-    <w:p>
-      <w:r>
-        <w:t xml:space="preserve">        with browser_context(p) as context:</w:t>
-      </w:r>
-    </w:p>
-    <w:p>
-      <w:r>
-        <w:t xml:space="preserve">            page=context.pages[0];page.goto(URL,wait_until='domcontentloaded')</w:t>
-      </w:r>
-    </w:p>
-    <w:p>
-      <w:r>
-        <w:t xml:space="preserve">            page.wait_for_timeout(1500)</w:t>
-      </w:r>
-    </w:p>
-    <w:p>
-      <w:r>
-        <w:t xml:space="preserve">            require_login_if_visible(page)</w:t>
-      </w:r>
-    </w:p>
-    <w:p>
-      <w:r>
-        <w:t xml:space="preserve">            page.get_by_text('中英文自由说',exact=True).wait_for(timeout=30000)</w:t>
-      </w:r>
-    </w:p>
-    <w:p>
-      <w:r>
-        <w:t xml:space="preserve">            require_login_if_visible(page)</w:t>
-      </w:r>
-    </w:p>
-    <w:p>
-      <w:r>
-        <w:t xml:space="preserve">            auth_state('valid')</w:t>
+        <w:t>class ExportDownloadError(RuntimeError):</w:t>
+      </w:r>
+    </w:p>
+    <w:p>
+      <w:r>
+        <w:t xml:space="preserve">    pass</w:t>
       </w:r>
     </w:p>
     <w:p/>
     <w:p/>
     <w:p>
       <w:r>
+        <w:t>def save_export_download(download,page,destination):</w:t>
+      </w:r>
+    </w:p>
+    <w:p>
+      <w:r>
+        <w:t xml:space="preserve">    """Validate every download before committing it; recover canceled/empty CDP exports."""</w:t>
+      </w:r>
+    </w:p>
+    <w:p>
+      <w:r>
+        <w:t xml:space="preserve">    import base64,io</w:t>
+      </w:r>
+    </w:p>
+    <w:p>
+      <w:r>
+        <w:t xml:space="preserve">    from zipfile import ZipFile,BadZipFile</w:t>
+      </w:r>
+    </w:p>
+    <w:p>
+      <w:r>
+        <w:t xml:space="preserve">    partial=destination.with_suffix('.partial.docx')</w:t>
+      </w:r>
+    </w:p>
+    <w:p>
+      <w:r>
+        <w:t xml:space="preserve">    def validate(data):</w:t>
+      </w:r>
+    </w:p>
+    <w:p>
+      <w:r>
+        <w:t xml:space="preserve">        try:</w:t>
+      </w:r>
+    </w:p>
+    <w:p>
+      <w:r>
+        <w:t xml:space="preserve">            with ZipFile(io.BytesIO(data)) as archive:</w:t>
+      </w:r>
+    </w:p>
+    <w:p>
+      <w:r>
+        <w:t xml:space="preserve">                if 'word/document.xml' not in archive.namelist() or archive.testzip():</w:t>
+      </w:r>
+    </w:p>
+    <w:p>
+      <w:r>
+        <w:t xml:space="preserve">                    raise ValueError('缺少正文或文件损坏')</w:t>
+      </w:r>
+    </w:p>
+    <w:p>
+      <w:r>
+        <w:t xml:space="preserve">        except (BadZipFile,ValueError) as error:</w:t>
+      </w:r>
+    </w:p>
+    <w:p>
+      <w:r>
+        <w:t xml:space="preserve">            raise ExportDownloadError('千问Word导出文件为空或不完整，尚未生成文稿；原媒体已保留') from error</w:t>
+      </w:r>
+    </w:p>
+    <w:p>
+      <w:r>
+        <w:t xml:space="preserve">    try:</w:t>
+      </w:r>
+    </w:p>
+    <w:p>
+      <w:r>
+        <w:t xml:space="preserve">        try:</w:t>
+      </w:r>
+    </w:p>
+    <w:p>
+      <w:r>
+        <w:t xml:space="preserve">            download.save_as(str(partial))</w:t>
+      </w:r>
+    </w:p>
+    <w:p>
+      <w:r>
+        <w:t xml:space="preserve">            data=partial.read_bytes()</w:t>
+      </w:r>
+    </w:p>
+    <w:p>
+      <w:r>
+        <w:t xml:space="preserve">            validate(data)</w:t>
+      </w:r>
+    </w:p>
+    <w:p>
+      <w:r>
+        <w:t xml:space="preserve">        except Exception:</w:t>
+      </w:r>
+    </w:p>
+    <w:p>
+      <w:r>
+        <w:t xml:space="preserve">            # XMLHttpRequest avoids the page's patched fetch implementation.</w:t>
+      </w:r>
+    </w:p>
+    <w:p>
+      <w:r>
+        <w:t xml:space="preserve">            try:</w:t>
+      </w:r>
+    </w:p>
+    <w:p>
+      <w:r>
+        <w:t xml:space="preserve">                encoded=page.evaluate("""url =&gt; new Promise((resolve,reject) =&gt; {</w:t>
+      </w:r>
+    </w:p>
+    <w:p>
+      <w:r>
+        <w:t xml:space="preserve">                    const xhr=new XMLHttpRequest();xhr.open('GET',url);xhr.responseType='arraybuffer';xhr.timeout=60000;</w:t>
+      </w:r>
+    </w:p>
+    <w:p>
+      <w:r>
+        <w:t xml:space="preserve">                    xhr.onload=()=&gt;{if(xhr.status &amp;&amp; (xhr.status&lt;200 || xhr.status&gt;=300)){reject(new Error('HTTP '+xhr.status));return;}</w:t>
+      </w:r>
+    </w:p>
+    <w:p>
+      <w:r>
+        <w:t xml:space="preserve">                        const bytes=new Uint8Array(xhr.response);</w:t>
+      </w:r>
+    </w:p>
+    <w:p>
+      <w:r>
+        <w:t xml:space="preserve">                        if(bytes.length&gt;50*1024*1024){reject(new Error('文件超过50MB'));return;}</w:t>
+      </w:r>
+    </w:p>
+    <w:p>
+      <w:r>
+        <w:t xml:space="preserve">                        let binary='';for(let i=0;i&lt;bytes.length;i+=8192)binary+=String.fromCharCode(...bytes.subarray(i,i+8192));resolve(btoa(binary));};</w:t>
+      </w:r>
+    </w:p>
+    <w:p>
+      <w:r>
+        <w:t xml:space="preserve">                    xhr.onerror=()=&gt;reject(new Error('导出下载连接失败'));xhr.ontimeout=()=&gt;reject(new Error('导出下载超时'));xhr.send();</w:t>
+      </w:r>
+    </w:p>
+    <w:p>
+      <w:r>
+        <w:t xml:space="preserve">                })""",download.url)</w:t>
+      </w:r>
+    </w:p>
+    <w:p>
+      <w:r>
+        <w:t xml:space="preserve">                data=base64.b64decode(encoded,validate=True)</w:t>
+      </w:r>
+    </w:p>
+    <w:p>
+      <w:r>
+        <w:t xml:space="preserve">                validate(data)</w:t>
+      </w:r>
+    </w:p>
+    <w:p>
+      <w:r>
+        <w:t xml:space="preserve">            except Exception as error:</w:t>
+      </w:r>
+    </w:p>
+    <w:p>
+      <w:r>
+        <w:t xml:space="preserve">                raise ExportDownloadError('千问文稿导出下载失败，已保留云端记录和本机音频；请稍后重试，无需重新上传') from error</w:t>
+      </w:r>
+    </w:p>
+    <w:p>
+      <w:r>
+        <w:t xml:space="preserve">        partial.write_bytes(data)</w:t>
+      </w:r>
+    </w:p>
+    <w:p>
+      <w:r>
+        <w:t xml:space="preserve">        partial.replace(destination)</w:t>
+      </w:r>
+    </w:p>
+    <w:p>
+      <w:r>
+        <w:t xml:space="preserve">    finally:</w:t>
+      </w:r>
+    </w:p>
+    <w:p>
+      <w:r>
+        <w:t xml:space="preserve">        partial.unlink(missing_ok=True)</w:t>
+      </w:r>
+    </w:p>
+    <w:p/>
+    <w:p>
+      <w:r>
+        <w:t>class TaskContext:</w:t>
+      </w:r>
+    </w:p>
+    <w:p>
+      <w:r>
+        <w:t xml:space="preserve">    def __init__(self,context):</w:t>
+      </w:r>
+    </w:p>
+    <w:p>
+      <w:r>
+        <w:t xml:space="preserve">        self.page=context.new_page()</w:t>
+      </w:r>
+    </w:p>
+    <w:p>
+      <w:r>
+        <w:t xml:space="preserve">        self.pages=[self.page]</w:t>
+      </w:r>
+    </w:p>
+    <w:p>
+      <w:r>
+        <w:t xml:space="preserve">        session=context.new_cdp_session(self.page)</w:t>
+      </w:r>
+    </w:p>
+    <w:p>
+      <w:r>
+        <w:t xml:space="preserve">        target=session.send("Target.getTargetInfo")["targetInfo"]["targetId"]</w:t>
+      </w:r>
+    </w:p>
+    <w:p>
+      <w:r>
+        <w:t xml:space="preserve">        session.detach()</w:t>
+      </w:r>
+    </w:p>
+    <w:p>
+      <w:r>
+        <w:t xml:space="preserve">        self.owner=ROOT/"work/browser-page-owners"/target</w:t>
+      </w:r>
+    </w:p>
+    <w:p>
+      <w:r>
+        <w:t xml:space="preserve">        self.owner.parent.mkdir(exist_ok=True)</w:t>
+      </w:r>
+    </w:p>
+    <w:p>
+      <w:r>
+        <w:t xml:space="preserve">        self.owner.write_text(str(os.getpid()))</w:t>
+      </w:r>
+    </w:p>
+    <w:p/>
+    <w:p>
+      <w:r>
+        <w:t>@contextmanager</w:t>
+      </w:r>
+    </w:p>
+    <w:p>
+      <w:r>
+        <w:t>def browser_context(playwright, headed=False):</w:t>
+      </w:r>
+    </w:p>
+    <w:p>
+      <w:r>
+        <w:t xml:space="preserve">    from browser_service import endpoint</w:t>
+      </w:r>
+    </w:p>
+    <w:p>
+      <w:r>
+        <w:t xml:space="preserve">    from runtime_compat import venv_python,file_lock as fcntl</w:t>
+      </w:r>
+    </w:p>
+    <w:p>
+      <w:r>
+        <w:t xml:space="preserve">    PROFILE.mkdir(parents=True, exist_ok=True)</w:t>
+      </w:r>
+    </w:p>
+    <w:p>
+      <w:r>
+        <w:t xml:space="preserve">    if not headed:</w:t>
+      </w:r>
+    </w:p>
+    <w:p>
+      <w:r>
+        <w:t xml:space="preserve">        if not endpoint():</w:t>
+      </w:r>
+    </w:p>
+    <w:p>
+      <w:r>
+        <w:t xml:space="preserve">            with (ROOT/'work/browser-service.log').open('ab') as log:</w:t>
+      </w:r>
+    </w:p>
+    <w:p>
+      <w:r>
+        <w:t xml:space="preserve">                subprocess.Popen([str(venv_python(ROOT)),str(ROOT/'browser_service.py')],stdout=log,stderr=log,start_new_session=True)</w:t>
+      </w:r>
+    </w:p>
+    <w:p>
+      <w:r>
+        <w:t xml:space="preserve">            for _ in range(40):</w:t>
+      </w:r>
+    </w:p>
+    <w:p>
+      <w:r>
+        <w:t xml:space="preserve">                if endpoint():break</w:t>
+      </w:r>
+    </w:p>
+    <w:p>
+      <w:r>
+        <w:t xml:space="preserve">                time.sleep(.25)</w:t>
+      </w:r>
+    </w:p>
+    <w:p>
+      <w:r>
+        <w:t xml:space="preserve">        address=endpoint()</w:t>
+      </w:r>
+    </w:p>
+    <w:p>
+      <w:r>
+        <w:t xml:space="preserve">        if not address:raise RuntimeError('千问浏览器正在使用中，请关闭登录窗口或稍后重试。')</w:t>
+      </w:r>
+    </w:p>
+    <w:p>
+      <w:r>
+        <w:t xml:space="preserve">        browser=playwright.chromium.connect_over_cdp(address)</w:t>
+      </w:r>
+    </w:p>
+    <w:p>
+      <w:r>
+        <w:t xml:space="preserve">        task=TaskContext(browser.contexts[0])</w:t>
+      </w:r>
+    </w:p>
+    <w:p>
+      <w:r>
+        <w:t xml:space="preserve">        try:yield task</w:t>
+      </w:r>
+    </w:p>
+    <w:p>
+      <w:r>
+        <w:t xml:space="preserve">        finally:</w:t>
+      </w:r>
+    </w:p>
+    <w:p>
+      <w:r>
+        <w:t xml:space="preserve">            try:</w:t>
+      </w:r>
+    </w:p>
+    <w:p>
+      <w:r>
+        <w:t xml:space="preserve">                task.page.close()</w:t>
+      </w:r>
+    </w:p>
+    <w:p>
+      <w:r>
+        <w:t xml:space="preserve">                task.owner.unlink(missing_ok=True)</w:t>
+      </w:r>
+    </w:p>
+    <w:p>
+      <w:r>
+        <w:t xml:space="preserve">            finally:browser.close() # CDP disconnect; shared browser stays alive.</w:t>
+      </w:r>
+    </w:p>
+    <w:p>
+      <w:r>
+        <w:t xml:space="preserve">        return</w:t>
+      </w:r>
+    </w:p>
+    <w:p>
+      <w:r>
+        <w:t xml:space="preserve">    address=endpoint()</w:t>
+      </w:r>
+    </w:p>
+    <w:p>
+      <w:r>
+        <w:t xml:space="preserve">    if address:</w:t>
+      </w:r>
+    </w:p>
+    <w:p>
+      <w:r>
+        <w:t xml:space="preserve">        browser=playwright.chromium.connect_over_cdp(address)</w:t>
+      </w:r>
+    </w:p>
+    <w:p>
+      <w:r>
+        <w:t xml:space="preserve">        if len(browser.contexts[0].pages)&gt;1:</w:t>
+      </w:r>
+    </w:p>
+    <w:p>
+      <w:r>
+        <w:t xml:space="preserve">            browser.close()</w:t>
+      </w:r>
+    </w:p>
+    <w:p>
+      <w:r>
+        <w:t xml:space="preserve">            raise RuntimeError('后台任务仍在使用千问，请等待当前操作完成后登录。')</w:t>
+      </w:r>
+    </w:p>
+    <w:p>
+      <w:r>
+        <w:t xml:space="preserve">        browser.new_browser_cdp_session().send('Browser.close')</w:t>
+      </w:r>
+    </w:p>
+    <w:p>
+      <w:r>
+        <w:t xml:space="preserve">        browser.close()</w:t>
+      </w:r>
+    </w:p>
+    <w:p>
+      <w:r>
+        <w:t xml:space="preserve">        time.sleep(1)</w:t>
+      </w:r>
+    </w:p>
+    <w:p>
+      <w:r>
+        <w:t xml:space="preserve">    with (ROOT/'work/qianwen-browser.lock').open('a') as lock:</w:t>
+      </w:r>
+    </w:p>
+    <w:p>
+      <w:r>
+        <w:t xml:space="preserve">        try:fcntl.flock(lock,fcntl.LOCK_EX|fcntl.LOCK_NB)</w:t>
+      </w:r>
+    </w:p>
+    <w:p>
+      <w:r>
+        <w:t xml:space="preserve">        except BlockingIOError:raise RuntimeError('千问浏览器正在使用中，请关闭登录窗口或等待任务完成后再试。')</w:t>
+      </w:r>
+    </w:p>
+    <w:p>
+      <w:r>
+        <w:t xml:space="preserve">        context=playwright.chromium.launch_persistent_context(str(PROFILE),headless=False,accept_downloads=True,viewport={'width':1920,'height':1600})</w:t>
+      </w:r>
+    </w:p>
+    <w:p>
+      <w:r>
+        <w:t xml:space="preserve">        try:yield context</w:t>
+      </w:r>
+    </w:p>
+    <w:p>
+      <w:r>
+        <w:t xml:space="preserve">        finally:context.close()</w:t>
+      </w:r>
+    </w:p>
+    <w:p/>
+    <w:p>
+      <w:r>
+        <w:t>def check_auth():</w:t>
+      </w:r>
+    </w:p>
+    <w:p>
+      <w:r>
+        <w:t xml:space="preserve">    from playwright.sync_api import sync_playwright</w:t>
+      </w:r>
+    </w:p>
+    <w:p>
+      <w:r>
+        <w:t xml:space="preserve">    with sync_playwright() as p:</w:t>
+      </w:r>
+    </w:p>
+    <w:p>
+      <w:r>
+        <w:t xml:space="preserve">        with browser_context(p) as context:</w:t>
+      </w:r>
+    </w:p>
+    <w:p>
+      <w:r>
+        <w:t xml:space="preserve">            page=context.pages[0];page.goto(URL,wait_until='domcontentloaded')</w:t>
+      </w:r>
+    </w:p>
+    <w:p>
+      <w:r>
+        <w:t xml:space="preserve">            page.wait_for_timeout(1500)</w:t>
+      </w:r>
+    </w:p>
+    <w:p>
+      <w:r>
+        <w:t xml:space="preserve">            require_login_if_visible(page)</w:t>
+      </w:r>
+    </w:p>
+    <w:p>
+      <w:r>
+        <w:t xml:space="preserve">            page.get_by_text('中英文自由说',exact=True).wait_for(timeout=30000)</w:t>
+      </w:r>
+    </w:p>
+    <w:p>
+      <w:r>
+        <w:t xml:space="preserve">            require_login_if_visible(page)</w:t>
+      </w:r>
+    </w:p>
+    <w:p>
+      <w:r>
+        <w:t xml:space="preserve">            auth_state('valid')</w:t>
+      </w:r>
+    </w:p>
+    <w:p/>
+    <w:p/>
+    <w:p>
+      <w:r>
         <w:t>def export_with_retry(audio, job, meta, save):</w:t>
       </w:r>
     </w:p>
@@ -7629,7 +7707,7 @@
     </w:p>
     <w:p>
       <w:r>
-        <w:t xml:space="preserve">        except BrowserTimeout:</w:t>
+        <w:t xml:space="preserve">        except (BrowserTimeout, ExportDownloadError):</w:t>
       </w:r>
     </w:p>
     <w:p>
@@ -13829,6 +13907,72 @@
         <w:t xml:space="preserve">   self.assertFalse(target.exists())</w:t>
       </w:r>
     </w:p>
+    <w:p/>
+    <w:p>
+      <w:r>
+        <w:t xml:space="preserve"> def test_empty_saved_download_uses_recovery(self):</w:t>
+      </w:r>
+    </w:p>
+    <w:p>
+      <w:r>
+        <w:t xml:space="preserve">  stream=io.BytesIO()</w:t>
+      </w:r>
+    </w:p>
+    <w:p>
+      <w:r>
+        <w:t xml:space="preserve">  with zipfile.ZipFile(stream,'w') as z:z.writestr('word/document.xml','&lt;document/&gt;')</w:t>
+      </w:r>
+    </w:p>
+    <w:p>
+      <w:r>
+        <w:t xml:space="preserve">  download=Mock();download.url='blob:export';download.save_as.side_effect=lambda path:Path(path).write_bytes(b'')</w:t>
+      </w:r>
+    </w:p>
+    <w:p>
+      <w:r>
+        <w:t xml:space="preserve">  page=Mock();page.evaluate.return_value=base64.b64encode(stream.getvalue()).decode()</w:t>
+      </w:r>
+    </w:p>
+    <w:p>
+      <w:r>
+        <w:t xml:space="preserve">  with tempfile.TemporaryDirectory() as tmp:</w:t>
+      </w:r>
+    </w:p>
+    <w:p>
+      <w:r>
+        <w:t xml:space="preserve">   target=Path(tmp)/'original.docx';save_export_download(download,page,target);self.assertEqual(target.read_bytes(),stream.getvalue())</w:t>
+      </w:r>
+    </w:p>
+    <w:p>
+      <w:r>
+        <w:t xml:space="preserve"> def test_network_failure_leaves_no_partial_file(self):</w:t>
+      </w:r>
+    </w:p>
+    <w:p>
+      <w:r>
+        <w:t xml:space="preserve">  download=Mock();download.save_as.side_effect=RuntimeError('canceled');page=Mock();page.evaluate.side_effect=RuntimeError('Failed to fetch')</w:t>
+      </w:r>
+    </w:p>
+    <w:p>
+      <w:r>
+        <w:t xml:space="preserve">  with tempfile.TemporaryDirectory() as tmp:</w:t>
+      </w:r>
+    </w:p>
+    <w:p>
+      <w:r>
+        <w:t xml:space="preserve">   target=Path(tmp)/'original.docx'</w:t>
+      </w:r>
+    </w:p>
+    <w:p>
+      <w:r>
+        <w:t xml:space="preserve">   with self.assertRaisesRegex(RuntimeError,'无需重新上传'):save_export_download(download,page,target)</w:t>
+      </w:r>
+    </w:p>
+    <w:p>
+      <w:r>
+        <w:t xml:space="preserve">   self.assertFalse(target.exists());self.assertFalse(target.with_suffix('.partial.docx').exists())</w:t>
+      </w:r>
+    </w:p>
     <w:p>
       <w:r>
         <w:t>```</w:t>
@@ -17884,7 +18028,7 @@
     </w:p>
     <w:p>
       <w:r>
-        <w:t xml:space="preserve">  "qianwen_browser.py": "7988161230d63faf0a86da6a6b5a2bc10c49a91edb92d7095873bb8a3c3b9cdd",</w:t>
+        <w:t xml:space="preserve">  "qianwen_browser.py": "fd2b1abaa5bfcf976950c73b39ea40af78253d407f912d252a265d12d5d84bb3",</w:t>
       </w:r>
     </w:p>
     <w:p>
@@ -17954,7 +18098,7 @@
     </w:p>
     <w:p>
       <w:r>
-        <w:t xml:space="preserve">  "test_export_download.py": "d7d2c3fd4ac63f3fc513a74ef9a296a707066cb2912c5a97443071dfb2255b01",</w:t>
+        <w:t xml:space="preserve">  "test_export_download.py": "fb8ab3834ee3b755a7201375ffb12157e7e8829b89f6bd37a12c03f02e52cd75",</w:t>
       </w:r>
     </w:p>
     <w:p>

</xml_diff>

<commit_message>
Tighten task card text line and paragraph spacing
</commit_message>
<xml_diff>
--- a/安装与使用指南.docx
+++ b/安装与使用指南.docx
@@ -4413,7 +4413,7 @@
     </w:p>
     <w:p>
       <w:r>
-        <w:t>#url::placeholder{color:#757575;opacity:1}#upload-zone{background:#fff;color:#757575;font:inherit;text-align:center;border:1px dashed #c6d1ca;border-radius:8px;padding:12px 14px;cursor:pointer;flex-basis:100%;box-sizing:border-box}#file-name{display:block;font-size:14px;color:#000}#form input[type=url]{order:0}#form button{order:1}#upload-zone{order:2}#qianwen-login{background:#004B93;border-color:#004B93}#qianwen-login:hover{background:#003B75}#form button{background:#D65A00;border-color:#D65A00}#form button:hover{background:#B94D00}.retry-task{background:#FFD54F;border-color:#FFD54F;color:#24322d}.retry-task:hover{background:#FFC928;border-color:#FFC928}#runtime-show{background:#169bb4;border-color:#169bb4}#runtime-show:hover{background:#127e93}#runtime-dialog{width:min(850px,90vw);max-height:85vh;border:1px solid #c6d1ca;border-radius:12px;overflow:auto}#runtime-dialog img{max-width:100%;border:1px solid #ddd}#runtime-dialog::backdrop{background:#0005}.tool-logo{width:122px;height:122px;object-fit:contain;flex:none;margin-right:16px;transform:translate(-6.67px,-3px);transform-origin:top left}h1{display:flex;align-items:flex-start;line-height:1;margin-bottom:16px}.tool-title{color:#287FB8;font-size:58px;line-height:1;font-weight:inherit;min-width:0}.tool-title-main,.tool-title-support{display:block}.tool-title-support{font-size:39px;margin-top:8px;margin-left:-.58em}@media(max-width:800px){.tool-title{font-size:clamp(20px,5.5vw,58px)}.tool-title-support{font-size:.6724em;margin-top:.1333em}.tool-logo{width:2.1034em;height:2.1034em}h1{font-size:clamp(20px,5.5vw,58px)}}.title-actions{display:flex;gap:10px;flex-wrap:wrap;margin-bottom:24px}.title-actions button{font-size:14px;padding:6px 10px;font-weight:normal}&lt;/style&gt;</w:t>
+        <w:t>#url::placeholder{color:#757575;opacity:1}#upload-zone{background:#fff;color:#757575;font:inherit;text-align:center;border:1px dashed #c6d1ca;border-radius:8px;padding:12px 14px;cursor:pointer;flex-basis:100%;box-sizing:border-box}#file-name{display:block;font-size:14px;color:#000}#form input[type=url]{order:0}#form button{order:1}#upload-zone{order:2}#qianwen-login{background:#004B93;border-color:#004B93}#qianwen-login:hover{background:#003B75}#form button{background:#D65A00;border-color:#D65A00}#form button:hover{background:#B94D00}.retry-task{background:#FFD54F;border-color:#FFD54F;color:#24322d}.retry-task:hover{background:#FFC928;border-color:#FFC928}#runtime-show{background:#169bb4;border-color:#169bb4}#runtime-show:hover{background:#127e93}#runtime-dialog{width:min(850px,90vw);max-height:85vh;border:1px solid #c6d1ca;border-radius:12px;overflow:auto}#runtime-dialog img{max-width:100%;border:1px solid #ddd}#runtime-dialog::backdrop{background:#0005}.tool-logo{width:122px;height:122px;object-fit:contain;flex:none;margin-right:16px;transform:translate(-6.67px,-3px);transform-origin:top left}h1{display:flex;align-items:flex-start;line-height:1;margin-bottom:16px}.tool-title{color:#287FB8;font-size:58px;line-height:1;font-weight:inherit;min-width:0}.tool-title-main,.tool-title-support{display:block}.tool-title-support{font-size:39px;margin-top:8px;margin-left:-.58em}@media(max-width:800px){.tool-title{font-size:clamp(20px,5.5vw,58px)}.tool-title-support{font-size:.6724em;margin-top:.1333em}.tool-logo{width:2.1034em;height:2.1034em}h1{font-size:clamp(20px,5.5vw,58px)}}.title-actions{display:flex;gap:10px;flex-wrap:wrap;margin-bottom:24px}.title-actions button{font-size:14px;padding:6px 10px;font-weight:normal}article h2{line-height:1.4;margin-top:14px;margin-bottom:12px}article&gt;p:not(.actions){line-height:1.45;margin-top:10px;margin-bottom:10px}&lt;/style&gt;</w:t>
       </w:r>
     </w:p>
     <w:p>
@@ -17998,7 +17998,7 @@
     </w:p>
     <w:p>
       <w:r>
-        <w:t xml:space="preserve">  "index.html": "e03ef79f87244a42a836ac02fd78eace8fcea43807c27614ba7f1257f57e630c",</w:t>
+        <w:t xml:space="preserve">  "index.html": "147d75919e0caa367260fc60643087bea6b409ed2f20c4a8e1a06ab1150c240d",</w:t>
       </w:r>
     </w:p>
     <w:p>

</xml_diff>

<commit_message>
Slightly narrow task cards and tighten text spacing
</commit_message>
<xml_diff>
--- a/安装与使用指南.docx
+++ b/安装与使用指南.docx
@@ -4413,7 +4413,7 @@
     </w:p>
     <w:p>
       <w:r>
-        <w:t>#url::placeholder{color:#757575;opacity:1}#upload-zone{background:#fff;color:#757575;font:inherit;text-align:center;border:1px dashed #c6d1ca;border-radius:8px;padding:12px 14px;cursor:pointer;flex-basis:100%;box-sizing:border-box}#file-name{display:block;font-size:14px;color:#000}#form input[type=url]{order:0}#form button{order:1}#upload-zone{order:2}#qianwen-login{background:#004B93;border-color:#004B93}#qianwen-login:hover{background:#003B75}#form button{background:#D65A00;border-color:#D65A00}#form button:hover{background:#B94D00}.retry-task{background:#FFD54F;border-color:#FFD54F;color:#24322d}.retry-task:hover{background:#FFC928;border-color:#FFC928}#runtime-show{background:#169bb4;border-color:#169bb4}#runtime-show:hover{background:#127e93}#runtime-dialog{width:min(850px,90vw);max-height:85vh;border:1px solid #c6d1ca;border-radius:12px;overflow:auto}#runtime-dialog img{max-width:100%;border:1px solid #ddd}#runtime-dialog::backdrop{background:#0005}.tool-logo{width:122px;height:122px;object-fit:contain;flex:none;margin-right:16px;transform:translate(-6.67px,-3px);transform-origin:top left}h1{display:flex;align-items:flex-start;line-height:1;margin-bottom:16px}.tool-title{color:#287FB8;font-size:58px;line-height:1;font-weight:inherit;min-width:0}.tool-title-main,.tool-title-support{display:block}.tool-title-support{font-size:39px;margin-top:8px;margin-left:-.58em}@media(max-width:800px){.tool-title{font-size:clamp(20px,5.5vw,58px)}.tool-title-support{font-size:.6724em;margin-top:.1333em}.tool-logo{width:2.1034em;height:2.1034em}h1{font-size:clamp(20px,5.5vw,58px)}}.title-actions{display:flex;gap:10px;flex-wrap:wrap;margin-bottom:24px}.title-actions button{font-size:14px;padding:6px 10px;font-weight:normal}article h2{line-height:1.4;margin-top:14px;margin-bottom:12px}article&gt;p:not(.actions){line-height:1.45;margin-top:10px;margin-bottom:10px}&lt;/style&gt;</w:t>
+        <w:t>#url::placeholder{color:#757575;opacity:1}#upload-zone{background:#fff;color:#757575;font:inherit;text-align:center;border:1px dashed #c6d1ca;border-radius:8px;padding:12px 14px;cursor:pointer;flex-basis:100%;box-sizing:border-box}#file-name{display:block;font-size:14px;color:#000}#form input[type=url]{order:0}#form button{order:1}#upload-zone{order:2}#qianwen-login{background:#004B93;border-color:#004B93}#qianwen-login:hover{background:#003B75}#form button{background:#D65A00;border-color:#D65A00}#form button:hover{background:#B94D00}.retry-task{background:#FFD54F;border-color:#FFD54F;color:#24322d}.retry-task:hover{background:#FFC928;border-color:#FFC928}#runtime-show{background:#169bb4;border-color:#169bb4}#runtime-show:hover{background:#127e93}#runtime-dialog{width:min(850px,90vw);max-height:85vh;border:1px solid #c6d1ca;border-radius:12px;overflow:auto}#runtime-dialog img{max-width:100%;border:1px solid #ddd}#runtime-dialog::backdrop{background:#0005}.tool-logo{width:122px;height:122px;object-fit:contain;flex:none;margin-right:16px;transform:translate(-6.67px,-3px);transform-origin:top left}h1{display:flex;align-items:flex-start;line-height:1;margin-bottom:16px}.tool-title{color:#287FB8;font-size:58px;line-height:1;font-weight:inherit;min-width:0}.tool-title-main,.tool-title-support{display:block}.tool-title-support{font-size:39px;margin-top:8px;margin-left:-.58em}@media(max-width:800px){.tool-title{font-size:clamp(20px,5.5vw,58px)}.tool-title-support{font-size:.6724em;margin-top:.1333em}.tool-logo{width:2.1034em;height:2.1034em}h1{font-size:clamp(20px,5.5vw,58px)}}.title-actions{display:flex;gap:10px;flex-wrap:wrap;margin-bottom:24px}.title-actions button{font-size:14px;padding:6px 10px;font-weight:normal}article{margin-right:24px}article h2{line-height:1.3;margin-top:10px;margin-bottom:8px}article&gt;p:not(.actions){line-height:1.35;margin-top:8px;margin-bottom:8px}@media(max-width:600px){article{margin-right:0}}&lt;/style&gt;</w:t>
       </w:r>
     </w:p>
     <w:p>
@@ -17998,7 +17998,7 @@
     </w:p>
     <w:p>
       <w:r>
-        <w:t xml:space="preserve">  "index.html": "147d75919e0caa367260fc60643087bea6b409ed2f20c4a8e1a06ab1150c240d",</w:t>
+        <w:t xml:space="preserve">  "index.html": "52952764cbfdbc162a689348ac947be4b648fcf52f032c4e541a78bfaaf8d746",</w:t>
       </w:r>
     </w:p>
     <w:p>

</xml_diff>

<commit_message>
Publish tested large-file upload fix and accurate source verification messages
</commit_message>
<xml_diff>
--- a/安装与使用指南.docx
+++ b/安装与使用指南.docx
@@ -683,6 +683,12 @@
     </w:p>
     <w:p/>
     <w:p>
+      <w:r>
+        <w:t>超过50MB的音频改由同一电脑上的浏览器直接选择文件路径，仍遵守千问500MB和6小时限制。YouTube访问验证与千问登录分别提示；匿名下载器未必能复用普通浏览器验证，可使用本地文件入口。</w:t>
+      </w:r>
+    </w:p>
+    <w:p/>
+    <w:p>
       <w:pPr>
         <w:pStyle w:val="Heading1"/>
       </w:pPr>
@@ -7017,7 +7023,7 @@
     </w:p>
     <w:p>
       <w:r>
-        <w:t xml:space="preserve">        if not re.search('存储已满|超限|不足|限制|不翻译|500MB|6小时|登录', message):</w:t>
+        <w:t xml:space="preserve">        if not re.search('存储已满|超限|不足|限制|不翻译|500MB|6小时|登录|50Mb|50MB|Cannot transfer|文件', message):</w:t>
       </w:r>
     </w:p>
     <w:p>
@@ -7383,6 +7389,92 @@
     <w:p/>
     <w:p>
       <w:r>
+        <w:t>def set_local_upload_file(page,chooser,path):</w:t>
+      </w:r>
+    </w:p>
+    <w:p>
+      <w:r>
+        <w:t xml:space="preserve">    """The managed Chromium runs on this host; CDP can select its local files directly."""</w:t>
+      </w:r>
+    </w:p>
+    <w:p>
+      <w:r>
+        <w:t xml:space="preserve">    if path.stat().st_size &lt;= 50*1024*1024:</w:t>
+      </w:r>
+    </w:p>
+    <w:p>
+      <w:r>
+        <w:t xml:space="preserve">        chooser.set_files(str(path))</w:t>
+      </w:r>
+    </w:p>
+    <w:p>
+      <w:r>
+        <w:t xml:space="preserve">        return</w:t>
+      </w:r>
+    </w:p>
+    <w:p>
+      <w:r>
+        <w:t xml:space="preserve">    import uuid</w:t>
+      </w:r>
+    </w:p>
+    <w:p>
+      <w:r>
+        <w:t xml:space="preserve">    marker='local-upload-'+uuid.uuid4().hex</w:t>
+      </w:r>
+    </w:p>
+    <w:p>
+      <w:r>
+        <w:t xml:space="preserve">    chooser.element.evaluate('(element,id)=&gt;element.setAttribute("data-local-upload",id)',marker)</w:t>
+      </w:r>
+    </w:p>
+    <w:p>
+      <w:r>
+        <w:t xml:space="preserve">    session=page.context.new_cdp_session(page)</w:t>
+      </w:r>
+    </w:p>
+    <w:p>
+      <w:r>
+        <w:t xml:space="preserve">    try:</w:t>
+      </w:r>
+    </w:p>
+    <w:p>
+      <w:r>
+        <w:t xml:space="preserve">        root=session.send('DOM.getDocument',{'depth':-1,'pierce':True})['root']['nodeId']</w:t>
+      </w:r>
+    </w:p>
+    <w:p>
+      <w:r>
+        <w:t xml:space="preserve">        node=session.send('DOM.querySelector',{'nodeId':root,'selector':'[data-local-upload="'+marker+'"]'})['nodeId']</w:t>
+      </w:r>
+    </w:p>
+    <w:p>
+      <w:r>
+        <w:t xml:space="preserve">        if not node:raise RuntimeError('未找到上传输入框，请重试')</w:t>
+      </w:r>
+    </w:p>
+    <w:p>
+      <w:r>
+        <w:t xml:space="preserve">        session.send('DOM.setFileInputFiles',{'nodeId':node,'files':[str(path.resolve())]})</w:t>
+      </w:r>
+    </w:p>
+    <w:p>
+      <w:r>
+        <w:t xml:space="preserve">    finally:</w:t>
+      </w:r>
+    </w:p>
+    <w:p>
+      <w:r>
+        <w:t xml:space="preserve">        session.detach()</w:t>
+      </w:r>
+    </w:p>
+    <w:p>
+      <w:r>
+        <w:t xml:space="preserve">        chooser.element.evaluate('(element)=&gt;element.removeAttribute("data-local-upload")')</w:t>
+      </w:r>
+    </w:p>
+    <w:p/>
+    <w:p>
+      <w:r>
         <w:t>class TaskContext:</w:t>
       </w:r>
     </w:p>
@@ -8088,7 +8180,7 @@
     </w:p>
     <w:p>
       <w:r>
-        <w:t xml:space="preserve">                    chooser.value.set_files(str(upload))</w:t>
+        <w:t xml:space="preserve">                    set_local_upload_file(page,chooser.value,upload)</w:t>
       </w:r>
     </w:p>
     <w:p>
@@ -9714,6 +9806,16 @@
     </w:p>
     <w:p>
       <w:r>
+        <w:t xml:space="preserve">            if 'Sign in to confirm' in message and '[youtube]' in message:</w:t>
+      </w:r>
+    </w:p>
+    <w:p>
+      <w:r>
+        <w:t xml:space="preserve">                message='YouTube要求登录或人机验证，当前无法获取音视频；尚未上传千问。请在YouTube完成验证后重试，或使用已取得的本地音视频文件。千问登录不能解决此问题。'</w:t>
+      </w:r>
+    </w:p>
+    <w:p>
+      <w:r>
         <w:t xml:space="preserve">            if 'Fresh cookies' in message and 'Douyin' in message:</w:t>
       </w:r>
     </w:p>
@@ -13973,6 +14075,72 @@
         <w:t xml:space="preserve">   self.assertFalse(target.exists());self.assertFalse(target.with_suffix('.partial.docx').exists())</w:t>
       </w:r>
     </w:p>
+    <w:p/>
+    <w:p>
+      <w:r>
+        <w:t xml:space="preserve"> def test_large_file_uses_local_cdp_path(self):</w:t>
+      </w:r>
+    </w:p>
+    <w:p>
+      <w:r>
+        <w:t xml:space="preserve">  from qianwen_browser import set_local_upload_file</w:t>
+      </w:r>
+    </w:p>
+    <w:p>
+      <w:r>
+        <w:t xml:space="preserve">  with tempfile.TemporaryDirectory() as tmp:</w:t>
+      </w:r>
+    </w:p>
+    <w:p>
+      <w:r>
+        <w:t xml:space="preserve">   path=Path(tmp)/'large.mp3'</w:t>
+      </w:r>
+    </w:p>
+    <w:p>
+      <w:r>
+        <w:t xml:space="preserve">   with path.open('wb') as f:f.truncate(51*1024*1024)</w:t>
+      </w:r>
+    </w:p>
+    <w:p>
+      <w:r>
+        <w:t xml:space="preserve">   chooser=Mock();page=Mock();session=page.context.new_cdp_session.return_value</w:t>
+      </w:r>
+    </w:p>
+    <w:p>
+      <w:r>
+        <w:t xml:space="preserve">   session.send.side_effect=[{'root':{'nodeId':1}},{'nodeId':2},{}]</w:t>
+      </w:r>
+    </w:p>
+    <w:p>
+      <w:r>
+        <w:t xml:space="preserve">   set_local_upload_file(page,chooser,path)</w:t>
+      </w:r>
+    </w:p>
+    <w:p>
+      <w:r>
+        <w:t xml:space="preserve">   chooser.set_files.assert_not_called();session.send.assert_any_call('DOM.setFileInputFiles',{'nodeId':2,'files':[str(path.resolve())]});session.detach.assert_called_once()</w:t>
+      </w:r>
+    </w:p>
+    <w:p>
+      <w:r>
+        <w:t xml:space="preserve"> def test_file_size_error_does_not_suggest_login(self):</w:t>
+      </w:r>
+    </w:p>
+    <w:p>
+      <w:r>
+        <w:t xml:space="preserve">  from qianwen_browser import upload_failure_message</w:t>
+      </w:r>
+    </w:p>
+    <w:p>
+      <w:r>
+        <w:t xml:space="preserve">  error='Cannot transfer files larger than 50Mb'</w:t>
+      </w:r>
+    </w:p>
+    <w:p>
+      <w:r>
+        <w:t xml:space="preserve">  self.assertEqual(upload_failure_message('cloud_uploading',error),error)</w:t>
+      </w:r>
+    </w:p>
     <w:p>
       <w:r>
         <w:t>```</w:t>
@@ -18028,12 +18196,12 @@
     </w:p>
     <w:p>
       <w:r>
-        <w:t xml:space="preserve">  "qianwen_browser.py": "fd2b1abaa5bfcf976950c73b39ea40af78253d407f912d252a265d12d5d84bb3",</w:t>
-      </w:r>
-    </w:p>
-    <w:p>
-      <w:r>
-        <w:t xml:space="preserve">  "reader.py": "c5ca5add9980f167b3566ae4fc1f536f4cd6055da666990fe418640572027566",</w:t>
+        <w:t xml:space="preserve">  "qianwen_browser.py": "9ec0997fe8d21e15c169dd534c6b1686bcdbd4281497aa6a8ac3ad3b1d91e109",</w:t>
+      </w:r>
+    </w:p>
+    <w:p>
+      <w:r>
+        <w:t xml:space="preserve">  "reader.py": "70a3c927f44100b9365c10478f0c46c2c50b4cff17b9662f292fa7e8b5cdd1ea",</w:t>
       </w:r>
     </w:p>
     <w:p>
@@ -18098,7 +18266,7 @@
     </w:p>
     <w:p>
       <w:r>
-        <w:t xml:space="preserve">  "test_export_download.py": "fb8ab3834ee3b755a7201375ffb12157e7e8829b89f6bd37a12c03f02e52cd75",</w:t>
+        <w:t xml:space="preserve">  "test_export_download.py": "9a9df755dd836be1ffdabde04ea1da8021258db75be2c8b89c39c5b48bb3f605",</w:t>
       </w:r>
     </w:p>
     <w:p>

</xml_diff>

<commit_message>
Open isolated human YouTube verification window and retry with its session
</commit_message>
<xml_diff>
--- a/安装与使用指南.docx
+++ b/安装与使用指南.docx
@@ -689,6 +689,12 @@
     </w:p>
     <w:p/>
     <w:p>
+      <w:r>
+        <w:t>YouTube要求登录或人机验证时，会打开隔离的专用浏览器窗口。本人完成验证后关闭该窗口，工具用该窗口的会话重试一次；15分钟未完成则保留任务。不会读取日常浏览器Cookie，验证不保证YouTube允许后台下载。专用资料位于私人work目录，不应公开。</w:t>
+      </w:r>
+    </w:p>
+    <w:p/>
+    <w:p>
       <w:pPr>
         <w:pStyle w:val="Heading1"/>
       </w:pPr>
@@ -4505,7 +4511,7 @@
     </w:p>
     <w:p>
       <w:r>
-        <w:t>const stages={queued:'排队中',downloading:'正在下载',downloaded:'下载完成',diarizing:'正在准备千问识别',transcribing:'正在准备千问识别',cloud_preparing:'正在准备上传音频',cloud_transcribing:'等待千问处理结果或加载文稿页面',extracting_audio:'正在提取音频',cloud_connecting:'正在连接千问并检查登录',cloud_uploading:'正在向千问上传音频',cloud_confirming_upload:'等待千问页面确认上传记录（尚未确认成功）',retry_waiting:'页面加载超时，稍后自动重试',generating_document:'正在生成并检查 Word 文稿',cleaning:'Word 已生成，正在清理原音视频和临时文件',cloud_exporting:'正在导出千问原文 Word',completed:'Word 已生成，可以查看',login_required:'需要重新登录千问',failed:'处理失败，进度已保留'};</w:t>
+        <w:t>const stages={youtube_verifying:'等待YouTube人工验证：请在弹出的窗口完成登录或验证，完成后关闭窗口，工具自动重试',queued:'排队中',downloading:'正在下载',downloaded:'下载完成',diarizing:'正在准备千问识别',transcribing:'正在准备千问识别',cloud_preparing:'正在准备上传音频',cloud_transcribing:'等待千问处理结果或加载文稿页面',extracting_audio:'正在提取音频',cloud_connecting:'正在连接千问并检查登录',cloud_uploading:'正在向千问上传音频',cloud_confirming_upload:'等待千问页面确认上传记录（尚未确认成功）',retry_waiting:'页面加载超时，稍后自动重试',generating_document:'正在生成并检查 Word 文稿',cleaning:'Word 已生成，正在清理原音视频和临时文件',cloud_exporting:'正在导出千问原文 Word',completed:'Word 已生成，可以查看',login_required:'需要重新登录千问',failed:'处理失败，进度已保留'};</w:t>
       </w:r>
     </w:p>
     <w:p>
@@ -9571,7 +9577,57 @@
     </w:p>
     <w:p>
       <w:r>
-        <w:t xml:space="preserve">                        if 'No video formats found' in str(error) and 'bilibili.com' in args.url:</w:t>
+        <w:t xml:space="preserve">                        from youtube_verification import needs_verification,verify</w:t>
+      </w:r>
+    </w:p>
+    <w:p>
+      <w:r>
+        <w:t xml:space="preserve">                        if needs_verification(error):</w:t>
+      </w:r>
+    </w:p>
+    <w:p>
+      <w:r>
+        <w:t xml:space="preserve">                            cookies=verify(download_url(args.url),job,meta,save_json)</w:t>
+      </w:r>
+    </w:p>
+    <w:p>
+      <w:r>
+        <w:t xml:space="preserve">                            meta['state']='downloading';meta.pop('error',None);save_json(job/'job.json',meta)</w:t>
+      </w:r>
+    </w:p>
+    <w:p>
+      <w:r>
+        <w:t xml:space="preserve">                            retry_options=dict(options);retry_options.pop('cookiesfrombrowser',None);retry_options['cookiefile']=str(cookies)</w:t>
+      </w:r>
+    </w:p>
+    <w:p>
+      <w:r>
+        <w:t xml:space="preserve">                            try:</w:t>
+      </w:r>
+    </w:p>
+    <w:p>
+      <w:r>
+        <w:t xml:space="preserve">                                with YoutubeDL(retry_options) as verified_downloader:</w:t>
+      </w:r>
+    </w:p>
+    <w:p>
+      <w:r>
+        <w:t xml:space="preserve">                                    info=verified_downloader.extract_info(download_url(args.url),download=True)</w:t>
+      </w:r>
+    </w:p>
+    <w:p>
+      <w:r>
+        <w:t xml:space="preserve">                            finally:</w:t>
+      </w:r>
+    </w:p>
+    <w:p>
+      <w:r>
+        <w:t xml:space="preserve">                                cookies.unlink(missing_ok=True)</w:t>
+      </w:r>
+    </w:p>
+    <w:p>
+      <w:r>
+        <w:t xml:space="preserve">                        elif 'No video formats found' in str(error) and 'bilibili.com' in args.url:</w:t>
       </w:r>
     </w:p>
     <w:p>
@@ -9581,7 +9637,7 @@
     </w:p>
     <w:p>
       <w:r>
-        <w:t xml:space="preserve">                        raise</w:t>
+        <w:t xml:space="preserve">                        else:raise</w:t>
       </w:r>
     </w:p>
     <w:p>
@@ -17131,7 +17187,7 @@
         <w:pStyle w:val="Heading2"/>
       </w:pPr>
       <w:r>
-        <w:t>FILE: tools/build_guides.py</w:t>
+        <w:t>FILE: test_youtube_verification.py</w:t>
       </w:r>
     </w:p>
     <w:p>
@@ -17141,158 +17197,32 @@
     </w:p>
     <w:p>
       <w:r>
-        <w:t>"""Rebuild public self-contained guides from tracked source; never read work/."""</w:t>
-      </w:r>
-    </w:p>
-    <w:p>
-      <w:r>
-        <w:t>import hashlib</w:t>
-      </w:r>
-    </w:p>
-    <w:p>
-      <w:r>
-        <w:t>import json</w:t>
-      </w:r>
-    </w:p>
-    <w:p>
-      <w:r>
-        <w:t>import subprocess</w:t>
-      </w:r>
-    </w:p>
-    <w:p>
-      <w:r>
-        <w:t>from pathlib import Path</w:t>
-      </w:r>
-    </w:p>
-    <w:p>
-      <w:r>
-        <w:t>from docx import Document</w:t>
-      </w:r>
-    </w:p>
-    <w:p/>
-    <w:p>
-      <w:r>
-        <w:t>ROOT = Path(__file__).resolve().parents[1]</w:t>
-      </w:r>
-    </w:p>
-    <w:p>
-      <w:r>
-        <w:t>files = sorted(subprocess.check_output(['git','ls-files','-z'], cwd=ROOT).decode().split('\0')[:-1])</w:t>
-      </w:r>
-    </w:p>
-    <w:p>
-      <w:r>
-        <w:t>files = sorted(set(files + ['install.sh', 'test_install.py', 'tools/build_guides.py', 'runtime_compat.py', 'test_runtime_compat.py', 'install-windows.ps1', 'install-windows.cmd', 'start-windows.cmd', 'deletion_queue.py', 'test_deletion_queue.py', 'browser_service.py', 'test_browser_service.py', 'runtime_status.py', 'test_runtime_status.py', 'bilibili_download.py', 'test_bilibili_download.py', 'test_export_download.py', 'task_numbering.py', 'test_task_numbering.py', '修复浏览器占用并加载更新.command']))</w:t>
-      </w:r>
-    </w:p>
-    <w:p>
-      <w:r>
-        <w:t>files = [f for f in files if f.endswith(('.py','.sh','.command','.html','.ps1','.cmd')) or f in ('requirements.txt','.gitignore')]</w:t>
-      </w:r>
-    </w:p>
-    <w:p>
-      <w:r>
-        <w:t>checks = {f:hashlib.sha256((ROOT/f).read_bytes()).hexdigest() for f in files}</w:t>
-      </w:r>
-    </w:p>
-    <w:p>
-      <w:r>
-        <w:t>(ROOT/'文件校验.json').write_text(json.dumps(checks,ensure_ascii=False,indent=2)+'\n', encoding="utf-8")</w:t>
-      </w:r>
-    </w:p>
-    <w:p>
-      <w:r>
-        <w:t>text = (ROOT/'README.md').read_text(encoding="utf-8") + '\n## 仅收到本文档：完整源码\n\nAI Agent 可按 FILE 标记逐个提取文件，再核对文件校验.json；运行 `bash install.sh`。仅提取这里列出的公开源码，不迁移他人的登录资料。\n\n'</w:t>
-      </w:r>
-    </w:p>
-    <w:p>
-      <w:r>
-        <w:t>for f in files + ['文件校验.json']:</w:t>
-      </w:r>
-    </w:p>
-    <w:p>
-      <w:r>
-        <w:t xml:space="preserve">    text += f'### FILE: {f}\n```text\n' + (ROOT/f).read_text(encoding="utf-8").rstrip() + '\n```\n\n'</w:t>
-      </w:r>
-    </w:p>
-    <w:p>
-      <w:r>
-        <w:t>(ROOT/'INSTALL_GUIDE.md').write_text(text, encoding="utf-8")</w:t>
-      </w:r>
-    </w:p>
-    <w:p>
-      <w:r>
-        <w:t>doc = Document()</w:t>
-      </w:r>
-    </w:p>
-    <w:p>
-      <w:r>
-        <w:t>in_code = False</w:t>
-      </w:r>
-    </w:p>
-    <w:p>
-      <w:r>
-        <w:t>for line in text.splitlines():</w:t>
-      </w:r>
-    </w:p>
-    <w:p>
-      <w:r>
-        <w:t xml:space="preserve">    if line == '```text':</w:t>
-      </w:r>
-    </w:p>
-    <w:p>
-      <w:r>
-        <w:t xml:space="preserve">        in_code = True</w:t>
-      </w:r>
-    </w:p>
-    <w:p>
-      <w:r>
-        <w:t xml:space="preserve">        doc.add_paragraph(line)</w:t>
-      </w:r>
-    </w:p>
-    <w:p>
-      <w:r>
-        <w:t xml:space="preserve">    elif line == '```' and in_code:</w:t>
-      </w:r>
-    </w:p>
-    <w:p>
-      <w:r>
-        <w:t xml:space="preserve">        in_code = False</w:t>
-      </w:r>
-    </w:p>
-    <w:p>
-      <w:r>
-        <w:t xml:space="preserve">        doc.add_paragraph(line)</w:t>
-      </w:r>
-    </w:p>
-    <w:p>
-      <w:r>
-        <w:t xml:space="preserve">    elif not in_code and line.startswith('# '): doc.add_heading(line[2:],level=0)</w:t>
-      </w:r>
-    </w:p>
-    <w:p>
-      <w:r>
-        <w:t xml:space="preserve">    elif not in_code and line.startswith('## '): doc.add_heading(line[3:],level=1)</w:t>
-      </w:r>
-    </w:p>
-    <w:p>
-      <w:r>
-        <w:t xml:space="preserve">    elif not in_code and line.startswith('### '): doc.add_heading(line[4:],level=2)</w:t>
-      </w:r>
-    </w:p>
-    <w:p>
-      <w:r>
-        <w:t xml:space="preserve">    else: doc.add_paragraph(line)</w:t>
-      </w:r>
-    </w:p>
-    <w:p>
-      <w:r>
-        <w:t>doc.save(ROOT/'安装与使用指南.docx')</w:t>
-      </w:r>
-    </w:p>
-    <w:p>
-      <w:r>
-        <w:t>print(f'Rebuilt guides with {len(files)} public source files.')</w:t>
+        <w:t>import unittest</w:t>
+      </w:r>
+    </w:p>
+    <w:p>
+      <w:r>
+        <w:t>from youtube_verification import needs_verification</w:t>
+      </w:r>
+    </w:p>
+    <w:p>
+      <w:r>
+        <w:t>class VerificationTests(unittest.TestCase):</w:t>
+      </w:r>
+    </w:p>
+    <w:p>
+      <w:r>
+        <w:t xml:space="preserve"> def test_youtube_challenge(self):self.assertTrue(needs_verification("ERROR: [youtube] abc: Sign in to confirm you’re not a bot"))</w:t>
+      </w:r>
+    </w:p>
+    <w:p>
+      <w:r>
+        <w:t xml:space="preserve"> def test_other_failure_does_not_open_window(self):</w:t>
+      </w:r>
+    </w:p>
+    <w:p>
+      <w:r>
+        <w:t xml:space="preserve">  for error in ["HTTP Error 403", "千问未登录", "[youtube] Video unavailable"]:self.assertFalse(needs_verification(error))</w:t>
       </w:r>
     </w:p>
     <w:p>
@@ -17306,7 +17236,7 @@
         <w:pStyle w:val="Heading2"/>
       </w:pPr>
       <w:r>
-        <w:t>FILE: 修复浏览器占用并加载更新.command</w:t>
+        <w:t>FILE: tools/build_guides.py</w:t>
       </w:r>
     </w:p>
     <w:p>
@@ -17316,22 +17246,22 @@
     </w:p>
     <w:p>
       <w:r>
-        <w:t>#!/bin/zsh</w:t>
-      </w:r>
-    </w:p>
-    <w:p>
-      <w:r>
-        <w:t>cd -- "${0:A:h}" || exit 1</w:t>
-      </w:r>
-    </w:p>
-    <w:p>
-      <w:r>
-        <w:t>.venv/bin/python - &lt;&lt;'PY'</w:t>
-      </w:r>
-    </w:p>
-    <w:p>
-      <w:r>
-        <w:t>import json,subprocess,time,os,plistlib</w:t>
+        <w:t>"""Rebuild public self-contained guides from tracked source; never read work/."""</w:t>
+      </w:r>
+    </w:p>
+    <w:p>
+      <w:r>
+        <w:t>import hashlib</w:t>
+      </w:r>
+    </w:p>
+    <w:p>
+      <w:r>
+        <w:t>import json</w:t>
+      </w:r>
+    </w:p>
+    <w:p>
+      <w:r>
+        <w:t>import subprocess</w:t>
       </w:r>
     </w:p>
     <w:p>
@@ -17341,167 +17271,133 @@
     </w:p>
     <w:p>
       <w:r>
-        <w:t>from task_controls import reader_pids,stop_reader</w:t>
-      </w:r>
-    </w:p>
-    <w:p>
-      <w:r>
-        <w:t>from reader import save_json</w:t>
-      </w:r>
-    </w:p>
-    <w:p>
-      <w:r>
-        <w:t>from launch_service import LABEL</w:t>
-      </w:r>
-    </w:p>
-    <w:p>
-      <w:r>
-        <w:t>from browser_service import endpoint</w:t>
-      </w:r>
-    </w:p>
-    <w:p>
-      <w:r>
-        <w:t>root=Path.cwd();work=root/'work'</w:t>
-      </w:r>
-    </w:p>
-    <w:p>
-      <w:r>
-        <w:t>plist=Path.home()/'Library/LaunchAgents'/(LABEL+'.plist')</w:t>
-      </w:r>
-    </w:p>
-    <w:p>
-      <w:r>
-        <w:t>if not plist.exists() or plistlib.loads(plist.read_bytes()).get('WorkingDirectory')!=str(root):raise SystemExit('未找到属于当前项目的自动启动服务，未执行切换。')</w:t>
-      </w:r>
-    </w:p>
-    <w:p>
-      <w:r>
-        <w:t>if not endpoint():</w:t>
-      </w:r>
-    </w:p>
-    <w:p>
-      <w:r>
-        <w:t xml:space="preserve">    owners=set(subprocess.run(['lsof','-t',str(work/'qianwen-browser.lock')],capture_output=True,text=True).stdout.split())</w:t>
-      </w:r>
-    </w:p>
-    <w:p>
-      <w:r>
-        <w:t xml:space="preserve">    for record in (work/'jobs').glob('*/job.json'):</w:t>
-      </w:r>
-    </w:p>
-    <w:p>
-      <w:r>
-        <w:t xml:space="preserve">        verified=reader_pids(root,record.parent)</w:t>
-      </w:r>
-    </w:p>
-    <w:p>
-      <w:r>
-        <w:t xml:space="preserve">        if not owners.intersection(str(pid) for pid in verified):continue</w:t>
-      </w:r>
-    </w:p>
-    <w:p>
-      <w:r>
-        <w:t xml:space="preserve">        for pid in verified:stop_reader(pid)</w:t>
-      </w:r>
-    </w:p>
-    <w:p>
-      <w:r>
-        <w:t xml:space="preserve">        from runtime_compat import file_lock as f</w:t>
-      </w:r>
-    </w:p>
-    <w:p>
-      <w:r>
-        <w:t xml:space="preserve">        with (record.parent/'.prepare.lock').open('a') as lock:</w:t>
-      </w:r>
-    </w:p>
-    <w:p>
-      <w:r>
-        <w:t xml:space="preserve">            deadline=time.monotonic()+20</w:t>
-      </w:r>
-    </w:p>
-    <w:p>
-      <w:r>
-        <w:t xml:space="preserve">            while True:</w:t>
-      </w:r>
-    </w:p>
-    <w:p>
-      <w:r>
-        <w:t xml:space="preserve">                try:f.flock(lock,f.LOCK_EX|f.LOCK_NB);break</w:t>
-      </w:r>
-    </w:p>
-    <w:p>
-      <w:r>
-        <w:t xml:space="preserve">                except BlockingIOError:</w:t>
-      </w:r>
-    </w:p>
-    <w:p>
-      <w:r>
-        <w:t xml:space="preserve">                    if time.monotonic()&gt;deadline:raise SystemExit('旧进程仍未退出，文件和任务已保留。')</w:t>
-      </w:r>
-    </w:p>
-    <w:p>
-      <w:r>
-        <w:t xml:space="preserve">                    time.sleep(.25)</w:t>
-      </w:r>
-    </w:p>
-    <w:p>
-      <w:r>
-        <w:t xml:space="preserve">            meta=json.loads(record.read_text());meta.update(state='queued');meta.pop('error',None);save_json(record,meta)</w:t>
-      </w:r>
-    </w:p>
-    <w:p>
-      <w:r>
-        <w:t xml:space="preserve">            print('已保留媒体和千问提交记录，切换任务：'+meta.get('title',record.parent.name))</w:t>
-      </w:r>
-    </w:p>
-    <w:p>
-      <w:r>
-        <w:t>for record in (work/'jobs').glob('*/job.json'):</w:t>
-      </w:r>
-    </w:p>
-    <w:p>
-      <w:r>
-        <w:t xml:space="preserve">    meta=json.loads(record.read_text())</w:t>
-      </w:r>
-    </w:p>
-    <w:p>
-      <w:r>
-        <w:t xml:space="preserve">    if meta.get('state')=='failed' and '千问浏览器正在使用中' in meta.get('error',''):</w:t>
-      </w:r>
-    </w:p>
-    <w:p>
-      <w:r>
-        <w:t xml:space="preserve">        meta.update(state='queued');meta.pop('error',None);save_json(record,meta)</w:t>
-      </w:r>
-    </w:p>
-    <w:p>
-      <w:r>
-        <w:t>subprocess.run(['/bin/launchctl','kill','SIGTERM',f'gui/{os.getuid()}/{LABEL}'],check=True)</w:t>
-      </w:r>
-    </w:p>
-    <w:p>
-      <w:r>
-        <w:t>print('切换完成。请刷新工具页面，并点击“显示任务状态”查看后台进展。')</w:t>
-      </w:r>
-    </w:p>
-    <w:p>
-      <w:r>
-        <w:t>PY</w:t>
-      </w:r>
-    </w:p>
-    <w:p>
-      <w:r>
-        <w:t>result=$?</w:t>
-      </w:r>
-    </w:p>
-    <w:p>
-      <w:r>
-        <w:t>read '?按回车关闭窗口。'</w:t>
-      </w:r>
-    </w:p>
-    <w:p>
-      <w:r>
-        <w:t>exit "$result"</w:t>
+        <w:t>from docx import Document</w:t>
+      </w:r>
+    </w:p>
+    <w:p/>
+    <w:p>
+      <w:r>
+        <w:t>ROOT = Path(__file__).resolve().parents[1]</w:t>
+      </w:r>
+    </w:p>
+    <w:p>
+      <w:r>
+        <w:t>files = sorted(subprocess.check_output(['git','ls-files','-z'], cwd=ROOT).decode().split('\0')[:-1])</w:t>
+      </w:r>
+    </w:p>
+    <w:p>
+      <w:r>
+        <w:t>files = sorted(set(files + ['install.sh', 'test_install.py', 'tools/build_guides.py', 'runtime_compat.py', 'test_runtime_compat.py', 'install-windows.ps1', 'install-windows.cmd', 'start-windows.cmd', 'deletion_queue.py', 'test_deletion_queue.py', 'browser_service.py', 'test_browser_service.py', 'runtime_status.py', 'test_runtime_status.py', 'bilibili_download.py', 'test_bilibili_download.py', 'test_export_download.py', 'youtube_verification.py', 'test_youtube_verification.py', 'task_numbering.py', 'test_task_numbering.py', '修复浏览器占用并加载更新.command']))</w:t>
+      </w:r>
+    </w:p>
+    <w:p>
+      <w:r>
+        <w:t>files = [f for f in files if f.endswith(('.py','.sh','.command','.html','.ps1','.cmd')) or f in ('requirements.txt','.gitignore')]</w:t>
+      </w:r>
+    </w:p>
+    <w:p>
+      <w:r>
+        <w:t>checks = {f:hashlib.sha256((ROOT/f).read_bytes()).hexdigest() for f in files}</w:t>
+      </w:r>
+    </w:p>
+    <w:p>
+      <w:r>
+        <w:t>(ROOT/'文件校验.json').write_text(json.dumps(checks,ensure_ascii=False,indent=2)+'\n', encoding="utf-8")</w:t>
+      </w:r>
+    </w:p>
+    <w:p>
+      <w:r>
+        <w:t>text = (ROOT/'README.md').read_text(encoding="utf-8") + '\n## 仅收到本文档：完整源码\n\nAI Agent 可按 FILE 标记逐个提取文件，再核对文件校验.json；运行 `bash install.sh`。仅提取这里列出的公开源码，不迁移他人的登录资料。\n\n'</w:t>
+      </w:r>
+    </w:p>
+    <w:p>
+      <w:r>
+        <w:t>for f in files + ['文件校验.json']:</w:t>
+      </w:r>
+    </w:p>
+    <w:p>
+      <w:r>
+        <w:t xml:space="preserve">    text += f'### FILE: {f}\n```text\n' + (ROOT/f).read_text(encoding="utf-8").rstrip() + '\n```\n\n'</w:t>
+      </w:r>
+    </w:p>
+    <w:p>
+      <w:r>
+        <w:t>(ROOT/'INSTALL_GUIDE.md').write_text(text, encoding="utf-8")</w:t>
+      </w:r>
+    </w:p>
+    <w:p>
+      <w:r>
+        <w:t>doc = Document()</w:t>
+      </w:r>
+    </w:p>
+    <w:p>
+      <w:r>
+        <w:t>in_code = False</w:t>
+      </w:r>
+    </w:p>
+    <w:p>
+      <w:r>
+        <w:t>for line in text.splitlines():</w:t>
+      </w:r>
+    </w:p>
+    <w:p>
+      <w:r>
+        <w:t xml:space="preserve">    if line == '```text':</w:t>
+      </w:r>
+    </w:p>
+    <w:p>
+      <w:r>
+        <w:t xml:space="preserve">        in_code = True</w:t>
+      </w:r>
+    </w:p>
+    <w:p>
+      <w:r>
+        <w:t xml:space="preserve">        doc.add_paragraph(line)</w:t>
+      </w:r>
+    </w:p>
+    <w:p>
+      <w:r>
+        <w:t xml:space="preserve">    elif line == '```' and in_code:</w:t>
+      </w:r>
+    </w:p>
+    <w:p>
+      <w:r>
+        <w:t xml:space="preserve">        in_code = False</w:t>
+      </w:r>
+    </w:p>
+    <w:p>
+      <w:r>
+        <w:t xml:space="preserve">        doc.add_paragraph(line)</w:t>
+      </w:r>
+    </w:p>
+    <w:p>
+      <w:r>
+        <w:t xml:space="preserve">    elif not in_code and line.startswith('# '): doc.add_heading(line[2:],level=0)</w:t>
+      </w:r>
+    </w:p>
+    <w:p>
+      <w:r>
+        <w:t xml:space="preserve">    elif not in_code and line.startswith('## '): doc.add_heading(line[3:],level=1)</w:t>
+      </w:r>
+    </w:p>
+    <w:p>
+      <w:r>
+        <w:t xml:space="preserve">    elif not in_code and line.startswith('### '): doc.add_heading(line[4:],level=2)</w:t>
+      </w:r>
+    </w:p>
+    <w:p>
+      <w:r>
+        <w:t xml:space="preserve">    else: doc.add_paragraph(line)</w:t>
+      </w:r>
+    </w:p>
+    <w:p>
+      <w:r>
+        <w:t>doc.save(ROOT/'安装与使用指南.docx')</w:t>
+      </w:r>
+    </w:p>
+    <w:p>
+      <w:r>
+        <w:t>print(f'Rebuilt guides with {len(files)} public source files.')</w:t>
       </w:r>
     </w:p>
     <w:p>
@@ -17515,7 +17411,7 @@
         <w:pStyle w:val="Heading2"/>
       </w:pPr>
       <w:r>
-        <w:t>FILE: 停用自动启动.command</w:t>
+        <w:t>FILE: youtube_verification.py</w:t>
       </w:r>
     </w:p>
     <w:p>
@@ -17525,32 +17421,194 @@
     </w:p>
     <w:p>
       <w:r>
-        <w:t>#!/bin/zsh</w:t>
-      </w:r>
-    </w:p>
-    <w:p>
-      <w:r>
-        <w:t>cd "${0:A:h}" || exit 1</w:t>
-      </w:r>
-    </w:p>
-    <w:p>
-      <w:r>
-        <w:t>.venv/bin/python launch_service.py uninstall --port 8767</w:t>
-      </w:r>
-    </w:p>
-    <w:p>
-      <w:r>
-        <w:t>result=$?</w:t>
-      </w:r>
-    </w:p>
-    <w:p>
-      <w:r>
-        <w:t>read 'reply?按回车关闭窗口。'</w:t>
-      </w:r>
-    </w:p>
-    <w:p>
-      <w:r>
-        <w:t>exit $result</w:t>
+        <w:t>"""Human verification in an isolated visible browser; never reads everyday browser cookies."""</w:t>
+      </w:r>
+    </w:p>
+    <w:p>
+      <w:r>
+        <w:t>import os,time</w:t>
+      </w:r>
+    </w:p>
+    <w:p>
+      <w:r>
+        <w:t>from pathlib import Path</w:t>
+      </w:r>
+    </w:p>
+    <w:p>
+      <w:r>
+        <w:t>from http.cookiejar import MozillaCookieJar,Cookie</w:t>
+      </w:r>
+    </w:p>
+    <w:p/>
+    <w:p>
+      <w:r>
+        <w:t>def needs_verification(message):</w:t>
+      </w:r>
+    </w:p>
+    <w:p>
+      <w:r>
+        <w:t xml:space="preserve">    return '[youtube]' in str(message) and 'Sign in to confirm' in str(message)</w:t>
+      </w:r>
+    </w:p>
+    <w:p/>
+    <w:p>
+      <w:r>
+        <w:t>def verify(url,job,meta,save,timeout=900):</w:t>
+      </w:r>
+    </w:p>
+    <w:p>
+      <w:r>
+        <w:t xml:space="preserve">    from playwright.sync_api import sync_playwright</w:t>
+      </w:r>
+    </w:p>
+    <w:p>
+      <w:r>
+        <w:t xml:space="preserve">    os.environ.setdefault('PLAYWRIGHT_BROWSERS_PATH',str(Path(__file__).resolve().parent/'work/browser-bin'))</w:t>
+      </w:r>
+    </w:p>
+    <w:p>
+      <w:r>
+        <w:t xml:space="preserve">    cookiefile=job/'youtube-session.cookies'</w:t>
+      </w:r>
+    </w:p>
+    <w:p>
+      <w:r>
+        <w:t xml:space="preserve">    meta.update(state='youtube_verifying',error='请在弹出的YouTube专用窗口登录或完成人机验证，完成后关闭该窗口；工具将自动重试下载。')</w:t>
+      </w:r>
+    </w:p>
+    <w:p>
+      <w:r>
+        <w:t xml:space="preserve">    save(job/'job.json',meta)</w:t>
+      </w:r>
+    </w:p>
+    <w:p>
+      <w:r>
+        <w:t xml:space="preserve">    try:</w:t>
+      </w:r>
+    </w:p>
+    <w:p>
+      <w:r>
+        <w:t xml:space="preserve">        with sync_playwright() as p:</w:t>
+      </w:r>
+    </w:p>
+    <w:p>
+      <w:r>
+        <w:t xml:space="preserve">            context=p.chromium.launch_persistent_context(str(job/'youtube-browser-profile'),headless=False)</w:t>
+      </w:r>
+    </w:p>
+    <w:p>
+      <w:r>
+        <w:t xml:space="preserve">            try:</w:t>
+      </w:r>
+    </w:p>
+    <w:p>
+      <w:r>
+        <w:t xml:space="preserve">                page=context.pages[0] if context.pages else context.new_page()</w:t>
+      </w:r>
+    </w:p>
+    <w:p>
+      <w:r>
+        <w:t xml:space="preserve">                page.goto(url,wait_until='domcontentloaded',timeout=60000)</w:t>
+      </w:r>
+    </w:p>
+    <w:p>
+      <w:r>
+        <w:t xml:space="preserve">                deadline=time.monotonic()+timeout</w:t>
+      </w:r>
+    </w:p>
+    <w:p>
+      <w:r>
+        <w:t xml:space="preserve">                jar=MozillaCookieJar(str(cookiefile))</w:t>
+      </w:r>
+    </w:p>
+    <w:p>
+      <w:r>
+        <w:t xml:space="preserve">                while context.pages:</w:t>
+      </w:r>
+    </w:p>
+    <w:p>
+      <w:r>
+        <w:t xml:space="preserve">                    if time.monotonic()&gt;deadline:raise RuntimeError('YouTube人工验证等待超过15分钟，请重试后完成验证')</w:t>
+      </w:r>
+    </w:p>
+    <w:p>
+      <w:r>
+        <w:t xml:space="preserve">                    try:</w:t>
+      </w:r>
+    </w:p>
+    <w:p>
+      <w:r>
+        <w:t xml:space="preserve">                        for c in context.cookies():</w:t>
+      </w:r>
+    </w:p>
+    <w:p>
+      <w:r>
+        <w:t xml:space="preserve">                            if not any((c['domain'].lstrip('.')==d or c['domain'].lstrip('.').endswith('.'+d)) for d in ('youtube.com','google.com')):continue</w:t>
+      </w:r>
+    </w:p>
+    <w:p>
+      <w:r>
+        <w:t xml:space="preserve">                            expires=int(c['expires']) if c.get('expires',-1)&gt;0 else None</w:t>
+      </w:r>
+    </w:p>
+    <w:p>
+      <w:r>
+        <w:t xml:space="preserve">                            jar.set_cookie(Cookie(0,c['name'],c['value'],None,False,c['domain'],True,c['domain'].startswith('.'),c['path'],True,c['secure'],expires,expires is None,None,None,{},False))</w:t>
+      </w:r>
+    </w:p>
+    <w:p>
+      <w:r>
+        <w:t xml:space="preserve">                        jar.save(ignore_discard=True,ignore_expires=True);cookiefile.chmod(0o600)</w:t>
+      </w:r>
+    </w:p>
+    <w:p>
+      <w:r>
+        <w:t xml:space="preserve">                        context.pages[-1].wait_for_timeout(1000)</w:t>
+      </w:r>
+    </w:p>
+    <w:p>
+      <w:r>
+        <w:t xml:space="preserve">                    except Exception:</w:t>
+      </w:r>
+    </w:p>
+    <w:p>
+      <w:r>
+        <w:t xml:space="preserve">                        if not context.pages:break</w:t>
+      </w:r>
+    </w:p>
+    <w:p>
+      <w:r>
+        <w:t xml:space="preserve">                        raise</w:t>
+      </w:r>
+    </w:p>
+    <w:p>
+      <w:r>
+        <w:t xml:space="preserve">                if not cookiefile.exists():raise RuntimeError('未获得YouTube验证会话，请重新打开验证窗口')</w:t>
+      </w:r>
+    </w:p>
+    <w:p>
+      <w:r>
+        <w:t xml:space="preserve">                return cookiefile</w:t>
+      </w:r>
+    </w:p>
+    <w:p>
+      <w:r>
+        <w:t xml:space="preserve">            finally:</w:t>
+      </w:r>
+    </w:p>
+    <w:p>
+      <w:r>
+        <w:t xml:space="preserve">                context.close()</w:t>
+      </w:r>
+    </w:p>
+    <w:p>
+      <w:r>
+        <w:t xml:space="preserve">    except Exception as error:</w:t>
+      </w:r>
+    </w:p>
+    <w:p>
+      <w:r>
+        <w:t xml:space="preserve">        raise RuntimeError('YouTube验证窗口未能完成：'+str(error)) from error</w:t>
       </w:r>
     </w:p>
     <w:p>
@@ -17564,7 +17622,7 @@
         <w:pStyle w:val="Heading2"/>
       </w:pPr>
       <w:r>
-        <w:t>FILE: 切换千问并清理本地模型.command</w:t>
+        <w:t>FILE: 修复浏览器占用并加载更新.command</w:t>
       </w:r>
     </w:p>
     <w:p>
@@ -17584,32 +17642,167 @@
     </w:p>
     <w:p>
       <w:r>
-        <w:t>uid_value=$(id -u)</w:t>
-      </w:r>
-    </w:p>
-    <w:p>
-      <w:r>
-        <w:t>service="gui/$uid_value/com.zhangjp.web-video-to-word"</w:t>
-      </w:r>
-    </w:p>
-    <w:p>
-      <w:r>
-        <w:t>plist="$HOME/Library/LaunchAgents/com.zhangjp.web-video-to-word.plist"</w:t>
-      </w:r>
-    </w:p>
-    <w:p>
-      <w:r>
-        <w:t># Temporarily unload to prevent an old worker restarting during migration.</w:t>
-      </w:r>
-    </w:p>
-    <w:p>
-      <w:r>
-        <w:t>/bin/launchctl bootout "$service" 2&gt;/dev/null || true</w:t>
-      </w:r>
-    </w:p>
-    <w:p>
-      <w:r>
-        <w:t>.venv/bin/python cloud_migration.py</w:t>
+        <w:t>.venv/bin/python - &lt;&lt;'PY'</w:t>
+      </w:r>
+    </w:p>
+    <w:p>
+      <w:r>
+        <w:t>import json,subprocess,time,os,plistlib</w:t>
+      </w:r>
+    </w:p>
+    <w:p>
+      <w:r>
+        <w:t>from pathlib import Path</w:t>
+      </w:r>
+    </w:p>
+    <w:p>
+      <w:r>
+        <w:t>from task_controls import reader_pids,stop_reader</w:t>
+      </w:r>
+    </w:p>
+    <w:p>
+      <w:r>
+        <w:t>from reader import save_json</w:t>
+      </w:r>
+    </w:p>
+    <w:p>
+      <w:r>
+        <w:t>from launch_service import LABEL</w:t>
+      </w:r>
+    </w:p>
+    <w:p>
+      <w:r>
+        <w:t>from browser_service import endpoint</w:t>
+      </w:r>
+    </w:p>
+    <w:p>
+      <w:r>
+        <w:t>root=Path.cwd();work=root/'work'</w:t>
+      </w:r>
+    </w:p>
+    <w:p>
+      <w:r>
+        <w:t>plist=Path.home()/'Library/LaunchAgents'/(LABEL+'.plist')</w:t>
+      </w:r>
+    </w:p>
+    <w:p>
+      <w:r>
+        <w:t>if not plist.exists() or plistlib.loads(plist.read_bytes()).get('WorkingDirectory')!=str(root):raise SystemExit('未找到属于当前项目的自动启动服务，未执行切换。')</w:t>
+      </w:r>
+    </w:p>
+    <w:p>
+      <w:r>
+        <w:t>if not endpoint():</w:t>
+      </w:r>
+    </w:p>
+    <w:p>
+      <w:r>
+        <w:t xml:space="preserve">    owners=set(subprocess.run(['lsof','-t',str(work/'qianwen-browser.lock')],capture_output=True,text=True).stdout.split())</w:t>
+      </w:r>
+    </w:p>
+    <w:p>
+      <w:r>
+        <w:t xml:space="preserve">    for record in (work/'jobs').glob('*/job.json'):</w:t>
+      </w:r>
+    </w:p>
+    <w:p>
+      <w:r>
+        <w:t xml:space="preserve">        verified=reader_pids(root,record.parent)</w:t>
+      </w:r>
+    </w:p>
+    <w:p>
+      <w:r>
+        <w:t xml:space="preserve">        if not owners.intersection(str(pid) for pid in verified):continue</w:t>
+      </w:r>
+    </w:p>
+    <w:p>
+      <w:r>
+        <w:t xml:space="preserve">        for pid in verified:stop_reader(pid)</w:t>
+      </w:r>
+    </w:p>
+    <w:p>
+      <w:r>
+        <w:t xml:space="preserve">        from runtime_compat import file_lock as f</w:t>
+      </w:r>
+    </w:p>
+    <w:p>
+      <w:r>
+        <w:t xml:space="preserve">        with (record.parent/'.prepare.lock').open('a') as lock:</w:t>
+      </w:r>
+    </w:p>
+    <w:p>
+      <w:r>
+        <w:t xml:space="preserve">            deadline=time.monotonic()+20</w:t>
+      </w:r>
+    </w:p>
+    <w:p>
+      <w:r>
+        <w:t xml:space="preserve">            while True:</w:t>
+      </w:r>
+    </w:p>
+    <w:p>
+      <w:r>
+        <w:t xml:space="preserve">                try:f.flock(lock,f.LOCK_EX|f.LOCK_NB);break</w:t>
+      </w:r>
+    </w:p>
+    <w:p>
+      <w:r>
+        <w:t xml:space="preserve">                except BlockingIOError:</w:t>
+      </w:r>
+    </w:p>
+    <w:p>
+      <w:r>
+        <w:t xml:space="preserve">                    if time.monotonic()&gt;deadline:raise SystemExit('旧进程仍未退出，文件和任务已保留。')</w:t>
+      </w:r>
+    </w:p>
+    <w:p>
+      <w:r>
+        <w:t xml:space="preserve">                    time.sleep(.25)</w:t>
+      </w:r>
+    </w:p>
+    <w:p>
+      <w:r>
+        <w:t xml:space="preserve">            meta=json.loads(record.read_text());meta.update(state='queued');meta.pop('error',None);save_json(record,meta)</w:t>
+      </w:r>
+    </w:p>
+    <w:p>
+      <w:r>
+        <w:t xml:space="preserve">            print('已保留媒体和千问提交记录，切换任务：'+meta.get('title',record.parent.name))</w:t>
+      </w:r>
+    </w:p>
+    <w:p>
+      <w:r>
+        <w:t>for record in (work/'jobs').glob('*/job.json'):</w:t>
+      </w:r>
+    </w:p>
+    <w:p>
+      <w:r>
+        <w:t xml:space="preserve">    meta=json.loads(record.read_text())</w:t>
+      </w:r>
+    </w:p>
+    <w:p>
+      <w:r>
+        <w:t xml:space="preserve">    if meta.get('state')=='failed' and '千问浏览器正在使用中' in meta.get('error',''):</w:t>
+      </w:r>
+    </w:p>
+    <w:p>
+      <w:r>
+        <w:t xml:space="preserve">        meta.update(state='queued');meta.pop('error',None);save_json(record,meta)</w:t>
+      </w:r>
+    </w:p>
+    <w:p>
+      <w:r>
+        <w:t>subprocess.run(['/bin/launchctl','kill','SIGTERM',f'gui/{os.getuid()}/{LABEL}'],check=True)</w:t>
+      </w:r>
+    </w:p>
+    <w:p>
+      <w:r>
+        <w:t>print('切换完成。请刷新工具页面，并点击“显示任务状态”查看后台进展。')</w:t>
+      </w:r>
+    </w:p>
+    <w:p>
+      <w:r>
+        <w:t>PY</w:t>
       </w:r>
     </w:p>
     <w:p>
@@ -17619,37 +17812,12 @@
     </w:p>
     <w:p>
       <w:r>
-        <w:t>/bin/launchctl bootstrap "gui/$uid_value" "$plist" 2&gt;/dev/null || /bin/launchctl kickstart "$service"</w:t>
-      </w:r>
-    </w:p>
-    <w:p>
-      <w:r>
-        <w:t>if (( result != 0 )); then</w:t>
-      </w:r>
-    </w:p>
-    <w:p>
-      <w:r>
-        <w:t xml:space="preserve"> print '迁移未完成，请把以上错误发给 Codex。'</w:t>
-      </w:r>
-    </w:p>
-    <w:p>
-      <w:r>
-        <w:t>else</w:t>
-      </w:r>
-    </w:p>
-    <w:p>
-      <w:r>
-        <w:t xml:space="preserve"> print '已完成千问专用版切换。刷新工具页面即可。'</w:t>
-      </w:r>
-    </w:p>
-    <w:p>
-      <w:r>
-        <w:t>fi</w:t>
-      </w:r>
-    </w:p>
-    <w:p>
-      <w:r>
         <w:t>read '?按回车关闭窗口。'</w:t>
+      </w:r>
+    </w:p>
+    <w:p>
+      <w:r>
+        <w:t>exit "$result"</w:t>
       </w:r>
     </w:p>
     <w:p>
@@ -17663,7 +17831,7 @@
         <w:pStyle w:val="Heading2"/>
       </w:pPr>
       <w:r>
-        <w:t>FILE: 加载本次更新.command</w:t>
+        <w:t>FILE: 停用自动启动.command</w:t>
       </w:r>
     </w:p>
     <w:p>
@@ -17678,77 +17846,12 @@
     </w:p>
     <w:p>
       <w:r>
-        <w:t>cd -- "${0:A:h}" || exit 1</w:t>
-      </w:r>
-    </w:p>
-    <w:p>
-      <w:r>
-        <w:t>.venv/bin/python - &lt;&lt;'PY'</w:t>
-      </w:r>
-    </w:p>
-    <w:p>
-      <w:r>
-        <w:t>import os, plistlib, subprocess</w:t>
-      </w:r>
-    </w:p>
-    <w:p>
-      <w:r>
-        <w:t>from pathlib import Path</w:t>
-      </w:r>
-    </w:p>
-    <w:p>
-      <w:r>
-        <w:t>from launch_service import LABEL</w:t>
-      </w:r>
-    </w:p>
-    <w:p>
-      <w:r>
-        <w:t>root=Path.cwd()</w:t>
-      </w:r>
-    </w:p>
-    <w:p>
-      <w:r>
-        <w:t>path=Path.home()/'Library/LaunchAgents'/(LABEL+'.plist')</w:t>
-      </w:r>
-    </w:p>
-    <w:p>
-      <w:r>
-        <w:t>if not path.exists():</w:t>
-      </w:r>
-    </w:p>
-    <w:p>
-      <w:r>
-        <w:t xml:space="preserve">    raise SystemExit('尚未启用自动启动。请先关闭手动网页服务，再运行启动工具.command。')</w:t>
-      </w:r>
-    </w:p>
-    <w:p>
-      <w:r>
-        <w:t>config=plistlib.loads(path.read_bytes())</w:t>
-      </w:r>
-    </w:p>
-    <w:p>
-      <w:r>
-        <w:t>if config.get('WorkingDirectory')!=str(root):</w:t>
-      </w:r>
-    </w:p>
-    <w:p>
-      <w:r>
-        <w:t xml:space="preserve">    raise SystemExit('自动启动项属于另一个项目副本，未停止服务。')</w:t>
-      </w:r>
-    </w:p>
-    <w:p>
-      <w:r>
-        <w:t>subprocess.run(['/bin/launchctl','kill','SIGTERM',f'gui/{os.getuid()}/{LABEL}'],check=True)</w:t>
-      </w:r>
-    </w:p>
-    <w:p>
-      <w:r>
-        <w:t>print('网页服务正在自动恢复。请稍后刷新工具页面。正在识别的任务会保留。')</w:t>
-      </w:r>
-    </w:p>
-    <w:p>
-      <w:r>
-        <w:t>PY</w:t>
+        <w:t>cd "${0:A:h}" || exit 1</w:t>
+      </w:r>
+    </w:p>
+    <w:p>
+      <w:r>
+        <w:t>.venv/bin/python launch_service.py uninstall --port 8767</w:t>
       </w:r>
     </w:p>
     <w:p>
@@ -17758,12 +17861,12 @@
     </w:p>
     <w:p>
       <w:r>
-        <w:t>read '?按回车关闭窗口。'</w:t>
-      </w:r>
-    </w:p>
-    <w:p>
-      <w:r>
-        <w:t>exit "$result"</w:t>
+        <w:t>read 'reply?按回车关闭窗口。'</w:t>
+      </w:r>
+    </w:p>
+    <w:p>
+      <w:r>
+        <w:t>exit $result</w:t>
       </w:r>
     </w:p>
     <w:p>
@@ -17777,7 +17880,7 @@
         <w:pStyle w:val="Heading2"/>
       </w:pPr>
       <w:r>
-        <w:t>FILE: 启动工具.command</w:t>
+        <w:t>FILE: 切换千问并清理本地模型.command</w:t>
       </w:r>
     </w:p>
     <w:p>
@@ -17792,12 +17895,37 @@
     </w:p>
     <w:p>
       <w:r>
-        <w:t>cd "${0:A:h}" || exit 1</w:t>
-      </w:r>
-    </w:p>
-    <w:p>
-      <w:r>
-        <w:t>/bin/bash install.sh --start-only --open</w:t>
+        <w:t>cd -- "${0:A:h}" || exit 1</w:t>
+      </w:r>
+    </w:p>
+    <w:p>
+      <w:r>
+        <w:t>uid_value=$(id -u)</w:t>
+      </w:r>
+    </w:p>
+    <w:p>
+      <w:r>
+        <w:t>service="gui/$uid_value/com.zhangjp.web-video-to-word"</w:t>
+      </w:r>
+    </w:p>
+    <w:p>
+      <w:r>
+        <w:t>plist="$HOME/Library/LaunchAgents/com.zhangjp.web-video-to-word.plist"</w:t>
+      </w:r>
+    </w:p>
+    <w:p>
+      <w:r>
+        <w:t># Temporarily unload to prevent an old worker restarting during migration.</w:t>
+      </w:r>
+    </w:p>
+    <w:p>
+      <w:r>
+        <w:t>/bin/launchctl bootout "$service" 2&gt;/dev/null || true</w:t>
+      </w:r>
+    </w:p>
+    <w:p>
+      <w:r>
+        <w:t>.venv/bin/python cloud_migration.py</w:t>
       </w:r>
     </w:p>
     <w:p>
@@ -17807,12 +17935,37 @@
     </w:p>
     <w:p>
       <w:r>
-        <w:t>if (( result != 0 )); then read 'reply?请按上方提示处理；按回车关闭窗口。'; fi</w:t>
-      </w:r>
-    </w:p>
-    <w:p>
-      <w:r>
-        <w:t>exit $result</w:t>
+        <w:t>/bin/launchctl bootstrap "gui/$uid_value" "$plist" 2&gt;/dev/null || /bin/launchctl kickstart "$service"</w:t>
+      </w:r>
+    </w:p>
+    <w:p>
+      <w:r>
+        <w:t>if (( result != 0 )); then</w:t>
+      </w:r>
+    </w:p>
+    <w:p>
+      <w:r>
+        <w:t xml:space="preserve"> print '迁移未完成，请把以上错误发给 Codex。'</w:t>
+      </w:r>
+    </w:p>
+    <w:p>
+      <w:r>
+        <w:t>else</w:t>
+      </w:r>
+    </w:p>
+    <w:p>
+      <w:r>
+        <w:t xml:space="preserve"> print '已完成千问专用版切换。刷新工具页面即可。'</w:t>
+      </w:r>
+    </w:p>
+    <w:p>
+      <w:r>
+        <w:t>fi</w:t>
+      </w:r>
+    </w:p>
+    <w:p>
+      <w:r>
+        <w:t>read '?按回车关闭窗口。'</w:t>
       </w:r>
     </w:p>
     <w:p>
@@ -17826,7 +17979,7 @@
         <w:pStyle w:val="Heading2"/>
       </w:pPr>
       <w:r>
-        <w:t>FILE: 启用自动启动.command</w:t>
+        <w:t>FILE: 加载本次更新.command</w:t>
       </w:r>
     </w:p>
     <w:p>
@@ -17841,12 +17994,77 @@
     </w:p>
     <w:p>
       <w:r>
-        <w:t>cd "${0:A:h}" || exit 1</w:t>
-      </w:r>
-    </w:p>
-    <w:p>
-      <w:r>
-        <w:t>.venv/bin/python launch_service.py install --port 8767</w:t>
+        <w:t>cd -- "${0:A:h}" || exit 1</w:t>
+      </w:r>
+    </w:p>
+    <w:p>
+      <w:r>
+        <w:t>.venv/bin/python - &lt;&lt;'PY'</w:t>
+      </w:r>
+    </w:p>
+    <w:p>
+      <w:r>
+        <w:t>import os, plistlib, subprocess</w:t>
+      </w:r>
+    </w:p>
+    <w:p>
+      <w:r>
+        <w:t>from pathlib import Path</w:t>
+      </w:r>
+    </w:p>
+    <w:p>
+      <w:r>
+        <w:t>from launch_service import LABEL</w:t>
+      </w:r>
+    </w:p>
+    <w:p>
+      <w:r>
+        <w:t>root=Path.cwd()</w:t>
+      </w:r>
+    </w:p>
+    <w:p>
+      <w:r>
+        <w:t>path=Path.home()/'Library/LaunchAgents'/(LABEL+'.plist')</w:t>
+      </w:r>
+    </w:p>
+    <w:p>
+      <w:r>
+        <w:t>if not path.exists():</w:t>
+      </w:r>
+    </w:p>
+    <w:p>
+      <w:r>
+        <w:t xml:space="preserve">    raise SystemExit('尚未启用自动启动。请先关闭手动网页服务，再运行启动工具.command。')</w:t>
+      </w:r>
+    </w:p>
+    <w:p>
+      <w:r>
+        <w:t>config=plistlib.loads(path.read_bytes())</w:t>
+      </w:r>
+    </w:p>
+    <w:p>
+      <w:r>
+        <w:t>if config.get('WorkingDirectory')!=str(root):</w:t>
+      </w:r>
+    </w:p>
+    <w:p>
+      <w:r>
+        <w:t xml:space="preserve">    raise SystemExit('自动启动项属于另一个项目副本，未停止服务。')</w:t>
+      </w:r>
+    </w:p>
+    <w:p>
+      <w:r>
+        <w:t>subprocess.run(['/bin/launchctl','kill','SIGTERM',f'gui/{os.getuid()}/{LABEL}'],check=True)</w:t>
+      </w:r>
+    </w:p>
+    <w:p>
+      <w:r>
+        <w:t>print('网页服务正在自动恢复。请稍后刷新工具页面。正在识别的任务会保留。')</w:t>
+      </w:r>
+    </w:p>
+    <w:p>
+      <w:r>
+        <w:t>PY</w:t>
       </w:r>
     </w:p>
     <w:p>
@@ -17856,12 +18074,12 @@
     </w:p>
     <w:p>
       <w:r>
-        <w:t>read 'reply?按回车关闭窗口。'</w:t>
-      </w:r>
-    </w:p>
-    <w:p>
-      <w:r>
-        <w:t>exit $result</w:t>
+        <w:t>read '?按回车关闭窗口。'</w:t>
+      </w:r>
+    </w:p>
+    <w:p>
+      <w:r>
+        <w:t>exit "$result"</w:t>
       </w:r>
     </w:p>
     <w:p>
@@ -17875,7 +18093,7 @@
         <w:pStyle w:val="Heading2"/>
       </w:pPr>
       <w:r>
-        <w:t>FILE: 测试千问后台流程.command</w:t>
+        <w:t>FILE: 启动工具.command</w:t>
       </w:r>
     </w:p>
     <w:p>
@@ -17890,22 +18108,12 @@
     </w:p>
     <w:p>
       <w:r>
-        <w:t>cd -- "${0:A:h}" || exit 1</w:t>
-      </w:r>
-    </w:p>
-    <w:p>
-      <w:r>
-        <w:t>export SSL_CERT_FILE=/etc/ssl/cert.pem</w:t>
-      </w:r>
-    </w:p>
-    <w:p>
-      <w:r>
-        <w:t>export NODE_EXTRA_CA_CERTS=/etc/ssl/cert.pem</w:t>
-      </w:r>
-    </w:p>
-    <w:p>
-      <w:r>
-        <w:t>.venv/bin/python smoke_qianwen_runner.py</w:t>
+        <w:t>cd "${0:A:h}" || exit 1</w:t>
+      </w:r>
+    </w:p>
+    <w:p>
+      <w:r>
+        <w:t>/bin/bash install.sh --start-only --open</w:t>
       </w:r>
     </w:p>
     <w:p>
@@ -17915,12 +18123,12 @@
     </w:p>
     <w:p>
       <w:r>
-        <w:t>read '?测试结束，按回车关闭窗口。'</w:t>
-      </w:r>
-    </w:p>
-    <w:p>
-      <w:r>
-        <w:t>exit "$result"</w:t>
+        <w:t>if (( result != 0 )); then read 'reply?请按上方提示处理；按回车关闭窗口。'; fi</w:t>
+      </w:r>
+    </w:p>
+    <w:p>
+      <w:r>
+        <w:t>exit $result</w:t>
       </w:r>
     </w:p>
     <w:p>
@@ -17934,7 +18142,7 @@
         <w:pStyle w:val="Heading2"/>
       </w:pPr>
       <w:r>
-        <w:t>FILE: 自动恢复测试.command</w:t>
+        <w:t>FILE: 启用自动启动.command</w:t>
       </w:r>
     </w:p>
     <w:p>
@@ -17954,7 +18162,7 @@
     </w:p>
     <w:p>
       <w:r>
-        <w:t>.venv/bin/python check_recovery.py --port 8767</w:t>
+        <w:t>.venv/bin/python launch_service.py install --port 8767</w:t>
       </w:r>
     </w:p>
     <w:p>
@@ -17983,7 +18191,7 @@
         <w:pStyle w:val="Heading2"/>
       </w:pPr>
       <w:r>
-        <w:t>FILE: 配置千问登录.command</w:t>
+        <w:t>FILE: 测试千问后台流程.command</w:t>
       </w:r>
     </w:p>
     <w:p>
@@ -18008,47 +18216,27 @@
     </w:p>
     <w:p>
       <w:r>
-        <w:t>export PIP_CERT=/etc/ssl/cert.pem</w:t>
-      </w:r>
-    </w:p>
-    <w:p>
-      <w:r>
         <w:t>export NODE_EXTRA_CA_CERTS=/etc/ssl/cert.pem</w:t>
       </w:r>
     </w:p>
     <w:p>
       <w:r>
-        <w:t>export PLAYWRIGHT_BROWSERS_PATH="$PWD/work/browser-bin"</w:t>
-      </w:r>
-    </w:p>
-    <w:p>
-      <w:r>
-        <w:t>.venv/bin/python -m pip install playwright || exit 1</w:t>
-      </w:r>
-    </w:p>
-    <w:p>
-      <w:r>
-        <w:t>.venv/bin/python -m playwright install chromium || exit 1</w:t>
-      </w:r>
-    </w:p>
-    <w:p>
-      <w:r>
-        <w:t>.venv/bin/python qianwen_browser.py login || exit 1</w:t>
-      </w:r>
-    </w:p>
-    <w:p>
-      <w:r>
-        <w:t>/bin/launchctl kill SIGTERM "gui/$(id -u)/com.zhangjp.web-video-to-word" 2&gt;/dev/null || true</w:t>
-      </w:r>
-    </w:p>
-    <w:p>
-      <w:r>
-        <w:t>echo "登录配置完成。如已启用自动启动，服务将自动加载新版。"</w:t>
-      </w:r>
-    </w:p>
-    <w:p>
-      <w:r>
-        <w:t>read '?按回车关闭窗口。'</w:t>
+        <w:t>.venv/bin/python smoke_qianwen_runner.py</w:t>
+      </w:r>
+    </w:p>
+    <w:p>
+      <w:r>
+        <w:t>result=$?</w:t>
+      </w:r>
+    </w:p>
+    <w:p>
+      <w:r>
+        <w:t>read '?测试结束，按回车关闭窗口。'</w:t>
+      </w:r>
+    </w:p>
+    <w:p>
+      <w:r>
+        <w:t>exit "$result"</w:t>
       </w:r>
     </w:p>
     <w:p>
@@ -18062,7 +18250,7 @@
         <w:pStyle w:val="Heading2"/>
       </w:pPr>
       <w:r>
-        <w:t>FILE: 首次安装.command</w:t>
+        <w:t>FILE: 自动恢复测试.command</w:t>
       </w:r>
     </w:p>
     <w:p>
@@ -18082,17 +18270,12 @@
     </w:p>
     <w:p>
       <w:r>
-        <w:t>/bin/bash install.sh --open</w:t>
+        <w:t>.venv/bin/python check_recovery.py --port 8767</w:t>
       </w:r>
     </w:p>
     <w:p>
       <w:r>
         <w:t>result=$?</w:t>
-      </w:r>
-    </w:p>
-    <w:p>
-      <w:r>
-        <w:t>if (( result != 0 )); then print '安装未完成，请按上方“下一步”操作后重试。'; fi</w:t>
       </w:r>
     </w:p>
     <w:p>
@@ -18116,6 +18299,139 @@
         <w:pStyle w:val="Heading2"/>
       </w:pPr>
       <w:r>
+        <w:t>FILE: 配置千问登录.command</w:t>
+      </w:r>
+    </w:p>
+    <w:p>
+      <w:r>
+        <w:t>```text</w:t>
+      </w:r>
+    </w:p>
+    <w:p>
+      <w:r>
+        <w:t>#!/bin/zsh</w:t>
+      </w:r>
+    </w:p>
+    <w:p>
+      <w:r>
+        <w:t>cd -- "${0:A:h}" || exit 1</w:t>
+      </w:r>
+    </w:p>
+    <w:p>
+      <w:r>
+        <w:t>export SSL_CERT_FILE=/etc/ssl/cert.pem</w:t>
+      </w:r>
+    </w:p>
+    <w:p>
+      <w:r>
+        <w:t>export PIP_CERT=/etc/ssl/cert.pem</w:t>
+      </w:r>
+    </w:p>
+    <w:p>
+      <w:r>
+        <w:t>export NODE_EXTRA_CA_CERTS=/etc/ssl/cert.pem</w:t>
+      </w:r>
+    </w:p>
+    <w:p>
+      <w:r>
+        <w:t>export PLAYWRIGHT_BROWSERS_PATH="$PWD/work/browser-bin"</w:t>
+      </w:r>
+    </w:p>
+    <w:p>
+      <w:r>
+        <w:t>.venv/bin/python -m pip install playwright || exit 1</w:t>
+      </w:r>
+    </w:p>
+    <w:p>
+      <w:r>
+        <w:t>.venv/bin/python -m playwright install chromium || exit 1</w:t>
+      </w:r>
+    </w:p>
+    <w:p>
+      <w:r>
+        <w:t>.venv/bin/python qianwen_browser.py login || exit 1</w:t>
+      </w:r>
+    </w:p>
+    <w:p>
+      <w:r>
+        <w:t>/bin/launchctl kill SIGTERM "gui/$(id -u)/com.zhangjp.web-video-to-word" 2&gt;/dev/null || true</w:t>
+      </w:r>
+    </w:p>
+    <w:p>
+      <w:r>
+        <w:t>echo "登录配置完成。如已启用自动启动，服务将自动加载新版。"</w:t>
+      </w:r>
+    </w:p>
+    <w:p>
+      <w:r>
+        <w:t>read '?按回车关闭窗口。'</w:t>
+      </w:r>
+    </w:p>
+    <w:p>
+      <w:r>
+        <w:t>```</w:t>
+      </w:r>
+    </w:p>
+    <w:p/>
+    <w:p>
+      <w:pPr>
+        <w:pStyle w:val="Heading2"/>
+      </w:pPr>
+      <w:r>
+        <w:t>FILE: 首次安装.command</w:t>
+      </w:r>
+    </w:p>
+    <w:p>
+      <w:r>
+        <w:t>```text</w:t>
+      </w:r>
+    </w:p>
+    <w:p>
+      <w:r>
+        <w:t>#!/bin/zsh</w:t>
+      </w:r>
+    </w:p>
+    <w:p>
+      <w:r>
+        <w:t>cd "${0:A:h}" || exit 1</w:t>
+      </w:r>
+    </w:p>
+    <w:p>
+      <w:r>
+        <w:t>/bin/bash install.sh --open</w:t>
+      </w:r>
+    </w:p>
+    <w:p>
+      <w:r>
+        <w:t>result=$?</w:t>
+      </w:r>
+    </w:p>
+    <w:p>
+      <w:r>
+        <w:t>if (( result != 0 )); then print '安装未完成，请按上方“下一步”操作后重试。'; fi</w:t>
+      </w:r>
+    </w:p>
+    <w:p>
+      <w:r>
+        <w:t>read 'reply?按回车关闭窗口。'</w:t>
+      </w:r>
+    </w:p>
+    <w:p>
+      <w:r>
+        <w:t>exit $result</w:t>
+      </w:r>
+    </w:p>
+    <w:p>
+      <w:r>
+        <w:t>```</w:t>
+      </w:r>
+    </w:p>
+    <w:p/>
+    <w:p>
+      <w:pPr>
+        <w:pStyle w:val="Heading2"/>
+      </w:pPr>
+      <w:r>
         <w:t>FILE: 文件校验.json</w:t>
       </w:r>
     </w:p>
@@ -18166,7 +18482,7 @@
     </w:p>
     <w:p>
       <w:r>
-        <w:t xml:space="preserve">  "index.html": "52952764cbfdbc162a689348ac947be4b648fcf52f032c4e541a78bfaaf8d746",</w:t>
+        <w:t xml:space="preserve">  "index.html": "910c2bbee351032d375aff76fbd53da4af9b06a65579dd9913abdb20e88d2f87",</w:t>
       </w:r>
     </w:p>
     <w:p>
@@ -18201,7 +18517,7 @@
     </w:p>
     <w:p>
       <w:r>
-        <w:t xml:space="preserve">  "reader.py": "70a3c927f44100b9365c10478f0c46c2c50b4cff17b9662f292fa7e8b5cdd1ea",</w:t>
+        <w:t xml:space="preserve">  "reader.py": "5c6aaaf88b1454db94bbd352f5dd736bf17c432af91fcbfa4a823e27cf633f22",</w:t>
       </w:r>
     </w:p>
     <w:p>
@@ -18306,7 +18622,17 @@
     </w:p>
     <w:p>
       <w:r>
-        <w:t xml:space="preserve">  "tools/build_guides.py": "a39ba11ad1b2496aee4ef424db8acfadaf8af35c687abd45adebfb7f1ff3329c",</w:t>
+        <w:t xml:space="preserve">  "test_youtube_verification.py": "e59cf4997a71b446f26d465080203dbdb71c4ebe1bb540237685d5bd748fb776",</w:t>
+      </w:r>
+    </w:p>
+    <w:p>
+      <w:r>
+        <w:t xml:space="preserve">  "tools/build_guides.py": "bab736160e519602158394a37bc7fda1d6093336692664de320ae4da03f2e296",</w:t>
+      </w:r>
+    </w:p>
+    <w:p>
+      <w:r>
+        <w:t xml:space="preserve">  "youtube_verification.py": "15565a36fa8ba520d184e0591327b56a7554f5827b9953a4d321816d73fd69ff",</w:t>
       </w:r>
     </w:p>
     <w:p>

</xml_diff>

<commit_message>
Use normal installed Chrome for manual YouTube login without automation control
</commit_message>
<xml_diff>
--- a/安装与使用指南.docx
+++ b/安装与使用指南.docx
@@ -695,6 +695,12 @@
     </w:p>
     <w:p/>
     <w:p>
+      <w:r>
+        <w:t>YouTube人工登录窗口使用已安装的正式版Chrome直接启动，不由Playwright控制，也不启用调试接口。专用配置与日常Chrome隔离；完成后关闭专用窗口，后台仅读取该专用配置的Cookie。系统可能要求授权访问Chrome加密凭据；登录成功仍不保证YouTube允许下载。</w:t>
+      </w:r>
+    </w:p>
+    <w:p/>
+    <w:p>
       <w:pPr>
         <w:pStyle w:val="Heading1"/>
       </w:pPr>
@@ -9597,32 +9603,17 @@
     </w:p>
     <w:p>
       <w:r>
-        <w:t xml:space="preserve">                            retry_options=dict(options);retry_options.pop('cookiesfrombrowser',None);retry_options['cookiefile']=str(cookies)</w:t>
-      </w:r>
-    </w:p>
-    <w:p>
-      <w:r>
-        <w:t xml:space="preserve">                            try:</w:t>
-      </w:r>
-    </w:p>
-    <w:p>
-      <w:r>
-        <w:t xml:space="preserve">                                with YoutubeDL(retry_options) as verified_downloader:</w:t>
-      </w:r>
-    </w:p>
-    <w:p>
-      <w:r>
-        <w:t xml:space="preserve">                                    info=verified_downloader.extract_info(download_url(args.url),download=True)</w:t>
-      </w:r>
-    </w:p>
-    <w:p>
-      <w:r>
-        <w:t xml:space="preserve">                            finally:</w:t>
-      </w:r>
-    </w:p>
-    <w:p>
-      <w:r>
-        <w:t xml:space="preserve">                                cookies.unlink(missing_ok=True)</w:t>
+        <w:t xml:space="preserve">                            retry_options=dict(options);retry_options['cookiesfrombrowser']=('chrome',str(cookies.resolve()))</w:t>
+      </w:r>
+    </w:p>
+    <w:p>
+      <w:r>
+        <w:t xml:space="preserve">                            with YoutubeDL(retry_options) as verified_downloader:</w:t>
+      </w:r>
+    </w:p>
+    <w:p>
+      <w:r>
+        <w:t xml:space="preserve">                                info=verified_downloader.extract_info(download_url(args.url),download=True)</w:t>
       </w:r>
     </w:p>
     <w:p>
@@ -17225,6 +17216,67 @@
         <w:t xml:space="preserve">  for error in ["HTTP Error 403", "千问未登录", "[youtube] Video unavailable"]:self.assertFalse(needs_verification(error))</w:t>
       </w:r>
     </w:p>
+    <w:p/>
+    <w:p>
+      <w:r>
+        <w:t xml:space="preserve"> def test_normal_chrome_has_no_automation_connection(self):</w:t>
+      </w:r>
+    </w:p>
+    <w:p>
+      <w:r>
+        <w:t xml:space="preserve">  import tempfile</w:t>
+      </w:r>
+    </w:p>
+    <w:p>
+      <w:r>
+        <w:t xml:space="preserve">  from pathlib import Path</w:t>
+      </w:r>
+    </w:p>
+    <w:p>
+      <w:r>
+        <w:t xml:space="preserve">  from unittest.mock import patch,Mock</w:t>
+      </w:r>
+    </w:p>
+    <w:p>
+      <w:r>
+        <w:t xml:space="preserve">  from youtube_verification import verify</w:t>
+      </w:r>
+    </w:p>
+    <w:p>
+      <w:r>
+        <w:t xml:space="preserve">  with tempfile.TemporaryDirectory() as tmp:</w:t>
+      </w:r>
+    </w:p>
+    <w:p>
+      <w:r>
+        <w:t xml:space="preserve">   job=Path(tmp);cookies=job/'youtube-manual-chrome/Default/Cookies';cookies.parent.mkdir(parents=True);cookies.touch()</w:t>
+      </w:r>
+    </w:p>
+    <w:p>
+      <w:r>
+        <w:t xml:space="preserve">   with patch('youtube_verification.chrome_path',return_value=Path('/chrome')),patch('youtube_verification.subprocess.Popen') as launch:</w:t>
+      </w:r>
+    </w:p>
+    <w:p>
+      <w:r>
+        <w:t xml:space="preserve">    verify('https://www.youtube.com/watch?v=test',job,{},Mock())</w:t>
+      </w:r>
+    </w:p>
+    <w:p>
+      <w:r>
+        <w:t xml:space="preserve">    args=launch.call_args.args[0]</w:t>
+      </w:r>
+    </w:p>
+    <w:p>
+      <w:r>
+        <w:t xml:space="preserve">    self.assertFalse(any('remote-debugging' in arg or 'enable-automation' in arg for arg in args))</w:t>
+      </w:r>
+    </w:p>
+    <w:p>
+      <w:r>
+        <w:t xml:space="preserve">    self.assertTrue(any('youtube-manual-chrome' in arg for arg in args))</w:t>
+      </w:r>
+    </w:p>
     <w:p>
       <w:r>
         <w:t>```</w:t>
@@ -17421,12 +17473,12 @@
     </w:p>
     <w:p>
       <w:r>
-        <w:t>"""Human verification in an isolated visible browser; never reads everyday browser cookies."""</w:t>
-      </w:r>
-    </w:p>
-    <w:p>
-      <w:r>
-        <w:t>import os,time</w:t>
+        <w:t>"""Human login in normal installed Chrome, with a dedicated private profile."""</w:t>
+      </w:r>
+    </w:p>
+    <w:p>
+      <w:r>
+        <w:t>import os,time,subprocess,sys</w:t>
       </w:r>
     </w:p>
     <w:p>
@@ -17434,11 +17486,6 @@
         <w:t>from pathlib import Path</w:t>
       </w:r>
     </w:p>
-    <w:p>
-      <w:r>
-        <w:t>from http.cookiejar import MozillaCookieJar,Cookie</w:t>
-      </w:r>
-    </w:p>
     <w:p/>
     <w:p>
       <w:r>
@@ -17453,27 +17500,63 @@
     <w:p/>
     <w:p>
       <w:r>
+        <w:t>def chrome_path():</w:t>
+      </w:r>
+    </w:p>
+    <w:p>
+      <w:r>
+        <w:t xml:space="preserve">    candidates=[Path('/Applications/Google Chrome.app/Contents/MacOS/Google Chrome'),Path.home()/'Applications/Google Chrome.app/Contents/MacOS/Google Chrome']</w:t>
+      </w:r>
+    </w:p>
+    <w:p>
+      <w:r>
+        <w:t xml:space="preserve">    if sys.platform=='win32':</w:t>
+      </w:r>
+    </w:p>
+    <w:p>
+      <w:r>
+        <w:t xml:space="preserve">        candidates=[Path(os.environ.get(k,''))/'Google/Chrome/Application/chrome.exe' for k in ('PROGRAMFILES','PROGRAMFILES(X86)','LOCALAPPDATA')]</w:t>
+      </w:r>
+    </w:p>
+    <w:p>
+      <w:r>
+        <w:t xml:space="preserve">    for path in candidates:</w:t>
+      </w:r>
+    </w:p>
+    <w:p>
+      <w:r>
+        <w:t xml:space="preserve">        if path.is_file():return path</w:t>
+      </w:r>
+    </w:p>
+    <w:p>
+      <w:r>
+        <w:t xml:space="preserve">    raise RuntimeError('未找到正式版Google Chrome，请安装后再重试YouTube验证')</w:t>
+      </w:r>
+    </w:p>
+    <w:p/>
+    <w:p>
+      <w:r>
         <w:t>def verify(url,job,meta,save,timeout=900):</w:t>
       </w:r>
     </w:p>
     <w:p>
       <w:r>
-        <w:t xml:space="preserve">    from playwright.sync_api import sync_playwright</w:t>
-      </w:r>
-    </w:p>
-    <w:p>
-      <w:r>
-        <w:t xml:space="preserve">    os.environ.setdefault('PLAYWRIGHT_BROWSERS_PATH',str(Path(__file__).resolve().parent/'work/browser-bin'))</w:t>
-      </w:r>
-    </w:p>
-    <w:p>
-      <w:r>
-        <w:t xml:space="preserve">    cookiefile=job/'youtube-session.cookies'</w:t>
-      </w:r>
-    </w:p>
-    <w:p>
-      <w:r>
-        <w:t xml:space="preserve">    meta.update(state='youtube_verifying',error='请在弹出的YouTube专用窗口登录或完成人机验证，完成后关闭该窗口；工具将自动重试下载。')</w:t>
+        <w:t xml:space="preserve">    # A separate profile: never launches or reads the user's everyday Chrome profile.</w:t>
+      </w:r>
+    </w:p>
+    <w:p>
+      <w:r>
+        <w:t xml:space="preserve">    profile=job/'youtube-manual-chrome'</w:t>
+      </w:r>
+    </w:p>
+    <w:p>
+      <w:r>
+        <w:t xml:space="preserve">    profile.mkdir(parents=True,exist_ok=True)</w:t>
+      </w:r>
+    </w:p>
+    <w:p>
+      <w:r>
+        <w:t xml:space="preserve">    meta.update(state='youtube_verifying',error='请在弹出的Chrome专用窗口完成YouTube登录或验证，然后关闭该专用窗口；工具自动重试下载。')</w:t>
       </w:r>
     </w:p>
     <w:p>
@@ -17483,132 +17566,42 @@
     </w:p>
     <w:p>
       <w:r>
+        <w:t xml:space="preserve">    process=subprocess.Popen([str(chrome_path()),'--user-data-dir='+str(profile.resolve()),'--no-first-run','--no-default-browser-check','--disable-background-mode','--new-window',url],stdout=subprocess.DEVNULL,stderr=subprocess.DEVNULL)</w:t>
+      </w:r>
+    </w:p>
+    <w:p>
+      <w:r>
         <w:t xml:space="preserve">    try:</w:t>
       </w:r>
     </w:p>
     <w:p>
       <w:r>
-        <w:t xml:space="preserve">        with sync_playwright() as p:</w:t>
-      </w:r>
-    </w:p>
-    <w:p>
-      <w:r>
-        <w:t xml:space="preserve">            context=p.chromium.launch_persistent_context(str(job/'youtube-browser-profile'),headless=False)</w:t>
-      </w:r>
-    </w:p>
-    <w:p>
-      <w:r>
-        <w:t xml:space="preserve">            try:</w:t>
-      </w:r>
-    </w:p>
-    <w:p>
-      <w:r>
-        <w:t xml:space="preserve">                page=context.pages[0] if context.pages else context.new_page()</w:t>
-      </w:r>
-    </w:p>
-    <w:p>
-      <w:r>
-        <w:t xml:space="preserve">                page.goto(url,wait_until='domcontentloaded',timeout=60000)</w:t>
-      </w:r>
-    </w:p>
-    <w:p>
-      <w:r>
-        <w:t xml:space="preserve">                deadline=time.monotonic()+timeout</w:t>
-      </w:r>
-    </w:p>
-    <w:p>
-      <w:r>
-        <w:t xml:space="preserve">                jar=MozillaCookieJar(str(cookiefile))</w:t>
-      </w:r>
-    </w:p>
-    <w:p>
-      <w:r>
-        <w:t xml:space="preserve">                while context.pages:</w:t>
-      </w:r>
-    </w:p>
-    <w:p>
-      <w:r>
-        <w:t xml:space="preserve">                    if time.monotonic()&gt;deadline:raise RuntimeError('YouTube人工验证等待超过15分钟，请重试后完成验证')</w:t>
-      </w:r>
-    </w:p>
-    <w:p>
-      <w:r>
-        <w:t xml:space="preserve">                    try:</w:t>
-      </w:r>
-    </w:p>
-    <w:p>
-      <w:r>
-        <w:t xml:space="preserve">                        for c in context.cookies():</w:t>
-      </w:r>
-    </w:p>
-    <w:p>
-      <w:r>
-        <w:t xml:space="preserve">                            if not any((c['domain'].lstrip('.')==d or c['domain'].lstrip('.').endswith('.'+d)) for d in ('youtube.com','google.com')):continue</w:t>
-      </w:r>
-    </w:p>
-    <w:p>
-      <w:r>
-        <w:t xml:space="preserve">                            expires=int(c['expires']) if c.get('expires',-1)&gt;0 else None</w:t>
-      </w:r>
-    </w:p>
-    <w:p>
-      <w:r>
-        <w:t xml:space="preserve">                            jar.set_cookie(Cookie(0,c['name'],c['value'],None,False,c['domain'],True,c['domain'].startswith('.'),c['path'],True,c['secure'],expires,expires is None,None,None,{},False))</w:t>
-      </w:r>
-    </w:p>
-    <w:p>
-      <w:r>
-        <w:t xml:space="preserve">                        jar.save(ignore_discard=True,ignore_expires=True);cookiefile.chmod(0o600)</w:t>
-      </w:r>
-    </w:p>
-    <w:p>
-      <w:r>
-        <w:t xml:space="preserve">                        context.pages[-1].wait_for_timeout(1000)</w:t>
-      </w:r>
-    </w:p>
-    <w:p>
-      <w:r>
-        <w:t xml:space="preserve">                    except Exception:</w:t>
-      </w:r>
-    </w:p>
-    <w:p>
-      <w:r>
-        <w:t xml:space="preserve">                        if not context.pages:break</w:t>
-      </w:r>
-    </w:p>
-    <w:p>
-      <w:r>
-        <w:t xml:space="preserve">                        raise</w:t>
-      </w:r>
-    </w:p>
-    <w:p>
-      <w:r>
-        <w:t xml:space="preserve">                if not cookiefile.exists():raise RuntimeError('未获得YouTube验证会话，请重新打开验证窗口')</w:t>
-      </w:r>
-    </w:p>
-    <w:p>
-      <w:r>
-        <w:t xml:space="preserve">                return cookiefile</w:t>
-      </w:r>
-    </w:p>
-    <w:p>
-      <w:r>
-        <w:t xml:space="preserve">            finally:</w:t>
-      </w:r>
-    </w:p>
-    <w:p>
-      <w:r>
-        <w:t xml:space="preserve">                context.close()</w:t>
-      </w:r>
-    </w:p>
-    <w:p>
-      <w:r>
-        <w:t xml:space="preserve">    except Exception as error:</w:t>
-      </w:r>
-    </w:p>
-    <w:p>
-      <w:r>
-        <w:t xml:space="preserve">        raise RuntimeError('YouTube验证窗口未能完成：'+str(error)) from error</w:t>
+        <w:t xml:space="preserve">        process.wait(timeout=timeout)</w:t>
+      </w:r>
+    </w:p>
+    <w:p>
+      <w:r>
+        <w:t xml:space="preserve">    except subprocess.TimeoutExpired as error:</w:t>
+      </w:r>
+    </w:p>
+    <w:p>
+      <w:r>
+        <w:t xml:space="preserve">        raise RuntimeError('YouTube验证窗口仍未关闭；请完成登录并关闭专用窗口后重试。') from error</w:t>
+      </w:r>
+    </w:p>
+    <w:p>
+      <w:r>
+        <w:t xml:space="preserve">    if not (profile/'Default'/'Network'/'Cookies').is_file() and not (profile/'Default'/'Cookies').is_file():</w:t>
+      </w:r>
+    </w:p>
+    <w:p>
+      <w:r>
+        <w:t xml:space="preserve">        raise RuntimeError('Chrome未保存验证会话，请在专用窗口完成登录后再重试')</w:t>
+      </w:r>
+    </w:p>
+    <w:p>
+      <w:r>
+        <w:t xml:space="preserve">    return profile</w:t>
       </w:r>
     </w:p>
     <w:p>
@@ -18517,7 +18510,7 @@
     </w:p>
     <w:p>
       <w:r>
-        <w:t xml:space="preserve">  "reader.py": "5c6aaaf88b1454db94bbd352f5dd736bf17c432af91fcbfa4a823e27cf633f22",</w:t>
+        <w:t xml:space="preserve">  "reader.py": "f9dad8cc4abb0173d5f9d56c01b4d90a787a49b83c216cae86f42ada2bc53fdd",</w:t>
       </w:r>
     </w:p>
     <w:p>
@@ -18622,7 +18615,7 @@
     </w:p>
     <w:p>
       <w:r>
-        <w:t xml:space="preserve">  "test_youtube_verification.py": "e59cf4997a71b446f26d465080203dbdb71c4ebe1bb540237685d5bd748fb776",</w:t>
+        <w:t xml:space="preserve">  "test_youtube_verification.py": "6d94837c22e56f74cdaf666b28f4bc550aaa3df93dd41049937d1b29cb20a225",</w:t>
       </w:r>
     </w:p>
     <w:p>
@@ -18632,7 +18625,7 @@
     </w:p>
     <w:p>
       <w:r>
-        <w:t xml:space="preserve">  "youtube_verification.py": "15565a36fa8ba520d184e0591327b56a7554f5827b9953a4d321816d73fd69ff",</w:t>
+        <w:t xml:space="preserve">  "youtube_verification.py": "9339d88a9fa85965d909045309c16599da841423df8ecf9c8257f788951332c9",</w:t>
       </w:r>
     </w:p>
     <w:p>

</xml_diff>

<commit_message>
Add manual YouTube verification completion button without duplicate tasks
</commit_message>
<xml_diff>
--- a/安装与使用指南.docx
+++ b/安装与使用指南.docx
@@ -701,6 +701,12 @@
     </w:p>
     <w:p/>
     <w:p>
+      <w:r>
+        <w:t>等待YouTube人工验证时，任务卡显示“已关闭验证弹窗，重新开始任务”。完成验证并关闭专用窗口后点击它，通知原任务继续，不重复排队；Chrome仍有后台进程时也可确认。</w:t>
+      </w:r>
+    </w:p>
+    <w:p/>
+    <w:p>
       <w:pPr>
         <w:pStyle w:val="Heading1"/>
       </w:pPr>
@@ -2805,6 +2811,26 @@
     </w:p>
     <w:p>
       <w:r>
+        <w:t xml:space="preserve">            verification=re.fullmatch(r'/youtube/confirm/([0-9a-f]{12})',self.path)</w:t>
+      </w:r>
+    </w:p>
+    <w:p>
+      <w:r>
+        <w:t xml:space="preserve">            if verification:</w:t>
+      </w:r>
+    </w:p>
+    <w:p>
+      <w:r>
+        <w:t xml:space="preserve">                from youtube_verification import confirm</w:t>
+      </w:r>
+    </w:p>
+    <w:p>
+      <w:r>
+        <w:t xml:space="preserve">                return self.reply(200,confirm(WORK/'jobs'/verification.group(1)))</w:t>
+      </w:r>
+    </w:p>
+    <w:p>
+      <w:r>
         <w:t xml:space="preserve">            if self.path == '/qianwen/login':</w:t>
       </w:r>
     </w:p>
@@ -4632,7 +4658,7 @@
     </w:p>
     <w:p>
       <w:r>
-        <w:t>async function refresh(){const sequence=++refreshSequence;try{await refreshDeletions();let jobs=await(await fetch('/jobs')).json();if(sequence!==refreshSequence)return;jobs=jobs.filter(j=&gt;!deletedTaskIds.has(j.id));jobs.sort((a,b)=&gt;a.task_number&amp;&amp;b.task_number?b.task_number-a.task_number:(b.created_at??historicalTaskTimes[b.id]??b.added_at??Infinity)-(a.created_at??historicalTaskTimes[a.id]??a.added_at??Infinity));let host=document.querySelector('#jobs');host.replaceChildren();for(let j of jobs){let card=document.createElement('article');card.dataset.taskId=j.id;let h=document.createElement('h2');h.textContent=taskHeading(j);card.append(h);let p=document.createElement('p');p.textContent=(j.document&amp;&amp;!j.has_document)?'Word 文件已不在原保存位置，重新提交链接可生成':(stages[j.state]||'状态暂未识别：'+String(j.state));card.append(p);if(j.source_kind==='local'){let source=document.createElement('p');source.textContent=j.source_label;card.append(source)}else card.append(link('原网页',j.url));let deletion=deletionResults.get(j.id)||j.deletion_result;if(deletion){let status=document.createElement('p');status.className='delete-result';status.setAttribute('role','alert');status.style.color=deletion.status==='failed'?'#a52222':'#8b4520';renderDeletionResult(status,deletion);card.append(status)}if(j.error){let err=document.createElement('p');err.textContent=j.error;card.append(err)}if(j.cleanup_error){let note=document.createElement('p');note.textContent='Word 已生成，但部分临时文件未清理：'+j.cleanup_error;card.append(note)}if(j.has_document){let actions=document.createElement('p');actions.className='actions';actions.append(link('查看 Word 文稿','/preview/'+j.id,'action'));let reveal=document.createElement('button');reveal.type='button';reveal.className='secondary';reveal.textContent='打开文档所在位置';let revealStatus=document.createElement('small');revealStatus.setAttribute('role','status');reveal.onclick=async()=&gt;{reveal.disabled=true;revealStatus.textContent='正在打开文件夹…';try{await post('/reveal/'+j.id,{});revealStatus.textContent='已打开 Finder 文件夹。';msg.textContent='已打开文档所在的 Finder 文件夹。'}catch(e){revealStatus.textContent='打开失败：'+e.message;msg.textContent='打开失败：'+e.message}finally{reveal.disabled=false}};actions.append(reveal);actions.append(revealStatus);card.append(actions);let note=document.createElement('small');note.textContent=j.temporary_files_removed?(j.media_trashed?'原音视频已移入废纸篓，临时音轨已清理。':'原音视频与临时音轨已清理。'):'Word 内容未经人工校对。';card.append(note)}let controls=document.createElement('p');controls.className='actions';if(j.state==='failed'||j.state==='login_required'){let retry=document.createElement('button');retry.textContent='重试任务';retry.className='retry-task';retry.onclick=async()=&gt;{try{await post('/jobs',{url:j.url,engine:'qianwen'});await refresh()}catch(e){msg.textContent=e.message}};controls.append(retry)}let remove=document.createElement('button');remove.type='button';remove.className='secondary';remove.style.color='#a52222';remove.textContent='删除任务并同步到千问';if(deletion?.status==='pending'){remove.disabled=true;remove.textContent='正在同步删除…'}remove.onclick=async()=&gt;{if(!confirm('删除“'+(j.title||j.id)+'”？将停止该任务，把本机任务文件和相关文稿移入废纸篓。同时删除对应的千问云端记录，云端删除后无法恢复。'))return;deletionResults.set(j.id,{status:'pending',message:'正在删除并同步到千问，请稍候…'});msg.className='';msg.textContent='正在删除并同步到千问，请稍候…';remove.disabled=true;remove.textContent='正在同步删除…';try{let health=await(await fetch('/health')).json();if(!health.cloud_delete)throw Error('请先双击加载本次更新.command启用千问同步删除');await requireControls();let r=await post('/delete/'+j.id,{});if(r.deletion_result?.status==='pending'){deletionResults.set(j.id,r.deletion_result);msg.className='';renderDeletionResult(msg,r.deletion_result);await refresh();return}deletedTaskIds.add(j.id);++refreshSequence;document.querySelectorAll('article[data-task-id="'+j.id+'"]').forEach(node=&gt;node.remove());deletionResults.delete(j.id);showDeletionResult(r.deletion_result||{status:'success',message:r.message},true);await refresh()}catch(e){let message=e.deletionResult?.message||('删除失败\n工具任务列表记录：未删除成功\n本机文稿及任务文件：未确认删除成功\n对应的千问记录：未确认删除成功\n原因：'+e.message);let report=e.deletionResult||{status:'failed',message};deletionResults.set(j.id,report);showDeletionResult(report,false);let status=card.querySelector('.delete-result');if(!status){status=document.createElement('p');status.className='delete-result';status.setAttribute('role','alert');card.append(status)}status.style.color='#a52222';renderDeletionResult(status,report);remove.disabled=false;remove.textContent='删除任务并同步到千问'}};if(j.has_document){card.querySelector('.actions').append(remove)}else{controls.append(remove)}if(controls.children.length)card.append(controls);host.append(card)}await refreshLogin()}catch(e){msg.textContent='后台连接中断，请重新启动工具。'}}</w:t>
+        <w:t>async function refresh(){const sequence=++refreshSequence;try{await refreshDeletions();let jobs=await(await fetch('/jobs')).json();if(sequence!==refreshSequence)return;jobs=jobs.filter(j=&gt;!deletedTaskIds.has(j.id));jobs.sort((a,b)=&gt;a.task_number&amp;&amp;b.task_number?b.task_number-a.task_number:(b.created_at??historicalTaskTimes[b.id]??b.added_at??Infinity)-(a.created_at??historicalTaskTimes[a.id]??a.added_at??Infinity));let host=document.querySelector('#jobs');host.replaceChildren();for(let j of jobs){let card=document.createElement('article');card.dataset.taskId=j.id;let h=document.createElement('h2');h.textContent=taskHeading(j);card.append(h);let p=document.createElement('p');p.textContent=(j.document&amp;&amp;!j.has_document)?'Word 文件已不在原保存位置，重新提交链接可生成':(stages[j.state]||'状态暂未识别：'+String(j.state));card.append(p);if(j.source_kind==='local'){let source=document.createElement('p');source.textContent=j.source_label;card.append(source)}else card.append(link('原网页',j.url));let deletion=deletionResults.get(j.id)||j.deletion_result;if(deletion){let status=document.createElement('p');status.className='delete-result';status.setAttribute('role','alert');status.style.color=deletion.status==='failed'?'#a52222':'#8b4520';renderDeletionResult(status,deletion);card.append(status)}if(j.error){let err=document.createElement('p');err.textContent=j.error;card.append(err)}if(j.cleanup_error){let note=document.createElement('p');note.textContent='Word 已生成，但部分临时文件未清理：'+j.cleanup_error;card.append(note)}if(j.has_document){let actions=document.createElement('p');actions.className='actions';actions.append(link('查看 Word 文稿','/preview/'+j.id,'action'));let reveal=document.createElement('button');reveal.type='button';reveal.className='secondary';reveal.textContent='打开文档所在位置';let revealStatus=document.createElement('small');revealStatus.setAttribute('role','status');reveal.onclick=async()=&gt;{reveal.disabled=true;revealStatus.textContent='正在打开文件夹…';try{await post('/reveal/'+j.id,{});revealStatus.textContent='已打开 Finder 文件夹。';msg.textContent='已打开文档所在的 Finder 文件夹。'}catch(e){revealStatus.textContent='打开失败：'+e.message;msg.textContent='打开失败：'+e.message}finally{reveal.disabled=false}};actions.append(reveal);actions.append(revealStatus);card.append(actions);let note=document.createElement('small');note.textContent=j.temporary_files_removed?(j.media_trashed?'原音视频已移入废纸篓，临时音轨已清理。':'原音视频与临时音轨已清理。'):'Word 内容未经人工校对。';card.append(note)}let controls=document.createElement('p');controls.className='actions';if(j.state==='youtube_verifying'){let resume=document.createElement('button');resume.textContent='已关闭验证弹窗，重新开始任务';resume.onclick=async()=&gt;{resume.disabled=true;try{let result=await post('/youtube/confirm/'+j.id,{});msg.textContent=result.message;await refresh()}catch(e){msg.textContent=e.message;resume.disabled=false}};controls.append(resume)}if(j.state==='failed'||j.state==='login_required'){let retry=document.createElement('button');retry.textContent='重试任务';retry.className='retry-task';retry.onclick=async()=&gt;{try{await post('/jobs',{url:j.url,engine:'qianwen'});await refresh()}catch(e){msg.textContent=e.message}};controls.append(retry)}let remove=document.createElement('button');remove.type='button';remove.className='secondary';remove.style.color='#a52222';remove.textContent='删除任务并同步到千问';if(deletion?.status==='pending'){remove.disabled=true;remove.textContent='正在同步删除…'}remove.onclick=async()=&gt;{if(!confirm('删除“'+(j.title||j.id)+'”？将停止该任务，把本机任务文件和相关文稿移入废纸篓。同时删除对应的千问云端记录，云端删除后无法恢复。'))return;deletionResults.set(j.id,{status:'pending',message:'正在删除并同步到千问，请稍候…'});msg.className='';msg.textContent='正在删除并同步到千问，请稍候…';remove.disabled=true;remove.textContent='正在同步删除…';try{let health=await(await fetch('/health')).json();if(!health.cloud_delete)throw Error('请先双击加载本次更新.command启用千问同步删除');await requireControls();let r=await post('/delete/'+j.id,{});if(r.deletion_result?.status==='pending'){deletionResults.set(j.id,r.deletion_result);msg.className='';renderDeletionResult(msg,r.deletion_result);await refresh();return}deletedTaskIds.add(j.id);++refreshSequence;document.querySelectorAll('article[data-task-id="'+j.id+'"]').forEach(node=&gt;node.remove());deletionResults.delete(j.id);showDeletionResult(r.deletion_result||{status:'success',message:r.message},true);await refresh()}catch(e){let message=e.deletionResult?.message||('删除失败\n工具任务列表记录：未删除成功\n本机文稿及任务文件：未确认删除成功\n对应的千问记录：未确认删除成功\n原因：'+e.message);let report=e.deletionResult||{status:'failed',message};deletionResults.set(j.id,report);showDeletionResult(report,false);let status=card.querySelector('.delete-result');if(!status){status=document.createElement('p');status.className='delete-result';status.setAttribute('role','alert');card.append(status)}status.style.color='#a52222';renderDeletionResult(status,report);remove.disabled=false;remove.textContent='删除任务并同步到千问'}};if(j.has_document){card.querySelector('.actions').append(remove)}else{controls.append(remove)}if(controls.children.length)card.append(controls);host.append(card)}await refreshLogin()}catch(e){msg.textContent='后台连接中断，请重新启动工具。'}}</w:t>
       </w:r>
     </w:p>
     <w:p>
@@ -17277,6 +17303,47 @@
         <w:t xml:space="preserve">    self.assertTrue(any('youtube-manual-chrome' in arg for arg in args))</w:t>
       </w:r>
     </w:p>
+    <w:p/>
+    <w:p>
+      <w:r>
+        <w:t xml:space="preserve"> def test_confirmation_only_for_waiting_task(self):</w:t>
+      </w:r>
+    </w:p>
+    <w:p>
+      <w:r>
+        <w:t xml:space="preserve">  import tempfile,json</w:t>
+      </w:r>
+    </w:p>
+    <w:p>
+      <w:r>
+        <w:t xml:space="preserve">  from pathlib import Path</w:t>
+      </w:r>
+    </w:p>
+    <w:p>
+      <w:r>
+        <w:t xml:space="preserve">  from youtube_verification import confirm</w:t>
+      </w:r>
+    </w:p>
+    <w:p>
+      <w:r>
+        <w:t xml:space="preserve">  with tempfile.TemporaryDirectory() as tmp:</w:t>
+      </w:r>
+    </w:p>
+    <w:p>
+      <w:r>
+        <w:t xml:space="preserve">   job=Path(tmp);(job/'job.json').write_text(json.dumps({'state':'youtube_verifying'}));self.assertTrue(confirm(job)['ok']);self.assertTrue((job/'youtube-verification-confirmed').exists())</w:t>
+      </w:r>
+    </w:p>
+    <w:p>
+      <w:r>
+        <w:t xml:space="preserve">   (job/'job.json').write_text(json.dumps({'state':'completed'}))</w:t>
+      </w:r>
+    </w:p>
+    <w:p>
+      <w:r>
+        <w:t xml:space="preserve">   with self.assertRaises(ValueError):confirm(job)</w:t>
+      </w:r>
+    </w:p>
     <w:p>
       <w:r>
         <w:t>```</w:t>
@@ -17566,27 +17633,47 @@
     </w:p>
     <w:p>
       <w:r>
+        <w:t xml:space="preserve">    marker=job/'youtube-verification-confirmed'</w:t>
+      </w:r>
+    </w:p>
+    <w:p>
+      <w:r>
+        <w:t xml:space="preserve">    marker.unlink(missing_ok=True)</w:t>
+      </w:r>
+    </w:p>
+    <w:p>
+      <w:r>
         <w:t xml:space="preserve">    process=subprocess.Popen([str(chrome_path()),'--user-data-dir='+str(profile.resolve()),'--no-first-run','--no-default-browser-check','--disable-background-mode','--new-window',url],stdout=subprocess.DEVNULL,stderr=subprocess.DEVNULL)</w:t>
       </w:r>
     </w:p>
     <w:p>
       <w:r>
-        <w:t xml:space="preserve">    try:</w:t>
-      </w:r>
-    </w:p>
-    <w:p>
-      <w:r>
-        <w:t xml:space="preserve">        process.wait(timeout=timeout)</w:t>
-      </w:r>
-    </w:p>
-    <w:p>
-      <w:r>
-        <w:t xml:space="preserve">    except subprocess.TimeoutExpired as error:</w:t>
-      </w:r>
-    </w:p>
-    <w:p>
-      <w:r>
-        <w:t xml:space="preserve">        raise RuntimeError('YouTube验证窗口仍未关闭；请完成登录并关闭专用窗口后重试。') from error</w:t>
+        <w:t xml:space="preserve">    deadline=time.monotonic()+timeout</w:t>
+      </w:r>
+    </w:p>
+    <w:p>
+      <w:r>
+        <w:t xml:space="preserve">    while process.poll() is None and not marker.exists():</w:t>
+      </w:r>
+    </w:p>
+    <w:p>
+      <w:r>
+        <w:t xml:space="preserve">        if time.monotonic()&gt;deadline:</w:t>
+      </w:r>
+    </w:p>
+    <w:p>
+      <w:r>
+        <w:t xml:space="preserve">            raise RuntimeError('YouTube验证窗口仍未关闭；请完成登录并关闭专用窗口后手动确认。')</w:t>
+      </w:r>
+    </w:p>
+    <w:p>
+      <w:r>
+        <w:t xml:space="preserve">        time.sleep(.5)</w:t>
+      </w:r>
+    </w:p>
+    <w:p>
+      <w:r>
+        <w:t xml:space="preserve">    marker.unlink(missing_ok=True)</w:t>
       </w:r>
     </w:p>
     <w:p>
@@ -17602,6 +17689,47 @@
     <w:p>
       <w:r>
         <w:t xml:space="preserve">    return profile</w:t>
+      </w:r>
+    </w:p>
+    <w:p/>
+    <w:p>
+      <w:r>
+        <w:t>def confirm(job):</w:t>
+      </w:r>
+    </w:p>
+    <w:p>
+      <w:r>
+        <w:t xml:space="preserve">    import json</w:t>
+      </w:r>
+    </w:p>
+    <w:p>
+      <w:r>
+        <w:t xml:space="preserve">    record=job/'job.json'</w:t>
+      </w:r>
+    </w:p>
+    <w:p>
+      <w:r>
+        <w:t xml:space="preserve">    if not record.is_file():raise ValueError('任务不存在')</w:t>
+      </w:r>
+    </w:p>
+    <w:p>
+      <w:r>
+        <w:t xml:space="preserve">    meta=json.loads(record.read_text())</w:t>
+      </w:r>
+    </w:p>
+    <w:p>
+      <w:r>
+        <w:t xml:space="preserve">    if meta.get('state')!='youtube_verifying':raise ValueError('任务当前不在等待YouTube验证，请刷新页面')</w:t>
+      </w:r>
+    </w:p>
+    <w:p>
+      <w:r>
+        <w:t xml:space="preserve">    (job/'youtube-verification-confirmed').touch()</w:t>
+      </w:r>
+    </w:p>
+    <w:p>
+      <w:r>
+        <w:t xml:space="preserve">    return {'ok':True,'message':'已确认关闭验证窗口，正在继续原任务，请稍候。'}</w:t>
       </w:r>
     </w:p>
     <w:p>
@@ -18445,7 +18573,7 @@
     </w:p>
     <w:p>
       <w:r>
-        <w:t xml:space="preserve">  "app.py": "de5aa99204ed5c0c0091be3a045c157968d9fa3758ba8833ee7543b23721221c",</w:t>
+        <w:t xml:space="preserve">  "app.py": "15b02945764aad7e0d83ca6cce391c652f3f2782db27d7903ffa888725e079ea",</w:t>
       </w:r>
     </w:p>
     <w:p>
@@ -18475,7 +18603,7 @@
     </w:p>
     <w:p>
       <w:r>
-        <w:t xml:space="preserve">  "index.html": "910c2bbee351032d375aff76fbd53da4af9b06a65579dd9913abdb20e88d2f87",</w:t>
+        <w:t xml:space="preserve">  "index.html": "2c42779b4fb3f6b4f05f3ca41290a9de2e90453c2f73ed50074a925180eb5aaa",</w:t>
       </w:r>
     </w:p>
     <w:p>
@@ -18615,7 +18743,7 @@
     </w:p>
     <w:p>
       <w:r>
-        <w:t xml:space="preserve">  "test_youtube_verification.py": "6d94837c22e56f74cdaf666b28f4bc550aaa3df93dd41049937d1b29cb20a225",</w:t>
+        <w:t xml:space="preserve">  "test_youtube_verification.py": "b6eaf70305d72e1399b1251d0134db9621c87e42e3d3b1de5951f8ae29cc6218",</w:t>
       </w:r>
     </w:p>
     <w:p>
@@ -18625,7 +18753,7 @@
     </w:p>
     <w:p>
       <w:r>
-        <w:t xml:space="preserve">  "youtube_verification.py": "9339d88a9fa85965d909045309c16599da841423df8ecf9c8257f788951332c9",</w:t>
+        <w:t xml:space="preserve">  "youtube_verification.py": "67849c06e73f6dae626c89267652f923ec626a0301a827e5516b9c0cce9886cf",</w:t>
       </w:r>
     </w:p>
     <w:p>

</xml_diff>

<commit_message>
Match YouTube resume button to yellow retry style
</commit_message>
<xml_diff>
--- a/安装与使用指南.docx
+++ b/安装与使用指南.docx
@@ -4658,7 +4658,7 @@
     </w:p>
     <w:p>
       <w:r>
-        <w:t>async function refresh(){const sequence=++refreshSequence;try{await refreshDeletions();let jobs=await(await fetch('/jobs')).json();if(sequence!==refreshSequence)return;jobs=jobs.filter(j=&gt;!deletedTaskIds.has(j.id));jobs.sort((a,b)=&gt;a.task_number&amp;&amp;b.task_number?b.task_number-a.task_number:(b.created_at??historicalTaskTimes[b.id]??b.added_at??Infinity)-(a.created_at??historicalTaskTimes[a.id]??a.added_at??Infinity));let host=document.querySelector('#jobs');host.replaceChildren();for(let j of jobs){let card=document.createElement('article');card.dataset.taskId=j.id;let h=document.createElement('h2');h.textContent=taskHeading(j);card.append(h);let p=document.createElement('p');p.textContent=(j.document&amp;&amp;!j.has_document)?'Word 文件已不在原保存位置，重新提交链接可生成':(stages[j.state]||'状态暂未识别：'+String(j.state));card.append(p);if(j.source_kind==='local'){let source=document.createElement('p');source.textContent=j.source_label;card.append(source)}else card.append(link('原网页',j.url));let deletion=deletionResults.get(j.id)||j.deletion_result;if(deletion){let status=document.createElement('p');status.className='delete-result';status.setAttribute('role','alert');status.style.color=deletion.status==='failed'?'#a52222':'#8b4520';renderDeletionResult(status,deletion);card.append(status)}if(j.error){let err=document.createElement('p');err.textContent=j.error;card.append(err)}if(j.cleanup_error){let note=document.createElement('p');note.textContent='Word 已生成，但部分临时文件未清理：'+j.cleanup_error;card.append(note)}if(j.has_document){let actions=document.createElement('p');actions.className='actions';actions.append(link('查看 Word 文稿','/preview/'+j.id,'action'));let reveal=document.createElement('button');reveal.type='button';reveal.className='secondary';reveal.textContent='打开文档所在位置';let revealStatus=document.createElement('small');revealStatus.setAttribute('role','status');reveal.onclick=async()=&gt;{reveal.disabled=true;revealStatus.textContent='正在打开文件夹…';try{await post('/reveal/'+j.id,{});revealStatus.textContent='已打开 Finder 文件夹。';msg.textContent='已打开文档所在的 Finder 文件夹。'}catch(e){revealStatus.textContent='打开失败：'+e.message;msg.textContent='打开失败：'+e.message}finally{reveal.disabled=false}};actions.append(reveal);actions.append(revealStatus);card.append(actions);let note=document.createElement('small');note.textContent=j.temporary_files_removed?(j.media_trashed?'原音视频已移入废纸篓，临时音轨已清理。':'原音视频与临时音轨已清理。'):'Word 内容未经人工校对。';card.append(note)}let controls=document.createElement('p');controls.className='actions';if(j.state==='youtube_verifying'){let resume=document.createElement('button');resume.textContent='已关闭验证弹窗，重新开始任务';resume.onclick=async()=&gt;{resume.disabled=true;try{let result=await post('/youtube/confirm/'+j.id,{});msg.textContent=result.message;await refresh()}catch(e){msg.textContent=e.message;resume.disabled=false}};controls.append(resume)}if(j.state==='failed'||j.state==='login_required'){let retry=document.createElement('button');retry.textContent='重试任务';retry.className='retry-task';retry.onclick=async()=&gt;{try{await post('/jobs',{url:j.url,engine:'qianwen'});await refresh()}catch(e){msg.textContent=e.message}};controls.append(retry)}let remove=document.createElement('button');remove.type='button';remove.className='secondary';remove.style.color='#a52222';remove.textContent='删除任务并同步到千问';if(deletion?.status==='pending'){remove.disabled=true;remove.textContent='正在同步删除…'}remove.onclick=async()=&gt;{if(!confirm('删除“'+(j.title||j.id)+'”？将停止该任务，把本机任务文件和相关文稿移入废纸篓。同时删除对应的千问云端记录，云端删除后无法恢复。'))return;deletionResults.set(j.id,{status:'pending',message:'正在删除并同步到千问，请稍候…'});msg.className='';msg.textContent='正在删除并同步到千问，请稍候…';remove.disabled=true;remove.textContent='正在同步删除…';try{let health=await(await fetch('/health')).json();if(!health.cloud_delete)throw Error('请先双击加载本次更新.command启用千问同步删除');await requireControls();let r=await post('/delete/'+j.id,{});if(r.deletion_result?.status==='pending'){deletionResults.set(j.id,r.deletion_result);msg.className='';renderDeletionResult(msg,r.deletion_result);await refresh();return}deletedTaskIds.add(j.id);++refreshSequence;document.querySelectorAll('article[data-task-id="'+j.id+'"]').forEach(node=&gt;node.remove());deletionResults.delete(j.id);showDeletionResult(r.deletion_result||{status:'success',message:r.message},true);await refresh()}catch(e){let message=e.deletionResult?.message||('删除失败\n工具任务列表记录：未删除成功\n本机文稿及任务文件：未确认删除成功\n对应的千问记录：未确认删除成功\n原因：'+e.message);let report=e.deletionResult||{status:'failed',message};deletionResults.set(j.id,report);showDeletionResult(report,false);let status=card.querySelector('.delete-result');if(!status){status=document.createElement('p');status.className='delete-result';status.setAttribute('role','alert');card.append(status)}status.style.color='#a52222';renderDeletionResult(status,report);remove.disabled=false;remove.textContent='删除任务并同步到千问'}};if(j.has_document){card.querySelector('.actions').append(remove)}else{controls.append(remove)}if(controls.children.length)card.append(controls);host.append(card)}await refreshLogin()}catch(e){msg.textContent='后台连接中断，请重新启动工具。'}}</w:t>
+        <w:t>async function refresh(){const sequence=++refreshSequence;try{await refreshDeletions();let jobs=await(await fetch('/jobs')).json();if(sequence!==refreshSequence)return;jobs=jobs.filter(j=&gt;!deletedTaskIds.has(j.id));jobs.sort((a,b)=&gt;a.task_number&amp;&amp;b.task_number?b.task_number-a.task_number:(b.created_at??historicalTaskTimes[b.id]??b.added_at??Infinity)-(a.created_at??historicalTaskTimes[a.id]??a.added_at??Infinity));let host=document.querySelector('#jobs');host.replaceChildren();for(let j of jobs){let card=document.createElement('article');card.dataset.taskId=j.id;let h=document.createElement('h2');h.textContent=taskHeading(j);card.append(h);let p=document.createElement('p');p.textContent=(j.document&amp;&amp;!j.has_document)?'Word 文件已不在原保存位置，重新提交链接可生成':(stages[j.state]||'状态暂未识别：'+String(j.state));card.append(p);if(j.source_kind==='local'){let source=document.createElement('p');source.textContent=j.source_label;card.append(source)}else card.append(link('原网页',j.url));let deletion=deletionResults.get(j.id)||j.deletion_result;if(deletion){let status=document.createElement('p');status.className='delete-result';status.setAttribute('role','alert');status.style.color=deletion.status==='failed'?'#a52222':'#8b4520';renderDeletionResult(status,deletion);card.append(status)}if(j.error){let err=document.createElement('p');err.textContent=j.error;card.append(err)}if(j.cleanup_error){let note=document.createElement('p');note.textContent='Word 已生成，但部分临时文件未清理：'+j.cleanup_error;card.append(note)}if(j.has_document){let actions=document.createElement('p');actions.className='actions';actions.append(link('查看 Word 文稿','/preview/'+j.id,'action'));let reveal=document.createElement('button');reveal.type='button';reveal.className='secondary';reveal.textContent='打开文档所在位置';let revealStatus=document.createElement('small');revealStatus.setAttribute('role','status');reveal.onclick=async()=&gt;{reveal.disabled=true;revealStatus.textContent='正在打开文件夹…';try{await post('/reveal/'+j.id,{});revealStatus.textContent='已打开 Finder 文件夹。';msg.textContent='已打开文档所在的 Finder 文件夹。'}catch(e){revealStatus.textContent='打开失败：'+e.message;msg.textContent='打开失败：'+e.message}finally{reveal.disabled=false}};actions.append(reveal);actions.append(revealStatus);card.append(actions);let note=document.createElement('small');note.textContent=j.temporary_files_removed?(j.media_trashed?'原音视频已移入废纸篓，临时音轨已清理。':'原音视频与临时音轨已清理。'):'Word 内容未经人工校对。';card.append(note)}let controls=document.createElement('p');controls.className='actions';if(j.state==='youtube_verifying'){let resume=document.createElement('button');resume.className='retry-task';resume.textContent='已关闭验证弹窗，重新开始任务';resume.onclick=async()=&gt;{resume.disabled=true;try{let result=await post('/youtube/confirm/'+j.id,{});msg.textContent=result.message;await refresh()}catch(e){msg.textContent=e.message;resume.disabled=false}};controls.append(resume)}if(j.state==='failed'||j.state==='login_required'){let retry=document.createElement('button');retry.textContent='重试任务';retry.className='retry-task';retry.onclick=async()=&gt;{try{await post('/jobs',{url:j.url,engine:'qianwen'});await refresh()}catch(e){msg.textContent=e.message}};controls.append(retry)}let remove=document.createElement('button');remove.type='button';remove.className='secondary';remove.style.color='#a52222';remove.textContent='删除任务并同步到千问';if(deletion?.status==='pending'){remove.disabled=true;remove.textContent='正在同步删除…'}remove.onclick=async()=&gt;{if(!confirm('删除“'+(j.title||j.id)+'”？将停止该任务，把本机任务文件和相关文稿移入废纸篓。同时删除对应的千问云端记录，云端删除后无法恢复。'))return;deletionResults.set(j.id,{status:'pending',message:'正在删除并同步到千问，请稍候…'});msg.className='';msg.textContent='正在删除并同步到千问，请稍候…';remove.disabled=true;remove.textContent='正在同步删除…';try{let health=await(await fetch('/health')).json();if(!health.cloud_delete)throw Error('请先双击加载本次更新.command启用千问同步删除');await requireControls();let r=await post('/delete/'+j.id,{});if(r.deletion_result?.status==='pending'){deletionResults.set(j.id,r.deletion_result);msg.className='';renderDeletionResult(msg,r.deletion_result);await refresh();return}deletedTaskIds.add(j.id);++refreshSequence;document.querySelectorAll('article[data-task-id="'+j.id+'"]').forEach(node=&gt;node.remove());deletionResults.delete(j.id);showDeletionResult(r.deletion_result||{status:'success',message:r.message},true);await refresh()}catch(e){let message=e.deletionResult?.message||('删除失败\n工具任务列表记录：未删除成功\n本机文稿及任务文件：未确认删除成功\n对应的千问记录：未确认删除成功\n原因：'+e.message);let report=e.deletionResult||{status:'failed',message};deletionResults.set(j.id,report);showDeletionResult(report,false);let status=card.querySelector('.delete-result');if(!status){status=document.createElement('p');status.className='delete-result';status.setAttribute('role','alert');card.append(status)}status.style.color='#a52222';renderDeletionResult(status,report);remove.disabled=false;remove.textContent='删除任务并同步到千问'}};if(j.has_document){card.querySelector('.actions').append(remove)}else{controls.append(remove)}if(controls.children.length)card.append(controls);host.append(card)}await refreshLogin()}catch(e){msg.textContent='后台连接中断，请重新启动工具。'}}</w:t>
       </w:r>
     </w:p>
     <w:p>
@@ -18603,7 +18603,7 @@
     </w:p>
     <w:p>
       <w:r>
-        <w:t xml:space="preserve">  "index.html": "2c42779b4fb3f6b4f05f3ca41290a9de2e90453c2f73ed50074a925180eb5aaa",</w:t>
+        <w:t xml:space="preserve">  "index.html": "1efafb4064d9c2abce905ca529713de2574d24793f29c623aeb173e9579ddf97",</w:t>
       </w:r>
     </w:p>
     <w:p>

</xml_diff>

<commit_message>
Use fixed task numbers in Qianwen upload titles and preserve deletion safety
</commit_message>
<xml_diff>
--- a/安装与使用指南.docx
+++ b/安装与使用指南.docx
@@ -707,6 +707,12 @@
     </w:p>
     <w:p/>
     <w:p>
+      <w:r>
+        <w:t>新上传千问的音频以固定任务序号和标题命名，例如“52 - 标题”，与工具任务列表及Word文件保持一致。重试和删除不会改变序号；已经上传的旧云端记录保留原名称和删除匹配信息，不重新上传。</w:t>
+      </w:r>
+    </w:p>
+    <w:p/>
+    <w:p>
       <w:pPr>
         <w:pStyle w:val="Heading1"/>
       </w:pPr>
@@ -8078,7 +8084,17 @@
     </w:p>
     <w:p>
       <w:r>
-        <w:t xml:space="preserve">    upload = job/'media'/(filename(meta['title'])+'-'+job.name+'.mp3')</w:t>
+        <w:t xml:space="preserve">    from task_numbering import numbers,document_name</w:t>
+      </w:r>
+    </w:p>
+    <w:p>
+      <w:r>
+        <w:t xml:space="preserve">    numbered_title=document_name(numbers(job.parent.parent)[job.name],filename(meta['title']))</w:t>
+      </w:r>
+    </w:p>
+    <w:p>
+      <w:r>
+        <w:t xml:space="preserve">    upload = job/'media'/(numbered_title+'.mp3')</w:t>
       </w:r>
     </w:p>
     <w:p>
@@ -8244,6 +8260,11 @@
     <w:p>
       <w:r>
         <w:t xml:space="preserve">                    meta['qianwen_upload_title']=upload.stem</w:t>
+      </w:r>
+    </w:p>
+    <w:p>
+      <w:r>
+        <w:t xml:space="preserve">                    meta['qianwen_numbered_title']=True</w:t>
       </w:r>
     </w:p>
     <w:p>
@@ -8545,7 +8566,32 @@
     </w:p>
     <w:p>
       <w:r>
-        <w:t xml:space="preserve">    if not title.endswith('-'+job.name):raise RuntimeError('无法确认千问记录归属，未执行删除')</w:t>
+        <w:t xml:space="preserve">    if not title.endswith('-'+job.name):</w:t>
+      </w:r>
+    </w:p>
+    <w:p>
+      <w:r>
+        <w:t xml:space="preserve">        if not meta.get('qianwen_numbered_title'):raise RuntimeError('无法确认千问记录归属，未执行删除')</w:t>
+      </w:r>
+    </w:p>
+    <w:p>
+      <w:r>
+        <w:t xml:space="preserve">        from task_numbering import numbers,document_name</w:t>
+      </w:r>
+    </w:p>
+    <w:p>
+      <w:r>
+        <w:t xml:space="preserve">        expected=document_name(numbers(job.parent.parent)[job.name],filename(meta['title']))</w:t>
+      </w:r>
+    </w:p>
+    <w:p>
+      <w:r>
+        <w:t xml:space="preserve">        if not meta.get('qianwen_numbered_title') or title!=expected:</w:t>
+      </w:r>
+    </w:p>
+    <w:p>
+      <w:r>
+        <w:t xml:space="preserve">            raise RuntimeError('无法确认千问记录归属，未执行删除')</w:t>
       </w:r>
     </w:p>
     <w:p>
@@ -18633,7 +18679,7 @@
     </w:p>
     <w:p>
       <w:r>
-        <w:t xml:space="preserve">  "qianwen_browser.py": "9ec0997fe8d21e15c169dd534c6b1686bcdbd4281497aa6a8ac3ad3b1d91e109",</w:t>
+        <w:t xml:space="preserve">  "qianwen_browser.py": "7b380bde0713ddc2b8717787f2e56412e1331f0ca1dec70e032ce6336f920427",</w:t>
       </w:r>
     </w:p>
     <w:p>

</xml_diff>

<commit_message>
Rename Word output folder and remove personal metadata from publication
</commit_message>
<xml_diff>
--- a/安装与使用指南.docx
+++ b/安装与使用指南.docx
@@ -7,7 +7,7 @@
         <w:pStyle w:val="Title"/>
       </w:pPr>
       <w:r>
-        <w:t>网页视频转语音识别文字稿（由千问提供支持）</w:t>
+        <w:t>网页视频转文字稿（由千问提供语音识别支持）</w:t>
       </w:r>
     </w:p>
     <w:p/>
@@ -109,7 +109,7 @@
     </w:p>
     <w:p>
       <w:r>
-        <w:t>6. 选择一个你有权处理的短音视频文件，或粘贴视频链接，点击橙色 **“开始生成文稿”**。Word 保存到用户“下载”文件夹中的“网页视频转语音识别文字稿（由千问提供支持）”。</w:t>
+        <w:t>6. 选择一个你有权处理的短音视频文件，或粘贴视频链接，点击橙色 **“开始生成文稿”**。Word 保存到用户“下载”文件夹中的“网页视频转文字稿（由千问提供语音识别支持）”。</w:t>
       </w:r>
     </w:p>
     <w:p>
@@ -372,7 +372,7 @@
     <w:p/>
     <w:p>
       <w:r>
-        <w:t>所有文稿直接保存在 `~/Downloads/网页视频转语音识别文字稿（由千问提供支持）/`，不建立任务二级文件夹。完成文档结构和内容完整性检查后，原下载媒体移入废纸篓，临时音轨清理。程序检查不代表人工确认识别准确率。本工具不生成总结。</w:t>
+        <w:t>所有文稿直接保存在 `~/Downloads/网页视频转文字稿（由千问提供语音识别支持）/`，不建立任务二级文件夹。完成文档结构和内容完整性检查后，原下载媒体移入废纸篓，临时音轨清理。程序检查不代表人工确认识别准确率。本工具不生成总结。</w:t>
       </w:r>
     </w:p>
     <w:p/>
@@ -796,6 +796,52 @@
         <w:t>.venv.backup-*/</w:t>
       </w:r>
     </w:p>
+    <w:p/>
+    <w:p>
+      <w:r>
+        <w:t># Local personal data and authentication state must never be published.</w:t>
+      </w:r>
+    </w:p>
+    <w:p>
+      <w:r>
+        <w:t>*.mp3</w:t>
+      </w:r>
+    </w:p>
+    <w:p>
+      <w:r>
+        <w:t>*.m4a</w:t>
+      </w:r>
+    </w:p>
+    <w:p>
+      <w:r>
+        <w:t>*.mp4</w:t>
+      </w:r>
+    </w:p>
+    <w:p>
+      <w:r>
+        <w:t>*.wav</w:t>
+      </w:r>
+    </w:p>
+    <w:p>
+      <w:r>
+        <w:t>*.webm</w:t>
+      </w:r>
+    </w:p>
+    <w:p>
+      <w:r>
+        <w:t>*.sqlite</w:t>
+      </w:r>
+    </w:p>
+    <w:p>
+      <w:r>
+        <w:t>*.sqlite3</w:t>
+      </w:r>
+    </w:p>
+    <w:p>
+      <w:r>
+        <w:t>*storage-state*</w:t>
+      </w:r>
+    </w:p>
     <w:p>
       <w:r>
         <w:t>```</w:t>
@@ -1087,7 +1133,7 @@
     </w:p>
     <w:p>
       <w:r>
-        <w:t xml:space="preserve">    if path.parent in (OUTPUT.parent / '网页视频转语音文稿', OUTPUT.parent / '网页视频转语音识别文字稿') and migrated.is_file():</w:t>
+        <w:t xml:space="preserve">    if path.parent in (OUTPUT.parent / '网页视频转语音识别文字稿（由千问提供支持）', OUTPUT.parent / '网页视频转语音文稿', OUTPUT.parent / '网页视频转语音识别文字稿') and migrated.is_file():</w:t>
       </w:r>
     </w:p>
     <w:p>
@@ -1097,7 +1143,7 @@
     </w:p>
     <w:p>
       <w:r>
-        <w:t xml:space="preserve">    if not any(root.resolve() in path.parents for root in (OUTPUT, LEGACY_OUTPUT, ROOT / 'outputs', OUTPUT.parent / '网页视频转语音文稿', OUTPUT.parent / '网页视频转语音识别文字稿')) or not path.is_file():</w:t>
+        <w:t xml:space="preserve">    if not any(root.resolve() in path.parents for root in (OUTPUT, LEGACY_OUTPUT, ROOT / 'outputs', OUTPUT.parent / '网页视频转语音识别文字稿（由千问提供支持）', OUTPUT.parent / '网页视频转语音文稿', OUTPUT.parent / '网页视频转语音识别文字稿')) or not path.is_file():</w:t>
       </w:r>
     </w:p>
     <w:p>
@@ -1967,7 +2013,7 @@
     </w:p>
     <w:p>
       <w:r>
-        <w:t xml:space="preserve">        result=trash_task(ROOT,WORK,[OUTPUT,LEGACY_OUTPUT,ROOT/'outputs',OUTPUT.parent/'网页视频转语音文稿'],ident)</w:t>
+        <w:t xml:space="preserve">        result=trash_task(ROOT,WORK,[OUTPUT,OUTPUT.parent/'网页视频转语音识别文字稿（由千问提供支持）',LEGACY_OUTPUT,ROOT/'outputs',OUTPUT.parent/'网页视频转语音文稿'],ident)</w:t>
       </w:r>
     </w:p>
     <w:p>
@@ -4423,7 +4469,7 @@
     </w:p>
     <w:p>
       <w:r>
-        <w:t>&lt;title&gt;网页视频转语音识别文字稿（由千问提供支持）&lt;/title&gt;</w:t>
+        <w:t>&lt;title&gt;网页视频转文字稿（由千问提供语音识别支持）&lt;/title&gt;</w:t>
       </w:r>
     </w:p>
     <w:p>
@@ -4498,7 +4544,7 @@
     </w:p>
     <w:p>
       <w:r>
-        <w:t>&lt;p&gt;&lt;small&gt;Word 保存到“下载/网页视频转语音识别文字稿（由千问提供支持）”。音频将上传千问服务器；需要登录时点击上方“登录或打开千问”。完成后直接查看或打开所在位置。Word 完整性检查通过后自动将原音视频移入废纸篓并清理临时音轨。&lt;/small&gt;&lt;/p&gt;</w:t>
+        <w:t>&lt;p&gt;&lt;small&gt;Word 保存到“下载/网页视频转文字稿（由千问提供语音识别支持）”。音频将上传千问服务器；需要登录时点击上方“登录或打开千问”。完成后直接查看或打开所在位置。Word 完整性检查通过后自动将原音视频移入废纸篓并清理临时音轨。&lt;/small&gt;&lt;/p&gt;</w:t>
       </w:r>
     </w:p>
     <w:p>
@@ -9082,7 +9128,27 @@
     </w:p>
     <w:p>
       <w:r>
-        <w:t>OUTPUT = Path.home() / 'Downloads' / '网页视频转语音识别文字稿（由千问提供支持）'</w:t>
+        <w:t>OUTPUT = Path.home() / 'Downloads' / '网页视频转文字稿（由千问提供语音识别支持）'</w:t>
+      </w:r>
+    </w:p>
+    <w:p>
+      <w:r>
+        <w:t>PREVIOUS_OUTPUT = OUTPUT.parent / '网页视频转语音识别文字稿（由千问提供支持）'</w:t>
+      </w:r>
+    </w:p>
+    <w:p>
+      <w:r>
+        <w:t># Preserve existing documents when upgrading an installed copy.</w:t>
+      </w:r>
+    </w:p>
+    <w:p>
+      <w:r>
+        <w:t>if PREVIOUS_OUTPUT.is_dir() and not OUTPUT.exists():</w:t>
+      </w:r>
+    </w:p>
+    <w:p>
+      <w:r>
+        <w:t xml:space="preserve">    PREVIOUS_OUTPUT.rename(OUTPUT)</w:t>
       </w:r>
     </w:p>
     <w:p>
@@ -9580,7 +9646,7 @@
     </w:p>
     <w:p>
       <w:r>
-        <w:t xml:space="preserve">            node = Path('~/.cache/codex-runtimes/codex-primary-runtime/dependencies/node/bin/node')</w:t>
+        <w:t xml:space="preserve">            node = Path.home() / '.cache/codex-runtimes/codex-primary-runtime/dependencies/node/bin/node'</w:t>
       </w:r>
     </w:p>
     <w:p>
@@ -18614,12 +18680,12 @@
     </w:p>
     <w:p>
       <w:r>
-        <w:t xml:space="preserve">  ".gitignore": "3e1cfc92af2c00c9dede00b674647a334c4cd068d8d8d743780802025013e291",</w:t>
-      </w:r>
-    </w:p>
-    <w:p>
-      <w:r>
-        <w:t xml:space="preserve">  "app.py": "15b02945764aad7e0d83ca6cce391c652f3f2782db27d7903ffa888725e079ea",</w:t>
+        <w:t xml:space="preserve">  ".gitignore": "1d9594b7ccf0d8bf23f5b6bb67eebf9a8633b907d972ba4c9693e8d1a031a50e",</w:t>
+      </w:r>
+    </w:p>
+    <w:p>
+      <w:r>
+        <w:t xml:space="preserve">  "app.py": "7b73c01abcb72bc63085d82939e3068dd274e76f3f1d1041e9ace4a5d2c3998e",</w:t>
       </w:r>
     </w:p>
     <w:p>
@@ -18649,7 +18715,7 @@
     </w:p>
     <w:p>
       <w:r>
-        <w:t xml:space="preserve">  "index.html": "1efafb4064d9c2abce905ca529713de2574d24793f29c623aeb173e9579ddf97",</w:t>
+        <w:t xml:space="preserve">  "index.html": "0bd751e2d42cb943cc7537bfd66568c126cefee63f1dd967884fd16b1bda5c6e",</w:t>
       </w:r>
     </w:p>
     <w:p>
@@ -18684,7 +18750,7 @@
     </w:p>
     <w:p>
       <w:r>
-        <w:t xml:space="preserve">  "reader.py": "f9dad8cc4abb0173d5f9d56c01b4d90a787a49b83c216cae86f42ada2bc53fdd",</w:t>
+        <w:t xml:space="preserve">  "reader.py": "d0212d4ccca88ab6367be92aee6138edaa8fa4dbebaf2fcdcf430082a83dd29b",</w:t>
       </w:r>
     </w:p>
     <w:p>

</xml_diff>

<commit_message>
Refresh public guide checksums after privacy exclusions
</commit_message>
<xml_diff>
--- a/安装与使用指南.docx
+++ b/安装与使用指南.docx
@@ -842,6 +842,52 @@
         <w:t>*storage-state*</w:t>
       </w:r>
     </w:p>
+    <w:p/>
+    <w:p>
+      <w:r>
+        <w:t># Local personal data and authentication state must never be published.</w:t>
+      </w:r>
+    </w:p>
+    <w:p>
+      <w:r>
+        <w:t>*.mp3</w:t>
+      </w:r>
+    </w:p>
+    <w:p>
+      <w:r>
+        <w:t>*.m4a</w:t>
+      </w:r>
+    </w:p>
+    <w:p>
+      <w:r>
+        <w:t>*.mp4</w:t>
+      </w:r>
+    </w:p>
+    <w:p>
+      <w:r>
+        <w:t>*.wav</w:t>
+      </w:r>
+    </w:p>
+    <w:p>
+      <w:r>
+        <w:t>*.webm</w:t>
+      </w:r>
+    </w:p>
+    <w:p>
+      <w:r>
+        <w:t>*.sqlite</w:t>
+      </w:r>
+    </w:p>
+    <w:p>
+      <w:r>
+        <w:t>*.sqlite3</w:t>
+      </w:r>
+    </w:p>
+    <w:p>
+      <w:r>
+        <w:t>*storage-state*</w:t>
+      </w:r>
+    </w:p>
     <w:p>
       <w:r>
         <w:t>```</w:t>
@@ -18680,7 +18726,7 @@
     </w:p>
     <w:p>
       <w:r>
-        <w:t xml:space="preserve">  ".gitignore": "1d9594b7ccf0d8bf23f5b6bb67eebf9a8633b907d972ba4c9693e8d1a031a50e",</w:t>
+        <w:t xml:space="preserve">  ".gitignore": "441ba499047830ff2c33283c180262761565e59eb322ed49d0faa5ef50c3b1c7",</w:t>
       </w:r>
     </w:p>
     <w:p>

</xml_diff>

<commit_message>
Share one YouTube verification session across queued tasks
</commit_message>
<xml_diff>
--- a/安装与使用指南.docx
+++ b/安装与使用指南.docx
@@ -713,6 +713,12 @@
     </w:p>
     <w:p/>
     <w:p>
+      <w:r>
+        <w:t>YouTube 登录或人机验证由所有任务共用一个专用 Chrome 窗口及登录目录。等待中的任务共用验证结果，完成后 10 分钟内不会重复弹窗；后续下载优先复用已保存的登录状态。任意等待任务上的手动确认按钮可通知所有等待任务继续。专用登录目录仅在本机 work/ 内，禁止上传或分享。网站仍可能再次要求验证。更新后请先完成并关闭旧验证窗口，再运行“加载本次更新.command”；已失败的任务可以重试。</w:t>
+      </w:r>
+    </w:p>
+    <w:p/>
+    <w:p>
       <w:pPr>
         <w:pStyle w:val="Heading1"/>
       </w:pPr>
@@ -9707,7 +9713,27 @@
     </w:p>
     <w:p>
       <w:r>
-        <w:t xml:space="preserve">            if args.cookies_browser:</w:t>
+        <w:t xml:space="preserve">            from youtube_verification import saved_profile</w:t>
+      </w:r>
+    </w:p>
+    <w:p>
+      <w:r>
+        <w:t xml:space="preserve">            youtube_profile = saved_profile(job) if 'youtube.com' in args.url or 'youtu.be' in args.url else None</w:t>
+      </w:r>
+    </w:p>
+    <w:p>
+      <w:r>
+        <w:t xml:space="preserve">            if youtube_profile:</w:t>
+      </w:r>
+    </w:p>
+    <w:p>
+      <w:r>
+        <w:t xml:space="preserve">                options['cookiesfrombrowser'] = ('chrome', str(youtube_profile.resolve()))</w:t>
+      </w:r>
+    </w:p>
+    <w:p>
+      <w:r>
+        <w:t xml:space="preserve">            if args.cookies_browser and not youtube_profile:</w:t>
       </w:r>
     </w:p>
     <w:p>
@@ -17433,7 +17459,7 @@
     </w:p>
     <w:p>
       <w:r>
-        <w:t xml:space="preserve">   job=Path(tmp);cookies=job/'youtube-manual-chrome/Default/Cookies';cookies.parent.mkdir(parents=True);cookies.touch()</w:t>
+        <w:t xml:space="preserve">   job=Path(tmp)/'work/jobs/task';job.mkdir(parents=True);cookies=job.parent.parent/'youtube-verification/youtube-manual-chrome/Default/Cookies';cookies.parent.mkdir(parents=True);cookies.touch()</w:t>
       </w:r>
     </w:p>
     <w:p>
@@ -17500,6 +17526,214 @@
     <w:p>
       <w:r>
         <w:t xml:space="preserve">   with self.assertRaises(ValueError):confirm(job)</w:t>
+      </w:r>
+    </w:p>
+    <w:p/>
+    <w:p>
+      <w:r>
+        <w:t xml:space="preserve"> def test_two_tasks_reuse_one_window(self):</w:t>
+      </w:r>
+    </w:p>
+    <w:p>
+      <w:r>
+        <w:t xml:space="preserve">  import tempfile</w:t>
+      </w:r>
+    </w:p>
+    <w:p>
+      <w:r>
+        <w:t xml:space="preserve">  from pathlib import Path</w:t>
+      </w:r>
+    </w:p>
+    <w:p>
+      <w:r>
+        <w:t xml:space="preserve">  from unittest.mock import patch,Mock</w:t>
+      </w:r>
+    </w:p>
+    <w:p>
+      <w:r>
+        <w:t xml:space="preserve">  from youtube_verification import verify,shared_root</w:t>
+      </w:r>
+    </w:p>
+    <w:p>
+      <w:r>
+        <w:t xml:space="preserve">  with tempfile.TemporaryDirectory() as tmp:</w:t>
+      </w:r>
+    </w:p>
+    <w:p>
+      <w:r>
+        <w:t xml:space="preserve">   jobs=[Path(tmp)/'work/jobs'/str(i) for i in range(2)]</w:t>
+      </w:r>
+    </w:p>
+    <w:p>
+      <w:r>
+        <w:t xml:space="preserve">   for job in jobs:job.mkdir(parents=True)</w:t>
+      </w:r>
+    </w:p>
+    <w:p>
+      <w:r>
+        <w:t xml:space="preserve">   cookies=shared_root(jobs[0])/'youtube-manual-chrome/Default/Cookies';cookies.parent.mkdir(parents=True);cookies.touch()</w:t>
+      </w:r>
+    </w:p>
+    <w:p>
+      <w:r>
+        <w:t xml:space="preserve">   with patch('youtube_verification.chrome_path',return_value=Path('/chrome')),patch('youtube_verification.subprocess.Popen') as launch:</w:t>
+      </w:r>
+    </w:p>
+    <w:p>
+      <w:r>
+        <w:t xml:space="preserve">    first=verify('https://youtube.com/watch?v=one',jobs[0],{},Mock())</w:t>
+      </w:r>
+    </w:p>
+    <w:p>
+      <w:r>
+        <w:t xml:space="preserve">    second=verify('https://youtube.com/watch?v=two',jobs[1],{},Mock())</w:t>
+      </w:r>
+    </w:p>
+    <w:p>
+      <w:r>
+        <w:t xml:space="preserve">    self.assertEqual(first,second);self.assertEqual(launch.call_count,1)</w:t>
+      </w:r>
+    </w:p>
+    <w:p/>
+    <w:p>
+      <w:r>
+        <w:t xml:space="preserve"> def test_any_waiting_task_can_confirm_shared_window(self):</w:t>
+      </w:r>
+    </w:p>
+    <w:p>
+      <w:r>
+        <w:t xml:space="preserve">  import tempfile,json</w:t>
+      </w:r>
+    </w:p>
+    <w:p>
+      <w:r>
+        <w:t xml:space="preserve">  from pathlib import Path</w:t>
+      </w:r>
+    </w:p>
+    <w:p>
+      <w:r>
+        <w:t xml:space="preserve">  from youtube_verification import confirm,shared_root</w:t>
+      </w:r>
+    </w:p>
+    <w:p>
+      <w:r>
+        <w:t xml:space="preserve">  with tempfile.TemporaryDirectory() as tmp:</w:t>
+      </w:r>
+    </w:p>
+    <w:p>
+      <w:r>
+        <w:t xml:space="preserve">   job=Path(tmp)/'work/jobs/task';job.mkdir(parents=True)</w:t>
+      </w:r>
+    </w:p>
+    <w:p>
+      <w:r>
+        <w:t xml:space="preserve">   (job/'job.json').write_text(json.dumps({'state':'youtube_verifying','youtube_shared_verification':True}))</w:t>
+      </w:r>
+    </w:p>
+    <w:p>
+      <w:r>
+        <w:t xml:space="preserve">   confirm(job);self.assertTrue((shared_root(job)/'confirmed').exists())</w:t>
+      </w:r>
+    </w:p>
+    <w:p/>
+    <w:p>
+      <w:r>
+        <w:t xml:space="preserve"> def test_concurrent_tasks_wait_for_one_window(self):</w:t>
+      </w:r>
+    </w:p>
+    <w:p>
+      <w:r>
+        <w:t xml:space="preserve">  import tempfile,time,threading</w:t>
+      </w:r>
+    </w:p>
+    <w:p>
+      <w:r>
+        <w:t xml:space="preserve">  from concurrent.futures import ThreadPoolExecutor</w:t>
+      </w:r>
+    </w:p>
+    <w:p>
+      <w:r>
+        <w:t xml:space="preserve">  from pathlib import Path</w:t>
+      </w:r>
+    </w:p>
+    <w:p>
+      <w:r>
+        <w:t xml:space="preserve">  from unittest.mock import patch,Mock</w:t>
+      </w:r>
+    </w:p>
+    <w:p>
+      <w:r>
+        <w:t xml:space="preserve">  from youtube_verification import verify,shared_root</w:t>
+      </w:r>
+    </w:p>
+    <w:p>
+      <w:r>
+        <w:t xml:space="preserve">  with tempfile.TemporaryDirectory() as tmp:</w:t>
+      </w:r>
+    </w:p>
+    <w:p>
+      <w:r>
+        <w:t xml:space="preserve">   jobs=[Path(tmp)/'work/jobs'/str(i) for i in range(2)]</w:t>
+      </w:r>
+    </w:p>
+    <w:p>
+      <w:r>
+        <w:t xml:space="preserve">   for job in jobs:job.mkdir(parents=True)</w:t>
+      </w:r>
+    </w:p>
+    <w:p>
+      <w:r>
+        <w:t xml:space="preserve">   cookies=shared_root(jobs[0])/'youtube-manual-chrome/Default/Cookies';cookies.parent.mkdir(parents=True);cookies.touch()</w:t>
+      </w:r>
+    </w:p>
+    <w:p>
+      <w:r>
+        <w:t xml:space="preserve">   opened=threading.Event();release=threading.Event()</w:t>
+      </w:r>
+    </w:p>
+    <w:p>
+      <w:r>
+        <w:t xml:space="preserve">   process=Mock();process.poll.side_effect=lambda:0 if release.is_set() else None</w:t>
+      </w:r>
+    </w:p>
+    <w:p>
+      <w:r>
+        <w:t xml:space="preserve">   def launch(*args,**kwargs):opened.set();return process</w:t>
+      </w:r>
+    </w:p>
+    <w:p>
+      <w:r>
+        <w:t xml:space="preserve">   with patch('youtube_verification.chrome_path',return_value=Path('/chrome')),patch('youtube_verification.subprocess.Popen',side_effect=launch) as popen:</w:t>
+      </w:r>
+    </w:p>
+    <w:p>
+      <w:r>
+        <w:t xml:space="preserve">    with ThreadPoolExecutor(max_workers=2) as pool:</w:t>
+      </w:r>
+    </w:p>
+    <w:p>
+      <w:r>
+        <w:t xml:space="preserve">     a=pool.submit(verify,'https://youtube.com/a',jobs[0],{},Mock())</w:t>
+      </w:r>
+    </w:p>
+    <w:p>
+      <w:r>
+        <w:t xml:space="preserve">     self.assertTrue(opened.wait(2))</w:t>
+      </w:r>
+    </w:p>
+    <w:p>
+      <w:r>
+        <w:t xml:space="preserve">     b=pool.submit(verify,'https://youtube.com/b',jobs[1],{},Mock())</w:t>
+      </w:r>
+    </w:p>
+    <w:p>
+      <w:r>
+        <w:t xml:space="preserve">     time.sleep(.1);self.assertFalse(b.done());release.set()</w:t>
+      </w:r>
+    </w:p>
+    <w:p>
+      <w:r>
+        <w:t xml:space="preserve">     self.assertEqual(a.result(timeout=3),b.result(timeout=3));self.assertEqual(popen.call_count,1)</w:t>
       </w:r>
     </w:p>
     <w:p>
@@ -17703,7 +17937,12 @@
     </w:p>
     <w:p>
       <w:r>
-        <w:t>import os,time,subprocess,sys</w:t>
+        <w:t>import os,time,subprocess,sys,json</w:t>
+      </w:r>
+    </w:p>
+    <w:p>
+      <w:r>
+        <w:t>from runtime_compat import file_lock</w:t>
       </w:r>
     </w:p>
     <w:p>
@@ -17761,27 +18000,101 @@
     <w:p/>
     <w:p>
       <w:r>
+        <w:t>REUSE_SECONDS = 600</w:t>
+      </w:r>
+    </w:p>
+    <w:p/>
+    <w:p>
+      <w:r>
+        <w:t>def shared_root(job):</w:t>
+      </w:r>
+    </w:p>
+    <w:p>
+      <w:r>
+        <w:t xml:space="preserve">    return job.parent.parent / 'youtube-verification'</w:t>
+      </w:r>
+    </w:p>
+    <w:p/>
+    <w:p>
+      <w:r>
+        <w:t>def saved_profile(job):</w:t>
+      </w:r>
+    </w:p>
+    <w:p>
+      <w:r>
+        <w:t xml:space="preserve">    profile = shared_root(job) / 'youtube-manual-chrome'</w:t>
+      </w:r>
+    </w:p>
+    <w:p>
+      <w:r>
+        <w:t xml:space="preserve">    return profile if any((profile / 'Default' / p).is_file() for p in ('Network/Cookies', 'Cookies')) else None</w:t>
+      </w:r>
+    </w:p>
+    <w:p/>
+    <w:p>
+      <w:r>
+        <w:t>def recently_verified(root):</w:t>
+      </w:r>
+    </w:p>
+    <w:p>
+      <w:r>
+        <w:t xml:space="preserve">    try:</w:t>
+      </w:r>
+    </w:p>
+    <w:p>
+      <w:r>
+        <w:t xml:space="preserve">        age = time.time() - float((root / 'verified-at').read_text())</w:t>
+      </w:r>
+    </w:p>
+    <w:p>
+      <w:r>
+        <w:t xml:space="preserve">        return 0 &lt;= age &lt; REUSE_SECONDS</w:t>
+      </w:r>
+    </w:p>
+    <w:p>
+      <w:r>
+        <w:t xml:space="preserve">    except (OSError, ValueError):</w:t>
+      </w:r>
+    </w:p>
+    <w:p>
+      <w:r>
+        <w:t xml:space="preserve">        return False</w:t>
+      </w:r>
+    </w:p>
+    <w:p/>
+    <w:p>
+      <w:r>
         <w:t>def verify(url,job,meta,save,timeout=900):</w:t>
       </w:r>
     </w:p>
     <w:p>
       <w:r>
-        <w:t xml:space="preserve">    # A separate profile: never launches or reads the user's everyday Chrome profile.</w:t>
-      </w:r>
-    </w:p>
-    <w:p>
-      <w:r>
-        <w:t xml:space="preserve">    profile=job/'youtube-manual-chrome'</w:t>
-      </w:r>
-    </w:p>
-    <w:p>
-      <w:r>
-        <w:t xml:space="preserve">    profile.mkdir(parents=True,exist_ok=True)</w:t>
-      </w:r>
-    </w:p>
-    <w:p>
-      <w:r>
-        <w:t xml:space="preserve">    meta.update(state='youtube_verifying',error='请在弹出的Chrome专用窗口完成YouTube登录或验证，然后关闭该专用窗口；工具自动重试下载。')</w:t>
+        <w:t xml:space="preserve">    root = shared_root(job)</w:t>
+      </w:r>
+    </w:p>
+    <w:p>
+      <w:r>
+        <w:t xml:space="preserve">    root.mkdir(parents=True,exist_ok=True)</w:t>
+      </w:r>
+    </w:p>
+    <w:p>
+      <w:r>
+        <w:t xml:space="preserve">    profile = root / 'youtube-manual-chrome'</w:t>
+      </w:r>
+    </w:p>
+    <w:p>
+      <w:r>
+        <w:t xml:space="preserve">    marker = root / 'confirmed'</w:t>
+      </w:r>
+    </w:p>
+    <w:p>
+      <w:r>
+        <w:t xml:space="preserve">    meta.update(state='youtube_verifying',youtube_shared_verification=True,</w:t>
+      </w:r>
+    </w:p>
+    <w:p>
+      <w:r>
+        <w:t xml:space="preserve">        error='等待共享YouTube验证：只需在一个专用窗口完成登录或验证并关闭窗口，所有等待任务将继续。')</w:t>
       </w:r>
     </w:p>
     <w:p>
@@ -17791,62 +18104,137 @@
     </w:p>
     <w:p>
       <w:r>
-        <w:t xml:space="preserve">    marker=job/'youtube-verification-confirmed'</w:t>
-      </w:r>
-    </w:p>
-    <w:p>
-      <w:r>
-        <w:t xml:space="preserve">    marker.unlink(missing_ok=True)</w:t>
-      </w:r>
-    </w:p>
-    <w:p>
-      <w:r>
-        <w:t xml:space="preserve">    process=subprocess.Popen([str(chrome_path()),'--user-data-dir='+str(profile.resolve()),'--no-first-run','--no-default-browser-check','--disable-background-mode','--new-window',url],stdout=subprocess.DEVNULL,stderr=subprocess.DEVNULL)</w:t>
-      </w:r>
-    </w:p>
-    <w:p>
-      <w:r>
-        <w:t xml:space="preserve">    deadline=time.monotonic()+timeout</w:t>
-      </w:r>
-    </w:p>
-    <w:p>
-      <w:r>
-        <w:t xml:space="preserve">    while process.poll() is None and not marker.exists():</w:t>
-      </w:r>
-    </w:p>
-    <w:p>
-      <w:r>
-        <w:t xml:space="preserve">        if time.monotonic()&gt;deadline:</w:t>
-      </w:r>
-    </w:p>
-    <w:p>
-      <w:r>
-        <w:t xml:space="preserve">            raise RuntimeError('YouTube验证窗口仍未关闭；请完成登录并关闭专用窗口后手动确认。')</w:t>
-      </w:r>
-    </w:p>
-    <w:p>
-      <w:r>
-        <w:t xml:space="preserve">        time.sleep(.5)</w:t>
-      </w:r>
-    </w:p>
-    <w:p>
-      <w:r>
-        <w:t xml:space="preserve">    marker.unlink(missing_ok=True)</w:t>
-      </w:r>
-    </w:p>
-    <w:p>
-      <w:r>
-        <w:t xml:space="preserve">    if not (profile/'Default'/'Network'/'Cookies').is_file() and not (profile/'Default'/'Cookies').is_file():</w:t>
-      </w:r>
-    </w:p>
-    <w:p>
-      <w:r>
-        <w:t xml:space="preserve">        raise RuntimeError('Chrome未保存验证会话，请在专用窗口完成登录后再重试')</w:t>
-      </w:r>
-    </w:p>
-    <w:p>
-      <w:r>
-        <w:t xml:space="preserve">    return profile</w:t>
+        <w:t xml:space="preserve">    deadline = time.monotonic()+timeout</w:t>
+      </w:r>
+    </w:p>
+    <w:p>
+      <w:r>
+        <w:t xml:space="preserve">    with (root / 'session.lock').open('a') as lock:</w:t>
+      </w:r>
+    </w:p>
+    <w:p>
+      <w:r>
+        <w:t xml:space="preserve">        while True:</w:t>
+      </w:r>
+    </w:p>
+    <w:p>
+      <w:r>
+        <w:t xml:space="preserve">            try:</w:t>
+      </w:r>
+    </w:p>
+    <w:p>
+      <w:r>
+        <w:t xml:space="preserve">                file_lock.flock(lock,file_lock.LOCK_EX | file_lock.LOCK_NB)</w:t>
+      </w:r>
+    </w:p>
+    <w:p>
+      <w:r>
+        <w:t xml:space="preserve">                break</w:t>
+      </w:r>
+    </w:p>
+    <w:p>
+      <w:r>
+        <w:t xml:space="preserve">            except BlockingIOError:</w:t>
+      </w:r>
+    </w:p>
+    <w:p>
+      <w:r>
+        <w:t xml:space="preserve">                if time.monotonic() &gt;= deadline:</w:t>
+      </w:r>
+    </w:p>
+    <w:p>
+      <w:r>
+        <w:t xml:space="preserve">                    raise RuntimeError('等待共享YouTube验证超时，请完成专用窗口验证后重试')</w:t>
+      </w:r>
+    </w:p>
+    <w:p>
+      <w:r>
+        <w:t xml:space="preserve">                time.sleep(.5)</w:t>
+      </w:r>
+    </w:p>
+    <w:p>
+      <w:r>
+        <w:t xml:space="preserve">        try:</w:t>
+      </w:r>
+    </w:p>
+    <w:p>
+      <w:r>
+        <w:t xml:space="preserve">            if recently_verified(root) and saved_profile(job):</w:t>
+      </w:r>
+    </w:p>
+    <w:p>
+      <w:r>
+        <w:t xml:space="preserve">                return profile</w:t>
+      </w:r>
+    </w:p>
+    <w:p>
+      <w:r>
+        <w:t xml:space="preserve">            profile.mkdir(parents=True,exist_ok=True)</w:t>
+      </w:r>
+    </w:p>
+    <w:p>
+      <w:r>
+        <w:t xml:space="preserve">            marker.unlink(missing_ok=True)</w:t>
+      </w:r>
+    </w:p>
+    <w:p>
+      <w:r>
+        <w:t xml:space="preserve">            process=subprocess.Popen([str(chrome_path()),'--user-data-dir='+str(profile.resolve()),'--no-first-run','--no-default-browser-check','--disable-background-mode','--new-window',url],stdout=subprocess.DEVNULL,stderr=subprocess.DEVNULL)</w:t>
+      </w:r>
+    </w:p>
+    <w:p>
+      <w:r>
+        <w:t xml:space="preserve">            while process.poll() is None and not marker.exists():</w:t>
+      </w:r>
+    </w:p>
+    <w:p>
+      <w:r>
+        <w:t xml:space="preserve">                if time.monotonic()&gt;deadline:</w:t>
+      </w:r>
+    </w:p>
+    <w:p>
+      <w:r>
+        <w:t xml:space="preserve">                    raise RuntimeError('YouTube验证窗口仍未关闭；请完成登录并关闭专用窗口后手动确认。')</w:t>
+      </w:r>
+    </w:p>
+    <w:p>
+      <w:r>
+        <w:t xml:space="preserve">                time.sleep(.5)</w:t>
+      </w:r>
+    </w:p>
+    <w:p>
+      <w:r>
+        <w:t xml:space="preserve">            marker.unlink(missing_ok=True)</w:t>
+      </w:r>
+    </w:p>
+    <w:p>
+      <w:r>
+        <w:t xml:space="preserve">            if not saved_profile(job):</w:t>
+      </w:r>
+    </w:p>
+    <w:p>
+      <w:r>
+        <w:t xml:space="preserve">                raise RuntimeError('Chrome未保存验证会话，请在专用窗口完成登录后再重试')</w:t>
+      </w:r>
+    </w:p>
+    <w:p>
+      <w:r>
+        <w:t xml:space="preserve">            (root / 'verified-at').write_text(str(time.time()))</w:t>
+      </w:r>
+    </w:p>
+    <w:p>
+      <w:r>
+        <w:t xml:space="preserve">            return profile</w:t>
+      </w:r>
+    </w:p>
+    <w:p>
+      <w:r>
+        <w:t xml:space="preserve">        finally:</w:t>
+      </w:r>
+    </w:p>
+    <w:p>
+      <w:r>
+        <w:t xml:space="preserve">            file_lock.flock(lock,file_lock.LOCK_UN)</w:t>
       </w:r>
     </w:p>
     <w:p/>
@@ -17882,7 +18270,27 @@
     </w:p>
     <w:p>
       <w:r>
-        <w:t xml:space="preserve">    (job/'youtube-verification-confirmed').touch()</w:t>
+        <w:t xml:space="preserve">    if meta.get('youtube_shared_verification'):</w:t>
+      </w:r>
+    </w:p>
+    <w:p>
+      <w:r>
+        <w:t xml:space="preserve">        root=shared_root(job);root.mkdir(parents=True,exist_ok=True)</w:t>
+      </w:r>
+    </w:p>
+    <w:p>
+      <w:r>
+        <w:t xml:space="preserve">        (root/'confirmed').touch()</w:t>
+      </w:r>
+    </w:p>
+    <w:p>
+      <w:r>
+        <w:t xml:space="preserve">    else:</w:t>
+      </w:r>
+    </w:p>
+    <w:p>
+      <w:r>
+        <w:t xml:space="preserve">        (job/'youtube-verification-confirmed').touch()</w:t>
       </w:r>
     </w:p>
     <w:p>
@@ -18796,7 +19204,7 @@
     </w:p>
     <w:p>
       <w:r>
-        <w:t xml:space="preserve">  "reader.py": "d0212d4ccca88ab6367be92aee6138edaa8fa4dbebaf2fcdcf430082a83dd29b",</w:t>
+        <w:t xml:space="preserve">  "reader.py": "18cbdb7df94172e178e64f2ab0e5c8bfaaafcbd0565e41af6f559d1c17c04c6a",</w:t>
       </w:r>
     </w:p>
     <w:p>
@@ -18901,7 +19309,7 @@
     </w:p>
     <w:p>
       <w:r>
-        <w:t xml:space="preserve">  "test_youtube_verification.py": "b6eaf70305d72e1399b1251d0134db9621c87e42e3d3b1de5951f8ae29cc6218",</w:t>
+        <w:t xml:space="preserve">  "test_youtube_verification.py": "80a4e86f691f5d8996ee4db7c21663f59becec74bda71a5045ba45385c2bb5dc",</w:t>
       </w:r>
     </w:p>
     <w:p>
@@ -18911,7 +19319,7 @@
     </w:p>
     <w:p>
       <w:r>
-        <w:t xml:space="preserve">  "youtube_verification.py": "67849c06e73f6dae626c89267652f923ec626a0301a827e5516b9c0cce9886cf",</w:t>
+        <w:t xml:space="preserve">  "youtube_verification.py": "f5b8f2ea1901a0ad10f8ad18ff4854ec7057af3e06f784c8c962756b5b7c4e60",</w:t>
       </w:r>
     </w:p>
     <w:p>

</xml_diff>

<commit_message>
Delete matching Qianwen record only after verifying saved Word
</commit_message>
<xml_diff>
--- a/安装与使用指南.docx
+++ b/安装与使用指南.docx
@@ -719,6 +719,12 @@
     </w:p>
     <w:p/>
     <w:p>
+      <w:r>
+        <w:t>新任务生成 Word 后，会先确认文件已保存到目标文件夹，并通过结构、完整内容和文件校验，再自动删除对应的千问云端记录。仅定位本任务的上传记录；保存或校验失败时不删除。云端清理失败不影响已生成的 Word，任务卡片显示清理状态。此规则用于更新后完成的任务，不批量删除此前完成的记录。</w:t>
+      </w:r>
+    </w:p>
+    <w:p/>
+    <w:p>
       <w:pPr>
         <w:pStyle w:val="Heading1"/>
       </w:pPr>
@@ -4762,7 +4768,7 @@
     </w:p>
     <w:p>
       <w:r>
-        <w:t>async function refresh(){const sequence=++refreshSequence;try{await refreshDeletions();let jobs=await(await fetch('/jobs')).json();if(sequence!==refreshSequence)return;jobs=jobs.filter(j=&gt;!deletedTaskIds.has(j.id));jobs.sort((a,b)=&gt;a.task_number&amp;&amp;b.task_number?b.task_number-a.task_number:(b.created_at??historicalTaskTimes[b.id]??b.added_at??Infinity)-(a.created_at??historicalTaskTimes[a.id]??a.added_at??Infinity));let host=document.querySelector('#jobs');host.replaceChildren();for(let j of jobs){let card=document.createElement('article');card.dataset.taskId=j.id;let h=document.createElement('h2');h.textContent=taskHeading(j);card.append(h);let p=document.createElement('p');p.textContent=(j.document&amp;&amp;!j.has_document)?'Word 文件已不在原保存位置，重新提交链接可生成':(stages[j.state]||'状态暂未识别：'+String(j.state));card.append(p);if(j.source_kind==='local'){let source=document.createElement('p');source.textContent=j.source_label;card.append(source)}else card.append(link('原网页',j.url));let deletion=deletionResults.get(j.id)||j.deletion_result;if(deletion){let status=document.createElement('p');status.className='delete-result';status.setAttribute('role','alert');status.style.color=deletion.status==='failed'?'#a52222':'#8b4520';renderDeletionResult(status,deletion);card.append(status)}if(j.error){let err=document.createElement('p');err.textContent=j.error;card.append(err)}if(j.cleanup_error){let note=document.createElement('p');note.textContent='Word 已生成，但部分临时文件未清理：'+j.cleanup_error;card.append(note)}if(j.has_document){let actions=document.createElement('p');actions.className='actions';actions.append(link('查看 Word 文稿','/preview/'+j.id,'action'));let reveal=document.createElement('button');reveal.type='button';reveal.className='secondary';reveal.textContent='打开文档所在位置';let revealStatus=document.createElement('small');revealStatus.setAttribute('role','status');reveal.onclick=async()=&gt;{reveal.disabled=true;revealStatus.textContent='正在打开文件夹…';try{await post('/reveal/'+j.id,{});revealStatus.textContent='已打开 Finder 文件夹。';msg.textContent='已打开文档所在的 Finder 文件夹。'}catch(e){revealStatus.textContent='打开失败：'+e.message;msg.textContent='打开失败：'+e.message}finally{reveal.disabled=false}};actions.append(reveal);actions.append(revealStatus);card.append(actions);let note=document.createElement('small');note.textContent=j.temporary_files_removed?(j.media_trashed?'原音视频已移入废纸篓，临时音轨已清理。':'原音视频与临时音轨已清理。'):'Word 内容未经人工校对。';card.append(note)}let controls=document.createElement('p');controls.className='actions';if(j.state==='youtube_verifying'){let resume=document.createElement('button');resume.className='retry-task';resume.textContent='已关闭验证弹窗，重新开始任务';resume.onclick=async()=&gt;{resume.disabled=true;try{let result=await post('/youtube/confirm/'+j.id,{});msg.textContent=result.message;await refresh()}catch(e){msg.textContent=e.message;resume.disabled=false}};controls.append(resume)}if(j.state==='failed'||j.state==='login_required'){let retry=document.createElement('button');retry.textContent='重试任务';retry.className='retry-task';retry.onclick=async()=&gt;{try{await post('/jobs',{url:j.url,engine:'qianwen'});await refresh()}catch(e){msg.textContent=e.message}};controls.append(retry)}let remove=document.createElement('button');remove.type='button';remove.className='secondary';remove.style.color='#a52222';remove.textContent='删除任务并同步到千问';if(deletion?.status==='pending'){remove.disabled=true;remove.textContent='正在同步删除…'}remove.onclick=async()=&gt;{if(!confirm('删除“'+(j.title||j.id)+'”？将停止该任务，把本机任务文件和相关文稿移入废纸篓。同时删除对应的千问云端记录，云端删除后无法恢复。'))return;deletionResults.set(j.id,{status:'pending',message:'正在删除并同步到千问，请稍候…'});msg.className='';msg.textContent='正在删除并同步到千问，请稍候…';remove.disabled=true;remove.textContent='正在同步删除…';try{let health=await(await fetch('/health')).json();if(!health.cloud_delete)throw Error('请先双击加载本次更新.command启用千问同步删除');await requireControls();let r=await post('/delete/'+j.id,{});if(r.deletion_result?.status==='pending'){deletionResults.set(j.id,r.deletion_result);msg.className='';renderDeletionResult(msg,r.deletion_result);await refresh();return}deletedTaskIds.add(j.id);++refreshSequence;document.querySelectorAll('article[data-task-id="'+j.id+'"]').forEach(node=&gt;node.remove());deletionResults.delete(j.id);showDeletionResult(r.deletion_result||{status:'success',message:r.message},true);await refresh()}catch(e){let message=e.deletionResult?.message||('删除失败\n工具任务列表记录：未删除成功\n本机文稿及任务文件：未确认删除成功\n对应的千问记录：未确认删除成功\n原因：'+e.message);let report=e.deletionResult||{status:'failed',message};deletionResults.set(j.id,report);showDeletionResult(report,false);let status=card.querySelector('.delete-result');if(!status){status=document.createElement('p');status.className='delete-result';status.setAttribute('role','alert');card.append(status)}status.style.color='#a52222';renderDeletionResult(status,report);remove.disabled=false;remove.textContent='删除任务并同步到千问'}};if(j.has_document){card.querySelector('.actions').append(remove)}else{controls.append(remove)}if(controls.children.length)card.append(controls);host.append(card)}await refreshLogin()}catch(e){msg.textContent='后台连接中断，请重新启动工具。'}}</w:t>
+        <w:t>async function refresh(){const sequence=++refreshSequence;try{await refreshDeletions();let jobs=await(await fetch('/jobs')).json();if(sequence!==refreshSequence)return;jobs=jobs.filter(j=&gt;!deletedTaskIds.has(j.id));jobs.sort((a,b)=&gt;a.task_number&amp;&amp;b.task_number?b.task_number-a.task_number:(b.created_at??historicalTaskTimes[b.id]??b.added_at??Infinity)-(a.created_at??historicalTaskTimes[a.id]??a.added_at??Infinity));let host=document.querySelector('#jobs');host.replaceChildren();for(let j of jobs){let card=document.createElement('article');card.dataset.taskId=j.id;let h=document.createElement('h2');h.textContent=taskHeading(j);card.append(h);let p=document.createElement('p');p.textContent=(j.document&amp;&amp;!j.has_document)?'Word 文件已不在原保存位置，重新提交链接可生成':(stages[j.state]||'状态暂未识别：'+String(j.state));card.append(p);if(j.source_kind==='local'){let source=document.createElement('p');source.textContent=j.source_label;card.append(source)}else card.append(link('原网页',j.url));let deletion=deletionResults.get(j.id)||j.deletion_result;if(deletion){let status=document.createElement('p');status.className='delete-result';status.setAttribute('role','alert');status.style.color=deletion.status==='failed'?'#a52222':'#8b4520';renderDeletionResult(status,deletion);card.append(status)}if(j.error){let err=document.createElement('p');err.textContent=j.error;card.append(err)}if(j.cloud_cleanup_state){let cloud=document.createElement('p');cloud.textContent=j.cloud_cleanup_state==='pending'?'Word 已保存，正在删除对应的千问记录…':j.cloud_cleanup_state==='completed'?'对应的千问记录已清理。':'Word 已保存；千问记录尚未清理：'+(j.cloud_cleanup_error||'请稍后在千问中检查');card.append(cloud)}if(j.cleanup_error){let note=document.createElement('p');note.textContent='Word 已生成，但部分临时文件未清理：'+j.cleanup_error;card.append(note)}if(j.has_document){let actions=document.createElement('p');actions.className='actions';actions.append(link('查看 Word 文稿','/preview/'+j.id,'action'));let reveal=document.createElement('button');reveal.type='button';reveal.className='secondary';reveal.textContent='打开文档所在位置';let revealStatus=document.createElement('small');revealStatus.setAttribute('role','status');reveal.onclick=async()=&gt;{reveal.disabled=true;revealStatus.textContent='正在打开文件夹…';try{await post('/reveal/'+j.id,{});revealStatus.textContent='已打开 Finder 文件夹。';msg.textContent='已打开文档所在的 Finder 文件夹。'}catch(e){revealStatus.textContent='打开失败：'+e.message;msg.textContent='打开失败：'+e.message}finally{reveal.disabled=false}};actions.append(reveal);actions.append(revealStatus);card.append(actions);let note=document.createElement('small');note.textContent=j.temporary_files_removed?(j.media_trashed?'原音视频已移入废纸篓，临时音轨已清理。':'原音视频与临时音轨已清理。'):'Word 内容未经人工校对。';card.append(note)}let controls=document.createElement('p');controls.className='actions';if(j.state==='youtube_verifying'){let resume=document.createElement('button');resume.className='retry-task';resume.textContent='已关闭验证弹窗，重新开始任务';resume.onclick=async()=&gt;{resume.disabled=true;try{let result=await post('/youtube/confirm/'+j.id,{});msg.textContent=result.message;await refresh()}catch(e){msg.textContent=e.message;resume.disabled=false}};controls.append(resume)}if(j.state==='failed'||j.state==='login_required'){let retry=document.createElement('button');retry.textContent='重试任务';retry.className='retry-task';retry.onclick=async()=&gt;{try{await post('/jobs',{url:j.url,engine:'qianwen'});await refresh()}catch(e){msg.textContent=e.message}};controls.append(retry)}let remove=document.createElement('button');remove.type='button';remove.className='secondary';remove.style.color='#a52222';remove.textContent='删除任务并同步到千问';if(deletion?.status==='pending'){remove.disabled=true;remove.textContent='正在同步删除…'}remove.onclick=async()=&gt;{if(!confirm('删除“'+(j.title||j.id)+'”？将停止该任务，把本机任务文件和相关文稿移入废纸篓。同时删除对应的千问云端记录，云端删除后无法恢复。'))return;deletionResults.set(j.id,{status:'pending',message:'正在删除并同步到千问，请稍候…'});msg.className='';msg.textContent='正在删除并同步到千问，请稍候…';remove.disabled=true;remove.textContent='正在同步删除…';try{let health=await(await fetch('/health')).json();if(!health.cloud_delete)throw Error('请先双击加载本次更新.command启用千问同步删除');await requireControls();let r=await post('/delete/'+j.id,{});if(r.deletion_result?.status==='pending'){deletionResults.set(j.id,r.deletion_result);msg.className='';renderDeletionResult(msg,r.deletion_result);await refresh();return}deletedTaskIds.add(j.id);++refreshSequence;document.querySelectorAll('article[data-task-id="'+j.id+'"]').forEach(node=&gt;node.remove());deletionResults.delete(j.id);showDeletionResult(r.deletion_result||{status:'success',message:r.message},true);await refresh()}catch(e){let message=e.deletionResult?.message||('删除失败\n工具任务列表记录：未删除成功\n本机文稿及任务文件：未确认删除成功\n对应的千问记录：未确认删除成功\n原因：'+e.message);let report=e.deletionResult||{status:'failed',message};deletionResults.set(j.id,report);showDeletionResult(report,false);let status=card.querySelector('.delete-result');if(!status){status=document.createElement('p');status.className='delete-result';status.setAttribute('role','alert');card.append(status)}status.style.color='#a52222';renderDeletionResult(status,report);remove.disabled=false;remove.textContent='删除任务并同步到千问'}};if(j.has_document){card.querySelector('.actions').append(remove)}else{controls.append(remove)}if(controls.children.length)card.append(controls);host.append(card)}await refreshLogin()}catch(e){msg.textContent='后台连接中断，请重新启动工具。'}}</w:t>
       </w:r>
     </w:p>
     <w:p>
@@ -10848,7 +10854,154 @@
     </w:p>
     <w:p>
       <w:r>
+        <w:t xml:space="preserve">    cleanup_cloud_after_export(job,meta)</w:t>
+      </w:r>
+    </w:p>
+    <w:p>
+      <w:r>
         <w:t xml:space="preserve">    return path</w:t>
+      </w:r>
+    </w:p>
+    <w:p/>
+    <w:p/>
+    <w:p>
+      <w:r>
+        <w:t>def cleanup_cloud_after_export(job, meta):</w:t>
+      </w:r>
+    </w:p>
+    <w:p>
+      <w:r>
+        <w:t xml:space="preserve">    """Remove only this task's cloud record after verifying its final local Word."""</w:t>
+      </w:r>
+    </w:p>
+    <w:p>
+      <w:r>
+        <w:t xml:space="preserve">    if meta.get('qianwen_delete_resolved') or not any(meta.get(k) for k in</w:t>
+      </w:r>
+    </w:p>
+    <w:p>
+      <w:r>
+        <w:t xml:space="preserve">            ('qianwen_submitted','qianwen_submission_attempted','qianwen_url','qianwen_upload_confirmed')):</w:t>
+      </w:r>
+    </w:p>
+    <w:p>
+      <w:r>
+        <w:t xml:space="preserve">        return</w:t>
+      </w:r>
+    </w:p>
+    <w:p>
+      <w:r>
+        <w:t xml:space="preserve">    meta['cloud_cleanup_state']='pending'</w:t>
+      </w:r>
+    </w:p>
+    <w:p>
+      <w:r>
+        <w:t xml:space="preserve">    save_json(job/'job.json',meta)</w:t>
+      </w:r>
+    </w:p>
+    <w:p>
+      <w:r>
+        <w:t xml:space="preserve">    try:</w:t>
+      </w:r>
+    </w:p>
+    <w:p>
+      <w:r>
+        <w:t xml:space="preserve">        path=Path(meta['document'])</w:t>
+      </w:r>
+    </w:p>
+    <w:p>
+      <w:r>
+        <w:t xml:space="preserve">        if path.parent.resolve()!=OUTPUT.resolve() or not path.is_file():</w:t>
+      </w:r>
+    </w:p>
+    <w:p>
+      <w:r>
+        <w:t xml:space="preserve">            raise ValueError('目标文件夹中尚未确认保存 Word，未删除千问记录')</w:t>
+      </w:r>
+    </w:p>
+    <w:p>
+      <w:r>
+        <w:t xml:space="preserve">        report=json.loads((job/'validation.json').read_text())</w:t>
+      </w:r>
+    </w:p>
+    <w:p>
+      <w:r>
+        <w:t xml:space="preserve">        if hashlib.sha256(path.read_bytes()).hexdigest()!=report['document_sha256']:</w:t>
+      </w:r>
+    </w:p>
+    <w:p>
+      <w:r>
+        <w:t xml:space="preserve">            raise ValueError('Word 校验不一致，未删除千问记录')</w:t>
+      </w:r>
+    </w:p>
+    <w:p>
+      <w:r>
+        <w:t xml:space="preserve">        raw=json.loads((job/'raw-transcript.json').read_text())</w:t>
+      </w:r>
+    </w:p>
+    <w:p>
+      <w:r>
+        <w:t xml:space="preserve">        verify_document(path,meta,make_blocks(raw['segments']))</w:t>
+      </w:r>
+    </w:p>
+    <w:p>
+      <w:r>
+        <w:t xml:space="preserve">        from qianwen_browser import delete_cloud</w:t>
+      </w:r>
+    </w:p>
+    <w:p>
+      <w:r>
+        <w:t xml:space="preserve">        delete_cloud(job)</w:t>
+      </w:r>
+    </w:p>
+    <w:p>
+      <w:r>
+        <w:t xml:space="preserve">        fresh=json.loads((job/'job.json').read_text())</w:t>
+      </w:r>
+    </w:p>
+    <w:p>
+      <w:r>
+        <w:t xml:space="preserve">        meta.update(fresh)</w:t>
+      </w:r>
+    </w:p>
+    <w:p>
+      <w:r>
+        <w:t xml:space="preserve">        if not meta.get('qianwen_delete_resolved'):</w:t>
+      </w:r>
+    </w:p>
+    <w:p>
+      <w:r>
+        <w:t xml:space="preserve">            raise RuntimeError('尚未确认千问记录删除成功')</w:t>
+      </w:r>
+    </w:p>
+    <w:p>
+      <w:r>
+        <w:t xml:space="preserve">        meta['cloud_cleanup_state']='completed'</w:t>
+      </w:r>
+    </w:p>
+    <w:p>
+      <w:r>
+        <w:t xml:space="preserve">        meta.pop('cloud_cleanup_error',None)</w:t>
+      </w:r>
+    </w:p>
+    <w:p>
+      <w:r>
+        <w:t xml:space="preserve">    except Exception as error:</w:t>
+      </w:r>
+    </w:p>
+    <w:p>
+      <w:r>
+        <w:t xml:space="preserve">        meta['cloud_cleanup_state']='failed'</w:t>
+      </w:r>
+    </w:p>
+    <w:p>
+      <w:r>
+        <w:t xml:space="preserve">        meta['cloud_cleanup_error']=str(error)</w:t>
+      </w:r>
+    </w:p>
+    <w:p>
+      <w:r>
+        <w:t xml:space="preserve">    save_json(job/'job.json',meta)</w:t>
       </w:r>
     </w:p>
     <w:p/>
@@ -16496,6 +16649,170 @@
         <w:t xml:space="preserve">        self.assertEqual(reader.download_url(source),source)</w:t>
       </w:r>
     </w:p>
+    <w:p/>
+    <w:p>
+      <w:r>
+        <w:t>class CloudCleanupTests(PipelineTests):</w:t>
+      </w:r>
+    </w:p>
+    <w:p>
+      <w:r>
+        <w:t xml:space="preserve">    def exported(self):</w:t>
+      </w:r>
+    </w:p>
+    <w:p>
+      <w:r>
+        <w:t xml:space="preserve">        job,meta,audio=self.fixture()</w:t>
+      </w:r>
+    </w:p>
+    <w:p>
+      <w:r>
+        <w:t xml:space="preserve">        meta['qianwen_url']='https://www.qianwen.com/test'</w:t>
+      </w:r>
+    </w:p>
+    <w:p>
+      <w:r>
+        <w:t xml:space="preserve">        reader.save_json(job/'job.json',meta)</w:t>
+      </w:r>
+    </w:p>
+    <w:p>
+      <w:r>
+        <w:t xml:space="preserve">        raw={'segments':[{'start':0,'end':1,'speaker':'发言人 1','text':'完整文字'}]}</w:t>
+      </w:r>
+    </w:p>
+    <w:p>
+      <w:r>
+        <w:t xml:space="preserve">        reader.save_json(job/'raw-transcript.json',raw)</w:t>
+      </w:r>
+    </w:p>
+    <w:p>
+      <w:r>
+        <w:t xml:space="preserve">        return job,meta,raw</w:t>
+      </w:r>
+    </w:p>
+    <w:p/>
+    <w:p>
+      <w:r>
+        <w:t xml:space="preserve">    def test_delete_only_after_word_is_saved_and_validated(self):</w:t>
+      </w:r>
+    </w:p>
+    <w:p>
+      <w:r>
+        <w:t xml:space="preserve">        job,meta,raw=self.exported()</w:t>
+      </w:r>
+    </w:p>
+    <w:p>
+      <w:r>
+        <w:t xml:space="preserve">        def deleted(folder):</w:t>
+      </w:r>
+    </w:p>
+    <w:p>
+      <w:r>
+        <w:t xml:space="preserve">            saved=json.loads((folder/'job.json').read_text())</w:t>
+      </w:r>
+    </w:p>
+    <w:p>
+      <w:r>
+        <w:t xml:space="preserve">            self.assertTrue(Path(saved['document']).is_file())</w:t>
+      </w:r>
+    </w:p>
+    <w:p>
+      <w:r>
+        <w:t xml:space="preserve">            self.assertTrue((folder/'validation.json').is_file())</w:t>
+      </w:r>
+    </w:p>
+    <w:p>
+      <w:r>
+        <w:t xml:space="preserve">            saved.update(qianwen_cloud_deleted=True,qianwen_delete_resolved=True)</w:t>
+      </w:r>
+    </w:p>
+    <w:p>
+      <w:r>
+        <w:t xml:space="preserve">            reader.save_json(folder/'job.json',saved)</w:t>
+      </w:r>
+    </w:p>
+    <w:p>
+      <w:r>
+        <w:t xml:space="preserve">        with patch('qianwen_browser.delete_cloud',side_effect=deleted) as delete:</w:t>
+      </w:r>
+    </w:p>
+    <w:p>
+      <w:r>
+        <w:t xml:space="preserve">            path=reader.build_document(job,raw)</w:t>
+      </w:r>
+    </w:p>
+    <w:p>
+      <w:r>
+        <w:t xml:space="preserve">        delete.assert_called_once_with(job.resolve())</w:t>
+      </w:r>
+    </w:p>
+    <w:p>
+      <w:r>
+        <w:t xml:space="preserve">        saved=json.loads((job/'job.json').read_text())</w:t>
+      </w:r>
+    </w:p>
+    <w:p>
+      <w:r>
+        <w:t xml:space="preserve">        self.assertEqual(saved['cloud_cleanup_state'],'completed');self.assertTrue(path.exists())</w:t>
+      </w:r>
+    </w:p>
+    <w:p/>
+    <w:p>
+      <w:r>
+        <w:t xml:space="preserve">    def test_cloud_failure_keeps_completed_word(self):</w:t>
+      </w:r>
+    </w:p>
+    <w:p>
+      <w:r>
+        <w:t xml:space="preserve">        job,meta,raw=self.exported()</w:t>
+      </w:r>
+    </w:p>
+    <w:p>
+      <w:r>
+        <w:t xml:space="preserve">        with patch('qianwen_browser.delete_cloud',side_effect=RuntimeError('登录失效')):</w:t>
+      </w:r>
+    </w:p>
+    <w:p>
+      <w:r>
+        <w:t xml:space="preserve">            path=reader.build_document(job,raw)</w:t>
+      </w:r>
+    </w:p>
+    <w:p>
+      <w:r>
+        <w:t xml:space="preserve">        saved=json.loads((job/'job.json').read_text())</w:t>
+      </w:r>
+    </w:p>
+    <w:p>
+      <w:r>
+        <w:t xml:space="preserve">        self.assertEqual(saved['state'],'completed');self.assertEqual(saved['cloud_cleanup_state'],'failed');self.assertTrue(path.exists())</w:t>
+      </w:r>
+    </w:p>
+    <w:p/>
+    <w:p>
+      <w:r>
+        <w:t xml:space="preserve">    def test_invalid_word_never_deletes_cloud(self):</w:t>
+      </w:r>
+    </w:p>
+    <w:p>
+      <w:r>
+        <w:t xml:space="preserve">        job,meta,raw=self.exported()</w:t>
+      </w:r>
+    </w:p>
+    <w:p>
+      <w:r>
+        <w:t xml:space="preserve">        with patch.object(reader,'verify_document',side_effect=ValueError('损坏')),patch('qianwen_browser.delete_cloud') as delete:</w:t>
+      </w:r>
+    </w:p>
+    <w:p>
+      <w:r>
+        <w:t xml:space="preserve">            with self.assertRaises(ValueError):reader.build_document(job,raw)</w:t>
+      </w:r>
+    </w:p>
+    <w:p>
+      <w:r>
+        <w:t xml:space="preserve">        delete.assert_not_called()</w:t>
+      </w:r>
+    </w:p>
     <w:p>
       <w:r>
         <w:t>```</w:t>
@@ -19169,7 +19486,7 @@
     </w:p>
     <w:p>
       <w:r>
-        <w:t xml:space="preserve">  "index.html": "0bd751e2d42cb943cc7537bfd66568c126cefee63f1dd967884fd16b1bda5c6e",</w:t>
+        <w:t xml:space="preserve">  "index.html": "fd994ed9dabd4749fcd40bbf7f89b0aa6d4086cfb2f42405647f44bb9d6b8246",</w:t>
       </w:r>
     </w:p>
     <w:p>
@@ -19204,7 +19521,7 @@
     </w:p>
     <w:p>
       <w:r>
-        <w:t xml:space="preserve">  "reader.py": "18cbdb7df94172e178e64f2ab0e5c8bfaaafcbd0565e41af6f559d1c17c04c6a",</w:t>
+        <w:t xml:space="preserve">  "reader.py": "e16d336fb71b6b727f66e7e9a9f02113fc68adb0670f4a94fb87457e5d878aed",</w:t>
       </w:r>
     </w:p>
     <w:p>
@@ -19284,7 +19601,7 @@
     </w:p>
     <w:p>
       <w:r>
-        <w:t xml:space="preserve">  "test_reader.py": "0320926db03be6d0726c88092cdd5cb7d88b3cc7fcfb9d341bc3e0cf740a6b02",</w:t>
+        <w:t xml:space="preserve">  "test_reader.py": "4289023d7dca27570089bd22a6b7890494bcd78d6a2f4976d2ed1a4bf8333dc7",</w:t>
       </w:r>
     </w:p>
     <w:p>

</xml_diff>

<commit_message>
Rename task deletion button to 删除任务记录
</commit_message>
<xml_diff>
--- a/安装与使用指南.docx
+++ b/安装与使用指南.docx
@@ -4768,7 +4768,7 @@
     </w:p>
     <w:p>
       <w:r>
-        <w:t>async function refresh(){const sequence=++refreshSequence;try{await refreshDeletions();let jobs=await(await fetch('/jobs')).json();if(sequence!==refreshSequence)return;jobs=jobs.filter(j=&gt;!deletedTaskIds.has(j.id));jobs.sort((a,b)=&gt;a.task_number&amp;&amp;b.task_number?b.task_number-a.task_number:(b.created_at??historicalTaskTimes[b.id]??b.added_at??Infinity)-(a.created_at??historicalTaskTimes[a.id]??a.added_at??Infinity));let host=document.querySelector('#jobs');host.replaceChildren();for(let j of jobs){let card=document.createElement('article');card.dataset.taskId=j.id;let h=document.createElement('h2');h.textContent=taskHeading(j);card.append(h);let p=document.createElement('p');p.textContent=(j.document&amp;&amp;!j.has_document)?'Word 文件已不在原保存位置，重新提交链接可生成':(stages[j.state]||'状态暂未识别：'+String(j.state));card.append(p);if(j.source_kind==='local'){let source=document.createElement('p');source.textContent=j.source_label;card.append(source)}else card.append(link('原网页',j.url));let deletion=deletionResults.get(j.id)||j.deletion_result;if(deletion){let status=document.createElement('p');status.className='delete-result';status.setAttribute('role','alert');status.style.color=deletion.status==='failed'?'#a52222':'#8b4520';renderDeletionResult(status,deletion);card.append(status)}if(j.error){let err=document.createElement('p');err.textContent=j.error;card.append(err)}if(j.cloud_cleanup_state){let cloud=document.createElement('p');cloud.textContent=j.cloud_cleanup_state==='pending'?'Word 已保存，正在删除对应的千问记录…':j.cloud_cleanup_state==='completed'?'对应的千问记录已清理。':'Word 已保存；千问记录尚未清理：'+(j.cloud_cleanup_error||'请稍后在千问中检查');card.append(cloud)}if(j.cleanup_error){let note=document.createElement('p');note.textContent='Word 已生成，但部分临时文件未清理：'+j.cleanup_error;card.append(note)}if(j.has_document){let actions=document.createElement('p');actions.className='actions';actions.append(link('查看 Word 文稿','/preview/'+j.id,'action'));let reveal=document.createElement('button');reveal.type='button';reveal.className='secondary';reveal.textContent='打开文档所在位置';let revealStatus=document.createElement('small');revealStatus.setAttribute('role','status');reveal.onclick=async()=&gt;{reveal.disabled=true;revealStatus.textContent='正在打开文件夹…';try{await post('/reveal/'+j.id,{});revealStatus.textContent='已打开 Finder 文件夹。';msg.textContent='已打开文档所在的 Finder 文件夹。'}catch(e){revealStatus.textContent='打开失败：'+e.message;msg.textContent='打开失败：'+e.message}finally{reveal.disabled=false}};actions.append(reveal);actions.append(revealStatus);card.append(actions);let note=document.createElement('small');note.textContent=j.temporary_files_removed?(j.media_trashed?'原音视频已移入废纸篓，临时音轨已清理。':'原音视频与临时音轨已清理。'):'Word 内容未经人工校对。';card.append(note)}let controls=document.createElement('p');controls.className='actions';if(j.state==='youtube_verifying'){let resume=document.createElement('button');resume.className='retry-task';resume.textContent='已关闭验证弹窗，重新开始任务';resume.onclick=async()=&gt;{resume.disabled=true;try{let result=await post('/youtube/confirm/'+j.id,{});msg.textContent=result.message;await refresh()}catch(e){msg.textContent=e.message;resume.disabled=false}};controls.append(resume)}if(j.state==='failed'||j.state==='login_required'){let retry=document.createElement('button');retry.textContent='重试任务';retry.className='retry-task';retry.onclick=async()=&gt;{try{await post('/jobs',{url:j.url,engine:'qianwen'});await refresh()}catch(e){msg.textContent=e.message}};controls.append(retry)}let remove=document.createElement('button');remove.type='button';remove.className='secondary';remove.style.color='#a52222';remove.textContent='删除任务并同步到千问';if(deletion?.status==='pending'){remove.disabled=true;remove.textContent='正在同步删除…'}remove.onclick=async()=&gt;{if(!confirm('删除“'+(j.title||j.id)+'”？将停止该任务，把本机任务文件和相关文稿移入废纸篓。同时删除对应的千问云端记录，云端删除后无法恢复。'))return;deletionResults.set(j.id,{status:'pending',message:'正在删除并同步到千问，请稍候…'});msg.className='';msg.textContent='正在删除并同步到千问，请稍候…';remove.disabled=true;remove.textContent='正在同步删除…';try{let health=await(await fetch('/health')).json();if(!health.cloud_delete)throw Error('请先双击加载本次更新.command启用千问同步删除');await requireControls();let r=await post('/delete/'+j.id,{});if(r.deletion_result?.status==='pending'){deletionResults.set(j.id,r.deletion_result);msg.className='';renderDeletionResult(msg,r.deletion_result);await refresh();return}deletedTaskIds.add(j.id);++refreshSequence;document.querySelectorAll('article[data-task-id="'+j.id+'"]').forEach(node=&gt;node.remove());deletionResults.delete(j.id);showDeletionResult(r.deletion_result||{status:'success',message:r.message},true);await refresh()}catch(e){let message=e.deletionResult?.message||('删除失败\n工具任务列表记录：未删除成功\n本机文稿及任务文件：未确认删除成功\n对应的千问记录：未确认删除成功\n原因：'+e.message);let report=e.deletionResult||{status:'failed',message};deletionResults.set(j.id,report);showDeletionResult(report,false);let status=card.querySelector('.delete-result');if(!status){status=document.createElement('p');status.className='delete-result';status.setAttribute('role','alert');card.append(status)}status.style.color='#a52222';renderDeletionResult(status,report);remove.disabled=false;remove.textContent='删除任务并同步到千问'}};if(j.has_document){card.querySelector('.actions').append(remove)}else{controls.append(remove)}if(controls.children.length)card.append(controls);host.append(card)}await refreshLogin()}catch(e){msg.textContent='后台连接中断，请重新启动工具。'}}</w:t>
+        <w:t>async function refresh(){const sequence=++refreshSequence;try{await refreshDeletions();let jobs=await(await fetch('/jobs')).json();if(sequence!==refreshSequence)return;jobs=jobs.filter(j=&gt;!deletedTaskIds.has(j.id));jobs.sort((a,b)=&gt;a.task_number&amp;&amp;b.task_number?b.task_number-a.task_number:(b.created_at??historicalTaskTimes[b.id]??b.added_at??Infinity)-(a.created_at??historicalTaskTimes[a.id]??a.added_at??Infinity));let host=document.querySelector('#jobs');host.replaceChildren();for(let j of jobs){let card=document.createElement('article');card.dataset.taskId=j.id;let h=document.createElement('h2');h.textContent=taskHeading(j);card.append(h);let p=document.createElement('p');p.textContent=(j.document&amp;&amp;!j.has_document)?'Word 文件已不在原保存位置，重新提交链接可生成':(stages[j.state]||'状态暂未识别：'+String(j.state));card.append(p);if(j.source_kind==='local'){let source=document.createElement('p');source.textContent=j.source_label;card.append(source)}else card.append(link('原网页',j.url));let deletion=deletionResults.get(j.id)||j.deletion_result;if(deletion){let status=document.createElement('p');status.className='delete-result';status.setAttribute('role','alert');status.style.color=deletion.status==='failed'?'#a52222':'#8b4520';renderDeletionResult(status,deletion);card.append(status)}if(j.error){let err=document.createElement('p');err.textContent=j.error;card.append(err)}if(j.cloud_cleanup_state){let cloud=document.createElement('p');cloud.textContent=j.cloud_cleanup_state==='pending'?'Word 已保存，正在删除对应的千问记录…':j.cloud_cleanup_state==='completed'?'对应的千问记录已清理。':'Word 已保存；千问记录尚未清理：'+(j.cloud_cleanup_error||'请稍后在千问中检查');card.append(cloud)}if(j.cleanup_error){let note=document.createElement('p');note.textContent='Word 已生成，但部分临时文件未清理：'+j.cleanup_error;card.append(note)}if(j.has_document){let actions=document.createElement('p');actions.className='actions';actions.append(link('查看 Word 文稿','/preview/'+j.id,'action'));let reveal=document.createElement('button');reveal.type='button';reveal.className='secondary';reveal.textContent='打开文档所在位置';let revealStatus=document.createElement('small');revealStatus.setAttribute('role','status');reveal.onclick=async()=&gt;{reveal.disabled=true;revealStatus.textContent='正在打开文件夹…';try{await post('/reveal/'+j.id,{});revealStatus.textContent='已打开 Finder 文件夹。';msg.textContent='已打开文档所在的 Finder 文件夹。'}catch(e){revealStatus.textContent='打开失败：'+e.message;msg.textContent='打开失败：'+e.message}finally{reveal.disabled=false}};actions.append(reveal);actions.append(revealStatus);card.append(actions);let note=document.createElement('small');note.textContent=j.temporary_files_removed?(j.media_trashed?'原音视频已移入废纸篓，临时音轨已清理。':'原音视频与临时音轨已清理。'):'Word 内容未经人工校对。';card.append(note)}let controls=document.createElement('p');controls.className='actions';if(j.state==='youtube_verifying'){let resume=document.createElement('button');resume.className='retry-task';resume.textContent='已关闭验证弹窗，重新开始任务';resume.onclick=async()=&gt;{resume.disabled=true;try{let result=await post('/youtube/confirm/'+j.id,{});msg.textContent=result.message;await refresh()}catch(e){msg.textContent=e.message;resume.disabled=false}};controls.append(resume)}if(j.state==='failed'||j.state==='login_required'){let retry=document.createElement('button');retry.textContent='重试任务';retry.className='retry-task';retry.onclick=async()=&gt;{try{await post('/jobs',{url:j.url,engine:'qianwen'});await refresh()}catch(e){msg.textContent=e.message}};controls.append(retry)}let remove=document.createElement('button');remove.type='button';remove.className='secondary';remove.style.color='#a52222';remove.textContent='删除任务记录';if(deletion?.status==='pending'){remove.disabled=true;remove.textContent='正在同步删除…'}remove.onclick=async()=&gt;{if(!confirm('删除“'+(j.title||j.id)+'”？将停止该任务，把本机任务文件和相关文稿移入废纸篓。同时删除对应的千问云端记录，云端删除后无法恢复。'))return;deletionResults.set(j.id,{status:'pending',message:'正在删除并同步到千问，请稍候…'});msg.className='';msg.textContent='正在删除并同步到千问，请稍候…';remove.disabled=true;remove.textContent='正在同步删除…';try{let health=await(await fetch('/health')).json();if(!health.cloud_delete)throw Error('请先双击加载本次更新.command启用千问同步删除');await requireControls();let r=await post('/delete/'+j.id,{});if(r.deletion_result?.status==='pending'){deletionResults.set(j.id,r.deletion_result);msg.className='';renderDeletionResult(msg,r.deletion_result);await refresh();return}deletedTaskIds.add(j.id);++refreshSequence;document.querySelectorAll('article[data-task-id="'+j.id+'"]').forEach(node=&gt;node.remove());deletionResults.delete(j.id);showDeletionResult(r.deletion_result||{status:'success',message:r.message},true);await refresh()}catch(e){let message=e.deletionResult?.message||('删除失败\n工具任务列表记录：未删除成功\n本机文稿及任务文件：未确认删除成功\n对应的千问记录：未确认删除成功\n原因：'+e.message);let report=e.deletionResult||{status:'failed',message};deletionResults.set(j.id,report);showDeletionResult(report,false);let status=card.querySelector('.delete-result');if(!status){status=document.createElement('p');status.className='delete-result';status.setAttribute('role','alert');card.append(status)}status.style.color='#a52222';renderDeletionResult(status,report);remove.disabled=false;remove.textContent='删除任务记录'}};if(j.has_document){card.querySelector('.actions').append(remove)}else{controls.append(remove)}if(controls.children.length)card.append(controls);host.append(card)}await refreshLogin()}catch(e){msg.textContent='后台连接中断，请重新启动工具。'}}</w:t>
       </w:r>
     </w:p>
     <w:p>
@@ -19486,7 +19486,7 @@
     </w:p>
     <w:p>
       <w:r>
-        <w:t xml:space="preserve">  "index.html": "fd994ed9dabd4749fcd40bbf7f89b0aa6d4086cfb2f42405647f44bb9d6b8246",</w:t>
+        <w:t xml:space="preserve">  "index.html": "c416a89eacc6f1c780b3e20f8886703459d614f5d1f1a96769a9074c60d12d79",</w:t>
       </w:r>
     </w:p>
     <w:p>

</xml_diff>

<commit_message>
Use brighter success green for Word preview buttons
</commit_message>
<xml_diff>
--- a/安装与使用指南.docx
+++ b/安装与使用指南.docx
@@ -4567,7 +4567,7 @@
     </w:p>
     <w:p>
       <w:r>
-        <w:t>#url::placeholder{color:#757575;opacity:1}#upload-zone{background:#fff;color:#757575;font:inherit;text-align:center;border:1px dashed #c6d1ca;border-radius:8px;padding:12px 14px;cursor:pointer;flex-basis:100%;box-sizing:border-box}#file-name{display:block;font-size:14px;color:#000}#form input[type=url]{order:0}#form button{order:1}#upload-zone{order:2}#qianwen-login{background:#004B93;border-color:#004B93}#qianwen-login:hover{background:#003B75}#form button{background:#D65A00;border-color:#D65A00}#form button:hover{background:#B94D00}.retry-task{background:#FFD54F;border-color:#FFD54F;color:#24322d}.retry-task:hover{background:#FFC928;border-color:#FFC928}#runtime-show{background:#169bb4;border-color:#169bb4}#runtime-show:hover{background:#127e93}#runtime-dialog{width:min(850px,90vw);max-height:85vh;border:1px solid #c6d1ca;border-radius:12px;overflow:auto}#runtime-dialog img{max-width:100%;border:1px solid #ddd}#runtime-dialog::backdrop{background:#0005}.tool-logo{width:122px;height:122px;object-fit:contain;flex:none;margin-right:16px;transform:translate(-6.67px,-3px);transform-origin:top left}h1{display:flex;align-items:flex-start;line-height:1;margin-bottom:16px}.tool-title{color:#287FB8;font-size:58px;line-height:1;font-weight:inherit;min-width:0}.tool-title-main,.tool-title-support{display:block}.tool-title-support{font-size:39px;margin-top:8px;margin-left:-.58em}@media(max-width:800px){.tool-title{font-size:clamp(20px,5.5vw,58px)}.tool-title-support{font-size:.6724em;margin-top:.1333em}.tool-logo{width:2.1034em;height:2.1034em}h1{font-size:clamp(20px,5.5vw,58px)}}.title-actions{display:flex;gap:10px;flex-wrap:wrap;margin-bottom:24px}.title-actions button{font-size:14px;padding:6px 10px;font-weight:normal}article{margin-right:24px}article h2{line-height:1.3;margin-top:10px;margin-bottom:8px}article&gt;p:not(.actions){line-height:1.35;margin-top:8px;margin-bottom:8px}@media(max-width:600px){article{margin-right:0}}&lt;/style&gt;</w:t>
+        <w:t>#url::placeholder{color:#757575;opacity:1}#upload-zone{background:#fff;color:#757575;font:inherit;text-align:center;border:1px dashed #c6d1ca;border-radius:8px;padding:12px 14px;cursor:pointer;flex-basis:100%;box-sizing:border-box}#file-name{display:block;font-size:14px;color:#000}#form input[type=url]{order:0}#form button{order:1}#upload-zone{order:2}#qianwen-login{background:#004B93;border-color:#004B93}#qianwen-login:hover{background:#003B75}#form button{background:#D65A00;border-color:#D65A00}#form button:hover{background:#B94D00}.retry-task{background:#FFD54F;border-color:#FFD54F;color:#24322d}.retry-task:hover{background:#FFC928;border-color:#FFC928}#runtime-show{background:#169bb4;border-color:#169bb4}#runtime-show:hover{background:#127e93}#runtime-dialog{width:min(850px,90vw);max-height:85vh;border:1px solid #c6d1ca;border-radius:12px;overflow:auto}#runtime-dialog img{max-width:100%;border:1px solid #ddd}#runtime-dialog::backdrop{background:#0005}.tool-logo{width:122px;height:122px;object-fit:contain;flex:none;margin-right:16px;transform:translate(-6.67px,-3px);transform-origin:top left}h1{display:flex;align-items:flex-start;line-height:1;margin-bottom:16px}.tool-title{color:#287FB8;font-size:58px;line-height:1;font-weight:inherit;min-width:0}.tool-title-main,.tool-title-support{display:block}.tool-title-support{font-size:39px;margin-top:8px;margin-left:-.58em}@media(max-width:800px){.tool-title{font-size:clamp(20px,5.5vw,58px)}.tool-title-support{font-size:.6724em;margin-top:.1333em}.tool-logo{width:2.1034em;height:2.1034em}h1{font-size:clamp(20px,5.5vw,58px)}}.title-actions{display:flex;gap:10px;flex-wrap:wrap;margin-bottom:24px}.title-actions button{font-size:14px;padding:6px 10px;font-weight:normal}article{margin-right:24px}article h2{line-height:1.3;margin-top:10px;margin-bottom:8px}article&gt;p:not(.actions){line-height:1.35;margin-top:8px;margin-bottom:8px}@media(max-width:600px){article{margin-right:0}}article .action{background:#16A34A;border-color:#16A34A;color:#fff}article .action:hover{background:#15803D;border-color:#15803D}&lt;/style&gt;</w:t>
       </w:r>
     </w:p>
     <w:p>
@@ -19486,7 +19486,7 @@
     </w:p>
     <w:p>
       <w:r>
-        <w:t xml:space="preserve">  "index.html": "c416a89eacc6f1c780b3e20f8886703459d614f5d1f1a96769a9074c60d12d79",</w:t>
+        <w:t xml:space="preserve">  "index.html": "40615aede8fdd8a5b942103e57f57a7705c6c1bb3bd7592182eac2129436574e",</w:t>
       </w:r>
     </w:p>
     <w:p>

</xml_diff>

<commit_message>
Detect failed Qianwen tasks and restart with retained audio
</commit_message>
<xml_diff>
--- a/安装与使用指南.docx
+++ b/安装与使用指南.docx
@@ -725,6 +725,12 @@
     </w:p>
     <w:p/>
     <w:p>
+      <w:r>
+        <w:t>千问轮询会检查当前任务精确匹配记录的“任务失败”状态，确认失败后停止等待，并显示黄色“重新开始任务”按钮。重启会先清理对应失败云端记录，再使用保留的本机音频重新提交，保留原任务序号。检查发生在每轮等待中，页面网络延迟可能影响同步速度。</w:t>
+      </w:r>
+    </w:p>
+    <w:p/>
+    <w:p>
       <w:pPr>
         <w:pStyle w:val="Heading1"/>
       </w:pPr>
@@ -4768,7 +4774,7 @@
     </w:p>
     <w:p>
       <w:r>
-        <w:t>async function refresh(){const sequence=++refreshSequence;try{await refreshDeletions();let jobs=await(await fetch('/jobs')).json();if(sequence!==refreshSequence)return;jobs=jobs.filter(j=&gt;!deletedTaskIds.has(j.id));jobs.sort((a,b)=&gt;a.task_number&amp;&amp;b.task_number?b.task_number-a.task_number:(b.created_at??historicalTaskTimes[b.id]??b.added_at??Infinity)-(a.created_at??historicalTaskTimes[a.id]??a.added_at??Infinity));let host=document.querySelector('#jobs');host.replaceChildren();for(let j of jobs){let card=document.createElement('article');card.dataset.taskId=j.id;let h=document.createElement('h2');h.textContent=taskHeading(j);card.append(h);let p=document.createElement('p');p.textContent=(j.document&amp;&amp;!j.has_document)?'Word 文件已不在原保存位置，重新提交链接可生成':(stages[j.state]||'状态暂未识别：'+String(j.state));card.append(p);if(j.source_kind==='local'){let source=document.createElement('p');source.textContent=j.source_label;card.append(source)}else card.append(link('原网页',j.url));let deletion=deletionResults.get(j.id)||j.deletion_result;if(deletion){let status=document.createElement('p');status.className='delete-result';status.setAttribute('role','alert');status.style.color=deletion.status==='failed'?'#a52222':'#8b4520';renderDeletionResult(status,deletion);card.append(status)}if(j.error){let err=document.createElement('p');err.textContent=j.error;card.append(err)}if(j.cloud_cleanup_state){let cloud=document.createElement('p');cloud.textContent=j.cloud_cleanup_state==='pending'?'Word 已保存，正在删除对应的千问记录…':j.cloud_cleanup_state==='completed'?'对应的千问记录已清理。':'Word 已保存；千问记录尚未清理：'+(j.cloud_cleanup_error||'请稍后在千问中检查');card.append(cloud)}if(j.cleanup_error){let note=document.createElement('p');note.textContent='Word 已生成，但部分临时文件未清理：'+j.cleanup_error;card.append(note)}if(j.has_document){let actions=document.createElement('p');actions.className='actions';actions.append(link('查看 Word 文稿','/preview/'+j.id,'action'));let reveal=document.createElement('button');reveal.type='button';reveal.className='secondary';reveal.textContent='打开文档所在位置';let revealStatus=document.createElement('small');revealStatus.setAttribute('role','status');reveal.onclick=async()=&gt;{reveal.disabled=true;revealStatus.textContent='正在打开文件夹…';try{await post('/reveal/'+j.id,{});revealStatus.textContent='已打开 Finder 文件夹。';msg.textContent='已打开文档所在的 Finder 文件夹。'}catch(e){revealStatus.textContent='打开失败：'+e.message;msg.textContent='打开失败：'+e.message}finally{reveal.disabled=false}};actions.append(reveal);actions.append(revealStatus);card.append(actions);let note=document.createElement('small');note.textContent=j.temporary_files_removed?(j.media_trashed?'原音视频已移入废纸篓，临时音轨已清理。':'原音视频与临时音轨已清理。'):'Word 内容未经人工校对。';card.append(note)}let controls=document.createElement('p');controls.className='actions';if(j.state==='youtube_verifying'){let resume=document.createElement('button');resume.className='retry-task';resume.textContent='已关闭验证弹窗，重新开始任务';resume.onclick=async()=&gt;{resume.disabled=true;try{let result=await post('/youtube/confirm/'+j.id,{});msg.textContent=result.message;await refresh()}catch(e){msg.textContent=e.message;resume.disabled=false}};controls.append(resume)}if(j.state==='failed'||j.state==='login_required'){let retry=document.createElement('button');retry.textContent='重试任务';retry.className='retry-task';retry.onclick=async()=&gt;{try{await post('/jobs',{url:j.url,engine:'qianwen'});await refresh()}catch(e){msg.textContent=e.message}};controls.append(retry)}let remove=document.createElement('button');remove.type='button';remove.className='secondary';remove.style.color='#a52222';remove.textContent='删除任务记录';if(deletion?.status==='pending'){remove.disabled=true;remove.textContent='正在同步删除…'}remove.onclick=async()=&gt;{if(!confirm('删除“'+(j.title||j.id)+'”？将停止该任务，把本机任务文件和相关文稿移入废纸篓。同时删除对应的千问云端记录，云端删除后无法恢复。'))return;deletionResults.set(j.id,{status:'pending',message:'正在删除并同步到千问，请稍候…'});msg.className='';msg.textContent='正在删除并同步到千问，请稍候…';remove.disabled=true;remove.textContent='正在同步删除…';try{let health=await(await fetch('/health')).json();if(!health.cloud_delete)throw Error('请先双击加载本次更新.command启用千问同步删除');await requireControls();let r=await post('/delete/'+j.id,{});if(r.deletion_result?.status==='pending'){deletionResults.set(j.id,r.deletion_result);msg.className='';renderDeletionResult(msg,r.deletion_result);await refresh();return}deletedTaskIds.add(j.id);++refreshSequence;document.querySelectorAll('article[data-task-id="'+j.id+'"]').forEach(node=&gt;node.remove());deletionResults.delete(j.id);showDeletionResult(r.deletion_result||{status:'success',message:r.message},true);await refresh()}catch(e){let message=e.deletionResult?.message||('删除失败\n工具任务列表记录：未删除成功\n本机文稿及任务文件：未确认删除成功\n对应的千问记录：未确认删除成功\n原因：'+e.message);let report=e.deletionResult||{status:'failed',message};deletionResults.set(j.id,report);showDeletionResult(report,false);let status=card.querySelector('.delete-result');if(!status){status=document.createElement('p');status.className='delete-result';status.setAttribute('role','alert');card.append(status)}status.style.color='#a52222';renderDeletionResult(status,report);remove.disabled=false;remove.textContent='删除任务记录'}};if(j.has_document){card.querySelector('.actions').append(remove)}else{controls.append(remove)}if(controls.children.length)card.append(controls);host.append(card)}await refreshLogin()}catch(e){msg.textContent='后台连接中断，请重新启动工具。'}}</w:t>
+        <w:t>async function refresh(){const sequence=++refreshSequence;try{await refreshDeletions();let jobs=await(await fetch('/jobs')).json();if(sequence!==refreshSequence)return;jobs=jobs.filter(j=&gt;!deletedTaskIds.has(j.id));jobs.sort((a,b)=&gt;a.task_number&amp;&amp;b.task_number?b.task_number-a.task_number:(b.created_at??historicalTaskTimes[b.id]??b.added_at??Infinity)-(a.created_at??historicalTaskTimes[a.id]??a.added_at??Infinity));let host=document.querySelector('#jobs');host.replaceChildren();for(let j of jobs){let card=document.createElement('article');card.dataset.taskId=j.id;let h=document.createElement('h2');h.textContent=taskHeading(j);card.append(h);let p=document.createElement('p');p.textContent=(j.document&amp;&amp;!j.has_document)?'Word 文件已不在原保存位置，重新提交链接可生成':(stages[j.state]||'状态暂未识别：'+String(j.state));if(j.qianwen_task_failed&amp;&amp;j.state==='failed')p.textContent='千问任务失败，进度已保留';card.append(p);if(j.source_kind==='local'){let source=document.createElement('p');source.textContent=j.source_label;card.append(source)}else card.append(link('原网页',j.url));let deletion=deletionResults.get(j.id)||j.deletion_result;if(deletion){let status=document.createElement('p');status.className='delete-result';status.setAttribute('role','alert');status.style.color=deletion.status==='failed'?'#a52222':'#8b4520';renderDeletionResult(status,deletion);card.append(status)}if(j.error){let err=document.createElement('p');err.textContent=j.error;card.append(err)}if(j.cloud_cleanup_state){let cloud=document.createElement('p');cloud.textContent=j.cloud_cleanup_state==='pending'?'Word 已保存，正在删除对应的千问记录…':j.cloud_cleanup_state==='completed'?'对应的千问记录已清理。':'Word 已保存；千问记录尚未清理：'+(j.cloud_cleanup_error||'请稍后在千问中检查');card.append(cloud)}if(j.cleanup_error){let note=document.createElement('p');note.textContent='Word 已生成，但部分临时文件未清理：'+j.cleanup_error;card.append(note)}if(j.has_document){let actions=document.createElement('p');actions.className='actions';actions.append(link('查看 Word 文稿','/preview/'+j.id,'action'));let reveal=document.createElement('button');reveal.type='button';reveal.className='secondary';reveal.textContent='打开文档所在位置';let revealStatus=document.createElement('small');revealStatus.setAttribute('role','status');reveal.onclick=async()=&gt;{reveal.disabled=true;revealStatus.textContent='正在打开文件夹…';try{await post('/reveal/'+j.id,{});revealStatus.textContent='已打开 Finder 文件夹。';msg.textContent='已打开文档所在的 Finder 文件夹。'}catch(e){revealStatus.textContent='打开失败：'+e.message;msg.textContent='打开失败：'+e.message}finally{reveal.disabled=false}};actions.append(reveal);actions.append(revealStatus);card.append(actions);let note=document.createElement('small');note.textContent=j.temporary_files_removed?(j.media_trashed?'原音视频已移入废纸篓，临时音轨已清理。':'原音视频与临时音轨已清理。'):'Word 内容未经人工校对。';card.append(note)}let controls=document.createElement('p');controls.className='actions';if(j.state==='youtube_verifying'){let resume=document.createElement('button');resume.className='retry-task';resume.textContent='已关闭验证弹窗，重新开始任务';resume.onclick=async()=&gt;{resume.disabled=true;try{let result=await post('/youtube/confirm/'+j.id,{});msg.textContent=result.message;await refresh()}catch(e){msg.textContent=e.message;resume.disabled=false}};controls.append(resume)}if(j.state==='failed'||j.state==='login_required'){let retry=document.createElement('button');retry.textContent=j.qianwen_task_failed?'重新开始任务':'重试任务';retry.className='retry-task';retry.onclick=async()=&gt;{try{await post('/jobs',{url:j.url,engine:'qianwen'});await refresh()}catch(e){msg.textContent=e.message}};controls.append(retry)}let remove=document.createElement('button');remove.type='button';remove.className='secondary';remove.style.color='#a52222';remove.textContent='删除任务记录';if(deletion?.status==='pending'){remove.disabled=true;remove.textContent='正在同步删除…'}remove.onclick=async()=&gt;{if(!confirm('删除“'+(j.title||j.id)+'”？将停止该任务，把本机任务文件和相关文稿移入废纸篓。同时删除对应的千问云端记录，云端删除后无法恢复。'))return;deletionResults.set(j.id,{status:'pending',message:'正在删除并同步到千问，请稍候…'});msg.className='';msg.textContent='正在删除并同步到千问，请稍候…';remove.disabled=true;remove.textContent='正在同步删除…';try{let health=await(await fetch('/health')).json();if(!health.cloud_delete)throw Error('请先双击加载本次更新.command启用千问同步删除');await requireControls();let r=await post('/delete/'+j.id,{});if(r.deletion_result?.status==='pending'){deletionResults.set(j.id,r.deletion_result);msg.className='';renderDeletionResult(msg,r.deletion_result);await refresh();return}deletedTaskIds.add(j.id);++refreshSequence;document.querySelectorAll('article[data-task-id="'+j.id+'"]').forEach(node=&gt;node.remove());deletionResults.delete(j.id);showDeletionResult(r.deletion_result||{status:'success',message:r.message},true);await refresh()}catch(e){let message=e.deletionResult?.message||('删除失败\n工具任务列表记录：未删除成功\n本机文稿及任务文件：未确认删除成功\n对应的千问记录：未确认删除成功\n原因：'+e.message);let report=e.deletionResult||{status:'failed',message};deletionResults.set(j.id,report);showDeletionResult(report,false);let status=card.querySelector('.delete-result');if(!status){status=document.createElement('p');status.className='delete-result';status.setAttribute('role','alert');card.append(status)}status.style.color='#a52222';renderDeletionResult(status,report);remove.disabled=false;remove.textContent='删除任务记录'}};if(j.has_document){card.querySelector('.actions').append(remove)}else{controls.append(remove)}if(controls.children.length)card.append(controls);host.append(card)}await refreshLogin()}catch(e){msg.textContent='后台连接中断，请重新启动工具。'}}</w:t>
       </w:r>
     </w:p>
     <w:p>
@@ -8423,6 +8429,11 @@
     </w:p>
     <w:p>
       <w:r>
+        <w:t xml:space="preserve">                    require_task_not_failed(page,title,job,meta,save)</w:t>
+      </w:r>
+    </w:p>
+    <w:p>
+      <w:r>
         <w:t xml:space="preserve">                    require_cloud_available(page)</w:t>
       </w:r>
     </w:p>
@@ -8468,6 +8479,11 @@
     </w:p>
     <w:p>
       <w:r>
+        <w:t xml:space="preserve">                        require_task_not_failed(page,title,job,meta,save)</w:t>
+      </w:r>
+    </w:p>
+    <w:p>
+      <w:r>
         <w:t xml:space="preserve">                        page.screenshot(path=str(job/'browser-diagnostic.png'),full_page=True)</w:t>
       </w:r>
     </w:p>
@@ -8513,6 +8529,11 @@
     </w:p>
     <w:p>
       <w:r>
+        <w:t xml:space="preserve">            require_task_not_failed(page,upload.stem,job,meta,save)</w:t>
+      </w:r>
+    </w:p>
+    <w:p>
+      <w:r>
         <w:t xml:space="preserve">            meta['state']='cloud_exporting';save(job/'job.json',meta)</w:t>
       </w:r>
     </w:p>
@@ -8624,6 +8645,73 @@
     <w:p>
       <w:r>
         <w:t xml:space="preserve">    return raw</w:t>
+      </w:r>
+    </w:p>
+    <w:p/>
+    <w:p/>
+    <w:p>
+      <w:r>
+        <w:t>def require_task_not_failed(page, title, job, meta, save):</w:t>
+      </w:r>
+    </w:p>
+    <w:p>
+      <w:r>
+        <w:t xml:space="preserve">    """Inspect only this task's exact row, never another failed record."""</w:t>
+      </w:r>
+    </w:p>
+    <w:p>
+      <w:r>
+        <w:t xml:space="preserve">    if '/efficiency/doc/transcripts/' in page.url:</w:t>
+      </w:r>
+    </w:p>
+    <w:p>
+      <w:r>
+        <w:t xml:space="preserve">        failed=page.get_by_text('任务失败',exact=True).is_visible()</w:t>
+      </w:r>
+    </w:p>
+    <w:p>
+      <w:r>
+        <w:t xml:space="preserve">    else:</w:t>
+      </w:r>
+    </w:p>
+    <w:p>
+      <w:r>
+        <w:t xml:space="preserve">        rows=page.locator('[data-e2e-test-id="folders_item_div"]').filter(has=page.get_by_text(title,exact=True))</w:t>
+      </w:r>
+    </w:p>
+    <w:p>
+      <w:r>
+        <w:t xml:space="preserve">        failed=rows.count()==1 and rows.get_by_text('任务失败',exact=True).is_visible()</w:t>
+      </w:r>
+    </w:p>
+    <w:p>
+      <w:r>
+        <w:t xml:space="preserve">    meta['last_browser_check']=time.time()</w:t>
+      </w:r>
+    </w:p>
+    <w:p>
+      <w:r>
+        <w:t xml:space="preserve">    if failed:</w:t>
+      </w:r>
+    </w:p>
+    <w:p>
+      <w:r>
+        <w:t xml:space="preserve">        meta.update(state='failed',qianwen_task_failed=True,error='千问已确认任务失败，本机音频已保留。请点击“重新开始任务”。')</w:t>
+      </w:r>
+    </w:p>
+    <w:p>
+      <w:r>
+        <w:t xml:space="preserve">        save(job/'job.json',meta)</w:t>
+      </w:r>
+    </w:p>
+    <w:p>
+      <w:r>
+        <w:t xml:space="preserve">        raise RuntimeError(meta['error'])</w:t>
+      </w:r>
+    </w:p>
+    <w:p>
+      <w:r>
+        <w:t xml:space="preserve">    save(job/'job.json',meta)</w:t>
       </w:r>
     </w:p>
     <w:p/>
@@ -9649,6 +9737,71 @@
     </w:p>
     <w:p>
       <w:r>
+        <w:t xml:space="preserve">        if meta.get('qianwen_task_failed'):</w:t>
+      </w:r>
+    </w:p>
+    <w:p>
+      <w:r>
+        <w:t xml:space="preserve">            from qianwen_browser import delete_cloud</w:t>
+      </w:r>
+    </w:p>
+    <w:p>
+      <w:r>
+        <w:t xml:space="preserve">            try:</w:t>
+      </w:r>
+    </w:p>
+    <w:p>
+      <w:r>
+        <w:t xml:space="preserve">                delete_cloud(job)</w:t>
+      </w:r>
+    </w:p>
+    <w:p>
+      <w:r>
+        <w:t xml:space="preserve">            except Exception as error:</w:t>
+      </w:r>
+    </w:p>
+    <w:p>
+      <w:r>
+        <w:t xml:space="preserve">                meta.update(state='failed',error='重新开始前未能清理千问失败记录：'+str(error))</w:t>
+      </w:r>
+    </w:p>
+    <w:p>
+      <w:r>
+        <w:t xml:space="preserve">                save_json(job/'job.json',meta)</w:t>
+      </w:r>
+    </w:p>
+    <w:p>
+      <w:r>
+        <w:t xml:space="preserve">                raise</w:t>
+      </w:r>
+    </w:p>
+    <w:p>
+      <w:r>
+        <w:t xml:space="preserve">            meta=json.loads((job/'job.json').read_text())</w:t>
+      </w:r>
+    </w:p>
+    <w:p>
+      <w:r>
+        <w:t xml:space="preserve">            for key in list(meta):</w:t>
+      </w:r>
+    </w:p>
+    <w:p>
+      <w:r>
+        <w:t xml:space="preserve">                if key.startswith('qianwen_') or key.startswith('cloud_cleanup_'):</w:t>
+      </w:r>
+    </w:p>
+    <w:p>
+      <w:r>
+        <w:t xml:space="preserve">                    meta.pop(key,None)</w:t>
+      </w:r>
+    </w:p>
+    <w:p>
+      <w:r>
+        <w:t xml:space="preserve">            save_json(job/'job.json',meta)</w:t>
+      </w:r>
+    </w:p>
+    <w:p>
+      <w:r>
         <w:t xml:space="preserve">        meta.setdefault('created_at', getattr(job.stat(), 'st_birthtime', job.stat().st_mtime))</w:t>
       </w:r>
     </w:p>
@@ -15900,6 +16053,103 @@
         <w:t>if __name__=='__main__':unittest.main()</w:t>
       </w:r>
     </w:p>
+    <w:p/>
+    <w:p>
+      <w:r>
+        <w:t>class CloudTaskFailureTests(unittest.TestCase):</w:t>
+      </w:r>
+    </w:p>
+    <w:p>
+      <w:r>
+        <w:t xml:space="preserve">    def test_exact_failed_task_is_recorded(self):</w:t>
+      </w:r>
+    </w:p>
+    <w:p>
+      <w:r>
+        <w:t xml:space="preserve">        from unittest.mock import Mock</w:t>
+      </w:r>
+    </w:p>
+    <w:p>
+      <w:r>
+        <w:t xml:space="preserve">        from pathlib import Path</w:t>
+      </w:r>
+    </w:p>
+    <w:p>
+      <w:r>
+        <w:t xml:space="preserve">        from qianwen_browser import require_task_not_failed</w:t>
+      </w:r>
+    </w:p>
+    <w:p>
+      <w:r>
+        <w:t xml:space="preserve">        page=Mock();page.url='https://www.qianwen.com/efficiency';row=page.locator.return_value.filter.return_value</w:t>
+      </w:r>
+    </w:p>
+    <w:p>
+      <w:r>
+        <w:t xml:space="preserve">        row.count.return_value=1;row.get_by_text.return_value.is_visible.return_value=True</w:t>
+      </w:r>
+    </w:p>
+    <w:p>
+      <w:r>
+        <w:t xml:space="preserve">        meta={};save=Mock()</w:t>
+      </w:r>
+    </w:p>
+    <w:p>
+      <w:r>
+        <w:t xml:space="preserve">        with self.assertRaises(RuntimeError):require_task_not_failed(page,'7 - title',Path('/tmp/job'),meta,save)</w:t>
+      </w:r>
+    </w:p>
+    <w:p>
+      <w:r>
+        <w:t xml:space="preserve">        self.assertTrue(meta['qianwen_task_failed']);self.assertEqual(meta['state'],'failed')</w:t>
+      </w:r>
+    </w:p>
+    <w:p>
+      <w:r>
+        <w:t xml:space="preserve">        page.get_by_text.assert_called_with('7 - title',exact=True)</w:t>
+      </w:r>
+    </w:p>
+    <w:p/>
+    <w:p>
+      <w:r>
+        <w:t xml:space="preserve">    def test_other_failed_records_do_not_fail_current_task(self):</w:t>
+      </w:r>
+    </w:p>
+    <w:p>
+      <w:r>
+        <w:t xml:space="preserve">        from unittest.mock import Mock</w:t>
+      </w:r>
+    </w:p>
+    <w:p>
+      <w:r>
+        <w:t xml:space="preserve">        from pathlib import Path</w:t>
+      </w:r>
+    </w:p>
+    <w:p>
+      <w:r>
+        <w:t xml:space="preserve">        from qianwen_browser import require_task_not_failed</w:t>
+      </w:r>
+    </w:p>
+    <w:p>
+      <w:r>
+        <w:t xml:space="preserve">        page=Mock();page.url='https://www.qianwen.com/efficiency';row=page.locator.return_value.filter.return_value</w:t>
+      </w:r>
+    </w:p>
+    <w:p>
+      <w:r>
+        <w:t xml:space="preserve">        row.count.return_value=0;meta={}</w:t>
+      </w:r>
+    </w:p>
+    <w:p>
+      <w:r>
+        <w:t xml:space="preserve">        require_task_not_failed(page,'7 - title',Path('/tmp/job'),meta,Mock())</w:t>
+      </w:r>
+    </w:p>
+    <w:p>
+      <w:r>
+        <w:t xml:space="preserve">        self.assertNotIn('qianwen_task_failed',meta)</w:t>
+      </w:r>
+    </w:p>
     <w:p>
       <w:r>
         <w:t>```</w:t>
@@ -19486,7 +19736,7 @@
     </w:p>
     <w:p>
       <w:r>
-        <w:t xml:space="preserve">  "index.html": "40615aede8fdd8a5b942103e57f57a7705c6c1bb3bd7592182eac2129436574e",</w:t>
+        <w:t xml:space="preserve">  "index.html": "414754d714297d7a5d6066da74777c68f61da44c1fa8ec625a68a9c4784bdde2",</w:t>
       </w:r>
     </w:p>
     <w:p>
@@ -19516,12 +19766,12 @@
     </w:p>
     <w:p>
       <w:r>
-        <w:t xml:space="preserve">  "qianwen_browser.py": "7b380bde0713ddc2b8717787f2e56412e1331f0ca1dec70e032ce6336f920427",</w:t>
-      </w:r>
-    </w:p>
-    <w:p>
-      <w:r>
-        <w:t xml:space="preserve">  "reader.py": "e16d336fb71b6b727f66e7e9a9f02113fc68adb0670f4a94fb87457e5d878aed",</w:t>
+        <w:t xml:space="preserve">  "qianwen_browser.py": "d2ca83f16f299db95720cfcfdc53e8e7e997cb1bd4901b1eaa9c203720fcd933",</w:t>
+      </w:r>
+    </w:p>
+    <w:p>
+      <w:r>
+        <w:t xml:space="preserve">  "reader.py": "4805c0350c22ec75f1c087d477fa55272cf164975eafeeefb862d5375c2c8833",</w:t>
       </w:r>
     </w:p>
     <w:p>
@@ -19596,7 +19846,7 @@
     </w:p>
     <w:p>
       <w:r>
-        <w:t xml:space="preserve">  "test_qianwen.py": "9fb2902cabfbb02f36b5ce3bed5c96205ba05b6b390833cae97e10ecafd78473",</w:t>
+        <w:t xml:space="preserve">  "test_qianwen.py": "c6714e95259548f920bc8be68002d40c655aa9c5cfc30b0653bda3d37f6e374a",</w:t>
       </w:r>
     </w:p>
     <w:p>

</xml_diff>

<commit_message>
Offer explicit restart for interrupted tasks without duplicating live work
</commit_message>
<xml_diff>
--- a/安装与使用指南.docx
+++ b/安装与使用指南.docx
@@ -731,6 +731,12 @@
     </w:p>
     <w:p/>
     <w:p>
+      <w:r>
+        <w:t>重启工具或刷新页面时，会检查未完成任务是否仍由后台运行或排队；失去执行进程的任务显示“任务已中断，进度已保留”，并在删除按钮旁提供黄色“重新开始任务”。不会把仍运行的任务误判为中断，不会自动重复提交。重启使用原任务和保存的进度；网络错误已明确失败的任务也提供同一重启按钮。</w:t>
+      </w:r>
+    </w:p>
+    <w:p/>
+    <w:p>
       <w:pPr>
         <w:pStyle w:val="Heading1"/>
       </w:pPr>
@@ -1478,79 +1484,146 @@
     </w:p>
     <w:p>
       <w:r>
-        <w:t xml:space="preserve">    # After restarting the web service, leave an existing reader process running.</w:t>
-      </w:r>
-    </w:p>
-    <w:p>
-      <w:r>
-        <w:t xml:space="preserve">    for item in sorted(list_jobs(), key=lambda item: item['created_at']):</w:t>
-      </w:r>
-    </w:p>
-    <w:p>
-      <w:r>
-        <w:t xml:space="preserve">        if item.get('state') not in ('completed', 'failed', 'login_required') and not (WORK/'jobs'/item['id']/'.deleting').exists():</w:t>
-      </w:r>
-    </w:p>
-    <w:p>
-      <w:r>
-        <w:t xml:space="preserve">            pending.add(item['id'])</w:t>
-      </w:r>
-    </w:p>
-    <w:p>
-      <w:r>
-        <w:t xml:space="preserve">            generation=__import__('uuid').uuid4().hex</w:t>
-      </w:r>
-    </w:p>
-    <w:p>
-      <w:r>
-        <w:t xml:space="preserve">            generations[item['id']]=generation</w:t>
-      </w:r>
-    </w:p>
-    <w:p>
-      <w:r>
-        <w:t xml:space="preserve">            tasks.put((item['id'], item['url'], generation))</w:t>
-      </w:r>
-    </w:p>
-    <w:p>
-      <w:r>
-        <w:t xml:space="preserve">            if not item.get('title'):</w:t>
-      </w:r>
-    </w:p>
-    <w:p>
-      <w:r>
-        <w:t xml:space="preserve">                start_title_lookup(item['id'], item['url'])</w:t>
-      </w:r>
-    </w:p>
-    <w:p/>
-    <w:p>
-      <w:r>
-        <w:t>def task_created_at(folder):</w:t>
-      </w:r>
-    </w:p>
-    <w:p>
-      <w:r>
-        <w:t xml:space="preserve">    marker = folder / '.prepare.lock'</w:t>
-      </w:r>
-    </w:p>
-    <w:p>
-      <w:r>
-        <w:t xml:space="preserve">    path = marker if marker.exists() else folder</w:t>
-      </w:r>
-    </w:p>
-    <w:p>
-      <w:r>
-        <w:t xml:space="preserve">    stat = path.stat()</w:t>
-      </w:r>
-    </w:p>
-    <w:p>
-      <w:r>
-        <w:t xml:space="preserve">    return getattr(stat, 'st_birthtime', stat.st_mtime)</w:t>
+        <w:t xml:space="preserve">    # Classify orphaned work for explicit restart; keep live readers untouched.</w:t>
+      </w:r>
+    </w:p>
+    <w:p>
+      <w:r>
+        <w:t xml:space="preserve">    list_jobs()</w:t>
       </w:r>
     </w:p>
     <w:p/>
     <w:p/>
     <w:p>
       <w:r>
+        <w:t>def classify_interrupted(folder, item):</w:t>
+      </w:r>
+    </w:p>
+    <w:p>
+      <w:r>
+        <w:t xml:space="preserve">    if item.get('state') in ('completed','failed','login_required','interrupted') or (folder/'.deleting').exists():</w:t>
+      </w:r>
+    </w:p>
+    <w:p>
+      <w:r>
+        <w:t xml:space="preserve">        return item</w:t>
+      </w:r>
+    </w:p>
+    <w:p>
+      <w:r>
+        <w:t xml:space="preserve">    from runtime_compat import file_lock</w:t>
+      </w:r>
+    </w:p>
+    <w:p>
+      <w:r>
+        <w:t xml:space="preserve">    with mutex:</w:t>
+      </w:r>
+    </w:p>
+    <w:p>
+      <w:r>
+        <w:t xml:space="preserve">        if folder.name in pending:</w:t>
+      </w:r>
+    </w:p>
+    <w:p>
+      <w:r>
+        <w:t xml:space="preserve">            return item</w:t>
+      </w:r>
+    </w:p>
+    <w:p>
+      <w:r>
+        <w:t xml:space="preserve">        with (folder/'.prepare.lock').open('a') as lock:</w:t>
+      </w:r>
+    </w:p>
+    <w:p>
+      <w:r>
+        <w:t xml:space="preserve">            try:</w:t>
+      </w:r>
+    </w:p>
+    <w:p>
+      <w:r>
+        <w:t xml:space="preserve">                file_lock.flock(lock,file_lock.LOCK_EX | file_lock.LOCK_NB)</w:t>
+      </w:r>
+    </w:p>
+    <w:p>
+      <w:r>
+        <w:t xml:space="preserve">            except BlockingIOError:</w:t>
+      </w:r>
+    </w:p>
+    <w:p>
+      <w:r>
+        <w:t xml:space="preserve">                return item</w:t>
+      </w:r>
+    </w:p>
+    <w:p>
+      <w:r>
+        <w:t xml:space="preserve">            try:</w:t>
+      </w:r>
+    </w:p>
+    <w:p>
+      <w:r>
+        <w:t xml:space="preserve">                fresh=json.loads((folder/'job.json').read_text())</w:t>
+      </w:r>
+    </w:p>
+    <w:p>
+      <w:r>
+        <w:t xml:space="preserve">                if fresh.get('state') not in ('completed','failed','login_required','interrupted'):</w:t>
+      </w:r>
+    </w:p>
+    <w:p>
+      <w:r>
+        <w:t xml:space="preserve">                    fresh.update(state='interrupted',error='任务已中断，已保留处理进度。请点击“重新开始任务”。')</w:t>
+      </w:r>
+    </w:p>
+    <w:p>
+      <w:r>
+        <w:t xml:space="preserve">                    save_json(folder/'job.json',fresh)</w:t>
+      </w:r>
+    </w:p>
+    <w:p>
+      <w:r>
+        <w:t xml:space="preserve">                return fresh</w:t>
+      </w:r>
+    </w:p>
+    <w:p>
+      <w:r>
+        <w:t xml:space="preserve">            finally:</w:t>
+      </w:r>
+    </w:p>
+    <w:p>
+      <w:r>
+        <w:t xml:space="preserve">                file_lock.flock(lock,file_lock.LOCK_UN)</w:t>
+      </w:r>
+    </w:p>
+    <w:p/>
+    <w:p>
+      <w:r>
+        <w:t>def task_created_at(folder):</w:t>
+      </w:r>
+    </w:p>
+    <w:p>
+      <w:r>
+        <w:t xml:space="preserve">    marker = folder / '.prepare.lock'</w:t>
+      </w:r>
+    </w:p>
+    <w:p>
+      <w:r>
+        <w:t xml:space="preserve">    path = marker if marker.exists() else folder</w:t>
+      </w:r>
+    </w:p>
+    <w:p>
+      <w:r>
+        <w:t xml:space="preserve">    stat = path.stat()</w:t>
+      </w:r>
+    </w:p>
+    <w:p>
+      <w:r>
+        <w:t xml:space="preserve">    return getattr(stat, 'st_birthtime', stat.st_mtime)</w:t>
+      </w:r>
+    </w:p>
+    <w:p/>
+    <w:p/>
+    <w:p>
+      <w:r>
         <w:t>def list_jobs():</w:t>
       </w:r>
     </w:p>
@@ -1581,7 +1654,7 @@
     </w:p>
     <w:p>
       <w:r>
-        <w:t xml:space="preserve">            item = json.loads(path.read_text(encoding="utf-8"))</w:t>
+        <w:t xml:space="preserve">            item = classify_interrupted(path.parent,json.loads(path.read_text(encoding="utf-8")))</w:t>
       </w:r>
     </w:p>
     <w:p>
@@ -4774,7 +4847,7 @@
     </w:p>
     <w:p>
       <w:r>
-        <w:t>async function refresh(){const sequence=++refreshSequence;try{await refreshDeletions();let jobs=await(await fetch('/jobs')).json();if(sequence!==refreshSequence)return;jobs=jobs.filter(j=&gt;!deletedTaskIds.has(j.id));jobs.sort((a,b)=&gt;a.task_number&amp;&amp;b.task_number?b.task_number-a.task_number:(b.created_at??historicalTaskTimes[b.id]??b.added_at??Infinity)-(a.created_at??historicalTaskTimes[a.id]??a.added_at??Infinity));let host=document.querySelector('#jobs');host.replaceChildren();for(let j of jobs){let card=document.createElement('article');card.dataset.taskId=j.id;let h=document.createElement('h2');h.textContent=taskHeading(j);card.append(h);let p=document.createElement('p');p.textContent=(j.document&amp;&amp;!j.has_document)?'Word 文件已不在原保存位置，重新提交链接可生成':(stages[j.state]||'状态暂未识别：'+String(j.state));if(j.qianwen_task_failed&amp;&amp;j.state==='failed')p.textContent='千问任务失败，进度已保留';card.append(p);if(j.source_kind==='local'){let source=document.createElement('p');source.textContent=j.source_label;card.append(source)}else card.append(link('原网页',j.url));let deletion=deletionResults.get(j.id)||j.deletion_result;if(deletion){let status=document.createElement('p');status.className='delete-result';status.setAttribute('role','alert');status.style.color=deletion.status==='failed'?'#a52222':'#8b4520';renderDeletionResult(status,deletion);card.append(status)}if(j.error){let err=document.createElement('p');err.textContent=j.error;card.append(err)}if(j.cloud_cleanup_state){let cloud=document.createElement('p');cloud.textContent=j.cloud_cleanup_state==='pending'?'Word 已保存，正在删除对应的千问记录…':j.cloud_cleanup_state==='completed'?'对应的千问记录已清理。':'Word 已保存；千问记录尚未清理：'+(j.cloud_cleanup_error||'请稍后在千问中检查');card.append(cloud)}if(j.cleanup_error){let note=document.createElement('p');note.textContent='Word 已生成，但部分临时文件未清理：'+j.cleanup_error;card.append(note)}if(j.has_document){let actions=document.createElement('p');actions.className='actions';actions.append(link('查看 Word 文稿','/preview/'+j.id,'action'));let reveal=document.createElement('button');reveal.type='button';reveal.className='secondary';reveal.textContent='打开文档所在位置';let revealStatus=document.createElement('small');revealStatus.setAttribute('role','status');reveal.onclick=async()=&gt;{reveal.disabled=true;revealStatus.textContent='正在打开文件夹…';try{await post('/reveal/'+j.id,{});revealStatus.textContent='已打开 Finder 文件夹。';msg.textContent='已打开文档所在的 Finder 文件夹。'}catch(e){revealStatus.textContent='打开失败：'+e.message;msg.textContent='打开失败：'+e.message}finally{reveal.disabled=false}};actions.append(reveal);actions.append(revealStatus);card.append(actions);let note=document.createElement('small');note.textContent=j.temporary_files_removed?(j.media_trashed?'原音视频已移入废纸篓，临时音轨已清理。':'原音视频与临时音轨已清理。'):'Word 内容未经人工校对。';card.append(note)}let controls=document.createElement('p');controls.className='actions';if(j.state==='youtube_verifying'){let resume=document.createElement('button');resume.className='retry-task';resume.textContent='已关闭验证弹窗，重新开始任务';resume.onclick=async()=&gt;{resume.disabled=true;try{let result=await post('/youtube/confirm/'+j.id,{});msg.textContent=result.message;await refresh()}catch(e){msg.textContent=e.message;resume.disabled=false}};controls.append(resume)}if(j.state==='failed'||j.state==='login_required'){let retry=document.createElement('button');retry.textContent=j.qianwen_task_failed?'重新开始任务':'重试任务';retry.className='retry-task';retry.onclick=async()=&gt;{try{await post('/jobs',{url:j.url,engine:'qianwen'});await refresh()}catch(e){msg.textContent=e.message}};controls.append(retry)}let remove=document.createElement('button');remove.type='button';remove.className='secondary';remove.style.color='#a52222';remove.textContent='删除任务记录';if(deletion?.status==='pending'){remove.disabled=true;remove.textContent='正在同步删除…'}remove.onclick=async()=&gt;{if(!confirm('删除“'+(j.title||j.id)+'”？将停止该任务，把本机任务文件和相关文稿移入废纸篓。同时删除对应的千问云端记录，云端删除后无法恢复。'))return;deletionResults.set(j.id,{status:'pending',message:'正在删除并同步到千问，请稍候…'});msg.className='';msg.textContent='正在删除并同步到千问，请稍候…';remove.disabled=true;remove.textContent='正在同步删除…';try{let health=await(await fetch('/health')).json();if(!health.cloud_delete)throw Error('请先双击加载本次更新.command启用千问同步删除');await requireControls();let r=await post('/delete/'+j.id,{});if(r.deletion_result?.status==='pending'){deletionResults.set(j.id,r.deletion_result);msg.className='';renderDeletionResult(msg,r.deletion_result);await refresh();return}deletedTaskIds.add(j.id);++refreshSequence;document.querySelectorAll('article[data-task-id="'+j.id+'"]').forEach(node=&gt;node.remove());deletionResults.delete(j.id);showDeletionResult(r.deletion_result||{status:'success',message:r.message},true);await refresh()}catch(e){let message=e.deletionResult?.message||('删除失败\n工具任务列表记录：未删除成功\n本机文稿及任务文件：未确认删除成功\n对应的千问记录：未确认删除成功\n原因：'+e.message);let report=e.deletionResult||{status:'failed',message};deletionResults.set(j.id,report);showDeletionResult(report,false);let status=card.querySelector('.delete-result');if(!status){status=document.createElement('p');status.className='delete-result';status.setAttribute('role','alert');card.append(status)}status.style.color='#a52222';renderDeletionResult(status,report);remove.disabled=false;remove.textContent='删除任务记录'}};if(j.has_document){card.querySelector('.actions').append(remove)}else{controls.append(remove)}if(controls.children.length)card.append(controls);host.append(card)}await refreshLogin()}catch(e){msg.textContent='后台连接中断，请重新启动工具。'}}</w:t>
+        <w:t>async function refresh(){const sequence=++refreshSequence;try{await refreshDeletions();let jobs=await(await fetch('/jobs')).json();if(sequence!==refreshSequence)return;jobs=jobs.filter(j=&gt;!deletedTaskIds.has(j.id));jobs.sort((a,b)=&gt;a.task_number&amp;&amp;b.task_number?b.task_number-a.task_number:(b.created_at??historicalTaskTimes[b.id]??b.added_at??Infinity)-(a.created_at??historicalTaskTimes[a.id]??a.added_at??Infinity));let host=document.querySelector('#jobs');host.replaceChildren();for(let j of jobs){let card=document.createElement('article');card.dataset.taskId=j.id;let h=document.createElement('h2');h.textContent=taskHeading(j);card.append(h);let p=document.createElement('p');p.textContent=(j.document&amp;&amp;!j.has_document)?'Word 文件已不在原保存位置，重新提交链接可生成':(stages[j.state]||'状态暂未识别：'+String(j.state));if(j.state==='interrupted')p.textContent='任务已中断，进度已保留';if(j.qianwen_task_failed&amp;&amp;j.state==='failed')p.textContent='千问任务失败，进度已保留';card.append(p);if(j.source_kind==='local'){let source=document.createElement('p');source.textContent=j.source_label;card.append(source)}else card.append(link('原网页',j.url));let deletion=deletionResults.get(j.id)||j.deletion_result;if(deletion){let status=document.createElement('p');status.className='delete-result';status.setAttribute('role','alert');status.style.color=deletion.status==='failed'?'#a52222':'#8b4520';renderDeletionResult(status,deletion);card.append(status)}if(j.error){let err=document.createElement('p');err.textContent=j.error;card.append(err)}if(j.cloud_cleanup_state){let cloud=document.createElement('p');cloud.textContent=j.cloud_cleanup_state==='pending'?'Word 已保存，正在删除对应的千问记录…':j.cloud_cleanup_state==='completed'?'对应的千问记录已清理。':'Word 已保存；千问记录尚未清理：'+(j.cloud_cleanup_error||'请稍后在千问中检查');card.append(cloud)}if(j.cleanup_error){let note=document.createElement('p');note.textContent='Word 已生成，但部分临时文件未清理：'+j.cleanup_error;card.append(note)}if(j.has_document){let actions=document.createElement('p');actions.className='actions';actions.append(link('查看 Word 文稿','/preview/'+j.id,'action'));let reveal=document.createElement('button');reveal.type='button';reveal.className='secondary';reveal.textContent='打开文档所在位置';let revealStatus=document.createElement('small');revealStatus.setAttribute('role','status');reveal.onclick=async()=&gt;{reveal.disabled=true;revealStatus.textContent='正在打开文件夹…';try{await post('/reveal/'+j.id,{});revealStatus.textContent='已打开 Finder 文件夹。';msg.textContent='已打开文档所在的 Finder 文件夹。'}catch(e){revealStatus.textContent='打开失败：'+e.message;msg.textContent='打开失败：'+e.message}finally{reveal.disabled=false}};actions.append(reveal);actions.append(revealStatus);card.append(actions);let note=document.createElement('small');note.textContent=j.temporary_files_removed?(j.media_trashed?'原音视频已移入废纸篓，临时音轨已清理。':'原音视频与临时音轨已清理。'):'Word 内容未经人工校对。';card.append(note)}let controls=document.createElement('p');controls.className='actions';if(j.state==='youtube_verifying'){let resume=document.createElement('button');resume.className='retry-task';resume.textContent='已关闭验证弹窗，重新开始任务';resume.onclick=async()=&gt;{resume.disabled=true;try{let result=await post('/youtube/confirm/'+j.id,{});msg.textContent=result.message;await refresh()}catch(e){msg.textContent=e.message;resume.disabled=false}};controls.append(resume)}if(j.state==='failed'||j.state==='login_required'||j.state==='interrupted'){let retry=document.createElement('button');retry.textContent='重新开始任务';retry.className='retry-task';retry.onclick=async()=&gt;{try{await post('/jobs',{url:j.url,engine:'qianwen'});await refresh()}catch(e){msg.textContent=e.message}};controls.append(retry)}let remove=document.createElement('button');remove.type='button';remove.className='secondary';remove.style.color='#a52222';remove.textContent='删除任务记录';if(deletion?.status==='pending'){remove.disabled=true;remove.textContent='正在同步删除…'}remove.onclick=async()=&gt;{if(!confirm('删除“'+(j.title||j.id)+'”？将停止该任务，把本机任务文件和相关文稿移入废纸篓。同时删除对应的千问云端记录，云端删除后无法恢复。'))return;deletionResults.set(j.id,{status:'pending',message:'正在删除并同步到千问，请稍候…'});msg.className='';msg.textContent='正在删除并同步到千问，请稍候…';remove.disabled=true;remove.textContent='正在同步删除…';try{let health=await(await fetch('/health')).json();if(!health.cloud_delete)throw Error('请先双击加载本次更新.command启用千问同步删除');await requireControls();let r=await post('/delete/'+j.id,{});if(r.deletion_result?.status==='pending'){deletionResults.set(j.id,r.deletion_result);msg.className='';renderDeletionResult(msg,r.deletion_result);await refresh();return}deletedTaskIds.add(j.id);++refreshSequence;document.querySelectorAll('article[data-task-id="'+j.id+'"]').forEach(node=&gt;node.remove());deletionResults.delete(j.id);showDeletionResult(r.deletion_result||{status:'success',message:r.message},true);await refresh()}catch(e){let message=e.deletionResult?.message||('删除失败\n工具任务列表记录：未删除成功\n本机文稿及任务文件：未确认删除成功\n对应的千问记录：未确认删除成功\n原因：'+e.message);let report=e.deletionResult||{status:'failed',message};deletionResults.set(j.id,report);showDeletionResult(report,false);let status=card.querySelector('.delete-result');if(!status){status=document.createElement('p');status.className='delete-result';status.setAttribute('role','alert');card.append(status)}status.style.color='#a52222';renderDeletionResult(status,report);remove.disabled=false;remove.textContent='删除任务记录'}};if(j.has_document){card.querySelector('.actions').append(remove)}else{controls.append(remove)}if(controls.children.length)card.append(controls);host.append(card)}await refreshLogin()}catch(e){msg.textContent='后台连接中断，请重新启动工具。'}}</w:t>
       </w:r>
     </w:p>
     <w:p>
@@ -13222,7 +13295,7 @@
     </w:p>
     <w:p>
       <w:r>
-        <w:t xml:space="preserve">            with patch.object(app, 'WORK', root):</w:t>
+        <w:t xml:space="preserve">            with patch.object(app, 'WORK', root),patch.object(app,'pending',{job.name}):</w:t>
       </w:r>
     </w:p>
     <w:p>
@@ -13364,19 +13437,86 @@
     </w:p>
     <w:p>
       <w:r>
-        <w:t xml:space="preserve">                self.assertEqual(restored.get_nowait()[0], '000000000002')</w:t>
-      </w:r>
-    </w:p>
-    <w:p>
-      <w:r>
-        <w:t xml:space="preserve">                self.assertEqual(restored.get_nowait()[0], '000000000001')</w:t>
-      </w:r>
-    </w:p>
-    <w:p>
-      <w:r>
         <w:t xml:space="preserve">                self.assertTrue(restored.empty())</w:t>
       </w:r>
     </w:p>
+    <w:p>
+      <w:r>
+        <w:t xml:space="preserve">                for ident in ['000000000001','000000000002']:</w:t>
+      </w:r>
+    </w:p>
+    <w:p>
+      <w:r>
+        <w:t xml:space="preserve">                    self.assertEqual(json.loads((root/'jobs'/ident/'job.json').read_text())['state'],'interrupted')</w:t>
+      </w:r>
+    </w:p>
+    <w:p/>
+    <w:p>
+      <w:r>
+        <w:t xml:space="preserve">    def test_live_reader_and_queued_tasks_are_not_interrupted(self):</w:t>
+      </w:r>
+    </w:p>
+    <w:p>
+      <w:r>
+        <w:t xml:space="preserve">        from runtime_compat import file_lock</w:t>
+      </w:r>
+    </w:p>
+    <w:p>
+      <w:r>
+        <w:t xml:space="preserve">        with tempfile.TemporaryDirectory() as tmp:</w:t>
+      </w:r>
+    </w:p>
+    <w:p>
+      <w:r>
+        <w:t xml:space="preserve">            root=Path(tmp);folder=root/'jobs/000000000001';folder.mkdir(parents=True)</w:t>
+      </w:r>
+    </w:p>
+    <w:p>
+      <w:r>
+        <w:t xml:space="preserve">            record=folder/'job.json';record.write_text(json.dumps({'state':'transcribing','url':'https://example.com'}))</w:t>
+      </w:r>
+    </w:p>
+    <w:p>
+      <w:r>
+        <w:t xml:space="preserve">            with patch.object(app,'WORK',root),patch.object(app,'pending',set()):</w:t>
+      </w:r>
+    </w:p>
+    <w:p>
+      <w:r>
+        <w:t xml:space="preserve">                with (folder/'.prepare.lock').open('a') as lock:</w:t>
+      </w:r>
+    </w:p>
+    <w:p>
+      <w:r>
+        <w:t xml:space="preserve">                    file_lock.flock(lock,file_lock.LOCK_EX | file_lock.LOCK_NB)</w:t>
+      </w:r>
+    </w:p>
+    <w:p>
+      <w:r>
+        <w:t xml:space="preserve">                    self.assertEqual(app.list_jobs()[0]['state'],'transcribing')</w:t>
+      </w:r>
+    </w:p>
+    <w:p>
+      <w:r>
+        <w:t xml:space="preserve">                    file_lock.flock(lock,file_lock.LOCK_UN)</w:t>
+      </w:r>
+    </w:p>
+    <w:p>
+      <w:r>
+        <w:t xml:space="preserve">                with patch.object(app,'pending',{folder.name}):</w:t>
+      </w:r>
+    </w:p>
+    <w:p>
+      <w:r>
+        <w:t xml:space="preserve">                    self.assertEqual(app.list_jobs()[0]['state'],'transcribing')</w:t>
+      </w:r>
+    </w:p>
+    <w:p>
+      <w:r>
+        <w:t xml:space="preserve">                self.assertEqual(app.list_jobs()[0]['state'],'interrupted')</w:t>
+      </w:r>
+    </w:p>
+    <w:p/>
     <w:p/>
     <w:p/>
     <w:p>
@@ -19706,7 +19846,7 @@
     </w:p>
     <w:p>
       <w:r>
-        <w:t xml:space="preserve">  "app.py": "7b73c01abcb72bc63085d82939e3068dd274e76f3f1d1041e9ace4a5d2c3998e",</w:t>
+        <w:t xml:space="preserve">  "app.py": "0a54525eb1443af9cad4da826f2ab094b2233ead773364496ae388f8273d1dee",</w:t>
       </w:r>
     </w:p>
     <w:p>
@@ -19736,7 +19876,7 @@
     </w:p>
     <w:p>
       <w:r>
-        <w:t xml:space="preserve">  "index.html": "414754d714297d7a5d6066da74777c68f61da44c1fa8ec625a68a9c4784bdde2",</w:t>
+        <w:t xml:space="preserve">  "index.html": "f6c2fd43f8fecf7599341e823f9854fc99d435d11c2636a26ed794cc5498d455",</w:t>
       </w:r>
     </w:p>
     <w:p>
@@ -19816,7 +19956,7 @@
     </w:p>
     <w:p>
       <w:r>
-        <w:t xml:space="preserve">  "test_app.py": "c7ffaebeb5c1ea329f86b5e1047860f080b1a7b46604250782d0cad6fc96d233",</w:t>
+        <w:t xml:space="preserve">  "test_app.py": "83d77bd051894336123e53aed3932ba5922d8c913ce40cac4af1efd9172cf76b",</w:t>
       </w:r>
     </w:p>
     <w:p>

</xml_diff>

<commit_message>
Render numbered task card immediately from submission response
</commit_message>
<xml_diff>
--- a/安装与使用指南.docx
+++ b/安装与使用指南.docx
@@ -737,6 +737,12 @@
     </w:p>
     <w:p/>
     <w:p>
+      <w:r>
+        <w:t>提交成功的接口直接返回已持久化的任务卡片信息与固定序号，页面立即显示卡片，不等待下一轮列表轮询。重复提交已完成链接会显示原记录并说明已完成，不再误报已加入队列。</w:t>
+      </w:r>
+    </w:p>
+    <w:p/>
+    <w:p>
       <w:pPr>
         <w:pStyle w:val="Heading1"/>
       </w:pPr>
@@ -1726,648 +1732,598 @@
     <w:p/>
     <w:p>
       <w:r>
-        <w:t>def worker():</w:t>
-      </w:r>
-    </w:p>
-    <w:p>
-      <w:r>
-        <w:t xml:space="preserve">    while True:</w:t>
-      </w:r>
-    </w:p>
-    <w:p>
-      <w:r>
-        <w:t xml:space="preserve">        ident, url, generation = tasks.get()</w:t>
-      </w:r>
-    </w:p>
-    <w:p>
-      <w:r>
-        <w:t xml:space="preserve">        log=None</w:t>
-      </w:r>
-    </w:p>
-    <w:p>
-      <w:r>
-        <w:t xml:space="preserve">        try:</w:t>
-      </w:r>
-    </w:p>
-    <w:p>
-      <w:r>
-        <w:t xml:space="preserve">            folder = WORK / 'jobs' / ident</w:t>
-      </w:r>
-    </w:p>
-    <w:p>
-      <w:r>
-        <w:t xml:space="preserve">            from runtime_compat import file_lock as fcntl</w:t>
-      </w:r>
-    </w:p>
-    <w:p>
-      <w:r>
-        <w:t xml:space="preserve">            if (ident,generation) in cancelled or not folder.exists():continue</w:t>
-      </w:r>
-    </w:p>
-    <w:p>
-      <w:r>
-        <w:t xml:space="preserve">            with (folder / '.prepare.lock').open('a') as lock:</w:t>
-      </w:r>
-    </w:p>
-    <w:p>
-      <w:r>
-        <w:t xml:space="preserve">                while True:</w:t>
-      </w:r>
-    </w:p>
-    <w:p>
-      <w:r>
-        <w:t xml:space="preserve">                    if (ident,generation) in cancelled or not folder.exists() or (folder/'.deleting').exists():break</w:t>
-      </w:r>
-    </w:p>
-    <w:p>
-      <w:r>
-        <w:t xml:space="preserve">                    try:</w:t>
-      </w:r>
-    </w:p>
-    <w:p>
-      <w:r>
-        <w:t xml:space="preserve">                        fcntl.flock(lock, fcntl.LOCK_EX | fcntl.LOCK_NB)</w:t>
-      </w:r>
-    </w:p>
-    <w:p>
-      <w:r>
-        <w:t xml:space="preserve">                        fcntl.flock(lock, fcntl.LOCK_UN)</w:t>
-      </w:r>
-    </w:p>
-    <w:p>
-      <w:r>
-        <w:t xml:space="preserve">                        break</w:t>
-      </w:r>
-    </w:p>
-    <w:p>
-      <w:r>
-        <w:t xml:space="preserve">                    except BlockingIOError:time.sleep(.2)</w:t>
-      </w:r>
-    </w:p>
-    <w:p>
-      <w:r>
-        <w:t xml:space="preserve">            with mutex:</w:t>
-      </w:r>
-    </w:p>
-    <w:p>
-      <w:r>
-        <w:t xml:space="preserve">                if (ident,generation) in cancelled or not folder.exists() or (folder/'.deleting').exists():continue</w:t>
-      </w:r>
-    </w:p>
-    <w:p>
-      <w:r>
-        <w:t xml:space="preserve">                log=(folder/'run.log').open('ab')</w:t>
-      </w:r>
-    </w:p>
-    <w:p>
-      <w:r>
-        <w:t xml:space="preserve">                process=subprocess.Popen([str(venv_python(ROOT)),str(ROOT/'reader.py'),</w:t>
-      </w:r>
-    </w:p>
-    <w:p>
-      <w:r>
-        <w:t xml:space="preserve">                     'prepare',url,'--engine',json.loads((folder/'job.json').read_text(encoding="utf-8")).get('engine','qianwen')],</w:t>
-      </w:r>
-    </w:p>
-    <w:p>
-      <w:r>
-        <w:t xml:space="preserve">                     stdout=log,stderr=log,start_new_session=True)</w:t>
-      </w:r>
-    </w:p>
-    <w:p>
-      <w:r>
-        <w:t xml:space="preserve">                active_readers[ident]=(process,generation)</w:t>
-      </w:r>
-    </w:p>
-    <w:p>
-      <w:r>
-        <w:t xml:space="preserve">            result=process.wait();log.close()</w:t>
-      </w:r>
-    </w:p>
-    <w:p>
-      <w:r>
-        <w:t xml:space="preserve">            if result==0:(folder/'run.log').unlink(missing_ok=True)</w:t>
-      </w:r>
-    </w:p>
-    <w:p>
-      <w:r>
-        <w:t xml:space="preserve">        except (OSError, ValueError, subprocess.SubprocessError) as error:</w:t>
-      </w:r>
-    </w:p>
-    <w:p>
-      <w:r>
-        <w:t xml:space="preserve">            record=WORK/'jobs'/ident/'job.json'</w:t>
-      </w:r>
-    </w:p>
-    <w:p>
-      <w:r>
-        <w:t xml:space="preserve">            if record.exists() and (ident,generation) not in cancelled:</w:t>
-      </w:r>
-    </w:p>
-    <w:p>
-      <w:r>
-        <w:t xml:space="preserve">                try:</w:t>
-      </w:r>
-    </w:p>
-    <w:p>
-      <w:r>
-        <w:t xml:space="preserve">                    meta=json.loads(record.read_text(encoding="utf-8"))</w:t>
-      </w:r>
-    </w:p>
-    <w:p>
-      <w:r>
-        <w:t xml:space="preserve">                    meta.update(state='failed',error='后台任务未能启动或任务记录异常：'+str(error))</w:t>
-      </w:r>
-    </w:p>
-    <w:p>
-      <w:r>
-        <w:t xml:space="preserve">                    save_json(record,meta)</w:t>
-      </w:r>
-    </w:p>
-    <w:p>
-      <w:r>
-        <w:t xml:space="preserve">                except (OSError,ValueError):pass</w:t>
-      </w:r>
-    </w:p>
-    <w:p>
-      <w:r>
-        <w:t xml:space="preserve">        finally:</w:t>
-      </w:r>
-    </w:p>
-    <w:p>
-      <w:r>
-        <w:t xml:space="preserve">            if log is not None:log.close()</w:t>
-      </w:r>
-    </w:p>
-    <w:p>
-      <w:r>
-        <w:t xml:space="preserve">            with mutex:</w:t>
-      </w:r>
-    </w:p>
-    <w:p>
-      <w:r>
-        <w:t xml:space="preserve">                if generations.get(ident)==generation:</w:t>
-      </w:r>
-    </w:p>
-    <w:p>
-      <w:r>
-        <w:t xml:space="preserve">                    pending.discard(ident);generations.pop(ident,None)</w:t>
-      </w:r>
-    </w:p>
-    <w:p>
-      <w:r>
-        <w:t xml:space="preserve">                cancelled.discard((ident,generation))</w:t>
-      </w:r>
-    </w:p>
-    <w:p>
-      <w:r>
-        <w:t xml:space="preserve">                if active_readers.get(ident,(None,None))[1]==generation:active_readers.pop(ident,None)</w:t>
-      </w:r>
-    </w:p>
-    <w:p>
-      <w:r>
-        <w:t xml:space="preserve">            tasks.task_done()</w:t>
+        <w:t>def submission_result(ident):</w:t>
+      </w:r>
+    </w:p>
+    <w:p>
+      <w:r>
+        <w:t xml:space="preserve">    from task_numbering import numbers</w:t>
+      </w:r>
+    </w:p>
+    <w:p>
+      <w:r>
+        <w:t xml:space="preserve">    folder=WORK/'jobs'/ident</w:t>
+      </w:r>
+    </w:p>
+    <w:p>
+      <w:r>
+        <w:t xml:space="preserve">    item=json.loads((folder/'job.json').read_text())</w:t>
+      </w:r>
+    </w:p>
+    <w:p>
+      <w:r>
+        <w:t xml:space="preserve">    item.update(id=ident,task_number=numbers(WORK)[ident])</w:t>
+      </w:r>
+    </w:p>
+    <w:p>
+      <w:r>
+        <w:t xml:space="preserve">    item['has_document']=bool(item.get('document') and Path(item['document']).is_file())</w:t>
+      </w:r>
+    </w:p>
+    <w:p>
+      <w:r>
+        <w:t xml:space="preserve">    return {'id':ident,'job':item}</w:t>
       </w:r>
     </w:p>
     <w:p/>
     <w:p/>
     <w:p>
       <w:r>
-        <w:t>def deletion_report(success, cloud_status, error=''):</w:t>
-      </w:r>
-    </w:p>
-    <w:p>
-      <w:r>
-        <w:t xml:space="preserve">    cloud={'deleted':'删除成功','not_uploaded':'无需删除：此任务未上传到千问',</w:t>
-      </w:r>
-    </w:p>
-    <w:p>
-      <w:r>
-        <w:t xml:space="preserve">           'not_found':'未找到对应千问记录，未执行云端删除；本机清理按成功处理'}</w:t>
-      </w:r>
-    </w:p>
-    <w:p>
-      <w:r>
-        <w:t xml:space="preserve">    local='删除成功' if success else '未删除成功，任务已保留'</w:t>
-      </w:r>
-    </w:p>
-    <w:p>
-      <w:r>
-        <w:t xml:space="preserve">    files='删除成功（已移入废纸篓）' if success else ('未全部删除成功，请检查并重试' if cloud_status in cloud else '未执行删除，文件已保留')</w:t>
-      </w:r>
-    </w:p>
-    <w:p>
-      <w:r>
-        <w:t xml:space="preserve">    elements=[{'label':'工具任务列表记录','detail':local,'status':'success' if success else 'failed'},</w:t>
-      </w:r>
-    </w:p>
-    <w:p>
-      <w:r>
-        <w:t xml:space="preserve">              {'label':'本机文稿及任务文件','detail':files,'status':'success' if success else 'failed'},</w:t>
-      </w:r>
-    </w:p>
-    <w:p>
-      <w:r>
-        <w:t xml:space="preserve">              {'label':'对应的千问记录','detail':cloud.get(cloud_status,'删除失败：'+error),'status':'success' if cloud_status in cloud else 'failed'}]</w:t>
-      </w:r>
-    </w:p>
-    <w:p>
-      <w:r>
-        <w:t xml:space="preserve">    message=('删除成功' if success else '删除失败')+'\n'+'\n'.join(e['label']+'：'+e['detail'] for e in elements)</w:t>
-      </w:r>
-    </w:p>
-    <w:p>
-      <w:r>
-        <w:t xml:space="preserve">    if not success and cloud_status in cloud:message+='\n失败原因：'+error</w:t>
-      </w:r>
-    </w:p>
-    <w:p>
-      <w:r>
-        <w:t xml:space="preserve">    return {'status':'success' if success else 'failed','message':message,'elements':elements,'at':time.time()}</w:t>
+        <w:t>def worker():</w:t>
+      </w:r>
+    </w:p>
+    <w:p>
+      <w:r>
+        <w:t xml:space="preserve">    while True:</w:t>
+      </w:r>
+    </w:p>
+    <w:p>
+      <w:r>
+        <w:t xml:space="preserve">        ident, url, generation = tasks.get()</w:t>
+      </w:r>
+    </w:p>
+    <w:p>
+      <w:r>
+        <w:t xml:space="preserve">        log=None</w:t>
+      </w:r>
+    </w:p>
+    <w:p>
+      <w:r>
+        <w:t xml:space="preserve">        try:</w:t>
+      </w:r>
+    </w:p>
+    <w:p>
+      <w:r>
+        <w:t xml:space="preserve">            folder = WORK / 'jobs' / ident</w:t>
+      </w:r>
+    </w:p>
+    <w:p>
+      <w:r>
+        <w:t xml:space="preserve">            from runtime_compat import file_lock as fcntl</w:t>
+      </w:r>
+    </w:p>
+    <w:p>
+      <w:r>
+        <w:t xml:space="preserve">            if (ident,generation) in cancelled or not folder.exists():continue</w:t>
+      </w:r>
+    </w:p>
+    <w:p>
+      <w:r>
+        <w:t xml:space="preserve">            with (folder / '.prepare.lock').open('a') as lock:</w:t>
+      </w:r>
+    </w:p>
+    <w:p>
+      <w:r>
+        <w:t xml:space="preserve">                while True:</w:t>
+      </w:r>
+    </w:p>
+    <w:p>
+      <w:r>
+        <w:t xml:space="preserve">                    if (ident,generation) in cancelled or not folder.exists() or (folder/'.deleting').exists():break</w:t>
+      </w:r>
+    </w:p>
+    <w:p>
+      <w:r>
+        <w:t xml:space="preserve">                    try:</w:t>
+      </w:r>
+    </w:p>
+    <w:p>
+      <w:r>
+        <w:t xml:space="preserve">                        fcntl.flock(lock, fcntl.LOCK_EX | fcntl.LOCK_NB)</w:t>
+      </w:r>
+    </w:p>
+    <w:p>
+      <w:r>
+        <w:t xml:space="preserve">                        fcntl.flock(lock, fcntl.LOCK_UN)</w:t>
+      </w:r>
+    </w:p>
+    <w:p>
+      <w:r>
+        <w:t xml:space="preserve">                        break</w:t>
+      </w:r>
+    </w:p>
+    <w:p>
+      <w:r>
+        <w:t xml:space="preserve">                    except BlockingIOError:time.sleep(.2)</w:t>
+      </w:r>
+    </w:p>
+    <w:p>
+      <w:r>
+        <w:t xml:space="preserve">            with mutex:</w:t>
+      </w:r>
+    </w:p>
+    <w:p>
+      <w:r>
+        <w:t xml:space="preserve">                if (ident,generation) in cancelled or not folder.exists() or (folder/'.deleting').exists():continue</w:t>
+      </w:r>
+    </w:p>
+    <w:p>
+      <w:r>
+        <w:t xml:space="preserve">                log=(folder/'run.log').open('ab')</w:t>
+      </w:r>
+    </w:p>
+    <w:p>
+      <w:r>
+        <w:t xml:space="preserve">                process=subprocess.Popen([str(venv_python(ROOT)),str(ROOT/'reader.py'),</w:t>
+      </w:r>
+    </w:p>
+    <w:p>
+      <w:r>
+        <w:t xml:space="preserve">                     'prepare',url,'--engine',json.loads((folder/'job.json').read_text(encoding="utf-8")).get('engine','qianwen')],</w:t>
+      </w:r>
+    </w:p>
+    <w:p>
+      <w:r>
+        <w:t xml:space="preserve">                     stdout=log,stderr=log,start_new_session=True)</w:t>
+      </w:r>
+    </w:p>
+    <w:p>
+      <w:r>
+        <w:t xml:space="preserve">                active_readers[ident]=(process,generation)</w:t>
+      </w:r>
+    </w:p>
+    <w:p>
+      <w:r>
+        <w:t xml:space="preserve">            result=process.wait();log.close()</w:t>
+      </w:r>
+    </w:p>
+    <w:p>
+      <w:r>
+        <w:t xml:space="preserve">            if result==0:(folder/'run.log').unlink(missing_ok=True)</w:t>
+      </w:r>
+    </w:p>
+    <w:p>
+      <w:r>
+        <w:t xml:space="preserve">        except (OSError, ValueError, subprocess.SubprocessError) as error:</w:t>
+      </w:r>
+    </w:p>
+    <w:p>
+      <w:r>
+        <w:t xml:space="preserve">            record=WORK/'jobs'/ident/'job.json'</w:t>
+      </w:r>
+    </w:p>
+    <w:p>
+      <w:r>
+        <w:t xml:space="preserve">            if record.exists() and (ident,generation) not in cancelled:</w:t>
+      </w:r>
+    </w:p>
+    <w:p>
+      <w:r>
+        <w:t xml:space="preserve">                try:</w:t>
+      </w:r>
+    </w:p>
+    <w:p>
+      <w:r>
+        <w:t xml:space="preserve">                    meta=json.loads(record.read_text(encoding="utf-8"))</w:t>
+      </w:r>
+    </w:p>
+    <w:p>
+      <w:r>
+        <w:t xml:space="preserve">                    meta.update(state='failed',error='后台任务未能启动或任务记录异常：'+str(error))</w:t>
+      </w:r>
+    </w:p>
+    <w:p>
+      <w:r>
+        <w:t xml:space="preserve">                    save_json(record,meta)</w:t>
+      </w:r>
+    </w:p>
+    <w:p>
+      <w:r>
+        <w:t xml:space="preserve">                except (OSError,ValueError):pass</w:t>
+      </w:r>
+    </w:p>
+    <w:p>
+      <w:r>
+        <w:t xml:space="preserve">        finally:</w:t>
+      </w:r>
+    </w:p>
+    <w:p>
+      <w:r>
+        <w:t xml:space="preserve">            if log is not None:log.close()</w:t>
+      </w:r>
+    </w:p>
+    <w:p>
+      <w:r>
+        <w:t xml:space="preserve">            with mutex:</w:t>
+      </w:r>
+    </w:p>
+    <w:p>
+      <w:r>
+        <w:t xml:space="preserve">                if generations.get(ident)==generation:</w:t>
+      </w:r>
+    </w:p>
+    <w:p>
+      <w:r>
+        <w:t xml:space="preserve">                    pending.discard(ident);generations.pop(ident,None)</w:t>
+      </w:r>
+    </w:p>
+    <w:p>
+      <w:r>
+        <w:t xml:space="preserve">                cancelled.discard((ident,generation))</w:t>
+      </w:r>
+    </w:p>
+    <w:p>
+      <w:r>
+        <w:t xml:space="preserve">                if active_readers.get(ident,(None,None))[1]==generation:active_readers.pop(ident,None)</w:t>
+      </w:r>
+    </w:p>
+    <w:p>
+      <w:r>
+        <w:t xml:space="preserve">            tasks.task_done()</w:t>
       </w:r>
     </w:p>
     <w:p/>
     <w:p/>
     <w:p>
       <w:r>
-        <w:t>def delete_task(ident):</w:t>
-      </w:r>
-    </w:p>
-    <w:p>
-      <w:r>
-        <w:t xml:space="preserve">    from task_controls import trash_task, stop_reader</w:t>
-      </w:r>
-    </w:p>
-    <w:p>
-      <w:r>
-        <w:t xml:space="preserve">    with mutex:</w:t>
-      </w:r>
-    </w:p>
-    <w:p>
-      <w:r>
-        <w:t xml:space="preserve">        generation=generations.get(ident)</w:t>
-      </w:r>
-    </w:p>
-    <w:p>
-      <w:r>
-        <w:t xml:space="preserve">        if generation:cancelled.add((ident,generation))</w:t>
-      </w:r>
-    </w:p>
-    <w:p>
-      <w:r>
-        <w:t xml:space="preserve">        process=active_readers.get(ident,(None,None))[0]</w:t>
-      </w:r>
-    </w:p>
-    <w:p>
-      <w:r>
-        <w:t xml:space="preserve">        if process and process.poll() is None:stop_reader(process.pid)</w:t>
-      </w:r>
-    </w:p>
-    <w:p>
-      <w:r>
-        <w:t xml:space="preserve">        folder=WORK/'jobs'/ident</w:t>
-      </w:r>
-    </w:p>
-    <w:p>
-      <w:r>
-        <w:t xml:space="preserve">        (folder/'.deleting').touch()</w:t>
-      </w:r>
-    </w:p>
-    <w:p>
-      <w:r>
-        <w:t xml:space="preserve">        try:</w:t>
-      </w:r>
-    </w:p>
-    <w:p>
-      <w:r>
-        <w:t xml:space="preserve">            # Also stop readers recovered after a web-service restart.</w:t>
-      </w:r>
-    </w:p>
-    <w:p>
-      <w:r>
-        <w:t xml:space="preserve">            from task_controls import reader_pids</w:t>
-      </w:r>
-    </w:p>
-    <w:p>
-      <w:r>
-        <w:t xml:space="preserve">            for pid in reader_pids(ROOT,folder):stop_reader(pid)</w:t>
-      </w:r>
-    </w:p>
-    <w:p>
-      <w:r>
-        <w:t xml:space="preserve">            from runtime_compat import file_lock as fcntl</w:t>
-      </w:r>
-    </w:p>
-    <w:p>
-      <w:r>
-        <w:t xml:space="preserve">            with (folder/'.prepare.lock').open('a') as lock:</w:t>
-      </w:r>
-    </w:p>
-    <w:p>
-      <w:r>
-        <w:t xml:space="preserve">                deadline=time.monotonic()+15</w:t>
-      </w:r>
-    </w:p>
-    <w:p>
-      <w:r>
-        <w:t xml:space="preserve">                while True:</w:t>
-      </w:r>
-    </w:p>
-    <w:p>
-      <w:r>
-        <w:t xml:space="preserve">                    try:fcntl.flock(lock,fcntl.LOCK_EX|fcntl.LOCK_NB);break</w:t>
-      </w:r>
-    </w:p>
-    <w:p>
-      <w:r>
-        <w:t xml:space="preserve">                    except BlockingIOError:</w:t>
-      </w:r>
-    </w:p>
-    <w:p>
-      <w:r>
-        <w:t xml:space="preserve">                        if time.monotonic()&gt;deadline:raise ValueError('任务尚未停止，请稍后重试删除')</w:t>
-      </w:r>
-    </w:p>
-    <w:p>
-      <w:r>
-        <w:t xml:space="preserve">                        time.sleep(.2)</w:t>
-      </w:r>
-    </w:p>
-    <w:p>
-      <w:r>
-        <w:t xml:space="preserve">                result=subprocess.run([str(venv_python(ROOT)),str(ROOT/'qianwen_browser.py'),'delete','--job',ident],capture_output=True,text=True,timeout=120)</w:t>
-      </w:r>
-    </w:p>
-    <w:p>
-      <w:r>
-        <w:t xml:space="preserve">                if result.returncode:raise ValueError('千问同步删除失败，本机任务和文稿已保留：'+(result.stderr.strip().splitlines()[-1] if result.stderr.strip() else '后台浏览器未能完成删除'))</w:t>
-      </w:r>
-    </w:p>
-    <w:p>
-      <w:r>
-        <w:t xml:space="preserve">        except Exception as error:</w:t>
-      </w:r>
-    </w:p>
-    <w:p>
-      <w:r>
-        <w:t xml:space="preserve">            (folder/'.deleting').unlink(missing_ok=True)</w:t>
-      </w:r>
-    </w:p>
-    <w:p>
-      <w:r>
-        <w:t xml:space="preserve">            meta=json.loads((folder/'job.json').read_text(encoding="utf-8"))</w:t>
-      </w:r>
-    </w:p>
-    <w:p>
-      <w:r>
-        <w:t xml:space="preserve">            if meta.get('state') not in ('completed','failed','login_required'):</w:t>
-      </w:r>
-    </w:p>
-    <w:p>
-      <w:r>
-        <w:t xml:space="preserve">                meta.update(state='failed',error='任务已停止，千问同步删除未完成：'+str(error))</w:t>
-      </w:r>
-    </w:p>
-    <w:p>
-      <w:r>
-        <w:t xml:space="preserve">                save_json(folder/'job.json',meta)</w:t>
-      </w:r>
-    </w:p>
-    <w:p>
-      <w:r>
-        <w:t xml:space="preserve">            raise</w:t>
-      </w:r>
-    </w:p>
-    <w:p>
-      <w:r>
-        <w:t xml:space="preserve">        cloud_meta=json.loads((folder/'job.json').read_text(encoding="utf-8"))</w:t>
-      </w:r>
-    </w:p>
-    <w:p>
-      <w:r>
-        <w:t xml:space="preserve">        cloud_status=cloud_meta.get('qianwen_delete_result','deleted' if cloud_meta.get('qianwen_cloud_deleted') else 'failed')</w:t>
-      </w:r>
-    </w:p>
-    <w:p>
-      <w:r>
-        <w:t xml:space="preserve">        result=trash_task(ROOT,WORK,[OUTPUT,OUTPUT.parent/'网页视频转语音识别文字稿（由千问提供支持）',LEGACY_OUTPUT,ROOT/'outputs',OUTPUT.parent/'网页视频转语音文稿'],ident)</w:t>
-      </w:r>
-    </w:p>
-    <w:p>
-      <w:r>
-        <w:t xml:space="preserve">        pending.discard(ident);generations.pop(ident,None)</w:t>
-      </w:r>
-    </w:p>
-    <w:p>
-      <w:r>
-        <w:t xml:space="preserve">        result['deletion_result']=deletion_report(True,cloud_status)</w:t>
-      </w:r>
-    </w:p>
-    <w:p>
-      <w:r>
-        <w:t xml:space="preserve">        result['message']=result['deletion_result']['message']</w:t>
-      </w:r>
-    </w:p>
-    <w:p>
-      <w:r>
-        <w:t xml:space="preserve">        return result</w:t>
+        <w:t>def deletion_report(success, cloud_status, error=''):</w:t>
+      </w:r>
+    </w:p>
+    <w:p>
+      <w:r>
+        <w:t xml:space="preserve">    cloud={'deleted':'删除成功','not_uploaded':'无需删除：此任务未上传到千问',</w:t>
+      </w:r>
+    </w:p>
+    <w:p>
+      <w:r>
+        <w:t xml:space="preserve">           'not_found':'未找到对应千问记录，未执行云端删除；本机清理按成功处理'}</w:t>
+      </w:r>
+    </w:p>
+    <w:p>
+      <w:r>
+        <w:t xml:space="preserve">    local='删除成功' if success else '未删除成功，任务已保留'</w:t>
+      </w:r>
+    </w:p>
+    <w:p>
+      <w:r>
+        <w:t xml:space="preserve">    files='删除成功（已移入废纸篓）' if success else ('未全部删除成功，请检查并重试' if cloud_status in cloud else '未执行删除，文件已保留')</w:t>
+      </w:r>
+    </w:p>
+    <w:p>
+      <w:r>
+        <w:t xml:space="preserve">    elements=[{'label':'工具任务列表记录','detail':local,'status':'success' if success else 'failed'},</w:t>
+      </w:r>
+    </w:p>
+    <w:p>
+      <w:r>
+        <w:t xml:space="preserve">              {'label':'本机文稿及任务文件','detail':files,'status':'success' if success else 'failed'},</w:t>
+      </w:r>
+    </w:p>
+    <w:p>
+      <w:r>
+        <w:t xml:space="preserve">              {'label':'对应的千问记录','detail':cloud.get(cloud_status,'删除失败：'+error),'status':'success' if cloud_status in cloud else 'failed'}]</w:t>
+      </w:r>
+    </w:p>
+    <w:p>
+      <w:r>
+        <w:t xml:space="preserve">    message=('删除成功' if success else '删除失败')+'\n'+'\n'.join(e['label']+'：'+e['detail'] for e in elements)</w:t>
+      </w:r>
+    </w:p>
+    <w:p>
+      <w:r>
+        <w:t xml:space="preserve">    if not success and cloud_status in cloud:message+='\n失败原因：'+error</w:t>
+      </w:r>
+    </w:p>
+    <w:p>
+      <w:r>
+        <w:t xml:space="preserve">    return {'status':'success' if success else 'failed','message':message,'elements':elements,'at':time.time()}</w:t>
       </w:r>
     </w:p>
     <w:p/>
     <w:p/>
     <w:p>
       <w:r>
-        <w:t>auth_check_process = None</w:t>
-      </w:r>
-    </w:p>
-    <w:p>
-      <w:r>
-        <w:t>auth_check_started = 0</w:t>
-      </w:r>
-    </w:p>
-    <w:p/>
-    <w:p>
-      <w:r>
-        <w:t>def login_status():</w:t>
-      </w:r>
-    </w:p>
-    <w:p>
-      <w:r>
-        <w:t xml:space="preserve">    global auth_check_process,auth_check_started</w:t>
-      </w:r>
-    </w:p>
-    <w:p>
-      <w:r>
-        <w:t xml:space="preserve">    if time.time()-auth_check_started&gt;60 and (auth_check_process is None or auth_check_process.poll() is not None) and not (login_process and login_process.poll() is None):</w:t>
-      </w:r>
-    </w:p>
-    <w:p>
-      <w:r>
-        <w:t xml:space="preserve">        auth_check_started=time.time()</w:t>
-      </w:r>
-    </w:p>
-    <w:p>
-      <w:r>
-        <w:t xml:space="preserve">        with (WORK/"qianwen-auth-check.log").open("ab") as log:</w:t>
-      </w:r>
-    </w:p>
-    <w:p>
-      <w:r>
-        <w:t xml:space="preserve">            auth_check_process=subprocess.Popen([str(venv_python(ROOT)),str(ROOT/"qianwen_browser.py"),"check-auth"],stdout=log,stderr=log,start_new_session=True)</w:t>
-      </w:r>
-    </w:p>
-    <w:p>
-      <w:r>
-        <w:t xml:space="preserve">    path=WORK/'qianwen-auth.json'</w:t>
-      </w:r>
-    </w:p>
-    <w:p>
-      <w:r>
-        <w:t xml:space="preserve">    state=json.loads(path.read_text(encoding="utf-8")) if path.exists() else {'status':'unknown'}</w:t>
-      </w:r>
-    </w:p>
-    <w:p>
-      <w:r>
-        <w:t xml:space="preserve">    if not state.get('last_success'):</w:t>
-      </w:r>
-    </w:p>
-    <w:p>
-      <w:r>
-        <w:t xml:space="preserve">        successes=[item.get('added_at',0) for item in list_jobs() if item.get('state')=='completed' and item.get('model')=='qianwen-web']</w:t>
-      </w:r>
-    </w:p>
-    <w:p>
-      <w:r>
-        <w:t xml:space="preserve">        if successes:state['last_success']=max(successes)</w:t>
-      </w:r>
-    </w:p>
-    <w:p>
-      <w:r>
-        <w:t xml:space="preserve">    state['window_open']=bool(login_process and login_process.poll() is None)</w:t>
-      </w:r>
-    </w:p>
-    <w:p>
-      <w:r>
-        <w:t xml:space="preserve">    result_path=WORK/'qianwen-login-result.json'</w:t>
-      </w:r>
-    </w:p>
-    <w:p>
-      <w:r>
-        <w:t xml:space="preserve">    if login_process and login_process.poll() not in (None,0):</w:t>
-      </w:r>
-    </w:p>
-    <w:p>
-      <w:r>
-        <w:t xml:space="preserve">        result=json.loads(result_path.read_text(encoding='utf-8')) if result_path.exists() else {}</w:t>
-      </w:r>
-    </w:p>
-    <w:p>
-      <w:r>
-        <w:t xml:space="preserve">        state['error']=result.get('error','千问登录窗口未能打开，请重试；若仍失败请检查登录错误记录。')</w:t>
-      </w:r>
-    </w:p>
-    <w:p>
-      <w:r>
-        <w:t xml:space="preserve">    return state</w:t>
+        <w:t>def delete_task(ident):</w:t>
+      </w:r>
+    </w:p>
+    <w:p>
+      <w:r>
+        <w:t xml:space="preserve">    from task_controls import trash_task, stop_reader</w:t>
+      </w:r>
+    </w:p>
+    <w:p>
+      <w:r>
+        <w:t xml:space="preserve">    with mutex:</w:t>
+      </w:r>
+    </w:p>
+    <w:p>
+      <w:r>
+        <w:t xml:space="preserve">        generation=generations.get(ident)</w:t>
+      </w:r>
+    </w:p>
+    <w:p>
+      <w:r>
+        <w:t xml:space="preserve">        if generation:cancelled.add((ident,generation))</w:t>
+      </w:r>
+    </w:p>
+    <w:p>
+      <w:r>
+        <w:t xml:space="preserve">        process=active_readers.get(ident,(None,None))[0]</w:t>
+      </w:r>
+    </w:p>
+    <w:p>
+      <w:r>
+        <w:t xml:space="preserve">        if process and process.poll() is None:stop_reader(process.pid)</w:t>
+      </w:r>
+    </w:p>
+    <w:p>
+      <w:r>
+        <w:t xml:space="preserve">        folder=WORK/'jobs'/ident</w:t>
+      </w:r>
+    </w:p>
+    <w:p>
+      <w:r>
+        <w:t xml:space="preserve">        (folder/'.deleting').touch()</w:t>
+      </w:r>
+    </w:p>
+    <w:p>
+      <w:r>
+        <w:t xml:space="preserve">        try:</w:t>
+      </w:r>
+    </w:p>
+    <w:p>
+      <w:r>
+        <w:t xml:space="preserve">            # Also stop readers recovered after a web-service restart.</w:t>
+      </w:r>
+    </w:p>
+    <w:p>
+      <w:r>
+        <w:t xml:space="preserve">            from task_controls import reader_pids</w:t>
+      </w:r>
+    </w:p>
+    <w:p>
+      <w:r>
+        <w:t xml:space="preserve">            for pid in reader_pids(ROOT,folder):stop_reader(pid)</w:t>
+      </w:r>
+    </w:p>
+    <w:p>
+      <w:r>
+        <w:t xml:space="preserve">            from runtime_compat import file_lock as fcntl</w:t>
+      </w:r>
+    </w:p>
+    <w:p>
+      <w:r>
+        <w:t xml:space="preserve">            with (folder/'.prepare.lock').open('a') as lock:</w:t>
+      </w:r>
+    </w:p>
+    <w:p>
+      <w:r>
+        <w:t xml:space="preserve">                deadline=time.monotonic()+15</w:t>
+      </w:r>
+    </w:p>
+    <w:p>
+      <w:r>
+        <w:t xml:space="preserve">                while True:</w:t>
+      </w:r>
+    </w:p>
+    <w:p>
+      <w:r>
+        <w:t xml:space="preserve">                    try:fcntl.flock(lock,fcntl.LOCK_EX|fcntl.LOCK_NB);break</w:t>
+      </w:r>
+    </w:p>
+    <w:p>
+      <w:r>
+        <w:t xml:space="preserve">                    except BlockingIOError:</w:t>
+      </w:r>
+    </w:p>
+    <w:p>
+      <w:r>
+        <w:t xml:space="preserve">                        if time.monotonic()&gt;deadline:raise ValueError('任务尚未停止，请稍后重试删除')</w:t>
+      </w:r>
+    </w:p>
+    <w:p>
+      <w:r>
+        <w:t xml:space="preserve">                        time.sleep(.2)</w:t>
+      </w:r>
+    </w:p>
+    <w:p>
+      <w:r>
+        <w:t xml:space="preserve">                result=subprocess.run([str(venv_python(ROOT)),str(ROOT/'qianwen_browser.py'),'delete','--job',ident],capture_output=True,text=True,timeout=120)</w:t>
+      </w:r>
+    </w:p>
+    <w:p>
+      <w:r>
+        <w:t xml:space="preserve">                if result.returncode:raise ValueError('千问同步删除失败，本机任务和文稿已保留：'+(result.stderr.strip().splitlines()[-1] if result.stderr.strip() else '后台浏览器未能完成删除'))</w:t>
+      </w:r>
+    </w:p>
+    <w:p>
+      <w:r>
+        <w:t xml:space="preserve">        except Exception as error:</w:t>
+      </w:r>
+    </w:p>
+    <w:p>
+      <w:r>
+        <w:t xml:space="preserve">            (folder/'.deleting').unlink(missing_ok=True)</w:t>
+      </w:r>
+    </w:p>
+    <w:p>
+      <w:r>
+        <w:t xml:space="preserve">            meta=json.loads((folder/'job.json').read_text(encoding="utf-8"))</w:t>
+      </w:r>
+    </w:p>
+    <w:p>
+      <w:r>
+        <w:t xml:space="preserve">            if meta.get('state') not in ('completed','failed','login_required'):</w:t>
+      </w:r>
+    </w:p>
+    <w:p>
+      <w:r>
+        <w:t xml:space="preserve">                meta.update(state='failed',error='任务已停止，千问同步删除未完成：'+str(error))</w:t>
+      </w:r>
+    </w:p>
+    <w:p>
+      <w:r>
+        <w:t xml:space="preserve">                save_json(folder/'job.json',meta)</w:t>
+      </w:r>
+    </w:p>
+    <w:p>
+      <w:r>
+        <w:t xml:space="preserve">            raise</w:t>
+      </w:r>
+    </w:p>
+    <w:p>
+      <w:r>
+        <w:t xml:space="preserve">        cloud_meta=json.loads((folder/'job.json').read_text(encoding="utf-8"))</w:t>
+      </w:r>
+    </w:p>
+    <w:p>
+      <w:r>
+        <w:t xml:space="preserve">        cloud_status=cloud_meta.get('qianwen_delete_result','deleted' if cloud_meta.get('qianwen_cloud_deleted') else 'failed')</w:t>
+      </w:r>
+    </w:p>
+    <w:p>
+      <w:r>
+        <w:t xml:space="preserve">        result=trash_task(ROOT,WORK,[OUTPUT,OUTPUT.parent/'网页视频转语音识别文字稿（由千问提供支持）',LEGACY_OUTPUT,ROOT/'outputs',OUTPUT.parent/'网页视频转语音文稿'],ident)</w:t>
+      </w:r>
+    </w:p>
+    <w:p>
+      <w:r>
+        <w:t xml:space="preserve">        pending.discard(ident);generations.pop(ident,None)</w:t>
+      </w:r>
+    </w:p>
+    <w:p>
+      <w:r>
+        <w:t xml:space="preserve">        result['deletion_result']=deletion_report(True,cloud_status)</w:t>
+      </w:r>
+    </w:p>
+    <w:p>
+      <w:r>
+        <w:t xml:space="preserve">        result['message']=result['deletion_result']['message']</w:t>
+      </w:r>
+    </w:p>
+    <w:p>
+      <w:r>
+        <w:t xml:space="preserve">        return result</w:t>
       </w:r>
     </w:p>
     <w:p/>
     <w:p/>
     <w:p>
       <w:r>
-        <w:t>def open_login():</w:t>
-      </w:r>
-    </w:p>
-    <w:p>
-      <w:r>
-        <w:t xml:space="preserve">    global login_process</w:t>
-      </w:r>
-    </w:p>
-    <w:p>
-      <w:r>
-        <w:t xml:space="preserve">    with mutex:</w:t>
-      </w:r>
-    </w:p>
-    <w:p>
-      <w:r>
-        <w:t xml:space="preserve">        if login_process and login_process.poll() is None:return {'ok':True,'message':'登录窗口已经打开。'}</w:t>
-      </w:r>
-    </w:p>
-    <w:p>
-      <w:r>
-        <w:t xml:space="preserve">        (WORK/'qianwen-login-result.json').unlink(missing_ok=True)</w:t>
-      </w:r>
-    </w:p>
-    <w:p>
-      <w:r>
-        <w:t xml:space="preserve">        with (WORK/'qianwen-login.log').open('ab') as log:</w:t>
-      </w:r>
-    </w:p>
-    <w:p>
-      <w:r>
-        <w:t xml:space="preserve">            login_process=subprocess.Popen([str(venv_python(ROOT)),str(ROOT/'qianwen_browser.py'),'login-ui'],</w:t>
-      </w:r>
-    </w:p>
-    <w:p>
-      <w:r>
-        <w:t xml:space="preserve">                                           stdin=subprocess.DEVNULL,stdout=log,stderr=log,start_new_session=True)</w:t>
-      </w:r>
-    </w:p>
-    <w:p>
-      <w:r>
-        <w:t xml:space="preserve">    return {'ok':True,'message':'正在打开千问登录窗口；登录完成后关闭该窗口即可。'}</w:t>
+        <w:t>auth_check_process = None</w:t>
+      </w:r>
+    </w:p>
+    <w:p>
+      <w:r>
+        <w:t>auth_check_started = 0</w:t>
+      </w:r>
+    </w:p>
+    <w:p/>
+    <w:p>
+      <w:r>
+        <w:t>def login_status():</w:t>
+      </w:r>
+    </w:p>
+    <w:p>
+      <w:r>
+        <w:t xml:space="preserve">    global auth_check_process,auth_check_started</w:t>
+      </w:r>
+    </w:p>
+    <w:p>
+      <w:r>
+        <w:t xml:space="preserve">    if time.time()-auth_check_started&gt;60 and (auth_check_process is None or auth_check_process.poll() is not None) and not (login_process and login_process.poll() is None):</w:t>
+      </w:r>
+    </w:p>
+    <w:p>
+      <w:r>
+        <w:t xml:space="preserve">        auth_check_started=time.time()</w:t>
+      </w:r>
+    </w:p>
+    <w:p>
+      <w:r>
+        <w:t xml:space="preserve">        with (WORK/"qianwen-auth-check.log").open("ab") as log:</w:t>
+      </w:r>
+    </w:p>
+    <w:p>
+      <w:r>
+        <w:t xml:space="preserve">            auth_check_process=subprocess.Popen([str(venv_python(ROOT)),str(ROOT/"qianwen_browser.py"),"check-auth"],stdout=log,stderr=log,start_new_session=True)</w:t>
+      </w:r>
+    </w:p>
+    <w:p>
+      <w:r>
+        <w:t xml:space="preserve">    path=WORK/'qianwen-auth.json'</w:t>
+      </w:r>
+    </w:p>
+    <w:p>
+      <w:r>
+        <w:t xml:space="preserve">    state=json.loads(path.read_text(encoding="utf-8")) if path.exists() else {'status':'unknown'}</w:t>
+      </w:r>
+    </w:p>
+    <w:p>
+      <w:r>
+        <w:t xml:space="preserve">    if not state.get('last_success'):</w:t>
+      </w:r>
+    </w:p>
+    <w:p>
+      <w:r>
+        <w:t xml:space="preserve">        successes=[item.get('added_at',0) for item in list_jobs() if item.get('state')=='completed' and item.get('model')=='qianwen-web']</w:t>
+      </w:r>
+    </w:p>
+    <w:p>
+      <w:r>
+        <w:t xml:space="preserve">        if successes:state['last_success']=max(successes)</w:t>
+      </w:r>
+    </w:p>
+    <w:p>
+      <w:r>
+        <w:t xml:space="preserve">    state['window_open']=bool(login_process and login_process.poll() is None)</w:t>
+      </w:r>
+    </w:p>
+    <w:p>
+      <w:r>
+        <w:t xml:space="preserve">    result_path=WORK/'qianwen-login-result.json'</w:t>
+      </w:r>
+    </w:p>
+    <w:p>
+      <w:r>
+        <w:t xml:space="preserve">    if login_process and login_process.poll() not in (None,0):</w:t>
+      </w:r>
+    </w:p>
+    <w:p>
+      <w:r>
+        <w:t xml:space="preserve">        result=json.loads(result_path.read_text(encoding='utf-8')) if result_path.exists() else {}</w:t>
+      </w:r>
+    </w:p>
+    <w:p>
+      <w:r>
+        <w:t xml:space="preserve">        state['error']=result.get('error','千问登录窗口未能打开，请重试；若仍失败请检查登录错误记录。')</w:t>
+      </w:r>
+    </w:p>
+    <w:p>
+      <w:r>
+        <w:t xml:space="preserve">    return state</w:t>
       </w:r>
     </w:p>
     <w:p/>
     <w:p/>
     <w:p>
       <w:r>
-        <w:t>def enqueue(url, engine="qianwen"):</w:t>
-      </w:r>
-    </w:p>
-    <w:p>
-      <w:r>
-        <w:t xml:space="preserve">    if engine != "qianwen":</w:t>
-      </w:r>
-    </w:p>
-    <w:p>
-      <w:r>
-        <w:t xml:space="preserve">        raise ValueError("不支持的语音识别方式")</w:t>
-      </w:r>
-    </w:p>
-    <w:p>
-      <w:r>
-        <w:t xml:space="preserve">    ident = hashlib.sha256(url.encode()).hexdigest()[:12]</w:t>
-      </w:r>
-    </w:p>
-    <w:p>
-      <w:r>
-        <w:t xml:space="preserve">    local = url.startswith('local://') and (WORK/'jobs'/ident/'job.json').is_file()</w:t>
-      </w:r>
-    </w:p>
-    <w:p>
-      <w:r>
-        <w:t xml:space="preserve">    if not local and (urlparse(url).scheme not in ('http', 'https') or not urlparse(url).hostname):</w:t>
-      </w:r>
-    </w:p>
-    <w:p>
-      <w:r>
-        <w:t xml:space="preserve">        raise ValueError('请输入完整的 HTTP/HTTPS 视频页面链接')</w:t>
-      </w:r>
-    </w:p>
-    <w:p>
-      <w:r>
-        <w:t xml:space="preserve">    ident = hashlib.sha256(url.encode()).hexdigest()[:12]</w:t>
-      </w:r>
-    </w:p>
-    <w:p>
-      <w:r>
-        <w:t xml:space="preserve">    folder = WORK / 'jobs' / ident</w:t>
-      </w:r>
-    </w:p>
-    <w:p>
-      <w:r>
-        <w:t xml:space="preserve">    folder.mkdir(parents=True, exist_ok=True)</w:t>
+        <w:t>def open_login():</w:t>
+      </w:r>
+    </w:p>
+    <w:p>
+      <w:r>
+        <w:t xml:space="preserve">    global login_process</w:t>
       </w:r>
     </w:p>
     <w:p>
@@ -2377,281 +2333,368 @@
     </w:p>
     <w:p>
       <w:r>
-        <w:t xml:space="preserve">        if ident in pending:</w:t>
-      </w:r>
-    </w:p>
-    <w:p>
-      <w:r>
-        <w:t xml:space="preserve">            return ident</w:t>
-      </w:r>
-    </w:p>
-    <w:p>
-      <w:r>
-        <w:t xml:space="preserve">        meta = json.loads((folder / 'job.json').read_text(encoding="utf-8")) if (folder / 'job.json').exists() else {}</w:t>
-      </w:r>
-    </w:p>
-    <w:p>
-      <w:r>
-        <w:t xml:space="preserve">        if meta.get('state') == 'completed' and Path(meta.get('document', '/nonexistent')).is_file():</w:t>
-      </w:r>
-    </w:p>
-    <w:p>
-      <w:r>
-        <w:t xml:space="preserve">            return ident</w:t>
-      </w:r>
-    </w:p>
-    <w:p>
-      <w:r>
-        <w:t xml:space="preserve">        from runtime_compat import file_lock as fcntl</w:t>
-      </w:r>
-    </w:p>
-    <w:p>
-      <w:r>
-        <w:t xml:space="preserve">        with (folder / '.prepare.lock').open('a') as lock:</w:t>
-      </w:r>
-    </w:p>
-    <w:p>
-      <w:r>
-        <w:t xml:space="preserve">            try:</w:t>
-      </w:r>
-    </w:p>
-    <w:p>
-      <w:r>
-        <w:t xml:space="preserve">                fcntl.flock(lock, fcntl.LOCK_EX | fcntl.LOCK_NB)</w:t>
-      </w:r>
-    </w:p>
-    <w:p>
-      <w:r>
-        <w:t xml:space="preserve">            except BlockingIOError:</w:t>
-      </w:r>
-    </w:p>
-    <w:p>
-      <w:r>
-        <w:t xml:space="preserve">                return ident</w:t>
-      </w:r>
-    </w:p>
-    <w:p>
-      <w:r>
-        <w:t xml:space="preserve">            (folder/'.deleting').unlink(missing_ok=True)</w:t>
-      </w:r>
-    </w:p>
-    <w:p>
-      <w:r>
-        <w:t xml:space="preserve">            meta.setdefault('created_at', task_created_at(folder))</w:t>
-      </w:r>
-    </w:p>
-    <w:p>
-      <w:r>
-        <w:t xml:space="preserve">            meta.update(url=url, state='queued', engine=engine)</w:t>
-      </w:r>
-    </w:p>
-    <w:p>
-      <w:r>
-        <w:t xml:space="preserve">            meta.pop('error', None)</w:t>
-      </w:r>
-    </w:p>
-    <w:p>
-      <w:r>
-        <w:t xml:space="preserve">            save_json(folder / 'job.json', meta)</w:t>
-      </w:r>
-    </w:p>
-    <w:p>
-      <w:r>
-        <w:t xml:space="preserve">            from task_numbering import numbers</w:t>
-      </w:r>
-    </w:p>
-    <w:p>
-      <w:r>
-        <w:t xml:space="preserve">            numbers(WORK)</w:t>
-      </w:r>
-    </w:p>
-    <w:p>
-      <w:r>
-        <w:t xml:space="preserve">        pending.add(ident)</w:t>
-      </w:r>
-    </w:p>
-    <w:p>
-      <w:r>
-        <w:t xml:space="preserve">        generation=__import__('uuid').uuid4().hex</w:t>
-      </w:r>
-    </w:p>
-    <w:p>
-      <w:r>
-        <w:t xml:space="preserve">        generations[ident]=generation</w:t>
-      </w:r>
-    </w:p>
-    <w:p>
-      <w:r>
-        <w:t xml:space="preserve">        tasks.put((ident, url, generation))</w:t>
-      </w:r>
-    </w:p>
-    <w:p>
-      <w:r>
-        <w:t xml:space="preserve">        if not meta.get('title') and not local:</w:t>
-      </w:r>
-    </w:p>
-    <w:p>
-      <w:r>
-        <w:t xml:space="preserve">            start_title_lookup(ident, url)</w:t>
-      </w:r>
-    </w:p>
-    <w:p>
-      <w:r>
-        <w:t xml:space="preserve">    return ident</w:t>
+        <w:t xml:space="preserve">        if login_process and login_process.poll() is None:return {'ok':True,'message':'登录窗口已经打开。'}</w:t>
+      </w:r>
+    </w:p>
+    <w:p>
+      <w:r>
+        <w:t xml:space="preserve">        (WORK/'qianwen-login-result.json').unlink(missing_ok=True)</w:t>
+      </w:r>
+    </w:p>
+    <w:p>
+      <w:r>
+        <w:t xml:space="preserve">        with (WORK/'qianwen-login.log').open('ab') as log:</w:t>
+      </w:r>
+    </w:p>
+    <w:p>
+      <w:r>
+        <w:t xml:space="preserve">            login_process=subprocess.Popen([str(venv_python(ROOT)),str(ROOT/'qianwen_browser.py'),'login-ui'],</w:t>
+      </w:r>
+    </w:p>
+    <w:p>
+      <w:r>
+        <w:t xml:space="preserve">                                           stdin=subprocess.DEVNULL,stdout=log,stderr=log,start_new_session=True)</w:t>
+      </w:r>
+    </w:p>
+    <w:p>
+      <w:r>
+        <w:t xml:space="preserve">    return {'ok':True,'message':'正在打开千问登录窗口；登录完成后关闭该窗口即可。'}</w:t>
       </w:r>
     </w:p>
     <w:p/>
     <w:p/>
     <w:p>
       <w:r>
-        <w:t>MEDIA_EXTENSIONS={'.mp4','.mov','.mkv','.webm','.avi','.wmv','.m4v','.flv','.mp3','.wav','.m4a','.aac','.ogg','.flac','.aiff','.wma','.amr','.mpeg','.mpg','.opus'}</w:t>
-      </w:r>
-    </w:p>
-    <w:p/>
-    <w:p>
-      <w:r>
-        <w:t>def receive_upload(stream, length, original_name):</w:t>
-      </w:r>
-    </w:p>
-    <w:p>
-      <w:r>
-        <w:t xml:space="preserve">    """Stream a browser-selected file into an isolated task; never move the user's original."""</w:t>
-      </w:r>
-    </w:p>
-    <w:p>
-      <w:r>
-        <w:t xml:space="preserve">    import uuid, shutil</w:t>
-      </w:r>
-    </w:p>
-    <w:p>
-      <w:r>
-        <w:t xml:space="preserve">    from reader import filename</w:t>
-      </w:r>
-    </w:p>
-    <w:p>
-      <w:r>
-        <w:t xml:space="preserve">    name=Path(original_name.replace('\\','/')).name</w:t>
-      </w:r>
-    </w:p>
-    <w:p>
-      <w:r>
-        <w:t xml:space="preserve">    if Path(name).suffix.lower() not in MEDIA_EXTENSIONS:</w:t>
-      </w:r>
-    </w:p>
-    <w:p>
-      <w:r>
-        <w:t xml:space="preserve">        raise ValueError('请选择支持的音频或视频文件')</w:t>
-      </w:r>
-    </w:p>
-    <w:p>
-      <w:r>
-        <w:t xml:space="preserve">    if not 0 &lt; length &lt;= 6_000_000_000:</w:t>
-      </w:r>
-    </w:p>
-    <w:p>
-      <w:r>
-        <w:t xml:space="preserve">        raise ValueError('文件为空或超过 6GB')</w:t>
-      </w:r>
-    </w:p>
-    <w:p>
-      <w:r>
-        <w:t xml:space="preserve">    url='local://'+uuid.uuid4().hex</w:t>
-      </w:r>
-    </w:p>
-    <w:p>
-      <w:r>
-        <w:t xml:space="preserve">    ident=hashlib.sha256(url.encode()).hexdigest()[:12]</w:t>
-      </w:r>
-    </w:p>
-    <w:p>
-      <w:r>
-        <w:t xml:space="preserve">    folder=WORK/'jobs'/ident</w:t>
-      </w:r>
-    </w:p>
-    <w:p>
-      <w:r>
-        <w:t xml:space="preserve">    media=folder/'media';media.mkdir(parents=True)</w:t>
-      </w:r>
-    </w:p>
-    <w:p>
-      <w:r>
-        <w:t xml:space="preserve">    target=media/(filename(Path(name).stem)+Path(name).suffix.lower())</w:t>
-      </w:r>
-    </w:p>
-    <w:p>
-      <w:r>
-        <w:t xml:space="preserve">    try:</w:t>
-      </w:r>
-    </w:p>
-    <w:p>
-      <w:r>
-        <w:t xml:space="preserve">        remaining=length</w:t>
-      </w:r>
-    </w:p>
-    <w:p>
-      <w:r>
-        <w:t xml:space="preserve">        with target.open('wb') as output:</w:t>
-      </w:r>
-    </w:p>
-    <w:p>
-      <w:r>
-        <w:t xml:space="preserve">            while remaining:</w:t>
-      </w:r>
-    </w:p>
-    <w:p>
-      <w:r>
-        <w:t xml:space="preserve">                chunk=stream.read(min(1024*1024,remaining))</w:t>
-      </w:r>
-    </w:p>
-    <w:p>
-      <w:r>
-        <w:t xml:space="preserve">                if not chunk:raise ValueError('文件上传中断，请重新选择并提交')</w:t>
-      </w:r>
-    </w:p>
-    <w:p>
-      <w:r>
-        <w:t xml:space="preserve">                output.write(chunk);remaining-=len(chunk)</w:t>
-      </w:r>
-    </w:p>
-    <w:p>
-      <w:r>
-        <w:t xml:space="preserve">        save_json(folder/'job.json',{'url':url,'source_kind':'local','source_label':'本地上传文件：'+name,</w:t>
-      </w:r>
-    </w:p>
-    <w:p>
-      <w:r>
-        <w:t xml:space="preserve">            'title':Path(name).stem,'name':filename(Path(name).stem),'media':str(target),</w:t>
-      </w:r>
-    </w:p>
-    <w:p>
-      <w:r>
-        <w:t xml:space="preserve">            'state':'queued','engine':'qianwen','created_at':time.time()})</w:t>
-      </w:r>
-    </w:p>
-    <w:p>
-      <w:r>
-        <w:t xml:space="preserve">        return enqueue(url)</w:t>
-      </w:r>
-    </w:p>
-    <w:p>
-      <w:r>
-        <w:t xml:space="preserve">    except Exception:</w:t>
-      </w:r>
-    </w:p>
-    <w:p>
-      <w:r>
-        <w:t xml:space="preserve">        shutil.rmtree(folder,ignore_errors=True)</w:t>
-      </w:r>
-    </w:p>
-    <w:p>
-      <w:r>
-        <w:t xml:space="preserve">        raise</w:t>
+        <w:t>def enqueue(url, engine="qianwen"):</w:t>
+      </w:r>
+    </w:p>
+    <w:p>
+      <w:r>
+        <w:t xml:space="preserve">    if engine != "qianwen":</w:t>
+      </w:r>
+    </w:p>
+    <w:p>
+      <w:r>
+        <w:t xml:space="preserve">        raise ValueError("不支持的语音识别方式")</w:t>
+      </w:r>
+    </w:p>
+    <w:p>
+      <w:r>
+        <w:t xml:space="preserve">    ident = hashlib.sha256(url.encode()).hexdigest()[:12]</w:t>
+      </w:r>
+    </w:p>
+    <w:p>
+      <w:r>
+        <w:t xml:space="preserve">    local = url.startswith('local://') and (WORK/'jobs'/ident/'job.json').is_file()</w:t>
+      </w:r>
+    </w:p>
+    <w:p>
+      <w:r>
+        <w:t xml:space="preserve">    if not local and (urlparse(url).scheme not in ('http', 'https') or not urlparse(url).hostname):</w:t>
+      </w:r>
+    </w:p>
+    <w:p>
+      <w:r>
+        <w:t xml:space="preserve">        raise ValueError('请输入完整的 HTTP/HTTPS 视频页面链接')</w:t>
+      </w:r>
+    </w:p>
+    <w:p>
+      <w:r>
+        <w:t xml:space="preserve">    ident = hashlib.sha256(url.encode()).hexdigest()[:12]</w:t>
+      </w:r>
+    </w:p>
+    <w:p>
+      <w:r>
+        <w:t xml:space="preserve">    folder = WORK / 'jobs' / ident</w:t>
+      </w:r>
+    </w:p>
+    <w:p>
+      <w:r>
+        <w:t xml:space="preserve">    folder.mkdir(parents=True, exist_ok=True)</w:t>
+      </w:r>
+    </w:p>
+    <w:p>
+      <w:r>
+        <w:t xml:space="preserve">    with mutex:</w:t>
+      </w:r>
+    </w:p>
+    <w:p>
+      <w:r>
+        <w:t xml:space="preserve">        if ident in pending:</w:t>
+      </w:r>
+    </w:p>
+    <w:p>
+      <w:r>
+        <w:t xml:space="preserve">            return ident</w:t>
+      </w:r>
+    </w:p>
+    <w:p>
+      <w:r>
+        <w:t xml:space="preserve">        meta = json.loads((folder / 'job.json').read_text(encoding="utf-8")) if (folder / 'job.json').exists() else {}</w:t>
+      </w:r>
+    </w:p>
+    <w:p>
+      <w:r>
+        <w:t xml:space="preserve">        if meta.get('state') == 'completed' and Path(meta.get('document', '/nonexistent')).is_file():</w:t>
+      </w:r>
+    </w:p>
+    <w:p>
+      <w:r>
+        <w:t xml:space="preserve">            return ident</w:t>
+      </w:r>
+    </w:p>
+    <w:p>
+      <w:r>
+        <w:t xml:space="preserve">        from runtime_compat import file_lock as fcntl</w:t>
+      </w:r>
+    </w:p>
+    <w:p>
+      <w:r>
+        <w:t xml:space="preserve">        with (folder / '.prepare.lock').open('a') as lock:</w:t>
+      </w:r>
+    </w:p>
+    <w:p>
+      <w:r>
+        <w:t xml:space="preserve">            try:</w:t>
+      </w:r>
+    </w:p>
+    <w:p>
+      <w:r>
+        <w:t xml:space="preserve">                fcntl.flock(lock, fcntl.LOCK_EX | fcntl.LOCK_NB)</w:t>
+      </w:r>
+    </w:p>
+    <w:p>
+      <w:r>
+        <w:t xml:space="preserve">            except BlockingIOError:</w:t>
+      </w:r>
+    </w:p>
+    <w:p>
+      <w:r>
+        <w:t xml:space="preserve">                return ident</w:t>
+      </w:r>
+    </w:p>
+    <w:p>
+      <w:r>
+        <w:t xml:space="preserve">            (folder/'.deleting').unlink(missing_ok=True)</w:t>
+      </w:r>
+    </w:p>
+    <w:p>
+      <w:r>
+        <w:t xml:space="preserve">            meta.setdefault('created_at', task_created_at(folder))</w:t>
+      </w:r>
+    </w:p>
+    <w:p>
+      <w:r>
+        <w:t xml:space="preserve">            meta.update(url=url, state='queued', engine=engine)</w:t>
+      </w:r>
+    </w:p>
+    <w:p>
+      <w:r>
+        <w:t xml:space="preserve">            meta.pop('error', None)</w:t>
+      </w:r>
+    </w:p>
+    <w:p>
+      <w:r>
+        <w:t xml:space="preserve">            save_json(folder / 'job.json', meta)</w:t>
+      </w:r>
+    </w:p>
+    <w:p>
+      <w:r>
+        <w:t xml:space="preserve">            from task_numbering import numbers</w:t>
+      </w:r>
+    </w:p>
+    <w:p>
+      <w:r>
+        <w:t xml:space="preserve">            numbers(WORK)</w:t>
+      </w:r>
+    </w:p>
+    <w:p>
+      <w:r>
+        <w:t xml:space="preserve">        pending.add(ident)</w:t>
+      </w:r>
+    </w:p>
+    <w:p>
+      <w:r>
+        <w:t xml:space="preserve">        generation=__import__('uuid').uuid4().hex</w:t>
+      </w:r>
+    </w:p>
+    <w:p>
+      <w:r>
+        <w:t xml:space="preserve">        generations[ident]=generation</w:t>
+      </w:r>
+    </w:p>
+    <w:p>
+      <w:r>
+        <w:t xml:space="preserve">        tasks.put((ident, url, generation))</w:t>
+      </w:r>
+    </w:p>
+    <w:p>
+      <w:r>
+        <w:t xml:space="preserve">        if not meta.get('title') and not local:</w:t>
+      </w:r>
+    </w:p>
+    <w:p>
+      <w:r>
+        <w:t xml:space="preserve">            start_title_lookup(ident, url)</w:t>
+      </w:r>
+    </w:p>
+    <w:p>
+      <w:r>
+        <w:t xml:space="preserve">    return ident</w:t>
       </w:r>
     </w:p>
     <w:p/>
     <w:p/>
     <w:p>
       <w:r>
+        <w:t>MEDIA_EXTENSIONS={'.mp4','.mov','.mkv','.webm','.avi','.wmv','.m4v','.flv','.mp3','.wav','.m4a','.aac','.ogg','.flac','.aiff','.wma','.amr','.mpeg','.mpg','.opus'}</w:t>
+      </w:r>
+    </w:p>
+    <w:p/>
+    <w:p>
+      <w:r>
+        <w:t>def receive_upload(stream, length, original_name):</w:t>
+      </w:r>
+    </w:p>
+    <w:p>
+      <w:r>
+        <w:t xml:space="preserve">    """Stream a browser-selected file into an isolated task; never move the user's original."""</w:t>
+      </w:r>
+    </w:p>
+    <w:p>
+      <w:r>
+        <w:t xml:space="preserve">    import uuid, shutil</w:t>
+      </w:r>
+    </w:p>
+    <w:p>
+      <w:r>
+        <w:t xml:space="preserve">    from reader import filename</w:t>
+      </w:r>
+    </w:p>
+    <w:p>
+      <w:r>
+        <w:t xml:space="preserve">    name=Path(original_name.replace('\\','/')).name</w:t>
+      </w:r>
+    </w:p>
+    <w:p>
+      <w:r>
+        <w:t xml:space="preserve">    if Path(name).suffix.lower() not in MEDIA_EXTENSIONS:</w:t>
+      </w:r>
+    </w:p>
+    <w:p>
+      <w:r>
+        <w:t xml:space="preserve">        raise ValueError('请选择支持的音频或视频文件')</w:t>
+      </w:r>
+    </w:p>
+    <w:p>
+      <w:r>
+        <w:t xml:space="preserve">    if not 0 &lt; length &lt;= 6_000_000_000:</w:t>
+      </w:r>
+    </w:p>
+    <w:p>
+      <w:r>
+        <w:t xml:space="preserve">        raise ValueError('文件为空或超过 6GB')</w:t>
+      </w:r>
+    </w:p>
+    <w:p>
+      <w:r>
+        <w:t xml:space="preserve">    url='local://'+uuid.uuid4().hex</w:t>
+      </w:r>
+    </w:p>
+    <w:p>
+      <w:r>
+        <w:t xml:space="preserve">    ident=hashlib.sha256(url.encode()).hexdigest()[:12]</w:t>
+      </w:r>
+    </w:p>
+    <w:p>
+      <w:r>
+        <w:t xml:space="preserve">    folder=WORK/'jobs'/ident</w:t>
+      </w:r>
+    </w:p>
+    <w:p>
+      <w:r>
+        <w:t xml:space="preserve">    media=folder/'media';media.mkdir(parents=True)</w:t>
+      </w:r>
+    </w:p>
+    <w:p>
+      <w:r>
+        <w:t xml:space="preserve">    target=media/(filename(Path(name).stem)+Path(name).suffix.lower())</w:t>
+      </w:r>
+    </w:p>
+    <w:p>
+      <w:r>
+        <w:t xml:space="preserve">    try:</w:t>
+      </w:r>
+    </w:p>
+    <w:p>
+      <w:r>
+        <w:t xml:space="preserve">        remaining=length</w:t>
+      </w:r>
+    </w:p>
+    <w:p>
+      <w:r>
+        <w:t xml:space="preserve">        with target.open('wb') as output:</w:t>
+      </w:r>
+    </w:p>
+    <w:p>
+      <w:r>
+        <w:t xml:space="preserve">            while remaining:</w:t>
+      </w:r>
+    </w:p>
+    <w:p>
+      <w:r>
+        <w:t xml:space="preserve">                chunk=stream.read(min(1024*1024,remaining))</w:t>
+      </w:r>
+    </w:p>
+    <w:p>
+      <w:r>
+        <w:t xml:space="preserve">                if not chunk:raise ValueError('文件上传中断，请重新选择并提交')</w:t>
+      </w:r>
+    </w:p>
+    <w:p>
+      <w:r>
+        <w:t xml:space="preserve">                output.write(chunk);remaining-=len(chunk)</w:t>
+      </w:r>
+    </w:p>
+    <w:p>
+      <w:r>
+        <w:t xml:space="preserve">        save_json(folder/'job.json',{'url':url,'source_kind':'local','source_label':'本地上传文件：'+name,</w:t>
+      </w:r>
+    </w:p>
+    <w:p>
+      <w:r>
+        <w:t xml:space="preserve">            'title':Path(name).stem,'name':filename(Path(name).stem),'media':str(target),</w:t>
+      </w:r>
+    </w:p>
+    <w:p>
+      <w:r>
+        <w:t xml:space="preserve">            'state':'queued','engine':'qianwen','created_at':time.time()})</w:t>
+      </w:r>
+    </w:p>
+    <w:p>
+      <w:r>
+        <w:t xml:space="preserve">        return enqueue(url)</w:t>
+      </w:r>
+    </w:p>
+    <w:p>
+      <w:r>
+        <w:t xml:space="preserve">    except Exception:</w:t>
+      </w:r>
+    </w:p>
+    <w:p>
+      <w:r>
+        <w:t xml:space="preserve">        shutil.rmtree(folder,ignore_errors=True)</w:t>
+      </w:r>
+    </w:p>
+    <w:p>
+      <w:r>
+        <w:t xml:space="preserve">        raise</w:t>
+      </w:r>
+    </w:p>
+    <w:p/>
+    <w:p/>
+    <w:p>
+      <w:r>
         <w:t>class Handler(BaseHTTPRequestHandler):</w:t>
       </w:r>
     </w:p>
@@ -2960,7 +3003,7 @@
     </w:p>
     <w:p>
       <w:r>
-        <w:t xml:space="preserve">                return self.reply(200, {'id': receive_upload(self.rfile,length,unquote(self.headers.get('X-File-Name','')))})</w:t>
+        <w:t xml:space="preserve">                return self.reply(200, submission_result(receive_upload(self.rfile,length,unquote(self.headers.get('X-File-Name','')))))</w:t>
       </w:r>
     </w:p>
     <w:p>
@@ -2995,7 +3038,7 @@
     </w:p>
     <w:p>
       <w:r>
-        <w:t xml:space="preserve">                return self.reply(200, {'id': enqueue(data['url'].strip(), 'qianwen')})</w:t>
+        <w:t xml:space="preserve">                return self.reply(200, submission_result(enqueue(data['url'].strip(), 'qianwen')))</w:t>
       </w:r>
     </w:p>
     <w:p>
@@ -4757,7 +4800,7 @@
     </w:p>
     <w:p>
       <w:r>
-        <w:t>const deletedTaskIds=new Set();const deletionResults=new Map();let refreshSequence=0;</w:t>
+        <w:t>const deletedTaskIds=new Set();const deletionResults=new Map();let refreshSequence=0;let visibleJobs=[];</w:t>
       </w:r>
     </w:p>
     <w:p>
@@ -4822,7 +4865,7 @@
     </w:p>
     <w:p>
       <w:r>
-        <w:t>document.querySelector('#form').onsubmit=async e=&gt;{e.preventDefault();try{if('qianwen'==='qianwen'){let health=await(await fetch('/health')).json();if(!health.engines?.includes('qianwen'))throw Error('网页服务需要加载新版。请完成登录千问配置后再试。')}if(selectedFile){let h=await(await fetch('/health')).json();if(!h.local_upload)throw Error('请双击“加载本次更新.command”启用本地文件入口。');let button=document.querySelector('#form button');button.disabled=true;msg.textContent='正在将文件交给本机后台，请稍候…';try{let r=await fetch('/upload',{method:'POST',headers:{'Content-Type':'application/octet-stream','X-File-Name':encodeURIComponent(selectedFile.name)},body:selectedFile});let j=await r.json();if(!r.ok)throw Error(j.error)}finally{button.disabled=false}}else{if(!urlInput.value.trim())throw Error('请粘贴链接或选择音视频文件');await post('/jobs',{url:urlInput.value,engine:'qianwen'})}deletedTaskIds.clear();selectedFile=null;picker.value='';document.querySelector('#file-name').textContent='';document.querySelector('#url').value='';msg.textContent='已加入后台队列。你可以继续做其他事情，稍后回来查看文稿。';await refresh()}catch(e){msg.textContent=e.message}};</w:t>
+        <w:t>document.querySelector('#form').onsubmit=async e=&gt;{e.preventDefault();try{if('qianwen'==='qianwen'){let health=await(await fetch('/health')).json();if(!health.engines?.includes('qianwen'))throw Error('网页服务需要加载新版。请完成登录千问配置后再试。')}if(selectedFile){let h=await(await fetch('/health')).json();if(!h.local_upload)throw Error('请双击“加载本次更新.command”启用本地文件入口。');let button=document.querySelector('#form button');button.disabled=true;msg.textContent='正在将文件交给本机后台，请稍候…';try{let r=await fetch('/upload',{method:'POST',headers:{'Content-Type':'application/octet-stream','X-File-Name':encodeURIComponent(selectedFile.name)},body:selectedFile});let j=await r.json();if(!r.ok)throw Error(j.error);showSubmittedJob(j.job);msg.textContent=j.job?.state==='completed'?'这个链接已有完成的任务，已显示对应记录。':'任务 '+(j.job?.task_number||'')+' 已加入后台队列。'}finally{button.disabled=false}}else{if(!urlInput.value.trim())throw Error('请粘贴链接或选择音视频文件');let result=await post('/jobs',{url:urlInput.value,engine:'qianwen'});showSubmittedJob(result.job);msg.textContent=result.job?.state==='completed'?'这个链接已有完成的任务，已显示对应记录。':'任务 '+(result.job?.task_number||'')+' 已加入后台队列。'}deletedTaskIds.clear();selectedFile=null;picker.value='';document.querySelector('#file-name').textContent='';document.querySelector('#url').value='';await refresh()}catch(e){msg.textContent=e.message}};</w:t>
       </w:r>
     </w:p>
     <w:p>
@@ -4847,7 +4890,17 @@
     </w:p>
     <w:p>
       <w:r>
-        <w:t>async function refresh(){const sequence=++refreshSequence;try{await refreshDeletions();let jobs=await(await fetch('/jobs')).json();if(sequence!==refreshSequence)return;jobs=jobs.filter(j=&gt;!deletedTaskIds.has(j.id));jobs.sort((a,b)=&gt;a.task_number&amp;&amp;b.task_number?b.task_number-a.task_number:(b.created_at??historicalTaskTimes[b.id]??b.added_at??Infinity)-(a.created_at??historicalTaskTimes[a.id]??a.added_at??Infinity));let host=document.querySelector('#jobs');host.replaceChildren();for(let j of jobs){let card=document.createElement('article');card.dataset.taskId=j.id;let h=document.createElement('h2');h.textContent=taskHeading(j);card.append(h);let p=document.createElement('p');p.textContent=(j.document&amp;&amp;!j.has_document)?'Word 文件已不在原保存位置，重新提交链接可生成':(stages[j.state]||'状态暂未识别：'+String(j.state));if(j.state==='interrupted')p.textContent='任务已中断，进度已保留';if(j.qianwen_task_failed&amp;&amp;j.state==='failed')p.textContent='千问任务失败，进度已保留';card.append(p);if(j.source_kind==='local'){let source=document.createElement('p');source.textContent=j.source_label;card.append(source)}else card.append(link('原网页',j.url));let deletion=deletionResults.get(j.id)||j.deletion_result;if(deletion){let status=document.createElement('p');status.className='delete-result';status.setAttribute('role','alert');status.style.color=deletion.status==='failed'?'#a52222':'#8b4520';renderDeletionResult(status,deletion);card.append(status)}if(j.error){let err=document.createElement('p');err.textContent=j.error;card.append(err)}if(j.cloud_cleanup_state){let cloud=document.createElement('p');cloud.textContent=j.cloud_cleanup_state==='pending'?'Word 已保存，正在删除对应的千问记录…':j.cloud_cleanup_state==='completed'?'对应的千问记录已清理。':'Word 已保存；千问记录尚未清理：'+(j.cloud_cleanup_error||'请稍后在千问中检查');card.append(cloud)}if(j.cleanup_error){let note=document.createElement('p');note.textContent='Word 已生成，但部分临时文件未清理：'+j.cleanup_error;card.append(note)}if(j.has_document){let actions=document.createElement('p');actions.className='actions';actions.append(link('查看 Word 文稿','/preview/'+j.id,'action'));let reveal=document.createElement('button');reveal.type='button';reveal.className='secondary';reveal.textContent='打开文档所在位置';let revealStatus=document.createElement('small');revealStatus.setAttribute('role','status');reveal.onclick=async()=&gt;{reveal.disabled=true;revealStatus.textContent='正在打开文件夹…';try{await post('/reveal/'+j.id,{});revealStatus.textContent='已打开 Finder 文件夹。';msg.textContent='已打开文档所在的 Finder 文件夹。'}catch(e){revealStatus.textContent='打开失败：'+e.message;msg.textContent='打开失败：'+e.message}finally{reveal.disabled=false}};actions.append(reveal);actions.append(revealStatus);card.append(actions);let note=document.createElement('small');note.textContent=j.temporary_files_removed?(j.media_trashed?'原音视频已移入废纸篓，临时音轨已清理。':'原音视频与临时音轨已清理。'):'Word 内容未经人工校对。';card.append(note)}let controls=document.createElement('p');controls.className='actions';if(j.state==='youtube_verifying'){let resume=document.createElement('button');resume.className='retry-task';resume.textContent='已关闭验证弹窗，重新开始任务';resume.onclick=async()=&gt;{resume.disabled=true;try{let result=await post('/youtube/confirm/'+j.id,{});msg.textContent=result.message;await refresh()}catch(e){msg.textContent=e.message;resume.disabled=false}};controls.append(resume)}if(j.state==='failed'||j.state==='login_required'||j.state==='interrupted'){let retry=document.createElement('button');retry.textContent='重新开始任务';retry.className='retry-task';retry.onclick=async()=&gt;{try{await post('/jobs',{url:j.url,engine:'qianwen'});await refresh()}catch(e){msg.textContent=e.message}};controls.append(retry)}let remove=document.createElement('button');remove.type='button';remove.className='secondary';remove.style.color='#a52222';remove.textContent='删除任务记录';if(deletion?.status==='pending'){remove.disabled=true;remove.textContent='正在同步删除…'}remove.onclick=async()=&gt;{if(!confirm('删除“'+(j.title||j.id)+'”？将停止该任务，把本机任务文件和相关文稿移入废纸篓。同时删除对应的千问云端记录，云端删除后无法恢复。'))return;deletionResults.set(j.id,{status:'pending',message:'正在删除并同步到千问，请稍候…'});msg.className='';msg.textContent='正在删除并同步到千问，请稍候…';remove.disabled=true;remove.textContent='正在同步删除…';try{let health=await(await fetch('/health')).json();if(!health.cloud_delete)throw Error('请先双击加载本次更新.command启用千问同步删除');await requireControls();let r=await post('/delete/'+j.id,{});if(r.deletion_result?.status==='pending'){deletionResults.set(j.id,r.deletion_result);msg.className='';renderDeletionResult(msg,r.deletion_result);await refresh();return}deletedTaskIds.add(j.id);++refreshSequence;document.querySelectorAll('article[data-task-id="'+j.id+'"]').forEach(node=&gt;node.remove());deletionResults.delete(j.id);showDeletionResult(r.deletion_result||{status:'success',message:r.message},true);await refresh()}catch(e){let message=e.deletionResult?.message||('删除失败\n工具任务列表记录：未删除成功\n本机文稿及任务文件：未确认删除成功\n对应的千问记录：未确认删除成功\n原因：'+e.message);let report=e.deletionResult||{status:'failed',message};deletionResults.set(j.id,report);showDeletionResult(report,false);let status=card.querySelector('.delete-result');if(!status){status=document.createElement('p');status.className='delete-result';status.setAttribute('role','alert');card.append(status)}status.style.color='#a52222';renderDeletionResult(status,report);remove.disabled=false;remove.textContent='删除任务记录'}};if(j.has_document){card.querySelector('.actions').append(remove)}else{controls.append(remove)}if(controls.children.length)card.append(controls);host.append(card)}await refreshLogin()}catch(e){msg.textContent='后台连接中断，请重新启动工具。'}}</w:t>
+        <w:t>function renderJobs(jobs){visibleJobs=jobs;jobs=jobs.filter(j=&gt;!deletedTaskIds.has(j.id));jobs.sort((a,b)=&gt;a.task_number&amp;&amp;b.task_number?b.task_number-a.task_number:(b.created_at??historicalTaskTimes[b.id]??b.added_at??Infinity)-(a.created_at??historicalTaskTimes[a.id]??a.added_at??Infinity));let host=document.querySelector('#jobs');host.replaceChildren();for(let j of jobs){let card=document.createElement('article');card.dataset.taskId=j.id;let h=document.createElement('h2');h.textContent=taskHeading(j);card.append(h);let p=document.createElement('p');p.textContent=(j.document&amp;&amp;!j.has_document)?'Word 文件已不在原保存位置，重新提交链接可生成':(stages[j.state]||'状态暂未识别：'+String(j.state));if(j.state==='interrupted')p.textContent='任务已中断，进度已保留';if(j.qianwen_task_failed&amp;&amp;j.state==='failed')p.textContent='千问任务失败，进度已保留';card.append(p);if(j.source_kind==='local'){let source=document.createElement('p');source.textContent=j.source_label;card.append(source)}else card.append(link('原网页',j.url));let deletion=deletionResults.get(j.id)||j.deletion_result;if(deletion){let status=document.createElement('p');status.className='delete-result';status.setAttribute('role','alert');status.style.color=deletion.status==='failed'?'#a52222':'#8b4520';renderDeletionResult(status,deletion);card.append(status)}if(j.error){let err=document.createElement('p');err.textContent=j.error;card.append(err)}if(j.cloud_cleanup_state){let cloud=document.createElement('p');cloud.textContent=j.cloud_cleanup_state==='pending'?'Word 已保存，正在删除对应的千问记录…':j.cloud_cleanup_state==='completed'?'对应的千问记录已清理。':'Word 已保存；千问记录尚未清理：'+(j.cloud_cleanup_error||'请稍后在千问中检查');card.append(cloud)}if(j.cleanup_error){let note=document.createElement('p');note.textContent='Word 已生成，但部分临时文件未清理：'+j.cleanup_error;card.append(note)}if(j.has_document){let actions=document.createElement('p');actions.className='actions';actions.append(link('查看 Word 文稿','/preview/'+j.id,'action'));let reveal=document.createElement('button');reveal.type='button';reveal.className='secondary';reveal.textContent='打开文档所在位置';let revealStatus=document.createElement('small');revealStatus.setAttribute('role','status');reveal.onclick=async()=&gt;{reveal.disabled=true;revealStatus.textContent='正在打开文件夹…';try{await post('/reveal/'+j.id,{});revealStatus.textContent='已打开 Finder 文件夹。';msg.textContent='已打开文档所在的 Finder 文件夹。'}catch(e){revealStatus.textContent='打开失败：'+e.message;msg.textContent='打开失败：'+e.message}finally{reveal.disabled=false}};actions.append(reveal);actions.append(revealStatus);card.append(actions);let note=document.createElement('small');note.textContent=j.temporary_files_removed?(j.media_trashed?'原音视频已移入废纸篓，临时音轨已清理。':'原音视频与临时音轨已清理。'):'Word 内容未经人工校对。';card.append(note)}let controls=document.createElement('p');controls.className='actions';if(j.state==='youtube_verifying'){let resume=document.createElement('button');resume.className='retry-task';resume.textContent='已关闭验证弹窗，重新开始任务';resume.onclick=async()=&gt;{resume.disabled=true;try{let result=await post('/youtube/confirm/'+j.id,{});msg.textContent=result.message;await refresh()}catch(e){msg.textContent=e.message;resume.disabled=false}};controls.append(resume)}if(j.state==='failed'||j.state==='login_required'||j.state==='interrupted'){let retry=document.createElement('button');retry.textContent='重新开始任务';retry.className='retry-task';retry.onclick=async()=&gt;{try{await post('/jobs',{url:j.url,engine:'qianwen'});await refresh()}catch(e){msg.textContent=e.message}};controls.append(retry)}let remove=document.createElement('button');remove.type='button';remove.className='secondary';remove.style.color='#a52222';remove.textContent='删除任务记录';if(deletion?.status==='pending'){remove.disabled=true;remove.textContent='正在同步删除…'}remove.onclick=async()=&gt;{if(!confirm('删除“'+(j.title||j.id)+'”？将停止该任务，把本机任务文件和相关文稿移入废纸篓。同时删除对应的千问云端记录，云端删除后无法恢复。'))return;deletionResults.set(j.id,{status:'pending',message:'正在删除并同步到千问，请稍候…'});msg.className='';msg.textContent='正在删除并同步到千问，请稍候…';remove.disabled=true;remove.textContent='正在同步删除…';try{let health=await(await fetch('/health')).json();if(!health.cloud_delete)throw Error('请先双击加载本次更新.command启用千问同步删除');await requireControls();let r=await post('/delete/'+j.id,{});if(r.deletion_result?.status==='pending'){deletionResults.set(j.id,r.deletion_result);msg.className='';renderDeletionResult(msg,r.deletion_result);await refresh();return}deletedTaskIds.add(j.id);++refreshSequence;document.querySelectorAll('article[data-task-id="'+j.id+'"]').forEach(node=&gt;node.remove());deletionResults.delete(j.id);showDeletionResult(r.deletion_result||{status:'success',message:r.message},true);await refresh()}catch(e){let message=e.deletionResult?.message||('删除失败\n工具任务列表记录：未删除成功\n本机文稿及任务文件：未确认删除成功\n对应的千问记录：未确认删除成功\n原因：'+e.message);let report=e.deletionResult||{status:'failed',message};deletionResults.set(j.id,report);showDeletionResult(report,false);let status=card.querySelector('.delete-result');if(!status){status=document.createElement('p');status.className='delete-result';status.setAttribute('role','alert');card.append(status)}status.style.color='#a52222';renderDeletionResult(status,report);remove.disabled=false;remove.textContent='删除任务记录'}};if(j.has_document){card.querySelector('.actions').append(remove)}else{controls.append(remove)}if(controls.children.length)card.append(controls);host.append(card)}}</w:t>
+      </w:r>
+    </w:p>
+    <w:p>
+      <w:r>
+        <w:t>function showSubmittedJob(job){if(!job)throw Error('任务请求已接收，但后台版本较旧，未返回任务记录。请加载本次更新后刷新页面确认。');++refreshSequence;deletedTaskIds.delete(job.id);renderJobs([job,...visibleJobs.filter(j=&gt;j.id!==job.id)]);document.querySelector('article[data-task-id="'+job.id+'"]')?.scrollIntoView({block:'nearest',behavior:'smooth'});}</w:t>
+      </w:r>
+    </w:p>
+    <w:p>
+      <w:r>
+        <w:t>async function refresh(){const sequence=++refreshSequence;try{await refreshDeletions();let jobs=await(await fetch('/jobs')).json();if(sequence!==refreshSequence)return;renderJobs(jobs);await refreshLogin()}catch(e){msg.textContent='后台连接中断，请重新启动工具。'}}</w:t>
       </w:r>
     </w:p>
     <w:p>
@@ -13521,6 +13574,62 @@
     <w:p/>
     <w:p>
       <w:r>
+        <w:t>class SubmissionSnapshotTests(unittest.TestCase):</w:t>
+      </w:r>
+    </w:p>
+    <w:p>
+      <w:r>
+        <w:t xml:space="preserve">    def test_submission_response_contains_numbered_persisted_card(self):</w:t>
+      </w:r>
+    </w:p>
+    <w:p>
+      <w:r>
+        <w:t xml:space="preserve">        with tempfile.TemporaryDirectory() as tmp:</w:t>
+      </w:r>
+    </w:p>
+    <w:p>
+      <w:r>
+        <w:t xml:space="preserve">            root=Path(tmp);job=root/'jobs/123456abcdef';job.mkdir(parents=True)</w:t>
+      </w:r>
+    </w:p>
+    <w:p>
+      <w:r>
+        <w:t xml:space="preserve">            (job/'job.json').write_text(json.dumps({'url':'https://example.com','state':'queued'}))</w:t>
+      </w:r>
+    </w:p>
+    <w:p>
+      <w:r>
+        <w:t xml:space="preserve">            with patch.object(app,'WORK',root):</w:t>
+      </w:r>
+    </w:p>
+    <w:p>
+      <w:r>
+        <w:t xml:space="preserve">                response=app.submission_result(job.name)</w:t>
+      </w:r>
+    </w:p>
+    <w:p>
+      <w:r>
+        <w:t xml:space="preserve">            self.assertEqual(response['job']['id'],job.name)</w:t>
+      </w:r>
+    </w:p>
+    <w:p>
+      <w:r>
+        <w:t xml:space="preserve">            self.assertEqual(response['job']['state'],'queued')</w:t>
+      </w:r>
+    </w:p>
+    <w:p>
+      <w:r>
+        <w:t xml:space="preserve">            self.assertGreater(response['job']['task_number'],0)</w:t>
+      </w:r>
+    </w:p>
+    <w:p>
+      <w:r>
+        <w:t xml:space="preserve">            self.assertFalse(response['job']['has_document'])</w:t>
+      </w:r>
+    </w:p>
+    <w:p/>
+    <w:p>
+      <w:r>
         <w:t>class WorkerFailureTests(unittest.TestCase):</w:t>
       </w:r>
     </w:p>
@@ -19846,7 +19955,7 @@
     </w:p>
     <w:p>
       <w:r>
-        <w:t xml:space="preserve">  "app.py": "0a54525eb1443af9cad4da826f2ab094b2233ead773364496ae388f8273d1dee",</w:t>
+        <w:t xml:space="preserve">  "app.py": "52e290fbc2ce69b65b08830d43d9974a7097adb5c38ba5015537a34c92cecd2f",</w:t>
       </w:r>
     </w:p>
     <w:p>
@@ -19876,7 +19985,7 @@
     </w:p>
     <w:p>
       <w:r>
-        <w:t xml:space="preserve">  "index.html": "f6c2fd43f8fecf7599341e823f9854fc99d435d11c2636a26ed794cc5498d455",</w:t>
+        <w:t xml:space="preserve">  "index.html": "4315b73c6064d70bb43413120b84b24b1cbdbe50758be8baa585f2ce0000933b",</w:t>
       </w:r>
     </w:p>
     <w:p>
@@ -19956,7 +20065,7 @@
     </w:p>
     <w:p>
       <w:r>
-        <w:t xml:space="preserve">  "test_app.py": "83d77bd051894336123e53aed3932ba5922d8c913ce40cac4af1efd9172cf76b",</w:t>
+        <w:t xml:space="preserve">  "test_app.py": "3c85d333abd77da00a5e5a2d9128c90574f3b4e90cc202ead2ebd0a8a686e39b",</w:t>
       </w:r>
     </w:p>
     <w:p>

</xml_diff>

<commit_message>
Warn on exact duplicate URLs or uploaded filenames with task numbers
</commit_message>
<xml_diff>
--- a/安装与使用指南.docx
+++ b/安装与使用指南.docx
@@ -743,6 +743,12 @@
     </w:p>
     <w:p/>
     <w:p>
+      <w:r>
+        <w:t>新任务按完全相同的网页链接，或完全相同的上传文件名（含扩展名，区分大小写）检查重复；发现重复不建立新任务，红色加粗弹窗提示“当前任务有重复”及已有任务序号。已删除记录不参与检查；明确点击“重新开始任务”不受重复检查阻止。</w:t>
+      </w:r>
+    </w:p>
+    <w:p/>
+    <w:p>
       <w:pPr>
         <w:pStyle w:val="Heading1"/>
       </w:pPr>
@@ -2547,6 +2553,125 @@
     <w:p/>
     <w:p>
       <w:r>
+        <w:t>submission_mutex=threading.Lock()</w:t>
+      </w:r>
+    </w:p>
+    <w:p/>
+    <w:p>
+      <w:r>
+        <w:t>class DuplicateTask(ValueError):</w:t>
+      </w:r>
+    </w:p>
+    <w:p>
+      <w:r>
+        <w:t xml:space="preserve">    def __init__(self, task_numbers):</w:t>
+      </w:r>
+    </w:p>
+    <w:p>
+      <w:r>
+        <w:t xml:space="preserve">        self.task_numbers=task_numbers</w:t>
+      </w:r>
+    </w:p>
+    <w:p>
+      <w:r>
+        <w:t xml:space="preserve">        super().__init__('当前任务有重复；与序号 '+ '、'.join(map(str,task_numbers))+' 的任务记录重复。')</w:t>
+      </w:r>
+    </w:p>
+    <w:p/>
+    <w:p>
+      <w:r>
+        <w:t>def reject_duplicate(url=None, original_name=None):</w:t>
+      </w:r>
+    </w:p>
+    <w:p>
+      <w:r>
+        <w:t xml:space="preserve">    from task_numbering import numbers</w:t>
+      </w:r>
+    </w:p>
+    <w:p>
+      <w:r>
+        <w:t xml:space="preserve">    matches=[]</w:t>
+      </w:r>
+    </w:p>
+    <w:p>
+      <w:r>
+        <w:t xml:space="preserve">    for record in (WORK/'jobs').glob('*/job.json'):</w:t>
+      </w:r>
+    </w:p>
+    <w:p>
+      <w:r>
+        <w:t xml:space="preserve">        item=json.loads(record.read_text())</w:t>
+      </w:r>
+    </w:p>
+    <w:p>
+      <w:r>
+        <w:t xml:space="preserve">        stored=item.get('original_filename')</w:t>
+      </w:r>
+    </w:p>
+    <w:p>
+      <w:r>
+        <w:t xml:space="preserve">        if not stored and item.get('source_kind')=='local':</w:t>
+      </w:r>
+    </w:p>
+    <w:p>
+      <w:r>
+        <w:t xml:space="preserve">            label=item.get('source_label','')</w:t>
+      </w:r>
+    </w:p>
+    <w:p>
+      <w:r>
+        <w:t xml:space="preserve">            if label.startswith('本地上传文件：'):stored=label[len('本地上传文件：'):]</w:t>
+      </w:r>
+    </w:p>
+    <w:p>
+      <w:r>
+        <w:t xml:space="preserve">        if (url is not None and item.get('url')==url) or (original_name is not None and stored==original_name):</w:t>
+      </w:r>
+    </w:p>
+    <w:p>
+      <w:r>
+        <w:t xml:space="preserve">            matches.append(record.parent.name)</w:t>
+      </w:r>
+    </w:p>
+    <w:p>
+      <w:r>
+        <w:t xml:space="preserve">    if matches:</w:t>
+      </w:r>
+    </w:p>
+    <w:p>
+      <w:r>
+        <w:t xml:space="preserve">        ledger=numbers(WORK)</w:t>
+      </w:r>
+    </w:p>
+    <w:p>
+      <w:r>
+        <w:t xml:space="preserve">        raise DuplicateTask(sorted(ledger[i] for i in matches))</w:t>
+      </w:r>
+    </w:p>
+    <w:p/>
+    <w:p>
+      <w:r>
+        <w:t>def submit_url(url, restart=False):</w:t>
+      </w:r>
+    </w:p>
+    <w:p>
+      <w:r>
+        <w:t xml:space="preserve">    with submission_mutex:</w:t>
+      </w:r>
+    </w:p>
+    <w:p>
+      <w:r>
+        <w:t xml:space="preserve">        if not restart:reject_duplicate(url=url)</w:t>
+      </w:r>
+    </w:p>
+    <w:p>
+      <w:r>
+        <w:t xml:space="preserve">        return enqueue(url,'qianwen')</w:t>
+      </w:r>
+    </w:p>
+    <w:p/>
+    <w:p>
+      <w:r>
         <w:t>MEDIA_EXTENSIONS={'.mp4','.mov','.mkv','.webm','.avi','.wmv','.m4v','.flv','.mp3','.wav','.m4a','.aac','.ogg','.flac','.aiff','.wma','.amr','.mpeg','.mpg','.opus'}</w:t>
       </w:r>
     </w:p>
@@ -2558,6 +2683,27 @@
     </w:p>
     <w:p>
       <w:r>
+        <w:t xml:space="preserve">    with submission_mutex:</w:t>
+      </w:r>
+    </w:p>
+    <w:p>
+      <w:r>
+        <w:t xml:space="preserve">        reject_duplicate(original_name=Path(original_name.replace('\\','/')).name)</w:t>
+      </w:r>
+    </w:p>
+    <w:p>
+      <w:r>
+        <w:t xml:space="preserve">        return _receive_upload(stream,length,original_name)</w:t>
+      </w:r>
+    </w:p>
+    <w:p/>
+    <w:p>
+      <w:r>
+        <w:t>def _receive_upload(stream, length, original_name):</w:t>
+      </w:r>
+    </w:p>
+    <w:p>
+      <w:r>
         <w:t xml:space="preserve">    """Stream a browser-selected file into an isolated task; never move the user's original."""</w:t>
       </w:r>
     </w:p>
@@ -2658,7 +2804,7 @@
     </w:p>
     <w:p>
       <w:r>
-        <w:t xml:space="preserve">        save_json(folder/'job.json',{'url':url,'source_kind':'local','source_label':'本地上传文件：'+name,</w:t>
+        <w:t xml:space="preserve">        save_json(folder/'job.json',{'url':url,'source_kind':'local','source_label':'本地上传文件：'+name,'original_filename':name,</w:t>
       </w:r>
     </w:p>
     <w:p>
@@ -3038,7 +3184,7 @@
     </w:p>
     <w:p>
       <w:r>
-        <w:t xml:space="preserve">                return self.reply(200, submission_result(enqueue(data['url'].strip(), 'qianwen')))</w:t>
+        <w:t xml:space="preserve">                return self.reply(200, submission_result(submit_url(data['url'].strip(),data.get('action')=='restart')))</w:t>
       </w:r>
     </w:p>
     <w:p>
@@ -3159,6 +3305,21 @@
     <w:p>
       <w:r>
         <w:t xml:space="preserve">            self.reply(404, {'error': '未找到'})</w:t>
+      </w:r>
+    </w:p>
+    <w:p>
+      <w:r>
+        <w:t xml:space="preserve">        except DuplicateTask as error:</w:t>
+      </w:r>
+    </w:p>
+    <w:p>
+      <w:r>
+        <w:t xml:space="preserve">            self.close_connection=True</w:t>
+      </w:r>
+    </w:p>
+    <w:p>
+      <w:r>
+        <w:t xml:space="preserve">            return self.reply(409,{'error':str(error),'duplicate':True,'task_numbers':error.task_numbers})</w:t>
       </w:r>
     </w:p>
     <w:p>
@@ -4825,7 +4986,12 @@
     </w:p>
     <w:p>
       <w:r>
-        <w:t>async function post(url,data){let r=await fetch(url,{method:'POST',headers:{'Content-Type':'application/json'},body:JSON.stringify(data)});let j=await r.json();if(!r.ok){let error=Error(j.error);error.deletionResult=j.deletion_result;throw error}return j}</w:t>
+        <w:t>function showDuplicate(numbers){let dialog=document.querySelector('#duplicate-warning');if(!dialog){dialog=document.createElement('dialog');dialog.id='duplicate-warning';let text=document.createElement('p');text.style.color='#c62828';text.style.fontWeight='bold';text.setAttribute('role','alert');dialog.append(text);let close=document.createElement('button');close.textContent='知道了';close.onclick=()=&gt;dialog.close();dialog.append(close);document.body.append(dialog)}dialog.querySelector('p').textContent='当前任务有重复。与序号 '+numbers.join('、')+' 的任务记录重复。';if(!dialog.open)dialog.showModal();msg.style.color='#c62828';msg.style.fontWeight='bold';}</w:t>
+      </w:r>
+    </w:p>
+    <w:p>
+      <w:r>
+        <w:t>async function post(url,data){let r=await fetch(url,{method:'POST',headers:{'Content-Type':'application/json'},body:JSON.stringify(data)});let j=await r.json();if(!r.ok){if(j.duplicate)showDuplicate(j.task_numbers);let error=Error(j.error);error.deletionResult=j.deletion_result;throw error}return j}</w:t>
       </w:r>
     </w:p>
     <w:p>
@@ -4865,7 +5031,7 @@
     </w:p>
     <w:p>
       <w:r>
-        <w:t>document.querySelector('#form').onsubmit=async e=&gt;{e.preventDefault();try{if('qianwen'==='qianwen'){let health=await(await fetch('/health')).json();if(!health.engines?.includes('qianwen'))throw Error('网页服务需要加载新版。请完成登录千问配置后再试。')}if(selectedFile){let h=await(await fetch('/health')).json();if(!h.local_upload)throw Error('请双击“加载本次更新.command”启用本地文件入口。');let button=document.querySelector('#form button');button.disabled=true;msg.textContent='正在将文件交给本机后台，请稍候…';try{let r=await fetch('/upload',{method:'POST',headers:{'Content-Type':'application/octet-stream','X-File-Name':encodeURIComponent(selectedFile.name)},body:selectedFile});let j=await r.json();if(!r.ok)throw Error(j.error);showSubmittedJob(j.job);msg.textContent=j.job?.state==='completed'?'这个链接已有完成的任务，已显示对应记录。':'任务 '+(j.job?.task_number||'')+' 已加入后台队列。'}finally{button.disabled=false}}else{if(!urlInput.value.trim())throw Error('请粘贴链接或选择音视频文件');let result=await post('/jobs',{url:urlInput.value,engine:'qianwen'});showSubmittedJob(result.job);msg.textContent=result.job?.state==='completed'?'这个链接已有完成的任务，已显示对应记录。':'任务 '+(result.job?.task_number||'')+' 已加入后台队列。'}deletedTaskIds.clear();selectedFile=null;picker.value='';document.querySelector('#file-name').textContent='';document.querySelector('#url').value='';await refresh()}catch(e){msg.textContent=e.message}};</w:t>
+        <w:t>document.querySelector('#form').onsubmit=async e=&gt;{e.preventDefault();msg.style.color='';msg.style.fontWeight='';try{if('qianwen'==='qianwen'){let health=await(await fetch('/health')).json();if(!health.engines?.includes('qianwen'))throw Error('网页服务需要加载新版。请完成登录千问配置后再试。')}if(selectedFile){let h=await(await fetch('/health')).json();if(!h.local_upload)throw Error('请双击“加载本次更新.command”启用本地文件入口。');let button=document.querySelector('#form button');button.disabled=true;msg.textContent='正在将文件交给本机后台，请稍候…';try{let r=await fetch('/upload',{method:'POST',headers:{'Content-Type':'application/octet-stream','X-File-Name':encodeURIComponent(selectedFile.name)},body:selectedFile});let j=await r.json();if(!r.ok){if(j.duplicate)showDuplicate(j.task_numbers);throw Error(j.error)}showSubmittedJob(j.job);msg.textContent=j.job?.state==='completed'?'这个链接已有完成的任务，已显示对应记录。':'任务 '+(j.job?.task_number||'')+' 已加入后台队列。'}finally{button.disabled=false}}else{if(!urlInput.value.trim())throw Error('请粘贴链接或选择音视频文件');let result=await post('/jobs',{url:urlInput.value,engine:'qianwen'});showSubmittedJob(result.job);msg.textContent=result.job?.state==='completed'?'这个链接已有完成的任务，已显示对应记录。':'任务 '+(result.job?.task_number||'')+' 已加入后台队列。'}deletedTaskIds.clear();selectedFile=null;picker.value='';document.querySelector('#file-name').textContent='';document.querySelector('#url').value='';await refresh()}catch(e){msg.textContent=e.message}};</w:t>
       </w:r>
     </w:p>
     <w:p>
@@ -4890,7 +5056,7 @@
     </w:p>
     <w:p>
       <w:r>
-        <w:t>function renderJobs(jobs){visibleJobs=jobs;jobs=jobs.filter(j=&gt;!deletedTaskIds.has(j.id));jobs.sort((a,b)=&gt;a.task_number&amp;&amp;b.task_number?b.task_number-a.task_number:(b.created_at??historicalTaskTimes[b.id]??b.added_at??Infinity)-(a.created_at??historicalTaskTimes[a.id]??a.added_at??Infinity));let host=document.querySelector('#jobs');host.replaceChildren();for(let j of jobs){let card=document.createElement('article');card.dataset.taskId=j.id;let h=document.createElement('h2');h.textContent=taskHeading(j);card.append(h);let p=document.createElement('p');p.textContent=(j.document&amp;&amp;!j.has_document)?'Word 文件已不在原保存位置，重新提交链接可生成':(stages[j.state]||'状态暂未识别：'+String(j.state));if(j.state==='interrupted')p.textContent='任务已中断，进度已保留';if(j.qianwen_task_failed&amp;&amp;j.state==='failed')p.textContent='千问任务失败，进度已保留';card.append(p);if(j.source_kind==='local'){let source=document.createElement('p');source.textContent=j.source_label;card.append(source)}else card.append(link('原网页',j.url));let deletion=deletionResults.get(j.id)||j.deletion_result;if(deletion){let status=document.createElement('p');status.className='delete-result';status.setAttribute('role','alert');status.style.color=deletion.status==='failed'?'#a52222':'#8b4520';renderDeletionResult(status,deletion);card.append(status)}if(j.error){let err=document.createElement('p');err.textContent=j.error;card.append(err)}if(j.cloud_cleanup_state){let cloud=document.createElement('p');cloud.textContent=j.cloud_cleanup_state==='pending'?'Word 已保存，正在删除对应的千问记录…':j.cloud_cleanup_state==='completed'?'对应的千问记录已清理。':'Word 已保存；千问记录尚未清理：'+(j.cloud_cleanup_error||'请稍后在千问中检查');card.append(cloud)}if(j.cleanup_error){let note=document.createElement('p');note.textContent='Word 已生成，但部分临时文件未清理：'+j.cleanup_error;card.append(note)}if(j.has_document){let actions=document.createElement('p');actions.className='actions';actions.append(link('查看 Word 文稿','/preview/'+j.id,'action'));let reveal=document.createElement('button');reveal.type='button';reveal.className='secondary';reveal.textContent='打开文档所在位置';let revealStatus=document.createElement('small');revealStatus.setAttribute('role','status');reveal.onclick=async()=&gt;{reveal.disabled=true;revealStatus.textContent='正在打开文件夹…';try{await post('/reveal/'+j.id,{});revealStatus.textContent='已打开 Finder 文件夹。';msg.textContent='已打开文档所在的 Finder 文件夹。'}catch(e){revealStatus.textContent='打开失败：'+e.message;msg.textContent='打开失败：'+e.message}finally{reveal.disabled=false}};actions.append(reveal);actions.append(revealStatus);card.append(actions);let note=document.createElement('small');note.textContent=j.temporary_files_removed?(j.media_trashed?'原音视频已移入废纸篓，临时音轨已清理。':'原音视频与临时音轨已清理。'):'Word 内容未经人工校对。';card.append(note)}let controls=document.createElement('p');controls.className='actions';if(j.state==='youtube_verifying'){let resume=document.createElement('button');resume.className='retry-task';resume.textContent='已关闭验证弹窗，重新开始任务';resume.onclick=async()=&gt;{resume.disabled=true;try{let result=await post('/youtube/confirm/'+j.id,{});msg.textContent=result.message;await refresh()}catch(e){msg.textContent=e.message;resume.disabled=false}};controls.append(resume)}if(j.state==='failed'||j.state==='login_required'||j.state==='interrupted'){let retry=document.createElement('button');retry.textContent='重新开始任务';retry.className='retry-task';retry.onclick=async()=&gt;{try{await post('/jobs',{url:j.url,engine:'qianwen'});await refresh()}catch(e){msg.textContent=e.message}};controls.append(retry)}let remove=document.createElement('button');remove.type='button';remove.className='secondary';remove.style.color='#a52222';remove.textContent='删除任务记录';if(deletion?.status==='pending'){remove.disabled=true;remove.textContent='正在同步删除…'}remove.onclick=async()=&gt;{if(!confirm('删除“'+(j.title||j.id)+'”？将停止该任务，把本机任务文件和相关文稿移入废纸篓。同时删除对应的千问云端记录，云端删除后无法恢复。'))return;deletionResults.set(j.id,{status:'pending',message:'正在删除并同步到千问，请稍候…'});msg.className='';msg.textContent='正在删除并同步到千问，请稍候…';remove.disabled=true;remove.textContent='正在同步删除…';try{let health=await(await fetch('/health')).json();if(!health.cloud_delete)throw Error('请先双击加载本次更新.command启用千问同步删除');await requireControls();let r=await post('/delete/'+j.id,{});if(r.deletion_result?.status==='pending'){deletionResults.set(j.id,r.deletion_result);msg.className='';renderDeletionResult(msg,r.deletion_result);await refresh();return}deletedTaskIds.add(j.id);++refreshSequence;document.querySelectorAll('article[data-task-id="'+j.id+'"]').forEach(node=&gt;node.remove());deletionResults.delete(j.id);showDeletionResult(r.deletion_result||{status:'success',message:r.message},true);await refresh()}catch(e){let message=e.deletionResult?.message||('删除失败\n工具任务列表记录：未删除成功\n本机文稿及任务文件：未确认删除成功\n对应的千问记录：未确认删除成功\n原因：'+e.message);let report=e.deletionResult||{status:'failed',message};deletionResults.set(j.id,report);showDeletionResult(report,false);let status=card.querySelector('.delete-result');if(!status){status=document.createElement('p');status.className='delete-result';status.setAttribute('role','alert');card.append(status)}status.style.color='#a52222';renderDeletionResult(status,report);remove.disabled=false;remove.textContent='删除任务记录'}};if(j.has_document){card.querySelector('.actions').append(remove)}else{controls.append(remove)}if(controls.children.length)card.append(controls);host.append(card)}}</w:t>
+        <w:t>function renderJobs(jobs){visibleJobs=jobs;jobs=jobs.filter(j=&gt;!deletedTaskIds.has(j.id));jobs.sort((a,b)=&gt;a.task_number&amp;&amp;b.task_number?b.task_number-a.task_number:(b.created_at??historicalTaskTimes[b.id]??b.added_at??Infinity)-(a.created_at??historicalTaskTimes[a.id]??a.added_at??Infinity));let host=document.querySelector('#jobs');host.replaceChildren();for(let j of jobs){let card=document.createElement('article');card.dataset.taskId=j.id;let h=document.createElement('h2');h.textContent=taskHeading(j);card.append(h);let p=document.createElement('p');p.textContent=(j.document&amp;&amp;!j.has_document)?'Word 文件已不在原保存位置，重新提交链接可生成':(stages[j.state]||'状态暂未识别：'+String(j.state));if(j.state==='interrupted')p.textContent='任务已中断，进度已保留';if(j.qianwen_task_failed&amp;&amp;j.state==='failed')p.textContent='千问任务失败，进度已保留';card.append(p);if(j.source_kind==='local'){let source=document.createElement('p');source.textContent=j.source_label;card.append(source)}else card.append(link('原网页',j.url));let deletion=deletionResults.get(j.id)||j.deletion_result;if(deletion){let status=document.createElement('p');status.className='delete-result';status.setAttribute('role','alert');status.style.color=deletion.status==='failed'?'#a52222':'#8b4520';renderDeletionResult(status,deletion);card.append(status)}if(j.error){let err=document.createElement('p');err.textContent=j.error;card.append(err)}if(j.cloud_cleanup_state){let cloud=document.createElement('p');cloud.textContent=j.cloud_cleanup_state==='pending'?'Word 已保存，正在删除对应的千问记录…':j.cloud_cleanup_state==='completed'?'对应的千问记录已清理。':'Word 已保存；千问记录尚未清理：'+(j.cloud_cleanup_error||'请稍后在千问中检查');card.append(cloud)}if(j.cleanup_error){let note=document.createElement('p');note.textContent='Word 已生成，但部分临时文件未清理：'+j.cleanup_error;card.append(note)}if(j.has_document){let actions=document.createElement('p');actions.className='actions';actions.append(link('查看 Word 文稿','/preview/'+j.id,'action'));let reveal=document.createElement('button');reveal.type='button';reveal.className='secondary';reveal.textContent='打开文档所在位置';let revealStatus=document.createElement('small');revealStatus.setAttribute('role','status');reveal.onclick=async()=&gt;{reveal.disabled=true;revealStatus.textContent='正在打开文件夹…';try{await post('/reveal/'+j.id,{});revealStatus.textContent='已打开 Finder 文件夹。';msg.textContent='已打开文档所在的 Finder 文件夹。'}catch(e){revealStatus.textContent='打开失败：'+e.message;msg.textContent='打开失败：'+e.message}finally{reveal.disabled=false}};actions.append(reveal);actions.append(revealStatus);card.append(actions);let note=document.createElement('small');note.textContent=j.temporary_files_removed?(j.media_trashed?'原音视频已移入废纸篓，临时音轨已清理。':'原音视频与临时音轨已清理。'):'Word 内容未经人工校对。';card.append(note)}let controls=document.createElement('p');controls.className='actions';if(j.state==='youtube_verifying'){let resume=document.createElement('button');resume.className='retry-task';resume.textContent='已关闭验证弹窗，重新开始任务';resume.onclick=async()=&gt;{resume.disabled=true;try{let result=await post('/youtube/confirm/'+j.id,{});msg.textContent=result.message;await refresh()}catch(e){msg.textContent=e.message;resume.disabled=false}};controls.append(resume)}if(j.state==='failed'||j.state==='login_required'||j.state==='interrupted'){let retry=document.createElement('button');retry.textContent='重新开始任务';retry.className='retry-task';retry.onclick=async()=&gt;{try{await post('/jobs',{url:j.url,engine:'qianwen',action:'restart'});await refresh()}catch(e){msg.textContent=e.message}};controls.append(retry)}let remove=document.createElement('button');remove.type='button';remove.className='secondary';remove.style.color='#a52222';remove.textContent='删除任务记录';if(deletion?.status==='pending'){remove.disabled=true;remove.textContent='正在同步删除…'}remove.onclick=async()=&gt;{if(!confirm('删除“'+(j.title||j.id)+'”？将停止该任务，把本机任务文件和相关文稿移入废纸篓。同时删除对应的千问云端记录，云端删除后无法恢复。'))return;deletionResults.set(j.id,{status:'pending',message:'正在删除并同步到千问，请稍候…'});msg.className='';msg.textContent='正在删除并同步到千问，请稍候…';remove.disabled=true;remove.textContent='正在同步删除…';try{let health=await(await fetch('/health')).json();if(!health.cloud_delete)throw Error('请先双击加载本次更新.command启用千问同步删除');await requireControls();let r=await post('/delete/'+j.id,{});if(r.deletion_result?.status==='pending'){deletionResults.set(j.id,r.deletion_result);msg.className='';renderDeletionResult(msg,r.deletion_result);await refresh();return}deletedTaskIds.add(j.id);++refreshSequence;document.querySelectorAll('article[data-task-id="'+j.id+'"]').forEach(node=&gt;node.remove());deletionResults.delete(j.id);showDeletionResult(r.deletion_result||{status:'success',message:r.message},true);await refresh()}catch(e){let message=e.deletionResult?.message||('删除失败\n工具任务列表记录：未删除成功\n本机文稿及任务文件：未确认删除成功\n对应的千问记录：未确认删除成功\n原因：'+e.message);let report=e.deletionResult||{status:'failed',message};deletionResults.set(j.id,report);showDeletionResult(report,false);let status=card.querySelector('.delete-result');if(!status){status=document.createElement('p');status.className='delete-result';status.setAttribute('role','alert');card.append(status)}status.style.color='#a52222';renderDeletionResult(status,report);remove.disabled=false;remove.textContent='删除任务记录'}};if(j.has_document){card.querySelector('.actions').append(remove)}else{controls.append(remove)}if(controls.children.length)card.append(controls);host.append(card)}}</w:t>
       </w:r>
     </w:p>
     <w:p>
@@ -14112,6 +14278,83 @@
         <w:t xml:space="preserve">    unittest.main()</w:t>
       </w:r>
     </w:p>
+    <w:p/>
+    <w:p>
+      <w:r>
+        <w:t>class DuplicateTaskTests(unittest.TestCase):</w:t>
+      </w:r>
+    </w:p>
+    <w:p>
+      <w:r>
+        <w:t xml:space="preserve">    def test_exact_link_and_filename_with_extension(self):</w:t>
+      </w:r>
+    </w:p>
+    <w:p>
+      <w:r>
+        <w:t xml:space="preserve">        with tempfile.TemporaryDirectory() as tmp:</w:t>
+      </w:r>
+    </w:p>
+    <w:p>
+      <w:r>
+        <w:t xml:space="preserve">            root=Path(tmp);job=root/'jobs/123456abcdef';job.mkdir(parents=True)</w:t>
+      </w:r>
+    </w:p>
+    <w:p>
+      <w:r>
+        <w:t xml:space="preserve">            (job/'job.json').write_text(json.dumps({'url':'https://example.com/a?x=1','source_kind':'local','source_label':'本地上传文件：测试.MP4','created_at':1}))</w:t>
+      </w:r>
+    </w:p>
+    <w:p>
+      <w:r>
+        <w:t xml:space="preserve">            with patch.object(app,'WORK',root):</w:t>
+      </w:r>
+    </w:p>
+    <w:p>
+      <w:r>
+        <w:t xml:space="preserve">                with self.assertRaises(app.DuplicateTask) as caught:app.reject_duplicate(url='https://example.com/a?x=1')</w:t>
+      </w:r>
+    </w:p>
+    <w:p>
+      <w:r>
+        <w:t xml:space="preserve">                self.assertEqual(caught.exception.task_numbers,[1])</w:t>
+      </w:r>
+    </w:p>
+    <w:p>
+      <w:r>
+        <w:t xml:space="preserve">                with self.assertRaises(app.DuplicateTask):app.reject_duplicate(original_name='测试.MP4')</w:t>
+      </w:r>
+    </w:p>
+    <w:p>
+      <w:r>
+        <w:t xml:space="preserve">                app.reject_duplicate(original_name='测试.mp4')</w:t>
+      </w:r>
+    </w:p>
+    <w:p>
+      <w:r>
+        <w:t xml:space="preserve">                app.reject_duplicate(original_name='测试.mp3')</w:t>
+      </w:r>
+    </w:p>
+    <w:p>
+      <w:r>
+        <w:t xml:space="preserve">                app.reject_duplicate(url='https://example.com/a?x=2')</w:t>
+      </w:r>
+    </w:p>
+    <w:p/>
+    <w:p>
+      <w:r>
+        <w:t xml:space="preserve">    def test_restart_bypasses_duplicate_guard(self):</w:t>
+      </w:r>
+    </w:p>
+    <w:p>
+      <w:r>
+        <w:t xml:space="preserve">        with patch('app.reject_duplicate') as guard,patch('app.enqueue',return_value='task'):</w:t>
+      </w:r>
+    </w:p>
+    <w:p>
+      <w:r>
+        <w:t xml:space="preserve">            self.assertEqual(app.submit_url('https://example.com',True),'task');guard.assert_not_called()</w:t>
+      </w:r>
+    </w:p>
     <w:p>
       <w:r>
         <w:t>```</w:t>
@@ -19955,7 +20198,7 @@
     </w:p>
     <w:p>
       <w:r>
-        <w:t xml:space="preserve">  "app.py": "52e290fbc2ce69b65b08830d43d9974a7097adb5c38ba5015537a34c92cecd2f",</w:t>
+        <w:t xml:space="preserve">  "app.py": "d42ba015a609dba26769a9f69f3e6eae0c4560546e45c5e0ae0b52f7a63f0222",</w:t>
       </w:r>
     </w:p>
     <w:p>
@@ -19985,7 +20228,7 @@
     </w:p>
     <w:p>
       <w:r>
-        <w:t xml:space="preserve">  "index.html": "4315b73c6064d70bb43413120b84b24b1cbdbe50758be8baa585f2ce0000933b",</w:t>
+        <w:t xml:space="preserve">  "index.html": "eed7c7db46077d8fc0592e0f5437dff3a387e03e74aee194f364ac87129743b5",</w:t>
       </w:r>
     </w:p>
     <w:p>
@@ -20065,7 +20308,7 @@
     </w:p>
     <w:p>
       <w:r>
-        <w:t xml:space="preserve">  "test_app.py": "3c85d333abd77da00a5e5a2d9128c90574f3b4e90cc202ead2ebd0a8a686e39b",</w:t>
+        <w:t xml:space="preserve">  "test_app.py": "a822ba519cf7dc919ec114c130df5ac7108a36184d8a8a402a3dd8934ecbe23b",</w:t>
       </w:r>
     </w:p>
     <w:p>

</xml_diff>

<commit_message>
Detect duplicate video identities across YouTube share URL forms
</commit_message>
<xml_diff>
--- a/安装与使用指南.docx
+++ b/安装与使用指南.docx
@@ -749,6 +749,12 @@
     </w:p>
     <w:p/>
     <w:p>
+      <w:r>
+        <w:t>重复检查还按平台视频 ID 匹配：YouTube 的 watch、youtu.be、shorts、embed、live 链接指向同一视频时，不受分享参数和播放起点影响，均视为重复。B 站标准视频链接忽略分享参数，但保留分 P，不同分 P 不视为重复。未知链接形式仍按完整链接比较，不仅凭标题判断。检查适用于已有本机任务记录，无需重新录入；原有完全相同文件名规则保持。</w:t>
+      </w:r>
+    </w:p>
+    <w:p/>
+    <w:p>
       <w:pPr>
         <w:pStyle w:val="Heading1"/>
       </w:pPr>
@@ -1005,7 +1011,7 @@
     </w:p>
     <w:p>
       <w:r>
-        <w:t>from urllib.parse import urlparse, unquote</w:t>
+        <w:t>from urllib.parse import urlparse, unquote, parse_qs</w:t>
       </w:r>
     </w:p>
     <w:p/>
@@ -2580,6 +2586,127 @@
     <w:p/>
     <w:p>
       <w:r>
+        <w:t>def video_identity(url):</w:t>
+      </w:r>
+    </w:p>
+    <w:p>
+      <w:r>
+        <w:t xml:space="preserve">    """Canonical identities for supported URL forms; unknown URLs stay exact."""</w:t>
+      </w:r>
+    </w:p>
+    <w:p>
+      <w:r>
+        <w:t xml:space="preserve">    try:</w:t>
+      </w:r>
+    </w:p>
+    <w:p>
+      <w:r>
+        <w:t xml:space="preserve">        parsed=urlparse(url)</w:t>
+      </w:r>
+    </w:p>
+    <w:p>
+      <w:r>
+        <w:t xml:space="preserve">        if parsed.scheme not in ('http','https'):return None</w:t>
+      </w:r>
+    </w:p>
+    <w:p>
+      <w:r>
+        <w:t xml:space="preserve">        host=(parsed.hostname or '').lower()</w:t>
+      </w:r>
+    </w:p>
+    <w:p>
+      <w:r>
+        <w:t xml:space="preserve">        query=parse_qs(parsed.query)</w:t>
+      </w:r>
+    </w:p>
+    <w:p>
+      <w:r>
+        <w:t xml:space="preserve">        parts=parsed.path.strip('/').split('/')</w:t>
+      </w:r>
+    </w:p>
+    <w:p>
+      <w:r>
+        <w:t xml:space="preserve">        video=None</w:t>
+      </w:r>
+    </w:p>
+    <w:p>
+      <w:r>
+        <w:t xml:space="preserve">        if host in ('youtu.be','www.youtu.be') and len(parts)==1:</w:t>
+      </w:r>
+    </w:p>
+    <w:p>
+      <w:r>
+        <w:t xml:space="preserve">            video=parts[0]</w:t>
+      </w:r>
+    </w:p>
+    <w:p>
+      <w:r>
+        <w:t xml:space="preserve">        elif host in ('youtube.com','www.youtube.com','m.youtube.com','music.youtube.com','youtube-nocookie.com','www.youtube-nocookie.com'):</w:t>
+      </w:r>
+    </w:p>
+    <w:p>
+      <w:r>
+        <w:t xml:space="preserve">            if parsed.path.rstrip('/')=='/watch' and len(query.get('v',[]))==1:video=query['v'][0]</w:t>
+      </w:r>
+    </w:p>
+    <w:p>
+      <w:r>
+        <w:t xml:space="preserve">            elif len(parts)==2 and parts[0] in ('shorts','embed','live'):video=parts[1]</w:t>
+      </w:r>
+    </w:p>
+    <w:p>
+      <w:r>
+        <w:t xml:space="preserve">        if video and re.fullmatch(r'[A-Za-z0-9_-]{11}',video):return ('youtube',video)</w:t>
+      </w:r>
+    </w:p>
+    <w:p>
+      <w:r>
+        <w:t xml:space="preserve">        if host in ('bilibili.com','www.bilibili.com','m.bilibili.com'):</w:t>
+      </w:r>
+    </w:p>
+    <w:p>
+      <w:r>
+        <w:t xml:space="preserve">            match=re.fullmatch(r'/video/(BV[A-Za-z0-9]{10}|av[0-9]+)/?',parsed.path)</w:t>
+      </w:r>
+    </w:p>
+    <w:p>
+      <w:r>
+        <w:t xml:space="preserve">            if match:</w:t>
+      </w:r>
+    </w:p>
+    <w:p>
+      <w:r>
+        <w:t xml:space="preserve">                pages=query.get('p',['1'])</w:t>
+      </w:r>
+    </w:p>
+    <w:p>
+      <w:r>
+        <w:t xml:space="preserve">                if len(pages)!=1 or not pages[0].isdigit() or int(pages[0])&lt;1:return None</w:t>
+      </w:r>
+    </w:p>
+    <w:p>
+      <w:r>
+        <w:t xml:space="preserve">                return ('bilibili',match[1],int(pages[0]))</w:t>
+      </w:r>
+    </w:p>
+    <w:p>
+      <w:r>
+        <w:t xml:space="preserve">    except (TypeError,ValueError):</w:t>
+      </w:r>
+    </w:p>
+    <w:p>
+      <w:r>
+        <w:t xml:space="preserve">        pass</w:t>
+      </w:r>
+    </w:p>
+    <w:p>
+      <w:r>
+        <w:t xml:space="preserve">    return None</w:t>
+      </w:r>
+    </w:p>
+    <w:p/>
+    <w:p>
+      <w:r>
         <w:t>def reject_duplicate(url=None, original_name=None):</w:t>
       </w:r>
     </w:p>
@@ -2595,6 +2722,11 @@
     </w:p>
     <w:p>
       <w:r>
+        <w:t xml:space="preserve">    identity=video_identity(url) if url is not None else None</w:t>
+      </w:r>
+    </w:p>
+    <w:p>
+      <w:r>
         <w:t xml:space="preserve">    for record in (WORK/'jobs').glob('*/job.json'):</w:t>
       </w:r>
     </w:p>
@@ -2625,7 +2757,7 @@
     </w:p>
     <w:p>
       <w:r>
-        <w:t xml:space="preserve">        if (url is not None and item.get('url')==url) or (original_name is not None and stored==original_name):</w:t>
+        <w:t xml:space="preserve">        if (url is not None and (item.get('url')==url or (identity is not None and video_identity(item.get('url'))==identity))) or (original_name is not None and stored==original_name):</w:t>
       </w:r>
     </w:p>
     <w:p>
@@ -14355,6 +14487,104 @@
         <w:t xml:space="preserve">            self.assertEqual(app.submit_url('https://example.com',True),'task');guard.assert_not_called()</w:t>
       </w:r>
     </w:p>
+    <w:p/>
+    <w:p>
+      <w:r>
+        <w:t>class VideoIdentityTests(unittest.TestCase):</w:t>
+      </w:r>
+    </w:p>
+    <w:p>
+      <w:r>
+        <w:t xml:space="preserve">    def test_youtube_share_variants_match(self):</w:t>
+      </w:r>
+    </w:p>
+    <w:p>
+      <w:r>
+        <w:t xml:space="preserve">        expected=('youtube','abcdefghijk')</w:t>
+      </w:r>
+    </w:p>
+    <w:p>
+      <w:r>
+        <w:t xml:space="preserve">        for url in ['https://youtu.be/abcdefghijk?si=share','https://www.youtube.com/watch?v=abcdefghijk&amp;t=20','https://m.youtube.com/watch?feature=share&amp;v=abcdefghijk','https://youtube.com/shorts/abcdefghijk','https://youtube.com/embed/abcdefghijk','https://youtube.com/live/abcdefghijk']:</w:t>
+      </w:r>
+    </w:p>
+    <w:p>
+      <w:r>
+        <w:t xml:space="preserve">            self.assertEqual(app.video_identity(url),expected)</w:t>
+      </w:r>
+    </w:p>
+    <w:p>
+      <w:r>
+        <w:t xml:space="preserve">        self.assertNotEqual(app.video_identity('https://youtu.be/abcdefghijK'),expected)</w:t>
+      </w:r>
+    </w:p>
+    <w:p>
+      <w:r>
+        <w:t xml:space="preserve">        self.assertIsNone(app.video_identity('https://youtube.com.attacker.test/watch?v=abcdefghijk'))</w:t>
+      </w:r>
+    </w:p>
+    <w:p/>
+    <w:p>
+      <w:r>
+        <w:t xml:space="preserve">    def test_bilibili_parts_are_distinct(self):</w:t>
+      </w:r>
+    </w:p>
+    <w:p>
+      <w:r>
+        <w:t xml:space="preserve">        base='https://www.bilibili.com/video/BV1234567890'</w:t>
+      </w:r>
+    </w:p>
+    <w:p>
+      <w:r>
+        <w:t xml:space="preserve">        self.assertEqual(app.video_identity(base),app.video_identity(base+'?p=1&amp;share_source=copy'))</w:t>
+      </w:r>
+    </w:p>
+    <w:p>
+      <w:r>
+        <w:t xml:space="preserve">        self.assertNotEqual(app.video_identity(base),app.video_identity(base+'?p=2'))</w:t>
+      </w:r>
+    </w:p>
+    <w:p>
+      <w:r>
+        <w:t xml:space="preserve">        self.assertIsNone(app.video_identity(base+'?p=bad'))</w:t>
+      </w:r>
+    </w:p>
+    <w:p/>
+    <w:p>
+      <w:r>
+        <w:t xml:space="preserve">    def test_duplicate_guard_checks_saved_alternate_url(self):</w:t>
+      </w:r>
+    </w:p>
+    <w:p>
+      <w:r>
+        <w:t xml:space="preserve">        with tempfile.TemporaryDirectory() as tmp:</w:t>
+      </w:r>
+    </w:p>
+    <w:p>
+      <w:r>
+        <w:t xml:space="preserve">            root=Path(tmp);job=root/'jobs/123456abcdef';job.mkdir(parents=True)</w:t>
+      </w:r>
+    </w:p>
+    <w:p>
+      <w:r>
+        <w:t xml:space="preserve">            (job/'job.json').write_text(json.dumps({'url':'https://youtube.com/watch?v=abcdefghijk','created_at':1}))</w:t>
+      </w:r>
+    </w:p>
+    <w:p>
+      <w:r>
+        <w:t xml:space="preserve">            with patch.object(app,'WORK',root):</w:t>
+      </w:r>
+    </w:p>
+    <w:p>
+      <w:r>
+        <w:t xml:space="preserve">                with self.assertRaises(app.DuplicateTask):app.reject_duplicate(url='https://youtu.be/abcdefghijk?si=share')</w:t>
+      </w:r>
+    </w:p>
+    <w:p>
+      <w:r>
+        <w:t xml:space="preserve">                app.reject_duplicate(url='https://youtu.be/abcdefghijK')</w:t>
+      </w:r>
+    </w:p>
     <w:p>
       <w:r>
         <w:t>```</w:t>
@@ -20198,7 +20428,7 @@
     </w:p>
     <w:p>
       <w:r>
-        <w:t xml:space="preserve">  "app.py": "d42ba015a609dba26769a9f69f3e6eae0c4560546e45c5e0ae0b52f7a63f0222",</w:t>
+        <w:t xml:space="preserve">  "app.py": "6c611bdaa1dc29d32645ed9596febd4a0c72405f1f60e39fa454c67f7f5e8bdc",</w:t>
       </w:r>
     </w:p>
     <w:p>
@@ -20308,7 +20538,7 @@
     </w:p>
     <w:p>
       <w:r>
-        <w:t xml:space="preserve">  "test_app.py": "a822ba519cf7dc919ec114c130df5ac7108a36184d8a8a402a3dd8934ecbe23b",</w:t>
+        <w:t xml:space="preserve">  "test_app.py": "9a42e7354e113fc172337ce5f9402431bc85d8694130b3cd47176d75fcd0a701",</w:t>
       </w:r>
     </w:p>
     <w:p>

</xml_diff>